<commit_message>
feat(electric-vehicle): add motor and inverter simulation
</commit_message>
<xml_diff>
--- a/docs/ATEP_Volume_VI_Electric_Vehicle_Engineering_Workbook.docx
+++ b/docs/ATEP_Volume_VI_Electric_Vehicle_Engineering_Workbook.docx
@@ -143,7 +143,7 @@
                 <w:color w:val="0B2545"/>
                 <w:sz w:val="19"/>
               </w:rPr>
-              <w:t>0.1.0</w:t>
+              <w:t>0.2.0</w:t>
             </w:r>
           </w:p>
         </w:tc>
@@ -265,7 +265,7 @@
                 <w:color w:val="111827"/>
                 <w:sz w:val="19"/>
               </w:rPr>
-              <w:t>VI-1 battery and BMS foundation implemented</w:t>
+              <w:t>VI-1 battery/BMS and VI-2 motor/inverter implemented</w:t>
             </w:r>
           </w:p>
         </w:tc>
@@ -873,7 +873,7 @@
                 <w:color w:val="111827"/>
                 <w:sz w:val="17"/>
               </w:rPr>
-              <w:t>0.1.0</w:t>
+              <w:t>0.2.0</w:t>
             </w:r>
           </w:p>
         </w:tc>
@@ -995,7 +995,7 @@
                 <w:color w:val="111827"/>
                 <w:sz w:val="17"/>
               </w:rPr>
-              <w:t>VI-1 battery and BMS foundation implemented</w:t>
+              <w:t>VI-1 battery/BMS and VI-2 motor/inverter implemented</w:t>
             </w:r>
           </w:p>
         </w:tc>
@@ -1084,7 +1084,7 @@
           <w:color w:val="111827"/>
           <w:sz w:val="22"/>
         </w:rPr>
-        <w:t>Volume VI turns the platform's general digital vehicle into a testable electric-energy system. The first increment establishes a persistent battery pack and deterministic BMS behavior suitable for repeatable software tests. It provides the foundation for motor torque, charging, thermal control, regenerative braking, range estimation, and full cross-domain EV scenarios.</w:t>
+        <w:t>Volume VI turns the platform's general digital vehicle into a testable electric-energy system. VI-1 establishes a persistent battery pack and deterministic BMS behavior. VI-2 adds a persistent motor/inverter aggregate, torque delivery, efficiency, power loss, thermal protection, drive-mode limits, and battery-derived propulsion availability for repeatable software tests.</w:t>
       </w:r>
     </w:p>
     <w:p>
@@ -1266,7 +1266,7 @@
         <w:keepLines/>
       </w:pPr>
       <w:r>
-        <w:t>Deferred</w:t>
+        <w:t>In Scope for VI-2</w:t>
       </w:r>
     </w:p>
     <w:p>
@@ -1284,7 +1284,7 @@
           <w:color w:val="111827"/>
           <w:sz w:val="22"/>
         </w:rPr>
-        <w:t>chemistry-specific equivalent-circuit and open-circuit-voltage curves;</w:t>
+        <w:t>one motor/inverter state per battery-equipped vehicle;</w:t>
       </w:r>
     </w:p>
     <w:p>
@@ -1302,7 +1302,7 @@
           <w:color w:val="111827"/>
           <w:sz w:val="22"/>
         </w:rPr>
-        <w:t>cell balancing, aging, sensor faults, and module topology;</w:t>
+        <w:t>requested and delivered torque, speed, mechanical/electrical power, efficiency, and loss;</w:t>
       </w:r>
     </w:p>
     <w:p>
@@ -1320,7 +1320,7 @@
           <w:color w:val="111827"/>
           <w:sz w:val="22"/>
         </w:rPr>
-        <w:t>inverter, motor, regen, charging, cooling actuators, and range estimation;</w:t>
+        <w:t>eco, normal, and sport torque ceilings;</w:t>
       </w:r>
     </w:p>
     <w:p>
@@ -1329,6 +1329,124 @@
         <w:numPr>
           <w:ilvl w:val="0"/>
           <w:numId w:val="12"/>
+        </w:numPr>
+        <w:spacing w:after="80"/>
+      </w:pPr>
+      <w:r>
+        <w:rPr>
+          <w:rFonts w:ascii="Calibri" w:hAnsi="Calibri"/>
+          <w:color w:val="111827"/>
+          <w:sz w:val="22"/>
+        </w:rPr>
+        <w:t>battery contactor, BMS, voltage, and inverter power constraints;</w:t>
+      </w:r>
+    </w:p>
+    <w:p>
+      <w:pPr>
+        <w:pStyle w:val="ListBullet"/>
+        <w:numPr>
+          <w:ilvl w:val="0"/>
+          <w:numId w:val="12"/>
+        </w:numPr>
+        <w:spacing w:after="80"/>
+      </w:pPr>
+      <w:r>
+        <w:rPr>
+          <w:rFonts w:ascii="Calibri" w:hAnsi="Calibri"/>
+          <w:color w:val="111827"/>
+          <w:sz w:val="22"/>
+        </w:rPr>
+        <w:t>motor and inverter thermal evolution and protection;</w:t>
+      </w:r>
+    </w:p>
+    <w:p>
+      <w:pPr>
+        <w:pStyle w:val="ListBullet"/>
+        <w:numPr>
+          <w:ilvl w:val="0"/>
+          <w:numId w:val="12"/>
+        </w:numPr>
+        <w:spacing w:after="80"/>
+      </w:pPr>
+      <w:r>
+        <w:rPr>
+          <w:rFonts w:ascii="Calibri" w:hAnsi="Calibri"/>
+          <w:color w:val="111827"/>
+          <w:sz w:val="22"/>
+        </w:rPr>
+        <w:t>stable limiting reasons, optimistic concurrency, exact replay, audit, and outbox evidence.</w:t>
+      </w:r>
+    </w:p>
+    <w:p>
+      <w:pPr>
+        <w:pStyle w:val="Heading2"/>
+        <w:keepNext/>
+        <w:keepLines/>
+      </w:pPr>
+      <w:r>
+        <w:t>Deferred</w:t>
+      </w:r>
+    </w:p>
+    <w:p>
+      <w:pPr>
+        <w:pStyle w:val="ListBullet"/>
+        <w:numPr>
+          <w:ilvl w:val="0"/>
+          <w:numId w:val="13"/>
+        </w:numPr>
+        <w:spacing w:after="80"/>
+      </w:pPr>
+      <w:r>
+        <w:rPr>
+          <w:rFonts w:ascii="Calibri" w:hAnsi="Calibri"/>
+          <w:color w:val="111827"/>
+          <w:sz w:val="22"/>
+        </w:rPr>
+        <w:t>chemistry-specific equivalent-circuit and open-circuit-voltage curves;</w:t>
+      </w:r>
+    </w:p>
+    <w:p>
+      <w:pPr>
+        <w:pStyle w:val="ListBullet"/>
+        <w:numPr>
+          <w:ilvl w:val="0"/>
+          <w:numId w:val="13"/>
+        </w:numPr>
+        <w:spacing w:after="80"/>
+      </w:pPr>
+      <w:r>
+        <w:rPr>
+          <w:rFonts w:ascii="Calibri" w:hAnsi="Calibri"/>
+          <w:color w:val="111827"/>
+          <w:sz w:val="22"/>
+        </w:rPr>
+        <w:t>cell balancing, aging, sensor faults, and module topology;</w:t>
+      </w:r>
+    </w:p>
+    <w:p>
+      <w:pPr>
+        <w:pStyle w:val="ListBullet"/>
+        <w:numPr>
+          <w:ilvl w:val="0"/>
+          <w:numId w:val="13"/>
+        </w:numPr>
+        <w:spacing w:after="80"/>
+      </w:pPr>
+      <w:r>
+        <w:rPr>
+          <w:rFonts w:ascii="Calibri" w:hAnsi="Calibri"/>
+          <w:color w:val="111827"/>
+          <w:sz w:val="22"/>
+        </w:rPr>
+        <w:t>regenerative braking, charging, cooling actuators, and range estimation;</w:t>
+      </w:r>
+    </w:p>
+    <w:p>
+      <w:pPr>
+        <w:pStyle w:val="ListBullet"/>
+        <w:numPr>
+          <w:ilvl w:val="0"/>
+          <w:numId w:val="13"/>
         </w:numPr>
         <w:spacing w:after="80"/>
       </w:pPr>
@@ -1366,7 +1484,7 @@
         <w:pStyle w:val="ListBullet"/>
         <w:numPr>
           <w:ilvl w:val="0"/>
-          <w:numId w:val="13"/>
+          <w:numId w:val="14"/>
         </w:numPr>
         <w:spacing w:after="80"/>
       </w:pPr>
@@ -1416,7 +1534,7 @@
         <w:pStyle w:val="ListBullet"/>
         <w:numPr>
           <w:ilvl w:val="0"/>
-          <w:numId w:val="13"/>
+          <w:numId w:val="14"/>
         </w:numPr>
         <w:spacing w:after="80"/>
       </w:pPr>
@@ -1442,7 +1560,7 @@
         <w:pStyle w:val="ListBullet"/>
         <w:numPr>
           <w:ilvl w:val="0"/>
-          <w:numId w:val="13"/>
+          <w:numId w:val="14"/>
         </w:numPr>
         <w:spacing w:after="80"/>
       </w:pPr>
@@ -1468,7 +1586,59 @@
         <w:pStyle w:val="ListBullet"/>
         <w:numPr>
           <w:ilvl w:val="0"/>
-          <w:numId w:val="13"/>
+          <w:numId w:val="14"/>
+        </w:numPr>
+        <w:spacing w:after="80"/>
+      </w:pPr>
+      <w:r>
+        <w:rPr>
+          <w:rFonts w:ascii="Consolas" w:hAnsi="Consolas"/>
+          <w:color w:val="1F4D78"/>
+          <w:sz w:val="19"/>
+        </w:rPr>
+        <w:t>MotorInverterState</w:t>
+      </w:r>
+      <w:r>
+        <w:rPr>
+          <w:rFonts w:ascii="Calibri" w:hAnsi="Calibri"/>
+          <w:color w:val="111827"/>
+          <w:sz w:val="22"/>
+        </w:rPr>
+        <w:t xml:space="preserve"> as the one-per-vehicle propulsion, efficiency, power, and thermal state;</w:t>
+      </w:r>
+    </w:p>
+    <w:p>
+      <w:pPr>
+        <w:pStyle w:val="ListBullet"/>
+        <w:numPr>
+          <w:ilvl w:val="0"/>
+          <w:numId w:val="14"/>
+        </w:numPr>
+        <w:spacing w:after="80"/>
+      </w:pPr>
+      <w:r>
+        <w:rPr>
+          <w:rFonts w:ascii="Consolas" w:hAnsi="Consolas"/>
+          <w:color w:val="1F4D78"/>
+          <w:sz w:val="19"/>
+        </w:rPr>
+        <w:t>MotorSimulationStep</w:t>
+      </w:r>
+      <w:r>
+        <w:rPr>
+          <w:rFonts w:ascii="Calibri" w:hAnsi="Calibri"/>
+          <w:color w:val="111827"/>
+          <w:sz w:val="22"/>
+        </w:rPr>
+        <w:t xml:space="preserve"> as the propulsion command identity and immutable replay evidence;</w:t>
+      </w:r>
+    </w:p>
+    <w:p>
+      <w:pPr>
+        <w:pStyle w:val="ListBullet"/>
+        <w:numPr>
+          <w:ilvl w:val="0"/>
+          <w:numId w:val="14"/>
         </w:numPr>
         <w:spacing w:after="80"/>
       </w:pPr>
@@ -2252,6 +2422,363 @@
           </w:p>
         </w:tc>
       </w:tr>
+      <w:tr>
+        <w:trPr>
+          <w:cantSplit/>
+        </w:trPr>
+        <w:tc>
+          <w:tcPr>
+            <w:tcW w:type="dxa" w:w="1650"/>
+            <w:tcMar>
+              <w:top w:w="80" w:type="dxa"/>
+              <w:start w:w="120" w:type="dxa"/>
+              <w:bottom w:w="80" w:type="dxa"/>
+              <w:end w:w="120" w:type="dxa"/>
+            </w:tcMar>
+            <w:vAlign w:val="center"/>
+            <w:shd w:fill="FFFFFF"/>
+          </w:tcPr>
+          <w:p>
+            <w:pPr>
+              <w:spacing w:before="0" w:after="40" w:line="252" w:lineRule="auto"/>
+              <w:jc w:val="center"/>
+            </w:pPr>
+            <w:r>
+              <w:rPr>
+                <w:rFonts w:ascii="Calibri" w:hAnsi="Calibri"/>
+                <w:b w:val="0"/>
+                <w:color w:val="111827"/>
+                <w:sz w:val="17"/>
+              </w:rPr>
+              <w:t>MotorInverterState</w:t>
+            </w:r>
+          </w:p>
+        </w:tc>
+        <w:tc>
+          <w:tcPr>
+            <w:tcW w:type="dxa" w:w="4450"/>
+            <w:tcMar>
+              <w:top w:w="80" w:type="dxa"/>
+              <w:start w:w="120" w:type="dxa"/>
+              <w:bottom w:w="80" w:type="dxa"/>
+              <w:end w:w="120" w:type="dxa"/>
+            </w:tcMar>
+            <w:vAlign w:val="center"/>
+            <w:shd w:fill="FFFFFF"/>
+          </w:tcPr>
+          <w:p>
+            <w:pPr>
+              <w:spacing w:before="0" w:after="40" w:line="252" w:lineRule="auto"/>
+              <w:jc w:val="left"/>
+            </w:pPr>
+            <w:r>
+              <w:rPr>
+                <w:rFonts w:ascii="Calibri" w:hAnsi="Calibri"/>
+                <w:b w:val="0"/>
+                <w:color w:val="111827"/>
+                <w:sz w:val="17"/>
+              </w:rPr>
+              <w:t>Authoritative propulsion state</w:t>
+            </w:r>
+          </w:p>
+        </w:tc>
+        <w:tc>
+          <w:tcPr>
+            <w:tcW w:type="dxa" w:w="3260"/>
+            <w:tcMar>
+              <w:top w:w="80" w:type="dxa"/>
+              <w:start w:w="120" w:type="dxa"/>
+              <w:bottom w:w="80" w:type="dxa"/>
+              <w:end w:w="120" w:type="dxa"/>
+            </w:tcMar>
+            <w:vAlign w:val="center"/>
+            <w:shd w:fill="FFFFFF"/>
+          </w:tcPr>
+          <w:p>
+            <w:pPr>
+              <w:spacing w:before="0" w:after="40" w:line="252" w:lineRule="auto"/>
+              <w:jc w:val="left"/>
+            </w:pPr>
+            <w:r>
+              <w:rPr>
+                <w:rFonts w:ascii="Calibri" w:hAnsi="Calibri"/>
+                <w:b w:val="0"/>
+                <w:color w:val="111827"/>
+                <w:sz w:val="17"/>
+              </w:rPr>
+              <w:t>one per vehicle; version &gt;= 1</w:t>
+            </w:r>
+          </w:p>
+        </w:tc>
+      </w:tr>
+      <w:tr>
+        <w:trPr>
+          <w:cantSplit/>
+        </w:trPr>
+        <w:tc>
+          <w:tcPr>
+            <w:tcW w:type="dxa" w:w="1650"/>
+            <w:tcMar>
+              <w:top w:w="80" w:type="dxa"/>
+              <w:start w:w="120" w:type="dxa"/>
+              <w:bottom w:w="80" w:type="dxa"/>
+              <w:end w:w="120" w:type="dxa"/>
+            </w:tcMar>
+            <w:vAlign w:val="center"/>
+            <w:shd w:fill="FFFFFF"/>
+          </w:tcPr>
+          <w:p>
+            <w:pPr>
+              <w:spacing w:before="0" w:after="40" w:line="252" w:lineRule="auto"/>
+              <w:jc w:val="center"/>
+            </w:pPr>
+            <w:r>
+              <w:rPr>
+                <w:rFonts w:ascii="Calibri" w:hAnsi="Calibri"/>
+                <w:b w:val="0"/>
+                <w:color w:val="111827"/>
+                <w:sz w:val="17"/>
+              </w:rPr>
+              <w:t>Drive mode</w:t>
+            </w:r>
+          </w:p>
+        </w:tc>
+        <w:tc>
+          <w:tcPr>
+            <w:tcW w:type="dxa" w:w="4450"/>
+            <w:tcMar>
+              <w:top w:w="80" w:type="dxa"/>
+              <w:start w:w="120" w:type="dxa"/>
+              <w:bottom w:w="80" w:type="dxa"/>
+              <w:end w:w="120" w:type="dxa"/>
+            </w:tcMar>
+            <w:vAlign w:val="center"/>
+            <w:shd w:fill="FFFFFF"/>
+          </w:tcPr>
+          <w:p>
+            <w:pPr>
+              <w:spacing w:before="0" w:after="40" w:line="252" w:lineRule="auto"/>
+              <w:jc w:val="left"/>
+            </w:pPr>
+            <w:r>
+              <w:rPr>
+                <w:rFonts w:ascii="Calibri" w:hAnsi="Calibri"/>
+                <w:b w:val="0"/>
+                <w:color w:val="111827"/>
+                <w:sz w:val="17"/>
+              </w:rPr>
+              <w:t>Driver-selectable torque policy</w:t>
+            </w:r>
+          </w:p>
+        </w:tc>
+        <w:tc>
+          <w:tcPr>
+            <w:tcW w:type="dxa" w:w="3260"/>
+            <w:tcMar>
+              <w:top w:w="80" w:type="dxa"/>
+              <w:start w:w="120" w:type="dxa"/>
+              <w:bottom w:w="80" w:type="dxa"/>
+              <w:end w:w="120" w:type="dxa"/>
+            </w:tcMar>
+            <w:vAlign w:val="center"/>
+            <w:shd w:fill="FFFFFF"/>
+          </w:tcPr>
+          <w:p>
+            <w:pPr>
+              <w:spacing w:before="0" w:after="40" w:line="252" w:lineRule="auto"/>
+              <w:jc w:val="left"/>
+            </w:pPr>
+            <w:r>
+              <w:rPr>
+                <w:rFonts w:ascii="Calibri" w:hAnsi="Calibri"/>
+                <w:b w:val="0"/>
+                <w:color w:val="111827"/>
+                <w:sz w:val="17"/>
+              </w:rPr>
+              <w:t>eco</w:t>
+            </w:r>
+            <w:r>
+              <w:rPr>
+                <w:rFonts w:ascii="Calibri" w:hAnsi="Calibri"/>
+                <w:b w:val="0"/>
+                <w:color w:val="111827"/>
+                <w:sz w:val="17"/>
+              </w:rPr>
+              <w:t xml:space="preserve">, </w:t>
+            </w:r>
+            <w:r>
+              <w:rPr>
+                <w:rFonts w:ascii="Calibri" w:hAnsi="Calibri"/>
+                <w:b w:val="0"/>
+                <w:color w:val="111827"/>
+                <w:sz w:val="17"/>
+              </w:rPr>
+              <w:t>normal</w:t>
+            </w:r>
+            <w:r>
+              <w:rPr>
+                <w:rFonts w:ascii="Calibri" w:hAnsi="Calibri"/>
+                <w:b w:val="0"/>
+                <w:color w:val="111827"/>
+                <w:sz w:val="17"/>
+              </w:rPr>
+              <w:t xml:space="preserve">, </w:t>
+            </w:r>
+            <w:r>
+              <w:rPr>
+                <w:rFonts w:ascii="Calibri" w:hAnsi="Calibri"/>
+                <w:b w:val="0"/>
+                <w:color w:val="111827"/>
+                <w:sz w:val="17"/>
+              </w:rPr>
+              <w:t>sport</w:t>
+            </w:r>
+          </w:p>
+        </w:tc>
+      </w:tr>
+      <w:tr>
+        <w:trPr>
+          <w:cantSplit/>
+        </w:trPr>
+        <w:tc>
+          <w:tcPr>
+            <w:tcW w:type="dxa" w:w="1650"/>
+            <w:tcMar>
+              <w:top w:w="80" w:type="dxa"/>
+              <w:start w:w="120" w:type="dxa"/>
+              <w:bottom w:w="80" w:type="dxa"/>
+              <w:end w:w="120" w:type="dxa"/>
+            </w:tcMar>
+            <w:vAlign w:val="center"/>
+            <w:shd w:fill="FFFFFF"/>
+          </w:tcPr>
+          <w:p>
+            <w:pPr>
+              <w:spacing w:before="0" w:after="40" w:line="252" w:lineRule="auto"/>
+              <w:jc w:val="center"/>
+            </w:pPr>
+            <w:r>
+              <w:rPr>
+                <w:rFonts w:ascii="Calibri" w:hAnsi="Calibri"/>
+                <w:b w:val="0"/>
+                <w:color w:val="111827"/>
+                <w:sz w:val="17"/>
+              </w:rPr>
+              <w:t>Powertrain state</w:t>
+            </w:r>
+          </w:p>
+        </w:tc>
+        <w:tc>
+          <w:tcPr>
+            <w:tcW w:type="dxa" w:w="4450"/>
+            <w:tcMar>
+              <w:top w:w="80" w:type="dxa"/>
+              <w:start w:w="120" w:type="dxa"/>
+              <w:bottom w:w="80" w:type="dxa"/>
+              <w:end w:w="120" w:type="dxa"/>
+            </w:tcMar>
+            <w:vAlign w:val="center"/>
+            <w:shd w:fill="FFFFFF"/>
+          </w:tcPr>
+          <w:p>
+            <w:pPr>
+              <w:spacing w:before="0" w:after="40" w:line="252" w:lineRule="auto"/>
+              <w:jc w:val="left"/>
+            </w:pPr>
+            <w:r>
+              <w:rPr>
+                <w:rFonts w:ascii="Calibri" w:hAnsi="Calibri"/>
+                <w:b w:val="0"/>
+                <w:color w:val="111827"/>
+                <w:sz w:val="17"/>
+              </w:rPr>
+              <w:t>Propulsion decision</w:t>
+            </w:r>
+          </w:p>
+        </w:tc>
+        <w:tc>
+          <w:tcPr>
+            <w:tcW w:type="dxa" w:w="3260"/>
+            <w:tcMar>
+              <w:top w:w="80" w:type="dxa"/>
+              <w:start w:w="120" w:type="dxa"/>
+              <w:bottom w:w="80" w:type="dxa"/>
+              <w:end w:w="120" w:type="dxa"/>
+            </w:tcMar>
+            <w:vAlign w:val="center"/>
+            <w:shd w:fill="FFFFFF"/>
+          </w:tcPr>
+          <w:p>
+            <w:pPr>
+              <w:spacing w:before="0" w:after="40" w:line="252" w:lineRule="auto"/>
+              <w:jc w:val="left"/>
+            </w:pPr>
+            <w:r>
+              <w:rPr>
+                <w:rFonts w:ascii="Calibri" w:hAnsi="Calibri"/>
+                <w:b w:val="0"/>
+                <w:color w:val="111827"/>
+                <w:sz w:val="17"/>
+              </w:rPr>
+              <w:t>standby</w:t>
+            </w:r>
+            <w:r>
+              <w:rPr>
+                <w:rFonts w:ascii="Calibri" w:hAnsi="Calibri"/>
+                <w:b w:val="0"/>
+                <w:color w:val="111827"/>
+                <w:sz w:val="17"/>
+              </w:rPr>
+              <w:t xml:space="preserve">, </w:t>
+            </w:r>
+            <w:r>
+              <w:rPr>
+                <w:rFonts w:ascii="Calibri" w:hAnsi="Calibri"/>
+                <w:b w:val="0"/>
+                <w:color w:val="111827"/>
+                <w:sz w:val="17"/>
+              </w:rPr>
+              <w:t>ready</w:t>
+            </w:r>
+            <w:r>
+              <w:rPr>
+                <w:rFonts w:ascii="Calibri" w:hAnsi="Calibri"/>
+                <w:b w:val="0"/>
+                <w:color w:val="111827"/>
+                <w:sz w:val="17"/>
+              </w:rPr>
+              <w:t xml:space="preserve">, </w:t>
+            </w:r>
+            <w:r>
+              <w:rPr>
+                <w:rFonts w:ascii="Calibri" w:hAnsi="Calibri"/>
+                <w:b w:val="0"/>
+                <w:color w:val="111827"/>
+                <w:sz w:val="17"/>
+              </w:rPr>
+              <w:t>derated</w:t>
+            </w:r>
+            <w:r>
+              <w:rPr>
+                <w:rFonts w:ascii="Calibri" w:hAnsi="Calibri"/>
+                <w:b w:val="0"/>
+                <w:color w:val="111827"/>
+                <w:sz w:val="17"/>
+              </w:rPr>
+              <w:t xml:space="preserve">, </w:t>
+            </w:r>
+            <w:r>
+              <w:rPr>
+                <w:rFonts w:ascii="Calibri" w:hAnsi="Calibri"/>
+                <w:b w:val="0"/>
+                <w:color w:val="111827"/>
+                <w:sz w:val="17"/>
+              </w:rPr>
+              <w:t>protection</w:t>
+            </w:r>
+          </w:p>
+        </w:tc>
+      </w:tr>
     </w:tbl>
     <w:p>
       <w:pPr>
@@ -2303,7 +2830,7 @@
         <w:pStyle w:val="ListBullet"/>
         <w:numPr>
           <w:ilvl w:val="0"/>
-          <w:numId w:val="14"/>
+          <w:numId w:val="15"/>
         </w:numPr>
         <w:spacing w:after="80"/>
       </w:pPr>
@@ -2321,7 +2848,7 @@
         <w:pStyle w:val="ListBullet"/>
         <w:numPr>
           <w:ilvl w:val="0"/>
-          <w:numId w:val="14"/>
+          <w:numId w:val="15"/>
         </w:numPr>
         <w:spacing w:after="80"/>
       </w:pPr>
@@ -2339,7 +2866,7 @@
         <w:pStyle w:val="ListBullet"/>
         <w:numPr>
           <w:ilvl w:val="0"/>
-          <w:numId w:val="14"/>
+          <w:numId w:val="15"/>
         </w:numPr>
         <w:spacing w:after="80"/>
       </w:pPr>
@@ -2367,7 +2894,7 @@
         <w:pStyle w:val="ListBullet"/>
         <w:numPr>
           <w:ilvl w:val="0"/>
-          <w:numId w:val="15"/>
+          <w:numId w:val="16"/>
         </w:numPr>
         <w:spacing w:after="80"/>
       </w:pPr>
@@ -2385,7 +2912,7 @@
         <w:pStyle w:val="ListBullet"/>
         <w:numPr>
           <w:ilvl w:val="0"/>
-          <w:numId w:val="15"/>
+          <w:numId w:val="16"/>
         </w:numPr>
         <w:spacing w:after="80"/>
       </w:pPr>
@@ -2413,7 +2940,7 @@
         <w:pStyle w:val="ListBullet"/>
         <w:numPr>
           <w:ilvl w:val="0"/>
-          <w:numId w:val="16"/>
+          <w:numId w:val="17"/>
         </w:numPr>
         <w:spacing w:after="80"/>
       </w:pPr>
@@ -2434,6 +2961,154 @@
           <w:sz w:val="22"/>
         </w:rPr>
         <w:t>VI-1 uses a 300,000 J/C thermal mass and 35 W/C passive-cooling coefficient. These values are simulation parameters, not production calibration data. When the projected temperature reaches a protection boundary, the model stops at the boundary, opens contactors, and reports zero delivered current rather than extrapolating heating beyond isolation.</w:t>
+      </w:r>
+    </w:p>
+    <w:p>
+      <w:pPr>
+        <w:pStyle w:val="Heading2"/>
+        <w:keepNext/>
+        <w:keepLines/>
+      </w:pPr>
+      <w:r>
+        <w:t>VI-2 Propulsion Model</w:t>
+      </w:r>
+    </w:p>
+    <w:p>
+      <w:pPr>
+        <w:pStyle w:val="ListBullet"/>
+        <w:numPr>
+          <w:ilvl w:val="0"/>
+          <w:numId w:val="18"/>
+        </w:numPr>
+        <w:spacing w:after="80"/>
+      </w:pPr>
+      <w:r>
+        <w:rPr>
+          <w:rFonts w:ascii="Calibri" w:hAnsi="Calibri"/>
+          <w:color w:val="111827"/>
+          <w:sz w:val="22"/>
+        </w:rPr>
+        <w:t>Mode torque ceiling = configured peak torque multiplied by 0.60, 0.85, or 1.00 for eco,</w:t>
+      </w:r>
+    </w:p>
+    <w:p>
+      <w:r>
+        <w:rPr>
+          <w:rFonts w:ascii="Calibri" w:hAnsi="Calibri"/>
+          <w:color w:val="111827"/>
+          <w:sz w:val="22"/>
+        </w:rPr>
+        <w:t>normal, or sport.</w:t>
+      </w:r>
+    </w:p>
+    <w:p>
+      <w:pPr>
+        <w:pStyle w:val="ListBullet"/>
+        <w:numPr>
+          <w:ilvl w:val="0"/>
+          <w:numId w:val="19"/>
+        </w:numPr>
+        <w:spacing w:after="80"/>
+      </w:pPr>
+      <w:r>
+        <w:rPr>
+          <w:rFonts w:ascii="Calibri" w:hAnsi="Calibri"/>
+          <w:color w:val="111827"/>
+          <w:sz w:val="22"/>
+        </w:rPr>
+        <w:t>Mechanical power (kW) = delivered torque multiplied by 2 pi multiplied by rpm / 60 / 1,000.</w:t>
+      </w:r>
+    </w:p>
+    <w:p>
+      <w:pPr>
+        <w:pStyle w:val="ListBullet"/>
+        <w:numPr>
+          <w:ilvl w:val="0"/>
+          <w:numId w:val="19"/>
+        </w:numPr>
+        <w:spacing w:after="80"/>
+      </w:pPr>
+      <w:r>
+        <w:rPr>
+          <w:rFonts w:ascii="Calibri" w:hAnsi="Calibri"/>
+          <w:color w:val="111827"/>
+          <w:sz w:val="22"/>
+        </w:rPr>
+        <w:t>Electrical power (kW) = mechanical power divided by deterministic efficiency.</w:t>
+      </w:r>
+    </w:p>
+    <w:p>
+      <w:pPr>
+        <w:pStyle w:val="ListBullet"/>
+        <w:numPr>
+          <w:ilvl w:val="0"/>
+          <w:numId w:val="19"/>
+        </w:numPr>
+        <w:spacing w:after="80"/>
+      </w:pPr>
+      <w:r>
+        <w:rPr>
+          <w:rFonts w:ascii="Calibri" w:hAnsi="Calibri"/>
+          <w:color w:val="111827"/>
+          <w:sz w:val="22"/>
+        </w:rPr>
+        <w:t>Conversion loss (kW) = electrical power minus mechanical power.</w:t>
+      </w:r>
+    </w:p>
+    <w:p>
+      <w:pPr>
+        <w:pStyle w:val="ListBullet"/>
+        <w:numPr>
+          <w:ilvl w:val="0"/>
+          <w:numId w:val="19"/>
+        </w:numPr>
+        <w:spacing w:after="80"/>
+      </w:pPr>
+      <w:r>
+        <w:rPr>
+          <w:rFonts w:ascii="Calibri" w:hAnsi="Calibri"/>
+          <w:color w:val="111827"/>
+          <w:sz w:val="22"/>
+        </w:rPr>
+        <w:t>Available electrical power is the lower of inverter rating and battery voltage multiplied by</w:t>
+      </w:r>
+    </w:p>
+    <w:p>
+      <w:r>
+        <w:rPr>
+          <w:rFonts w:ascii="Calibri" w:hAnsi="Calibri"/>
+          <w:color w:val="111827"/>
+          <w:sz w:val="22"/>
+        </w:rPr>
+        <w:t>the BMS-dependent current ceiling.</w:t>
+      </w:r>
+    </w:p>
+    <w:p>
+      <w:pPr>
+        <w:pStyle w:val="ListBullet"/>
+        <w:numPr>
+          <w:ilvl w:val="0"/>
+          <w:numId w:val="20"/>
+        </w:numPr>
+        <w:spacing w:after="80"/>
+      </w:pPr>
+      <w:r>
+        <w:rPr>
+          <w:rFonts w:ascii="Calibri" w:hAnsi="Calibri"/>
+          <w:color w:val="111827"/>
+          <w:sz w:val="22"/>
+        </w:rPr>
+        <w:t>Motor and inverter temperatures integrate their share of conversion loss and passive cooling</w:t>
+      </w:r>
+    </w:p>
+    <w:p>
+      <w:r>
+        <w:rPr>
+          <w:rFonts w:ascii="Calibri" w:hAnsi="Calibri"/>
+          <w:color w:val="111827"/>
+          <w:sz w:val="22"/>
+        </w:rPr>
+        <w:t>over logical time. Protection trips at 150 C motor or 110 C inverter temperature.</w:t>
       </w:r>
     </w:p>
     <w:p>
@@ -3575,6 +4250,273 @@
           </w:p>
         </w:tc>
       </w:tr>
+      <w:tr>
+        <w:trPr>
+          <w:cantSplit/>
+        </w:trPr>
+        <w:tc>
+          <w:tcPr>
+            <w:tcW w:type="dxa" w:w="3100"/>
+            <w:tcMar>
+              <w:top w:w="80" w:type="dxa"/>
+              <w:start w:w="120" w:type="dxa"/>
+              <w:bottom w:w="80" w:type="dxa"/>
+              <w:end w:w="120" w:type="dxa"/>
+            </w:tcMar>
+            <w:vAlign w:val="center"/>
+            <w:shd w:fill="FFFFFF"/>
+          </w:tcPr>
+          <w:p>
+            <w:pPr>
+              <w:spacing w:before="0" w:after="40" w:line="252" w:lineRule="auto"/>
+              <w:jc w:val="center"/>
+            </w:pPr>
+            <w:r>
+              <w:rPr>
+                <w:rFonts w:ascii="Calibri" w:hAnsi="Calibri"/>
+                <w:b w:val="0"/>
+                <w:color w:val="111827"/>
+                <w:sz w:val="17"/>
+              </w:rPr>
+              <w:t>POST /api/v1/vehicles/{vehicle_id}/electric/powertrain</w:t>
+            </w:r>
+          </w:p>
+        </w:tc>
+        <w:tc>
+          <w:tcPr>
+            <w:tcW w:type="dxa" w:w="4000"/>
+            <w:tcMar>
+              <w:top w:w="80" w:type="dxa"/>
+              <w:start w:w="120" w:type="dxa"/>
+              <w:bottom w:w="80" w:type="dxa"/>
+              <w:end w:w="120" w:type="dxa"/>
+            </w:tcMar>
+            <w:vAlign w:val="center"/>
+            <w:shd w:fill="FFFFFF"/>
+          </w:tcPr>
+          <w:p>
+            <w:pPr>
+              <w:spacing w:before="0" w:after="40" w:line="252" w:lineRule="auto"/>
+              <w:jc w:val="left"/>
+            </w:pPr>
+            <w:r>
+              <w:rPr>
+                <w:rFonts w:ascii="Calibri" w:hAnsi="Calibri"/>
+                <w:b w:val="0"/>
+                <w:color w:val="111827"/>
+                <w:sz w:val="17"/>
+              </w:rPr>
+              <w:t>Create the motor/inverter baseline</w:t>
+            </w:r>
+          </w:p>
+        </w:tc>
+        <w:tc>
+          <w:tcPr>
+            <w:tcW w:type="dxa" w:w="2260"/>
+            <w:tcMar>
+              <w:top w:w="80" w:type="dxa"/>
+              <w:start w:w="120" w:type="dxa"/>
+              <w:bottom w:w="80" w:type="dxa"/>
+              <w:end w:w="120" w:type="dxa"/>
+            </w:tcMar>
+            <w:vAlign w:val="center"/>
+            <w:shd w:fill="FFFFFF"/>
+          </w:tcPr>
+          <w:p>
+            <w:pPr>
+              <w:spacing w:before="0" w:after="40" w:line="252" w:lineRule="auto"/>
+              <w:jc w:val="left"/>
+            </w:pPr>
+            <w:r>
+              <w:rPr>
+                <w:rFonts w:ascii="Calibri" w:hAnsi="Calibri"/>
+                <w:b w:val="0"/>
+                <w:color w:val="111827"/>
+                <w:sz w:val="17"/>
+              </w:rPr>
+              <w:t>electric_vehicle:manage</w:t>
+            </w:r>
+          </w:p>
+        </w:tc>
+      </w:tr>
+      <w:tr>
+        <w:trPr>
+          <w:cantSplit/>
+        </w:trPr>
+        <w:tc>
+          <w:tcPr>
+            <w:tcW w:type="dxa" w:w="3100"/>
+            <w:tcMar>
+              <w:top w:w="80" w:type="dxa"/>
+              <w:start w:w="120" w:type="dxa"/>
+              <w:bottom w:w="80" w:type="dxa"/>
+              <w:end w:w="120" w:type="dxa"/>
+            </w:tcMar>
+            <w:vAlign w:val="center"/>
+            <w:shd w:fill="FFFFFF"/>
+          </w:tcPr>
+          <w:p>
+            <w:pPr>
+              <w:spacing w:before="0" w:after="40" w:line="252" w:lineRule="auto"/>
+              <w:jc w:val="center"/>
+            </w:pPr>
+            <w:r>
+              <w:rPr>
+                <w:rFonts w:ascii="Calibri" w:hAnsi="Calibri"/>
+                <w:b w:val="0"/>
+                <w:color w:val="111827"/>
+                <w:sz w:val="17"/>
+              </w:rPr>
+              <w:t>GET /api/v1/vehicles/{vehicle_id}/electric/powertrain</w:t>
+            </w:r>
+          </w:p>
+        </w:tc>
+        <w:tc>
+          <w:tcPr>
+            <w:tcW w:type="dxa" w:w="4000"/>
+            <w:tcMar>
+              <w:top w:w="80" w:type="dxa"/>
+              <w:start w:w="120" w:type="dxa"/>
+              <w:bottom w:w="80" w:type="dxa"/>
+              <w:end w:w="120" w:type="dxa"/>
+            </w:tcMar>
+            <w:vAlign w:val="center"/>
+            <w:shd w:fill="FFFFFF"/>
+          </w:tcPr>
+          <w:p>
+            <w:pPr>
+              <w:spacing w:before="0" w:after="40" w:line="252" w:lineRule="auto"/>
+              <w:jc w:val="left"/>
+            </w:pPr>
+            <w:r>
+              <w:rPr>
+                <w:rFonts w:ascii="Calibri" w:hAnsi="Calibri"/>
+                <w:b w:val="0"/>
+                <w:color w:val="111827"/>
+                <w:sz w:val="17"/>
+              </w:rPr>
+              <w:t>Read torque, power, efficiency, and thermal state</w:t>
+            </w:r>
+          </w:p>
+        </w:tc>
+        <w:tc>
+          <w:tcPr>
+            <w:tcW w:type="dxa" w:w="2260"/>
+            <w:tcMar>
+              <w:top w:w="80" w:type="dxa"/>
+              <w:start w:w="120" w:type="dxa"/>
+              <w:bottom w:w="80" w:type="dxa"/>
+              <w:end w:w="120" w:type="dxa"/>
+            </w:tcMar>
+            <w:vAlign w:val="center"/>
+            <w:shd w:fill="FFFFFF"/>
+          </w:tcPr>
+          <w:p>
+            <w:pPr>
+              <w:spacing w:before="0" w:after="40" w:line="252" w:lineRule="auto"/>
+              <w:jc w:val="left"/>
+            </w:pPr>
+            <w:r>
+              <w:rPr>
+                <w:rFonts w:ascii="Calibri" w:hAnsi="Calibri"/>
+                <w:b w:val="0"/>
+                <w:color w:val="111827"/>
+                <w:sz w:val="17"/>
+              </w:rPr>
+              <w:t>electric_vehicle:read</w:t>
+            </w:r>
+          </w:p>
+        </w:tc>
+      </w:tr>
+      <w:tr>
+        <w:trPr>
+          <w:cantSplit/>
+        </w:trPr>
+        <w:tc>
+          <w:tcPr>
+            <w:tcW w:type="dxa" w:w="3100"/>
+            <w:tcMar>
+              <w:top w:w="80" w:type="dxa"/>
+              <w:start w:w="120" w:type="dxa"/>
+              <w:bottom w:w="80" w:type="dxa"/>
+              <w:end w:w="120" w:type="dxa"/>
+            </w:tcMar>
+            <w:vAlign w:val="center"/>
+            <w:shd w:fill="FFFFFF"/>
+          </w:tcPr>
+          <w:p>
+            <w:pPr>
+              <w:spacing w:before="0" w:after="40" w:line="252" w:lineRule="auto"/>
+              <w:jc w:val="center"/>
+            </w:pPr>
+            <w:r>
+              <w:rPr>
+                <w:rFonts w:ascii="Calibri" w:hAnsi="Calibri"/>
+                <w:b w:val="0"/>
+                <w:color w:val="111827"/>
+                <w:sz w:val="17"/>
+              </w:rPr>
+              <w:t>POST /api/v1/vehicles/{vehicle_id}/electric/powertrain/steps</w:t>
+            </w:r>
+          </w:p>
+        </w:tc>
+        <w:tc>
+          <w:tcPr>
+            <w:tcW w:type="dxa" w:w="4000"/>
+            <w:tcMar>
+              <w:top w:w="80" w:type="dxa"/>
+              <w:start w:w="120" w:type="dxa"/>
+              <w:bottom w:w="80" w:type="dxa"/>
+              <w:end w:w="120" w:type="dxa"/>
+            </w:tcMar>
+            <w:vAlign w:val="center"/>
+            <w:shd w:fill="FFFFFF"/>
+          </w:tcPr>
+          <w:p>
+            <w:pPr>
+              <w:spacing w:before="0" w:after="40" w:line="252" w:lineRule="auto"/>
+              <w:jc w:val="left"/>
+            </w:pPr>
+            <w:r>
+              <w:rPr>
+                <w:rFonts w:ascii="Calibri" w:hAnsi="Calibri"/>
+                <w:b w:val="0"/>
+                <w:color w:val="111827"/>
+                <w:sz w:val="17"/>
+              </w:rPr>
+              <w:t>Execute a deterministic propulsion step</w:t>
+            </w:r>
+          </w:p>
+        </w:tc>
+        <w:tc>
+          <w:tcPr>
+            <w:tcW w:type="dxa" w:w="2260"/>
+            <w:tcMar>
+              <w:top w:w="80" w:type="dxa"/>
+              <w:start w:w="120" w:type="dxa"/>
+              <w:bottom w:w="80" w:type="dxa"/>
+              <w:end w:w="120" w:type="dxa"/>
+            </w:tcMar>
+            <w:vAlign w:val="center"/>
+            <w:shd w:fill="FFFFFF"/>
+          </w:tcPr>
+          <w:p>
+            <w:pPr>
+              <w:spacing w:before="0" w:after="40" w:line="252" w:lineRule="auto"/>
+              <w:jc w:val="left"/>
+            </w:pPr>
+            <w:r>
+              <w:rPr>
+                <w:rFonts w:ascii="Calibri" w:hAnsi="Calibri"/>
+                <w:b w:val="0"/>
+                <w:color w:val="111827"/>
+                <w:sz w:val="17"/>
+              </w:rPr>
+              <w:t>electric_vehicle:manage</w:t>
+            </w:r>
+          </w:p>
+        </w:tc>
+      </w:tr>
     </w:tbl>
     <w:p>
       <w:pPr>
@@ -3922,6 +4864,268 @@
                 <w:sz w:val="17"/>
               </w:rPr>
               <w:t>A command ID was reused with different content.</w:t>
+            </w:r>
+          </w:p>
+        </w:tc>
+      </w:tr>
+      <w:tr>
+        <w:trPr>
+          <w:cantSplit/>
+        </w:trPr>
+        <w:tc>
+          <w:tcPr>
+            <w:tcW w:type="dxa" w:w="2700"/>
+            <w:tcMar>
+              <w:top w:w="80" w:type="dxa"/>
+              <w:start w:w="120" w:type="dxa"/>
+              <w:bottom w:w="80" w:type="dxa"/>
+              <w:end w:w="120" w:type="dxa"/>
+            </w:tcMar>
+            <w:vAlign w:val="center"/>
+            <w:shd w:fill="FFFFFF"/>
+          </w:tcPr>
+          <w:p>
+            <w:pPr>
+              <w:spacing w:before="0" w:after="40" w:line="252" w:lineRule="auto"/>
+              <w:jc w:val="left"/>
+            </w:pPr>
+            <w:r>
+              <w:rPr>
+                <w:rFonts w:ascii="Calibri" w:hAnsi="Calibri"/>
+                <w:b w:val="0"/>
+                <w:color w:val="111827"/>
+                <w:sz w:val="17"/>
+              </w:rPr>
+              <w:t>motor_inverter_already_exists</w:t>
+            </w:r>
+          </w:p>
+        </w:tc>
+        <w:tc>
+          <w:tcPr>
+            <w:tcW w:type="dxa" w:w="6660"/>
+            <w:tcMar>
+              <w:top w:w="80" w:type="dxa"/>
+              <w:start w:w="120" w:type="dxa"/>
+              <w:bottom w:w="80" w:type="dxa"/>
+              <w:end w:w="120" w:type="dxa"/>
+            </w:tcMar>
+            <w:vAlign w:val="center"/>
+            <w:shd w:fill="FFFFFF"/>
+          </w:tcPr>
+          <w:p>
+            <w:pPr>
+              <w:spacing w:before="0" w:after="40" w:line="252" w:lineRule="auto"/>
+              <w:jc w:val="left"/>
+            </w:pPr>
+            <w:r>
+              <w:rPr>
+                <w:rFonts w:ascii="Calibri" w:hAnsi="Calibri"/>
+                <w:b w:val="0"/>
+                <w:color w:val="111827"/>
+                <w:sz w:val="17"/>
+              </w:rPr>
+              <w:t>The vehicle already owns a motor/inverter state.</w:t>
+            </w:r>
+          </w:p>
+        </w:tc>
+      </w:tr>
+      <w:tr>
+        <w:trPr>
+          <w:cantSplit/>
+        </w:trPr>
+        <w:tc>
+          <w:tcPr>
+            <w:tcW w:type="dxa" w:w="2700"/>
+            <w:tcMar>
+              <w:top w:w="80" w:type="dxa"/>
+              <w:start w:w="120" w:type="dxa"/>
+              <w:bottom w:w="80" w:type="dxa"/>
+              <w:end w:w="120" w:type="dxa"/>
+            </w:tcMar>
+            <w:vAlign w:val="center"/>
+            <w:shd w:fill="FFFFFF"/>
+          </w:tcPr>
+          <w:p>
+            <w:pPr>
+              <w:spacing w:before="0" w:after="40" w:line="252" w:lineRule="auto"/>
+              <w:jc w:val="left"/>
+            </w:pPr>
+            <w:r>
+              <w:rPr>
+                <w:rFonts w:ascii="Calibri" w:hAnsi="Calibri"/>
+                <w:b w:val="0"/>
+                <w:color w:val="111827"/>
+                <w:sz w:val="17"/>
+              </w:rPr>
+              <w:t>motor_inverter_not_found</w:t>
+            </w:r>
+          </w:p>
+        </w:tc>
+        <w:tc>
+          <w:tcPr>
+            <w:tcW w:type="dxa" w:w="6660"/>
+            <w:tcMar>
+              <w:top w:w="80" w:type="dxa"/>
+              <w:start w:w="120" w:type="dxa"/>
+              <w:bottom w:w="80" w:type="dxa"/>
+              <w:end w:w="120" w:type="dxa"/>
+            </w:tcMar>
+            <w:vAlign w:val="center"/>
+            <w:shd w:fill="FFFFFF"/>
+          </w:tcPr>
+          <w:p>
+            <w:pPr>
+              <w:spacing w:before="0" w:after="40" w:line="252" w:lineRule="auto"/>
+              <w:jc w:val="left"/>
+            </w:pPr>
+            <w:r>
+              <w:rPr>
+                <w:rFonts w:ascii="Calibri" w:hAnsi="Calibri"/>
+                <w:b w:val="0"/>
+                <w:color w:val="111827"/>
+                <w:sz w:val="17"/>
+              </w:rPr>
+              <w:t>No motor/inverter state exists for the vehicle.</w:t>
+            </w:r>
+          </w:p>
+        </w:tc>
+      </w:tr>
+      <w:tr>
+        <w:trPr>
+          <w:cantSplit/>
+        </w:trPr>
+        <w:tc>
+          <w:tcPr>
+            <w:tcW w:type="dxa" w:w="2700"/>
+            <w:tcMar>
+              <w:top w:w="80" w:type="dxa"/>
+              <w:start w:w="120" w:type="dxa"/>
+              <w:bottom w:w="80" w:type="dxa"/>
+              <w:end w:w="120" w:type="dxa"/>
+            </w:tcMar>
+            <w:vAlign w:val="center"/>
+            <w:shd w:fill="FFFFFF"/>
+          </w:tcPr>
+          <w:p>
+            <w:pPr>
+              <w:spacing w:before="0" w:after="40" w:line="252" w:lineRule="auto"/>
+              <w:jc w:val="left"/>
+            </w:pPr>
+            <w:r>
+              <w:rPr>
+                <w:rFonts w:ascii="Calibri" w:hAnsi="Calibri"/>
+                <w:b w:val="0"/>
+                <w:color w:val="111827"/>
+                <w:sz w:val="17"/>
+              </w:rPr>
+              <w:t>motor_state_version_conflict</w:t>
+            </w:r>
+          </w:p>
+        </w:tc>
+        <w:tc>
+          <w:tcPr>
+            <w:tcW w:type="dxa" w:w="6660"/>
+            <w:tcMar>
+              <w:top w:w="80" w:type="dxa"/>
+              <w:start w:w="120" w:type="dxa"/>
+              <w:bottom w:w="80" w:type="dxa"/>
+              <w:end w:w="120" w:type="dxa"/>
+            </w:tcMar>
+            <w:vAlign w:val="center"/>
+            <w:shd w:fill="FFFFFF"/>
+          </w:tcPr>
+          <w:p>
+            <w:pPr>
+              <w:spacing w:before="0" w:after="40" w:line="252" w:lineRule="auto"/>
+              <w:jc w:val="left"/>
+            </w:pPr>
+            <w:r>
+              <w:rPr>
+                <w:rFonts w:ascii="Calibri" w:hAnsi="Calibri"/>
+                <w:b w:val="0"/>
+                <w:color w:val="111827"/>
+                <w:sz w:val="17"/>
+              </w:rPr>
+              <w:t xml:space="preserve">The powertrain </w:t>
+            </w:r>
+            <w:r>
+              <w:rPr>
+                <w:rFonts w:ascii="Calibri" w:hAnsi="Calibri"/>
+                <w:b w:val="0"/>
+                <w:color w:val="111827"/>
+                <w:sz w:val="17"/>
+              </w:rPr>
+              <w:t>expected_version</w:t>
+            </w:r>
+            <w:r>
+              <w:rPr>
+                <w:rFonts w:ascii="Calibri" w:hAnsi="Calibri"/>
+                <w:b w:val="0"/>
+                <w:color w:val="111827"/>
+                <w:sz w:val="17"/>
+              </w:rPr>
+              <w:t xml:space="preserve"> is stale.</w:t>
+            </w:r>
+          </w:p>
+        </w:tc>
+      </w:tr>
+      <w:tr>
+        <w:trPr>
+          <w:cantSplit/>
+        </w:trPr>
+        <w:tc>
+          <w:tcPr>
+            <w:tcW w:type="dxa" w:w="2700"/>
+            <w:tcMar>
+              <w:top w:w="80" w:type="dxa"/>
+              <w:start w:w="120" w:type="dxa"/>
+              <w:bottom w:w="80" w:type="dxa"/>
+              <w:end w:w="120" w:type="dxa"/>
+            </w:tcMar>
+            <w:vAlign w:val="center"/>
+            <w:shd w:fill="FFFFFF"/>
+          </w:tcPr>
+          <w:p>
+            <w:pPr>
+              <w:spacing w:before="0" w:after="40" w:line="252" w:lineRule="auto"/>
+              <w:jc w:val="left"/>
+            </w:pPr>
+            <w:r>
+              <w:rPr>
+                <w:rFonts w:ascii="Calibri" w:hAnsi="Calibri"/>
+                <w:b w:val="0"/>
+                <w:color w:val="111827"/>
+                <w:sz w:val="17"/>
+              </w:rPr>
+              <w:t>motor_simulation_command_conflict</w:t>
+            </w:r>
+          </w:p>
+        </w:tc>
+        <w:tc>
+          <w:tcPr>
+            <w:tcW w:type="dxa" w:w="6660"/>
+            <w:tcMar>
+              <w:top w:w="80" w:type="dxa"/>
+              <w:start w:w="120" w:type="dxa"/>
+              <w:bottom w:w="80" w:type="dxa"/>
+              <w:end w:w="120" w:type="dxa"/>
+            </w:tcMar>
+            <w:vAlign w:val="center"/>
+            <w:shd w:fill="FFFFFF"/>
+          </w:tcPr>
+          <w:p>
+            <w:pPr>
+              <w:spacing w:before="0" w:after="40" w:line="252" w:lineRule="auto"/>
+              <w:jc w:val="left"/>
+            </w:pPr>
+            <w:r>
+              <w:rPr>
+                <w:rFonts w:ascii="Calibri" w:hAnsi="Calibri"/>
+                <w:b w:val="0"/>
+                <w:color w:val="111827"/>
+                <w:sz w:val="17"/>
+              </w:rPr>
+              <w:t>A motor command ID was reused differently.</w:t>
             </w:r>
           </w:p>
         </w:tc>
@@ -4119,7 +5323,55 @@
           <w:color w:val="111827"/>
           <w:sz w:val="22"/>
         </w:rPr>
-        <w:t>. Database checks reinforce API limits for cell count, capacity, SOC, SOH, versions, duration, BMS state, and contactor state.</w:t>
+        <w:t xml:space="preserve">. Migration </w:t>
+      </w:r>
+      <w:r>
+        <w:rPr>
+          <w:rFonts w:ascii="Consolas" w:hAnsi="Consolas"/>
+          <w:color w:val="1F4D78"/>
+          <w:sz w:val="19"/>
+        </w:rPr>
+        <w:t>0038_motor_inverter</w:t>
+      </w:r>
+      <w:r>
+        <w:rPr>
+          <w:rFonts w:ascii="Calibri" w:hAnsi="Calibri"/>
+          <w:color w:val="111827"/>
+          <w:sz w:val="22"/>
+        </w:rPr>
+        <w:t xml:space="preserve"> creates </w:t>
+      </w:r>
+      <w:r>
+        <w:rPr>
+          <w:rFonts w:ascii="Consolas" w:hAnsi="Consolas"/>
+          <w:color w:val="1F4D78"/>
+          <w:sz w:val="19"/>
+        </w:rPr>
+        <w:t>motor_inverter_states</w:t>
+      </w:r>
+      <w:r>
+        <w:rPr>
+          <w:rFonts w:ascii="Calibri" w:hAnsi="Calibri"/>
+          <w:color w:val="111827"/>
+          <w:sz w:val="22"/>
+        </w:rPr>
+        <w:t xml:space="preserve"> and </w:t>
+      </w:r>
+      <w:r>
+        <w:rPr>
+          <w:rFonts w:ascii="Consolas" w:hAnsi="Consolas"/>
+          <w:color w:val="1F4D78"/>
+          <w:sz w:val="19"/>
+        </w:rPr>
+        <w:t>motor_simulation_steps</w:t>
+      </w:r>
+      <w:r>
+        <w:rPr>
+          <w:rFonts w:ascii="Calibri" w:hAnsi="Calibri"/>
+          <w:color w:val="111827"/>
+          <w:sz w:val="22"/>
+        </w:rPr>
+        <w:t>. Database checks reinforce the bounded states, versions, and durations.</w:t>
       </w:r>
     </w:p>
     <w:tbl>
@@ -4411,6 +5663,184 @@
           </w:p>
         </w:tc>
       </w:tr>
+      <w:tr>
+        <w:trPr>
+          <w:cantSplit/>
+        </w:trPr>
+        <w:tc>
+          <w:tcPr>
+            <w:tcW w:type="dxa" w:w="1650"/>
+            <w:tcMar>
+              <w:top w:w="80" w:type="dxa"/>
+              <w:start w:w="120" w:type="dxa"/>
+              <w:bottom w:w="80" w:type="dxa"/>
+              <w:end w:w="120" w:type="dxa"/>
+            </w:tcMar>
+            <w:vAlign w:val="center"/>
+            <w:shd w:fill="FFFFFF"/>
+          </w:tcPr>
+          <w:p>
+            <w:pPr>
+              <w:spacing w:before="0" w:after="40" w:line="252" w:lineRule="auto"/>
+              <w:jc w:val="center"/>
+            </w:pPr>
+            <w:r>
+              <w:rPr>
+                <w:rFonts w:ascii="Calibri" w:hAnsi="Calibri"/>
+                <w:b w:val="0"/>
+                <w:color w:val="111827"/>
+                <w:sz w:val="17"/>
+              </w:rPr>
+              <w:t>atep.electric_vehicle.motor_inverter.created.v1</w:t>
+            </w:r>
+          </w:p>
+        </w:tc>
+        <w:tc>
+          <w:tcPr>
+            <w:tcW w:type="dxa" w:w="4450"/>
+            <w:tcMar>
+              <w:top w:w="80" w:type="dxa"/>
+              <w:start w:w="120" w:type="dxa"/>
+              <w:bottom w:w="80" w:type="dxa"/>
+              <w:end w:w="120" w:type="dxa"/>
+            </w:tcMar>
+            <w:vAlign w:val="center"/>
+            <w:shd w:fill="FFFFFF"/>
+          </w:tcPr>
+          <w:p>
+            <w:pPr>
+              <w:spacing w:before="0" w:after="40" w:line="252" w:lineRule="auto"/>
+              <w:jc w:val="left"/>
+            </w:pPr>
+            <w:r>
+              <w:rPr>
+                <w:rFonts w:ascii="Calibri" w:hAnsi="Calibri"/>
+                <w:b w:val="0"/>
+                <w:color w:val="111827"/>
+                <w:sz w:val="17"/>
+              </w:rPr>
+              <w:t>Announce configured propulsion hardware</w:t>
+            </w:r>
+          </w:p>
+        </w:tc>
+        <w:tc>
+          <w:tcPr>
+            <w:tcW w:type="dxa" w:w="3260"/>
+            <w:tcMar>
+              <w:top w:w="80" w:type="dxa"/>
+              <w:start w:w="120" w:type="dxa"/>
+              <w:bottom w:w="80" w:type="dxa"/>
+              <w:end w:w="120" w:type="dxa"/>
+            </w:tcMar>
+            <w:vAlign w:val="center"/>
+            <w:shd w:fill="FFFFFF"/>
+          </w:tcPr>
+          <w:p>
+            <w:pPr>
+              <w:spacing w:before="0" w:after="40" w:line="252" w:lineRule="auto"/>
+              <w:jc w:val="left"/>
+            </w:pPr>
+            <w:r>
+              <w:rPr>
+                <w:rFonts w:ascii="Calibri" w:hAnsi="Calibri"/>
+                <w:b w:val="0"/>
+                <w:color w:val="111827"/>
+                <w:sz w:val="17"/>
+              </w:rPr>
+              <w:t>Bounded configuration only</w:t>
+            </w:r>
+          </w:p>
+        </w:tc>
+      </w:tr>
+      <w:tr>
+        <w:trPr>
+          <w:cantSplit/>
+        </w:trPr>
+        <w:tc>
+          <w:tcPr>
+            <w:tcW w:type="dxa" w:w="1650"/>
+            <w:tcMar>
+              <w:top w:w="80" w:type="dxa"/>
+              <w:start w:w="120" w:type="dxa"/>
+              <w:bottom w:w="80" w:type="dxa"/>
+              <w:end w:w="120" w:type="dxa"/>
+            </w:tcMar>
+            <w:vAlign w:val="center"/>
+            <w:shd w:fill="FFFFFF"/>
+          </w:tcPr>
+          <w:p>
+            <w:pPr>
+              <w:spacing w:before="0" w:after="40" w:line="252" w:lineRule="auto"/>
+              <w:jc w:val="center"/>
+            </w:pPr>
+            <w:r>
+              <w:rPr>
+                <w:rFonts w:ascii="Calibri" w:hAnsi="Calibri"/>
+                <w:b w:val="0"/>
+                <w:color w:val="111827"/>
+                <w:sz w:val="17"/>
+              </w:rPr>
+              <w:t>atep.electric_vehicle.motor.step.completed.v1</w:t>
+            </w:r>
+          </w:p>
+        </w:tc>
+        <w:tc>
+          <w:tcPr>
+            <w:tcW w:type="dxa" w:w="4450"/>
+            <w:tcMar>
+              <w:top w:w="80" w:type="dxa"/>
+              <w:start w:w="120" w:type="dxa"/>
+              <w:bottom w:w="80" w:type="dxa"/>
+              <w:end w:w="120" w:type="dxa"/>
+            </w:tcMar>
+            <w:vAlign w:val="center"/>
+            <w:shd w:fill="FFFFFF"/>
+          </w:tcPr>
+          <w:p>
+            <w:pPr>
+              <w:spacing w:before="0" w:after="40" w:line="252" w:lineRule="auto"/>
+              <w:jc w:val="left"/>
+            </w:pPr>
+            <w:r>
+              <w:rPr>
+                <w:rFonts w:ascii="Calibri" w:hAnsi="Calibri"/>
+                <w:b w:val="0"/>
+                <w:color w:val="111827"/>
+                <w:sz w:val="17"/>
+              </w:rPr>
+              <w:t>Announce torque and power outcome</w:t>
+            </w:r>
+          </w:p>
+        </w:tc>
+        <w:tc>
+          <w:tcPr>
+            <w:tcW w:type="dxa" w:w="3260"/>
+            <w:tcMar>
+              <w:top w:w="80" w:type="dxa"/>
+              <w:start w:w="120" w:type="dxa"/>
+              <w:bottom w:w="80" w:type="dxa"/>
+              <w:end w:w="120" w:type="dxa"/>
+            </w:tcMar>
+            <w:vAlign w:val="center"/>
+            <w:shd w:fill="FFFFFF"/>
+          </w:tcPr>
+          <w:p>
+            <w:pPr>
+              <w:spacing w:before="0" w:after="40" w:line="252" w:lineRule="auto"/>
+              <w:jc w:val="left"/>
+            </w:pPr>
+            <w:r>
+              <w:rPr>
+                <w:rFonts w:ascii="Calibri" w:hAnsi="Calibri"/>
+                <w:b w:val="0"/>
+                <w:color w:val="111827"/>
+                <w:sz w:val="17"/>
+              </w:rPr>
+              <w:t>Summary, limit reason, and versions</w:t>
+            </w:r>
+          </w:p>
+        </w:tc>
+      </w:tr>
     </w:tbl>
     <w:p>
       <w:pPr>
@@ -4434,7 +5864,7 @@
           <w:color w:val="111827"/>
           <w:sz w:val="22"/>
         </w:rPr>
-        <w:t xml:space="preserve">VI-1 implements EV-F-001 through EV-F-014 and EV-NF-001 through EV-NF-008. The authoritative traceability table is maintained in </w:t>
+        <w:t xml:space="preserve">VI-1 and VI-2 implement EV-F-001 through EV-F-028 and EV-NF-001 through EV-NF-012. The authoritative traceability table is maintained in </w:t>
       </w:r>
       <w:r>
         <w:rPr>
@@ -4577,6 +6007,66 @@
     </w:p>
     <w:p>
       <w:pPr>
+        <w:pStyle w:val="Heading2"/>
+        <w:keepNext/>
+        <w:keepLines/>
+      </w:pPr>
+      <w:r>
+        <w:t>ADR-EV-005 - Keep Battery and Propulsion Aggregates Separate</w:t>
+      </w:r>
+    </w:p>
+    <w:p>
+      <w:r>
+        <w:rPr>
+          <w:rFonts w:ascii="Calibri" w:hAnsi="Calibri"/>
+          <w:color w:val="111827"/>
+          <w:sz w:val="22"/>
+        </w:rPr>
+        <w:t>Decision: motor commands lock and read the battery aggregate but persist propulsion state in a dedicated aggregate. Rationale: explicit ownership prevents a single oversized EV state while still producing consistent power-limit evidence.</w:t>
+      </w:r>
+    </w:p>
+    <w:p>
+      <w:pPr>
+        <w:pStyle w:val="Heading2"/>
+        <w:keepNext/>
+        <w:keepLines/>
+      </w:pPr>
+      <w:r>
+        <w:t>ADR-EV-006 - Use an Explainable Analytic Efficiency Surface</w:t>
+      </w:r>
+    </w:p>
+    <w:p>
+      <w:r>
+        <w:rPr>
+          <w:rFonts w:ascii="Calibri" w:hAnsi="Calibri"/>
+          <w:color w:val="111827"/>
+          <w:sz w:val="22"/>
+        </w:rPr>
+        <w:t>Decision: VI-2 derives efficiency from bounded torque and speed ratios. Rationale: the model is portable, deterministic, and auditable without proprietary calibration data. Versioned efficiency maps can replace it later behind the same contract.</w:t>
+      </w:r>
+    </w:p>
+    <w:p>
+      <w:pPr>
+        <w:pStyle w:val="Heading2"/>
+        <w:keepNext/>
+        <w:keepLines/>
+      </w:pPr>
+      <w:r>
+        <w:t>ADR-EV-007 - Reserve Negative Torque for Regeneration</w:t>
+      </w:r>
+    </w:p>
+    <w:p>
+      <w:r>
+        <w:rPr>
+          <w:rFonts w:ascii="Calibri" w:hAnsi="Calibri"/>
+          <w:color w:val="111827"/>
+          <w:sz w:val="22"/>
+        </w:rPr>
+        <w:t>Decision: reject negative requested torque in VI-2. Rationale: regeneration requires battery charge-acceptance and blended-brake policies that belong together in VI-3.</w:t>
+      </w:r>
+    </w:p>
+    <w:p>
+      <w:pPr>
         <w:pStyle w:val="Heading1"/>
         <w:keepNext/>
         <w:keepLines/>
@@ -7529,6 +9019,2346 @@
                 <w:sz w:val="16"/>
               </w:rPr>
               <w:t>VI-1 tables removed cleanly</w:t>
+            </w:r>
+          </w:p>
+        </w:tc>
+      </w:tr>
+      <w:tr>
+        <w:trPr>
+          <w:cantSplit/>
+        </w:trPr>
+        <w:tc>
+          <w:tcPr>
+            <w:tcW w:type="dxa" w:w="1150"/>
+            <w:tcMar>
+              <w:top w:w="80" w:type="dxa"/>
+              <w:start w:w="120" w:type="dxa"/>
+              <w:bottom w:w="80" w:type="dxa"/>
+              <w:end w:w="120" w:type="dxa"/>
+            </w:tcMar>
+            <w:vAlign w:val="center"/>
+            <w:shd w:fill="FFFFFF"/>
+          </w:tcPr>
+          <w:p>
+            <w:pPr>
+              <w:spacing w:before="0" w:after="40" w:line="252" w:lineRule="auto"/>
+              <w:jc w:val="center"/>
+            </w:pPr>
+            <w:r>
+              <w:rPr>
+                <w:rFonts w:ascii="Calibri" w:hAnsi="Calibri"/>
+                <w:b w:val="0"/>
+                <w:color w:val="111827"/>
+                <w:sz w:val="16"/>
+              </w:rPr>
+              <w:t>EV-T-025</w:t>
+            </w:r>
+          </w:p>
+        </w:tc>
+        <w:tc>
+          <w:tcPr>
+            <w:tcW w:type="dxa" w:w="3700"/>
+            <w:tcMar>
+              <w:top w:w="80" w:type="dxa"/>
+              <w:start w:w="120" w:type="dxa"/>
+              <w:bottom w:w="80" w:type="dxa"/>
+              <w:end w:w="120" w:type="dxa"/>
+            </w:tcMar>
+            <w:vAlign w:val="center"/>
+            <w:shd w:fill="FFFFFF"/>
+          </w:tcPr>
+          <w:p>
+            <w:pPr>
+              <w:spacing w:before="0" w:after="40" w:line="252" w:lineRule="auto"/>
+              <w:jc w:val="left"/>
+            </w:pPr>
+            <w:r>
+              <w:rPr>
+                <w:rFonts w:ascii="Calibri" w:hAnsi="Calibri"/>
+                <w:b w:val="0"/>
+                <w:color w:val="111827"/>
+                <w:sz w:val="16"/>
+              </w:rPr>
+              <w:t>Motor creation</w:t>
+            </w:r>
+          </w:p>
+        </w:tc>
+        <w:tc>
+          <w:tcPr>
+            <w:tcW w:type="dxa" w:w="3100"/>
+            <w:tcMar>
+              <w:top w:w="80" w:type="dxa"/>
+              <w:start w:w="120" w:type="dxa"/>
+              <w:bottom w:w="80" w:type="dxa"/>
+              <w:end w:w="120" w:type="dxa"/>
+            </w:tcMar>
+            <w:vAlign w:val="center"/>
+            <w:shd w:fill="FFFFFF"/>
+          </w:tcPr>
+          <w:p>
+            <w:pPr>
+              <w:spacing w:before="0" w:after="40" w:line="252" w:lineRule="auto"/>
+              <w:jc w:val="left"/>
+            </w:pPr>
+            <w:r>
+              <w:rPr>
+                <w:rFonts w:ascii="Calibri" w:hAnsi="Calibri"/>
+                <w:b w:val="0"/>
+                <w:color w:val="111827"/>
+                <w:sz w:val="16"/>
+              </w:rPr>
+              <w:t>Create one state after battery creation</w:t>
+            </w:r>
+          </w:p>
+        </w:tc>
+        <w:tc>
+          <w:tcPr>
+            <w:tcW w:type="dxa" w:w="1410"/>
+            <w:tcMar>
+              <w:top w:w="80" w:type="dxa"/>
+              <w:start w:w="120" w:type="dxa"/>
+              <w:bottom w:w="80" w:type="dxa"/>
+              <w:end w:w="120" w:type="dxa"/>
+            </w:tcMar>
+            <w:vAlign w:val="center"/>
+            <w:shd w:fill="FFFFFF"/>
+          </w:tcPr>
+          <w:p>
+            <w:pPr>
+              <w:spacing w:before="0" w:after="40" w:line="252" w:lineRule="auto"/>
+              <w:jc w:val="left"/>
+            </w:pPr>
+            <w:r>
+              <w:rPr>
+                <w:rFonts w:ascii="Calibri" w:hAnsi="Calibri"/>
+                <w:b w:val="0"/>
+                <w:color w:val="111827"/>
+                <w:sz w:val="16"/>
+              </w:rPr>
+              <w:t>Version 1 and standby</w:t>
+            </w:r>
+          </w:p>
+        </w:tc>
+      </w:tr>
+      <w:tr>
+        <w:trPr>
+          <w:cantSplit/>
+        </w:trPr>
+        <w:tc>
+          <w:tcPr>
+            <w:tcW w:type="dxa" w:w="1150"/>
+            <w:tcMar>
+              <w:top w:w="80" w:type="dxa"/>
+              <w:start w:w="120" w:type="dxa"/>
+              <w:bottom w:w="80" w:type="dxa"/>
+              <w:end w:w="120" w:type="dxa"/>
+            </w:tcMar>
+            <w:vAlign w:val="center"/>
+            <w:shd w:fill="FFFFFF"/>
+          </w:tcPr>
+          <w:p>
+            <w:pPr>
+              <w:spacing w:before="0" w:after="40" w:line="252" w:lineRule="auto"/>
+              <w:jc w:val="center"/>
+            </w:pPr>
+            <w:r>
+              <w:rPr>
+                <w:rFonts w:ascii="Calibri" w:hAnsi="Calibri"/>
+                <w:b w:val="0"/>
+                <w:color w:val="111827"/>
+                <w:sz w:val="16"/>
+              </w:rPr>
+              <w:t>EV-T-026</w:t>
+            </w:r>
+          </w:p>
+        </w:tc>
+        <w:tc>
+          <w:tcPr>
+            <w:tcW w:type="dxa" w:w="3700"/>
+            <w:tcMar>
+              <w:top w:w="80" w:type="dxa"/>
+              <w:start w:w="120" w:type="dxa"/>
+              <w:bottom w:w="80" w:type="dxa"/>
+              <w:end w:w="120" w:type="dxa"/>
+            </w:tcMar>
+            <w:vAlign w:val="center"/>
+            <w:shd w:fill="FFFFFF"/>
+          </w:tcPr>
+          <w:p>
+            <w:pPr>
+              <w:spacing w:before="0" w:after="40" w:line="252" w:lineRule="auto"/>
+              <w:jc w:val="left"/>
+            </w:pPr>
+            <w:r>
+              <w:rPr>
+                <w:rFonts w:ascii="Calibri" w:hAnsi="Calibri"/>
+                <w:b w:val="0"/>
+                <w:color w:val="111827"/>
+                <w:sz w:val="16"/>
+              </w:rPr>
+              <w:t>Duplicate motor</w:t>
+            </w:r>
+          </w:p>
+        </w:tc>
+        <w:tc>
+          <w:tcPr>
+            <w:tcW w:type="dxa" w:w="3100"/>
+            <w:tcMar>
+              <w:top w:w="80" w:type="dxa"/>
+              <w:start w:w="120" w:type="dxa"/>
+              <w:bottom w:w="80" w:type="dxa"/>
+              <w:end w:w="120" w:type="dxa"/>
+            </w:tcMar>
+            <w:vAlign w:val="center"/>
+            <w:shd w:fill="FFFFFF"/>
+          </w:tcPr>
+          <w:p>
+            <w:pPr>
+              <w:spacing w:before="0" w:after="40" w:line="252" w:lineRule="auto"/>
+              <w:jc w:val="left"/>
+            </w:pPr>
+            <w:r>
+              <w:rPr>
+                <w:rFonts w:ascii="Calibri" w:hAnsi="Calibri"/>
+                <w:b w:val="0"/>
+                <w:color w:val="111827"/>
+                <w:sz w:val="16"/>
+              </w:rPr>
+              <w:t>Enforce one state per vehicle</w:t>
+            </w:r>
+          </w:p>
+        </w:tc>
+        <w:tc>
+          <w:tcPr>
+            <w:tcW w:type="dxa" w:w="1410"/>
+            <w:tcMar>
+              <w:top w:w="80" w:type="dxa"/>
+              <w:start w:w="120" w:type="dxa"/>
+              <w:bottom w:w="80" w:type="dxa"/>
+              <w:end w:w="120" w:type="dxa"/>
+            </w:tcMar>
+            <w:vAlign w:val="center"/>
+            <w:shd w:fill="FFFFFF"/>
+          </w:tcPr>
+          <w:p>
+            <w:pPr>
+              <w:spacing w:before="0" w:after="40" w:line="252" w:lineRule="auto"/>
+              <w:jc w:val="left"/>
+            </w:pPr>
+            <w:r>
+              <w:rPr>
+                <w:rFonts w:ascii="Calibri" w:hAnsi="Calibri"/>
+                <w:b w:val="0"/>
+                <w:color w:val="111827"/>
+                <w:sz w:val="16"/>
+              </w:rPr>
+              <w:t>Stable 409 conflict</w:t>
+            </w:r>
+          </w:p>
+        </w:tc>
+      </w:tr>
+      <w:tr>
+        <w:trPr>
+          <w:cantSplit/>
+        </w:trPr>
+        <w:tc>
+          <w:tcPr>
+            <w:tcW w:type="dxa" w:w="1150"/>
+            <w:tcMar>
+              <w:top w:w="80" w:type="dxa"/>
+              <w:start w:w="120" w:type="dxa"/>
+              <w:bottom w:w="80" w:type="dxa"/>
+              <w:end w:w="120" w:type="dxa"/>
+            </w:tcMar>
+            <w:vAlign w:val="center"/>
+            <w:shd w:fill="FFFFFF"/>
+          </w:tcPr>
+          <w:p>
+            <w:pPr>
+              <w:spacing w:before="0" w:after="40" w:line="252" w:lineRule="auto"/>
+              <w:jc w:val="center"/>
+            </w:pPr>
+            <w:r>
+              <w:rPr>
+                <w:rFonts w:ascii="Calibri" w:hAnsi="Calibri"/>
+                <w:b w:val="0"/>
+                <w:color w:val="111827"/>
+                <w:sz w:val="16"/>
+              </w:rPr>
+              <w:t>EV-T-027</w:t>
+            </w:r>
+          </w:p>
+        </w:tc>
+        <w:tc>
+          <w:tcPr>
+            <w:tcW w:type="dxa" w:w="3700"/>
+            <w:tcMar>
+              <w:top w:w="80" w:type="dxa"/>
+              <w:start w:w="120" w:type="dxa"/>
+              <w:bottom w:w="80" w:type="dxa"/>
+              <w:end w:w="120" w:type="dxa"/>
+            </w:tcMar>
+            <w:vAlign w:val="center"/>
+            <w:shd w:fill="FFFFFF"/>
+          </w:tcPr>
+          <w:p>
+            <w:pPr>
+              <w:spacing w:before="0" w:after="40" w:line="252" w:lineRule="auto"/>
+              <w:jc w:val="left"/>
+            </w:pPr>
+            <w:r>
+              <w:rPr>
+                <w:rFonts w:ascii="Calibri" w:hAnsi="Calibri"/>
+                <w:b w:val="0"/>
+                <w:color w:val="111827"/>
+                <w:sz w:val="16"/>
+              </w:rPr>
+              <w:t>Normal torque delivery</w:t>
+            </w:r>
+          </w:p>
+        </w:tc>
+        <w:tc>
+          <w:tcPr>
+            <w:tcW w:type="dxa" w:w="3100"/>
+            <w:tcMar>
+              <w:top w:w="80" w:type="dxa"/>
+              <w:start w:w="120" w:type="dxa"/>
+              <w:bottom w:w="80" w:type="dxa"/>
+              <w:end w:w="120" w:type="dxa"/>
+            </w:tcMar>
+            <w:vAlign w:val="center"/>
+            <w:shd w:fill="FFFFFF"/>
+          </w:tcPr>
+          <w:p>
+            <w:pPr>
+              <w:spacing w:before="0" w:after="40" w:line="252" w:lineRule="auto"/>
+              <w:jc w:val="left"/>
+            </w:pPr>
+            <w:r>
+              <w:rPr>
+                <w:rFonts w:ascii="Calibri" w:hAnsi="Calibri"/>
+                <w:b w:val="0"/>
+                <w:color w:val="111827"/>
+                <w:sz w:val="16"/>
+              </w:rPr>
+              <w:t>Request torque within all limits</w:t>
+            </w:r>
+          </w:p>
+        </w:tc>
+        <w:tc>
+          <w:tcPr>
+            <w:tcW w:type="dxa" w:w="1410"/>
+            <w:tcMar>
+              <w:top w:w="80" w:type="dxa"/>
+              <w:start w:w="120" w:type="dxa"/>
+              <w:bottom w:w="80" w:type="dxa"/>
+              <w:end w:w="120" w:type="dxa"/>
+            </w:tcMar>
+            <w:vAlign w:val="center"/>
+            <w:shd w:fill="FFFFFF"/>
+          </w:tcPr>
+          <w:p>
+            <w:pPr>
+              <w:spacing w:before="0" w:after="40" w:line="252" w:lineRule="auto"/>
+              <w:jc w:val="left"/>
+            </w:pPr>
+            <w:r>
+              <w:rPr>
+                <w:rFonts w:ascii="Calibri" w:hAnsi="Calibri"/>
+                <w:b w:val="0"/>
+                <w:color w:val="111827"/>
+                <w:sz w:val="16"/>
+              </w:rPr>
+              <w:t>Requested torque delivered</w:t>
+            </w:r>
+          </w:p>
+        </w:tc>
+      </w:tr>
+      <w:tr>
+        <w:trPr>
+          <w:cantSplit/>
+        </w:trPr>
+        <w:tc>
+          <w:tcPr>
+            <w:tcW w:type="dxa" w:w="1150"/>
+            <w:tcMar>
+              <w:top w:w="80" w:type="dxa"/>
+              <w:start w:w="120" w:type="dxa"/>
+              <w:bottom w:w="80" w:type="dxa"/>
+              <w:end w:w="120" w:type="dxa"/>
+            </w:tcMar>
+            <w:vAlign w:val="center"/>
+            <w:shd w:fill="FFFFFF"/>
+          </w:tcPr>
+          <w:p>
+            <w:pPr>
+              <w:spacing w:before="0" w:after="40" w:line="252" w:lineRule="auto"/>
+              <w:jc w:val="center"/>
+            </w:pPr>
+            <w:r>
+              <w:rPr>
+                <w:rFonts w:ascii="Calibri" w:hAnsi="Calibri"/>
+                <w:b w:val="0"/>
+                <w:color w:val="111827"/>
+                <w:sz w:val="16"/>
+              </w:rPr>
+              <w:t>EV-T-028</w:t>
+            </w:r>
+          </w:p>
+        </w:tc>
+        <w:tc>
+          <w:tcPr>
+            <w:tcW w:type="dxa" w:w="3700"/>
+            <w:tcMar>
+              <w:top w:w="80" w:type="dxa"/>
+              <w:start w:w="120" w:type="dxa"/>
+              <w:bottom w:w="80" w:type="dxa"/>
+              <w:end w:w="120" w:type="dxa"/>
+            </w:tcMar>
+            <w:vAlign w:val="center"/>
+            <w:shd w:fill="FFFFFF"/>
+          </w:tcPr>
+          <w:p>
+            <w:pPr>
+              <w:spacing w:before="0" w:after="40" w:line="252" w:lineRule="auto"/>
+              <w:jc w:val="left"/>
+            </w:pPr>
+            <w:r>
+              <w:rPr>
+                <w:rFonts w:ascii="Calibri" w:hAnsi="Calibri"/>
+                <w:b w:val="0"/>
+                <w:color w:val="111827"/>
+                <w:sz w:val="16"/>
+              </w:rPr>
+              <w:t>Mechanical power</w:t>
+            </w:r>
+          </w:p>
+        </w:tc>
+        <w:tc>
+          <w:tcPr>
+            <w:tcW w:type="dxa" w:w="3100"/>
+            <w:tcMar>
+              <w:top w:w="80" w:type="dxa"/>
+              <w:start w:w="120" w:type="dxa"/>
+              <w:bottom w:w="80" w:type="dxa"/>
+              <w:end w:w="120" w:type="dxa"/>
+            </w:tcMar>
+            <w:vAlign w:val="center"/>
+            <w:shd w:fill="FFFFFF"/>
+          </w:tcPr>
+          <w:p>
+            <w:pPr>
+              <w:spacing w:before="0" w:after="40" w:line="252" w:lineRule="auto"/>
+              <w:jc w:val="left"/>
+            </w:pPr>
+            <w:r>
+              <w:rPr>
+                <w:rFonts w:ascii="Calibri" w:hAnsi="Calibri"/>
+                <w:b w:val="0"/>
+                <w:color w:val="111827"/>
+                <w:sz w:val="16"/>
+              </w:rPr>
+              <w:t>Apply torque at nonzero speed</w:t>
+            </w:r>
+          </w:p>
+        </w:tc>
+        <w:tc>
+          <w:tcPr>
+            <w:tcW w:type="dxa" w:w="1410"/>
+            <w:tcMar>
+              <w:top w:w="80" w:type="dxa"/>
+              <w:start w:w="120" w:type="dxa"/>
+              <w:bottom w:w="80" w:type="dxa"/>
+              <w:end w:w="120" w:type="dxa"/>
+            </w:tcMar>
+            <w:vAlign w:val="center"/>
+            <w:shd w:fill="FFFFFF"/>
+          </w:tcPr>
+          <w:p>
+            <w:pPr>
+              <w:spacing w:before="0" w:after="40" w:line="252" w:lineRule="auto"/>
+              <w:jc w:val="left"/>
+            </w:pPr>
+            <w:r>
+              <w:rPr>
+                <w:rFonts w:ascii="Calibri" w:hAnsi="Calibri"/>
+                <w:b w:val="0"/>
+                <w:color w:val="111827"/>
+                <w:sz w:val="16"/>
+              </w:rPr>
+              <w:t>Torque times angular speed</w:t>
+            </w:r>
+          </w:p>
+        </w:tc>
+      </w:tr>
+      <w:tr>
+        <w:trPr>
+          <w:cantSplit/>
+        </w:trPr>
+        <w:tc>
+          <w:tcPr>
+            <w:tcW w:type="dxa" w:w="1150"/>
+            <w:tcMar>
+              <w:top w:w="80" w:type="dxa"/>
+              <w:start w:w="120" w:type="dxa"/>
+              <w:bottom w:w="80" w:type="dxa"/>
+              <w:end w:w="120" w:type="dxa"/>
+            </w:tcMar>
+            <w:vAlign w:val="center"/>
+            <w:shd w:fill="FFFFFF"/>
+          </w:tcPr>
+          <w:p>
+            <w:pPr>
+              <w:spacing w:before="0" w:after="40" w:line="252" w:lineRule="auto"/>
+              <w:jc w:val="center"/>
+            </w:pPr>
+            <w:r>
+              <w:rPr>
+                <w:rFonts w:ascii="Calibri" w:hAnsi="Calibri"/>
+                <w:b w:val="0"/>
+                <w:color w:val="111827"/>
+                <w:sz w:val="16"/>
+              </w:rPr>
+              <w:t>EV-T-029</w:t>
+            </w:r>
+          </w:p>
+        </w:tc>
+        <w:tc>
+          <w:tcPr>
+            <w:tcW w:type="dxa" w:w="3700"/>
+            <w:tcMar>
+              <w:top w:w="80" w:type="dxa"/>
+              <w:start w:w="120" w:type="dxa"/>
+              <w:bottom w:w="80" w:type="dxa"/>
+              <w:end w:w="120" w:type="dxa"/>
+            </w:tcMar>
+            <w:vAlign w:val="center"/>
+            <w:shd w:fill="FFFFFF"/>
+          </w:tcPr>
+          <w:p>
+            <w:pPr>
+              <w:spacing w:before="0" w:after="40" w:line="252" w:lineRule="auto"/>
+              <w:jc w:val="left"/>
+            </w:pPr>
+            <w:r>
+              <w:rPr>
+                <w:rFonts w:ascii="Calibri" w:hAnsi="Calibri"/>
+                <w:b w:val="0"/>
+                <w:color w:val="111827"/>
+                <w:sz w:val="16"/>
+              </w:rPr>
+              <w:t>Electrical power</w:t>
+            </w:r>
+          </w:p>
+        </w:tc>
+        <w:tc>
+          <w:tcPr>
+            <w:tcW w:type="dxa" w:w="3100"/>
+            <w:tcMar>
+              <w:top w:w="80" w:type="dxa"/>
+              <w:start w:w="120" w:type="dxa"/>
+              <w:bottom w:w="80" w:type="dxa"/>
+              <w:end w:w="120" w:type="dxa"/>
+            </w:tcMar>
+            <w:vAlign w:val="center"/>
+            <w:shd w:fill="FFFFFF"/>
+          </w:tcPr>
+          <w:p>
+            <w:pPr>
+              <w:spacing w:before="0" w:after="40" w:line="252" w:lineRule="auto"/>
+              <w:jc w:val="left"/>
+            </w:pPr>
+            <w:r>
+              <w:rPr>
+                <w:rFonts w:ascii="Calibri" w:hAnsi="Calibri"/>
+                <w:b w:val="0"/>
+                <w:color w:val="111827"/>
+                <w:sz w:val="16"/>
+              </w:rPr>
+              <w:t>Inspect conversion input</w:t>
+            </w:r>
+          </w:p>
+        </w:tc>
+        <w:tc>
+          <w:tcPr>
+            <w:tcW w:type="dxa" w:w="1410"/>
+            <w:tcMar>
+              <w:top w:w="80" w:type="dxa"/>
+              <w:start w:w="120" w:type="dxa"/>
+              <w:bottom w:w="80" w:type="dxa"/>
+              <w:end w:w="120" w:type="dxa"/>
+            </w:tcMar>
+            <w:vAlign w:val="center"/>
+            <w:shd w:fill="FFFFFF"/>
+          </w:tcPr>
+          <w:p>
+            <w:pPr>
+              <w:spacing w:before="0" w:after="40" w:line="252" w:lineRule="auto"/>
+              <w:jc w:val="left"/>
+            </w:pPr>
+            <w:r>
+              <w:rPr>
+                <w:rFonts w:ascii="Calibri" w:hAnsi="Calibri"/>
+                <w:b w:val="0"/>
+                <w:color w:val="111827"/>
+                <w:sz w:val="16"/>
+              </w:rPr>
+              <w:t>Greater than mechanical power</w:t>
+            </w:r>
+          </w:p>
+        </w:tc>
+      </w:tr>
+      <w:tr>
+        <w:trPr>
+          <w:cantSplit/>
+        </w:trPr>
+        <w:tc>
+          <w:tcPr>
+            <w:tcW w:type="dxa" w:w="1150"/>
+            <w:tcMar>
+              <w:top w:w="80" w:type="dxa"/>
+              <w:start w:w="120" w:type="dxa"/>
+              <w:bottom w:w="80" w:type="dxa"/>
+              <w:end w:w="120" w:type="dxa"/>
+            </w:tcMar>
+            <w:vAlign w:val="center"/>
+            <w:shd w:fill="FFFFFF"/>
+          </w:tcPr>
+          <w:p>
+            <w:pPr>
+              <w:spacing w:before="0" w:after="40" w:line="252" w:lineRule="auto"/>
+              <w:jc w:val="center"/>
+            </w:pPr>
+            <w:r>
+              <w:rPr>
+                <w:rFonts w:ascii="Calibri" w:hAnsi="Calibri"/>
+                <w:b w:val="0"/>
+                <w:color w:val="111827"/>
+                <w:sz w:val="16"/>
+              </w:rPr>
+              <w:t>EV-T-030</w:t>
+            </w:r>
+          </w:p>
+        </w:tc>
+        <w:tc>
+          <w:tcPr>
+            <w:tcW w:type="dxa" w:w="3700"/>
+            <w:tcMar>
+              <w:top w:w="80" w:type="dxa"/>
+              <w:start w:w="120" w:type="dxa"/>
+              <w:bottom w:w="80" w:type="dxa"/>
+              <w:end w:w="120" w:type="dxa"/>
+            </w:tcMar>
+            <w:vAlign w:val="center"/>
+            <w:shd w:fill="FFFFFF"/>
+          </w:tcPr>
+          <w:p>
+            <w:pPr>
+              <w:spacing w:before="0" w:after="40" w:line="252" w:lineRule="auto"/>
+              <w:jc w:val="left"/>
+            </w:pPr>
+            <w:r>
+              <w:rPr>
+                <w:rFonts w:ascii="Calibri" w:hAnsi="Calibri"/>
+                <w:b w:val="0"/>
+                <w:color w:val="111827"/>
+                <w:sz w:val="16"/>
+              </w:rPr>
+              <w:t>Efficiency loss</w:t>
+            </w:r>
+          </w:p>
+        </w:tc>
+        <w:tc>
+          <w:tcPr>
+            <w:tcW w:type="dxa" w:w="3100"/>
+            <w:tcMar>
+              <w:top w:w="80" w:type="dxa"/>
+              <w:start w:w="120" w:type="dxa"/>
+              <w:bottom w:w="80" w:type="dxa"/>
+              <w:end w:w="120" w:type="dxa"/>
+            </w:tcMar>
+            <w:vAlign w:val="center"/>
+            <w:shd w:fill="FFFFFF"/>
+          </w:tcPr>
+          <w:p>
+            <w:pPr>
+              <w:spacing w:before="0" w:after="40" w:line="252" w:lineRule="auto"/>
+              <w:jc w:val="left"/>
+            </w:pPr>
+            <w:r>
+              <w:rPr>
+                <w:rFonts w:ascii="Calibri" w:hAnsi="Calibri"/>
+                <w:b w:val="0"/>
+                <w:color w:val="111827"/>
+                <w:sz w:val="16"/>
+              </w:rPr>
+              <w:t>Compare electrical and mechanical power</w:t>
+            </w:r>
+          </w:p>
+        </w:tc>
+        <w:tc>
+          <w:tcPr>
+            <w:tcW w:type="dxa" w:w="1410"/>
+            <w:tcMar>
+              <w:top w:w="80" w:type="dxa"/>
+              <w:start w:w="120" w:type="dxa"/>
+              <w:bottom w:w="80" w:type="dxa"/>
+              <w:end w:w="120" w:type="dxa"/>
+            </w:tcMar>
+            <w:vAlign w:val="center"/>
+            <w:shd w:fill="FFFFFF"/>
+          </w:tcPr>
+          <w:p>
+            <w:pPr>
+              <w:spacing w:before="0" w:after="40" w:line="252" w:lineRule="auto"/>
+              <w:jc w:val="left"/>
+            </w:pPr>
+            <w:r>
+              <w:rPr>
+                <w:rFonts w:ascii="Calibri" w:hAnsi="Calibri"/>
+                <w:b w:val="0"/>
+                <w:color w:val="111827"/>
+                <w:sz w:val="16"/>
+              </w:rPr>
+              <w:t>Positive deterministic loss</w:t>
+            </w:r>
+          </w:p>
+        </w:tc>
+      </w:tr>
+      <w:tr>
+        <w:trPr>
+          <w:cantSplit/>
+        </w:trPr>
+        <w:tc>
+          <w:tcPr>
+            <w:tcW w:type="dxa" w:w="1150"/>
+            <w:tcMar>
+              <w:top w:w="80" w:type="dxa"/>
+              <w:start w:w="120" w:type="dxa"/>
+              <w:bottom w:w="80" w:type="dxa"/>
+              <w:end w:w="120" w:type="dxa"/>
+            </w:tcMar>
+            <w:vAlign w:val="center"/>
+            <w:shd w:fill="FFFFFF"/>
+          </w:tcPr>
+          <w:p>
+            <w:pPr>
+              <w:spacing w:before="0" w:after="40" w:line="252" w:lineRule="auto"/>
+              <w:jc w:val="center"/>
+            </w:pPr>
+            <w:r>
+              <w:rPr>
+                <w:rFonts w:ascii="Calibri" w:hAnsi="Calibri"/>
+                <w:b w:val="0"/>
+                <w:color w:val="111827"/>
+                <w:sz w:val="16"/>
+              </w:rPr>
+              <w:t>EV-T-031</w:t>
+            </w:r>
+          </w:p>
+        </w:tc>
+        <w:tc>
+          <w:tcPr>
+            <w:tcW w:type="dxa" w:w="3700"/>
+            <w:tcMar>
+              <w:top w:w="80" w:type="dxa"/>
+              <w:start w:w="120" w:type="dxa"/>
+              <w:bottom w:w="80" w:type="dxa"/>
+              <w:end w:w="120" w:type="dxa"/>
+            </w:tcMar>
+            <w:vAlign w:val="center"/>
+            <w:shd w:fill="FFFFFF"/>
+          </w:tcPr>
+          <w:p>
+            <w:pPr>
+              <w:spacing w:before="0" w:after="40" w:line="252" w:lineRule="auto"/>
+              <w:jc w:val="left"/>
+            </w:pPr>
+            <w:r>
+              <w:rPr>
+                <w:rFonts w:ascii="Calibri" w:hAnsi="Calibri"/>
+                <w:b w:val="0"/>
+                <w:color w:val="111827"/>
+                <w:sz w:val="16"/>
+              </w:rPr>
+              <w:t>Eco limit</w:t>
+            </w:r>
+          </w:p>
+        </w:tc>
+        <w:tc>
+          <w:tcPr>
+            <w:tcW w:type="dxa" w:w="3100"/>
+            <w:tcMar>
+              <w:top w:w="80" w:type="dxa"/>
+              <w:start w:w="120" w:type="dxa"/>
+              <w:bottom w:w="80" w:type="dxa"/>
+              <w:end w:w="120" w:type="dxa"/>
+            </w:tcMar>
+            <w:vAlign w:val="center"/>
+            <w:shd w:fill="FFFFFF"/>
+          </w:tcPr>
+          <w:p>
+            <w:pPr>
+              <w:spacing w:before="0" w:after="40" w:line="252" w:lineRule="auto"/>
+              <w:jc w:val="left"/>
+            </w:pPr>
+            <w:r>
+              <w:rPr>
+                <w:rFonts w:ascii="Calibri" w:hAnsi="Calibri"/>
+                <w:b w:val="0"/>
+                <w:color w:val="111827"/>
+                <w:sz w:val="16"/>
+              </w:rPr>
+              <w:t>Request peak torque in eco</w:t>
+            </w:r>
+          </w:p>
+        </w:tc>
+        <w:tc>
+          <w:tcPr>
+            <w:tcW w:type="dxa" w:w="1410"/>
+            <w:tcMar>
+              <w:top w:w="80" w:type="dxa"/>
+              <w:start w:w="120" w:type="dxa"/>
+              <w:bottom w:w="80" w:type="dxa"/>
+              <w:end w:w="120" w:type="dxa"/>
+            </w:tcMar>
+            <w:vAlign w:val="center"/>
+            <w:shd w:fill="FFFFFF"/>
+          </w:tcPr>
+          <w:p>
+            <w:pPr>
+              <w:spacing w:before="0" w:after="40" w:line="252" w:lineRule="auto"/>
+              <w:jc w:val="left"/>
+            </w:pPr>
+            <w:r>
+              <w:rPr>
+                <w:rFonts w:ascii="Calibri" w:hAnsi="Calibri"/>
+                <w:b w:val="0"/>
+                <w:color w:val="111827"/>
+                <w:sz w:val="16"/>
+              </w:rPr>
+              <w:t>Delivery capped at 60%</w:t>
+            </w:r>
+          </w:p>
+        </w:tc>
+      </w:tr>
+      <w:tr>
+        <w:trPr>
+          <w:cantSplit/>
+        </w:trPr>
+        <w:tc>
+          <w:tcPr>
+            <w:tcW w:type="dxa" w:w="1150"/>
+            <w:tcMar>
+              <w:top w:w="80" w:type="dxa"/>
+              <w:start w:w="120" w:type="dxa"/>
+              <w:bottom w:w="80" w:type="dxa"/>
+              <w:end w:w="120" w:type="dxa"/>
+            </w:tcMar>
+            <w:vAlign w:val="center"/>
+            <w:shd w:fill="FFFFFF"/>
+          </w:tcPr>
+          <w:p>
+            <w:pPr>
+              <w:spacing w:before="0" w:after="40" w:line="252" w:lineRule="auto"/>
+              <w:jc w:val="center"/>
+            </w:pPr>
+            <w:r>
+              <w:rPr>
+                <w:rFonts w:ascii="Calibri" w:hAnsi="Calibri"/>
+                <w:b w:val="0"/>
+                <w:color w:val="111827"/>
+                <w:sz w:val="16"/>
+              </w:rPr>
+              <w:t>EV-T-032</w:t>
+            </w:r>
+          </w:p>
+        </w:tc>
+        <w:tc>
+          <w:tcPr>
+            <w:tcW w:type="dxa" w:w="3700"/>
+            <w:tcMar>
+              <w:top w:w="80" w:type="dxa"/>
+              <w:start w:w="120" w:type="dxa"/>
+              <w:bottom w:w="80" w:type="dxa"/>
+              <w:end w:w="120" w:type="dxa"/>
+            </w:tcMar>
+            <w:vAlign w:val="center"/>
+            <w:shd w:fill="FFFFFF"/>
+          </w:tcPr>
+          <w:p>
+            <w:pPr>
+              <w:spacing w:before="0" w:after="40" w:line="252" w:lineRule="auto"/>
+              <w:jc w:val="left"/>
+            </w:pPr>
+            <w:r>
+              <w:rPr>
+                <w:rFonts w:ascii="Calibri" w:hAnsi="Calibri"/>
+                <w:b w:val="0"/>
+                <w:color w:val="111827"/>
+                <w:sz w:val="16"/>
+              </w:rPr>
+              <w:t>Normal limit</w:t>
+            </w:r>
+          </w:p>
+        </w:tc>
+        <w:tc>
+          <w:tcPr>
+            <w:tcW w:type="dxa" w:w="3100"/>
+            <w:tcMar>
+              <w:top w:w="80" w:type="dxa"/>
+              <w:start w:w="120" w:type="dxa"/>
+              <w:bottom w:w="80" w:type="dxa"/>
+              <w:end w:w="120" w:type="dxa"/>
+            </w:tcMar>
+            <w:vAlign w:val="center"/>
+            <w:shd w:fill="FFFFFF"/>
+          </w:tcPr>
+          <w:p>
+            <w:pPr>
+              <w:spacing w:before="0" w:after="40" w:line="252" w:lineRule="auto"/>
+              <w:jc w:val="left"/>
+            </w:pPr>
+            <w:r>
+              <w:rPr>
+                <w:rFonts w:ascii="Calibri" w:hAnsi="Calibri"/>
+                <w:b w:val="0"/>
+                <w:color w:val="111827"/>
+                <w:sz w:val="16"/>
+              </w:rPr>
+              <w:t>Request peak torque in normal</w:t>
+            </w:r>
+          </w:p>
+        </w:tc>
+        <w:tc>
+          <w:tcPr>
+            <w:tcW w:type="dxa" w:w="1410"/>
+            <w:tcMar>
+              <w:top w:w="80" w:type="dxa"/>
+              <w:start w:w="120" w:type="dxa"/>
+              <w:bottom w:w="80" w:type="dxa"/>
+              <w:end w:w="120" w:type="dxa"/>
+            </w:tcMar>
+            <w:vAlign w:val="center"/>
+            <w:shd w:fill="FFFFFF"/>
+          </w:tcPr>
+          <w:p>
+            <w:pPr>
+              <w:spacing w:before="0" w:after="40" w:line="252" w:lineRule="auto"/>
+              <w:jc w:val="left"/>
+            </w:pPr>
+            <w:r>
+              <w:rPr>
+                <w:rFonts w:ascii="Calibri" w:hAnsi="Calibri"/>
+                <w:b w:val="0"/>
+                <w:color w:val="111827"/>
+                <w:sz w:val="16"/>
+              </w:rPr>
+              <w:t>Delivery capped at 85%</w:t>
+            </w:r>
+          </w:p>
+        </w:tc>
+      </w:tr>
+      <w:tr>
+        <w:trPr>
+          <w:cantSplit/>
+        </w:trPr>
+        <w:tc>
+          <w:tcPr>
+            <w:tcW w:type="dxa" w:w="1150"/>
+            <w:tcMar>
+              <w:top w:w="80" w:type="dxa"/>
+              <w:start w:w="120" w:type="dxa"/>
+              <w:bottom w:w="80" w:type="dxa"/>
+              <w:end w:w="120" w:type="dxa"/>
+            </w:tcMar>
+            <w:vAlign w:val="center"/>
+            <w:shd w:fill="FFFFFF"/>
+          </w:tcPr>
+          <w:p>
+            <w:pPr>
+              <w:spacing w:before="0" w:after="40" w:line="252" w:lineRule="auto"/>
+              <w:jc w:val="center"/>
+            </w:pPr>
+            <w:r>
+              <w:rPr>
+                <w:rFonts w:ascii="Calibri" w:hAnsi="Calibri"/>
+                <w:b w:val="0"/>
+                <w:color w:val="111827"/>
+                <w:sz w:val="16"/>
+              </w:rPr>
+              <w:t>EV-T-033</w:t>
+            </w:r>
+          </w:p>
+        </w:tc>
+        <w:tc>
+          <w:tcPr>
+            <w:tcW w:type="dxa" w:w="3700"/>
+            <w:tcMar>
+              <w:top w:w="80" w:type="dxa"/>
+              <w:start w:w="120" w:type="dxa"/>
+              <w:bottom w:w="80" w:type="dxa"/>
+              <w:end w:w="120" w:type="dxa"/>
+            </w:tcMar>
+            <w:vAlign w:val="center"/>
+            <w:shd w:fill="FFFFFF"/>
+          </w:tcPr>
+          <w:p>
+            <w:pPr>
+              <w:spacing w:before="0" w:after="40" w:line="252" w:lineRule="auto"/>
+              <w:jc w:val="left"/>
+            </w:pPr>
+            <w:r>
+              <w:rPr>
+                <w:rFonts w:ascii="Calibri" w:hAnsi="Calibri"/>
+                <w:b w:val="0"/>
+                <w:color w:val="111827"/>
+                <w:sz w:val="16"/>
+              </w:rPr>
+              <w:t>Sport limit</w:t>
+            </w:r>
+          </w:p>
+        </w:tc>
+        <w:tc>
+          <w:tcPr>
+            <w:tcW w:type="dxa" w:w="3100"/>
+            <w:tcMar>
+              <w:top w:w="80" w:type="dxa"/>
+              <w:start w:w="120" w:type="dxa"/>
+              <w:bottom w:w="80" w:type="dxa"/>
+              <w:end w:w="120" w:type="dxa"/>
+            </w:tcMar>
+            <w:vAlign w:val="center"/>
+            <w:shd w:fill="FFFFFF"/>
+          </w:tcPr>
+          <w:p>
+            <w:pPr>
+              <w:spacing w:before="0" w:after="40" w:line="252" w:lineRule="auto"/>
+              <w:jc w:val="left"/>
+            </w:pPr>
+            <w:r>
+              <w:rPr>
+                <w:rFonts w:ascii="Calibri" w:hAnsi="Calibri"/>
+                <w:b w:val="0"/>
+                <w:color w:val="111827"/>
+                <w:sz w:val="16"/>
+              </w:rPr>
+              <w:t>Request peak torque in sport</w:t>
+            </w:r>
+          </w:p>
+        </w:tc>
+        <w:tc>
+          <w:tcPr>
+            <w:tcW w:type="dxa" w:w="1410"/>
+            <w:tcMar>
+              <w:top w:w="80" w:type="dxa"/>
+              <w:start w:w="120" w:type="dxa"/>
+              <w:bottom w:w="80" w:type="dxa"/>
+              <w:end w:w="120" w:type="dxa"/>
+            </w:tcMar>
+            <w:vAlign w:val="center"/>
+            <w:shd w:fill="FFFFFF"/>
+          </w:tcPr>
+          <w:p>
+            <w:pPr>
+              <w:spacing w:before="0" w:after="40" w:line="252" w:lineRule="auto"/>
+              <w:jc w:val="left"/>
+            </w:pPr>
+            <w:r>
+              <w:rPr>
+                <w:rFonts w:ascii="Calibri" w:hAnsi="Calibri"/>
+                <w:b w:val="0"/>
+                <w:color w:val="111827"/>
+                <w:sz w:val="16"/>
+              </w:rPr>
+              <w:t>Delivery capped at 100%</w:t>
+            </w:r>
+          </w:p>
+        </w:tc>
+      </w:tr>
+      <w:tr>
+        <w:trPr>
+          <w:cantSplit/>
+        </w:trPr>
+        <w:tc>
+          <w:tcPr>
+            <w:tcW w:type="dxa" w:w="1150"/>
+            <w:tcMar>
+              <w:top w:w="80" w:type="dxa"/>
+              <w:start w:w="120" w:type="dxa"/>
+              <w:bottom w:w="80" w:type="dxa"/>
+              <w:end w:w="120" w:type="dxa"/>
+            </w:tcMar>
+            <w:vAlign w:val="center"/>
+            <w:shd w:fill="FFFFFF"/>
+          </w:tcPr>
+          <w:p>
+            <w:pPr>
+              <w:spacing w:before="0" w:after="40" w:line="252" w:lineRule="auto"/>
+              <w:jc w:val="center"/>
+            </w:pPr>
+            <w:r>
+              <w:rPr>
+                <w:rFonts w:ascii="Calibri" w:hAnsi="Calibri"/>
+                <w:b w:val="0"/>
+                <w:color w:val="111827"/>
+                <w:sz w:val="16"/>
+              </w:rPr>
+              <w:t>EV-T-034</w:t>
+            </w:r>
+          </w:p>
+        </w:tc>
+        <w:tc>
+          <w:tcPr>
+            <w:tcW w:type="dxa" w:w="3700"/>
+            <w:tcMar>
+              <w:top w:w="80" w:type="dxa"/>
+              <w:start w:w="120" w:type="dxa"/>
+              <w:bottom w:w="80" w:type="dxa"/>
+              <w:end w:w="120" w:type="dxa"/>
+            </w:tcMar>
+            <w:vAlign w:val="center"/>
+            <w:shd w:fill="FFFFFF"/>
+          </w:tcPr>
+          <w:p>
+            <w:pPr>
+              <w:spacing w:before="0" w:after="40" w:line="252" w:lineRule="auto"/>
+              <w:jc w:val="left"/>
+            </w:pPr>
+            <w:r>
+              <w:rPr>
+                <w:rFonts w:ascii="Calibri" w:hAnsi="Calibri"/>
+                <w:b w:val="0"/>
+                <w:color w:val="111827"/>
+                <w:sz w:val="16"/>
+              </w:rPr>
+              <w:t>Battery unavailable</w:t>
+            </w:r>
+          </w:p>
+        </w:tc>
+        <w:tc>
+          <w:tcPr>
+            <w:tcW w:type="dxa" w:w="3100"/>
+            <w:tcMar>
+              <w:top w:w="80" w:type="dxa"/>
+              <w:start w:w="120" w:type="dxa"/>
+              <w:bottom w:w="80" w:type="dxa"/>
+              <w:end w:w="120" w:type="dxa"/>
+            </w:tcMar>
+            <w:vAlign w:val="center"/>
+            <w:shd w:fill="FFFFFF"/>
+          </w:tcPr>
+          <w:p>
+            <w:pPr>
+              <w:spacing w:before="0" w:after="40" w:line="252" w:lineRule="auto"/>
+              <w:jc w:val="left"/>
+            </w:pPr>
+            <w:r>
+              <w:rPr>
+                <w:rFonts w:ascii="Calibri" w:hAnsi="Calibri"/>
+                <w:b w:val="0"/>
+                <w:color w:val="111827"/>
+                <w:sz w:val="16"/>
+              </w:rPr>
+              <w:t>Open battery contactors</w:t>
+            </w:r>
+          </w:p>
+        </w:tc>
+        <w:tc>
+          <w:tcPr>
+            <w:tcW w:type="dxa" w:w="1410"/>
+            <w:tcMar>
+              <w:top w:w="80" w:type="dxa"/>
+              <w:start w:w="120" w:type="dxa"/>
+              <w:bottom w:w="80" w:type="dxa"/>
+              <w:end w:w="120" w:type="dxa"/>
+            </w:tcMar>
+            <w:vAlign w:val="center"/>
+            <w:shd w:fill="FFFFFF"/>
+          </w:tcPr>
+          <w:p>
+            <w:pPr>
+              <w:spacing w:before="0" w:after="40" w:line="252" w:lineRule="auto"/>
+              <w:jc w:val="left"/>
+            </w:pPr>
+            <w:r>
+              <w:rPr>
+                <w:rFonts w:ascii="Calibri" w:hAnsi="Calibri"/>
+                <w:b w:val="0"/>
+                <w:color w:val="111827"/>
+                <w:sz w:val="16"/>
+              </w:rPr>
+              <w:t>Zero delivered torque</w:t>
+            </w:r>
+          </w:p>
+        </w:tc>
+      </w:tr>
+      <w:tr>
+        <w:trPr>
+          <w:cantSplit/>
+        </w:trPr>
+        <w:tc>
+          <w:tcPr>
+            <w:tcW w:type="dxa" w:w="1150"/>
+            <w:tcMar>
+              <w:top w:w="80" w:type="dxa"/>
+              <w:start w:w="120" w:type="dxa"/>
+              <w:bottom w:w="80" w:type="dxa"/>
+              <w:end w:w="120" w:type="dxa"/>
+            </w:tcMar>
+            <w:vAlign w:val="center"/>
+            <w:shd w:fill="FFFFFF"/>
+          </w:tcPr>
+          <w:p>
+            <w:pPr>
+              <w:spacing w:before="0" w:after="40" w:line="252" w:lineRule="auto"/>
+              <w:jc w:val="center"/>
+            </w:pPr>
+            <w:r>
+              <w:rPr>
+                <w:rFonts w:ascii="Calibri" w:hAnsi="Calibri"/>
+                <w:b w:val="0"/>
+                <w:color w:val="111827"/>
+                <w:sz w:val="16"/>
+              </w:rPr>
+              <w:t>EV-T-035</w:t>
+            </w:r>
+          </w:p>
+        </w:tc>
+        <w:tc>
+          <w:tcPr>
+            <w:tcW w:type="dxa" w:w="3700"/>
+            <w:tcMar>
+              <w:top w:w="80" w:type="dxa"/>
+              <w:start w:w="120" w:type="dxa"/>
+              <w:bottom w:w="80" w:type="dxa"/>
+              <w:end w:w="120" w:type="dxa"/>
+            </w:tcMar>
+            <w:vAlign w:val="center"/>
+            <w:shd w:fill="FFFFFF"/>
+          </w:tcPr>
+          <w:p>
+            <w:pPr>
+              <w:spacing w:before="0" w:after="40" w:line="252" w:lineRule="auto"/>
+              <w:jc w:val="left"/>
+            </w:pPr>
+            <w:r>
+              <w:rPr>
+                <w:rFonts w:ascii="Calibri" w:hAnsi="Calibri"/>
+                <w:b w:val="0"/>
+                <w:color w:val="111827"/>
+                <w:sz w:val="16"/>
+              </w:rPr>
+              <w:t>Battery power limit</w:t>
+            </w:r>
+          </w:p>
+        </w:tc>
+        <w:tc>
+          <w:tcPr>
+            <w:tcW w:type="dxa" w:w="3100"/>
+            <w:tcMar>
+              <w:top w:w="80" w:type="dxa"/>
+              <w:start w:w="120" w:type="dxa"/>
+              <w:bottom w:w="80" w:type="dxa"/>
+              <w:end w:w="120" w:type="dxa"/>
+            </w:tcMar>
+            <w:vAlign w:val="center"/>
+            <w:shd w:fill="FFFFFF"/>
+          </w:tcPr>
+          <w:p>
+            <w:pPr>
+              <w:spacing w:before="0" w:after="40" w:line="252" w:lineRule="auto"/>
+              <w:jc w:val="left"/>
+            </w:pPr>
+            <w:r>
+              <w:rPr>
+                <w:rFonts w:ascii="Calibri" w:hAnsi="Calibri"/>
+                <w:b w:val="0"/>
+                <w:color w:val="111827"/>
+                <w:sz w:val="16"/>
+              </w:rPr>
+              <w:t>Exceed available electrical power</w:t>
+            </w:r>
+          </w:p>
+        </w:tc>
+        <w:tc>
+          <w:tcPr>
+            <w:tcW w:type="dxa" w:w="1410"/>
+            <w:tcMar>
+              <w:top w:w="80" w:type="dxa"/>
+              <w:start w:w="120" w:type="dxa"/>
+              <w:bottom w:w="80" w:type="dxa"/>
+              <w:end w:w="120" w:type="dxa"/>
+            </w:tcMar>
+            <w:vAlign w:val="center"/>
+            <w:shd w:fill="FFFFFF"/>
+          </w:tcPr>
+          <w:p>
+            <w:pPr>
+              <w:spacing w:before="0" w:after="40" w:line="252" w:lineRule="auto"/>
+              <w:jc w:val="left"/>
+            </w:pPr>
+            <w:r>
+              <w:rPr>
+                <w:rFonts w:ascii="Calibri" w:hAnsi="Calibri"/>
+                <w:b w:val="0"/>
+                <w:color w:val="111827"/>
+                <w:sz w:val="16"/>
+              </w:rPr>
+              <w:t>Derated torque and reason</w:t>
+            </w:r>
+          </w:p>
+        </w:tc>
+      </w:tr>
+      <w:tr>
+        <w:trPr>
+          <w:cantSplit/>
+        </w:trPr>
+        <w:tc>
+          <w:tcPr>
+            <w:tcW w:type="dxa" w:w="1150"/>
+            <w:tcMar>
+              <w:top w:w="80" w:type="dxa"/>
+              <w:start w:w="120" w:type="dxa"/>
+              <w:bottom w:w="80" w:type="dxa"/>
+              <w:end w:w="120" w:type="dxa"/>
+            </w:tcMar>
+            <w:vAlign w:val="center"/>
+            <w:shd w:fill="FFFFFF"/>
+          </w:tcPr>
+          <w:p>
+            <w:pPr>
+              <w:spacing w:before="0" w:after="40" w:line="252" w:lineRule="auto"/>
+              <w:jc w:val="center"/>
+            </w:pPr>
+            <w:r>
+              <w:rPr>
+                <w:rFonts w:ascii="Calibri" w:hAnsi="Calibri"/>
+                <w:b w:val="0"/>
+                <w:color w:val="111827"/>
+                <w:sz w:val="16"/>
+              </w:rPr>
+              <w:t>EV-T-036</w:t>
+            </w:r>
+          </w:p>
+        </w:tc>
+        <w:tc>
+          <w:tcPr>
+            <w:tcW w:type="dxa" w:w="3700"/>
+            <w:tcMar>
+              <w:top w:w="80" w:type="dxa"/>
+              <w:start w:w="120" w:type="dxa"/>
+              <w:bottom w:w="80" w:type="dxa"/>
+              <w:end w:w="120" w:type="dxa"/>
+            </w:tcMar>
+            <w:vAlign w:val="center"/>
+            <w:shd w:fill="FFFFFF"/>
+          </w:tcPr>
+          <w:p>
+            <w:pPr>
+              <w:spacing w:before="0" w:after="40" w:line="252" w:lineRule="auto"/>
+              <w:jc w:val="left"/>
+            </w:pPr>
+            <w:r>
+              <w:rPr>
+                <w:rFonts w:ascii="Calibri" w:hAnsi="Calibri"/>
+                <w:b w:val="0"/>
+                <w:color w:val="111827"/>
+                <w:sz w:val="16"/>
+              </w:rPr>
+              <w:t>Overspeed</w:t>
+            </w:r>
+          </w:p>
+        </w:tc>
+        <w:tc>
+          <w:tcPr>
+            <w:tcW w:type="dxa" w:w="3100"/>
+            <w:tcMar>
+              <w:top w:w="80" w:type="dxa"/>
+              <w:start w:w="120" w:type="dxa"/>
+              <w:bottom w:w="80" w:type="dxa"/>
+              <w:end w:w="120" w:type="dxa"/>
+            </w:tcMar>
+            <w:vAlign w:val="center"/>
+            <w:shd w:fill="FFFFFF"/>
+          </w:tcPr>
+          <w:p>
+            <w:pPr>
+              <w:spacing w:before="0" w:after="40" w:line="252" w:lineRule="auto"/>
+              <w:jc w:val="left"/>
+            </w:pPr>
+            <w:r>
+              <w:rPr>
+                <w:rFonts w:ascii="Calibri" w:hAnsi="Calibri"/>
+                <w:b w:val="0"/>
+                <w:color w:val="111827"/>
+                <w:sz w:val="16"/>
+              </w:rPr>
+              <w:t>Exceed configured motor speed</w:t>
+            </w:r>
+          </w:p>
+        </w:tc>
+        <w:tc>
+          <w:tcPr>
+            <w:tcW w:type="dxa" w:w="1410"/>
+            <w:tcMar>
+              <w:top w:w="80" w:type="dxa"/>
+              <w:start w:w="120" w:type="dxa"/>
+              <w:bottom w:w="80" w:type="dxa"/>
+              <w:end w:w="120" w:type="dxa"/>
+            </w:tcMar>
+            <w:vAlign w:val="center"/>
+            <w:shd w:fill="FFFFFF"/>
+          </w:tcPr>
+          <w:p>
+            <w:pPr>
+              <w:spacing w:before="0" w:after="40" w:line="252" w:lineRule="auto"/>
+              <w:jc w:val="left"/>
+            </w:pPr>
+            <w:r>
+              <w:rPr>
+                <w:rFonts w:ascii="Calibri" w:hAnsi="Calibri"/>
+                <w:b w:val="0"/>
+                <w:color w:val="111827"/>
+                <w:sz w:val="16"/>
+              </w:rPr>
+              <w:t>Zero torque and speed-limit reason</w:t>
+            </w:r>
+          </w:p>
+        </w:tc>
+      </w:tr>
+      <w:tr>
+        <w:trPr>
+          <w:cantSplit/>
+        </w:trPr>
+        <w:tc>
+          <w:tcPr>
+            <w:tcW w:type="dxa" w:w="1150"/>
+            <w:tcMar>
+              <w:top w:w="80" w:type="dxa"/>
+              <w:start w:w="120" w:type="dxa"/>
+              <w:bottom w:w="80" w:type="dxa"/>
+              <w:end w:w="120" w:type="dxa"/>
+            </w:tcMar>
+            <w:vAlign w:val="center"/>
+            <w:shd w:fill="FFFFFF"/>
+          </w:tcPr>
+          <w:p>
+            <w:pPr>
+              <w:spacing w:before="0" w:after="40" w:line="252" w:lineRule="auto"/>
+              <w:jc w:val="center"/>
+            </w:pPr>
+            <w:r>
+              <w:rPr>
+                <w:rFonts w:ascii="Calibri" w:hAnsi="Calibri"/>
+                <w:b w:val="0"/>
+                <w:color w:val="111827"/>
+                <w:sz w:val="16"/>
+              </w:rPr>
+              <w:t>EV-T-037</w:t>
+            </w:r>
+          </w:p>
+        </w:tc>
+        <w:tc>
+          <w:tcPr>
+            <w:tcW w:type="dxa" w:w="3700"/>
+            <w:tcMar>
+              <w:top w:w="80" w:type="dxa"/>
+              <w:start w:w="120" w:type="dxa"/>
+              <w:bottom w:w="80" w:type="dxa"/>
+              <w:end w:w="120" w:type="dxa"/>
+            </w:tcMar>
+            <w:vAlign w:val="center"/>
+            <w:shd w:fill="FFFFFF"/>
+          </w:tcPr>
+          <w:p>
+            <w:pPr>
+              <w:spacing w:before="0" w:after="40" w:line="252" w:lineRule="auto"/>
+              <w:jc w:val="left"/>
+            </w:pPr>
+            <w:r>
+              <w:rPr>
+                <w:rFonts w:ascii="Calibri" w:hAnsi="Calibri"/>
+                <w:b w:val="0"/>
+                <w:color w:val="111827"/>
+                <w:sz w:val="16"/>
+              </w:rPr>
+              <w:t>Thermal protection</w:t>
+            </w:r>
+          </w:p>
+        </w:tc>
+        <w:tc>
+          <w:tcPr>
+            <w:tcW w:type="dxa" w:w="3100"/>
+            <w:tcMar>
+              <w:top w:w="80" w:type="dxa"/>
+              <w:start w:w="120" w:type="dxa"/>
+              <w:bottom w:w="80" w:type="dxa"/>
+              <w:end w:w="120" w:type="dxa"/>
+            </w:tcMar>
+            <w:vAlign w:val="center"/>
+            <w:shd w:fill="FFFFFF"/>
+          </w:tcPr>
+          <w:p>
+            <w:pPr>
+              <w:spacing w:before="0" w:after="40" w:line="252" w:lineRule="auto"/>
+              <w:jc w:val="left"/>
+            </w:pPr>
+            <w:r>
+              <w:rPr>
+                <w:rFonts w:ascii="Calibri" w:hAnsi="Calibri"/>
+                <w:b w:val="0"/>
+                <w:color w:val="111827"/>
+                <w:sz w:val="16"/>
+              </w:rPr>
+              <w:t>Reach motor or inverter trip</w:t>
+            </w:r>
+          </w:p>
+        </w:tc>
+        <w:tc>
+          <w:tcPr>
+            <w:tcW w:type="dxa" w:w="1410"/>
+            <w:tcMar>
+              <w:top w:w="80" w:type="dxa"/>
+              <w:start w:w="120" w:type="dxa"/>
+              <w:bottom w:w="80" w:type="dxa"/>
+              <w:end w:w="120" w:type="dxa"/>
+            </w:tcMar>
+            <w:vAlign w:val="center"/>
+            <w:shd w:fill="FFFFFF"/>
+          </w:tcPr>
+          <w:p>
+            <w:pPr>
+              <w:spacing w:before="0" w:after="40" w:line="252" w:lineRule="auto"/>
+              <w:jc w:val="left"/>
+            </w:pPr>
+            <w:r>
+              <w:rPr>
+                <w:rFonts w:ascii="Calibri" w:hAnsi="Calibri"/>
+                <w:b w:val="0"/>
+                <w:color w:val="111827"/>
+                <w:sz w:val="16"/>
+              </w:rPr>
+              <w:t>Protection and zero power</w:t>
+            </w:r>
+          </w:p>
+        </w:tc>
+      </w:tr>
+      <w:tr>
+        <w:trPr>
+          <w:cantSplit/>
+        </w:trPr>
+        <w:tc>
+          <w:tcPr>
+            <w:tcW w:type="dxa" w:w="1150"/>
+            <w:tcMar>
+              <w:top w:w="80" w:type="dxa"/>
+              <w:start w:w="120" w:type="dxa"/>
+              <w:bottom w:w="80" w:type="dxa"/>
+              <w:end w:w="120" w:type="dxa"/>
+            </w:tcMar>
+            <w:vAlign w:val="center"/>
+            <w:shd w:fill="FFFFFF"/>
+          </w:tcPr>
+          <w:p>
+            <w:pPr>
+              <w:spacing w:before="0" w:after="40" w:line="252" w:lineRule="auto"/>
+              <w:jc w:val="center"/>
+            </w:pPr>
+            <w:r>
+              <w:rPr>
+                <w:rFonts w:ascii="Calibri" w:hAnsi="Calibri"/>
+                <w:b w:val="0"/>
+                <w:color w:val="111827"/>
+                <w:sz w:val="16"/>
+              </w:rPr>
+              <w:t>EV-T-038</w:t>
+            </w:r>
+          </w:p>
+        </w:tc>
+        <w:tc>
+          <w:tcPr>
+            <w:tcW w:type="dxa" w:w="3700"/>
+            <w:tcMar>
+              <w:top w:w="80" w:type="dxa"/>
+              <w:start w:w="120" w:type="dxa"/>
+              <w:bottom w:w="80" w:type="dxa"/>
+              <w:end w:w="120" w:type="dxa"/>
+            </w:tcMar>
+            <w:vAlign w:val="center"/>
+            <w:shd w:fill="FFFFFF"/>
+          </w:tcPr>
+          <w:p>
+            <w:pPr>
+              <w:spacing w:before="0" w:after="40" w:line="252" w:lineRule="auto"/>
+              <w:jc w:val="left"/>
+            </w:pPr>
+            <w:r>
+              <w:rPr>
+                <w:rFonts w:ascii="Calibri" w:hAnsi="Calibri"/>
+                <w:b w:val="0"/>
+                <w:color w:val="111827"/>
+                <w:sz w:val="16"/>
+              </w:rPr>
+              <w:t>Regen deferred</w:t>
+            </w:r>
+          </w:p>
+        </w:tc>
+        <w:tc>
+          <w:tcPr>
+            <w:tcW w:type="dxa" w:w="3100"/>
+            <w:tcMar>
+              <w:top w:w="80" w:type="dxa"/>
+              <w:start w:w="120" w:type="dxa"/>
+              <w:bottom w:w="80" w:type="dxa"/>
+              <w:end w:w="120" w:type="dxa"/>
+            </w:tcMar>
+            <w:vAlign w:val="center"/>
+            <w:shd w:fill="FFFFFF"/>
+          </w:tcPr>
+          <w:p>
+            <w:pPr>
+              <w:spacing w:before="0" w:after="40" w:line="252" w:lineRule="auto"/>
+              <w:jc w:val="left"/>
+            </w:pPr>
+            <w:r>
+              <w:rPr>
+                <w:rFonts w:ascii="Calibri" w:hAnsi="Calibri"/>
+                <w:b w:val="0"/>
+                <w:color w:val="111827"/>
+                <w:sz w:val="16"/>
+              </w:rPr>
+              <w:t>Submit negative torque</w:t>
+            </w:r>
+          </w:p>
+        </w:tc>
+        <w:tc>
+          <w:tcPr>
+            <w:tcW w:type="dxa" w:w="1410"/>
+            <w:tcMar>
+              <w:top w:w="80" w:type="dxa"/>
+              <w:start w:w="120" w:type="dxa"/>
+              <w:bottom w:w="80" w:type="dxa"/>
+              <w:end w:w="120" w:type="dxa"/>
+            </w:tcMar>
+            <w:vAlign w:val="center"/>
+            <w:shd w:fill="FFFFFF"/>
+          </w:tcPr>
+          <w:p>
+            <w:pPr>
+              <w:spacing w:before="0" w:after="40" w:line="252" w:lineRule="auto"/>
+              <w:jc w:val="left"/>
+            </w:pPr>
+            <w:r>
+              <w:rPr>
+                <w:rFonts w:ascii="Calibri" w:hAnsi="Calibri"/>
+                <w:b w:val="0"/>
+                <w:color w:val="111827"/>
+                <w:sz w:val="16"/>
+              </w:rPr>
+              <w:t>Stable validation error</w:t>
+            </w:r>
+          </w:p>
+        </w:tc>
+      </w:tr>
+      <w:tr>
+        <w:trPr>
+          <w:cantSplit/>
+        </w:trPr>
+        <w:tc>
+          <w:tcPr>
+            <w:tcW w:type="dxa" w:w="1150"/>
+            <w:tcMar>
+              <w:top w:w="80" w:type="dxa"/>
+              <w:start w:w="120" w:type="dxa"/>
+              <w:bottom w:w="80" w:type="dxa"/>
+              <w:end w:w="120" w:type="dxa"/>
+            </w:tcMar>
+            <w:vAlign w:val="center"/>
+            <w:shd w:fill="FFFFFF"/>
+          </w:tcPr>
+          <w:p>
+            <w:pPr>
+              <w:spacing w:before="0" w:after="40" w:line="252" w:lineRule="auto"/>
+              <w:jc w:val="center"/>
+            </w:pPr>
+            <w:r>
+              <w:rPr>
+                <w:rFonts w:ascii="Calibri" w:hAnsi="Calibri"/>
+                <w:b w:val="0"/>
+                <w:color w:val="111827"/>
+                <w:sz w:val="16"/>
+              </w:rPr>
+              <w:t>EV-T-039</w:t>
+            </w:r>
+          </w:p>
+        </w:tc>
+        <w:tc>
+          <w:tcPr>
+            <w:tcW w:type="dxa" w:w="3700"/>
+            <w:tcMar>
+              <w:top w:w="80" w:type="dxa"/>
+              <w:start w:w="120" w:type="dxa"/>
+              <w:bottom w:w="80" w:type="dxa"/>
+              <w:end w:w="120" w:type="dxa"/>
+            </w:tcMar>
+            <w:vAlign w:val="center"/>
+            <w:shd w:fill="FFFFFF"/>
+          </w:tcPr>
+          <w:p>
+            <w:pPr>
+              <w:spacing w:before="0" w:after="40" w:line="252" w:lineRule="auto"/>
+              <w:jc w:val="left"/>
+            </w:pPr>
+            <w:r>
+              <w:rPr>
+                <w:rFonts w:ascii="Calibri" w:hAnsi="Calibri"/>
+                <w:b w:val="0"/>
+                <w:color w:val="111827"/>
+                <w:sz w:val="16"/>
+              </w:rPr>
+              <w:t>Motor exact replay</w:t>
+            </w:r>
+          </w:p>
+        </w:tc>
+        <w:tc>
+          <w:tcPr>
+            <w:tcW w:type="dxa" w:w="3100"/>
+            <w:tcMar>
+              <w:top w:w="80" w:type="dxa"/>
+              <w:start w:w="120" w:type="dxa"/>
+              <w:bottom w:w="80" w:type="dxa"/>
+              <w:end w:w="120" w:type="dxa"/>
+            </w:tcMar>
+            <w:vAlign w:val="center"/>
+            <w:shd w:fill="FFFFFF"/>
+          </w:tcPr>
+          <w:p>
+            <w:pPr>
+              <w:spacing w:before="0" w:after="40" w:line="252" w:lineRule="auto"/>
+              <w:jc w:val="left"/>
+            </w:pPr>
+            <w:r>
+              <w:rPr>
+                <w:rFonts w:ascii="Calibri" w:hAnsi="Calibri"/>
+                <w:b w:val="0"/>
+                <w:color w:val="111827"/>
+                <w:sz w:val="16"/>
+              </w:rPr>
+              <w:t>Retry identical motor command</w:t>
+            </w:r>
+          </w:p>
+        </w:tc>
+        <w:tc>
+          <w:tcPr>
+            <w:tcW w:type="dxa" w:w="1410"/>
+            <w:tcMar>
+              <w:top w:w="80" w:type="dxa"/>
+              <w:start w:w="120" w:type="dxa"/>
+              <w:bottom w:w="80" w:type="dxa"/>
+              <w:end w:w="120" w:type="dxa"/>
+            </w:tcMar>
+            <w:vAlign w:val="center"/>
+            <w:shd w:fill="FFFFFF"/>
+          </w:tcPr>
+          <w:p>
+            <w:pPr>
+              <w:spacing w:before="0" w:after="40" w:line="252" w:lineRule="auto"/>
+              <w:jc w:val="left"/>
+            </w:pPr>
+            <w:r>
+              <w:rPr>
+                <w:rFonts w:ascii="Calibri" w:hAnsi="Calibri"/>
+                <w:b w:val="0"/>
+                <w:color w:val="111827"/>
+                <w:sz w:val="16"/>
+              </w:rPr>
+              <w:t>Persisted snapshot returned</w:t>
+            </w:r>
+          </w:p>
+        </w:tc>
+      </w:tr>
+      <w:tr>
+        <w:trPr>
+          <w:cantSplit/>
+        </w:trPr>
+        <w:tc>
+          <w:tcPr>
+            <w:tcW w:type="dxa" w:w="1150"/>
+            <w:tcMar>
+              <w:top w:w="80" w:type="dxa"/>
+              <w:start w:w="120" w:type="dxa"/>
+              <w:bottom w:w="80" w:type="dxa"/>
+              <w:end w:w="120" w:type="dxa"/>
+            </w:tcMar>
+            <w:vAlign w:val="center"/>
+            <w:shd w:fill="FFFFFF"/>
+          </w:tcPr>
+          <w:p>
+            <w:pPr>
+              <w:spacing w:before="0" w:after="40" w:line="252" w:lineRule="auto"/>
+              <w:jc w:val="center"/>
+            </w:pPr>
+            <w:r>
+              <w:rPr>
+                <w:rFonts w:ascii="Calibri" w:hAnsi="Calibri"/>
+                <w:b w:val="0"/>
+                <w:color w:val="111827"/>
+                <w:sz w:val="16"/>
+              </w:rPr>
+              <w:t>EV-T-040</w:t>
+            </w:r>
+          </w:p>
+        </w:tc>
+        <w:tc>
+          <w:tcPr>
+            <w:tcW w:type="dxa" w:w="3700"/>
+            <w:tcMar>
+              <w:top w:w="80" w:type="dxa"/>
+              <w:start w:w="120" w:type="dxa"/>
+              <w:bottom w:w="80" w:type="dxa"/>
+              <w:end w:w="120" w:type="dxa"/>
+            </w:tcMar>
+            <w:vAlign w:val="center"/>
+            <w:shd w:fill="FFFFFF"/>
+          </w:tcPr>
+          <w:p>
+            <w:pPr>
+              <w:spacing w:before="0" w:after="40" w:line="252" w:lineRule="auto"/>
+              <w:jc w:val="left"/>
+            </w:pPr>
+            <w:r>
+              <w:rPr>
+                <w:rFonts w:ascii="Calibri" w:hAnsi="Calibri"/>
+                <w:b w:val="0"/>
+                <w:color w:val="111827"/>
+                <w:sz w:val="16"/>
+              </w:rPr>
+              <w:t>Motor changed reuse</w:t>
+            </w:r>
+          </w:p>
+        </w:tc>
+        <w:tc>
+          <w:tcPr>
+            <w:tcW w:type="dxa" w:w="3100"/>
+            <w:tcMar>
+              <w:top w:w="80" w:type="dxa"/>
+              <w:start w:w="120" w:type="dxa"/>
+              <w:bottom w:w="80" w:type="dxa"/>
+              <w:end w:w="120" w:type="dxa"/>
+            </w:tcMar>
+            <w:vAlign w:val="center"/>
+            <w:shd w:fill="FFFFFF"/>
+          </w:tcPr>
+          <w:p>
+            <w:pPr>
+              <w:spacing w:before="0" w:after="40" w:line="252" w:lineRule="auto"/>
+              <w:jc w:val="left"/>
+            </w:pPr>
+            <w:r>
+              <w:rPr>
+                <w:rFonts w:ascii="Calibri" w:hAnsi="Calibri"/>
+                <w:b w:val="0"/>
+                <w:color w:val="111827"/>
+                <w:sz w:val="16"/>
+              </w:rPr>
+              <w:t>Reuse ID with changed input</w:t>
+            </w:r>
+          </w:p>
+        </w:tc>
+        <w:tc>
+          <w:tcPr>
+            <w:tcW w:type="dxa" w:w="1410"/>
+            <w:tcMar>
+              <w:top w:w="80" w:type="dxa"/>
+              <w:start w:w="120" w:type="dxa"/>
+              <w:bottom w:w="80" w:type="dxa"/>
+              <w:end w:w="120" w:type="dxa"/>
+            </w:tcMar>
+            <w:vAlign w:val="center"/>
+            <w:shd w:fill="FFFFFF"/>
+          </w:tcPr>
+          <w:p>
+            <w:pPr>
+              <w:spacing w:before="0" w:after="40" w:line="252" w:lineRule="auto"/>
+              <w:jc w:val="left"/>
+            </w:pPr>
+            <w:r>
+              <w:rPr>
+                <w:rFonts w:ascii="Calibri" w:hAnsi="Calibri"/>
+                <w:b w:val="0"/>
+                <w:color w:val="111827"/>
+                <w:sz w:val="16"/>
+              </w:rPr>
+              <w:t>Stable command conflict</w:t>
+            </w:r>
+          </w:p>
+        </w:tc>
+      </w:tr>
+      <w:tr>
+        <w:trPr>
+          <w:cantSplit/>
+        </w:trPr>
+        <w:tc>
+          <w:tcPr>
+            <w:tcW w:type="dxa" w:w="1150"/>
+            <w:tcMar>
+              <w:top w:w="80" w:type="dxa"/>
+              <w:start w:w="120" w:type="dxa"/>
+              <w:bottom w:w="80" w:type="dxa"/>
+              <w:end w:w="120" w:type="dxa"/>
+            </w:tcMar>
+            <w:vAlign w:val="center"/>
+            <w:shd w:fill="FFFFFF"/>
+          </w:tcPr>
+          <w:p>
+            <w:pPr>
+              <w:spacing w:before="0" w:after="40" w:line="252" w:lineRule="auto"/>
+              <w:jc w:val="center"/>
+            </w:pPr>
+            <w:r>
+              <w:rPr>
+                <w:rFonts w:ascii="Calibri" w:hAnsi="Calibri"/>
+                <w:b w:val="0"/>
+                <w:color w:val="111827"/>
+                <w:sz w:val="16"/>
+              </w:rPr>
+              <w:t>EV-T-041</w:t>
+            </w:r>
+          </w:p>
+        </w:tc>
+        <w:tc>
+          <w:tcPr>
+            <w:tcW w:type="dxa" w:w="3700"/>
+            <w:tcMar>
+              <w:top w:w="80" w:type="dxa"/>
+              <w:start w:w="120" w:type="dxa"/>
+              <w:bottom w:w="80" w:type="dxa"/>
+              <w:end w:w="120" w:type="dxa"/>
+            </w:tcMar>
+            <w:vAlign w:val="center"/>
+            <w:shd w:fill="FFFFFF"/>
+          </w:tcPr>
+          <w:p>
+            <w:pPr>
+              <w:spacing w:before="0" w:after="40" w:line="252" w:lineRule="auto"/>
+              <w:jc w:val="left"/>
+            </w:pPr>
+            <w:r>
+              <w:rPr>
+                <w:rFonts w:ascii="Calibri" w:hAnsi="Calibri"/>
+                <w:b w:val="0"/>
+                <w:color w:val="111827"/>
+                <w:sz w:val="16"/>
+              </w:rPr>
+              <w:t>Motor version conflict</w:t>
+            </w:r>
+          </w:p>
+        </w:tc>
+        <w:tc>
+          <w:tcPr>
+            <w:tcW w:type="dxa" w:w="3100"/>
+            <w:tcMar>
+              <w:top w:w="80" w:type="dxa"/>
+              <w:start w:w="120" w:type="dxa"/>
+              <w:bottom w:w="80" w:type="dxa"/>
+              <w:end w:w="120" w:type="dxa"/>
+            </w:tcMar>
+            <w:vAlign w:val="center"/>
+            <w:shd w:fill="FFFFFF"/>
+          </w:tcPr>
+          <w:p>
+            <w:pPr>
+              <w:spacing w:before="0" w:after="40" w:line="252" w:lineRule="auto"/>
+              <w:jc w:val="left"/>
+            </w:pPr>
+            <w:r>
+              <w:rPr>
+                <w:rFonts w:ascii="Calibri" w:hAnsi="Calibri"/>
+                <w:b w:val="0"/>
+                <w:color w:val="111827"/>
+                <w:sz w:val="16"/>
+              </w:rPr>
+              <w:t>Submit stale state version</w:t>
+            </w:r>
+          </w:p>
+        </w:tc>
+        <w:tc>
+          <w:tcPr>
+            <w:tcW w:type="dxa" w:w="1410"/>
+            <w:tcMar>
+              <w:top w:w="80" w:type="dxa"/>
+              <w:start w:w="120" w:type="dxa"/>
+              <w:bottom w:w="80" w:type="dxa"/>
+              <w:end w:w="120" w:type="dxa"/>
+            </w:tcMar>
+            <w:vAlign w:val="center"/>
+            <w:shd w:fill="FFFFFF"/>
+          </w:tcPr>
+          <w:p>
+            <w:pPr>
+              <w:spacing w:before="0" w:after="40" w:line="252" w:lineRule="auto"/>
+              <w:jc w:val="left"/>
+            </w:pPr>
+            <w:r>
+              <w:rPr>
+                <w:rFonts w:ascii="Calibri" w:hAnsi="Calibri"/>
+                <w:b w:val="0"/>
+                <w:color w:val="111827"/>
+                <w:sz w:val="16"/>
+              </w:rPr>
+              <w:t>Current version returned</w:t>
+            </w:r>
+          </w:p>
+        </w:tc>
+      </w:tr>
+      <w:tr>
+        <w:trPr>
+          <w:cantSplit/>
+        </w:trPr>
+        <w:tc>
+          <w:tcPr>
+            <w:tcW w:type="dxa" w:w="1150"/>
+            <w:tcMar>
+              <w:top w:w="80" w:type="dxa"/>
+              <w:start w:w="120" w:type="dxa"/>
+              <w:bottom w:w="80" w:type="dxa"/>
+              <w:end w:w="120" w:type="dxa"/>
+            </w:tcMar>
+            <w:vAlign w:val="center"/>
+            <w:shd w:fill="FFFFFF"/>
+          </w:tcPr>
+          <w:p>
+            <w:pPr>
+              <w:spacing w:before="0" w:after="40" w:line="252" w:lineRule="auto"/>
+              <w:jc w:val="center"/>
+            </w:pPr>
+            <w:r>
+              <w:rPr>
+                <w:rFonts w:ascii="Calibri" w:hAnsi="Calibri"/>
+                <w:b w:val="0"/>
+                <w:color w:val="111827"/>
+                <w:sz w:val="16"/>
+              </w:rPr>
+              <w:t>EV-T-042</w:t>
+            </w:r>
+          </w:p>
+        </w:tc>
+        <w:tc>
+          <w:tcPr>
+            <w:tcW w:type="dxa" w:w="3700"/>
+            <w:tcMar>
+              <w:top w:w="80" w:type="dxa"/>
+              <w:start w:w="120" w:type="dxa"/>
+              <w:bottom w:w="80" w:type="dxa"/>
+              <w:end w:w="120" w:type="dxa"/>
+            </w:tcMar>
+            <w:vAlign w:val="center"/>
+            <w:shd w:fill="FFFFFF"/>
+          </w:tcPr>
+          <w:p>
+            <w:pPr>
+              <w:spacing w:before="0" w:after="40" w:line="252" w:lineRule="auto"/>
+              <w:jc w:val="left"/>
+            </w:pPr>
+            <w:r>
+              <w:rPr>
+                <w:rFonts w:ascii="Calibri" w:hAnsi="Calibri"/>
+                <w:b w:val="0"/>
+                <w:color w:val="111827"/>
+                <w:sz w:val="16"/>
+              </w:rPr>
+              <w:t>Motor atomic evidence</w:t>
+            </w:r>
+          </w:p>
+        </w:tc>
+        <w:tc>
+          <w:tcPr>
+            <w:tcW w:type="dxa" w:w="3100"/>
+            <w:tcMar>
+              <w:top w:w="80" w:type="dxa"/>
+              <w:start w:w="120" w:type="dxa"/>
+              <w:bottom w:w="80" w:type="dxa"/>
+              <w:end w:w="120" w:type="dxa"/>
+            </w:tcMar>
+            <w:vAlign w:val="center"/>
+            <w:shd w:fill="FFFFFF"/>
+          </w:tcPr>
+          <w:p>
+            <w:pPr>
+              <w:spacing w:before="0" w:after="40" w:line="252" w:lineRule="auto"/>
+              <w:jc w:val="left"/>
+            </w:pPr>
+            <w:r>
+              <w:rPr>
+                <w:rFonts w:ascii="Calibri" w:hAnsi="Calibri"/>
+                <w:b w:val="0"/>
+                <w:color w:val="111827"/>
+                <w:sz w:val="16"/>
+              </w:rPr>
+              <w:t>Inspect step, audit, and outbox</w:t>
+            </w:r>
+          </w:p>
+        </w:tc>
+        <w:tc>
+          <w:tcPr>
+            <w:tcW w:type="dxa" w:w="1410"/>
+            <w:tcMar>
+              <w:top w:w="80" w:type="dxa"/>
+              <w:start w:w="120" w:type="dxa"/>
+              <w:bottom w:w="80" w:type="dxa"/>
+              <w:end w:w="120" w:type="dxa"/>
+            </w:tcMar>
+            <w:vAlign w:val="center"/>
+            <w:shd w:fill="FFFFFF"/>
+          </w:tcPr>
+          <w:p>
+            <w:pPr>
+              <w:spacing w:before="0" w:after="40" w:line="252" w:lineRule="auto"/>
+              <w:jc w:val="left"/>
+            </w:pPr>
+            <w:r>
+              <w:rPr>
+                <w:rFonts w:ascii="Calibri" w:hAnsi="Calibri"/>
+                <w:b w:val="0"/>
+                <w:color w:val="111827"/>
+                <w:sz w:val="16"/>
+              </w:rPr>
+              <w:t>All commit or all roll back</w:t>
+            </w:r>
+          </w:p>
+        </w:tc>
+      </w:tr>
+      <w:tr>
+        <w:trPr>
+          <w:cantSplit/>
+        </w:trPr>
+        <w:tc>
+          <w:tcPr>
+            <w:tcW w:type="dxa" w:w="1150"/>
+            <w:tcMar>
+              <w:top w:w="80" w:type="dxa"/>
+              <w:start w:w="120" w:type="dxa"/>
+              <w:bottom w:w="80" w:type="dxa"/>
+              <w:end w:w="120" w:type="dxa"/>
+            </w:tcMar>
+            <w:vAlign w:val="center"/>
+            <w:shd w:fill="FFFFFF"/>
+          </w:tcPr>
+          <w:p>
+            <w:pPr>
+              <w:spacing w:before="0" w:after="40" w:line="252" w:lineRule="auto"/>
+              <w:jc w:val="center"/>
+            </w:pPr>
+            <w:r>
+              <w:rPr>
+                <w:rFonts w:ascii="Calibri" w:hAnsi="Calibri"/>
+                <w:b w:val="0"/>
+                <w:color w:val="111827"/>
+                <w:sz w:val="16"/>
+              </w:rPr>
+              <w:t>EV-T-043</w:t>
+            </w:r>
+          </w:p>
+        </w:tc>
+        <w:tc>
+          <w:tcPr>
+            <w:tcW w:type="dxa" w:w="3700"/>
+            <w:tcMar>
+              <w:top w:w="80" w:type="dxa"/>
+              <w:start w:w="120" w:type="dxa"/>
+              <w:bottom w:w="80" w:type="dxa"/>
+              <w:end w:w="120" w:type="dxa"/>
+            </w:tcMar>
+            <w:vAlign w:val="center"/>
+            <w:shd w:fill="FFFFFF"/>
+          </w:tcPr>
+          <w:p>
+            <w:pPr>
+              <w:spacing w:before="0" w:after="40" w:line="252" w:lineRule="auto"/>
+              <w:jc w:val="left"/>
+            </w:pPr>
+            <w:r>
+              <w:rPr>
+                <w:rFonts w:ascii="Calibri" w:hAnsi="Calibri"/>
+                <w:b w:val="0"/>
+                <w:color w:val="111827"/>
+                <w:sz w:val="16"/>
+              </w:rPr>
+              <w:t>Powertrain OpenAPI</w:t>
+            </w:r>
+          </w:p>
+        </w:tc>
+        <w:tc>
+          <w:tcPr>
+            <w:tcW w:type="dxa" w:w="3100"/>
+            <w:tcMar>
+              <w:top w:w="80" w:type="dxa"/>
+              <w:start w:w="120" w:type="dxa"/>
+              <w:bottom w:w="80" w:type="dxa"/>
+              <w:end w:w="120" w:type="dxa"/>
+            </w:tcMar>
+            <w:vAlign w:val="center"/>
+            <w:shd w:fill="FFFFFF"/>
+          </w:tcPr>
+          <w:p>
+            <w:pPr>
+              <w:spacing w:before="0" w:after="40" w:line="252" w:lineRule="auto"/>
+              <w:jc w:val="left"/>
+            </w:pPr>
+            <w:r>
+              <w:rPr>
+                <w:rFonts w:ascii="Calibri" w:hAnsi="Calibri"/>
+                <w:b w:val="0"/>
+                <w:color w:val="111827"/>
+                <w:sz w:val="16"/>
+              </w:rPr>
+              <w:t>Inspect routes and physical bounds</w:t>
+            </w:r>
+          </w:p>
+        </w:tc>
+        <w:tc>
+          <w:tcPr>
+            <w:tcW w:type="dxa" w:w="1410"/>
+            <w:tcMar>
+              <w:top w:w="80" w:type="dxa"/>
+              <w:start w:w="120" w:type="dxa"/>
+              <w:bottom w:w="80" w:type="dxa"/>
+              <w:end w:w="120" w:type="dxa"/>
+            </w:tcMar>
+            <w:vAlign w:val="center"/>
+            <w:shd w:fill="FFFFFF"/>
+          </w:tcPr>
+          <w:p>
+            <w:pPr>
+              <w:spacing w:before="0" w:after="40" w:line="252" w:lineRule="auto"/>
+              <w:jc w:val="left"/>
+            </w:pPr>
+            <w:r>
+              <w:rPr>
+                <w:rFonts w:ascii="Calibri" w:hAnsi="Calibri"/>
+                <w:b w:val="0"/>
+                <w:color w:val="111827"/>
+                <w:sz w:val="16"/>
+              </w:rPr>
+              <w:t>Bounded schema published</w:t>
+            </w:r>
+          </w:p>
+        </w:tc>
+      </w:tr>
+      <w:tr>
+        <w:trPr>
+          <w:cantSplit/>
+        </w:trPr>
+        <w:tc>
+          <w:tcPr>
+            <w:tcW w:type="dxa" w:w="1150"/>
+            <w:tcMar>
+              <w:top w:w="80" w:type="dxa"/>
+              <w:start w:w="120" w:type="dxa"/>
+              <w:bottom w:w="80" w:type="dxa"/>
+              <w:end w:w="120" w:type="dxa"/>
+            </w:tcMar>
+            <w:vAlign w:val="center"/>
+            <w:shd w:fill="FFFFFF"/>
+          </w:tcPr>
+          <w:p>
+            <w:pPr>
+              <w:spacing w:before="0" w:after="40" w:line="252" w:lineRule="auto"/>
+              <w:jc w:val="center"/>
+            </w:pPr>
+            <w:r>
+              <w:rPr>
+                <w:rFonts w:ascii="Calibri" w:hAnsi="Calibri"/>
+                <w:b w:val="0"/>
+                <w:color w:val="111827"/>
+                <w:sz w:val="16"/>
+              </w:rPr>
+              <w:t>EV-T-044</w:t>
+            </w:r>
+          </w:p>
+        </w:tc>
+        <w:tc>
+          <w:tcPr>
+            <w:tcW w:type="dxa" w:w="3700"/>
+            <w:tcMar>
+              <w:top w:w="80" w:type="dxa"/>
+              <w:start w:w="120" w:type="dxa"/>
+              <w:bottom w:w="80" w:type="dxa"/>
+              <w:end w:w="120" w:type="dxa"/>
+            </w:tcMar>
+            <w:vAlign w:val="center"/>
+            <w:shd w:fill="FFFFFF"/>
+          </w:tcPr>
+          <w:p>
+            <w:pPr>
+              <w:spacing w:before="0" w:after="40" w:line="252" w:lineRule="auto"/>
+              <w:jc w:val="left"/>
+            </w:pPr>
+            <w:r>
+              <w:rPr>
+                <w:rFonts w:ascii="Calibri" w:hAnsi="Calibri"/>
+                <w:b w:val="0"/>
+                <w:color w:val="111827"/>
+                <w:sz w:val="16"/>
+              </w:rPr>
+              <w:t>Migration 0038</w:t>
+            </w:r>
+          </w:p>
+        </w:tc>
+        <w:tc>
+          <w:tcPr>
+            <w:tcW w:type="dxa" w:w="3100"/>
+            <w:tcMar>
+              <w:top w:w="80" w:type="dxa"/>
+              <w:start w:w="120" w:type="dxa"/>
+              <w:bottom w:w="80" w:type="dxa"/>
+              <w:end w:w="120" w:type="dxa"/>
+            </w:tcMar>
+            <w:vAlign w:val="center"/>
+            <w:shd w:fill="FFFFFF"/>
+          </w:tcPr>
+          <w:p>
+            <w:pPr>
+              <w:spacing w:before="0" w:after="40" w:line="252" w:lineRule="auto"/>
+              <w:jc w:val="left"/>
+            </w:pPr>
+            <w:r>
+              <w:rPr>
+                <w:rFonts w:ascii="Calibri" w:hAnsi="Calibri"/>
+                <w:b w:val="0"/>
+                <w:color w:val="111827"/>
+                <w:sz w:val="16"/>
+              </w:rPr>
+              <w:t>Upgrade and downgrade disposable DB</w:t>
+            </w:r>
+          </w:p>
+        </w:tc>
+        <w:tc>
+          <w:tcPr>
+            <w:tcW w:type="dxa" w:w="1410"/>
+            <w:tcMar>
+              <w:top w:w="80" w:type="dxa"/>
+              <w:start w:w="120" w:type="dxa"/>
+              <w:bottom w:w="80" w:type="dxa"/>
+              <w:end w:w="120" w:type="dxa"/>
+            </w:tcMar>
+            <w:vAlign w:val="center"/>
+            <w:shd w:fill="FFFFFF"/>
+          </w:tcPr>
+          <w:p>
+            <w:pPr>
+              <w:spacing w:before="0" w:after="40" w:line="252" w:lineRule="auto"/>
+              <w:jc w:val="left"/>
+            </w:pPr>
+            <w:r>
+              <w:rPr>
+                <w:rFonts w:ascii="Calibri" w:hAnsi="Calibri"/>
+                <w:b w:val="0"/>
+                <w:color w:val="111827"/>
+                <w:sz w:val="16"/>
+              </w:rPr>
+              <w:t>Tables created and removed cleanly</w:t>
             </w:r>
           </w:p>
         </w:tc>
@@ -7626,7 +11456,7 @@
                 <w:color w:val="0B2545"/>
                 <w:sz w:val="17"/>
               </w:rPr>
-              <w:t>VI-1 evidence</w:t>
+              <w:t>VI-1 and VI-2 evidence</w:t>
             </w:r>
           </w:p>
         </w:tc>
@@ -7687,7 +11517,7 @@
                 <w:color w:val="111827"/>
                 <w:sz w:val="17"/>
               </w:rPr>
-              <w:t>Contract, creation, deterministic discharge, thermal protection, replay, conflicts</w:t>
+              <w:t>Battery/BMS plus motor torque, power, efficiency, limits, thermal protection, replay, conflicts</w:t>
             </w:r>
           </w:p>
         </w:tc>
@@ -8719,6 +12549,273 @@
           </w:p>
         </w:tc>
       </w:tr>
+      <w:tr>
+        <w:trPr>
+          <w:cantSplit/>
+        </w:trPr>
+        <w:tc>
+          <w:tcPr>
+            <w:tcW w:type="dxa" w:w="1650"/>
+            <w:tcMar>
+              <w:top w:w="80" w:type="dxa"/>
+              <w:start w:w="120" w:type="dxa"/>
+              <w:bottom w:w="80" w:type="dxa"/>
+              <w:end w:w="120" w:type="dxa"/>
+            </w:tcMar>
+            <w:vAlign w:val="center"/>
+            <w:shd w:fill="FFFFFF"/>
+          </w:tcPr>
+          <w:p>
+            <w:pPr>
+              <w:spacing w:before="0" w:after="40" w:line="252" w:lineRule="auto"/>
+              <w:jc w:val="center"/>
+            </w:pPr>
+            <w:r>
+              <w:rPr>
+                <w:rFonts w:ascii="Calibri" w:hAnsi="Calibri"/>
+                <w:b w:val="0"/>
+                <w:color w:val="111827"/>
+                <w:sz w:val="17"/>
+              </w:rPr>
+              <w:t>Analytic efficiency surface</w:t>
+            </w:r>
+          </w:p>
+        </w:tc>
+        <w:tc>
+          <w:tcPr>
+            <w:tcW w:type="dxa" w:w="4450"/>
+            <w:tcMar>
+              <w:top w:w="80" w:type="dxa"/>
+              <w:start w:w="120" w:type="dxa"/>
+              <w:bottom w:w="80" w:type="dxa"/>
+              <w:end w:w="120" w:type="dxa"/>
+            </w:tcMar>
+            <w:vAlign w:val="center"/>
+            <w:shd w:fill="FFFFFF"/>
+          </w:tcPr>
+          <w:p>
+            <w:pPr>
+              <w:spacing w:before="0" w:after="40" w:line="252" w:lineRule="auto"/>
+              <w:jc w:val="left"/>
+            </w:pPr>
+            <w:r>
+              <w:rPr>
+                <w:rFonts w:ascii="Calibri" w:hAnsi="Calibri"/>
+                <w:b w:val="0"/>
+                <w:color w:val="111827"/>
+                <w:sz w:val="17"/>
+              </w:rPr>
+              <w:t>Lower fidelity than dyno calibration</w:t>
+            </w:r>
+          </w:p>
+        </w:tc>
+        <w:tc>
+          <w:tcPr>
+            <w:tcW w:type="dxa" w:w="3260"/>
+            <w:tcMar>
+              <w:top w:w="80" w:type="dxa"/>
+              <w:start w:w="120" w:type="dxa"/>
+              <w:bottom w:w="80" w:type="dxa"/>
+              <w:end w:w="120" w:type="dxa"/>
+            </w:tcMar>
+            <w:vAlign w:val="center"/>
+            <w:shd w:fill="FFFFFF"/>
+          </w:tcPr>
+          <w:p>
+            <w:pPr>
+              <w:spacing w:before="0" w:after="40" w:line="252" w:lineRule="auto"/>
+              <w:jc w:val="left"/>
+            </w:pPr>
+            <w:r>
+              <w:rPr>
+                <w:rFonts w:ascii="Calibri" w:hAnsi="Calibri"/>
+                <w:b w:val="0"/>
+                <w:color w:val="111827"/>
+                <w:sz w:val="17"/>
+              </w:rPr>
+              <w:t>Add versioned torque-speed-efficiency maps later</w:t>
+            </w:r>
+          </w:p>
+        </w:tc>
+      </w:tr>
+      <w:tr>
+        <w:trPr>
+          <w:cantSplit/>
+        </w:trPr>
+        <w:tc>
+          <w:tcPr>
+            <w:tcW w:type="dxa" w:w="1650"/>
+            <w:tcMar>
+              <w:top w:w="80" w:type="dxa"/>
+              <w:start w:w="120" w:type="dxa"/>
+              <w:bottom w:w="80" w:type="dxa"/>
+              <w:end w:w="120" w:type="dxa"/>
+            </w:tcMar>
+            <w:vAlign w:val="center"/>
+            <w:shd w:fill="FFFFFF"/>
+          </w:tcPr>
+          <w:p>
+            <w:pPr>
+              <w:spacing w:before="0" w:after="40" w:line="252" w:lineRule="auto"/>
+              <w:jc w:val="center"/>
+            </w:pPr>
+            <w:r>
+              <w:rPr>
+                <w:rFonts w:ascii="Calibri" w:hAnsi="Calibri"/>
+                <w:b w:val="0"/>
+                <w:color w:val="111827"/>
+                <w:sz w:val="17"/>
+              </w:rPr>
+              <w:t>Motor step does not debit SOC</w:t>
+            </w:r>
+          </w:p>
+        </w:tc>
+        <w:tc>
+          <w:tcPr>
+            <w:tcW w:type="dxa" w:w="4450"/>
+            <w:tcMar>
+              <w:top w:w="80" w:type="dxa"/>
+              <w:start w:w="120" w:type="dxa"/>
+              <w:bottom w:w="80" w:type="dxa"/>
+              <w:end w:w="120" w:type="dxa"/>
+            </w:tcMar>
+            <w:vAlign w:val="center"/>
+            <w:shd w:fill="FFFFFF"/>
+          </w:tcPr>
+          <w:p>
+            <w:pPr>
+              <w:spacing w:before="0" w:after="40" w:line="252" w:lineRule="auto"/>
+              <w:jc w:val="left"/>
+            </w:pPr>
+            <w:r>
+              <w:rPr>
+                <w:rFonts w:ascii="Calibri" w:hAnsi="Calibri"/>
+                <w:b w:val="0"/>
+                <w:color w:val="111827"/>
+                <w:sz w:val="17"/>
+              </w:rPr>
+              <w:t>Energy domains can diverge across long scenarios</w:t>
+            </w:r>
+          </w:p>
+        </w:tc>
+        <w:tc>
+          <w:tcPr>
+            <w:tcW w:type="dxa" w:w="3260"/>
+            <w:tcMar>
+              <w:top w:w="80" w:type="dxa"/>
+              <w:start w:w="120" w:type="dxa"/>
+              <w:bottom w:w="80" w:type="dxa"/>
+              <w:end w:w="120" w:type="dxa"/>
+            </w:tcMar>
+            <w:vAlign w:val="center"/>
+            <w:shd w:fill="FFFFFF"/>
+          </w:tcPr>
+          <w:p>
+            <w:pPr>
+              <w:spacing w:before="0" w:after="40" w:line="252" w:lineRule="auto"/>
+              <w:jc w:val="left"/>
+            </w:pPr>
+            <w:r>
+              <w:rPr>
+                <w:rFonts w:ascii="Calibri" w:hAnsi="Calibri"/>
+                <w:b w:val="0"/>
+                <w:color w:val="111827"/>
+                <w:sz w:val="17"/>
+              </w:rPr>
+              <w:t>Couple energy flow in VI-6/VI-7 scenarios</w:t>
+            </w:r>
+          </w:p>
+        </w:tc>
+      </w:tr>
+      <w:tr>
+        <w:trPr>
+          <w:cantSplit/>
+        </w:trPr>
+        <w:tc>
+          <w:tcPr>
+            <w:tcW w:type="dxa" w:w="1650"/>
+            <w:tcMar>
+              <w:top w:w="80" w:type="dxa"/>
+              <w:start w:w="120" w:type="dxa"/>
+              <w:bottom w:w="80" w:type="dxa"/>
+              <w:end w:w="120" w:type="dxa"/>
+            </w:tcMar>
+            <w:vAlign w:val="center"/>
+            <w:shd w:fill="FFFFFF"/>
+          </w:tcPr>
+          <w:p>
+            <w:pPr>
+              <w:spacing w:before="0" w:after="40" w:line="252" w:lineRule="auto"/>
+              <w:jc w:val="center"/>
+            </w:pPr>
+            <w:r>
+              <w:rPr>
+                <w:rFonts w:ascii="Calibri" w:hAnsi="Calibri"/>
+                <w:b w:val="0"/>
+                <w:color w:val="111827"/>
+                <w:sz w:val="17"/>
+              </w:rPr>
+              <w:t>Fixed motor thermal constants</w:t>
+            </w:r>
+          </w:p>
+        </w:tc>
+        <w:tc>
+          <w:tcPr>
+            <w:tcW w:type="dxa" w:w="4450"/>
+            <w:tcMar>
+              <w:top w:w="80" w:type="dxa"/>
+              <w:start w:w="120" w:type="dxa"/>
+              <w:bottom w:w="80" w:type="dxa"/>
+              <w:end w:w="120" w:type="dxa"/>
+            </w:tcMar>
+            <w:vAlign w:val="center"/>
+            <w:shd w:fill="FFFFFF"/>
+          </w:tcPr>
+          <w:p>
+            <w:pPr>
+              <w:spacing w:before="0" w:after="40" w:line="252" w:lineRule="auto"/>
+              <w:jc w:val="left"/>
+            </w:pPr>
+            <w:r>
+              <w:rPr>
+                <w:rFonts w:ascii="Calibri" w:hAnsi="Calibri"/>
+                <w:b w:val="0"/>
+                <w:color w:val="111827"/>
+                <w:sz w:val="17"/>
+              </w:rPr>
+              <w:t>Cannot represent every cooling design</w:t>
+            </w:r>
+          </w:p>
+        </w:tc>
+        <w:tc>
+          <w:tcPr>
+            <w:tcW w:type="dxa" w:w="3260"/>
+            <w:tcMar>
+              <w:top w:w="80" w:type="dxa"/>
+              <w:start w:w="120" w:type="dxa"/>
+              <w:bottom w:w="80" w:type="dxa"/>
+              <w:end w:w="120" w:type="dxa"/>
+            </w:tcMar>
+            <w:vAlign w:val="center"/>
+            <w:shd w:fill="FFFFFF"/>
+          </w:tcPr>
+          <w:p>
+            <w:pPr>
+              <w:spacing w:before="0" w:after="40" w:line="252" w:lineRule="auto"/>
+              <w:jc w:val="left"/>
+            </w:pPr>
+            <w:r>
+              <w:rPr>
+                <w:rFonts w:ascii="Calibri" w:hAnsi="Calibri"/>
+                <w:b w:val="0"/>
+                <w:color w:val="111827"/>
+                <w:sz w:val="17"/>
+              </w:rPr>
+              <w:t>Add calibration profiles in VI-5</w:t>
+            </w:r>
+          </w:p>
+        </w:tc>
+      </w:tr>
     </w:tbl>
     <w:p>
       <w:pPr>
@@ -8740,7 +12837,7 @@
         <w:pStyle w:val="ListNumber"/>
         <w:numPr>
           <w:ilvl w:val="0"/>
-          <w:numId w:val="17"/>
+          <w:numId w:val="21"/>
         </w:numPr>
         <w:spacing w:after="120"/>
       </w:pPr>
@@ -8758,7 +12855,7 @@
         <w:pStyle w:val="ListNumber"/>
         <w:numPr>
           <w:ilvl w:val="0"/>
-          <w:numId w:val="17"/>
+          <w:numId w:val="21"/>
         </w:numPr>
         <w:spacing w:after="120"/>
       </w:pPr>
@@ -8776,7 +12873,7 @@
         <w:pStyle w:val="ListNumber"/>
         <w:numPr>
           <w:ilvl w:val="0"/>
-          <w:numId w:val="17"/>
+          <w:numId w:val="21"/>
         </w:numPr>
         <w:spacing w:after="120"/>
       </w:pPr>
@@ -8794,7 +12891,7 @@
         <w:pStyle w:val="ListNumber"/>
         <w:numPr>
           <w:ilvl w:val="0"/>
-          <w:numId w:val="17"/>
+          <w:numId w:val="21"/>
         </w:numPr>
         <w:spacing w:after="120"/>
       </w:pPr>
@@ -8812,7 +12909,7 @@
         <w:pStyle w:val="ListNumber"/>
         <w:numPr>
           <w:ilvl w:val="0"/>
-          <w:numId w:val="17"/>
+          <w:numId w:val="21"/>
         </w:numPr>
         <w:spacing w:after="120"/>
       </w:pPr>
@@ -8830,7 +12927,7 @@
         <w:pStyle w:val="ListNumber"/>
         <w:numPr>
           <w:ilvl w:val="0"/>
-          <w:numId w:val="17"/>
+          <w:numId w:val="21"/>
         </w:numPr>
         <w:spacing w:after="120"/>
       </w:pPr>
@@ -8848,7 +12945,7 @@
         <w:pStyle w:val="ListNumber"/>
         <w:numPr>
           <w:ilvl w:val="0"/>
-          <w:numId w:val="17"/>
+          <w:numId w:val="21"/>
         </w:numPr>
         <w:spacing w:after="120"/>
       </w:pPr>
@@ -8859,6 +12956,96 @@
           <w:sz w:val="22"/>
         </w:rPr>
         <w:t>Design a chemistry-specific OCV curve without breaking persisted replay evidence.</w:t>
+      </w:r>
+    </w:p>
+    <w:p>
+      <w:pPr>
+        <w:pStyle w:val="ListNumber"/>
+        <w:numPr>
+          <w:ilvl w:val="0"/>
+          <w:numId w:val="21"/>
+        </w:numPr>
+        <w:spacing w:after="120"/>
+      </w:pPr>
+      <w:r>
+        <w:rPr>
+          <w:rFonts w:ascii="Calibri" w:hAnsi="Calibri"/>
+          <w:color w:val="111827"/>
+          <w:sz w:val="22"/>
+        </w:rPr>
+        <w:t>Create the motor/inverter baseline and explain why it begins in standby.</w:t>
+      </w:r>
+    </w:p>
+    <w:p>
+      <w:pPr>
+        <w:pStyle w:val="ListNumber"/>
+        <w:numPr>
+          <w:ilvl w:val="0"/>
+          <w:numId w:val="21"/>
+        </w:numPr>
+        <w:spacing w:after="120"/>
+      </w:pPr>
+      <w:r>
+        <w:rPr>
+          <w:rFonts w:ascii="Calibri" w:hAnsi="Calibri"/>
+          <w:color w:val="111827"/>
+          <w:sz w:val="22"/>
+        </w:rPr>
+        <w:t>Compare eco, normal, and sport peak-torque limits.</w:t>
+      </w:r>
+    </w:p>
+    <w:p>
+      <w:pPr>
+        <w:pStyle w:val="ListNumber"/>
+        <w:numPr>
+          <w:ilvl w:val="0"/>
+          <w:numId w:val="21"/>
+        </w:numPr>
+        <w:spacing w:after="120"/>
+      </w:pPr>
+      <w:r>
+        <w:rPr>
+          <w:rFonts w:ascii="Calibri" w:hAnsi="Calibri"/>
+          <w:color w:val="111827"/>
+          <w:sz w:val="22"/>
+        </w:rPr>
+        <w:t>Calculate mechanical and electrical power for 100 Nm at 3,000 rpm.</w:t>
+      </w:r>
+    </w:p>
+    <w:p>
+      <w:pPr>
+        <w:pStyle w:val="ListNumber"/>
+        <w:numPr>
+          <w:ilvl w:val="0"/>
+          <w:numId w:val="21"/>
+        </w:numPr>
+        <w:spacing w:after="120"/>
+      </w:pPr>
+      <w:r>
+        <w:rPr>
+          <w:rFonts w:ascii="Calibri" w:hAnsi="Calibri"/>
+          <w:color w:val="111827"/>
+          <w:sz w:val="22"/>
+        </w:rPr>
+        <w:t>Open the battery contactors and prove that propulsion torque becomes unavailable.</w:t>
+      </w:r>
+    </w:p>
+    <w:p>
+      <w:pPr>
+        <w:pStyle w:val="ListNumber"/>
+        <w:numPr>
+          <w:ilvl w:val="0"/>
+          <w:numId w:val="21"/>
+        </w:numPr>
+        <w:spacing w:after="120"/>
+      </w:pPr>
+      <w:r>
+        <w:rPr>
+          <w:rFonts w:ascii="Calibri" w:hAnsi="Calibri"/>
+          <w:color w:val="111827"/>
+          <w:sz w:val="22"/>
+        </w:rPr>
+        <w:t>Trigger the motor thermal boundary and inspect the stable limiting reason.</w:t>
       </w:r>
     </w:p>
     <w:p>
@@ -8878,7 +13065,7 @@
           <w:color w:val="111827"/>
           <w:sz w:val="22"/>
         </w:rPr>
-        <w:t>VI-2 will add motor and inverter state, requested and delivered torque, efficiency, electrical power, thermal loss, speed limits, and battery-derived charge/discharge power constraints. It should reuse the same logical-time, optimistic-version, idempotency, RBAC, audit, outbox, and evidence patterns.</w:t>
+        <w:t>VI-3 will add regenerative braking, battery charge-acceptance limits, requested deceleration, recoverable motor torque, recovered electrical energy, and blended friction-brake allocation. It will retain logical time, explicit sign conventions, optimistic versions, idempotency, RBAC, audit, outbox, and bounded evidence.</w:t>
       </w:r>
     </w:p>
     <w:sectPr>
@@ -8910,7 +13097,7 @@
         <w:color w:val="667085"/>
         <w:sz w:val="17"/>
       </w:rPr>
-      <w:t>ATEP Volume VI Workbook  |  Version 0.1.0</w:t>
+      <w:t>ATEP Volume VI Workbook  |  Version 0.2.0</w:t>
     </w:r>
     <w:r>
       <w:rPr>
@@ -9234,6 +13421,30 @@
     </w:lvlOverride>
   </w:num>
   <w:num w:numId="17">
+    <w:abstractNumId w:val="10"/>
+    <w:lvlOverride w:ilvl="0">
+      <w:startOverride w:val="1"/>
+    </w:lvlOverride>
+  </w:num>
+  <w:num w:numId="18">
+    <w:abstractNumId w:val="10"/>
+    <w:lvlOverride w:ilvl="0">
+      <w:startOverride w:val="1"/>
+    </w:lvlOverride>
+  </w:num>
+  <w:num w:numId="19">
+    <w:abstractNumId w:val="10"/>
+    <w:lvlOverride w:ilvl="0">
+      <w:startOverride w:val="1"/>
+    </w:lvlOverride>
+  </w:num>
+  <w:num w:numId="20">
+    <w:abstractNumId w:val="10"/>
+    <w:lvlOverride w:ilvl="0">
+      <w:startOverride w:val="1"/>
+    </w:lvlOverride>
+  </w:num>
+  <w:num w:numId="21">
     <w:abstractNumId w:val="9"/>
     <w:lvlOverride w:ilvl="0">
       <w:startOverride w:val="1"/>

</xml_diff>

<commit_message>
feat(electric-vehicle): add regenerative braking
</commit_message>
<xml_diff>
--- a/docs/ATEP_Volume_VI_Electric_Vehicle_Engineering_Workbook.docx
+++ b/docs/ATEP_Volume_VI_Electric_Vehicle_Engineering_Workbook.docx
@@ -143,7 +143,7 @@
                 <w:color w:val="0B2545"/>
                 <w:sz w:val="19"/>
               </w:rPr>
-              <w:t>0.2.0</w:t>
+              <w:t>0.3.0</w:t>
             </w:r>
           </w:p>
         </w:tc>
@@ -204,7 +204,7 @@
                 <w:color w:val="111827"/>
                 <w:sz w:val="19"/>
               </w:rPr>
-              <w:t>3 September 2026</w:t>
+              <w:t>4 September 2026</w:t>
             </w:r>
           </w:p>
         </w:tc>
@@ -265,7 +265,7 @@
                 <w:color w:val="111827"/>
                 <w:sz w:val="19"/>
               </w:rPr>
-              <w:t>VI-1 battery/BMS and VI-2 motor/inverter implemented</w:t>
+              <w:t>VI-1 battery/BMS, VI-2 motor/inverter, and VI-3 braking implemented</w:t>
             </w:r>
           </w:p>
         </w:tc>
@@ -873,7 +873,7 @@
                 <w:color w:val="111827"/>
                 <w:sz w:val="17"/>
               </w:rPr>
-              <w:t>0.2.0</w:t>
+              <w:t>0.3.0</w:t>
             </w:r>
           </w:p>
         </w:tc>
@@ -934,7 +934,7 @@
                 <w:color w:val="111827"/>
                 <w:sz w:val="17"/>
               </w:rPr>
-              <w:t>3 September 2026</w:t>
+              <w:t>4 September 2026</w:t>
             </w:r>
           </w:p>
         </w:tc>
@@ -995,7 +995,7 @@
                 <w:color w:val="111827"/>
                 <w:sz w:val="17"/>
               </w:rPr>
-              <w:t>VI-1 battery/BMS and VI-2 motor/inverter implemented</w:t>
+              <w:t>VI-1 battery/BMS, VI-2 motor/inverter, and VI-3 regenerative braking implemented</w:t>
             </w:r>
           </w:p>
         </w:tc>
@@ -1084,7 +1084,7 @@
           <w:color w:val="111827"/>
           <w:sz w:val="22"/>
         </w:rPr>
-        <w:t>Volume VI turns the platform's general digital vehicle into a testable electric-energy system. VI-1 establishes a persistent battery pack and deterministic BMS behavior. VI-2 adds a persistent motor/inverter aggregate, torque delivery, efficiency, power loss, thermal protection, drive-mode limits, and battery-derived propulsion availability for repeatable software tests.</w:t>
+        <w:t>Volume VI turns the platform's general digital vehicle into a testable electric-energy system. VI-1 establishes a persistent battery pack and deterministic BMS behavior. VI-2 adds a persistent motor/inverter aggregate, torque delivery, efficiency, power loss, thermal protection, drive-mode limits, and battery-derived propulsion availability. VI-3 adds requested-deceleration control, regenerative energy recovery, battery charge acceptance, and blended friction braking.</w:t>
       </w:r>
     </w:p>
     <w:p>
@@ -1384,7 +1384,7 @@
         <w:keepLines/>
       </w:pPr>
       <w:r>
-        <w:t>Deferred</w:t>
+        <w:t>In Scope for VI-3</w:t>
       </w:r>
     </w:p>
     <w:p>
@@ -1402,7 +1402,7 @@
           <w:color w:val="111827"/>
           <w:sz w:val="22"/>
         </w:rPr>
-        <w:t>chemistry-specific equivalent-circuit and open-circuit-voltage curves;</w:t>
+        <w:t>one regenerative-braking state per battery- and motor-equipped vehicle;</w:t>
       </w:r>
     </w:p>
     <w:p>
@@ -1420,7 +1420,7 @@
           <w:color w:val="111827"/>
           <w:sz w:val="22"/>
         </w:rPr>
-        <w:t>cell balancing, aging, sensor faults, and module topology;</w:t>
+        <w:t>requested and delivered deceleration with regenerative and friction allocation;</w:t>
       </w:r>
     </w:p>
     <w:p>
@@ -1438,7 +1438,7 @@
           <w:color w:val="111827"/>
           <w:sz w:val="22"/>
         </w:rPr>
-        <w:t>regenerative braking, charging, cooling actuators, and range estimation;</w:t>
+        <w:t>motor-torque, drivetrain, wheel, speed, and battery charge-acceptance limits;</w:t>
       </w:r>
     </w:p>
     <w:p>
@@ -1447,6 +1447,124 @@
         <w:numPr>
           <w:ilvl w:val="0"/>
           <w:numId w:val="13"/>
+        </w:numPr>
+        <w:spacing w:after="80"/>
+      </w:pPr>
+      <w:r>
+        <w:rPr>
+          <w:rFonts w:ascii="Calibri" w:hAnsi="Calibri"/>
+          <w:color w:val="111827"/>
+          <w:sz w:val="22"/>
+        </w:rPr>
+        <w:t>recovered electrical power, step energy, cumulative energy, and battery SOC update;</w:t>
+      </w:r>
+    </w:p>
+    <w:p>
+      <w:pPr>
+        <w:pStyle w:val="ListBullet"/>
+        <w:numPr>
+          <w:ilvl w:val="0"/>
+          <w:numId w:val="13"/>
+        </w:numPr>
+        <w:spacing w:after="80"/>
+      </w:pPr>
+      <w:r>
+        <w:rPr>
+          <w:rFonts w:ascii="Calibri" w:hAnsi="Calibri"/>
+          <w:color w:val="111827"/>
+          <w:sz w:val="22"/>
+        </w:rPr>
+        <w:t>low-speed and battery-unavailable friction fallback;</w:t>
+      </w:r>
+    </w:p>
+    <w:p>
+      <w:pPr>
+        <w:pStyle w:val="ListBullet"/>
+        <w:numPr>
+          <w:ilvl w:val="0"/>
+          <w:numId w:val="13"/>
+        </w:numPr>
+        <w:spacing w:after="80"/>
+      </w:pPr>
+      <w:r>
+        <w:rPr>
+          <w:rFonts w:ascii="Calibri" w:hAnsi="Calibri"/>
+          <w:color w:val="111827"/>
+          <w:sz w:val="22"/>
+        </w:rPr>
+        <w:t>braking and battery optimistic versions, exact replay, audit, and outbox evidence.</w:t>
+      </w:r>
+    </w:p>
+    <w:p>
+      <w:pPr>
+        <w:pStyle w:val="Heading2"/>
+        <w:keepNext/>
+        <w:keepLines/>
+      </w:pPr>
+      <w:r>
+        <w:t>Deferred</w:t>
+      </w:r>
+    </w:p>
+    <w:p>
+      <w:pPr>
+        <w:pStyle w:val="ListBullet"/>
+        <w:numPr>
+          <w:ilvl w:val="0"/>
+          <w:numId w:val="14"/>
+        </w:numPr>
+        <w:spacing w:after="80"/>
+      </w:pPr>
+      <w:r>
+        <w:rPr>
+          <w:rFonts w:ascii="Calibri" w:hAnsi="Calibri"/>
+          <w:color w:val="111827"/>
+          <w:sz w:val="22"/>
+        </w:rPr>
+        <w:t>chemistry-specific equivalent-circuit and open-circuit-voltage curves;</w:t>
+      </w:r>
+    </w:p>
+    <w:p>
+      <w:pPr>
+        <w:pStyle w:val="ListBullet"/>
+        <w:numPr>
+          <w:ilvl w:val="0"/>
+          <w:numId w:val="14"/>
+        </w:numPr>
+        <w:spacing w:after="80"/>
+      </w:pPr>
+      <w:r>
+        <w:rPr>
+          <w:rFonts w:ascii="Calibri" w:hAnsi="Calibri"/>
+          <w:color w:val="111827"/>
+          <w:sz w:val="22"/>
+        </w:rPr>
+        <w:t>cell balancing, aging, sensor faults, and module topology;</w:t>
+      </w:r>
+    </w:p>
+    <w:p>
+      <w:pPr>
+        <w:pStyle w:val="ListBullet"/>
+        <w:numPr>
+          <w:ilvl w:val="0"/>
+          <w:numId w:val="14"/>
+        </w:numPr>
+        <w:spacing w:after="80"/>
+      </w:pPr>
+      <w:r>
+        <w:rPr>
+          <w:rFonts w:ascii="Calibri" w:hAnsi="Calibri"/>
+          <w:color w:val="111827"/>
+          <w:sz w:val="22"/>
+        </w:rPr>
+        <w:t>charging, cooling actuators, and range estimation;</w:t>
+      </w:r>
+    </w:p>
+    <w:p>
+      <w:pPr>
+        <w:pStyle w:val="ListBullet"/>
+        <w:numPr>
+          <w:ilvl w:val="0"/>
+          <w:numId w:val="14"/>
         </w:numPr>
         <w:spacing w:after="80"/>
       </w:pPr>
@@ -1476,25 +1594,7 @@
           <w:color w:val="111827"/>
           <w:sz w:val="22"/>
         </w:rPr>
-        <w:t>The FastAPI electric-vehicle boundary coordinates these explicit components:</w:t>
-      </w:r>
-    </w:p>
-    <w:p>
-      <w:pPr>
-        <w:pStyle w:val="ListBullet"/>
-        <w:numPr>
-          <w:ilvl w:val="0"/>
-          <w:numId w:val="14"/>
-        </w:numPr>
-        <w:spacing w:after="80"/>
-      </w:pPr>
-      <w:r>
-        <w:rPr>
-          <w:rFonts w:ascii="Calibri" w:hAnsi="Calibri"/>
-          <w:color w:val="111827"/>
-          <w:sz w:val="22"/>
-        </w:rPr>
-        <w:t xml:space="preserve">RBAC through </w:t>
+        <w:t xml:space="preserve">The FastAPI electric-vehicle boundary uses </w:t>
       </w:r>
       <w:r>
         <w:rPr>
@@ -1526,18 +1626,8 @@
           <w:color w:val="111827"/>
           <w:sz w:val="22"/>
         </w:rPr>
-        <w:t>;</w:t>
+        <w:t xml:space="preserve">. </w:t>
       </w:r>
-    </w:p>
-    <w:p>
-      <w:pPr>
-        <w:pStyle w:val="ListBullet"/>
-        <w:numPr>
-          <w:ilvl w:val="0"/>
-          <w:numId w:val="14"/>
-        </w:numPr>
-        <w:spacing w:after="80"/>
-      </w:pPr>
       <w:r>
         <w:rPr>
           <w:rFonts w:ascii="Consolas" w:hAnsi="Consolas"/>
@@ -1552,44 +1642,8 @@
           <w:color w:val="111827"/>
           <w:sz w:val="22"/>
         </w:rPr>
-        <w:t xml:space="preserve"> as the one-per-vehicle electrical, thermal, BMS, contactor, and cell state;</w:t>
+        <w:t xml:space="preserve">, </w:t>
       </w:r>
-    </w:p>
-    <w:p>
-      <w:pPr>
-        <w:pStyle w:val="ListBullet"/>
-        <w:numPr>
-          <w:ilvl w:val="0"/>
-          <w:numId w:val="14"/>
-        </w:numPr>
-        <w:spacing w:after="80"/>
-      </w:pPr>
-      <w:r>
-        <w:rPr>
-          <w:rFonts w:ascii="Consolas" w:hAnsi="Consolas"/>
-          <w:color w:val="1F4D78"/>
-          <w:sz w:val="19"/>
-        </w:rPr>
-        <w:t>BatterySimulationStep</w:t>
-      </w:r>
-      <w:r>
-        <w:rPr>
-          <w:rFonts w:ascii="Calibri" w:hAnsi="Calibri"/>
-          <w:color w:val="111827"/>
-          <w:sz w:val="22"/>
-        </w:rPr>
-        <w:t xml:space="preserve"> as the command identity and immutable replay evidence;</w:t>
-      </w:r>
-    </w:p>
-    <w:p>
-      <w:pPr>
-        <w:pStyle w:val="ListBullet"/>
-        <w:numPr>
-          <w:ilvl w:val="0"/>
-          <w:numId w:val="14"/>
-        </w:numPr>
-        <w:spacing w:after="80"/>
-      </w:pPr>
       <w:r>
         <w:rPr>
           <w:rFonts w:ascii="Consolas" w:hAnsi="Consolas"/>
@@ -1604,25 +1658,15 @@
           <w:color w:val="111827"/>
           <w:sz w:val="22"/>
         </w:rPr>
-        <w:t xml:space="preserve"> as the one-per-vehicle propulsion, efficiency, power, and thermal state;</w:t>
+        <w:t xml:space="preserve">, and </w:t>
       </w:r>
-    </w:p>
-    <w:p>
-      <w:pPr>
-        <w:pStyle w:val="ListBullet"/>
-        <w:numPr>
-          <w:ilvl w:val="0"/>
-          <w:numId w:val="14"/>
-        </w:numPr>
-        <w:spacing w:after="80"/>
-      </w:pPr>
       <w:r>
         <w:rPr>
           <w:rFonts w:ascii="Consolas" w:hAnsi="Consolas"/>
           <w:color w:val="1F4D78"/>
           <w:sz w:val="19"/>
         </w:rPr>
-        <w:t>MotorSimulationStep</w:t>
+        <w:t>RegenerativeBrakeState</w:t>
       </w:r>
       <w:r>
         <w:rPr>
@@ -1630,18 +1674,8 @@
           <w:color w:val="111827"/>
           <w:sz w:val="22"/>
         </w:rPr>
-        <w:t xml:space="preserve"> as the propulsion command identity and immutable replay evidence;</w:t>
+        <w:t xml:space="preserve"> own the battery, propulsion, and braking aggregates. Their simulation step records preserve immutable replay evidence. </w:t>
       </w:r>
-    </w:p>
-    <w:p>
-      <w:pPr>
-        <w:pStyle w:val="ListBullet"/>
-        <w:numPr>
-          <w:ilvl w:val="0"/>
-          <w:numId w:val="14"/>
-        </w:numPr>
-        <w:spacing w:after="80"/>
-      </w:pPr>
       <w:r>
         <w:rPr>
           <w:rFonts w:ascii="Consolas" w:hAnsi="Consolas"/>
@@ -1672,7 +1706,7 @@
           <w:color w:val="111827"/>
           <w:sz w:val="22"/>
         </w:rPr>
-        <w:t xml:space="preserve"> in the same database transaction as each accepted mutation.</w:t>
+        <w:t xml:space="preserve"> commit in the same database transaction as each accepted mutation.</w:t>
       </w:r>
     </w:p>
     <w:p>
@@ -2775,6 +2809,256 @@
                 <w:sz w:val="17"/>
               </w:rPr>
               <w:t>protection</w:t>
+            </w:r>
+          </w:p>
+        </w:tc>
+      </w:tr>
+      <w:tr>
+        <w:trPr>
+          <w:cantSplit/>
+        </w:trPr>
+        <w:tc>
+          <w:tcPr>
+            <w:tcW w:type="dxa" w:w="1650"/>
+            <w:tcMar>
+              <w:top w:w="80" w:type="dxa"/>
+              <w:start w:w="120" w:type="dxa"/>
+              <w:bottom w:w="80" w:type="dxa"/>
+              <w:end w:w="120" w:type="dxa"/>
+            </w:tcMar>
+            <w:vAlign w:val="center"/>
+            <w:shd w:fill="FFFFFF"/>
+          </w:tcPr>
+          <w:p>
+            <w:pPr>
+              <w:spacing w:before="0" w:after="40" w:line="252" w:lineRule="auto"/>
+              <w:jc w:val="center"/>
+            </w:pPr>
+            <w:r>
+              <w:rPr>
+                <w:rFonts w:ascii="Calibri" w:hAnsi="Calibri"/>
+                <w:b w:val="0"/>
+                <w:color w:val="111827"/>
+                <w:sz w:val="17"/>
+              </w:rPr>
+              <w:t>RegenerativeBrakeState</w:t>
+            </w:r>
+          </w:p>
+        </w:tc>
+        <w:tc>
+          <w:tcPr>
+            <w:tcW w:type="dxa" w:w="4450"/>
+            <w:tcMar>
+              <w:top w:w="80" w:type="dxa"/>
+              <w:start w:w="120" w:type="dxa"/>
+              <w:bottom w:w="80" w:type="dxa"/>
+              <w:end w:w="120" w:type="dxa"/>
+            </w:tcMar>
+            <w:vAlign w:val="center"/>
+            <w:shd w:fill="FFFFFF"/>
+          </w:tcPr>
+          <w:p>
+            <w:pPr>
+              <w:spacing w:before="0" w:after="40" w:line="252" w:lineRule="auto"/>
+              <w:jc w:val="left"/>
+            </w:pPr>
+            <w:r>
+              <w:rPr>
+                <w:rFonts w:ascii="Calibri" w:hAnsi="Calibri"/>
+                <w:b w:val="0"/>
+                <w:color w:val="111827"/>
+                <w:sz w:val="17"/>
+              </w:rPr>
+              <w:t>Braking strategy and recovered energy</w:t>
+            </w:r>
+          </w:p>
+        </w:tc>
+        <w:tc>
+          <w:tcPr>
+            <w:tcW w:type="dxa" w:w="3260"/>
+            <w:tcMar>
+              <w:top w:w="80" w:type="dxa"/>
+              <w:start w:w="120" w:type="dxa"/>
+              <w:bottom w:w="80" w:type="dxa"/>
+              <w:end w:w="120" w:type="dxa"/>
+            </w:tcMar>
+            <w:vAlign w:val="center"/>
+            <w:shd w:fill="FFFFFF"/>
+          </w:tcPr>
+          <w:p>
+            <w:pPr>
+              <w:spacing w:before="0" w:after="40" w:line="252" w:lineRule="auto"/>
+              <w:jc w:val="left"/>
+            </w:pPr>
+            <w:r>
+              <w:rPr>
+                <w:rFonts w:ascii="Calibri" w:hAnsi="Calibri"/>
+                <w:b w:val="0"/>
+                <w:color w:val="111827"/>
+                <w:sz w:val="17"/>
+              </w:rPr>
+              <w:t>one per vehicle; version &gt;= 1</w:t>
+            </w:r>
+          </w:p>
+        </w:tc>
+      </w:tr>
+      <w:tr>
+        <w:trPr>
+          <w:cantSplit/>
+        </w:trPr>
+        <w:tc>
+          <w:tcPr>
+            <w:tcW w:type="dxa" w:w="1650"/>
+            <w:tcMar>
+              <w:top w:w="80" w:type="dxa"/>
+              <w:start w:w="120" w:type="dxa"/>
+              <w:bottom w:w="80" w:type="dxa"/>
+              <w:end w:w="120" w:type="dxa"/>
+            </w:tcMar>
+            <w:vAlign w:val="center"/>
+            <w:shd w:fill="FFFFFF"/>
+          </w:tcPr>
+          <w:p>
+            <w:pPr>
+              <w:spacing w:before="0" w:after="40" w:line="252" w:lineRule="auto"/>
+              <w:jc w:val="center"/>
+            </w:pPr>
+            <w:r>
+              <w:rPr>
+                <w:rFonts w:ascii="Calibri" w:hAnsi="Calibri"/>
+                <w:b w:val="0"/>
+                <w:color w:val="111827"/>
+                <w:sz w:val="17"/>
+              </w:rPr>
+              <w:t>Brake state</w:t>
+            </w:r>
+          </w:p>
+        </w:tc>
+        <w:tc>
+          <w:tcPr>
+            <w:tcW w:type="dxa" w:w="4450"/>
+            <w:tcMar>
+              <w:top w:w="80" w:type="dxa"/>
+              <w:start w:w="120" w:type="dxa"/>
+              <w:bottom w:w="80" w:type="dxa"/>
+              <w:end w:w="120" w:type="dxa"/>
+            </w:tcMar>
+            <w:vAlign w:val="center"/>
+            <w:shd w:fill="FFFFFF"/>
+          </w:tcPr>
+          <w:p>
+            <w:pPr>
+              <w:spacing w:before="0" w:after="40" w:line="252" w:lineRule="auto"/>
+              <w:jc w:val="left"/>
+            </w:pPr>
+            <w:r>
+              <w:rPr>
+                <w:rFonts w:ascii="Calibri" w:hAnsi="Calibri"/>
+                <w:b w:val="0"/>
+                <w:color w:val="111827"/>
+                <w:sz w:val="17"/>
+              </w:rPr>
+              <w:t>Current allocation decision</w:t>
+            </w:r>
+          </w:p>
+        </w:tc>
+        <w:tc>
+          <w:tcPr>
+            <w:tcW w:type="dxa" w:w="3260"/>
+            <w:tcMar>
+              <w:top w:w="80" w:type="dxa"/>
+              <w:start w:w="120" w:type="dxa"/>
+              <w:bottom w:w="80" w:type="dxa"/>
+              <w:end w:w="120" w:type="dxa"/>
+            </w:tcMar>
+            <w:vAlign w:val="center"/>
+            <w:shd w:fill="FFFFFF"/>
+          </w:tcPr>
+          <w:p>
+            <w:pPr>
+              <w:spacing w:before="0" w:after="40" w:line="252" w:lineRule="auto"/>
+              <w:jc w:val="left"/>
+            </w:pPr>
+            <w:r>
+              <w:rPr>
+                <w:rFonts w:ascii="Calibri" w:hAnsi="Calibri"/>
+                <w:b w:val="0"/>
+                <w:color w:val="111827"/>
+                <w:sz w:val="17"/>
+              </w:rPr>
+              <w:t>standby</w:t>
+            </w:r>
+            <w:r>
+              <w:rPr>
+                <w:rFonts w:ascii="Calibri" w:hAnsi="Calibri"/>
+                <w:b w:val="0"/>
+                <w:color w:val="111827"/>
+                <w:sz w:val="17"/>
+              </w:rPr>
+              <w:t xml:space="preserve">, </w:t>
+            </w:r>
+            <w:r>
+              <w:rPr>
+                <w:rFonts w:ascii="Calibri" w:hAnsi="Calibri"/>
+                <w:b w:val="0"/>
+                <w:color w:val="111827"/>
+                <w:sz w:val="17"/>
+              </w:rPr>
+              <w:t>regenerative</w:t>
+            </w:r>
+            <w:r>
+              <w:rPr>
+                <w:rFonts w:ascii="Calibri" w:hAnsi="Calibri"/>
+                <w:b w:val="0"/>
+                <w:color w:val="111827"/>
+                <w:sz w:val="17"/>
+              </w:rPr>
+              <w:t xml:space="preserve">, </w:t>
+            </w:r>
+            <w:r>
+              <w:rPr>
+                <w:rFonts w:ascii="Calibri" w:hAnsi="Calibri"/>
+                <w:b w:val="0"/>
+                <w:color w:val="111827"/>
+                <w:sz w:val="17"/>
+              </w:rPr>
+              <w:t>blended</w:t>
+            </w:r>
+            <w:r>
+              <w:rPr>
+                <w:rFonts w:ascii="Calibri" w:hAnsi="Calibri"/>
+                <w:b w:val="0"/>
+                <w:color w:val="111827"/>
+                <w:sz w:val="17"/>
+              </w:rPr>
+              <w:t xml:space="preserve">, </w:t>
+            </w:r>
+            <w:r>
+              <w:rPr>
+                <w:rFonts w:ascii="Calibri" w:hAnsi="Calibri"/>
+                <w:b w:val="0"/>
+                <w:color w:val="111827"/>
+                <w:sz w:val="17"/>
+              </w:rPr>
+              <w:t>friction</w:t>
+            </w:r>
+            <w:r>
+              <w:rPr>
+                <w:rFonts w:ascii="Calibri" w:hAnsi="Calibri"/>
+                <w:b w:val="0"/>
+                <w:color w:val="111827"/>
+                <w:sz w:val="17"/>
+              </w:rPr>
+              <w:t xml:space="preserve">, </w:t>
+            </w:r>
+            <w:r>
+              <w:rPr>
+                <w:rFonts w:ascii="Calibri" w:hAnsi="Calibri"/>
+                <w:b w:val="0"/>
+                <w:color w:val="111827"/>
+                <w:sz w:val="17"/>
+              </w:rPr>
+              <w:t>limited</w:t>
             </w:r>
           </w:p>
         </w:tc>
@@ -2988,17 +3272,107 @@
           <w:color w:val="111827"/>
           <w:sz w:val="22"/>
         </w:rPr>
-        <w:t>Mode torque ceiling = configured peak torque multiplied by 0.60, 0.85, or 1.00 for eco,</w:t>
+        <w:t>Mode torque ceiling = configured peak torque multiplied by 0.60, 0.85, or 1.00 for eco, normal, or sport.</w:t>
       </w:r>
     </w:p>
     <w:p>
+      <w:pPr>
+        <w:pStyle w:val="ListBullet"/>
+        <w:numPr>
+          <w:ilvl w:val="0"/>
+          <w:numId w:val="18"/>
+        </w:numPr>
+        <w:spacing w:after="80"/>
+      </w:pPr>
       <w:r>
         <w:rPr>
           <w:rFonts w:ascii="Calibri" w:hAnsi="Calibri"/>
           <w:color w:val="111827"/>
           <w:sz w:val="22"/>
         </w:rPr>
-        <w:t>normal, or sport.</w:t>
+        <w:t>Mechanical power (kW) = delivered torque multiplied by 2 pi multiplied by rpm / 60 / 1,000.</w:t>
+      </w:r>
+    </w:p>
+    <w:p>
+      <w:pPr>
+        <w:pStyle w:val="ListBullet"/>
+        <w:numPr>
+          <w:ilvl w:val="0"/>
+          <w:numId w:val="18"/>
+        </w:numPr>
+        <w:spacing w:after="80"/>
+      </w:pPr>
+      <w:r>
+        <w:rPr>
+          <w:rFonts w:ascii="Calibri" w:hAnsi="Calibri"/>
+          <w:color w:val="111827"/>
+          <w:sz w:val="22"/>
+        </w:rPr>
+        <w:t>Electrical power (kW) = mechanical power divided by deterministic efficiency.</w:t>
+      </w:r>
+    </w:p>
+    <w:p>
+      <w:pPr>
+        <w:pStyle w:val="ListBullet"/>
+        <w:numPr>
+          <w:ilvl w:val="0"/>
+          <w:numId w:val="18"/>
+        </w:numPr>
+        <w:spacing w:after="80"/>
+      </w:pPr>
+      <w:r>
+        <w:rPr>
+          <w:rFonts w:ascii="Calibri" w:hAnsi="Calibri"/>
+          <w:color w:val="111827"/>
+          <w:sz w:val="22"/>
+        </w:rPr>
+        <w:t>Conversion loss (kW) = electrical power minus mechanical power.</w:t>
+      </w:r>
+    </w:p>
+    <w:p>
+      <w:pPr>
+        <w:pStyle w:val="ListBullet"/>
+        <w:numPr>
+          <w:ilvl w:val="0"/>
+          <w:numId w:val="18"/>
+        </w:numPr>
+        <w:spacing w:after="80"/>
+      </w:pPr>
+      <w:r>
+        <w:rPr>
+          <w:rFonts w:ascii="Calibri" w:hAnsi="Calibri"/>
+          <w:color w:val="111827"/>
+          <w:sz w:val="22"/>
+        </w:rPr>
+        <w:t>Available power is the lower of inverter rating and battery voltage multiplied by the BMS current ceiling.</w:t>
+      </w:r>
+    </w:p>
+    <w:p>
+      <w:pPr>
+        <w:pStyle w:val="ListBullet"/>
+        <w:numPr>
+          <w:ilvl w:val="0"/>
+          <w:numId w:val="18"/>
+        </w:numPr>
+        <w:spacing w:after="80"/>
+      </w:pPr>
+      <w:r>
+        <w:rPr>
+          <w:rFonts w:ascii="Calibri" w:hAnsi="Calibri"/>
+          <w:color w:val="111827"/>
+          <w:sz w:val="22"/>
+        </w:rPr>
+        <w:t>Motor and inverter temperatures integrate conversion loss and passive cooling over logical time.</w:t>
+      </w:r>
+    </w:p>
+    <w:p>
+      <w:pPr>
+        <w:pStyle w:val="Heading2"/>
+        <w:keepNext/>
+        <w:keepLines/>
+      </w:pPr>
+      <w:r>
+        <w:t>VI-3 Braking Model</w:t>
       </w:r>
     </w:p>
     <w:p>
@@ -3016,7 +3390,7 @@
           <w:color w:val="111827"/>
           <w:sz w:val="22"/>
         </w:rPr>
-        <w:t>Mechanical power (kW) = delivered torque multiplied by 2 pi multiplied by rpm / 60 / 1,000.</w:t>
+        <w:t>Requested braking force (N) = vehicle mass multiplied by requested deceleration.</w:t>
       </w:r>
     </w:p>
     <w:p>
@@ -3034,7 +3408,7 @@
           <w:color w:val="111827"/>
           <w:sz w:val="22"/>
         </w:rPr>
-        <w:t>Electrical power (kW) = mechanical power divided by deterministic efficiency.</w:t>
+        <w:t>Regenerative force is bounded by motor torque, final-drive ratio, drivetrain efficiency, and wheel radius.</w:t>
       </w:r>
     </w:p>
     <w:p>
@@ -3052,7 +3426,7 @@
           <w:color w:val="111827"/>
           <w:sz w:val="22"/>
         </w:rPr>
-        <w:t>Conversion loss (kW) = electrical power minus mechanical power.</w:t>
+        <w:t>Battery-limited regenerative force is charge acceptance divided by speed and regeneration efficiency.</w:t>
       </w:r>
     </w:p>
     <w:p>
@@ -3070,7 +3444,43 @@
           <w:color w:val="111827"/>
           <w:sz w:val="22"/>
         </w:rPr>
-        <w:t>Available electrical power is the lower of inverter rating and battery voltage multiplied by</w:t>
+        <w:t>Friction force supplies the remaining request within its configured limit.</w:t>
+      </w:r>
+    </w:p>
+    <w:p>
+      <w:pPr>
+        <w:pStyle w:val="ListBullet"/>
+        <w:numPr>
+          <w:ilvl w:val="0"/>
+          <w:numId w:val="19"/>
+        </w:numPr>
+        <w:spacing w:after="80"/>
+      </w:pPr>
+      <w:r>
+        <w:rPr>
+          <w:rFonts w:ascii="Calibri" w:hAnsi="Calibri"/>
+          <w:color w:val="111827"/>
+          <w:sz w:val="22"/>
+        </w:rPr>
+        <w:t>Recovered power (kW) = regenerative force multiplied by speed and efficiency, divided by 1,000.</w:t>
+      </w:r>
+    </w:p>
+    <w:p>
+      <w:pPr>
+        <w:pStyle w:val="ListBullet"/>
+        <w:numPr>
+          <w:ilvl w:val="0"/>
+          <w:numId w:val="19"/>
+        </w:numPr>
+        <w:spacing w:after="80"/>
+      </w:pPr>
+      <w:r>
+        <w:rPr>
+          <w:rFonts w:ascii="Calibri" w:hAnsi="Calibri"/>
+          <w:color w:val="111827"/>
+          <w:sz w:val="22"/>
+        </w:rPr>
+        <w:t>Step energy (kWh) = recovered power multiplied by duration in hours.</w:t>
       </w:r>
     </w:p>
     <w:p>
@@ -3080,25 +3490,7 @@
           <w:color w:val="111827"/>
           <w:sz w:val="22"/>
         </w:rPr>
-        <w:t>the BMS-dependent current ceiling.</w:t>
-      </w:r>
-    </w:p>
-    <w:p>
-      <w:pPr>
-        <w:pStyle w:val="ListBullet"/>
-        <w:numPr>
-          <w:ilvl w:val="0"/>
-          <w:numId w:val="20"/>
-        </w:numPr>
-        <w:spacing w:after="80"/>
-      </w:pPr>
-      <w:r>
-        <w:rPr>
-          <w:rFonts w:ascii="Calibri" w:hAnsi="Calibri"/>
-          <w:color w:val="111827"/>
-          <w:sz w:val="22"/>
-        </w:rPr>
-        <w:t>Motor and inverter temperatures integrate their share of conversion loss and passive cooling</w:t>
+        <w:t>Recovered energy increases SOC using SOH-adjusted pack energy.</w:t>
       </w:r>
     </w:p>
     <w:p>
@@ -3108,7 +3500,7 @@
           <w:color w:val="111827"/>
           <w:sz w:val="22"/>
         </w:rPr>
-        <w:t>over logical time. Protection trips at 150 C motor or 110 C inverter temperature.</w:t>
+        <w:t>Charge acceptance is zero below 0.5 m/s, with open contactors, in BMS protection, at or above 95% SOC, or outside 0-50 C. It tapers from 80% to 95% SOC, is reduced near the temperature limits, and is capped by the remaining energy room so a long step cannot cross 95% SOC.</w:t>
       </w:r>
     </w:p>
     <w:p>
@@ -4517,6 +4909,273 @@
           </w:p>
         </w:tc>
       </w:tr>
+      <w:tr>
+        <w:trPr>
+          <w:cantSplit/>
+        </w:trPr>
+        <w:tc>
+          <w:tcPr>
+            <w:tcW w:type="dxa" w:w="3100"/>
+            <w:tcMar>
+              <w:top w:w="80" w:type="dxa"/>
+              <w:start w:w="120" w:type="dxa"/>
+              <w:bottom w:w="80" w:type="dxa"/>
+              <w:end w:w="120" w:type="dxa"/>
+            </w:tcMar>
+            <w:vAlign w:val="center"/>
+            <w:shd w:fill="FFFFFF"/>
+          </w:tcPr>
+          <w:p>
+            <w:pPr>
+              <w:spacing w:before="0" w:after="40" w:line="252" w:lineRule="auto"/>
+              <w:jc w:val="center"/>
+            </w:pPr>
+            <w:r>
+              <w:rPr>
+                <w:rFonts w:ascii="Calibri" w:hAnsi="Calibri"/>
+                <w:b w:val="0"/>
+                <w:color w:val="111827"/>
+                <w:sz w:val="17"/>
+              </w:rPr>
+              <w:t>POST /api/v1/vehicles/{vehicle_id}/electric/braking</w:t>
+            </w:r>
+          </w:p>
+        </w:tc>
+        <w:tc>
+          <w:tcPr>
+            <w:tcW w:type="dxa" w:w="4000"/>
+            <w:tcMar>
+              <w:top w:w="80" w:type="dxa"/>
+              <w:start w:w="120" w:type="dxa"/>
+              <w:bottom w:w="80" w:type="dxa"/>
+              <w:end w:w="120" w:type="dxa"/>
+            </w:tcMar>
+            <w:vAlign w:val="center"/>
+            <w:shd w:fill="FFFFFF"/>
+          </w:tcPr>
+          <w:p>
+            <w:pPr>
+              <w:spacing w:before="0" w:after="40" w:line="252" w:lineRule="auto"/>
+              <w:jc w:val="left"/>
+            </w:pPr>
+            <w:r>
+              <w:rPr>
+                <w:rFonts w:ascii="Calibri" w:hAnsi="Calibri"/>
+                <w:b w:val="0"/>
+                <w:color w:val="111827"/>
+                <w:sz w:val="17"/>
+              </w:rPr>
+              <w:t>Create the regenerative-braking baseline</w:t>
+            </w:r>
+          </w:p>
+        </w:tc>
+        <w:tc>
+          <w:tcPr>
+            <w:tcW w:type="dxa" w:w="2260"/>
+            <w:tcMar>
+              <w:top w:w="80" w:type="dxa"/>
+              <w:start w:w="120" w:type="dxa"/>
+              <w:bottom w:w="80" w:type="dxa"/>
+              <w:end w:w="120" w:type="dxa"/>
+            </w:tcMar>
+            <w:vAlign w:val="center"/>
+            <w:shd w:fill="FFFFFF"/>
+          </w:tcPr>
+          <w:p>
+            <w:pPr>
+              <w:spacing w:before="0" w:after="40" w:line="252" w:lineRule="auto"/>
+              <w:jc w:val="left"/>
+            </w:pPr>
+            <w:r>
+              <w:rPr>
+                <w:rFonts w:ascii="Calibri" w:hAnsi="Calibri"/>
+                <w:b w:val="0"/>
+                <w:color w:val="111827"/>
+                <w:sz w:val="17"/>
+              </w:rPr>
+              <w:t>electric_vehicle:manage</w:t>
+            </w:r>
+          </w:p>
+        </w:tc>
+      </w:tr>
+      <w:tr>
+        <w:trPr>
+          <w:cantSplit/>
+        </w:trPr>
+        <w:tc>
+          <w:tcPr>
+            <w:tcW w:type="dxa" w:w="3100"/>
+            <w:tcMar>
+              <w:top w:w="80" w:type="dxa"/>
+              <w:start w:w="120" w:type="dxa"/>
+              <w:bottom w:w="80" w:type="dxa"/>
+              <w:end w:w="120" w:type="dxa"/>
+            </w:tcMar>
+            <w:vAlign w:val="center"/>
+            <w:shd w:fill="FFFFFF"/>
+          </w:tcPr>
+          <w:p>
+            <w:pPr>
+              <w:spacing w:before="0" w:after="40" w:line="252" w:lineRule="auto"/>
+              <w:jc w:val="center"/>
+            </w:pPr>
+            <w:r>
+              <w:rPr>
+                <w:rFonts w:ascii="Calibri" w:hAnsi="Calibri"/>
+                <w:b w:val="0"/>
+                <w:color w:val="111827"/>
+                <w:sz w:val="17"/>
+              </w:rPr>
+              <w:t>GET /api/v1/vehicles/{vehicle_id}/electric/braking</w:t>
+            </w:r>
+          </w:p>
+        </w:tc>
+        <w:tc>
+          <w:tcPr>
+            <w:tcW w:type="dxa" w:w="4000"/>
+            <w:tcMar>
+              <w:top w:w="80" w:type="dxa"/>
+              <w:start w:w="120" w:type="dxa"/>
+              <w:bottom w:w="80" w:type="dxa"/>
+              <w:end w:w="120" w:type="dxa"/>
+            </w:tcMar>
+            <w:vAlign w:val="center"/>
+            <w:shd w:fill="FFFFFF"/>
+          </w:tcPr>
+          <w:p>
+            <w:pPr>
+              <w:spacing w:before="0" w:after="40" w:line="252" w:lineRule="auto"/>
+              <w:jc w:val="left"/>
+            </w:pPr>
+            <w:r>
+              <w:rPr>
+                <w:rFonts w:ascii="Calibri" w:hAnsi="Calibri"/>
+                <w:b w:val="0"/>
+                <w:color w:val="111827"/>
+                <w:sz w:val="17"/>
+              </w:rPr>
+              <w:t>Read braking allocation and recovery state</w:t>
+            </w:r>
+          </w:p>
+        </w:tc>
+        <w:tc>
+          <w:tcPr>
+            <w:tcW w:type="dxa" w:w="2260"/>
+            <w:tcMar>
+              <w:top w:w="80" w:type="dxa"/>
+              <w:start w:w="120" w:type="dxa"/>
+              <w:bottom w:w="80" w:type="dxa"/>
+              <w:end w:w="120" w:type="dxa"/>
+            </w:tcMar>
+            <w:vAlign w:val="center"/>
+            <w:shd w:fill="FFFFFF"/>
+          </w:tcPr>
+          <w:p>
+            <w:pPr>
+              <w:spacing w:before="0" w:after="40" w:line="252" w:lineRule="auto"/>
+              <w:jc w:val="left"/>
+            </w:pPr>
+            <w:r>
+              <w:rPr>
+                <w:rFonts w:ascii="Calibri" w:hAnsi="Calibri"/>
+                <w:b w:val="0"/>
+                <w:color w:val="111827"/>
+                <w:sz w:val="17"/>
+              </w:rPr>
+              <w:t>electric_vehicle:read</w:t>
+            </w:r>
+          </w:p>
+        </w:tc>
+      </w:tr>
+      <w:tr>
+        <w:trPr>
+          <w:cantSplit/>
+        </w:trPr>
+        <w:tc>
+          <w:tcPr>
+            <w:tcW w:type="dxa" w:w="3100"/>
+            <w:tcMar>
+              <w:top w:w="80" w:type="dxa"/>
+              <w:start w:w="120" w:type="dxa"/>
+              <w:bottom w:w="80" w:type="dxa"/>
+              <w:end w:w="120" w:type="dxa"/>
+            </w:tcMar>
+            <w:vAlign w:val="center"/>
+            <w:shd w:fill="FFFFFF"/>
+          </w:tcPr>
+          <w:p>
+            <w:pPr>
+              <w:spacing w:before="0" w:after="40" w:line="252" w:lineRule="auto"/>
+              <w:jc w:val="center"/>
+            </w:pPr>
+            <w:r>
+              <w:rPr>
+                <w:rFonts w:ascii="Calibri" w:hAnsi="Calibri"/>
+                <w:b w:val="0"/>
+                <w:color w:val="111827"/>
+                <w:sz w:val="17"/>
+              </w:rPr>
+              <w:t>POST /api/v1/vehicles/{vehicle_id}/electric/braking/steps</w:t>
+            </w:r>
+          </w:p>
+        </w:tc>
+        <w:tc>
+          <w:tcPr>
+            <w:tcW w:type="dxa" w:w="4000"/>
+            <w:tcMar>
+              <w:top w:w="80" w:type="dxa"/>
+              <w:start w:w="120" w:type="dxa"/>
+              <w:bottom w:w="80" w:type="dxa"/>
+              <w:end w:w="120" w:type="dxa"/>
+            </w:tcMar>
+            <w:vAlign w:val="center"/>
+            <w:shd w:fill="FFFFFF"/>
+          </w:tcPr>
+          <w:p>
+            <w:pPr>
+              <w:spacing w:before="0" w:after="40" w:line="252" w:lineRule="auto"/>
+              <w:jc w:val="left"/>
+            </w:pPr>
+            <w:r>
+              <w:rPr>
+                <w:rFonts w:ascii="Calibri" w:hAnsi="Calibri"/>
+                <w:b w:val="0"/>
+                <w:color w:val="111827"/>
+                <w:sz w:val="17"/>
+              </w:rPr>
+              <w:t>Execute a deterministic braking step</w:t>
+            </w:r>
+          </w:p>
+        </w:tc>
+        <w:tc>
+          <w:tcPr>
+            <w:tcW w:type="dxa" w:w="2260"/>
+            <w:tcMar>
+              <w:top w:w="80" w:type="dxa"/>
+              <w:start w:w="120" w:type="dxa"/>
+              <w:bottom w:w="80" w:type="dxa"/>
+              <w:end w:w="120" w:type="dxa"/>
+            </w:tcMar>
+            <w:vAlign w:val="center"/>
+            <w:shd w:fill="FFFFFF"/>
+          </w:tcPr>
+          <w:p>
+            <w:pPr>
+              <w:spacing w:before="0" w:after="40" w:line="252" w:lineRule="auto"/>
+              <w:jc w:val="left"/>
+            </w:pPr>
+            <w:r>
+              <w:rPr>
+                <w:rFonts w:ascii="Calibri" w:hAnsi="Calibri"/>
+                <w:b w:val="0"/>
+                <w:color w:val="111827"/>
+                <w:sz w:val="17"/>
+              </w:rPr>
+              <w:t>electric_vehicle:manage</w:t>
+            </w:r>
+          </w:p>
+        </w:tc>
+      </w:tr>
     </w:tbl>
     <w:p>
       <w:pPr>
@@ -5126,6 +5785,329 @@
                 <w:sz w:val="17"/>
               </w:rPr>
               <w:t>A motor command ID was reused differently.</w:t>
+            </w:r>
+          </w:p>
+        </w:tc>
+      </w:tr>
+      <w:tr>
+        <w:trPr>
+          <w:cantSplit/>
+        </w:trPr>
+        <w:tc>
+          <w:tcPr>
+            <w:tcW w:type="dxa" w:w="2700"/>
+            <w:tcMar>
+              <w:top w:w="80" w:type="dxa"/>
+              <w:start w:w="120" w:type="dxa"/>
+              <w:bottom w:w="80" w:type="dxa"/>
+              <w:end w:w="120" w:type="dxa"/>
+            </w:tcMar>
+            <w:vAlign w:val="center"/>
+            <w:shd w:fill="FFFFFF"/>
+          </w:tcPr>
+          <w:p>
+            <w:pPr>
+              <w:spacing w:before="0" w:after="40" w:line="252" w:lineRule="auto"/>
+              <w:jc w:val="left"/>
+            </w:pPr>
+            <w:r>
+              <w:rPr>
+                <w:rFonts w:ascii="Calibri" w:hAnsi="Calibri"/>
+                <w:b w:val="0"/>
+                <w:color w:val="111827"/>
+                <w:sz w:val="17"/>
+              </w:rPr>
+              <w:t>regenerative_brake_already_exists</w:t>
+            </w:r>
+          </w:p>
+        </w:tc>
+        <w:tc>
+          <w:tcPr>
+            <w:tcW w:type="dxa" w:w="6660"/>
+            <w:tcMar>
+              <w:top w:w="80" w:type="dxa"/>
+              <w:start w:w="120" w:type="dxa"/>
+              <w:bottom w:w="80" w:type="dxa"/>
+              <w:end w:w="120" w:type="dxa"/>
+            </w:tcMar>
+            <w:vAlign w:val="center"/>
+            <w:shd w:fill="FFFFFF"/>
+          </w:tcPr>
+          <w:p>
+            <w:pPr>
+              <w:spacing w:before="0" w:after="40" w:line="252" w:lineRule="auto"/>
+              <w:jc w:val="left"/>
+            </w:pPr>
+            <w:r>
+              <w:rPr>
+                <w:rFonts w:ascii="Calibri" w:hAnsi="Calibri"/>
+                <w:b w:val="0"/>
+                <w:color w:val="111827"/>
+                <w:sz w:val="17"/>
+              </w:rPr>
+              <w:t>The vehicle already owns braking state.</w:t>
+            </w:r>
+          </w:p>
+        </w:tc>
+      </w:tr>
+      <w:tr>
+        <w:trPr>
+          <w:cantSplit/>
+        </w:trPr>
+        <w:tc>
+          <w:tcPr>
+            <w:tcW w:type="dxa" w:w="2700"/>
+            <w:tcMar>
+              <w:top w:w="80" w:type="dxa"/>
+              <w:start w:w="120" w:type="dxa"/>
+              <w:bottom w:w="80" w:type="dxa"/>
+              <w:end w:w="120" w:type="dxa"/>
+            </w:tcMar>
+            <w:vAlign w:val="center"/>
+            <w:shd w:fill="FFFFFF"/>
+          </w:tcPr>
+          <w:p>
+            <w:pPr>
+              <w:spacing w:before="0" w:after="40" w:line="252" w:lineRule="auto"/>
+              <w:jc w:val="left"/>
+            </w:pPr>
+            <w:r>
+              <w:rPr>
+                <w:rFonts w:ascii="Calibri" w:hAnsi="Calibri"/>
+                <w:b w:val="0"/>
+                <w:color w:val="111827"/>
+                <w:sz w:val="17"/>
+              </w:rPr>
+              <w:t>regenerative_brake_not_found</w:t>
+            </w:r>
+          </w:p>
+        </w:tc>
+        <w:tc>
+          <w:tcPr>
+            <w:tcW w:type="dxa" w:w="6660"/>
+            <w:tcMar>
+              <w:top w:w="80" w:type="dxa"/>
+              <w:start w:w="120" w:type="dxa"/>
+              <w:bottom w:w="80" w:type="dxa"/>
+              <w:end w:w="120" w:type="dxa"/>
+            </w:tcMar>
+            <w:vAlign w:val="center"/>
+            <w:shd w:fill="FFFFFF"/>
+          </w:tcPr>
+          <w:p>
+            <w:pPr>
+              <w:spacing w:before="0" w:after="40" w:line="252" w:lineRule="auto"/>
+              <w:jc w:val="left"/>
+            </w:pPr>
+            <w:r>
+              <w:rPr>
+                <w:rFonts w:ascii="Calibri" w:hAnsi="Calibri"/>
+                <w:b w:val="0"/>
+                <w:color w:val="111827"/>
+                <w:sz w:val="17"/>
+              </w:rPr>
+              <w:t>No braking state exists for the vehicle.</w:t>
+            </w:r>
+          </w:p>
+        </w:tc>
+      </w:tr>
+      <w:tr>
+        <w:trPr>
+          <w:cantSplit/>
+        </w:trPr>
+        <w:tc>
+          <w:tcPr>
+            <w:tcW w:type="dxa" w:w="2700"/>
+            <w:tcMar>
+              <w:top w:w="80" w:type="dxa"/>
+              <w:start w:w="120" w:type="dxa"/>
+              <w:bottom w:w="80" w:type="dxa"/>
+              <w:end w:w="120" w:type="dxa"/>
+            </w:tcMar>
+            <w:vAlign w:val="center"/>
+            <w:shd w:fill="FFFFFF"/>
+          </w:tcPr>
+          <w:p>
+            <w:pPr>
+              <w:spacing w:before="0" w:after="40" w:line="252" w:lineRule="auto"/>
+              <w:jc w:val="left"/>
+            </w:pPr>
+            <w:r>
+              <w:rPr>
+                <w:rFonts w:ascii="Calibri" w:hAnsi="Calibri"/>
+                <w:b w:val="0"/>
+                <w:color w:val="111827"/>
+                <w:sz w:val="17"/>
+              </w:rPr>
+              <w:t>brake_state_version_conflict</w:t>
+            </w:r>
+          </w:p>
+        </w:tc>
+        <w:tc>
+          <w:tcPr>
+            <w:tcW w:type="dxa" w:w="6660"/>
+            <w:tcMar>
+              <w:top w:w="80" w:type="dxa"/>
+              <w:start w:w="120" w:type="dxa"/>
+              <w:bottom w:w="80" w:type="dxa"/>
+              <w:end w:w="120" w:type="dxa"/>
+            </w:tcMar>
+            <w:vAlign w:val="center"/>
+            <w:shd w:fill="FFFFFF"/>
+          </w:tcPr>
+          <w:p>
+            <w:pPr>
+              <w:spacing w:before="0" w:after="40" w:line="252" w:lineRule="auto"/>
+              <w:jc w:val="left"/>
+            </w:pPr>
+            <w:r>
+              <w:rPr>
+                <w:rFonts w:ascii="Calibri" w:hAnsi="Calibri"/>
+                <w:b w:val="0"/>
+                <w:color w:val="111827"/>
+                <w:sz w:val="17"/>
+              </w:rPr>
+              <w:t xml:space="preserve">The braking </w:t>
+            </w:r>
+            <w:r>
+              <w:rPr>
+                <w:rFonts w:ascii="Calibri" w:hAnsi="Calibri"/>
+                <w:b w:val="0"/>
+                <w:color w:val="111827"/>
+                <w:sz w:val="17"/>
+              </w:rPr>
+              <w:t>expected_version</w:t>
+            </w:r>
+            <w:r>
+              <w:rPr>
+                <w:rFonts w:ascii="Calibri" w:hAnsi="Calibri"/>
+                <w:b w:val="0"/>
+                <w:color w:val="111827"/>
+                <w:sz w:val="17"/>
+              </w:rPr>
+              <w:t xml:space="preserve"> is stale.</w:t>
+            </w:r>
+          </w:p>
+        </w:tc>
+      </w:tr>
+      <w:tr>
+        <w:trPr>
+          <w:cantSplit/>
+        </w:trPr>
+        <w:tc>
+          <w:tcPr>
+            <w:tcW w:type="dxa" w:w="2700"/>
+            <w:tcMar>
+              <w:top w:w="80" w:type="dxa"/>
+              <w:start w:w="120" w:type="dxa"/>
+              <w:bottom w:w="80" w:type="dxa"/>
+              <w:end w:w="120" w:type="dxa"/>
+            </w:tcMar>
+            <w:vAlign w:val="center"/>
+            <w:shd w:fill="FFFFFF"/>
+          </w:tcPr>
+          <w:p>
+            <w:pPr>
+              <w:spacing w:before="0" w:after="40" w:line="252" w:lineRule="auto"/>
+              <w:jc w:val="left"/>
+            </w:pPr>
+            <w:r>
+              <w:rPr>
+                <w:rFonts w:ascii="Calibri" w:hAnsi="Calibri"/>
+                <w:b w:val="0"/>
+                <w:color w:val="111827"/>
+                <w:sz w:val="17"/>
+              </w:rPr>
+              <w:t>brake_battery_version_conflict</w:t>
+            </w:r>
+          </w:p>
+        </w:tc>
+        <w:tc>
+          <w:tcPr>
+            <w:tcW w:type="dxa" w:w="6660"/>
+            <w:tcMar>
+              <w:top w:w="80" w:type="dxa"/>
+              <w:start w:w="120" w:type="dxa"/>
+              <w:bottom w:w="80" w:type="dxa"/>
+              <w:end w:w="120" w:type="dxa"/>
+            </w:tcMar>
+            <w:vAlign w:val="center"/>
+            <w:shd w:fill="FFFFFF"/>
+          </w:tcPr>
+          <w:p>
+            <w:pPr>
+              <w:spacing w:before="0" w:after="40" w:line="252" w:lineRule="auto"/>
+              <w:jc w:val="left"/>
+            </w:pPr>
+            <w:r>
+              <w:rPr>
+                <w:rFonts w:ascii="Calibri" w:hAnsi="Calibri"/>
+                <w:b w:val="0"/>
+                <w:color w:val="111827"/>
+                <w:sz w:val="17"/>
+              </w:rPr>
+              <w:t>The battery version supplied to braking is stale.</w:t>
+            </w:r>
+          </w:p>
+        </w:tc>
+      </w:tr>
+      <w:tr>
+        <w:trPr>
+          <w:cantSplit/>
+        </w:trPr>
+        <w:tc>
+          <w:tcPr>
+            <w:tcW w:type="dxa" w:w="2700"/>
+            <w:tcMar>
+              <w:top w:w="80" w:type="dxa"/>
+              <w:start w:w="120" w:type="dxa"/>
+              <w:bottom w:w="80" w:type="dxa"/>
+              <w:end w:w="120" w:type="dxa"/>
+            </w:tcMar>
+            <w:vAlign w:val="center"/>
+            <w:shd w:fill="FFFFFF"/>
+          </w:tcPr>
+          <w:p>
+            <w:pPr>
+              <w:spacing w:before="0" w:after="40" w:line="252" w:lineRule="auto"/>
+              <w:jc w:val="left"/>
+            </w:pPr>
+            <w:r>
+              <w:rPr>
+                <w:rFonts w:ascii="Calibri" w:hAnsi="Calibri"/>
+                <w:b w:val="0"/>
+                <w:color w:val="111827"/>
+                <w:sz w:val="17"/>
+              </w:rPr>
+              <w:t>brake_simulation_command_conflict</w:t>
+            </w:r>
+          </w:p>
+        </w:tc>
+        <w:tc>
+          <w:tcPr>
+            <w:tcW w:type="dxa" w:w="6660"/>
+            <w:tcMar>
+              <w:top w:w="80" w:type="dxa"/>
+              <w:start w:w="120" w:type="dxa"/>
+              <w:bottom w:w="80" w:type="dxa"/>
+              <w:end w:w="120" w:type="dxa"/>
+            </w:tcMar>
+            <w:vAlign w:val="center"/>
+            <w:shd w:fill="FFFFFF"/>
+          </w:tcPr>
+          <w:p>
+            <w:pPr>
+              <w:spacing w:before="0" w:after="40" w:line="252" w:lineRule="auto"/>
+              <w:jc w:val="left"/>
+            </w:pPr>
+            <w:r>
+              <w:rPr>
+                <w:rFonts w:ascii="Calibri" w:hAnsi="Calibri"/>
+                <w:b w:val="0"/>
+                <w:color w:val="111827"/>
+                <w:sz w:val="17"/>
+              </w:rPr>
+              <w:t>A braking command ID was reused differently.</w:t>
             </w:r>
           </w:p>
         </w:tc>
@@ -5371,7 +6353,55 @@
           <w:color w:val="111827"/>
           <w:sz w:val="22"/>
         </w:rPr>
-        <w:t>. Database checks reinforce the bounded states, versions, and durations.</w:t>
+        <w:t xml:space="preserve">. Migration </w:t>
+      </w:r>
+      <w:r>
+        <w:rPr>
+          <w:rFonts w:ascii="Consolas" w:hAnsi="Consolas"/>
+          <w:color w:val="1F4D78"/>
+          <w:sz w:val="19"/>
+        </w:rPr>
+        <w:t>0039_regenerative_braking</w:t>
+      </w:r>
+      <w:r>
+        <w:rPr>
+          <w:rFonts w:ascii="Calibri" w:hAnsi="Calibri"/>
+          <w:color w:val="111827"/>
+          <w:sz w:val="22"/>
+        </w:rPr>
+        <w:t xml:space="preserve"> creates </w:t>
+      </w:r>
+      <w:r>
+        <w:rPr>
+          <w:rFonts w:ascii="Consolas" w:hAnsi="Consolas"/>
+          <w:color w:val="1F4D78"/>
+          <w:sz w:val="19"/>
+        </w:rPr>
+        <w:t>regenerative_brake_states</w:t>
+      </w:r>
+      <w:r>
+        <w:rPr>
+          <w:rFonts w:ascii="Calibri" w:hAnsi="Calibri"/>
+          <w:color w:val="111827"/>
+          <w:sz w:val="22"/>
+        </w:rPr>
+        <w:t xml:space="preserve"> and </w:t>
+      </w:r>
+      <w:r>
+        <w:rPr>
+          <w:rFonts w:ascii="Consolas" w:hAnsi="Consolas"/>
+          <w:color w:val="1F4D78"/>
+          <w:sz w:val="19"/>
+        </w:rPr>
+        <w:t>brake_simulation_steps</w:t>
+      </w:r>
+      <w:r>
+        <w:rPr>
+          <w:rFonts w:ascii="Calibri" w:hAnsi="Calibri"/>
+          <w:color w:val="111827"/>
+          <w:sz w:val="22"/>
+        </w:rPr>
+        <w:t>. Database checks reinforce bounded states, versions, and durations.</w:t>
       </w:r>
     </w:p>
     <w:tbl>
@@ -5841,6 +6871,184 @@
           </w:p>
         </w:tc>
       </w:tr>
+      <w:tr>
+        <w:trPr>
+          <w:cantSplit/>
+        </w:trPr>
+        <w:tc>
+          <w:tcPr>
+            <w:tcW w:type="dxa" w:w="1650"/>
+            <w:tcMar>
+              <w:top w:w="80" w:type="dxa"/>
+              <w:start w:w="120" w:type="dxa"/>
+              <w:bottom w:w="80" w:type="dxa"/>
+              <w:end w:w="120" w:type="dxa"/>
+            </w:tcMar>
+            <w:vAlign w:val="center"/>
+            <w:shd w:fill="FFFFFF"/>
+          </w:tcPr>
+          <w:p>
+            <w:pPr>
+              <w:spacing w:before="0" w:after="40" w:line="252" w:lineRule="auto"/>
+              <w:jc w:val="center"/>
+            </w:pPr>
+            <w:r>
+              <w:rPr>
+                <w:rFonts w:ascii="Calibri" w:hAnsi="Calibri"/>
+                <w:b w:val="0"/>
+                <w:color w:val="111827"/>
+                <w:sz w:val="17"/>
+              </w:rPr>
+              <w:t>atep.electric_vehicle.regenerative_brake.created.v1</w:t>
+            </w:r>
+          </w:p>
+        </w:tc>
+        <w:tc>
+          <w:tcPr>
+            <w:tcW w:type="dxa" w:w="4450"/>
+            <w:tcMar>
+              <w:top w:w="80" w:type="dxa"/>
+              <w:start w:w="120" w:type="dxa"/>
+              <w:bottom w:w="80" w:type="dxa"/>
+              <w:end w:w="120" w:type="dxa"/>
+            </w:tcMar>
+            <w:vAlign w:val="center"/>
+            <w:shd w:fill="FFFFFF"/>
+          </w:tcPr>
+          <w:p>
+            <w:pPr>
+              <w:spacing w:before="0" w:after="40" w:line="252" w:lineRule="auto"/>
+              <w:jc w:val="left"/>
+            </w:pPr>
+            <w:r>
+              <w:rPr>
+                <w:rFonts w:ascii="Calibri" w:hAnsi="Calibri"/>
+                <w:b w:val="0"/>
+                <w:color w:val="111827"/>
+                <w:sz w:val="17"/>
+              </w:rPr>
+              <w:t>Announce braking configuration</w:t>
+            </w:r>
+          </w:p>
+        </w:tc>
+        <w:tc>
+          <w:tcPr>
+            <w:tcW w:type="dxa" w:w="3260"/>
+            <w:tcMar>
+              <w:top w:w="80" w:type="dxa"/>
+              <w:start w:w="120" w:type="dxa"/>
+              <w:bottom w:w="80" w:type="dxa"/>
+              <w:end w:w="120" w:type="dxa"/>
+            </w:tcMar>
+            <w:vAlign w:val="center"/>
+            <w:shd w:fill="FFFFFF"/>
+          </w:tcPr>
+          <w:p>
+            <w:pPr>
+              <w:spacing w:before="0" w:after="40" w:line="252" w:lineRule="auto"/>
+              <w:jc w:val="left"/>
+            </w:pPr>
+            <w:r>
+              <w:rPr>
+                <w:rFonts w:ascii="Calibri" w:hAnsi="Calibri"/>
+                <w:b w:val="0"/>
+                <w:color w:val="111827"/>
+                <w:sz w:val="17"/>
+              </w:rPr>
+              <w:t>Bounded configuration only</w:t>
+            </w:r>
+          </w:p>
+        </w:tc>
+      </w:tr>
+      <w:tr>
+        <w:trPr>
+          <w:cantSplit/>
+        </w:trPr>
+        <w:tc>
+          <w:tcPr>
+            <w:tcW w:type="dxa" w:w="1650"/>
+            <w:tcMar>
+              <w:top w:w="80" w:type="dxa"/>
+              <w:start w:w="120" w:type="dxa"/>
+              <w:bottom w:w="80" w:type="dxa"/>
+              <w:end w:w="120" w:type="dxa"/>
+            </w:tcMar>
+            <w:vAlign w:val="center"/>
+            <w:shd w:fill="FFFFFF"/>
+          </w:tcPr>
+          <w:p>
+            <w:pPr>
+              <w:spacing w:before="0" w:after="40" w:line="252" w:lineRule="auto"/>
+              <w:jc w:val="center"/>
+            </w:pPr>
+            <w:r>
+              <w:rPr>
+                <w:rFonts w:ascii="Calibri" w:hAnsi="Calibri"/>
+                <w:b w:val="0"/>
+                <w:color w:val="111827"/>
+                <w:sz w:val="17"/>
+              </w:rPr>
+              <w:t>atep.electric_vehicle.brake.step.completed.v1</w:t>
+            </w:r>
+          </w:p>
+        </w:tc>
+        <w:tc>
+          <w:tcPr>
+            <w:tcW w:type="dxa" w:w="4450"/>
+            <w:tcMar>
+              <w:top w:w="80" w:type="dxa"/>
+              <w:start w:w="120" w:type="dxa"/>
+              <w:bottom w:w="80" w:type="dxa"/>
+              <w:end w:w="120" w:type="dxa"/>
+            </w:tcMar>
+            <w:vAlign w:val="center"/>
+            <w:shd w:fill="FFFFFF"/>
+          </w:tcPr>
+          <w:p>
+            <w:pPr>
+              <w:spacing w:before="0" w:after="40" w:line="252" w:lineRule="auto"/>
+              <w:jc w:val="left"/>
+            </w:pPr>
+            <w:r>
+              <w:rPr>
+                <w:rFonts w:ascii="Calibri" w:hAnsi="Calibri"/>
+                <w:b w:val="0"/>
+                <w:color w:val="111827"/>
+                <w:sz w:val="17"/>
+              </w:rPr>
+              <w:t>Announce allocation and recovered energy</w:t>
+            </w:r>
+          </w:p>
+        </w:tc>
+        <w:tc>
+          <w:tcPr>
+            <w:tcW w:type="dxa" w:w="3260"/>
+            <w:tcMar>
+              <w:top w:w="80" w:type="dxa"/>
+              <w:start w:w="120" w:type="dxa"/>
+              <w:bottom w:w="80" w:type="dxa"/>
+              <w:end w:w="120" w:type="dxa"/>
+            </w:tcMar>
+            <w:vAlign w:val="center"/>
+            <w:shd w:fill="FFFFFF"/>
+          </w:tcPr>
+          <w:p>
+            <w:pPr>
+              <w:spacing w:before="0" w:after="40" w:line="252" w:lineRule="auto"/>
+              <w:jc w:val="left"/>
+            </w:pPr>
+            <w:r>
+              <w:rPr>
+                <w:rFonts w:ascii="Calibri" w:hAnsi="Calibri"/>
+                <w:b w:val="0"/>
+                <w:color w:val="111827"/>
+                <w:sz w:val="17"/>
+              </w:rPr>
+              <w:t>Summary, SOC, limit reason, and versions</w:t>
+            </w:r>
+          </w:p>
+        </w:tc>
+      </w:tr>
     </w:tbl>
     <w:p>
       <w:pPr>
@@ -5864,7 +7072,7 @@
           <w:color w:val="111827"/>
           <w:sz w:val="22"/>
         </w:rPr>
-        <w:t xml:space="preserve">VI-1 and VI-2 implement EV-F-001 through EV-F-028 and EV-NF-001 through EV-NF-012. The authoritative traceability table is maintained in </w:t>
+        <w:t xml:space="preserve">VI-1 through VI-3 implement EV-F-001 through EV-F-043 and EV-NF-001 through EV-NF-016. The authoritative traceability table is maintained in </w:t>
       </w:r>
       <w:r>
         <w:rPr>
@@ -6067,6 +7275,66 @@
     </w:p>
     <w:p>
       <w:pPr>
+        <w:pStyle w:val="Heading2"/>
+        <w:keepNext/>
+        <w:keepLines/>
+      </w:pPr>
+      <w:r>
+        <w:t>ADR-EV-008 - Represent Braking as Requested Deceleration</w:t>
+      </w:r>
+    </w:p>
+    <w:p>
+      <w:r>
+        <w:rPr>
+          <w:rFonts w:ascii="Calibri" w:hAnsi="Calibri"/>
+          <w:color w:val="111827"/>
+          <w:sz w:val="22"/>
+        </w:rPr>
+        <w:t>Decision: expose nonnegative requested deceleration rather than negative propulsion torque. Rationale: the service can allocate one vehicle-level request across regenerative and friction actuators without overloading the propulsion command contract.</w:t>
+      </w:r>
+    </w:p>
+    <w:p>
+      <w:pPr>
+        <w:pStyle w:val="Heading2"/>
+        <w:keepNext/>
+        <w:keepLines/>
+      </w:pPr>
+      <w:r>
+        <w:t>ADR-EV-009 - Update Recovered Battery Energy Atomically</w:t>
+      </w:r>
+    </w:p>
+    <w:p>
+      <w:r>
+        <w:rPr>
+          <w:rFonts w:ascii="Calibri" w:hAnsi="Calibri"/>
+          <w:color w:val="111827"/>
+          <w:sz w:val="22"/>
+        </w:rPr>
+        <w:t>Decision: a regenerative step validates the battery version and commits recovered energy, SOC, braking state, replay evidence, audit, and outbox together. Rationale: partial energy evidence would make cross-domain test results internally inconsistent.</w:t>
+      </w:r>
+    </w:p>
+    <w:p>
+      <w:pPr>
+        <w:pStyle w:val="Heading2"/>
+        <w:keepNext/>
+        <w:keepLines/>
+      </w:pPr>
+      <w:r>
+        <w:t>ADR-EV-010 - Use Deterministic Charge-Acceptance Tapering</w:t>
+      </w:r>
+    </w:p>
+    <w:p>
+      <w:r>
+        <w:rPr>
+          <w:rFonts w:ascii="Calibri" w:hAnsi="Calibri"/>
+          <w:color w:val="111827"/>
+          <w:sz w:val="22"/>
+        </w:rPr>
+        <w:t>Decision: VI-3 uses explicit SOC, temperature, contactor, BMS, voltage, and current ceilings. Rationale: explainable bounds support repeatable QA before chemistry-specific calibration exists.</w:t>
+      </w:r>
+    </w:p>
+    <w:p>
+      <w:pPr>
         <w:pStyle w:val="Heading1"/>
         <w:keepNext/>
         <w:keepLines/>
@@ -11359,6 +12627,2580 @@
                 <w:sz w:val="16"/>
               </w:rPr>
               <w:t>Tables created and removed cleanly</w:t>
+            </w:r>
+          </w:p>
+        </w:tc>
+      </w:tr>
+      <w:tr>
+        <w:trPr>
+          <w:cantSplit/>
+        </w:trPr>
+        <w:tc>
+          <w:tcPr>
+            <w:tcW w:type="dxa" w:w="1150"/>
+            <w:tcMar>
+              <w:top w:w="80" w:type="dxa"/>
+              <w:start w:w="120" w:type="dxa"/>
+              <w:bottom w:w="80" w:type="dxa"/>
+              <w:end w:w="120" w:type="dxa"/>
+            </w:tcMar>
+            <w:vAlign w:val="center"/>
+            <w:shd w:fill="FFFFFF"/>
+          </w:tcPr>
+          <w:p>
+            <w:pPr>
+              <w:spacing w:before="0" w:after="40" w:line="252" w:lineRule="auto"/>
+              <w:jc w:val="center"/>
+            </w:pPr>
+            <w:r>
+              <w:rPr>
+                <w:rFonts w:ascii="Calibri" w:hAnsi="Calibri"/>
+                <w:b w:val="0"/>
+                <w:color w:val="111827"/>
+                <w:sz w:val="16"/>
+              </w:rPr>
+              <w:t>EV-T-045</w:t>
+            </w:r>
+          </w:p>
+        </w:tc>
+        <w:tc>
+          <w:tcPr>
+            <w:tcW w:type="dxa" w:w="3700"/>
+            <w:tcMar>
+              <w:top w:w="80" w:type="dxa"/>
+              <w:start w:w="120" w:type="dxa"/>
+              <w:bottom w:w="80" w:type="dxa"/>
+              <w:end w:w="120" w:type="dxa"/>
+            </w:tcMar>
+            <w:vAlign w:val="center"/>
+            <w:shd w:fill="FFFFFF"/>
+          </w:tcPr>
+          <w:p>
+            <w:pPr>
+              <w:spacing w:before="0" w:after="40" w:line="252" w:lineRule="auto"/>
+              <w:jc w:val="left"/>
+            </w:pPr>
+            <w:r>
+              <w:rPr>
+                <w:rFonts w:ascii="Calibri" w:hAnsi="Calibri"/>
+                <w:b w:val="0"/>
+                <w:color w:val="111827"/>
+                <w:sz w:val="16"/>
+              </w:rPr>
+              <w:t>Braking creation</w:t>
+            </w:r>
+          </w:p>
+        </w:tc>
+        <w:tc>
+          <w:tcPr>
+            <w:tcW w:type="dxa" w:w="3100"/>
+            <w:tcMar>
+              <w:top w:w="80" w:type="dxa"/>
+              <w:start w:w="120" w:type="dxa"/>
+              <w:bottom w:w="80" w:type="dxa"/>
+              <w:end w:w="120" w:type="dxa"/>
+            </w:tcMar>
+            <w:vAlign w:val="center"/>
+            <w:shd w:fill="FFFFFF"/>
+          </w:tcPr>
+          <w:p>
+            <w:pPr>
+              <w:spacing w:before="0" w:after="40" w:line="252" w:lineRule="auto"/>
+              <w:jc w:val="left"/>
+            </w:pPr>
+            <w:r>
+              <w:rPr>
+                <w:rFonts w:ascii="Calibri" w:hAnsi="Calibri"/>
+                <w:b w:val="0"/>
+                <w:color w:val="111827"/>
+                <w:sz w:val="16"/>
+              </w:rPr>
+              <w:t>Create state after battery and motor</w:t>
+            </w:r>
+          </w:p>
+        </w:tc>
+        <w:tc>
+          <w:tcPr>
+            <w:tcW w:type="dxa" w:w="1410"/>
+            <w:tcMar>
+              <w:top w:w="80" w:type="dxa"/>
+              <w:start w:w="120" w:type="dxa"/>
+              <w:bottom w:w="80" w:type="dxa"/>
+              <w:end w:w="120" w:type="dxa"/>
+            </w:tcMar>
+            <w:vAlign w:val="center"/>
+            <w:shd w:fill="FFFFFF"/>
+          </w:tcPr>
+          <w:p>
+            <w:pPr>
+              <w:spacing w:before="0" w:after="40" w:line="252" w:lineRule="auto"/>
+              <w:jc w:val="left"/>
+            </w:pPr>
+            <w:r>
+              <w:rPr>
+                <w:rFonts w:ascii="Calibri" w:hAnsi="Calibri"/>
+                <w:b w:val="0"/>
+                <w:color w:val="111827"/>
+                <w:sz w:val="16"/>
+              </w:rPr>
+              <w:t>Version 1 and standby</w:t>
+            </w:r>
+          </w:p>
+        </w:tc>
+      </w:tr>
+      <w:tr>
+        <w:trPr>
+          <w:cantSplit/>
+        </w:trPr>
+        <w:tc>
+          <w:tcPr>
+            <w:tcW w:type="dxa" w:w="1150"/>
+            <w:tcMar>
+              <w:top w:w="80" w:type="dxa"/>
+              <w:start w:w="120" w:type="dxa"/>
+              <w:bottom w:w="80" w:type="dxa"/>
+              <w:end w:w="120" w:type="dxa"/>
+            </w:tcMar>
+            <w:vAlign w:val="center"/>
+            <w:shd w:fill="FFFFFF"/>
+          </w:tcPr>
+          <w:p>
+            <w:pPr>
+              <w:spacing w:before="0" w:after="40" w:line="252" w:lineRule="auto"/>
+              <w:jc w:val="center"/>
+            </w:pPr>
+            <w:r>
+              <w:rPr>
+                <w:rFonts w:ascii="Calibri" w:hAnsi="Calibri"/>
+                <w:b w:val="0"/>
+                <w:color w:val="111827"/>
+                <w:sz w:val="16"/>
+              </w:rPr>
+              <w:t>EV-T-046</w:t>
+            </w:r>
+          </w:p>
+        </w:tc>
+        <w:tc>
+          <w:tcPr>
+            <w:tcW w:type="dxa" w:w="3700"/>
+            <w:tcMar>
+              <w:top w:w="80" w:type="dxa"/>
+              <w:start w:w="120" w:type="dxa"/>
+              <w:bottom w:w="80" w:type="dxa"/>
+              <w:end w:w="120" w:type="dxa"/>
+            </w:tcMar>
+            <w:vAlign w:val="center"/>
+            <w:shd w:fill="FFFFFF"/>
+          </w:tcPr>
+          <w:p>
+            <w:pPr>
+              <w:spacing w:before="0" w:after="40" w:line="252" w:lineRule="auto"/>
+              <w:jc w:val="left"/>
+            </w:pPr>
+            <w:r>
+              <w:rPr>
+                <w:rFonts w:ascii="Calibri" w:hAnsi="Calibri"/>
+                <w:b w:val="0"/>
+                <w:color w:val="111827"/>
+                <w:sz w:val="16"/>
+              </w:rPr>
+              <w:t>Duplicate braking state</w:t>
+            </w:r>
+          </w:p>
+        </w:tc>
+        <w:tc>
+          <w:tcPr>
+            <w:tcW w:type="dxa" w:w="3100"/>
+            <w:tcMar>
+              <w:top w:w="80" w:type="dxa"/>
+              <w:start w:w="120" w:type="dxa"/>
+              <w:bottom w:w="80" w:type="dxa"/>
+              <w:end w:w="120" w:type="dxa"/>
+            </w:tcMar>
+            <w:vAlign w:val="center"/>
+            <w:shd w:fill="FFFFFF"/>
+          </w:tcPr>
+          <w:p>
+            <w:pPr>
+              <w:spacing w:before="0" w:after="40" w:line="252" w:lineRule="auto"/>
+              <w:jc w:val="left"/>
+            </w:pPr>
+            <w:r>
+              <w:rPr>
+                <w:rFonts w:ascii="Calibri" w:hAnsi="Calibri"/>
+                <w:b w:val="0"/>
+                <w:color w:val="111827"/>
+                <w:sz w:val="16"/>
+              </w:rPr>
+              <w:t>Enforce one state per vehicle</w:t>
+            </w:r>
+          </w:p>
+        </w:tc>
+        <w:tc>
+          <w:tcPr>
+            <w:tcW w:type="dxa" w:w="1410"/>
+            <w:tcMar>
+              <w:top w:w="80" w:type="dxa"/>
+              <w:start w:w="120" w:type="dxa"/>
+              <w:bottom w:w="80" w:type="dxa"/>
+              <w:end w:w="120" w:type="dxa"/>
+            </w:tcMar>
+            <w:vAlign w:val="center"/>
+            <w:shd w:fill="FFFFFF"/>
+          </w:tcPr>
+          <w:p>
+            <w:pPr>
+              <w:spacing w:before="0" w:after="40" w:line="252" w:lineRule="auto"/>
+              <w:jc w:val="left"/>
+            </w:pPr>
+            <w:r>
+              <w:rPr>
+                <w:rFonts w:ascii="Calibri" w:hAnsi="Calibri"/>
+                <w:b w:val="0"/>
+                <w:color w:val="111827"/>
+                <w:sz w:val="16"/>
+              </w:rPr>
+              <w:t>Stable 409 conflict</w:t>
+            </w:r>
+          </w:p>
+        </w:tc>
+      </w:tr>
+      <w:tr>
+        <w:trPr>
+          <w:cantSplit/>
+        </w:trPr>
+        <w:tc>
+          <w:tcPr>
+            <w:tcW w:type="dxa" w:w="1150"/>
+            <w:tcMar>
+              <w:top w:w="80" w:type="dxa"/>
+              <w:start w:w="120" w:type="dxa"/>
+              <w:bottom w:w="80" w:type="dxa"/>
+              <w:end w:w="120" w:type="dxa"/>
+            </w:tcMar>
+            <w:vAlign w:val="center"/>
+            <w:shd w:fill="FFFFFF"/>
+          </w:tcPr>
+          <w:p>
+            <w:pPr>
+              <w:spacing w:before="0" w:after="40" w:line="252" w:lineRule="auto"/>
+              <w:jc w:val="center"/>
+            </w:pPr>
+            <w:r>
+              <w:rPr>
+                <w:rFonts w:ascii="Calibri" w:hAnsi="Calibri"/>
+                <w:b w:val="0"/>
+                <w:color w:val="111827"/>
+                <w:sz w:val="16"/>
+              </w:rPr>
+              <w:t>EV-T-047</w:t>
+            </w:r>
+          </w:p>
+        </w:tc>
+        <w:tc>
+          <w:tcPr>
+            <w:tcW w:type="dxa" w:w="3700"/>
+            <w:tcMar>
+              <w:top w:w="80" w:type="dxa"/>
+              <w:start w:w="120" w:type="dxa"/>
+              <w:bottom w:w="80" w:type="dxa"/>
+              <w:end w:w="120" w:type="dxa"/>
+            </w:tcMar>
+            <w:vAlign w:val="center"/>
+            <w:shd w:fill="FFFFFF"/>
+          </w:tcPr>
+          <w:p>
+            <w:pPr>
+              <w:spacing w:before="0" w:after="40" w:line="252" w:lineRule="auto"/>
+              <w:jc w:val="left"/>
+            </w:pPr>
+            <w:r>
+              <w:rPr>
+                <w:rFonts w:ascii="Calibri" w:hAnsi="Calibri"/>
+                <w:b w:val="0"/>
+                <w:color w:val="111827"/>
+                <w:sz w:val="16"/>
+              </w:rPr>
+              <w:t>Pure regeneration</w:t>
+            </w:r>
+          </w:p>
+        </w:tc>
+        <w:tc>
+          <w:tcPr>
+            <w:tcW w:type="dxa" w:w="3100"/>
+            <w:tcMar>
+              <w:top w:w="80" w:type="dxa"/>
+              <w:start w:w="120" w:type="dxa"/>
+              <w:bottom w:w="80" w:type="dxa"/>
+              <w:end w:w="120" w:type="dxa"/>
+            </w:tcMar>
+            <w:vAlign w:val="center"/>
+            <w:shd w:fill="FFFFFF"/>
+          </w:tcPr>
+          <w:p>
+            <w:pPr>
+              <w:spacing w:before="0" w:after="40" w:line="252" w:lineRule="auto"/>
+              <w:jc w:val="left"/>
+            </w:pPr>
+            <w:r>
+              <w:rPr>
+                <w:rFonts w:ascii="Calibri" w:hAnsi="Calibri"/>
+                <w:b w:val="0"/>
+                <w:color w:val="111827"/>
+                <w:sz w:val="16"/>
+              </w:rPr>
+              <w:t>Request deceleration within regenerative capacity</w:t>
+            </w:r>
+          </w:p>
+        </w:tc>
+        <w:tc>
+          <w:tcPr>
+            <w:tcW w:type="dxa" w:w="1410"/>
+            <w:tcMar>
+              <w:top w:w="80" w:type="dxa"/>
+              <w:start w:w="120" w:type="dxa"/>
+              <w:bottom w:w="80" w:type="dxa"/>
+              <w:end w:w="120" w:type="dxa"/>
+            </w:tcMar>
+            <w:vAlign w:val="center"/>
+            <w:shd w:fill="FFFFFF"/>
+          </w:tcPr>
+          <w:p>
+            <w:pPr>
+              <w:spacing w:before="0" w:after="40" w:line="252" w:lineRule="auto"/>
+              <w:jc w:val="left"/>
+            </w:pPr>
+            <w:r>
+              <w:rPr>
+                <w:rFonts w:ascii="Calibri" w:hAnsi="Calibri"/>
+                <w:b w:val="0"/>
+                <w:color w:val="111827"/>
+                <w:sz w:val="16"/>
+              </w:rPr>
+              <w:t>No friction contribution</w:t>
+            </w:r>
+          </w:p>
+        </w:tc>
+      </w:tr>
+      <w:tr>
+        <w:trPr>
+          <w:cantSplit/>
+        </w:trPr>
+        <w:tc>
+          <w:tcPr>
+            <w:tcW w:type="dxa" w:w="1150"/>
+            <w:tcMar>
+              <w:top w:w="80" w:type="dxa"/>
+              <w:start w:w="120" w:type="dxa"/>
+              <w:bottom w:w="80" w:type="dxa"/>
+              <w:end w:w="120" w:type="dxa"/>
+            </w:tcMar>
+            <w:vAlign w:val="center"/>
+            <w:shd w:fill="FFFFFF"/>
+          </w:tcPr>
+          <w:p>
+            <w:pPr>
+              <w:spacing w:before="0" w:after="40" w:line="252" w:lineRule="auto"/>
+              <w:jc w:val="center"/>
+            </w:pPr>
+            <w:r>
+              <w:rPr>
+                <w:rFonts w:ascii="Calibri" w:hAnsi="Calibri"/>
+                <w:b w:val="0"/>
+                <w:color w:val="111827"/>
+                <w:sz w:val="16"/>
+              </w:rPr>
+              <w:t>EV-T-048</w:t>
+            </w:r>
+          </w:p>
+        </w:tc>
+        <w:tc>
+          <w:tcPr>
+            <w:tcW w:type="dxa" w:w="3700"/>
+            <w:tcMar>
+              <w:top w:w="80" w:type="dxa"/>
+              <w:start w:w="120" w:type="dxa"/>
+              <w:bottom w:w="80" w:type="dxa"/>
+              <w:end w:w="120" w:type="dxa"/>
+            </w:tcMar>
+            <w:vAlign w:val="center"/>
+            <w:shd w:fill="FFFFFF"/>
+          </w:tcPr>
+          <w:p>
+            <w:pPr>
+              <w:spacing w:before="0" w:after="40" w:line="252" w:lineRule="auto"/>
+              <w:jc w:val="left"/>
+            </w:pPr>
+            <w:r>
+              <w:rPr>
+                <w:rFonts w:ascii="Calibri" w:hAnsi="Calibri"/>
+                <w:b w:val="0"/>
+                <w:color w:val="111827"/>
+                <w:sz w:val="16"/>
+              </w:rPr>
+              <w:t>Blended braking</w:t>
+            </w:r>
+          </w:p>
+        </w:tc>
+        <w:tc>
+          <w:tcPr>
+            <w:tcW w:type="dxa" w:w="3100"/>
+            <w:tcMar>
+              <w:top w:w="80" w:type="dxa"/>
+              <w:start w:w="120" w:type="dxa"/>
+              <w:bottom w:w="80" w:type="dxa"/>
+              <w:end w:w="120" w:type="dxa"/>
+            </w:tcMar>
+            <w:vAlign w:val="center"/>
+            <w:shd w:fill="FFFFFF"/>
+          </w:tcPr>
+          <w:p>
+            <w:pPr>
+              <w:spacing w:before="0" w:after="40" w:line="252" w:lineRule="auto"/>
+              <w:jc w:val="left"/>
+            </w:pPr>
+            <w:r>
+              <w:rPr>
+                <w:rFonts w:ascii="Calibri" w:hAnsi="Calibri"/>
+                <w:b w:val="0"/>
+                <w:color w:val="111827"/>
+                <w:sz w:val="16"/>
+              </w:rPr>
+              <w:t>Exceed regenerative torque capacity</w:t>
+            </w:r>
+          </w:p>
+        </w:tc>
+        <w:tc>
+          <w:tcPr>
+            <w:tcW w:type="dxa" w:w="1410"/>
+            <w:tcMar>
+              <w:top w:w="80" w:type="dxa"/>
+              <w:start w:w="120" w:type="dxa"/>
+              <w:bottom w:w="80" w:type="dxa"/>
+              <w:end w:w="120" w:type="dxa"/>
+            </w:tcMar>
+            <w:vAlign w:val="center"/>
+            <w:shd w:fill="FFFFFF"/>
+          </w:tcPr>
+          <w:p>
+            <w:pPr>
+              <w:spacing w:before="0" w:after="40" w:line="252" w:lineRule="auto"/>
+              <w:jc w:val="left"/>
+            </w:pPr>
+            <w:r>
+              <w:rPr>
+                <w:rFonts w:ascii="Calibri" w:hAnsi="Calibri"/>
+                <w:b w:val="0"/>
+                <w:color w:val="111827"/>
+                <w:sz w:val="16"/>
+              </w:rPr>
+              <w:t>Regen plus friction meets request</w:t>
+            </w:r>
+          </w:p>
+        </w:tc>
+      </w:tr>
+      <w:tr>
+        <w:trPr>
+          <w:cantSplit/>
+        </w:trPr>
+        <w:tc>
+          <w:tcPr>
+            <w:tcW w:type="dxa" w:w="1150"/>
+            <w:tcMar>
+              <w:top w:w="80" w:type="dxa"/>
+              <w:start w:w="120" w:type="dxa"/>
+              <w:bottom w:w="80" w:type="dxa"/>
+              <w:end w:w="120" w:type="dxa"/>
+            </w:tcMar>
+            <w:vAlign w:val="center"/>
+            <w:shd w:fill="FFFFFF"/>
+          </w:tcPr>
+          <w:p>
+            <w:pPr>
+              <w:spacing w:before="0" w:after="40" w:line="252" w:lineRule="auto"/>
+              <w:jc w:val="center"/>
+            </w:pPr>
+            <w:r>
+              <w:rPr>
+                <w:rFonts w:ascii="Calibri" w:hAnsi="Calibri"/>
+                <w:b w:val="0"/>
+                <w:color w:val="111827"/>
+                <w:sz w:val="16"/>
+              </w:rPr>
+              <w:t>EV-T-049</w:t>
+            </w:r>
+          </w:p>
+        </w:tc>
+        <w:tc>
+          <w:tcPr>
+            <w:tcW w:type="dxa" w:w="3700"/>
+            <w:tcMar>
+              <w:top w:w="80" w:type="dxa"/>
+              <w:start w:w="120" w:type="dxa"/>
+              <w:bottom w:w="80" w:type="dxa"/>
+              <w:end w:w="120" w:type="dxa"/>
+            </w:tcMar>
+            <w:vAlign w:val="center"/>
+            <w:shd w:fill="FFFFFF"/>
+          </w:tcPr>
+          <w:p>
+            <w:pPr>
+              <w:spacing w:before="0" w:after="40" w:line="252" w:lineRule="auto"/>
+              <w:jc w:val="left"/>
+            </w:pPr>
+            <w:r>
+              <w:rPr>
+                <w:rFonts w:ascii="Calibri" w:hAnsi="Calibri"/>
+                <w:b w:val="0"/>
+                <w:color w:val="111827"/>
+                <w:sz w:val="16"/>
+              </w:rPr>
+              <w:t>Low-speed fallback</w:t>
+            </w:r>
+          </w:p>
+        </w:tc>
+        <w:tc>
+          <w:tcPr>
+            <w:tcW w:type="dxa" w:w="3100"/>
+            <w:tcMar>
+              <w:top w:w="80" w:type="dxa"/>
+              <w:start w:w="120" w:type="dxa"/>
+              <w:bottom w:w="80" w:type="dxa"/>
+              <w:end w:w="120" w:type="dxa"/>
+            </w:tcMar>
+            <w:vAlign w:val="center"/>
+            <w:shd w:fill="FFFFFF"/>
+          </w:tcPr>
+          <w:p>
+            <w:pPr>
+              <w:spacing w:before="0" w:after="40" w:line="252" w:lineRule="auto"/>
+              <w:jc w:val="left"/>
+            </w:pPr>
+            <w:r>
+              <w:rPr>
+                <w:rFonts w:ascii="Calibri" w:hAnsi="Calibri"/>
+                <w:b w:val="0"/>
+                <w:color w:val="111827"/>
+                <w:sz w:val="16"/>
+              </w:rPr>
+              <w:t>Brake below 0.5 m/s</w:t>
+            </w:r>
+          </w:p>
+        </w:tc>
+        <w:tc>
+          <w:tcPr>
+            <w:tcW w:type="dxa" w:w="1410"/>
+            <w:tcMar>
+              <w:top w:w="80" w:type="dxa"/>
+              <w:start w:w="120" w:type="dxa"/>
+              <w:bottom w:w="80" w:type="dxa"/>
+              <w:end w:w="120" w:type="dxa"/>
+            </w:tcMar>
+            <w:vAlign w:val="center"/>
+            <w:shd w:fill="FFFFFF"/>
+          </w:tcPr>
+          <w:p>
+            <w:pPr>
+              <w:spacing w:before="0" w:after="40" w:line="252" w:lineRule="auto"/>
+              <w:jc w:val="left"/>
+            </w:pPr>
+            <w:r>
+              <w:rPr>
+                <w:rFonts w:ascii="Calibri" w:hAnsi="Calibri"/>
+                <w:b w:val="0"/>
+                <w:color w:val="111827"/>
+                <w:sz w:val="16"/>
+              </w:rPr>
+              <w:t>Friction only and stable reason</w:t>
+            </w:r>
+          </w:p>
+        </w:tc>
+      </w:tr>
+      <w:tr>
+        <w:trPr>
+          <w:cantSplit/>
+        </w:trPr>
+        <w:tc>
+          <w:tcPr>
+            <w:tcW w:type="dxa" w:w="1150"/>
+            <w:tcMar>
+              <w:top w:w="80" w:type="dxa"/>
+              <w:start w:w="120" w:type="dxa"/>
+              <w:bottom w:w="80" w:type="dxa"/>
+              <w:end w:w="120" w:type="dxa"/>
+            </w:tcMar>
+            <w:vAlign w:val="center"/>
+            <w:shd w:fill="FFFFFF"/>
+          </w:tcPr>
+          <w:p>
+            <w:pPr>
+              <w:spacing w:before="0" w:after="40" w:line="252" w:lineRule="auto"/>
+              <w:jc w:val="center"/>
+            </w:pPr>
+            <w:r>
+              <w:rPr>
+                <w:rFonts w:ascii="Calibri" w:hAnsi="Calibri"/>
+                <w:b w:val="0"/>
+                <w:color w:val="111827"/>
+                <w:sz w:val="16"/>
+              </w:rPr>
+              <w:t>EV-T-050</w:t>
+            </w:r>
+          </w:p>
+        </w:tc>
+        <w:tc>
+          <w:tcPr>
+            <w:tcW w:type="dxa" w:w="3700"/>
+            <w:tcMar>
+              <w:top w:w="80" w:type="dxa"/>
+              <w:start w:w="120" w:type="dxa"/>
+              <w:bottom w:w="80" w:type="dxa"/>
+              <w:end w:w="120" w:type="dxa"/>
+            </w:tcMar>
+            <w:vAlign w:val="center"/>
+            <w:shd w:fill="FFFFFF"/>
+          </w:tcPr>
+          <w:p>
+            <w:pPr>
+              <w:spacing w:before="0" w:after="40" w:line="252" w:lineRule="auto"/>
+              <w:jc w:val="left"/>
+            </w:pPr>
+            <w:r>
+              <w:rPr>
+                <w:rFonts w:ascii="Calibri" w:hAnsi="Calibri"/>
+                <w:b w:val="0"/>
+                <w:color w:val="111827"/>
+                <w:sz w:val="16"/>
+              </w:rPr>
+              <w:t>High-SOC fallback</w:t>
+            </w:r>
+          </w:p>
+        </w:tc>
+        <w:tc>
+          <w:tcPr>
+            <w:tcW w:type="dxa" w:w="3100"/>
+            <w:tcMar>
+              <w:top w:w="80" w:type="dxa"/>
+              <w:start w:w="120" w:type="dxa"/>
+              <w:bottom w:w="80" w:type="dxa"/>
+              <w:end w:w="120" w:type="dxa"/>
+            </w:tcMar>
+            <w:vAlign w:val="center"/>
+            <w:shd w:fill="FFFFFF"/>
+          </w:tcPr>
+          <w:p>
+            <w:pPr>
+              <w:spacing w:before="0" w:after="40" w:line="252" w:lineRule="auto"/>
+              <w:jc w:val="left"/>
+            </w:pPr>
+            <w:r>
+              <w:rPr>
+                <w:rFonts w:ascii="Calibri" w:hAnsi="Calibri"/>
+                <w:b w:val="0"/>
+                <w:color w:val="111827"/>
+                <w:sz w:val="16"/>
+              </w:rPr>
+              <w:t>Brake at or above 95% SOC</w:t>
+            </w:r>
+          </w:p>
+        </w:tc>
+        <w:tc>
+          <w:tcPr>
+            <w:tcW w:type="dxa" w:w="1410"/>
+            <w:tcMar>
+              <w:top w:w="80" w:type="dxa"/>
+              <w:start w:w="120" w:type="dxa"/>
+              <w:bottom w:w="80" w:type="dxa"/>
+              <w:end w:w="120" w:type="dxa"/>
+            </w:tcMar>
+            <w:vAlign w:val="center"/>
+            <w:shd w:fill="FFFFFF"/>
+          </w:tcPr>
+          <w:p>
+            <w:pPr>
+              <w:spacing w:before="0" w:after="40" w:line="252" w:lineRule="auto"/>
+              <w:jc w:val="left"/>
+            </w:pPr>
+            <w:r>
+              <w:rPr>
+                <w:rFonts w:ascii="Calibri" w:hAnsi="Calibri"/>
+                <w:b w:val="0"/>
+                <w:color w:val="111827"/>
+                <w:sz w:val="16"/>
+              </w:rPr>
+              <w:t>Friction only and no recovered energy</w:t>
+            </w:r>
+          </w:p>
+        </w:tc>
+      </w:tr>
+      <w:tr>
+        <w:trPr>
+          <w:cantSplit/>
+        </w:trPr>
+        <w:tc>
+          <w:tcPr>
+            <w:tcW w:type="dxa" w:w="1150"/>
+            <w:tcMar>
+              <w:top w:w="80" w:type="dxa"/>
+              <w:start w:w="120" w:type="dxa"/>
+              <w:bottom w:w="80" w:type="dxa"/>
+              <w:end w:w="120" w:type="dxa"/>
+            </w:tcMar>
+            <w:vAlign w:val="center"/>
+            <w:shd w:fill="FFFFFF"/>
+          </w:tcPr>
+          <w:p>
+            <w:pPr>
+              <w:spacing w:before="0" w:after="40" w:line="252" w:lineRule="auto"/>
+              <w:jc w:val="center"/>
+            </w:pPr>
+            <w:r>
+              <w:rPr>
+                <w:rFonts w:ascii="Calibri" w:hAnsi="Calibri"/>
+                <w:b w:val="0"/>
+                <w:color w:val="111827"/>
+                <w:sz w:val="16"/>
+              </w:rPr>
+              <w:t>EV-T-051</w:t>
+            </w:r>
+          </w:p>
+        </w:tc>
+        <w:tc>
+          <w:tcPr>
+            <w:tcW w:type="dxa" w:w="3700"/>
+            <w:tcMar>
+              <w:top w:w="80" w:type="dxa"/>
+              <w:start w:w="120" w:type="dxa"/>
+              <w:bottom w:w="80" w:type="dxa"/>
+              <w:end w:w="120" w:type="dxa"/>
+            </w:tcMar>
+            <w:vAlign w:val="center"/>
+            <w:shd w:fill="FFFFFF"/>
+          </w:tcPr>
+          <w:p>
+            <w:pPr>
+              <w:spacing w:before="0" w:after="40" w:line="252" w:lineRule="auto"/>
+              <w:jc w:val="left"/>
+            </w:pPr>
+            <w:r>
+              <w:rPr>
+                <w:rFonts w:ascii="Calibri" w:hAnsi="Calibri"/>
+                <w:b w:val="0"/>
+                <w:color w:val="111827"/>
+                <w:sz w:val="16"/>
+              </w:rPr>
+              <w:t>Open-contactor fallback</w:t>
+            </w:r>
+          </w:p>
+        </w:tc>
+        <w:tc>
+          <w:tcPr>
+            <w:tcW w:type="dxa" w:w="3100"/>
+            <w:tcMar>
+              <w:top w:w="80" w:type="dxa"/>
+              <w:start w:w="120" w:type="dxa"/>
+              <w:bottom w:w="80" w:type="dxa"/>
+              <w:end w:w="120" w:type="dxa"/>
+            </w:tcMar>
+            <w:vAlign w:val="center"/>
+            <w:shd w:fill="FFFFFF"/>
+          </w:tcPr>
+          <w:p>
+            <w:pPr>
+              <w:spacing w:before="0" w:after="40" w:line="252" w:lineRule="auto"/>
+              <w:jc w:val="left"/>
+            </w:pPr>
+            <w:r>
+              <w:rPr>
+                <w:rFonts w:ascii="Calibri" w:hAnsi="Calibri"/>
+                <w:b w:val="0"/>
+                <w:color w:val="111827"/>
+                <w:sz w:val="16"/>
+              </w:rPr>
+              <w:t>Brake with contactors open</w:t>
+            </w:r>
+          </w:p>
+        </w:tc>
+        <w:tc>
+          <w:tcPr>
+            <w:tcW w:type="dxa" w:w="1410"/>
+            <w:tcMar>
+              <w:top w:w="80" w:type="dxa"/>
+              <w:start w:w="120" w:type="dxa"/>
+              <w:bottom w:w="80" w:type="dxa"/>
+              <w:end w:w="120" w:type="dxa"/>
+            </w:tcMar>
+            <w:vAlign w:val="center"/>
+            <w:shd w:fill="FFFFFF"/>
+          </w:tcPr>
+          <w:p>
+            <w:pPr>
+              <w:spacing w:before="0" w:after="40" w:line="252" w:lineRule="auto"/>
+              <w:jc w:val="left"/>
+            </w:pPr>
+            <w:r>
+              <w:rPr>
+                <w:rFonts w:ascii="Calibri" w:hAnsi="Calibri"/>
+                <w:b w:val="0"/>
+                <w:color w:val="111827"/>
+                <w:sz w:val="16"/>
+              </w:rPr>
+              <w:t>Friction only and stable reason</w:t>
+            </w:r>
+          </w:p>
+        </w:tc>
+      </w:tr>
+      <w:tr>
+        <w:trPr>
+          <w:cantSplit/>
+        </w:trPr>
+        <w:tc>
+          <w:tcPr>
+            <w:tcW w:type="dxa" w:w="1150"/>
+            <w:tcMar>
+              <w:top w:w="80" w:type="dxa"/>
+              <w:start w:w="120" w:type="dxa"/>
+              <w:bottom w:w="80" w:type="dxa"/>
+              <w:end w:w="120" w:type="dxa"/>
+            </w:tcMar>
+            <w:vAlign w:val="center"/>
+            <w:shd w:fill="FFFFFF"/>
+          </w:tcPr>
+          <w:p>
+            <w:pPr>
+              <w:spacing w:before="0" w:after="40" w:line="252" w:lineRule="auto"/>
+              <w:jc w:val="center"/>
+            </w:pPr>
+            <w:r>
+              <w:rPr>
+                <w:rFonts w:ascii="Calibri" w:hAnsi="Calibri"/>
+                <w:b w:val="0"/>
+                <w:color w:val="111827"/>
+                <w:sz w:val="16"/>
+              </w:rPr>
+              <w:t>EV-T-052</w:t>
+            </w:r>
+          </w:p>
+        </w:tc>
+        <w:tc>
+          <w:tcPr>
+            <w:tcW w:type="dxa" w:w="3700"/>
+            <w:tcMar>
+              <w:top w:w="80" w:type="dxa"/>
+              <w:start w:w="120" w:type="dxa"/>
+              <w:bottom w:w="80" w:type="dxa"/>
+              <w:end w:w="120" w:type="dxa"/>
+            </w:tcMar>
+            <w:vAlign w:val="center"/>
+            <w:shd w:fill="FFFFFF"/>
+          </w:tcPr>
+          <w:p>
+            <w:pPr>
+              <w:spacing w:before="0" w:after="40" w:line="252" w:lineRule="auto"/>
+              <w:jc w:val="left"/>
+            </w:pPr>
+            <w:r>
+              <w:rPr>
+                <w:rFonts w:ascii="Calibri" w:hAnsi="Calibri"/>
+                <w:b w:val="0"/>
+                <w:color w:val="111827"/>
+                <w:sz w:val="16"/>
+              </w:rPr>
+              <w:t>Temperature acceptance</w:t>
+            </w:r>
+          </w:p>
+        </w:tc>
+        <w:tc>
+          <w:tcPr>
+            <w:tcW w:type="dxa" w:w="3100"/>
+            <w:tcMar>
+              <w:top w:w="80" w:type="dxa"/>
+              <w:start w:w="120" w:type="dxa"/>
+              <w:bottom w:w="80" w:type="dxa"/>
+              <w:end w:w="120" w:type="dxa"/>
+            </w:tcMar>
+            <w:vAlign w:val="center"/>
+            <w:shd w:fill="FFFFFF"/>
+          </w:tcPr>
+          <w:p>
+            <w:pPr>
+              <w:spacing w:before="0" w:after="40" w:line="252" w:lineRule="auto"/>
+              <w:jc w:val="left"/>
+            </w:pPr>
+            <w:r>
+              <w:rPr>
+                <w:rFonts w:ascii="Calibri" w:hAnsi="Calibri"/>
+                <w:b w:val="0"/>
+                <w:color w:val="111827"/>
+                <w:sz w:val="16"/>
+              </w:rPr>
+              <w:t>Brake outside charge window</w:t>
+            </w:r>
+          </w:p>
+        </w:tc>
+        <w:tc>
+          <w:tcPr>
+            <w:tcW w:type="dxa" w:w="1410"/>
+            <w:tcMar>
+              <w:top w:w="80" w:type="dxa"/>
+              <w:start w:w="120" w:type="dxa"/>
+              <w:bottom w:w="80" w:type="dxa"/>
+              <w:end w:w="120" w:type="dxa"/>
+            </w:tcMar>
+            <w:vAlign w:val="center"/>
+            <w:shd w:fill="FFFFFF"/>
+          </w:tcPr>
+          <w:p>
+            <w:pPr>
+              <w:spacing w:before="0" w:after="40" w:line="252" w:lineRule="auto"/>
+              <w:jc w:val="left"/>
+            </w:pPr>
+            <w:r>
+              <w:rPr>
+                <w:rFonts w:ascii="Calibri" w:hAnsi="Calibri"/>
+                <w:b w:val="0"/>
+                <w:color w:val="111827"/>
+                <w:sz w:val="16"/>
+              </w:rPr>
+              <w:t>Regeneration unavailable</w:t>
+            </w:r>
+          </w:p>
+        </w:tc>
+      </w:tr>
+      <w:tr>
+        <w:trPr>
+          <w:cantSplit/>
+        </w:trPr>
+        <w:tc>
+          <w:tcPr>
+            <w:tcW w:type="dxa" w:w="1150"/>
+            <w:tcMar>
+              <w:top w:w="80" w:type="dxa"/>
+              <w:start w:w="120" w:type="dxa"/>
+              <w:bottom w:w="80" w:type="dxa"/>
+              <w:end w:w="120" w:type="dxa"/>
+            </w:tcMar>
+            <w:vAlign w:val="center"/>
+            <w:shd w:fill="FFFFFF"/>
+          </w:tcPr>
+          <w:p>
+            <w:pPr>
+              <w:spacing w:before="0" w:after="40" w:line="252" w:lineRule="auto"/>
+              <w:jc w:val="center"/>
+            </w:pPr>
+            <w:r>
+              <w:rPr>
+                <w:rFonts w:ascii="Calibri" w:hAnsi="Calibri"/>
+                <w:b w:val="0"/>
+                <w:color w:val="111827"/>
+                <w:sz w:val="16"/>
+              </w:rPr>
+              <w:t>EV-T-053</w:t>
+            </w:r>
+          </w:p>
+        </w:tc>
+        <w:tc>
+          <w:tcPr>
+            <w:tcW w:type="dxa" w:w="3700"/>
+            <w:tcMar>
+              <w:top w:w="80" w:type="dxa"/>
+              <w:start w:w="120" w:type="dxa"/>
+              <w:bottom w:w="80" w:type="dxa"/>
+              <w:end w:w="120" w:type="dxa"/>
+            </w:tcMar>
+            <w:vAlign w:val="center"/>
+            <w:shd w:fill="FFFFFF"/>
+          </w:tcPr>
+          <w:p>
+            <w:pPr>
+              <w:spacing w:before="0" w:after="40" w:line="252" w:lineRule="auto"/>
+              <w:jc w:val="left"/>
+            </w:pPr>
+            <w:r>
+              <w:rPr>
+                <w:rFonts w:ascii="Calibri" w:hAnsi="Calibri"/>
+                <w:b w:val="0"/>
+                <w:color w:val="111827"/>
+                <w:sz w:val="16"/>
+              </w:rPr>
+              <w:t>Charge taper</w:t>
+            </w:r>
+          </w:p>
+        </w:tc>
+        <w:tc>
+          <w:tcPr>
+            <w:tcW w:type="dxa" w:w="3100"/>
+            <w:tcMar>
+              <w:top w:w="80" w:type="dxa"/>
+              <w:start w:w="120" w:type="dxa"/>
+              <w:bottom w:w="80" w:type="dxa"/>
+              <w:end w:w="120" w:type="dxa"/>
+            </w:tcMar>
+            <w:vAlign w:val="center"/>
+            <w:shd w:fill="FFFFFF"/>
+          </w:tcPr>
+          <w:p>
+            <w:pPr>
+              <w:spacing w:before="0" w:after="40" w:line="252" w:lineRule="auto"/>
+              <w:jc w:val="left"/>
+            </w:pPr>
+            <w:r>
+              <w:rPr>
+                <w:rFonts w:ascii="Calibri" w:hAnsi="Calibri"/>
+                <w:b w:val="0"/>
+                <w:color w:val="111827"/>
+                <w:sz w:val="16"/>
+              </w:rPr>
+              <w:t>Compare acceptance at 80% and near 95% SOC</w:t>
+            </w:r>
+          </w:p>
+        </w:tc>
+        <w:tc>
+          <w:tcPr>
+            <w:tcW w:type="dxa" w:w="1410"/>
+            <w:tcMar>
+              <w:top w:w="80" w:type="dxa"/>
+              <w:start w:w="120" w:type="dxa"/>
+              <w:bottom w:w="80" w:type="dxa"/>
+              <w:end w:w="120" w:type="dxa"/>
+            </w:tcMar>
+            <w:vAlign w:val="center"/>
+            <w:shd w:fill="FFFFFF"/>
+          </w:tcPr>
+          <w:p>
+            <w:pPr>
+              <w:spacing w:before="0" w:after="40" w:line="252" w:lineRule="auto"/>
+              <w:jc w:val="left"/>
+            </w:pPr>
+            <w:r>
+              <w:rPr>
+                <w:rFonts w:ascii="Calibri" w:hAnsi="Calibri"/>
+                <w:b w:val="0"/>
+                <w:color w:val="111827"/>
+                <w:sz w:val="16"/>
+              </w:rPr>
+              <w:t>Higher SOC has lower acceptance</w:t>
+            </w:r>
+          </w:p>
+        </w:tc>
+      </w:tr>
+      <w:tr>
+        <w:trPr>
+          <w:cantSplit/>
+        </w:trPr>
+        <w:tc>
+          <w:tcPr>
+            <w:tcW w:type="dxa" w:w="1150"/>
+            <w:tcMar>
+              <w:top w:w="80" w:type="dxa"/>
+              <w:start w:w="120" w:type="dxa"/>
+              <w:bottom w:w="80" w:type="dxa"/>
+              <w:end w:w="120" w:type="dxa"/>
+            </w:tcMar>
+            <w:vAlign w:val="center"/>
+            <w:shd w:fill="FFFFFF"/>
+          </w:tcPr>
+          <w:p>
+            <w:pPr>
+              <w:spacing w:before="0" w:after="40" w:line="252" w:lineRule="auto"/>
+              <w:jc w:val="center"/>
+            </w:pPr>
+            <w:r>
+              <w:rPr>
+                <w:rFonts w:ascii="Calibri" w:hAnsi="Calibri"/>
+                <w:b w:val="0"/>
+                <w:color w:val="111827"/>
+                <w:sz w:val="16"/>
+              </w:rPr>
+              <w:t>EV-T-054</w:t>
+            </w:r>
+          </w:p>
+        </w:tc>
+        <w:tc>
+          <w:tcPr>
+            <w:tcW w:type="dxa" w:w="3700"/>
+            <w:tcMar>
+              <w:top w:w="80" w:type="dxa"/>
+              <w:start w:w="120" w:type="dxa"/>
+              <w:bottom w:w="80" w:type="dxa"/>
+              <w:end w:w="120" w:type="dxa"/>
+            </w:tcMar>
+            <w:vAlign w:val="center"/>
+            <w:shd w:fill="FFFFFF"/>
+          </w:tcPr>
+          <w:p>
+            <w:pPr>
+              <w:spacing w:before="0" w:after="40" w:line="252" w:lineRule="auto"/>
+              <w:jc w:val="left"/>
+            </w:pPr>
+            <w:r>
+              <w:rPr>
+                <w:rFonts w:ascii="Calibri" w:hAnsi="Calibri"/>
+                <w:b w:val="0"/>
+                <w:color w:val="111827"/>
+                <w:sz w:val="16"/>
+              </w:rPr>
+              <w:t>Regen torque limit</w:t>
+            </w:r>
+          </w:p>
+        </w:tc>
+        <w:tc>
+          <w:tcPr>
+            <w:tcW w:type="dxa" w:w="3100"/>
+            <w:tcMar>
+              <w:top w:w="80" w:type="dxa"/>
+              <w:start w:w="120" w:type="dxa"/>
+              <w:bottom w:w="80" w:type="dxa"/>
+              <w:end w:w="120" w:type="dxa"/>
+            </w:tcMar>
+            <w:vAlign w:val="center"/>
+            <w:shd w:fill="FFFFFF"/>
+          </w:tcPr>
+          <w:p>
+            <w:pPr>
+              <w:spacing w:before="0" w:after="40" w:line="252" w:lineRule="auto"/>
+              <w:jc w:val="left"/>
+            </w:pPr>
+            <w:r>
+              <w:rPr>
+                <w:rFonts w:ascii="Calibri" w:hAnsi="Calibri"/>
+                <w:b w:val="0"/>
+                <w:color w:val="111827"/>
+                <w:sz w:val="16"/>
+              </w:rPr>
+              <w:t>Exceed recoverable motor torque</w:t>
+            </w:r>
+          </w:p>
+        </w:tc>
+        <w:tc>
+          <w:tcPr>
+            <w:tcW w:type="dxa" w:w="1410"/>
+            <w:tcMar>
+              <w:top w:w="80" w:type="dxa"/>
+              <w:start w:w="120" w:type="dxa"/>
+              <w:bottom w:w="80" w:type="dxa"/>
+              <w:end w:w="120" w:type="dxa"/>
+            </w:tcMar>
+            <w:vAlign w:val="center"/>
+            <w:shd w:fill="FFFFFF"/>
+          </w:tcPr>
+          <w:p>
+            <w:pPr>
+              <w:spacing w:before="0" w:after="40" w:line="252" w:lineRule="auto"/>
+              <w:jc w:val="left"/>
+            </w:pPr>
+            <w:r>
+              <w:rPr>
+                <w:rFonts w:ascii="Calibri" w:hAnsi="Calibri"/>
+                <w:b w:val="0"/>
+                <w:color w:val="111827"/>
+                <w:sz w:val="16"/>
+              </w:rPr>
+              <w:t>Stable torque-limit reason</w:t>
+            </w:r>
+          </w:p>
+        </w:tc>
+      </w:tr>
+      <w:tr>
+        <w:trPr>
+          <w:cantSplit/>
+        </w:trPr>
+        <w:tc>
+          <w:tcPr>
+            <w:tcW w:type="dxa" w:w="1150"/>
+            <w:tcMar>
+              <w:top w:w="80" w:type="dxa"/>
+              <w:start w:w="120" w:type="dxa"/>
+              <w:bottom w:w="80" w:type="dxa"/>
+              <w:end w:w="120" w:type="dxa"/>
+            </w:tcMar>
+            <w:vAlign w:val="center"/>
+            <w:shd w:fill="FFFFFF"/>
+          </w:tcPr>
+          <w:p>
+            <w:pPr>
+              <w:spacing w:before="0" w:after="40" w:line="252" w:lineRule="auto"/>
+              <w:jc w:val="center"/>
+            </w:pPr>
+            <w:r>
+              <w:rPr>
+                <w:rFonts w:ascii="Calibri" w:hAnsi="Calibri"/>
+                <w:b w:val="0"/>
+                <w:color w:val="111827"/>
+                <w:sz w:val="16"/>
+              </w:rPr>
+              <w:t>EV-T-055</w:t>
+            </w:r>
+          </w:p>
+        </w:tc>
+        <w:tc>
+          <w:tcPr>
+            <w:tcW w:type="dxa" w:w="3700"/>
+            <w:tcMar>
+              <w:top w:w="80" w:type="dxa"/>
+              <w:start w:w="120" w:type="dxa"/>
+              <w:bottom w:w="80" w:type="dxa"/>
+              <w:end w:w="120" w:type="dxa"/>
+            </w:tcMar>
+            <w:vAlign w:val="center"/>
+            <w:shd w:fill="FFFFFF"/>
+          </w:tcPr>
+          <w:p>
+            <w:pPr>
+              <w:spacing w:before="0" w:after="40" w:line="252" w:lineRule="auto"/>
+              <w:jc w:val="left"/>
+            </w:pPr>
+            <w:r>
+              <w:rPr>
+                <w:rFonts w:ascii="Calibri" w:hAnsi="Calibri"/>
+                <w:b w:val="0"/>
+                <w:color w:val="111827"/>
+                <w:sz w:val="16"/>
+              </w:rPr>
+              <w:t>Battery power limit</w:t>
+            </w:r>
+          </w:p>
+        </w:tc>
+        <w:tc>
+          <w:tcPr>
+            <w:tcW w:type="dxa" w:w="3100"/>
+            <w:tcMar>
+              <w:top w:w="80" w:type="dxa"/>
+              <w:start w:w="120" w:type="dxa"/>
+              <w:bottom w:w="80" w:type="dxa"/>
+              <w:end w:w="120" w:type="dxa"/>
+            </w:tcMar>
+            <w:vAlign w:val="center"/>
+            <w:shd w:fill="FFFFFF"/>
+          </w:tcPr>
+          <w:p>
+            <w:pPr>
+              <w:spacing w:before="0" w:after="40" w:line="252" w:lineRule="auto"/>
+              <w:jc w:val="left"/>
+            </w:pPr>
+            <w:r>
+              <w:rPr>
+                <w:rFonts w:ascii="Calibri" w:hAnsi="Calibri"/>
+                <w:b w:val="0"/>
+                <w:color w:val="111827"/>
+                <w:sz w:val="16"/>
+              </w:rPr>
+              <w:t>Exceed charge acceptance</w:t>
+            </w:r>
+          </w:p>
+        </w:tc>
+        <w:tc>
+          <w:tcPr>
+            <w:tcW w:type="dxa" w:w="1410"/>
+            <w:tcMar>
+              <w:top w:w="80" w:type="dxa"/>
+              <w:start w:w="120" w:type="dxa"/>
+              <w:bottom w:w="80" w:type="dxa"/>
+              <w:end w:w="120" w:type="dxa"/>
+            </w:tcMar>
+            <w:vAlign w:val="center"/>
+            <w:shd w:fill="FFFFFF"/>
+          </w:tcPr>
+          <w:p>
+            <w:pPr>
+              <w:spacing w:before="0" w:after="40" w:line="252" w:lineRule="auto"/>
+              <w:jc w:val="left"/>
+            </w:pPr>
+            <w:r>
+              <w:rPr>
+                <w:rFonts w:ascii="Calibri" w:hAnsi="Calibri"/>
+                <w:b w:val="0"/>
+                <w:color w:val="111827"/>
+                <w:sz w:val="16"/>
+              </w:rPr>
+              <w:t>Stable charge-limit reason</w:t>
+            </w:r>
+          </w:p>
+        </w:tc>
+      </w:tr>
+      <w:tr>
+        <w:trPr>
+          <w:cantSplit/>
+        </w:trPr>
+        <w:tc>
+          <w:tcPr>
+            <w:tcW w:type="dxa" w:w="1150"/>
+            <w:tcMar>
+              <w:top w:w="80" w:type="dxa"/>
+              <w:start w:w="120" w:type="dxa"/>
+              <w:bottom w:w="80" w:type="dxa"/>
+              <w:end w:w="120" w:type="dxa"/>
+            </w:tcMar>
+            <w:vAlign w:val="center"/>
+            <w:shd w:fill="FFFFFF"/>
+          </w:tcPr>
+          <w:p>
+            <w:pPr>
+              <w:spacing w:before="0" w:after="40" w:line="252" w:lineRule="auto"/>
+              <w:jc w:val="center"/>
+            </w:pPr>
+            <w:r>
+              <w:rPr>
+                <w:rFonts w:ascii="Calibri" w:hAnsi="Calibri"/>
+                <w:b w:val="0"/>
+                <w:color w:val="111827"/>
+                <w:sz w:val="16"/>
+              </w:rPr>
+              <w:t>EV-T-056</w:t>
+            </w:r>
+          </w:p>
+        </w:tc>
+        <w:tc>
+          <w:tcPr>
+            <w:tcW w:type="dxa" w:w="3700"/>
+            <w:tcMar>
+              <w:top w:w="80" w:type="dxa"/>
+              <w:start w:w="120" w:type="dxa"/>
+              <w:bottom w:w="80" w:type="dxa"/>
+              <w:end w:w="120" w:type="dxa"/>
+            </w:tcMar>
+            <w:vAlign w:val="center"/>
+            <w:shd w:fill="FFFFFF"/>
+          </w:tcPr>
+          <w:p>
+            <w:pPr>
+              <w:spacing w:before="0" w:after="40" w:line="252" w:lineRule="auto"/>
+              <w:jc w:val="left"/>
+            </w:pPr>
+            <w:r>
+              <w:rPr>
+                <w:rFonts w:ascii="Calibri" w:hAnsi="Calibri"/>
+                <w:b w:val="0"/>
+                <w:color w:val="111827"/>
+                <w:sz w:val="16"/>
+              </w:rPr>
+              <w:t>Brake capacity</w:t>
+            </w:r>
+          </w:p>
+        </w:tc>
+        <w:tc>
+          <w:tcPr>
+            <w:tcW w:type="dxa" w:w="3100"/>
+            <w:tcMar>
+              <w:top w:w="80" w:type="dxa"/>
+              <w:start w:w="120" w:type="dxa"/>
+              <w:bottom w:w="80" w:type="dxa"/>
+              <w:end w:w="120" w:type="dxa"/>
+            </w:tcMar>
+            <w:vAlign w:val="center"/>
+            <w:shd w:fill="FFFFFF"/>
+          </w:tcPr>
+          <w:p>
+            <w:pPr>
+              <w:spacing w:before="0" w:after="40" w:line="252" w:lineRule="auto"/>
+              <w:jc w:val="left"/>
+            </w:pPr>
+            <w:r>
+              <w:rPr>
+                <w:rFonts w:ascii="Calibri" w:hAnsi="Calibri"/>
+                <w:b w:val="0"/>
+                <w:color w:val="111827"/>
+                <w:sz w:val="16"/>
+              </w:rPr>
+              <w:t>Exceed combined capacity</w:t>
+            </w:r>
+          </w:p>
+        </w:tc>
+        <w:tc>
+          <w:tcPr>
+            <w:tcW w:type="dxa" w:w="1410"/>
+            <w:tcMar>
+              <w:top w:w="80" w:type="dxa"/>
+              <w:start w:w="120" w:type="dxa"/>
+              <w:bottom w:w="80" w:type="dxa"/>
+              <w:end w:w="120" w:type="dxa"/>
+            </w:tcMar>
+            <w:vAlign w:val="center"/>
+            <w:shd w:fill="FFFFFF"/>
+          </w:tcPr>
+          <w:p>
+            <w:pPr>
+              <w:spacing w:before="0" w:after="40" w:line="252" w:lineRule="auto"/>
+              <w:jc w:val="left"/>
+            </w:pPr>
+            <w:r>
+              <w:rPr>
+                <w:rFonts w:ascii="Calibri" w:hAnsi="Calibri"/>
+                <w:b w:val="0"/>
+                <w:color w:val="111827"/>
+                <w:sz w:val="16"/>
+              </w:rPr>
+              <w:t>Limited delivered deceleration</w:t>
+            </w:r>
+          </w:p>
+        </w:tc>
+      </w:tr>
+      <w:tr>
+        <w:trPr>
+          <w:cantSplit/>
+        </w:trPr>
+        <w:tc>
+          <w:tcPr>
+            <w:tcW w:type="dxa" w:w="1150"/>
+            <w:tcMar>
+              <w:top w:w="80" w:type="dxa"/>
+              <w:start w:w="120" w:type="dxa"/>
+              <w:bottom w:w="80" w:type="dxa"/>
+              <w:end w:w="120" w:type="dxa"/>
+            </w:tcMar>
+            <w:vAlign w:val="center"/>
+            <w:shd w:fill="FFFFFF"/>
+          </w:tcPr>
+          <w:p>
+            <w:pPr>
+              <w:spacing w:before="0" w:after="40" w:line="252" w:lineRule="auto"/>
+              <w:jc w:val="center"/>
+            </w:pPr>
+            <w:r>
+              <w:rPr>
+                <w:rFonts w:ascii="Calibri" w:hAnsi="Calibri"/>
+                <w:b w:val="0"/>
+                <w:color w:val="111827"/>
+                <w:sz w:val="16"/>
+              </w:rPr>
+              <w:t>EV-T-057</w:t>
+            </w:r>
+          </w:p>
+        </w:tc>
+        <w:tc>
+          <w:tcPr>
+            <w:tcW w:type="dxa" w:w="3700"/>
+            <w:tcMar>
+              <w:top w:w="80" w:type="dxa"/>
+              <w:start w:w="120" w:type="dxa"/>
+              <w:bottom w:w="80" w:type="dxa"/>
+              <w:end w:w="120" w:type="dxa"/>
+            </w:tcMar>
+            <w:vAlign w:val="center"/>
+            <w:shd w:fill="FFFFFF"/>
+          </w:tcPr>
+          <w:p>
+            <w:pPr>
+              <w:spacing w:before="0" w:after="40" w:line="252" w:lineRule="auto"/>
+              <w:jc w:val="left"/>
+            </w:pPr>
+            <w:r>
+              <w:rPr>
+                <w:rFonts w:ascii="Calibri" w:hAnsi="Calibri"/>
+                <w:b w:val="0"/>
+                <w:color w:val="111827"/>
+                <w:sz w:val="16"/>
+              </w:rPr>
+              <w:t>Recovered power</w:t>
+            </w:r>
+          </w:p>
+        </w:tc>
+        <w:tc>
+          <w:tcPr>
+            <w:tcW w:type="dxa" w:w="3100"/>
+            <w:tcMar>
+              <w:top w:w="80" w:type="dxa"/>
+              <w:start w:w="120" w:type="dxa"/>
+              <w:bottom w:w="80" w:type="dxa"/>
+              <w:end w:w="120" w:type="dxa"/>
+            </w:tcMar>
+            <w:vAlign w:val="center"/>
+            <w:shd w:fill="FFFFFF"/>
+          </w:tcPr>
+          <w:p>
+            <w:pPr>
+              <w:spacing w:before="0" w:after="40" w:line="252" w:lineRule="auto"/>
+              <w:jc w:val="left"/>
+            </w:pPr>
+            <w:r>
+              <w:rPr>
+                <w:rFonts w:ascii="Calibri" w:hAnsi="Calibri"/>
+                <w:b w:val="0"/>
+                <w:color w:val="111827"/>
+                <w:sz w:val="16"/>
+              </w:rPr>
+              <w:t>Verify force, speed, and efficiency formula</w:t>
+            </w:r>
+          </w:p>
+        </w:tc>
+        <w:tc>
+          <w:tcPr>
+            <w:tcW w:type="dxa" w:w="1410"/>
+            <w:tcMar>
+              <w:top w:w="80" w:type="dxa"/>
+              <w:start w:w="120" w:type="dxa"/>
+              <w:bottom w:w="80" w:type="dxa"/>
+              <w:end w:w="120" w:type="dxa"/>
+            </w:tcMar>
+            <w:vAlign w:val="center"/>
+            <w:shd w:fill="FFFFFF"/>
+          </w:tcPr>
+          <w:p>
+            <w:pPr>
+              <w:spacing w:before="0" w:after="40" w:line="252" w:lineRule="auto"/>
+              <w:jc w:val="left"/>
+            </w:pPr>
+            <w:r>
+              <w:rPr>
+                <w:rFonts w:ascii="Calibri" w:hAnsi="Calibri"/>
+                <w:b w:val="0"/>
+                <w:color w:val="111827"/>
+                <w:sz w:val="16"/>
+              </w:rPr>
+              <w:t>Deterministic electrical power</w:t>
+            </w:r>
+          </w:p>
+        </w:tc>
+      </w:tr>
+      <w:tr>
+        <w:trPr>
+          <w:cantSplit/>
+        </w:trPr>
+        <w:tc>
+          <w:tcPr>
+            <w:tcW w:type="dxa" w:w="1150"/>
+            <w:tcMar>
+              <w:top w:w="80" w:type="dxa"/>
+              <w:start w:w="120" w:type="dxa"/>
+              <w:bottom w:w="80" w:type="dxa"/>
+              <w:end w:w="120" w:type="dxa"/>
+            </w:tcMar>
+            <w:vAlign w:val="center"/>
+            <w:shd w:fill="FFFFFF"/>
+          </w:tcPr>
+          <w:p>
+            <w:pPr>
+              <w:spacing w:before="0" w:after="40" w:line="252" w:lineRule="auto"/>
+              <w:jc w:val="center"/>
+            </w:pPr>
+            <w:r>
+              <w:rPr>
+                <w:rFonts w:ascii="Calibri" w:hAnsi="Calibri"/>
+                <w:b w:val="0"/>
+                <w:color w:val="111827"/>
+                <w:sz w:val="16"/>
+              </w:rPr>
+              <w:t>EV-T-058</w:t>
+            </w:r>
+          </w:p>
+        </w:tc>
+        <w:tc>
+          <w:tcPr>
+            <w:tcW w:type="dxa" w:w="3700"/>
+            <w:tcMar>
+              <w:top w:w="80" w:type="dxa"/>
+              <w:start w:w="120" w:type="dxa"/>
+              <w:bottom w:w="80" w:type="dxa"/>
+              <w:end w:w="120" w:type="dxa"/>
+            </w:tcMar>
+            <w:vAlign w:val="center"/>
+            <w:shd w:fill="FFFFFF"/>
+          </w:tcPr>
+          <w:p>
+            <w:pPr>
+              <w:spacing w:before="0" w:after="40" w:line="252" w:lineRule="auto"/>
+              <w:jc w:val="left"/>
+            </w:pPr>
+            <w:r>
+              <w:rPr>
+                <w:rFonts w:ascii="Calibri" w:hAnsi="Calibri"/>
+                <w:b w:val="0"/>
+                <w:color w:val="111827"/>
+                <w:sz w:val="16"/>
+              </w:rPr>
+              <w:t>Recovered energy and SOC</w:t>
+            </w:r>
+          </w:p>
+        </w:tc>
+        <w:tc>
+          <w:tcPr>
+            <w:tcW w:type="dxa" w:w="3100"/>
+            <w:tcMar>
+              <w:top w:w="80" w:type="dxa"/>
+              <w:start w:w="120" w:type="dxa"/>
+              <w:bottom w:w="80" w:type="dxa"/>
+              <w:end w:w="120" w:type="dxa"/>
+            </w:tcMar>
+            <w:vAlign w:val="center"/>
+            <w:shd w:fill="FFFFFF"/>
+          </w:tcPr>
+          <w:p>
+            <w:pPr>
+              <w:spacing w:before="0" w:after="40" w:line="252" w:lineRule="auto"/>
+              <w:jc w:val="left"/>
+            </w:pPr>
+            <w:r>
+              <w:rPr>
+                <w:rFonts w:ascii="Calibri" w:hAnsi="Calibri"/>
+                <w:b w:val="0"/>
+                <w:color w:val="111827"/>
+                <w:sz w:val="16"/>
+              </w:rPr>
+              <w:t>Integrate a logical step</w:t>
+            </w:r>
+          </w:p>
+        </w:tc>
+        <w:tc>
+          <w:tcPr>
+            <w:tcW w:type="dxa" w:w="1410"/>
+            <w:tcMar>
+              <w:top w:w="80" w:type="dxa"/>
+              <w:start w:w="120" w:type="dxa"/>
+              <w:bottom w:w="80" w:type="dxa"/>
+              <w:end w:w="120" w:type="dxa"/>
+            </w:tcMar>
+            <w:vAlign w:val="center"/>
+            <w:shd w:fill="FFFFFF"/>
+          </w:tcPr>
+          <w:p>
+            <w:pPr>
+              <w:spacing w:before="0" w:after="40" w:line="252" w:lineRule="auto"/>
+              <w:jc w:val="left"/>
+            </w:pPr>
+            <w:r>
+              <w:rPr>
+                <w:rFonts w:ascii="Calibri" w:hAnsi="Calibri"/>
+                <w:b w:val="0"/>
+                <w:color w:val="111827"/>
+                <w:sz w:val="16"/>
+              </w:rPr>
+              <w:t>Energy and SOC increase atomically</w:t>
+            </w:r>
+          </w:p>
+        </w:tc>
+      </w:tr>
+      <w:tr>
+        <w:trPr>
+          <w:cantSplit/>
+        </w:trPr>
+        <w:tc>
+          <w:tcPr>
+            <w:tcW w:type="dxa" w:w="1150"/>
+            <w:tcMar>
+              <w:top w:w="80" w:type="dxa"/>
+              <w:start w:w="120" w:type="dxa"/>
+              <w:bottom w:w="80" w:type="dxa"/>
+              <w:end w:w="120" w:type="dxa"/>
+            </w:tcMar>
+            <w:vAlign w:val="center"/>
+            <w:shd w:fill="FFFFFF"/>
+          </w:tcPr>
+          <w:p>
+            <w:pPr>
+              <w:spacing w:before="0" w:after="40" w:line="252" w:lineRule="auto"/>
+              <w:jc w:val="center"/>
+            </w:pPr>
+            <w:r>
+              <w:rPr>
+                <w:rFonts w:ascii="Calibri" w:hAnsi="Calibri"/>
+                <w:b w:val="0"/>
+                <w:color w:val="111827"/>
+                <w:sz w:val="16"/>
+              </w:rPr>
+              <w:t>EV-T-059</w:t>
+            </w:r>
+          </w:p>
+        </w:tc>
+        <w:tc>
+          <w:tcPr>
+            <w:tcW w:type="dxa" w:w="3700"/>
+            <w:tcMar>
+              <w:top w:w="80" w:type="dxa"/>
+              <w:start w:w="120" w:type="dxa"/>
+              <w:bottom w:w="80" w:type="dxa"/>
+              <w:end w:w="120" w:type="dxa"/>
+            </w:tcMar>
+            <w:vAlign w:val="center"/>
+            <w:shd w:fill="FFFFFF"/>
+          </w:tcPr>
+          <w:p>
+            <w:pPr>
+              <w:spacing w:before="0" w:after="40" w:line="252" w:lineRule="auto"/>
+              <w:jc w:val="left"/>
+            </w:pPr>
+            <w:r>
+              <w:rPr>
+                <w:rFonts w:ascii="Calibri" w:hAnsi="Calibri"/>
+                <w:b w:val="0"/>
+                <w:color w:val="111827"/>
+                <w:sz w:val="16"/>
+              </w:rPr>
+              <w:t>Braking exact replay</w:t>
+            </w:r>
+          </w:p>
+        </w:tc>
+        <w:tc>
+          <w:tcPr>
+            <w:tcW w:type="dxa" w:w="3100"/>
+            <w:tcMar>
+              <w:top w:w="80" w:type="dxa"/>
+              <w:start w:w="120" w:type="dxa"/>
+              <w:bottom w:w="80" w:type="dxa"/>
+              <w:end w:w="120" w:type="dxa"/>
+            </w:tcMar>
+            <w:vAlign w:val="center"/>
+            <w:shd w:fill="FFFFFF"/>
+          </w:tcPr>
+          <w:p>
+            <w:pPr>
+              <w:spacing w:before="0" w:after="40" w:line="252" w:lineRule="auto"/>
+              <w:jc w:val="left"/>
+            </w:pPr>
+            <w:r>
+              <w:rPr>
+                <w:rFonts w:ascii="Calibri" w:hAnsi="Calibri"/>
+                <w:b w:val="0"/>
+                <w:color w:val="111827"/>
+                <w:sz w:val="16"/>
+              </w:rPr>
+              <w:t>Retry identical command</w:t>
+            </w:r>
+          </w:p>
+        </w:tc>
+        <w:tc>
+          <w:tcPr>
+            <w:tcW w:type="dxa" w:w="1410"/>
+            <w:tcMar>
+              <w:top w:w="80" w:type="dxa"/>
+              <w:start w:w="120" w:type="dxa"/>
+              <w:bottom w:w="80" w:type="dxa"/>
+              <w:end w:w="120" w:type="dxa"/>
+            </w:tcMar>
+            <w:vAlign w:val="center"/>
+            <w:shd w:fill="FFFFFF"/>
+          </w:tcPr>
+          <w:p>
+            <w:pPr>
+              <w:spacing w:before="0" w:after="40" w:line="252" w:lineRule="auto"/>
+              <w:jc w:val="left"/>
+            </w:pPr>
+            <w:r>
+              <w:rPr>
+                <w:rFonts w:ascii="Calibri" w:hAnsi="Calibri"/>
+                <w:b w:val="0"/>
+                <w:color w:val="111827"/>
+                <w:sz w:val="16"/>
+              </w:rPr>
+              <w:t>Persisted cross-aggregate snapshot</w:t>
+            </w:r>
+          </w:p>
+        </w:tc>
+      </w:tr>
+      <w:tr>
+        <w:trPr>
+          <w:cantSplit/>
+        </w:trPr>
+        <w:tc>
+          <w:tcPr>
+            <w:tcW w:type="dxa" w:w="1150"/>
+            <w:tcMar>
+              <w:top w:w="80" w:type="dxa"/>
+              <w:start w:w="120" w:type="dxa"/>
+              <w:bottom w:w="80" w:type="dxa"/>
+              <w:end w:w="120" w:type="dxa"/>
+            </w:tcMar>
+            <w:vAlign w:val="center"/>
+            <w:shd w:fill="FFFFFF"/>
+          </w:tcPr>
+          <w:p>
+            <w:pPr>
+              <w:spacing w:before="0" w:after="40" w:line="252" w:lineRule="auto"/>
+              <w:jc w:val="center"/>
+            </w:pPr>
+            <w:r>
+              <w:rPr>
+                <w:rFonts w:ascii="Calibri" w:hAnsi="Calibri"/>
+                <w:b w:val="0"/>
+                <w:color w:val="111827"/>
+                <w:sz w:val="16"/>
+              </w:rPr>
+              <w:t>EV-T-060</w:t>
+            </w:r>
+          </w:p>
+        </w:tc>
+        <w:tc>
+          <w:tcPr>
+            <w:tcW w:type="dxa" w:w="3700"/>
+            <w:tcMar>
+              <w:top w:w="80" w:type="dxa"/>
+              <w:start w:w="120" w:type="dxa"/>
+              <w:bottom w:w="80" w:type="dxa"/>
+              <w:end w:w="120" w:type="dxa"/>
+            </w:tcMar>
+            <w:vAlign w:val="center"/>
+            <w:shd w:fill="FFFFFF"/>
+          </w:tcPr>
+          <w:p>
+            <w:pPr>
+              <w:spacing w:before="0" w:after="40" w:line="252" w:lineRule="auto"/>
+              <w:jc w:val="left"/>
+            </w:pPr>
+            <w:r>
+              <w:rPr>
+                <w:rFonts w:ascii="Calibri" w:hAnsi="Calibri"/>
+                <w:b w:val="0"/>
+                <w:color w:val="111827"/>
+                <w:sz w:val="16"/>
+              </w:rPr>
+              <w:t>Braking changed reuse</w:t>
+            </w:r>
+          </w:p>
+        </w:tc>
+        <w:tc>
+          <w:tcPr>
+            <w:tcW w:type="dxa" w:w="3100"/>
+            <w:tcMar>
+              <w:top w:w="80" w:type="dxa"/>
+              <w:start w:w="120" w:type="dxa"/>
+              <w:bottom w:w="80" w:type="dxa"/>
+              <w:end w:w="120" w:type="dxa"/>
+            </w:tcMar>
+            <w:vAlign w:val="center"/>
+            <w:shd w:fill="FFFFFF"/>
+          </w:tcPr>
+          <w:p>
+            <w:pPr>
+              <w:spacing w:before="0" w:after="40" w:line="252" w:lineRule="auto"/>
+              <w:jc w:val="left"/>
+            </w:pPr>
+            <w:r>
+              <w:rPr>
+                <w:rFonts w:ascii="Calibri" w:hAnsi="Calibri"/>
+                <w:b w:val="0"/>
+                <w:color w:val="111827"/>
+                <w:sz w:val="16"/>
+              </w:rPr>
+              <w:t>Reuse ID with changed input</w:t>
+            </w:r>
+          </w:p>
+        </w:tc>
+        <w:tc>
+          <w:tcPr>
+            <w:tcW w:type="dxa" w:w="1410"/>
+            <w:tcMar>
+              <w:top w:w="80" w:type="dxa"/>
+              <w:start w:w="120" w:type="dxa"/>
+              <w:bottom w:w="80" w:type="dxa"/>
+              <w:end w:w="120" w:type="dxa"/>
+            </w:tcMar>
+            <w:vAlign w:val="center"/>
+            <w:shd w:fill="FFFFFF"/>
+          </w:tcPr>
+          <w:p>
+            <w:pPr>
+              <w:spacing w:before="0" w:after="40" w:line="252" w:lineRule="auto"/>
+              <w:jc w:val="left"/>
+            </w:pPr>
+            <w:r>
+              <w:rPr>
+                <w:rFonts w:ascii="Calibri" w:hAnsi="Calibri"/>
+                <w:b w:val="0"/>
+                <w:color w:val="111827"/>
+                <w:sz w:val="16"/>
+              </w:rPr>
+              <w:t>Stable command conflict</w:t>
+            </w:r>
+          </w:p>
+        </w:tc>
+      </w:tr>
+      <w:tr>
+        <w:trPr>
+          <w:cantSplit/>
+        </w:trPr>
+        <w:tc>
+          <w:tcPr>
+            <w:tcW w:type="dxa" w:w="1150"/>
+            <w:tcMar>
+              <w:top w:w="80" w:type="dxa"/>
+              <w:start w:w="120" w:type="dxa"/>
+              <w:bottom w:w="80" w:type="dxa"/>
+              <w:end w:w="120" w:type="dxa"/>
+            </w:tcMar>
+            <w:vAlign w:val="center"/>
+            <w:shd w:fill="FFFFFF"/>
+          </w:tcPr>
+          <w:p>
+            <w:pPr>
+              <w:spacing w:before="0" w:after="40" w:line="252" w:lineRule="auto"/>
+              <w:jc w:val="center"/>
+            </w:pPr>
+            <w:r>
+              <w:rPr>
+                <w:rFonts w:ascii="Calibri" w:hAnsi="Calibri"/>
+                <w:b w:val="0"/>
+                <w:color w:val="111827"/>
+                <w:sz w:val="16"/>
+              </w:rPr>
+              <w:t>EV-T-061</w:t>
+            </w:r>
+          </w:p>
+        </w:tc>
+        <w:tc>
+          <w:tcPr>
+            <w:tcW w:type="dxa" w:w="3700"/>
+            <w:tcMar>
+              <w:top w:w="80" w:type="dxa"/>
+              <w:start w:w="120" w:type="dxa"/>
+              <w:bottom w:w="80" w:type="dxa"/>
+              <w:end w:w="120" w:type="dxa"/>
+            </w:tcMar>
+            <w:vAlign w:val="center"/>
+            <w:shd w:fill="FFFFFF"/>
+          </w:tcPr>
+          <w:p>
+            <w:pPr>
+              <w:spacing w:before="0" w:after="40" w:line="252" w:lineRule="auto"/>
+              <w:jc w:val="left"/>
+            </w:pPr>
+            <w:r>
+              <w:rPr>
+                <w:rFonts w:ascii="Calibri" w:hAnsi="Calibri"/>
+                <w:b w:val="0"/>
+                <w:color w:val="111827"/>
+                <w:sz w:val="16"/>
+              </w:rPr>
+              <w:t>Braking version conflict</w:t>
+            </w:r>
+          </w:p>
+        </w:tc>
+        <w:tc>
+          <w:tcPr>
+            <w:tcW w:type="dxa" w:w="3100"/>
+            <w:tcMar>
+              <w:top w:w="80" w:type="dxa"/>
+              <w:start w:w="120" w:type="dxa"/>
+              <w:bottom w:w="80" w:type="dxa"/>
+              <w:end w:w="120" w:type="dxa"/>
+            </w:tcMar>
+            <w:vAlign w:val="center"/>
+            <w:shd w:fill="FFFFFF"/>
+          </w:tcPr>
+          <w:p>
+            <w:pPr>
+              <w:spacing w:before="0" w:after="40" w:line="252" w:lineRule="auto"/>
+              <w:jc w:val="left"/>
+            </w:pPr>
+            <w:r>
+              <w:rPr>
+                <w:rFonts w:ascii="Calibri" w:hAnsi="Calibri"/>
+                <w:b w:val="0"/>
+                <w:color w:val="111827"/>
+                <w:sz w:val="16"/>
+              </w:rPr>
+              <w:t>Submit stale braking version</w:t>
+            </w:r>
+          </w:p>
+        </w:tc>
+        <w:tc>
+          <w:tcPr>
+            <w:tcW w:type="dxa" w:w="1410"/>
+            <w:tcMar>
+              <w:top w:w="80" w:type="dxa"/>
+              <w:start w:w="120" w:type="dxa"/>
+              <w:bottom w:w="80" w:type="dxa"/>
+              <w:end w:w="120" w:type="dxa"/>
+            </w:tcMar>
+            <w:vAlign w:val="center"/>
+            <w:shd w:fill="FFFFFF"/>
+          </w:tcPr>
+          <w:p>
+            <w:pPr>
+              <w:spacing w:before="0" w:after="40" w:line="252" w:lineRule="auto"/>
+              <w:jc w:val="left"/>
+            </w:pPr>
+            <w:r>
+              <w:rPr>
+                <w:rFonts w:ascii="Calibri" w:hAnsi="Calibri"/>
+                <w:b w:val="0"/>
+                <w:color w:val="111827"/>
+                <w:sz w:val="16"/>
+              </w:rPr>
+              <w:t>Current version returned</w:t>
+            </w:r>
+          </w:p>
+        </w:tc>
+      </w:tr>
+      <w:tr>
+        <w:trPr>
+          <w:cantSplit/>
+        </w:trPr>
+        <w:tc>
+          <w:tcPr>
+            <w:tcW w:type="dxa" w:w="1150"/>
+            <w:tcMar>
+              <w:top w:w="80" w:type="dxa"/>
+              <w:start w:w="120" w:type="dxa"/>
+              <w:bottom w:w="80" w:type="dxa"/>
+              <w:end w:w="120" w:type="dxa"/>
+            </w:tcMar>
+            <w:vAlign w:val="center"/>
+            <w:shd w:fill="FFFFFF"/>
+          </w:tcPr>
+          <w:p>
+            <w:pPr>
+              <w:spacing w:before="0" w:after="40" w:line="252" w:lineRule="auto"/>
+              <w:jc w:val="center"/>
+            </w:pPr>
+            <w:r>
+              <w:rPr>
+                <w:rFonts w:ascii="Calibri" w:hAnsi="Calibri"/>
+                <w:b w:val="0"/>
+                <w:color w:val="111827"/>
+                <w:sz w:val="16"/>
+              </w:rPr>
+              <w:t>EV-T-062</w:t>
+            </w:r>
+          </w:p>
+        </w:tc>
+        <w:tc>
+          <w:tcPr>
+            <w:tcW w:type="dxa" w:w="3700"/>
+            <w:tcMar>
+              <w:top w:w="80" w:type="dxa"/>
+              <w:start w:w="120" w:type="dxa"/>
+              <w:bottom w:w="80" w:type="dxa"/>
+              <w:end w:w="120" w:type="dxa"/>
+            </w:tcMar>
+            <w:vAlign w:val="center"/>
+            <w:shd w:fill="FFFFFF"/>
+          </w:tcPr>
+          <w:p>
+            <w:pPr>
+              <w:spacing w:before="0" w:after="40" w:line="252" w:lineRule="auto"/>
+              <w:jc w:val="left"/>
+            </w:pPr>
+            <w:r>
+              <w:rPr>
+                <w:rFonts w:ascii="Calibri" w:hAnsi="Calibri"/>
+                <w:b w:val="0"/>
+                <w:color w:val="111827"/>
+                <w:sz w:val="16"/>
+              </w:rPr>
+              <w:t>Battery version conflict</w:t>
+            </w:r>
+          </w:p>
+        </w:tc>
+        <w:tc>
+          <w:tcPr>
+            <w:tcW w:type="dxa" w:w="3100"/>
+            <w:tcMar>
+              <w:top w:w="80" w:type="dxa"/>
+              <w:start w:w="120" w:type="dxa"/>
+              <w:bottom w:w="80" w:type="dxa"/>
+              <w:end w:w="120" w:type="dxa"/>
+            </w:tcMar>
+            <w:vAlign w:val="center"/>
+            <w:shd w:fill="FFFFFF"/>
+          </w:tcPr>
+          <w:p>
+            <w:pPr>
+              <w:spacing w:before="0" w:after="40" w:line="252" w:lineRule="auto"/>
+              <w:jc w:val="left"/>
+            </w:pPr>
+            <w:r>
+              <w:rPr>
+                <w:rFonts w:ascii="Calibri" w:hAnsi="Calibri"/>
+                <w:b w:val="0"/>
+                <w:color w:val="111827"/>
+                <w:sz w:val="16"/>
+              </w:rPr>
+              <w:t>Submit stale battery version</w:t>
+            </w:r>
+          </w:p>
+        </w:tc>
+        <w:tc>
+          <w:tcPr>
+            <w:tcW w:type="dxa" w:w="1410"/>
+            <w:tcMar>
+              <w:top w:w="80" w:type="dxa"/>
+              <w:start w:w="120" w:type="dxa"/>
+              <w:bottom w:w="80" w:type="dxa"/>
+              <w:end w:w="120" w:type="dxa"/>
+            </w:tcMar>
+            <w:vAlign w:val="center"/>
+            <w:shd w:fill="FFFFFF"/>
+          </w:tcPr>
+          <w:p>
+            <w:pPr>
+              <w:spacing w:before="0" w:after="40" w:line="252" w:lineRule="auto"/>
+              <w:jc w:val="left"/>
+            </w:pPr>
+            <w:r>
+              <w:rPr>
+                <w:rFonts w:ascii="Calibri" w:hAnsi="Calibri"/>
+                <w:b w:val="0"/>
+                <w:color w:val="111827"/>
+                <w:sz w:val="16"/>
+              </w:rPr>
+              <w:t>Current battery version returned</w:t>
+            </w:r>
+          </w:p>
+        </w:tc>
+      </w:tr>
+      <w:tr>
+        <w:trPr>
+          <w:cantSplit/>
+        </w:trPr>
+        <w:tc>
+          <w:tcPr>
+            <w:tcW w:type="dxa" w:w="1150"/>
+            <w:tcMar>
+              <w:top w:w="80" w:type="dxa"/>
+              <w:start w:w="120" w:type="dxa"/>
+              <w:bottom w:w="80" w:type="dxa"/>
+              <w:end w:w="120" w:type="dxa"/>
+            </w:tcMar>
+            <w:vAlign w:val="center"/>
+            <w:shd w:fill="FFFFFF"/>
+          </w:tcPr>
+          <w:p>
+            <w:pPr>
+              <w:spacing w:before="0" w:after="40" w:line="252" w:lineRule="auto"/>
+              <w:jc w:val="center"/>
+            </w:pPr>
+            <w:r>
+              <w:rPr>
+                <w:rFonts w:ascii="Calibri" w:hAnsi="Calibri"/>
+                <w:b w:val="0"/>
+                <w:color w:val="111827"/>
+                <w:sz w:val="16"/>
+              </w:rPr>
+              <w:t>EV-T-063</w:t>
+            </w:r>
+          </w:p>
+        </w:tc>
+        <w:tc>
+          <w:tcPr>
+            <w:tcW w:type="dxa" w:w="3700"/>
+            <w:tcMar>
+              <w:top w:w="80" w:type="dxa"/>
+              <w:start w:w="120" w:type="dxa"/>
+              <w:bottom w:w="80" w:type="dxa"/>
+              <w:end w:w="120" w:type="dxa"/>
+            </w:tcMar>
+            <w:vAlign w:val="center"/>
+            <w:shd w:fill="FFFFFF"/>
+          </w:tcPr>
+          <w:p>
+            <w:pPr>
+              <w:spacing w:before="0" w:after="40" w:line="252" w:lineRule="auto"/>
+              <w:jc w:val="left"/>
+            </w:pPr>
+            <w:r>
+              <w:rPr>
+                <w:rFonts w:ascii="Calibri" w:hAnsi="Calibri"/>
+                <w:b w:val="0"/>
+                <w:color w:val="111827"/>
+                <w:sz w:val="16"/>
+              </w:rPr>
+              <w:t>Braking atomic evidence</w:t>
+            </w:r>
+          </w:p>
+        </w:tc>
+        <w:tc>
+          <w:tcPr>
+            <w:tcW w:type="dxa" w:w="3100"/>
+            <w:tcMar>
+              <w:top w:w="80" w:type="dxa"/>
+              <w:start w:w="120" w:type="dxa"/>
+              <w:bottom w:w="80" w:type="dxa"/>
+              <w:end w:w="120" w:type="dxa"/>
+            </w:tcMar>
+            <w:vAlign w:val="center"/>
+            <w:shd w:fill="FFFFFF"/>
+          </w:tcPr>
+          <w:p>
+            <w:pPr>
+              <w:spacing w:before="0" w:after="40" w:line="252" w:lineRule="auto"/>
+              <w:jc w:val="left"/>
+            </w:pPr>
+            <w:r>
+              <w:rPr>
+                <w:rFonts w:ascii="Calibri" w:hAnsi="Calibri"/>
+                <w:b w:val="0"/>
+                <w:color w:val="111827"/>
+                <w:sz w:val="16"/>
+              </w:rPr>
+              <w:t>Inspect state, battery, step, audit, outbox</w:t>
+            </w:r>
+          </w:p>
+        </w:tc>
+        <w:tc>
+          <w:tcPr>
+            <w:tcW w:type="dxa" w:w="1410"/>
+            <w:tcMar>
+              <w:top w:w="80" w:type="dxa"/>
+              <w:start w:w="120" w:type="dxa"/>
+              <w:bottom w:w="80" w:type="dxa"/>
+              <w:end w:w="120" w:type="dxa"/>
+            </w:tcMar>
+            <w:vAlign w:val="center"/>
+            <w:shd w:fill="FFFFFF"/>
+          </w:tcPr>
+          <w:p>
+            <w:pPr>
+              <w:spacing w:before="0" w:after="40" w:line="252" w:lineRule="auto"/>
+              <w:jc w:val="left"/>
+            </w:pPr>
+            <w:r>
+              <w:rPr>
+                <w:rFonts w:ascii="Calibri" w:hAnsi="Calibri"/>
+                <w:b w:val="0"/>
+                <w:color w:val="111827"/>
+                <w:sz w:val="16"/>
+              </w:rPr>
+              <w:t>All commit or all roll back</w:t>
+            </w:r>
+          </w:p>
+        </w:tc>
+      </w:tr>
+      <w:tr>
+        <w:trPr>
+          <w:cantSplit/>
+        </w:trPr>
+        <w:tc>
+          <w:tcPr>
+            <w:tcW w:type="dxa" w:w="1150"/>
+            <w:tcMar>
+              <w:top w:w="80" w:type="dxa"/>
+              <w:start w:w="120" w:type="dxa"/>
+              <w:bottom w:w="80" w:type="dxa"/>
+              <w:end w:w="120" w:type="dxa"/>
+            </w:tcMar>
+            <w:vAlign w:val="center"/>
+            <w:shd w:fill="FFFFFF"/>
+          </w:tcPr>
+          <w:p>
+            <w:pPr>
+              <w:spacing w:before="0" w:after="40" w:line="252" w:lineRule="auto"/>
+              <w:jc w:val="center"/>
+            </w:pPr>
+            <w:r>
+              <w:rPr>
+                <w:rFonts w:ascii="Calibri" w:hAnsi="Calibri"/>
+                <w:b w:val="0"/>
+                <w:color w:val="111827"/>
+                <w:sz w:val="16"/>
+              </w:rPr>
+              <w:t>EV-T-064</w:t>
+            </w:r>
+          </w:p>
+        </w:tc>
+        <w:tc>
+          <w:tcPr>
+            <w:tcW w:type="dxa" w:w="3700"/>
+            <w:tcMar>
+              <w:top w:w="80" w:type="dxa"/>
+              <w:start w:w="120" w:type="dxa"/>
+              <w:bottom w:w="80" w:type="dxa"/>
+              <w:end w:w="120" w:type="dxa"/>
+            </w:tcMar>
+            <w:vAlign w:val="center"/>
+            <w:shd w:fill="FFFFFF"/>
+          </w:tcPr>
+          <w:p>
+            <w:pPr>
+              <w:spacing w:before="0" w:after="40" w:line="252" w:lineRule="auto"/>
+              <w:jc w:val="left"/>
+            </w:pPr>
+            <w:r>
+              <w:rPr>
+                <w:rFonts w:ascii="Calibri" w:hAnsi="Calibri"/>
+                <w:b w:val="0"/>
+                <w:color w:val="111827"/>
+                <w:sz w:val="16"/>
+              </w:rPr>
+              <w:t>Braking OpenAPI</w:t>
+            </w:r>
+          </w:p>
+        </w:tc>
+        <w:tc>
+          <w:tcPr>
+            <w:tcW w:type="dxa" w:w="3100"/>
+            <w:tcMar>
+              <w:top w:w="80" w:type="dxa"/>
+              <w:start w:w="120" w:type="dxa"/>
+              <w:bottom w:w="80" w:type="dxa"/>
+              <w:end w:w="120" w:type="dxa"/>
+            </w:tcMar>
+            <w:vAlign w:val="center"/>
+            <w:shd w:fill="FFFFFF"/>
+          </w:tcPr>
+          <w:p>
+            <w:pPr>
+              <w:spacing w:before="0" w:after="40" w:line="252" w:lineRule="auto"/>
+              <w:jc w:val="left"/>
+            </w:pPr>
+            <w:r>
+              <w:rPr>
+                <w:rFonts w:ascii="Calibri" w:hAnsi="Calibri"/>
+                <w:b w:val="0"/>
+                <w:color w:val="111827"/>
+                <w:sz w:val="16"/>
+              </w:rPr>
+              <w:t>Inspect routes and numeric bounds</w:t>
+            </w:r>
+          </w:p>
+        </w:tc>
+        <w:tc>
+          <w:tcPr>
+            <w:tcW w:type="dxa" w:w="1410"/>
+            <w:tcMar>
+              <w:top w:w="80" w:type="dxa"/>
+              <w:start w:w="120" w:type="dxa"/>
+              <w:bottom w:w="80" w:type="dxa"/>
+              <w:end w:w="120" w:type="dxa"/>
+            </w:tcMar>
+            <w:vAlign w:val="center"/>
+            <w:shd w:fill="FFFFFF"/>
+          </w:tcPr>
+          <w:p>
+            <w:pPr>
+              <w:spacing w:before="0" w:after="40" w:line="252" w:lineRule="auto"/>
+              <w:jc w:val="left"/>
+            </w:pPr>
+            <w:r>
+              <w:rPr>
+                <w:rFonts w:ascii="Calibri" w:hAnsi="Calibri"/>
+                <w:b w:val="0"/>
+                <w:color w:val="111827"/>
+                <w:sz w:val="16"/>
+              </w:rPr>
+              <w:t>Bounded schema published</w:t>
+            </w:r>
+          </w:p>
+        </w:tc>
+      </w:tr>
+      <w:tr>
+        <w:trPr>
+          <w:cantSplit/>
+        </w:trPr>
+        <w:tc>
+          <w:tcPr>
+            <w:tcW w:type="dxa" w:w="1150"/>
+            <w:tcMar>
+              <w:top w:w="80" w:type="dxa"/>
+              <w:start w:w="120" w:type="dxa"/>
+              <w:bottom w:w="80" w:type="dxa"/>
+              <w:end w:w="120" w:type="dxa"/>
+            </w:tcMar>
+            <w:vAlign w:val="center"/>
+            <w:shd w:fill="FFFFFF"/>
+          </w:tcPr>
+          <w:p>
+            <w:pPr>
+              <w:spacing w:before="0" w:after="40" w:line="252" w:lineRule="auto"/>
+              <w:jc w:val="center"/>
+            </w:pPr>
+            <w:r>
+              <w:rPr>
+                <w:rFonts w:ascii="Calibri" w:hAnsi="Calibri"/>
+                <w:b w:val="0"/>
+                <w:color w:val="111827"/>
+                <w:sz w:val="16"/>
+              </w:rPr>
+              <w:t>EV-T-065</w:t>
+            </w:r>
+          </w:p>
+        </w:tc>
+        <w:tc>
+          <w:tcPr>
+            <w:tcW w:type="dxa" w:w="3700"/>
+            <w:tcMar>
+              <w:top w:w="80" w:type="dxa"/>
+              <w:start w:w="120" w:type="dxa"/>
+              <w:bottom w:w="80" w:type="dxa"/>
+              <w:end w:w="120" w:type="dxa"/>
+            </w:tcMar>
+            <w:vAlign w:val="center"/>
+            <w:shd w:fill="FFFFFF"/>
+          </w:tcPr>
+          <w:p>
+            <w:pPr>
+              <w:spacing w:before="0" w:after="40" w:line="252" w:lineRule="auto"/>
+              <w:jc w:val="left"/>
+            </w:pPr>
+            <w:r>
+              <w:rPr>
+                <w:rFonts w:ascii="Calibri" w:hAnsi="Calibri"/>
+                <w:b w:val="0"/>
+                <w:color w:val="111827"/>
+                <w:sz w:val="16"/>
+              </w:rPr>
+              <w:t>Migration 0039</w:t>
+            </w:r>
+          </w:p>
+        </w:tc>
+        <w:tc>
+          <w:tcPr>
+            <w:tcW w:type="dxa" w:w="3100"/>
+            <w:tcMar>
+              <w:top w:w="80" w:type="dxa"/>
+              <w:start w:w="120" w:type="dxa"/>
+              <w:bottom w:w="80" w:type="dxa"/>
+              <w:end w:w="120" w:type="dxa"/>
+            </w:tcMar>
+            <w:vAlign w:val="center"/>
+            <w:shd w:fill="FFFFFF"/>
+          </w:tcPr>
+          <w:p>
+            <w:pPr>
+              <w:spacing w:before="0" w:after="40" w:line="252" w:lineRule="auto"/>
+              <w:jc w:val="left"/>
+            </w:pPr>
+            <w:r>
+              <w:rPr>
+                <w:rFonts w:ascii="Calibri" w:hAnsi="Calibri"/>
+                <w:b w:val="0"/>
+                <w:color w:val="111827"/>
+                <w:sz w:val="16"/>
+              </w:rPr>
+              <w:t>Upgrade and downgrade disposable DB</w:t>
+            </w:r>
+          </w:p>
+        </w:tc>
+        <w:tc>
+          <w:tcPr>
+            <w:tcW w:type="dxa" w:w="1410"/>
+            <w:tcMar>
+              <w:top w:w="80" w:type="dxa"/>
+              <w:start w:w="120" w:type="dxa"/>
+              <w:bottom w:w="80" w:type="dxa"/>
+              <w:end w:w="120" w:type="dxa"/>
+            </w:tcMar>
+            <w:vAlign w:val="center"/>
+            <w:shd w:fill="FFFFFF"/>
+          </w:tcPr>
+          <w:p>
+            <w:pPr>
+              <w:spacing w:before="0" w:after="40" w:line="252" w:lineRule="auto"/>
+              <w:jc w:val="left"/>
+            </w:pPr>
+            <w:r>
+              <w:rPr>
+                <w:rFonts w:ascii="Calibri" w:hAnsi="Calibri"/>
+                <w:b w:val="0"/>
+                <w:color w:val="111827"/>
+                <w:sz w:val="16"/>
+              </w:rPr>
+              <w:t>Tables created and removed cleanly</w:t>
+            </w:r>
+          </w:p>
+        </w:tc>
+      </w:tr>
+      <w:tr>
+        <w:trPr>
+          <w:cantSplit/>
+        </w:trPr>
+        <w:tc>
+          <w:tcPr>
+            <w:tcW w:type="dxa" w:w="1150"/>
+            <w:tcMar>
+              <w:top w:w="80" w:type="dxa"/>
+              <w:start w:w="120" w:type="dxa"/>
+              <w:bottom w:w="80" w:type="dxa"/>
+              <w:end w:w="120" w:type="dxa"/>
+            </w:tcMar>
+            <w:vAlign w:val="center"/>
+            <w:shd w:fill="FFFFFF"/>
+          </w:tcPr>
+          <w:p>
+            <w:pPr>
+              <w:spacing w:before="0" w:after="40" w:line="252" w:lineRule="auto"/>
+              <w:jc w:val="center"/>
+            </w:pPr>
+            <w:r>
+              <w:rPr>
+                <w:rFonts w:ascii="Calibri" w:hAnsi="Calibri"/>
+                <w:b w:val="0"/>
+                <w:color w:val="111827"/>
+                <w:sz w:val="16"/>
+              </w:rPr>
+              <w:t>EV-T-066</w:t>
+            </w:r>
+          </w:p>
+        </w:tc>
+        <w:tc>
+          <w:tcPr>
+            <w:tcW w:type="dxa" w:w="3700"/>
+            <w:tcMar>
+              <w:top w:w="80" w:type="dxa"/>
+              <w:start w:w="120" w:type="dxa"/>
+              <w:bottom w:w="80" w:type="dxa"/>
+              <w:end w:w="120" w:type="dxa"/>
+            </w:tcMar>
+            <w:vAlign w:val="center"/>
+            <w:shd w:fill="FFFFFF"/>
+          </w:tcPr>
+          <w:p>
+            <w:pPr>
+              <w:spacing w:before="0" w:after="40" w:line="252" w:lineRule="auto"/>
+              <w:jc w:val="left"/>
+            </w:pPr>
+            <w:r>
+              <w:rPr>
+                <w:rFonts w:ascii="Calibri" w:hAnsi="Calibri"/>
+                <w:b w:val="0"/>
+                <w:color w:val="111827"/>
+                <w:sz w:val="16"/>
+              </w:rPr>
+              <w:t>Long-step SOC ceiling</w:t>
+            </w:r>
+          </w:p>
+        </w:tc>
+        <w:tc>
+          <w:tcPr>
+            <w:tcW w:type="dxa" w:w="3100"/>
+            <w:tcMar>
+              <w:top w:w="80" w:type="dxa"/>
+              <w:start w:w="120" w:type="dxa"/>
+              <w:bottom w:w="80" w:type="dxa"/>
+              <w:end w:w="120" w:type="dxa"/>
+            </w:tcMar>
+            <w:vAlign w:val="center"/>
+            <w:shd w:fill="FFFFFF"/>
+          </w:tcPr>
+          <w:p>
+            <w:pPr>
+              <w:spacing w:before="0" w:after="40" w:line="252" w:lineRule="auto"/>
+              <w:jc w:val="left"/>
+            </w:pPr>
+            <w:r>
+              <w:rPr>
+                <w:rFonts w:ascii="Calibri" w:hAnsi="Calibri"/>
+                <w:b w:val="0"/>
+                <w:color w:val="111827"/>
+                <w:sz w:val="16"/>
+              </w:rPr>
+              <w:t>Recover energy near 95% SOC for one hour</w:t>
+            </w:r>
+          </w:p>
+        </w:tc>
+        <w:tc>
+          <w:tcPr>
+            <w:tcW w:type="dxa" w:w="1410"/>
+            <w:tcMar>
+              <w:top w:w="80" w:type="dxa"/>
+              <w:start w:w="120" w:type="dxa"/>
+              <w:bottom w:w="80" w:type="dxa"/>
+              <w:end w:w="120" w:type="dxa"/>
+            </w:tcMar>
+            <w:vAlign w:val="center"/>
+            <w:shd w:fill="FFFFFF"/>
+          </w:tcPr>
+          <w:p>
+            <w:pPr>
+              <w:spacing w:before="0" w:after="40" w:line="252" w:lineRule="auto"/>
+              <w:jc w:val="left"/>
+            </w:pPr>
+            <w:r>
+              <w:rPr>
+                <w:rFonts w:ascii="Calibri" w:hAnsi="Calibri"/>
+                <w:b w:val="0"/>
+                <w:color w:val="111827"/>
+                <w:sz w:val="16"/>
+              </w:rPr>
+              <w:t>SOC stops at 95% and friction supplies the remainder</w:t>
             </w:r>
           </w:p>
         </w:tc>
@@ -11456,7 +15298,7 @@
                 <w:color w:val="0B2545"/>
                 <w:sz w:val="17"/>
               </w:rPr>
-              <w:t>VI-1 and VI-2 evidence</w:t>
+              <w:t>VI-1 through VI-3 evidence</w:t>
             </w:r>
           </w:p>
         </w:tc>
@@ -11517,7 +15359,7 @@
                 <w:color w:val="111827"/>
                 <w:sz w:val="17"/>
               </w:rPr>
-              <w:t>Battery/BMS plus motor torque, power, efficiency, limits, thermal protection, replay, conflicts</w:t>
+              <w:t>Battery/BMS, propulsion, regenerative allocation, friction fallback, energy recovery, replay, conflicts</w:t>
             </w:r>
           </w:p>
         </w:tc>
@@ -12816,6 +16658,273 @@
           </w:p>
         </w:tc>
       </w:tr>
+      <w:tr>
+        <w:trPr>
+          <w:cantSplit/>
+        </w:trPr>
+        <w:tc>
+          <w:tcPr>
+            <w:tcW w:type="dxa" w:w="1650"/>
+            <w:tcMar>
+              <w:top w:w="80" w:type="dxa"/>
+              <w:start w:w="120" w:type="dxa"/>
+              <w:bottom w:w="80" w:type="dxa"/>
+              <w:end w:w="120" w:type="dxa"/>
+            </w:tcMar>
+            <w:vAlign w:val="center"/>
+            <w:shd w:fill="FFFFFF"/>
+          </w:tcPr>
+          <w:p>
+            <w:pPr>
+              <w:spacing w:before="0" w:after="40" w:line="252" w:lineRule="auto"/>
+              <w:jc w:val="center"/>
+            </w:pPr>
+            <w:r>
+              <w:rPr>
+                <w:rFonts w:ascii="Calibri" w:hAnsi="Calibri"/>
+                <w:b w:val="0"/>
+                <w:color w:val="111827"/>
+                <w:sz w:val="17"/>
+              </w:rPr>
+              <w:t>Quasi-static braking step</w:t>
+            </w:r>
+          </w:p>
+        </w:tc>
+        <w:tc>
+          <w:tcPr>
+            <w:tcW w:type="dxa" w:w="4450"/>
+            <w:tcMar>
+              <w:top w:w="80" w:type="dxa"/>
+              <w:start w:w="120" w:type="dxa"/>
+              <w:bottom w:w="80" w:type="dxa"/>
+              <w:end w:w="120" w:type="dxa"/>
+            </w:tcMar>
+            <w:vAlign w:val="center"/>
+            <w:shd w:fill="FFFFFF"/>
+          </w:tcPr>
+          <w:p>
+            <w:pPr>
+              <w:spacing w:before="0" w:after="40" w:line="252" w:lineRule="auto"/>
+              <w:jc w:val="left"/>
+            </w:pPr>
+            <w:r>
+              <w:rPr>
+                <w:rFonts w:ascii="Calibri" w:hAnsi="Calibri"/>
+                <w:b w:val="0"/>
+                <w:color w:val="111827"/>
+                <w:sz w:val="17"/>
+              </w:rPr>
+              <w:t>Vehicle speed is not integrated over time</w:t>
+            </w:r>
+          </w:p>
+        </w:tc>
+        <w:tc>
+          <w:tcPr>
+            <w:tcW w:type="dxa" w:w="3260"/>
+            <w:tcMar>
+              <w:top w:w="80" w:type="dxa"/>
+              <w:start w:w="120" w:type="dxa"/>
+              <w:bottom w:w="80" w:type="dxa"/>
+              <w:end w:w="120" w:type="dxa"/>
+            </w:tcMar>
+            <w:vAlign w:val="center"/>
+            <w:shd w:fill="FFFFFF"/>
+          </w:tcPr>
+          <w:p>
+            <w:pPr>
+              <w:spacing w:before="0" w:after="40" w:line="252" w:lineRule="auto"/>
+              <w:jc w:val="left"/>
+            </w:pPr>
+            <w:r>
+              <w:rPr>
+                <w:rFonts w:ascii="Calibri" w:hAnsi="Calibri"/>
+                <w:b w:val="0"/>
+                <w:color w:val="111827"/>
+                <w:sz w:val="17"/>
+              </w:rPr>
+              <w:t>Couple braking to Volume II dynamics in VI-7</w:t>
+            </w:r>
+          </w:p>
+        </w:tc>
+      </w:tr>
+      <w:tr>
+        <w:trPr>
+          <w:cantSplit/>
+        </w:trPr>
+        <w:tc>
+          <w:tcPr>
+            <w:tcW w:type="dxa" w:w="1650"/>
+            <w:tcMar>
+              <w:top w:w="80" w:type="dxa"/>
+              <w:start w:w="120" w:type="dxa"/>
+              <w:bottom w:w="80" w:type="dxa"/>
+              <w:end w:w="120" w:type="dxa"/>
+            </w:tcMar>
+            <w:vAlign w:val="center"/>
+            <w:shd w:fill="FFFFFF"/>
+          </w:tcPr>
+          <w:p>
+            <w:pPr>
+              <w:spacing w:before="0" w:after="40" w:line="252" w:lineRule="auto"/>
+              <w:jc w:val="center"/>
+            </w:pPr>
+            <w:r>
+              <w:rPr>
+                <w:rFonts w:ascii="Calibri" w:hAnsi="Calibri"/>
+                <w:b w:val="0"/>
+                <w:color w:val="111827"/>
+                <w:sz w:val="17"/>
+              </w:rPr>
+              <w:t>Simplified charge acceptance</w:t>
+            </w:r>
+          </w:p>
+        </w:tc>
+        <w:tc>
+          <w:tcPr>
+            <w:tcW w:type="dxa" w:w="4450"/>
+            <w:tcMar>
+              <w:top w:w="80" w:type="dxa"/>
+              <w:start w:w="120" w:type="dxa"/>
+              <w:bottom w:w="80" w:type="dxa"/>
+              <w:end w:w="120" w:type="dxa"/>
+            </w:tcMar>
+            <w:vAlign w:val="center"/>
+            <w:shd w:fill="FFFFFF"/>
+          </w:tcPr>
+          <w:p>
+            <w:pPr>
+              <w:spacing w:before="0" w:after="40" w:line="252" w:lineRule="auto"/>
+              <w:jc w:val="left"/>
+            </w:pPr>
+            <w:r>
+              <w:rPr>
+                <w:rFonts w:ascii="Calibri" w:hAnsi="Calibri"/>
+                <w:b w:val="0"/>
+                <w:color w:val="111827"/>
+                <w:sz w:val="17"/>
+              </w:rPr>
+              <w:t>Cannot represent chemistry-specific power maps</w:t>
+            </w:r>
+          </w:p>
+        </w:tc>
+        <w:tc>
+          <w:tcPr>
+            <w:tcW w:type="dxa" w:w="3260"/>
+            <w:tcMar>
+              <w:top w:w="80" w:type="dxa"/>
+              <w:start w:w="120" w:type="dxa"/>
+              <w:bottom w:w="80" w:type="dxa"/>
+              <w:end w:w="120" w:type="dxa"/>
+            </w:tcMar>
+            <w:vAlign w:val="center"/>
+            <w:shd w:fill="FFFFFF"/>
+          </w:tcPr>
+          <w:p>
+            <w:pPr>
+              <w:spacing w:before="0" w:after="40" w:line="252" w:lineRule="auto"/>
+              <w:jc w:val="left"/>
+            </w:pPr>
+            <w:r>
+              <w:rPr>
+                <w:rFonts w:ascii="Calibri" w:hAnsi="Calibri"/>
+                <w:b w:val="0"/>
+                <w:color w:val="111827"/>
+                <w:sz w:val="17"/>
+              </w:rPr>
+              <w:t>Add versioned SOC-temperature maps later</w:t>
+            </w:r>
+          </w:p>
+        </w:tc>
+      </w:tr>
+      <w:tr>
+        <w:trPr>
+          <w:cantSplit/>
+        </w:trPr>
+        <w:tc>
+          <w:tcPr>
+            <w:tcW w:type="dxa" w:w="1650"/>
+            <w:tcMar>
+              <w:top w:w="80" w:type="dxa"/>
+              <w:start w:w="120" w:type="dxa"/>
+              <w:bottom w:w="80" w:type="dxa"/>
+              <w:end w:w="120" w:type="dxa"/>
+            </w:tcMar>
+            <w:vAlign w:val="center"/>
+            <w:shd w:fill="FFFFFF"/>
+          </w:tcPr>
+          <w:p>
+            <w:pPr>
+              <w:spacing w:before="0" w:after="40" w:line="252" w:lineRule="auto"/>
+              <w:jc w:val="center"/>
+            </w:pPr>
+            <w:r>
+              <w:rPr>
+                <w:rFonts w:ascii="Calibri" w:hAnsi="Calibri"/>
+                <w:b w:val="0"/>
+                <w:color w:val="111827"/>
+                <w:sz w:val="17"/>
+              </w:rPr>
+              <w:t>No hydraulic pressure model</w:t>
+            </w:r>
+          </w:p>
+        </w:tc>
+        <w:tc>
+          <w:tcPr>
+            <w:tcW w:type="dxa" w:w="4450"/>
+            <w:tcMar>
+              <w:top w:w="80" w:type="dxa"/>
+              <w:start w:w="120" w:type="dxa"/>
+              <w:bottom w:w="80" w:type="dxa"/>
+              <w:end w:w="120" w:type="dxa"/>
+            </w:tcMar>
+            <w:vAlign w:val="center"/>
+            <w:shd w:fill="FFFFFF"/>
+          </w:tcPr>
+          <w:p>
+            <w:pPr>
+              <w:spacing w:before="0" w:after="40" w:line="252" w:lineRule="auto"/>
+              <w:jc w:val="left"/>
+            </w:pPr>
+            <w:r>
+              <w:rPr>
+                <w:rFonts w:ascii="Calibri" w:hAnsi="Calibri"/>
+                <w:b w:val="0"/>
+                <w:color w:val="111827"/>
+                <w:sz w:val="17"/>
+              </w:rPr>
+              <w:t>Cannot test valve or pressure dynamics yet</w:t>
+            </w:r>
+          </w:p>
+        </w:tc>
+        <w:tc>
+          <w:tcPr>
+            <w:tcW w:type="dxa" w:w="3260"/>
+            <w:tcMar>
+              <w:top w:w="80" w:type="dxa"/>
+              <w:start w:w="120" w:type="dxa"/>
+              <w:bottom w:w="80" w:type="dxa"/>
+              <w:end w:w="120" w:type="dxa"/>
+            </w:tcMar>
+            <w:vAlign w:val="center"/>
+            <w:shd w:fill="FFFFFF"/>
+          </w:tcPr>
+          <w:p>
+            <w:pPr>
+              <w:spacing w:before="0" w:after="40" w:line="252" w:lineRule="auto"/>
+              <w:jc w:val="left"/>
+            </w:pPr>
+            <w:r>
+              <w:rPr>
+                <w:rFonts w:ascii="Calibri" w:hAnsi="Calibri"/>
+                <w:b w:val="0"/>
+                <w:color w:val="111827"/>
+                <w:sz w:val="17"/>
+              </w:rPr>
+              <w:t>Add brake-system actuator fidelity in a later volume</w:t>
+            </w:r>
+          </w:p>
+        </w:tc>
+      </w:tr>
     </w:tbl>
     <w:p>
       <w:pPr>
@@ -12837,7 +16946,7 @@
         <w:pStyle w:val="ListNumber"/>
         <w:numPr>
           <w:ilvl w:val="0"/>
-          <w:numId w:val="21"/>
+          <w:numId w:val="20"/>
         </w:numPr>
         <w:spacing w:after="120"/>
       </w:pPr>
@@ -12855,7 +16964,7 @@
         <w:pStyle w:val="ListNumber"/>
         <w:numPr>
           <w:ilvl w:val="0"/>
-          <w:numId w:val="21"/>
+          <w:numId w:val="20"/>
         </w:numPr>
         <w:spacing w:after="120"/>
       </w:pPr>
@@ -12873,7 +16982,7 @@
         <w:pStyle w:val="ListNumber"/>
         <w:numPr>
           <w:ilvl w:val="0"/>
-          <w:numId w:val="21"/>
+          <w:numId w:val="20"/>
         </w:numPr>
         <w:spacing w:after="120"/>
       </w:pPr>
@@ -12891,7 +17000,7 @@
         <w:pStyle w:val="ListNumber"/>
         <w:numPr>
           <w:ilvl w:val="0"/>
-          <w:numId w:val="21"/>
+          <w:numId w:val="20"/>
         </w:numPr>
         <w:spacing w:after="120"/>
       </w:pPr>
@@ -12909,7 +17018,7 @@
         <w:pStyle w:val="ListNumber"/>
         <w:numPr>
           <w:ilvl w:val="0"/>
-          <w:numId w:val="21"/>
+          <w:numId w:val="20"/>
         </w:numPr>
         <w:spacing w:after="120"/>
       </w:pPr>
@@ -12927,7 +17036,7 @@
         <w:pStyle w:val="ListNumber"/>
         <w:numPr>
           <w:ilvl w:val="0"/>
-          <w:numId w:val="21"/>
+          <w:numId w:val="20"/>
         </w:numPr>
         <w:spacing w:after="120"/>
       </w:pPr>
@@ -12945,7 +17054,7 @@
         <w:pStyle w:val="ListNumber"/>
         <w:numPr>
           <w:ilvl w:val="0"/>
-          <w:numId w:val="21"/>
+          <w:numId w:val="20"/>
         </w:numPr>
         <w:spacing w:after="120"/>
       </w:pPr>
@@ -12963,7 +17072,7 @@
         <w:pStyle w:val="ListNumber"/>
         <w:numPr>
           <w:ilvl w:val="0"/>
-          <w:numId w:val="21"/>
+          <w:numId w:val="20"/>
         </w:numPr>
         <w:spacing w:after="120"/>
       </w:pPr>
@@ -12981,7 +17090,7 @@
         <w:pStyle w:val="ListNumber"/>
         <w:numPr>
           <w:ilvl w:val="0"/>
-          <w:numId w:val="21"/>
+          <w:numId w:val="20"/>
         </w:numPr>
         <w:spacing w:after="120"/>
       </w:pPr>
@@ -12999,7 +17108,7 @@
         <w:pStyle w:val="ListNumber"/>
         <w:numPr>
           <w:ilvl w:val="0"/>
-          <w:numId w:val="21"/>
+          <w:numId w:val="20"/>
         </w:numPr>
         <w:spacing w:after="120"/>
       </w:pPr>
@@ -13017,7 +17126,7 @@
         <w:pStyle w:val="ListNumber"/>
         <w:numPr>
           <w:ilvl w:val="0"/>
-          <w:numId w:val="21"/>
+          <w:numId w:val="20"/>
         </w:numPr>
         <w:spacing w:after="120"/>
       </w:pPr>
@@ -13035,7 +17144,7 @@
         <w:pStyle w:val="ListNumber"/>
         <w:numPr>
           <w:ilvl w:val="0"/>
-          <w:numId w:val="21"/>
+          <w:numId w:val="20"/>
         </w:numPr>
         <w:spacing w:after="120"/>
       </w:pPr>
@@ -13046,6 +17155,78 @@
           <w:sz w:val="22"/>
         </w:rPr>
         <w:t>Trigger the motor thermal boundary and inspect the stable limiting reason.</w:t>
+      </w:r>
+    </w:p>
+    <w:p>
+      <w:pPr>
+        <w:pStyle w:val="ListNumber"/>
+        <w:numPr>
+          <w:ilvl w:val="0"/>
+          <w:numId w:val="20"/>
+        </w:numPr>
+        <w:spacing w:after="120"/>
+      </w:pPr>
+      <w:r>
+        <w:rPr>
+          <w:rFonts w:ascii="Calibri" w:hAnsi="Calibri"/>
+          <w:color w:val="111827"/>
+          <w:sz w:val="22"/>
+        </w:rPr>
+        <w:t>Request 1 m/s2 at 20 m/s and verify pure regenerative braking and recovered energy.</w:t>
+      </w:r>
+    </w:p>
+    <w:p>
+      <w:pPr>
+        <w:pStyle w:val="ListNumber"/>
+        <w:numPr>
+          <w:ilvl w:val="0"/>
+          <w:numId w:val="20"/>
+        </w:numPr>
+        <w:spacing w:after="120"/>
+      </w:pPr>
+      <w:r>
+        <w:rPr>
+          <w:rFonts w:ascii="Calibri" w:hAnsi="Calibri"/>
+          <w:color w:val="111827"/>
+          <w:sz w:val="22"/>
+        </w:rPr>
+        <w:t>Increase the request until friction braking is blended with regeneration.</w:t>
+      </w:r>
+    </w:p>
+    <w:p>
+      <w:pPr>
+        <w:pStyle w:val="ListNumber"/>
+        <w:numPr>
+          <w:ilvl w:val="0"/>
+          <w:numId w:val="20"/>
+        </w:numPr>
+        <w:spacing w:after="120"/>
+      </w:pPr>
+      <w:r>
+        <w:rPr>
+          <w:rFonts w:ascii="Calibri" w:hAnsi="Calibri"/>
+          <w:color w:val="111827"/>
+          <w:sz w:val="22"/>
+        </w:rPr>
+        <w:t>Compare regenerative availability at 80% and 95% SOC.</w:t>
+      </w:r>
+    </w:p>
+    <w:p>
+      <w:pPr>
+        <w:pStyle w:val="ListNumber"/>
+        <w:numPr>
+          <w:ilvl w:val="0"/>
+          <w:numId w:val="20"/>
+        </w:numPr>
+        <w:spacing w:after="120"/>
+      </w:pPr>
+      <w:r>
+        <w:rPr>
+          <w:rFonts w:ascii="Calibri" w:hAnsi="Calibri"/>
+          <w:color w:val="111827"/>
+          <w:sz w:val="22"/>
+        </w:rPr>
+        <w:t>Repeat a successful braking command and prove that battery SOC does not increase twice.</w:t>
       </w:r>
     </w:p>
     <w:p>
@@ -13065,7 +17246,7 @@
           <w:color w:val="111827"/>
           <w:sz w:val="22"/>
         </w:rPr>
-        <w:t>VI-3 will add regenerative braking, battery charge-acceptance limits, requested deceleration, recoverable motor torque, recovered electrical energy, and blended friction-brake allocation. It will retain logical time, explicit sign conventions, optimistic versions, idempotency, RBAC, audit, outbox, and bounded evidence.</w:t>
+        <w:t>VI-4 will add AC and DC charging sessions, connector and charger-power contracts, deterministic charge curves, SOC/temperature limits, session lifecycle, interruptions, and fault handling. It will retain logical time, optimistic versions, idempotency, RBAC, audit, outbox, and bounded evidence.</w:t>
       </w:r>
     </w:p>
     <w:sectPr>
@@ -13097,7 +17278,7 @@
         <w:color w:val="667085"/>
         <w:sz w:val="17"/>
       </w:rPr>
-      <w:t>ATEP Volume VI Workbook  |  Version 0.2.0</w:t>
+      <w:t>ATEP Volume VI Workbook  |  Version 0.3.0</w:t>
     </w:r>
     <w:r>
       <w:rPr>
@@ -13439,12 +17620,6 @@
     </w:lvlOverride>
   </w:num>
   <w:num w:numId="20">
-    <w:abstractNumId w:val="10"/>
-    <w:lvlOverride w:ilvl="0">
-      <w:startOverride w:val="1"/>
-    </w:lvlOverride>
-  </w:num>
-  <w:num w:numId="21">
     <w:abstractNumId w:val="9"/>
     <w:lvlOverride w:ilvl="0">
       <w:startOverride w:val="1"/>

</xml_diff>

<commit_message>
feat(electric-vehicle): add charging sessions
</commit_message>
<xml_diff>
--- a/docs/ATEP_Volume_VI_Electric_Vehicle_Engineering_Workbook.docx
+++ b/docs/ATEP_Volume_VI_Electric_Vehicle_Engineering_Workbook.docx
@@ -143,7 +143,7 @@
                 <w:color w:val="0B2545"/>
                 <w:sz w:val="19"/>
               </w:rPr>
-              <w:t>0.3.0</w:t>
+              <w:t>0.4.0</w:t>
             </w:r>
           </w:p>
         </w:tc>
@@ -265,7 +265,7 @@
                 <w:color w:val="111827"/>
                 <w:sz w:val="19"/>
               </w:rPr>
-              <w:t>VI-1 battery/BMS, VI-2 motor/inverter, and VI-3 braking implemented</w:t>
+              <w:t>VI-1 through VI-4 implemented, including AC/DC charging sessions</w:t>
             </w:r>
           </w:p>
         </w:tc>
@@ -873,7 +873,7 @@
                 <w:color w:val="111827"/>
                 <w:sz w:val="17"/>
               </w:rPr>
-              <w:t>0.3.0</w:t>
+              <w:t>0.4.0</w:t>
             </w:r>
           </w:p>
         </w:tc>
@@ -995,7 +995,7 @@
                 <w:color w:val="111827"/>
                 <w:sz w:val="17"/>
               </w:rPr>
-              <w:t>VI-1 battery/BMS, VI-2 motor/inverter, and VI-3 regenerative braking implemented</w:t>
+              <w:t>VI-1 through VI-4 implemented, including AC/DC charging sessions</w:t>
             </w:r>
           </w:p>
         </w:tc>
@@ -1084,7 +1084,7 @@
           <w:color w:val="111827"/>
           <w:sz w:val="22"/>
         </w:rPr>
-        <w:t>Volume VI turns the platform's general digital vehicle into a testable electric-energy system. VI-1 establishes a persistent battery pack and deterministic BMS behavior. VI-2 adds a persistent motor/inverter aggregate, torque delivery, efficiency, power loss, thermal protection, drive-mode limits, and battery-derived propulsion availability. VI-3 adds requested-deceleration control, regenerative energy recovery, battery charge acceptance, and blended friction braking.</w:t>
+        <w:t>Volume VI turns the platform's general digital vehicle into a testable electric-energy system. VI-1 establishes a persistent battery pack and deterministic BMS behavior. VI-2 adds a persistent motor/inverter aggregate, torque delivery, efficiency, power loss, thermal protection, drive-mode limits, and battery-derived propulsion availability. VI-3 adds requested-deceleration control, regenerative energy recovery, battery charge acceptance, and blended friction braking. VI-4 adds AC/DC charging sessions, deterministic charge curves, lifecycle control, and faults.</w:t>
       </w:r>
     </w:p>
     <w:p>
@@ -1420,7 +1420,7 @@
           <w:color w:val="111827"/>
           <w:sz w:val="22"/>
         </w:rPr>
-        <w:t>requested and delivered deceleration with regenerative and friction allocation;</w:t>
+        <w:t>regenerative and friction allocation with deterministic power and energy recovery;</w:t>
       </w:r>
     </w:p>
     <w:p>
@@ -1438,43 +1438,7 @@
           <w:color w:val="111827"/>
           <w:sz w:val="22"/>
         </w:rPr>
-        <w:t>motor-torque, drivetrain, wheel, speed, and battery charge-acceptance limits;</w:t>
-      </w:r>
-    </w:p>
-    <w:p>
-      <w:pPr>
-        <w:pStyle w:val="ListBullet"/>
-        <w:numPr>
-          <w:ilvl w:val="0"/>
-          <w:numId w:val="13"/>
-        </w:numPr>
-        <w:spacing w:after="80"/>
-      </w:pPr>
-      <w:r>
-        <w:rPr>
-          <w:rFonts w:ascii="Calibri" w:hAnsi="Calibri"/>
-          <w:color w:val="111827"/>
-          <w:sz w:val="22"/>
-        </w:rPr>
-        <w:t>recovered electrical power, step energy, cumulative energy, and battery SOC update;</w:t>
-      </w:r>
-    </w:p>
-    <w:p>
-      <w:pPr>
-        <w:pStyle w:val="ListBullet"/>
-        <w:numPr>
-          <w:ilvl w:val="0"/>
-          <w:numId w:val="13"/>
-        </w:numPr>
-        <w:spacing w:after="80"/>
-      </w:pPr>
-      <w:r>
-        <w:rPr>
-          <w:rFonts w:ascii="Calibri" w:hAnsi="Calibri"/>
-          <w:color w:val="111827"/>
-          <w:sz w:val="22"/>
-        </w:rPr>
-        <w:t>low-speed and battery-unavailable friction fallback;</w:t>
+        <w:t>motor, drivetrain, speed, battery-acceptance, and friction limits;</w:t>
       </w:r>
     </w:p>
     <w:p>
@@ -1502,7 +1466,7 @@
         <w:keepLines/>
       </w:pPr>
       <w:r>
-        <w:t>Deferred</w:t>
+        <w:t>In Scope for VI-4</w:t>
       </w:r>
     </w:p>
     <w:p>
@@ -1520,7 +1484,7 @@
           <w:color w:val="111827"/>
           <w:sz w:val="22"/>
         </w:rPr>
-        <w:t>chemistry-specific equivalent-circuit and open-circuit-voltage curves;</w:t>
+        <w:t>one charging-system state per battery-equipped vehicle;</w:t>
       </w:r>
     </w:p>
     <w:p>
@@ -1538,7 +1502,7 @@
           <w:color w:val="111827"/>
           <w:sz w:val="22"/>
         </w:rPr>
-        <w:t>cell balancing, aging, sensor faults, and module topology;</w:t>
+        <w:t>AC Type 2 and DC CCS connector contracts with separate power limits;</w:t>
       </w:r>
     </w:p>
     <w:p>
@@ -1556,7 +1520,7 @@
           <w:color w:val="111827"/>
           <w:sz w:val="22"/>
         </w:rPr>
-        <w:t>charging, cooling actuators, and range estimation;</w:t>
+        <w:t>deterministic session lifecycle, SOC integration, taper, target, and temperature limits;</w:t>
       </w:r>
     </w:p>
     <w:p>
@@ -1565,6 +1529,88 @@
         <w:numPr>
           <w:ilvl w:val="0"/>
           <w:numId w:val="14"/>
+        </w:numPr>
+        <w:spacing w:after="80"/>
+      </w:pPr>
+      <w:r>
+        <w:rPr>
+          <w:rFonts w:ascii="Calibri" w:hAnsi="Calibri"/>
+          <w:color w:val="111827"/>
+          <w:sz w:val="22"/>
+        </w:rPr>
+        <w:t>charging and battery optimistic versions, exact replay, audit, and outbox evidence.</w:t>
+      </w:r>
+    </w:p>
+    <w:p>
+      <w:pPr>
+        <w:pStyle w:val="Heading2"/>
+        <w:keepNext/>
+        <w:keepLines/>
+      </w:pPr>
+      <w:r>
+        <w:t>Deferred</w:t>
+      </w:r>
+    </w:p>
+    <w:p>
+      <w:pPr>
+        <w:pStyle w:val="ListBullet"/>
+        <w:numPr>
+          <w:ilvl w:val="0"/>
+          <w:numId w:val="15"/>
+        </w:numPr>
+        <w:spacing w:after="80"/>
+      </w:pPr>
+      <w:r>
+        <w:rPr>
+          <w:rFonts w:ascii="Calibri" w:hAnsi="Calibri"/>
+          <w:color w:val="111827"/>
+          <w:sz w:val="22"/>
+        </w:rPr>
+        <w:t>chemistry-specific equivalent-circuit and open-circuit-voltage curves;</w:t>
+      </w:r>
+    </w:p>
+    <w:p>
+      <w:pPr>
+        <w:pStyle w:val="ListBullet"/>
+        <w:numPr>
+          <w:ilvl w:val="0"/>
+          <w:numId w:val="15"/>
+        </w:numPr>
+        <w:spacing w:after="80"/>
+      </w:pPr>
+      <w:r>
+        <w:rPr>
+          <w:rFonts w:ascii="Calibri" w:hAnsi="Calibri"/>
+          <w:color w:val="111827"/>
+          <w:sz w:val="22"/>
+        </w:rPr>
+        <w:t>cell balancing, aging, sensor faults, and module topology;</w:t>
+      </w:r>
+    </w:p>
+    <w:p>
+      <w:pPr>
+        <w:pStyle w:val="ListBullet"/>
+        <w:numPr>
+          <w:ilvl w:val="0"/>
+          <w:numId w:val="15"/>
+        </w:numPr>
+        <w:spacing w:after="80"/>
+      </w:pPr>
+      <w:r>
+        <w:rPr>
+          <w:rFonts w:ascii="Calibri" w:hAnsi="Calibri"/>
+          <w:color w:val="111827"/>
+          <w:sz w:val="22"/>
+        </w:rPr>
+        <w:t>cooling actuators and range estimation;</w:t>
+      </w:r>
+    </w:p>
+    <w:p>
+      <w:pPr>
+        <w:pStyle w:val="ListBullet"/>
+        <w:numPr>
+          <w:ilvl w:val="0"/>
+          <w:numId w:val="15"/>
         </w:numPr>
         <w:spacing w:after="80"/>
       </w:pPr>
@@ -1658,7 +1704,7 @@
           <w:color w:val="111827"/>
           <w:sz w:val="22"/>
         </w:rPr>
-        <w:t xml:space="preserve">, and </w:t>
+        <w:t xml:space="preserve">, </w:t>
       </w:r>
       <w:r>
         <w:rPr>
@@ -1674,7 +1720,23 @@
           <w:color w:val="111827"/>
           <w:sz w:val="22"/>
         </w:rPr>
-        <w:t xml:space="preserve"> own the battery, propulsion, and braking aggregates. Their simulation step records preserve immutable replay evidence. </w:t>
+        <w:t xml:space="preserve">, and </w:t>
+      </w:r>
+      <w:r>
+        <w:rPr>
+          <w:rFonts w:ascii="Consolas" w:hAnsi="Consolas"/>
+          <w:color w:val="1F4D78"/>
+          <w:sz w:val="19"/>
+        </w:rPr>
+        <w:t>ChargingSystemState</w:t>
+      </w:r>
+      <w:r>
+        <w:rPr>
+          <w:rFonts w:ascii="Calibri" w:hAnsi="Calibri"/>
+          <w:color w:val="111827"/>
+          <w:sz w:val="22"/>
+        </w:rPr>
+        <w:t xml:space="preserve"> own the battery, propulsion, braking, and charging aggregates. Their simulation step records preserve immutable replay evidence. </w:t>
       </w:r>
       <w:r>
         <w:rPr>
@@ -3063,6 +3125,363 @@
           </w:p>
         </w:tc>
       </w:tr>
+      <w:tr>
+        <w:trPr>
+          <w:cantSplit/>
+        </w:trPr>
+        <w:tc>
+          <w:tcPr>
+            <w:tcW w:type="dxa" w:w="1650"/>
+            <w:tcMar>
+              <w:top w:w="80" w:type="dxa"/>
+              <w:start w:w="120" w:type="dxa"/>
+              <w:bottom w:w="80" w:type="dxa"/>
+              <w:end w:w="120" w:type="dxa"/>
+            </w:tcMar>
+            <w:vAlign w:val="center"/>
+            <w:shd w:fill="FFFFFF"/>
+          </w:tcPr>
+          <w:p>
+            <w:pPr>
+              <w:spacing w:before="0" w:after="40" w:line="252" w:lineRule="auto"/>
+              <w:jc w:val="center"/>
+            </w:pPr>
+            <w:r>
+              <w:rPr>
+                <w:rFonts w:ascii="Calibri" w:hAnsi="Calibri"/>
+                <w:b w:val="0"/>
+                <w:color w:val="111827"/>
+                <w:sz w:val="17"/>
+              </w:rPr>
+              <w:t>ChargingSystemState</w:t>
+            </w:r>
+          </w:p>
+        </w:tc>
+        <w:tc>
+          <w:tcPr>
+            <w:tcW w:type="dxa" w:w="4450"/>
+            <w:tcMar>
+              <w:top w:w="80" w:type="dxa"/>
+              <w:start w:w="120" w:type="dxa"/>
+              <w:bottom w:w="80" w:type="dxa"/>
+              <w:end w:w="120" w:type="dxa"/>
+            </w:tcMar>
+            <w:vAlign w:val="center"/>
+            <w:shd w:fill="FFFFFF"/>
+          </w:tcPr>
+          <w:p>
+            <w:pPr>
+              <w:spacing w:before="0" w:after="40" w:line="252" w:lineRule="auto"/>
+              <w:jc w:val="left"/>
+            </w:pPr>
+            <w:r>
+              <w:rPr>
+                <w:rFonts w:ascii="Calibri" w:hAnsi="Calibri"/>
+                <w:b w:val="0"/>
+                <w:color w:val="111827"/>
+                <w:sz w:val="17"/>
+              </w:rPr>
+              <w:t>Current charging session and energy transfer</w:t>
+            </w:r>
+          </w:p>
+        </w:tc>
+        <w:tc>
+          <w:tcPr>
+            <w:tcW w:type="dxa" w:w="3260"/>
+            <w:tcMar>
+              <w:top w:w="80" w:type="dxa"/>
+              <w:start w:w="120" w:type="dxa"/>
+              <w:bottom w:w="80" w:type="dxa"/>
+              <w:end w:w="120" w:type="dxa"/>
+            </w:tcMar>
+            <w:vAlign w:val="center"/>
+            <w:shd w:fill="FFFFFF"/>
+          </w:tcPr>
+          <w:p>
+            <w:pPr>
+              <w:spacing w:before="0" w:after="40" w:line="252" w:lineRule="auto"/>
+              <w:jc w:val="left"/>
+            </w:pPr>
+            <w:r>
+              <w:rPr>
+                <w:rFonts w:ascii="Calibri" w:hAnsi="Calibri"/>
+                <w:b w:val="0"/>
+                <w:color w:val="111827"/>
+                <w:sz w:val="17"/>
+              </w:rPr>
+              <w:t>one per vehicle; version &gt;= 1</w:t>
+            </w:r>
+          </w:p>
+        </w:tc>
+      </w:tr>
+      <w:tr>
+        <w:trPr>
+          <w:cantSplit/>
+        </w:trPr>
+        <w:tc>
+          <w:tcPr>
+            <w:tcW w:type="dxa" w:w="1650"/>
+            <w:tcMar>
+              <w:top w:w="80" w:type="dxa"/>
+              <w:start w:w="120" w:type="dxa"/>
+              <w:bottom w:w="80" w:type="dxa"/>
+              <w:end w:w="120" w:type="dxa"/>
+            </w:tcMar>
+            <w:vAlign w:val="center"/>
+            <w:shd w:fill="FFFFFF"/>
+          </w:tcPr>
+          <w:p>
+            <w:pPr>
+              <w:spacing w:before="0" w:after="40" w:line="252" w:lineRule="auto"/>
+              <w:jc w:val="center"/>
+            </w:pPr>
+            <w:r>
+              <w:rPr>
+                <w:rFonts w:ascii="Calibri" w:hAnsi="Calibri"/>
+                <w:b w:val="0"/>
+                <w:color w:val="111827"/>
+                <w:sz w:val="17"/>
+              </w:rPr>
+              <w:t>Connector type</w:t>
+            </w:r>
+          </w:p>
+        </w:tc>
+        <w:tc>
+          <w:tcPr>
+            <w:tcW w:type="dxa" w:w="4450"/>
+            <w:tcMar>
+              <w:top w:w="80" w:type="dxa"/>
+              <w:start w:w="120" w:type="dxa"/>
+              <w:bottom w:w="80" w:type="dxa"/>
+              <w:end w:w="120" w:type="dxa"/>
+            </w:tcMar>
+            <w:vAlign w:val="center"/>
+            <w:shd w:fill="FFFFFF"/>
+          </w:tcPr>
+          <w:p>
+            <w:pPr>
+              <w:spacing w:before="0" w:after="40" w:line="252" w:lineRule="auto"/>
+              <w:jc w:val="left"/>
+            </w:pPr>
+            <w:r>
+              <w:rPr>
+                <w:rFonts w:ascii="Calibri" w:hAnsi="Calibri"/>
+                <w:b w:val="0"/>
+                <w:color w:val="111827"/>
+                <w:sz w:val="17"/>
+              </w:rPr>
+              <w:t>Physical charging path</w:t>
+            </w:r>
+          </w:p>
+        </w:tc>
+        <w:tc>
+          <w:tcPr>
+            <w:tcW w:type="dxa" w:w="3260"/>
+            <w:tcMar>
+              <w:top w:w="80" w:type="dxa"/>
+              <w:start w:w="120" w:type="dxa"/>
+              <w:bottom w:w="80" w:type="dxa"/>
+              <w:end w:w="120" w:type="dxa"/>
+            </w:tcMar>
+            <w:vAlign w:val="center"/>
+            <w:shd w:fill="FFFFFF"/>
+          </w:tcPr>
+          <w:p>
+            <w:pPr>
+              <w:spacing w:before="0" w:after="40" w:line="252" w:lineRule="auto"/>
+              <w:jc w:val="left"/>
+            </w:pPr>
+            <w:r>
+              <w:rPr>
+                <w:rFonts w:ascii="Calibri" w:hAnsi="Calibri"/>
+                <w:b w:val="0"/>
+                <w:color w:val="111827"/>
+                <w:sz w:val="17"/>
+              </w:rPr>
+              <w:t>ac_type_2</w:t>
+            </w:r>
+            <w:r>
+              <w:rPr>
+                <w:rFonts w:ascii="Calibri" w:hAnsi="Calibri"/>
+                <w:b w:val="0"/>
+                <w:color w:val="111827"/>
+                <w:sz w:val="17"/>
+              </w:rPr>
+              <w:t xml:space="preserve">, </w:t>
+            </w:r>
+            <w:r>
+              <w:rPr>
+                <w:rFonts w:ascii="Calibri" w:hAnsi="Calibri"/>
+                <w:b w:val="0"/>
+                <w:color w:val="111827"/>
+                <w:sz w:val="17"/>
+              </w:rPr>
+              <w:t>dc_ccs</w:t>
+            </w:r>
+          </w:p>
+        </w:tc>
+      </w:tr>
+      <w:tr>
+        <w:trPr>
+          <w:cantSplit/>
+        </w:trPr>
+        <w:tc>
+          <w:tcPr>
+            <w:tcW w:type="dxa" w:w="1650"/>
+            <w:tcMar>
+              <w:top w:w="80" w:type="dxa"/>
+              <w:start w:w="120" w:type="dxa"/>
+              <w:bottom w:w="80" w:type="dxa"/>
+              <w:end w:w="120" w:type="dxa"/>
+            </w:tcMar>
+            <w:vAlign w:val="center"/>
+            <w:shd w:fill="FFFFFF"/>
+          </w:tcPr>
+          <w:p>
+            <w:pPr>
+              <w:spacing w:before="0" w:after="40" w:line="252" w:lineRule="auto"/>
+              <w:jc w:val="center"/>
+            </w:pPr>
+            <w:r>
+              <w:rPr>
+                <w:rFonts w:ascii="Calibri" w:hAnsi="Calibri"/>
+                <w:b w:val="0"/>
+                <w:color w:val="111827"/>
+                <w:sz w:val="17"/>
+              </w:rPr>
+              <w:t>Charging state</w:t>
+            </w:r>
+          </w:p>
+        </w:tc>
+        <w:tc>
+          <w:tcPr>
+            <w:tcW w:type="dxa" w:w="4450"/>
+            <w:tcMar>
+              <w:top w:w="80" w:type="dxa"/>
+              <w:start w:w="120" w:type="dxa"/>
+              <w:bottom w:w="80" w:type="dxa"/>
+              <w:end w:w="120" w:type="dxa"/>
+            </w:tcMar>
+            <w:vAlign w:val="center"/>
+            <w:shd w:fill="FFFFFF"/>
+          </w:tcPr>
+          <w:p>
+            <w:pPr>
+              <w:spacing w:before="0" w:after="40" w:line="252" w:lineRule="auto"/>
+              <w:jc w:val="left"/>
+            </w:pPr>
+            <w:r>
+              <w:rPr>
+                <w:rFonts w:ascii="Calibri" w:hAnsi="Calibri"/>
+                <w:b w:val="0"/>
+                <w:color w:val="111827"/>
+                <w:sz w:val="17"/>
+              </w:rPr>
+              <w:t>Session lifecycle</w:t>
+            </w:r>
+          </w:p>
+        </w:tc>
+        <w:tc>
+          <w:tcPr>
+            <w:tcW w:type="dxa" w:w="3260"/>
+            <w:tcMar>
+              <w:top w:w="80" w:type="dxa"/>
+              <w:start w:w="120" w:type="dxa"/>
+              <w:bottom w:w="80" w:type="dxa"/>
+              <w:end w:w="120" w:type="dxa"/>
+            </w:tcMar>
+            <w:vAlign w:val="center"/>
+            <w:shd w:fill="FFFFFF"/>
+          </w:tcPr>
+          <w:p>
+            <w:pPr>
+              <w:spacing w:before="0" w:after="40" w:line="252" w:lineRule="auto"/>
+              <w:jc w:val="left"/>
+            </w:pPr>
+            <w:r>
+              <w:rPr>
+                <w:rFonts w:ascii="Calibri" w:hAnsi="Calibri"/>
+                <w:b w:val="0"/>
+                <w:color w:val="111827"/>
+                <w:sz w:val="17"/>
+              </w:rPr>
+              <w:t>idle</w:t>
+            </w:r>
+            <w:r>
+              <w:rPr>
+                <w:rFonts w:ascii="Calibri" w:hAnsi="Calibri"/>
+                <w:b w:val="0"/>
+                <w:color w:val="111827"/>
+                <w:sz w:val="17"/>
+              </w:rPr>
+              <w:t xml:space="preserve">, </w:t>
+            </w:r>
+            <w:r>
+              <w:rPr>
+                <w:rFonts w:ascii="Calibri" w:hAnsi="Calibri"/>
+                <w:b w:val="0"/>
+                <w:color w:val="111827"/>
+                <w:sz w:val="17"/>
+              </w:rPr>
+              <w:t>charging</w:t>
+            </w:r>
+            <w:r>
+              <w:rPr>
+                <w:rFonts w:ascii="Calibri" w:hAnsi="Calibri"/>
+                <w:b w:val="0"/>
+                <w:color w:val="111827"/>
+                <w:sz w:val="17"/>
+              </w:rPr>
+              <w:t xml:space="preserve">, </w:t>
+            </w:r>
+            <w:r>
+              <w:rPr>
+                <w:rFonts w:ascii="Calibri" w:hAnsi="Calibri"/>
+                <w:b w:val="0"/>
+                <w:color w:val="111827"/>
+                <w:sz w:val="17"/>
+              </w:rPr>
+              <w:t>paused</w:t>
+            </w:r>
+            <w:r>
+              <w:rPr>
+                <w:rFonts w:ascii="Calibri" w:hAnsi="Calibri"/>
+                <w:b w:val="0"/>
+                <w:color w:val="111827"/>
+                <w:sz w:val="17"/>
+              </w:rPr>
+              <w:t xml:space="preserve">, </w:t>
+            </w:r>
+            <w:r>
+              <w:rPr>
+                <w:rFonts w:ascii="Calibri" w:hAnsi="Calibri"/>
+                <w:b w:val="0"/>
+                <w:color w:val="111827"/>
+                <w:sz w:val="17"/>
+              </w:rPr>
+              <w:t>completed</w:t>
+            </w:r>
+            <w:r>
+              <w:rPr>
+                <w:rFonts w:ascii="Calibri" w:hAnsi="Calibri"/>
+                <w:b w:val="0"/>
+                <w:color w:val="111827"/>
+                <w:sz w:val="17"/>
+              </w:rPr>
+              <w:t xml:space="preserve">, </w:t>
+            </w:r>
+            <w:r>
+              <w:rPr>
+                <w:rFonts w:ascii="Calibri" w:hAnsi="Calibri"/>
+                <w:b w:val="0"/>
+                <w:color w:val="111827"/>
+                <w:sz w:val="17"/>
+              </w:rPr>
+              <w:t>faulted</w:t>
+            </w:r>
+          </w:p>
+        </w:tc>
+      </w:tr>
     </w:tbl>
     <w:p>
       <w:pPr>
@@ -3114,7 +3533,7 @@
         <w:pStyle w:val="ListBullet"/>
         <w:numPr>
           <w:ilvl w:val="0"/>
-          <w:numId w:val="15"/>
+          <w:numId w:val="16"/>
         </w:numPr>
         <w:spacing w:after="80"/>
       </w:pPr>
@@ -3132,7 +3551,7 @@
         <w:pStyle w:val="ListBullet"/>
         <w:numPr>
           <w:ilvl w:val="0"/>
-          <w:numId w:val="15"/>
+          <w:numId w:val="16"/>
         </w:numPr>
         <w:spacing w:after="80"/>
       </w:pPr>
@@ -3150,7 +3569,7 @@
         <w:pStyle w:val="ListBullet"/>
         <w:numPr>
           <w:ilvl w:val="0"/>
-          <w:numId w:val="15"/>
+          <w:numId w:val="16"/>
         </w:numPr>
         <w:spacing w:after="80"/>
       </w:pPr>
@@ -3178,7 +3597,7 @@
         <w:pStyle w:val="ListBullet"/>
         <w:numPr>
           <w:ilvl w:val="0"/>
-          <w:numId w:val="16"/>
+          <w:numId w:val="17"/>
         </w:numPr>
         <w:spacing w:after="80"/>
       </w:pPr>
@@ -3196,7 +3615,7 @@
         <w:pStyle w:val="ListBullet"/>
         <w:numPr>
           <w:ilvl w:val="0"/>
-          <w:numId w:val="16"/>
+          <w:numId w:val="17"/>
         </w:numPr>
         <w:spacing w:after="80"/>
       </w:pPr>
@@ -3224,7 +3643,7 @@
         <w:pStyle w:val="ListBullet"/>
         <w:numPr>
           <w:ilvl w:val="0"/>
-          <w:numId w:val="17"/>
+          <w:numId w:val="18"/>
         </w:numPr>
         <w:spacing w:after="80"/>
       </w:pPr>
@@ -3262,7 +3681,7 @@
         <w:pStyle w:val="ListBullet"/>
         <w:numPr>
           <w:ilvl w:val="0"/>
-          <w:numId w:val="18"/>
+          <w:numId w:val="19"/>
         </w:numPr>
         <w:spacing w:after="80"/>
       </w:pPr>
@@ -3280,7 +3699,7 @@
         <w:pStyle w:val="ListBullet"/>
         <w:numPr>
           <w:ilvl w:val="0"/>
-          <w:numId w:val="18"/>
+          <w:numId w:val="19"/>
         </w:numPr>
         <w:spacing w:after="80"/>
       </w:pPr>
@@ -3298,7 +3717,7 @@
         <w:pStyle w:val="ListBullet"/>
         <w:numPr>
           <w:ilvl w:val="0"/>
-          <w:numId w:val="18"/>
+          <w:numId w:val="19"/>
         </w:numPr>
         <w:spacing w:after="80"/>
       </w:pPr>
@@ -3316,7 +3735,7 @@
         <w:pStyle w:val="ListBullet"/>
         <w:numPr>
           <w:ilvl w:val="0"/>
-          <w:numId w:val="18"/>
+          <w:numId w:val="19"/>
         </w:numPr>
         <w:spacing w:after="80"/>
       </w:pPr>
@@ -3334,7 +3753,7 @@
         <w:pStyle w:val="ListBullet"/>
         <w:numPr>
           <w:ilvl w:val="0"/>
-          <w:numId w:val="18"/>
+          <w:numId w:val="19"/>
         </w:numPr>
         <w:spacing w:after="80"/>
       </w:pPr>
@@ -3352,7 +3771,7 @@
         <w:pStyle w:val="ListBullet"/>
         <w:numPr>
           <w:ilvl w:val="0"/>
-          <w:numId w:val="18"/>
+          <w:numId w:val="19"/>
         </w:numPr>
         <w:spacing w:after="80"/>
       </w:pPr>
@@ -3380,7 +3799,7 @@
         <w:pStyle w:val="ListBullet"/>
         <w:numPr>
           <w:ilvl w:val="0"/>
-          <w:numId w:val="19"/>
+          <w:numId w:val="20"/>
         </w:numPr>
         <w:spacing w:after="80"/>
       </w:pPr>
@@ -3398,7 +3817,7 @@
         <w:pStyle w:val="ListBullet"/>
         <w:numPr>
           <w:ilvl w:val="0"/>
-          <w:numId w:val="19"/>
+          <w:numId w:val="20"/>
         </w:numPr>
         <w:spacing w:after="80"/>
       </w:pPr>
@@ -3416,7 +3835,7 @@
         <w:pStyle w:val="ListBullet"/>
         <w:numPr>
           <w:ilvl w:val="0"/>
-          <w:numId w:val="19"/>
+          <w:numId w:val="20"/>
         </w:numPr>
         <w:spacing w:after="80"/>
       </w:pPr>
@@ -3434,7 +3853,7 @@
         <w:pStyle w:val="ListBullet"/>
         <w:numPr>
           <w:ilvl w:val="0"/>
-          <w:numId w:val="19"/>
+          <w:numId w:val="20"/>
         </w:numPr>
         <w:spacing w:after="80"/>
       </w:pPr>
@@ -3452,7 +3871,7 @@
         <w:pStyle w:val="ListBullet"/>
         <w:numPr>
           <w:ilvl w:val="0"/>
-          <w:numId w:val="19"/>
+          <w:numId w:val="20"/>
         </w:numPr>
         <w:spacing w:after="80"/>
       </w:pPr>
@@ -3462,25 +3881,7 @@
           <w:color w:val="111827"/>
           <w:sz w:val="22"/>
         </w:rPr>
-        <w:t>Recovered power (kW) = regenerative force multiplied by speed and efficiency, divided by 1,000.</w:t>
-      </w:r>
-    </w:p>
-    <w:p>
-      <w:pPr>
-        <w:pStyle w:val="ListBullet"/>
-        <w:numPr>
-          <w:ilvl w:val="0"/>
-          <w:numId w:val="19"/>
-        </w:numPr>
-        <w:spacing w:after="80"/>
-      </w:pPr>
-      <w:r>
-        <w:rPr>
-          <w:rFonts w:ascii="Calibri" w:hAnsi="Calibri"/>
-          <w:color w:val="111827"/>
-          <w:sz w:val="22"/>
-        </w:rPr>
-        <w:t>Step energy (kWh) = recovered power multiplied by duration in hours.</w:t>
+        <w:t>Recovered power uses force, speed, and efficiency; its logical-time integral increases SOC using</w:t>
       </w:r>
     </w:p>
     <w:p>
@@ -3490,7 +3891,7 @@
           <w:color w:val="111827"/>
           <w:sz w:val="22"/>
         </w:rPr>
-        <w:t>Recovered energy increases SOC using SOH-adjusted pack energy.</w:t>
+        <w:t>SOH-adjusted pack energy.</w:t>
       </w:r>
     </w:p>
     <w:p>
@@ -3501,6 +3902,134 @@
           <w:sz w:val="22"/>
         </w:rPr>
         <w:t>Charge acceptance is zero below 0.5 m/s, with open contactors, in BMS protection, at or above 95% SOC, or outside 0-50 C. It tapers from 80% to 95% SOC, is reduced near the temperature limits, and is capped by the remaining energy room so a long step cannot cross 95% SOC.</w:t>
+      </w:r>
+    </w:p>
+    <w:p>
+      <w:pPr>
+        <w:pStyle w:val="Heading2"/>
+        <w:keepNext/>
+        <w:keepLines/>
+      </w:pPr>
+      <w:r>
+        <w:t>VI-4 Charging Model</w:t>
+      </w:r>
+    </w:p>
+    <w:p>
+      <w:pPr>
+        <w:pStyle w:val="ListBullet"/>
+        <w:numPr>
+          <w:ilvl w:val="0"/>
+          <w:numId w:val="21"/>
+        </w:numPr>
+        <w:spacing w:after="80"/>
+      </w:pPr>
+      <w:r>
+        <w:rPr>
+          <w:rFonts w:ascii="Calibri" w:hAnsi="Calibri"/>
+          <w:color w:val="111827"/>
+          <w:sz w:val="22"/>
+        </w:rPr>
+        <w:t>AC input power is capped by the configured onboard-charger limit.</w:t>
+      </w:r>
+    </w:p>
+    <w:p>
+      <w:pPr>
+        <w:pStyle w:val="ListBullet"/>
+        <w:numPr>
+          <w:ilvl w:val="0"/>
+          <w:numId w:val="21"/>
+        </w:numPr>
+        <w:spacing w:after="80"/>
+      </w:pPr>
+      <w:r>
+        <w:rPr>
+          <w:rFonts w:ascii="Calibri" w:hAnsi="Calibri"/>
+          <w:color w:val="111827"/>
+          <w:sz w:val="22"/>
+        </w:rPr>
+        <w:t>DC input power is capped by the configured DC inlet and battery current ceiling.</w:t>
+      </w:r>
+    </w:p>
+    <w:p>
+      <w:pPr>
+        <w:pStyle w:val="ListBullet"/>
+        <w:numPr>
+          <w:ilvl w:val="0"/>
+          <w:numId w:val="21"/>
+        </w:numPr>
+        <w:spacing w:after="80"/>
+      </w:pPr>
+      <w:r>
+        <w:rPr>
+          <w:rFonts w:ascii="Calibri" w:hAnsi="Calibri"/>
+          <w:color w:val="111827"/>
+          <w:sz w:val="22"/>
+        </w:rPr>
+        <w:t>Battery power equals delivered input power multiplied by charging efficiency.</w:t>
+      </w:r>
+    </w:p>
+    <w:p>
+      <w:pPr>
+        <w:pStyle w:val="ListBullet"/>
+        <w:numPr>
+          <w:ilvl w:val="0"/>
+          <w:numId w:val="21"/>
+        </w:numPr>
+        <w:spacing w:after="80"/>
+      </w:pPr>
+      <w:r>
+        <w:rPr>
+          <w:rFonts w:ascii="Calibri" w:hAnsi="Calibri"/>
+          <w:color w:val="111827"/>
+          <w:sz w:val="22"/>
+        </w:rPr>
+        <w:t>Step energy integrates accepted power over logical time and remaining energy caps the step at its</w:t>
+      </w:r>
+    </w:p>
+    <w:p>
+      <w:r>
+        <w:rPr>
+          <w:rFonts w:ascii="Calibri" w:hAnsi="Calibri"/>
+          <w:color w:val="111827"/>
+          <w:sz w:val="22"/>
+        </w:rPr>
+        <w:t>target SOC.</w:t>
+      </w:r>
+    </w:p>
+    <w:p>
+      <w:pPr>
+        <w:pStyle w:val="ListBullet"/>
+        <w:numPr>
+          <w:ilvl w:val="0"/>
+          <w:numId w:val="22"/>
+        </w:numPr>
+        <w:spacing w:after="80"/>
+      </w:pPr>
+      <w:r>
+        <w:rPr>
+          <w:rFonts w:ascii="Calibri" w:hAnsi="Calibri"/>
+          <w:color w:val="111827"/>
+          <w:sz w:val="22"/>
+        </w:rPr>
+        <w:t>Charge acceptance is zero in BMS protection, outside 0-50 C, or at the target SOC.</w:t>
+      </w:r>
+    </w:p>
+    <w:p>
+      <w:pPr>
+        <w:pStyle w:val="ListBullet"/>
+        <w:numPr>
+          <w:ilvl w:val="0"/>
+          <w:numId w:val="22"/>
+        </w:numPr>
+        <w:spacing w:after="80"/>
+      </w:pPr>
+      <w:r>
+        <w:rPr>
+          <w:rFonts w:ascii="Calibri" w:hAnsi="Calibri"/>
+          <w:color w:val="111827"/>
+          <w:sz w:val="22"/>
+        </w:rPr>
+        <w:t>Above 80% SOC, the analytic curve tapers power toward zero at the configured target.</w:t>
       </w:r>
     </w:p>
     <w:p>
@@ -5176,6 +5705,273 @@
           </w:p>
         </w:tc>
       </w:tr>
+      <w:tr>
+        <w:trPr>
+          <w:cantSplit/>
+        </w:trPr>
+        <w:tc>
+          <w:tcPr>
+            <w:tcW w:type="dxa" w:w="3100"/>
+            <w:tcMar>
+              <w:top w:w="80" w:type="dxa"/>
+              <w:start w:w="120" w:type="dxa"/>
+              <w:bottom w:w="80" w:type="dxa"/>
+              <w:end w:w="120" w:type="dxa"/>
+            </w:tcMar>
+            <w:vAlign w:val="center"/>
+            <w:shd w:fill="FFFFFF"/>
+          </w:tcPr>
+          <w:p>
+            <w:pPr>
+              <w:spacing w:before="0" w:after="40" w:line="252" w:lineRule="auto"/>
+              <w:jc w:val="center"/>
+            </w:pPr>
+            <w:r>
+              <w:rPr>
+                <w:rFonts w:ascii="Calibri" w:hAnsi="Calibri"/>
+                <w:b w:val="0"/>
+                <w:color w:val="111827"/>
+                <w:sz w:val="17"/>
+              </w:rPr>
+              <w:t>POST /api/v1/vehicles/{vehicle_id}/electric/charging</w:t>
+            </w:r>
+          </w:p>
+        </w:tc>
+        <w:tc>
+          <w:tcPr>
+            <w:tcW w:type="dxa" w:w="4000"/>
+            <w:tcMar>
+              <w:top w:w="80" w:type="dxa"/>
+              <w:start w:w="120" w:type="dxa"/>
+              <w:bottom w:w="80" w:type="dxa"/>
+              <w:end w:w="120" w:type="dxa"/>
+            </w:tcMar>
+            <w:vAlign w:val="center"/>
+            <w:shd w:fill="FFFFFF"/>
+          </w:tcPr>
+          <w:p>
+            <w:pPr>
+              <w:spacing w:before="0" w:after="40" w:line="252" w:lineRule="auto"/>
+              <w:jc w:val="left"/>
+            </w:pPr>
+            <w:r>
+              <w:rPr>
+                <w:rFonts w:ascii="Calibri" w:hAnsi="Calibri"/>
+                <w:b w:val="0"/>
+                <w:color w:val="111827"/>
+                <w:sz w:val="17"/>
+              </w:rPr>
+              <w:t>Create the charging-system baseline</w:t>
+            </w:r>
+          </w:p>
+        </w:tc>
+        <w:tc>
+          <w:tcPr>
+            <w:tcW w:type="dxa" w:w="2260"/>
+            <w:tcMar>
+              <w:top w:w="80" w:type="dxa"/>
+              <w:start w:w="120" w:type="dxa"/>
+              <w:bottom w:w="80" w:type="dxa"/>
+              <w:end w:w="120" w:type="dxa"/>
+            </w:tcMar>
+            <w:vAlign w:val="center"/>
+            <w:shd w:fill="FFFFFF"/>
+          </w:tcPr>
+          <w:p>
+            <w:pPr>
+              <w:spacing w:before="0" w:after="40" w:line="252" w:lineRule="auto"/>
+              <w:jc w:val="left"/>
+            </w:pPr>
+            <w:r>
+              <w:rPr>
+                <w:rFonts w:ascii="Calibri" w:hAnsi="Calibri"/>
+                <w:b w:val="0"/>
+                <w:color w:val="111827"/>
+                <w:sz w:val="17"/>
+              </w:rPr>
+              <w:t>electric_vehicle:manage</w:t>
+            </w:r>
+          </w:p>
+        </w:tc>
+      </w:tr>
+      <w:tr>
+        <w:trPr>
+          <w:cantSplit/>
+        </w:trPr>
+        <w:tc>
+          <w:tcPr>
+            <w:tcW w:type="dxa" w:w="3100"/>
+            <w:tcMar>
+              <w:top w:w="80" w:type="dxa"/>
+              <w:start w:w="120" w:type="dxa"/>
+              <w:bottom w:w="80" w:type="dxa"/>
+              <w:end w:w="120" w:type="dxa"/>
+            </w:tcMar>
+            <w:vAlign w:val="center"/>
+            <w:shd w:fill="FFFFFF"/>
+          </w:tcPr>
+          <w:p>
+            <w:pPr>
+              <w:spacing w:before="0" w:after="40" w:line="252" w:lineRule="auto"/>
+              <w:jc w:val="center"/>
+            </w:pPr>
+            <w:r>
+              <w:rPr>
+                <w:rFonts w:ascii="Calibri" w:hAnsi="Calibri"/>
+                <w:b w:val="0"/>
+                <w:color w:val="111827"/>
+                <w:sz w:val="17"/>
+              </w:rPr>
+              <w:t>GET /api/v1/vehicles/{vehicle_id}/electric/charging</w:t>
+            </w:r>
+          </w:p>
+        </w:tc>
+        <w:tc>
+          <w:tcPr>
+            <w:tcW w:type="dxa" w:w="4000"/>
+            <w:tcMar>
+              <w:top w:w="80" w:type="dxa"/>
+              <w:start w:w="120" w:type="dxa"/>
+              <w:bottom w:w="80" w:type="dxa"/>
+              <w:end w:w="120" w:type="dxa"/>
+            </w:tcMar>
+            <w:vAlign w:val="center"/>
+            <w:shd w:fill="FFFFFF"/>
+          </w:tcPr>
+          <w:p>
+            <w:pPr>
+              <w:spacing w:before="0" w:after="40" w:line="252" w:lineRule="auto"/>
+              <w:jc w:val="left"/>
+            </w:pPr>
+            <w:r>
+              <w:rPr>
+                <w:rFonts w:ascii="Calibri" w:hAnsi="Calibri"/>
+                <w:b w:val="0"/>
+                <w:color w:val="111827"/>
+                <w:sz w:val="17"/>
+              </w:rPr>
+              <w:t>Read the current session and charging state</w:t>
+            </w:r>
+          </w:p>
+        </w:tc>
+        <w:tc>
+          <w:tcPr>
+            <w:tcW w:type="dxa" w:w="2260"/>
+            <w:tcMar>
+              <w:top w:w="80" w:type="dxa"/>
+              <w:start w:w="120" w:type="dxa"/>
+              <w:bottom w:w="80" w:type="dxa"/>
+              <w:end w:w="120" w:type="dxa"/>
+            </w:tcMar>
+            <w:vAlign w:val="center"/>
+            <w:shd w:fill="FFFFFF"/>
+          </w:tcPr>
+          <w:p>
+            <w:pPr>
+              <w:spacing w:before="0" w:after="40" w:line="252" w:lineRule="auto"/>
+              <w:jc w:val="left"/>
+            </w:pPr>
+            <w:r>
+              <w:rPr>
+                <w:rFonts w:ascii="Calibri" w:hAnsi="Calibri"/>
+                <w:b w:val="0"/>
+                <w:color w:val="111827"/>
+                <w:sz w:val="17"/>
+              </w:rPr>
+              <w:t>electric_vehicle:read</w:t>
+            </w:r>
+          </w:p>
+        </w:tc>
+      </w:tr>
+      <w:tr>
+        <w:trPr>
+          <w:cantSplit/>
+        </w:trPr>
+        <w:tc>
+          <w:tcPr>
+            <w:tcW w:type="dxa" w:w="3100"/>
+            <w:tcMar>
+              <w:top w:w="80" w:type="dxa"/>
+              <w:start w:w="120" w:type="dxa"/>
+              <w:bottom w:w="80" w:type="dxa"/>
+              <w:end w:w="120" w:type="dxa"/>
+            </w:tcMar>
+            <w:vAlign w:val="center"/>
+            <w:shd w:fill="FFFFFF"/>
+          </w:tcPr>
+          <w:p>
+            <w:pPr>
+              <w:spacing w:before="0" w:after="40" w:line="252" w:lineRule="auto"/>
+              <w:jc w:val="center"/>
+            </w:pPr>
+            <w:r>
+              <w:rPr>
+                <w:rFonts w:ascii="Calibri" w:hAnsi="Calibri"/>
+                <w:b w:val="0"/>
+                <w:color w:val="111827"/>
+                <w:sz w:val="17"/>
+              </w:rPr>
+              <w:t>POST /api/v1/vehicles/{vehicle_id}/electric/charging/commands</w:t>
+            </w:r>
+          </w:p>
+        </w:tc>
+        <w:tc>
+          <w:tcPr>
+            <w:tcW w:type="dxa" w:w="4000"/>
+            <w:tcMar>
+              <w:top w:w="80" w:type="dxa"/>
+              <w:start w:w="120" w:type="dxa"/>
+              <w:bottom w:w="80" w:type="dxa"/>
+              <w:end w:w="120" w:type="dxa"/>
+            </w:tcMar>
+            <w:vAlign w:val="center"/>
+            <w:shd w:fill="FFFFFF"/>
+          </w:tcPr>
+          <w:p>
+            <w:pPr>
+              <w:spacing w:before="0" w:after="40" w:line="252" w:lineRule="auto"/>
+              <w:jc w:val="left"/>
+            </w:pPr>
+            <w:r>
+              <w:rPr>
+                <w:rFonts w:ascii="Calibri" w:hAnsi="Calibri"/>
+                <w:b w:val="0"/>
+                <w:color w:val="111827"/>
+                <w:sz w:val="17"/>
+              </w:rPr>
+              <w:t>Execute a versioned lifecycle or energy command</w:t>
+            </w:r>
+          </w:p>
+        </w:tc>
+        <w:tc>
+          <w:tcPr>
+            <w:tcW w:type="dxa" w:w="2260"/>
+            <w:tcMar>
+              <w:top w:w="80" w:type="dxa"/>
+              <w:start w:w="120" w:type="dxa"/>
+              <w:bottom w:w="80" w:type="dxa"/>
+              <w:end w:w="120" w:type="dxa"/>
+            </w:tcMar>
+            <w:vAlign w:val="center"/>
+            <w:shd w:fill="FFFFFF"/>
+          </w:tcPr>
+          <w:p>
+            <w:pPr>
+              <w:spacing w:before="0" w:after="40" w:line="252" w:lineRule="auto"/>
+              <w:jc w:val="left"/>
+            </w:pPr>
+            <w:r>
+              <w:rPr>
+                <w:rFonts w:ascii="Calibri" w:hAnsi="Calibri"/>
+                <w:b w:val="0"/>
+                <w:color w:val="111827"/>
+                <w:sz w:val="17"/>
+              </w:rPr>
+              <w:t>electric_vehicle:manage</w:t>
+            </w:r>
+          </w:p>
+        </w:tc>
+      </w:tr>
     </w:tbl>
     <w:p>
       <w:pPr>
@@ -6108,6 +6904,390 @@
                 <w:sz w:val="17"/>
               </w:rPr>
               <w:t>A braking command ID was reused differently.</w:t>
+            </w:r>
+          </w:p>
+        </w:tc>
+      </w:tr>
+      <w:tr>
+        <w:trPr>
+          <w:cantSplit/>
+        </w:trPr>
+        <w:tc>
+          <w:tcPr>
+            <w:tcW w:type="dxa" w:w="2700"/>
+            <w:tcMar>
+              <w:top w:w="80" w:type="dxa"/>
+              <w:start w:w="120" w:type="dxa"/>
+              <w:bottom w:w="80" w:type="dxa"/>
+              <w:end w:w="120" w:type="dxa"/>
+            </w:tcMar>
+            <w:vAlign w:val="center"/>
+            <w:shd w:fill="FFFFFF"/>
+          </w:tcPr>
+          <w:p>
+            <w:pPr>
+              <w:spacing w:before="0" w:after="40" w:line="252" w:lineRule="auto"/>
+              <w:jc w:val="left"/>
+            </w:pPr>
+            <w:r>
+              <w:rPr>
+                <w:rFonts w:ascii="Calibri" w:hAnsi="Calibri"/>
+                <w:b w:val="0"/>
+                <w:color w:val="111827"/>
+                <w:sz w:val="17"/>
+              </w:rPr>
+              <w:t>charging_system_already_exists</w:t>
+            </w:r>
+          </w:p>
+        </w:tc>
+        <w:tc>
+          <w:tcPr>
+            <w:tcW w:type="dxa" w:w="6660"/>
+            <w:tcMar>
+              <w:top w:w="80" w:type="dxa"/>
+              <w:start w:w="120" w:type="dxa"/>
+              <w:bottom w:w="80" w:type="dxa"/>
+              <w:end w:w="120" w:type="dxa"/>
+            </w:tcMar>
+            <w:vAlign w:val="center"/>
+            <w:shd w:fill="FFFFFF"/>
+          </w:tcPr>
+          <w:p>
+            <w:pPr>
+              <w:spacing w:before="0" w:after="40" w:line="252" w:lineRule="auto"/>
+              <w:jc w:val="left"/>
+            </w:pPr>
+            <w:r>
+              <w:rPr>
+                <w:rFonts w:ascii="Calibri" w:hAnsi="Calibri"/>
+                <w:b w:val="0"/>
+                <w:color w:val="111827"/>
+                <w:sz w:val="17"/>
+              </w:rPr>
+              <w:t>The vehicle already owns charging state.</w:t>
+            </w:r>
+          </w:p>
+        </w:tc>
+      </w:tr>
+      <w:tr>
+        <w:trPr>
+          <w:cantSplit/>
+        </w:trPr>
+        <w:tc>
+          <w:tcPr>
+            <w:tcW w:type="dxa" w:w="2700"/>
+            <w:tcMar>
+              <w:top w:w="80" w:type="dxa"/>
+              <w:start w:w="120" w:type="dxa"/>
+              <w:bottom w:w="80" w:type="dxa"/>
+              <w:end w:w="120" w:type="dxa"/>
+            </w:tcMar>
+            <w:vAlign w:val="center"/>
+            <w:shd w:fill="FFFFFF"/>
+          </w:tcPr>
+          <w:p>
+            <w:pPr>
+              <w:spacing w:before="0" w:after="40" w:line="252" w:lineRule="auto"/>
+              <w:jc w:val="left"/>
+            </w:pPr>
+            <w:r>
+              <w:rPr>
+                <w:rFonts w:ascii="Calibri" w:hAnsi="Calibri"/>
+                <w:b w:val="0"/>
+                <w:color w:val="111827"/>
+                <w:sz w:val="17"/>
+              </w:rPr>
+              <w:t>charging_system_not_found</w:t>
+            </w:r>
+          </w:p>
+        </w:tc>
+        <w:tc>
+          <w:tcPr>
+            <w:tcW w:type="dxa" w:w="6660"/>
+            <w:tcMar>
+              <w:top w:w="80" w:type="dxa"/>
+              <w:start w:w="120" w:type="dxa"/>
+              <w:bottom w:w="80" w:type="dxa"/>
+              <w:end w:w="120" w:type="dxa"/>
+            </w:tcMar>
+            <w:vAlign w:val="center"/>
+            <w:shd w:fill="FFFFFF"/>
+          </w:tcPr>
+          <w:p>
+            <w:pPr>
+              <w:spacing w:before="0" w:after="40" w:line="252" w:lineRule="auto"/>
+              <w:jc w:val="left"/>
+            </w:pPr>
+            <w:r>
+              <w:rPr>
+                <w:rFonts w:ascii="Calibri" w:hAnsi="Calibri"/>
+                <w:b w:val="0"/>
+                <w:color w:val="111827"/>
+                <w:sz w:val="17"/>
+              </w:rPr>
+              <w:t>No charging state exists for the vehicle.</w:t>
+            </w:r>
+          </w:p>
+        </w:tc>
+      </w:tr>
+      <w:tr>
+        <w:trPr>
+          <w:cantSplit/>
+        </w:trPr>
+        <w:tc>
+          <w:tcPr>
+            <w:tcW w:type="dxa" w:w="2700"/>
+            <w:tcMar>
+              <w:top w:w="80" w:type="dxa"/>
+              <w:start w:w="120" w:type="dxa"/>
+              <w:bottom w:w="80" w:type="dxa"/>
+              <w:end w:w="120" w:type="dxa"/>
+            </w:tcMar>
+            <w:vAlign w:val="center"/>
+            <w:shd w:fill="FFFFFF"/>
+          </w:tcPr>
+          <w:p>
+            <w:pPr>
+              <w:spacing w:before="0" w:after="40" w:line="252" w:lineRule="auto"/>
+              <w:jc w:val="left"/>
+            </w:pPr>
+            <w:r>
+              <w:rPr>
+                <w:rFonts w:ascii="Calibri" w:hAnsi="Calibri"/>
+                <w:b w:val="0"/>
+                <w:color w:val="111827"/>
+                <w:sz w:val="17"/>
+              </w:rPr>
+              <w:t>charging_state_version_conflict</w:t>
+            </w:r>
+          </w:p>
+        </w:tc>
+        <w:tc>
+          <w:tcPr>
+            <w:tcW w:type="dxa" w:w="6660"/>
+            <w:tcMar>
+              <w:top w:w="80" w:type="dxa"/>
+              <w:start w:w="120" w:type="dxa"/>
+              <w:bottom w:w="80" w:type="dxa"/>
+              <w:end w:w="120" w:type="dxa"/>
+            </w:tcMar>
+            <w:vAlign w:val="center"/>
+            <w:shd w:fill="FFFFFF"/>
+          </w:tcPr>
+          <w:p>
+            <w:pPr>
+              <w:spacing w:before="0" w:after="40" w:line="252" w:lineRule="auto"/>
+              <w:jc w:val="left"/>
+            </w:pPr>
+            <w:r>
+              <w:rPr>
+                <w:rFonts w:ascii="Calibri" w:hAnsi="Calibri"/>
+                <w:b w:val="0"/>
+                <w:color w:val="111827"/>
+                <w:sz w:val="17"/>
+              </w:rPr>
+              <w:t xml:space="preserve">The charging </w:t>
+            </w:r>
+            <w:r>
+              <w:rPr>
+                <w:rFonts w:ascii="Calibri" w:hAnsi="Calibri"/>
+                <w:b w:val="0"/>
+                <w:color w:val="111827"/>
+                <w:sz w:val="17"/>
+              </w:rPr>
+              <w:t>expected_version</w:t>
+            </w:r>
+            <w:r>
+              <w:rPr>
+                <w:rFonts w:ascii="Calibri" w:hAnsi="Calibri"/>
+                <w:b w:val="0"/>
+                <w:color w:val="111827"/>
+                <w:sz w:val="17"/>
+              </w:rPr>
+              <w:t xml:space="preserve"> is stale.</w:t>
+            </w:r>
+          </w:p>
+        </w:tc>
+      </w:tr>
+      <w:tr>
+        <w:trPr>
+          <w:cantSplit/>
+        </w:trPr>
+        <w:tc>
+          <w:tcPr>
+            <w:tcW w:type="dxa" w:w="2700"/>
+            <w:tcMar>
+              <w:top w:w="80" w:type="dxa"/>
+              <w:start w:w="120" w:type="dxa"/>
+              <w:bottom w:w="80" w:type="dxa"/>
+              <w:end w:w="120" w:type="dxa"/>
+            </w:tcMar>
+            <w:vAlign w:val="center"/>
+            <w:shd w:fill="FFFFFF"/>
+          </w:tcPr>
+          <w:p>
+            <w:pPr>
+              <w:spacing w:before="0" w:after="40" w:line="252" w:lineRule="auto"/>
+              <w:jc w:val="left"/>
+            </w:pPr>
+            <w:r>
+              <w:rPr>
+                <w:rFonts w:ascii="Calibri" w:hAnsi="Calibri"/>
+                <w:b w:val="0"/>
+                <w:color w:val="111827"/>
+                <w:sz w:val="17"/>
+              </w:rPr>
+              <w:t>charging_battery_version_conflict</w:t>
+            </w:r>
+          </w:p>
+        </w:tc>
+        <w:tc>
+          <w:tcPr>
+            <w:tcW w:type="dxa" w:w="6660"/>
+            <w:tcMar>
+              <w:top w:w="80" w:type="dxa"/>
+              <w:start w:w="120" w:type="dxa"/>
+              <w:bottom w:w="80" w:type="dxa"/>
+              <w:end w:w="120" w:type="dxa"/>
+            </w:tcMar>
+            <w:vAlign w:val="center"/>
+            <w:shd w:fill="FFFFFF"/>
+          </w:tcPr>
+          <w:p>
+            <w:pPr>
+              <w:spacing w:before="0" w:after="40" w:line="252" w:lineRule="auto"/>
+              <w:jc w:val="left"/>
+            </w:pPr>
+            <w:r>
+              <w:rPr>
+                <w:rFonts w:ascii="Calibri" w:hAnsi="Calibri"/>
+                <w:b w:val="0"/>
+                <w:color w:val="111827"/>
+                <w:sz w:val="17"/>
+              </w:rPr>
+              <w:t>The battery version supplied to charging is stale.</w:t>
+            </w:r>
+          </w:p>
+        </w:tc>
+      </w:tr>
+      <w:tr>
+        <w:trPr>
+          <w:cantSplit/>
+        </w:trPr>
+        <w:tc>
+          <w:tcPr>
+            <w:tcW w:type="dxa" w:w="2700"/>
+            <w:tcMar>
+              <w:top w:w="80" w:type="dxa"/>
+              <w:start w:w="120" w:type="dxa"/>
+              <w:bottom w:w="80" w:type="dxa"/>
+              <w:end w:w="120" w:type="dxa"/>
+            </w:tcMar>
+            <w:vAlign w:val="center"/>
+            <w:shd w:fill="FFFFFF"/>
+          </w:tcPr>
+          <w:p>
+            <w:pPr>
+              <w:spacing w:before="0" w:after="40" w:line="252" w:lineRule="auto"/>
+              <w:jc w:val="left"/>
+            </w:pPr>
+            <w:r>
+              <w:rPr>
+                <w:rFonts w:ascii="Calibri" w:hAnsi="Calibri"/>
+                <w:b w:val="0"/>
+                <w:color w:val="111827"/>
+                <w:sz w:val="17"/>
+              </w:rPr>
+              <w:t>charging_command_conflict</w:t>
+            </w:r>
+          </w:p>
+        </w:tc>
+        <w:tc>
+          <w:tcPr>
+            <w:tcW w:type="dxa" w:w="6660"/>
+            <w:tcMar>
+              <w:top w:w="80" w:type="dxa"/>
+              <w:start w:w="120" w:type="dxa"/>
+              <w:bottom w:w="80" w:type="dxa"/>
+              <w:end w:w="120" w:type="dxa"/>
+            </w:tcMar>
+            <w:vAlign w:val="center"/>
+            <w:shd w:fill="FFFFFF"/>
+          </w:tcPr>
+          <w:p>
+            <w:pPr>
+              <w:spacing w:before="0" w:after="40" w:line="252" w:lineRule="auto"/>
+              <w:jc w:val="left"/>
+            </w:pPr>
+            <w:r>
+              <w:rPr>
+                <w:rFonts w:ascii="Calibri" w:hAnsi="Calibri"/>
+                <w:b w:val="0"/>
+                <w:color w:val="111827"/>
+                <w:sz w:val="17"/>
+              </w:rPr>
+              <w:t>A charging command ID was reused differently.</w:t>
+            </w:r>
+          </w:p>
+        </w:tc>
+      </w:tr>
+      <w:tr>
+        <w:trPr>
+          <w:cantSplit/>
+        </w:trPr>
+        <w:tc>
+          <w:tcPr>
+            <w:tcW w:type="dxa" w:w="2700"/>
+            <w:tcMar>
+              <w:top w:w="80" w:type="dxa"/>
+              <w:start w:w="120" w:type="dxa"/>
+              <w:bottom w:w="80" w:type="dxa"/>
+              <w:end w:w="120" w:type="dxa"/>
+            </w:tcMar>
+            <w:vAlign w:val="center"/>
+            <w:shd w:fill="FFFFFF"/>
+          </w:tcPr>
+          <w:p>
+            <w:pPr>
+              <w:spacing w:before="0" w:after="40" w:line="252" w:lineRule="auto"/>
+              <w:jc w:val="left"/>
+            </w:pPr>
+            <w:r>
+              <w:rPr>
+                <w:rFonts w:ascii="Calibri" w:hAnsi="Calibri"/>
+                <w:b w:val="0"/>
+                <w:color w:val="111827"/>
+                <w:sz w:val="17"/>
+              </w:rPr>
+              <w:t>charging_transition_invalid</w:t>
+            </w:r>
+          </w:p>
+        </w:tc>
+        <w:tc>
+          <w:tcPr>
+            <w:tcW w:type="dxa" w:w="6660"/>
+            <w:tcMar>
+              <w:top w:w="80" w:type="dxa"/>
+              <w:start w:w="120" w:type="dxa"/>
+              <w:bottom w:w="80" w:type="dxa"/>
+              <w:end w:w="120" w:type="dxa"/>
+            </w:tcMar>
+            <w:vAlign w:val="center"/>
+            <w:shd w:fill="FFFFFF"/>
+          </w:tcPr>
+          <w:p>
+            <w:pPr>
+              <w:spacing w:before="0" w:after="40" w:line="252" w:lineRule="auto"/>
+              <w:jc w:val="left"/>
+            </w:pPr>
+            <w:r>
+              <w:rPr>
+                <w:rFonts w:ascii="Calibri" w:hAnsi="Calibri"/>
+                <w:b w:val="0"/>
+                <w:color w:val="111827"/>
+                <w:sz w:val="17"/>
+              </w:rPr>
+              <w:t>An action is invalid from the current lifecycle state.</w:t>
             </w:r>
           </w:p>
         </w:tc>
@@ -6401,7 +7581,55 @@
           <w:color w:val="111827"/>
           <w:sz w:val="22"/>
         </w:rPr>
-        <w:t>. Database checks reinforce bounded states, versions, and durations.</w:t>
+        <w:t xml:space="preserve">. Database checks reinforce bounded states, versions, and durations. Migration </w:t>
+      </w:r>
+      <w:r>
+        <w:rPr>
+          <w:rFonts w:ascii="Consolas" w:hAnsi="Consolas"/>
+          <w:color w:val="1F4D78"/>
+          <w:sz w:val="19"/>
+        </w:rPr>
+        <w:t>0040_charging_sessions</w:t>
+      </w:r>
+      <w:r>
+        <w:rPr>
+          <w:rFonts w:ascii="Calibri" w:hAnsi="Calibri"/>
+          <w:color w:val="111827"/>
+          <w:sz w:val="22"/>
+        </w:rPr>
+        <w:t xml:space="preserve"> creates </w:t>
+      </w:r>
+      <w:r>
+        <w:rPr>
+          <w:rFonts w:ascii="Consolas" w:hAnsi="Consolas"/>
+          <w:color w:val="1F4D78"/>
+          <w:sz w:val="19"/>
+        </w:rPr>
+        <w:t>charging_system_states</w:t>
+      </w:r>
+      <w:r>
+        <w:rPr>
+          <w:rFonts w:ascii="Calibri" w:hAnsi="Calibri"/>
+          <w:color w:val="111827"/>
+          <w:sz w:val="22"/>
+        </w:rPr>
+        <w:t xml:space="preserve"> and </w:t>
+      </w:r>
+      <w:r>
+        <w:rPr>
+          <w:rFonts w:ascii="Consolas" w:hAnsi="Consolas"/>
+          <w:color w:val="1F4D78"/>
+          <w:sz w:val="19"/>
+        </w:rPr>
+        <w:t>charging_command_steps</w:t>
+      </w:r>
+      <w:r>
+        <w:rPr>
+          <w:rFonts w:ascii="Calibri" w:hAnsi="Calibri"/>
+          <w:color w:val="111827"/>
+          <w:sz w:val="22"/>
+        </w:rPr>
+        <w:t>.</w:t>
       </w:r>
     </w:p>
     <w:tbl>
@@ -7049,6 +8277,184 @@
           </w:p>
         </w:tc>
       </w:tr>
+      <w:tr>
+        <w:trPr>
+          <w:cantSplit/>
+        </w:trPr>
+        <w:tc>
+          <w:tcPr>
+            <w:tcW w:type="dxa" w:w="1650"/>
+            <w:tcMar>
+              <w:top w:w="80" w:type="dxa"/>
+              <w:start w:w="120" w:type="dxa"/>
+              <w:bottom w:w="80" w:type="dxa"/>
+              <w:end w:w="120" w:type="dxa"/>
+            </w:tcMar>
+            <w:vAlign w:val="center"/>
+            <w:shd w:fill="FFFFFF"/>
+          </w:tcPr>
+          <w:p>
+            <w:pPr>
+              <w:spacing w:before="0" w:after="40" w:line="252" w:lineRule="auto"/>
+              <w:jc w:val="center"/>
+            </w:pPr>
+            <w:r>
+              <w:rPr>
+                <w:rFonts w:ascii="Calibri" w:hAnsi="Calibri"/>
+                <w:b w:val="0"/>
+                <w:color w:val="111827"/>
+                <w:sz w:val="17"/>
+              </w:rPr>
+              <w:t>atep.electric_vehicle.charging_system.created.v1</w:t>
+            </w:r>
+          </w:p>
+        </w:tc>
+        <w:tc>
+          <w:tcPr>
+            <w:tcW w:type="dxa" w:w="4450"/>
+            <w:tcMar>
+              <w:top w:w="80" w:type="dxa"/>
+              <w:start w:w="120" w:type="dxa"/>
+              <w:bottom w:w="80" w:type="dxa"/>
+              <w:end w:w="120" w:type="dxa"/>
+            </w:tcMar>
+            <w:vAlign w:val="center"/>
+            <w:shd w:fill="FFFFFF"/>
+          </w:tcPr>
+          <w:p>
+            <w:pPr>
+              <w:spacing w:before="0" w:after="40" w:line="252" w:lineRule="auto"/>
+              <w:jc w:val="left"/>
+            </w:pPr>
+            <w:r>
+              <w:rPr>
+                <w:rFonts w:ascii="Calibri" w:hAnsi="Calibri"/>
+                <w:b w:val="0"/>
+                <w:color w:val="111827"/>
+                <w:sz w:val="17"/>
+              </w:rPr>
+              <w:t>Announce charging capability</w:t>
+            </w:r>
+          </w:p>
+        </w:tc>
+        <w:tc>
+          <w:tcPr>
+            <w:tcW w:type="dxa" w:w="3260"/>
+            <w:tcMar>
+              <w:top w:w="80" w:type="dxa"/>
+              <w:start w:w="120" w:type="dxa"/>
+              <w:bottom w:w="80" w:type="dxa"/>
+              <w:end w:w="120" w:type="dxa"/>
+            </w:tcMar>
+            <w:vAlign w:val="center"/>
+            <w:shd w:fill="FFFFFF"/>
+          </w:tcPr>
+          <w:p>
+            <w:pPr>
+              <w:spacing w:before="0" w:after="40" w:line="252" w:lineRule="auto"/>
+              <w:jc w:val="left"/>
+            </w:pPr>
+            <w:r>
+              <w:rPr>
+                <w:rFonts w:ascii="Calibri" w:hAnsi="Calibri"/>
+                <w:b w:val="0"/>
+                <w:color w:val="111827"/>
+                <w:sz w:val="17"/>
+              </w:rPr>
+              <w:t>Bounded AC/DC configuration only</w:t>
+            </w:r>
+          </w:p>
+        </w:tc>
+      </w:tr>
+      <w:tr>
+        <w:trPr>
+          <w:cantSplit/>
+        </w:trPr>
+        <w:tc>
+          <w:tcPr>
+            <w:tcW w:type="dxa" w:w="1650"/>
+            <w:tcMar>
+              <w:top w:w="80" w:type="dxa"/>
+              <w:start w:w="120" w:type="dxa"/>
+              <w:bottom w:w="80" w:type="dxa"/>
+              <w:end w:w="120" w:type="dxa"/>
+            </w:tcMar>
+            <w:vAlign w:val="center"/>
+            <w:shd w:fill="FFFFFF"/>
+          </w:tcPr>
+          <w:p>
+            <w:pPr>
+              <w:spacing w:before="0" w:after="40" w:line="252" w:lineRule="auto"/>
+              <w:jc w:val="center"/>
+            </w:pPr>
+            <w:r>
+              <w:rPr>
+                <w:rFonts w:ascii="Calibri" w:hAnsi="Calibri"/>
+                <w:b w:val="0"/>
+                <w:color w:val="111827"/>
+                <w:sz w:val="17"/>
+              </w:rPr>
+              <w:t>atep.electric_vehicle.charging.command.completed.v1</w:t>
+            </w:r>
+          </w:p>
+        </w:tc>
+        <w:tc>
+          <w:tcPr>
+            <w:tcW w:type="dxa" w:w="4450"/>
+            <w:tcMar>
+              <w:top w:w="80" w:type="dxa"/>
+              <w:start w:w="120" w:type="dxa"/>
+              <w:bottom w:w="80" w:type="dxa"/>
+              <w:end w:w="120" w:type="dxa"/>
+            </w:tcMar>
+            <w:vAlign w:val="center"/>
+            <w:shd w:fill="FFFFFF"/>
+          </w:tcPr>
+          <w:p>
+            <w:pPr>
+              <w:spacing w:before="0" w:after="40" w:line="252" w:lineRule="auto"/>
+              <w:jc w:val="left"/>
+            </w:pPr>
+            <w:r>
+              <w:rPr>
+                <w:rFonts w:ascii="Calibri" w:hAnsi="Calibri"/>
+                <w:b w:val="0"/>
+                <w:color w:val="111827"/>
+                <w:sz w:val="17"/>
+              </w:rPr>
+              <w:t>Announce lifecycle and energy outcome</w:t>
+            </w:r>
+          </w:p>
+        </w:tc>
+        <w:tc>
+          <w:tcPr>
+            <w:tcW w:type="dxa" w:w="3260"/>
+            <w:tcMar>
+              <w:top w:w="80" w:type="dxa"/>
+              <w:start w:w="120" w:type="dxa"/>
+              <w:bottom w:w="80" w:type="dxa"/>
+              <w:end w:w="120" w:type="dxa"/>
+            </w:tcMar>
+            <w:vAlign w:val="center"/>
+            <w:shd w:fill="FFFFFF"/>
+          </w:tcPr>
+          <w:p>
+            <w:pPr>
+              <w:spacing w:before="0" w:after="40" w:line="252" w:lineRule="auto"/>
+              <w:jc w:val="left"/>
+            </w:pPr>
+            <w:r>
+              <w:rPr>
+                <w:rFonts w:ascii="Calibri" w:hAnsi="Calibri"/>
+                <w:b w:val="0"/>
+                <w:color w:val="111827"/>
+                <w:sz w:val="17"/>
+              </w:rPr>
+              <w:t>Session summary and versions; no cells</w:t>
+            </w:r>
+          </w:p>
+        </w:tc>
+      </w:tr>
     </w:tbl>
     <w:p>
       <w:pPr>
@@ -7072,7 +8478,7 @@
           <w:color w:val="111827"/>
           <w:sz w:val="22"/>
         </w:rPr>
-        <w:t xml:space="preserve">VI-1 through VI-3 implement EV-F-001 through EV-F-043 and EV-NF-001 through EV-NF-016. The authoritative traceability table is maintained in </w:t>
+        <w:t xml:space="preserve">VI-1 through VI-4 implement EV-F-001 through EV-F-060 and EV-NF-001 through EV-NF-020. The authoritative traceability table is maintained in </w:t>
       </w:r>
       <w:r>
         <w:rPr>
@@ -7335,6 +8741,46 @@
     </w:p>
     <w:p>
       <w:pPr>
+        <w:pStyle w:val="Heading2"/>
+        <w:keepNext/>
+        <w:keepLines/>
+      </w:pPr>
+      <w:r>
+        <w:t>ADR-EV-011 - Model Charging as a Versioned State Machine</w:t>
+      </w:r>
+    </w:p>
+    <w:p>
+      <w:r>
+        <w:rPr>
+          <w:rFonts w:ascii="Calibri" w:hAnsi="Calibri"/>
+          <w:color w:val="111827"/>
+          <w:sz w:val="22"/>
+        </w:rPr>
+        <w:t>Decision: express session start, energy transfer, pause, resume, stop, fault injection, and fault clearing as explicit actions. Rationale: invalid transitions become stable test evidence rather than implicit side effects.</w:t>
+      </w:r>
+    </w:p>
+    <w:p>
+      <w:pPr>
+        <w:pStyle w:val="Heading2"/>
+        <w:keepNext/>
+        <w:keepLines/>
+      </w:pPr>
+      <w:r>
+        <w:t>ADR-EV-012 - Commit Charging and Battery State Together</w:t>
+      </w:r>
+    </w:p>
+    <w:p>
+      <w:r>
+        <w:rPr>
+          <w:rFonts w:ascii="Calibri" w:hAnsi="Calibri"/>
+          <w:color w:val="111827"/>
+          <w:sz w:val="22"/>
+        </w:rPr>
+        <w:t>Decision: charging commands validate both versions and commit battery contactors, SOC, session state, replay evidence, audit, and outbox in one transaction. Rationale: a session result cannot claim transferred energy without the matching battery state.</w:t>
+      </w:r>
+    </w:p>
+    <w:p>
+      <w:pPr>
         <w:pStyle w:val="Heading1"/>
         <w:keepNext/>
         <w:keepLines/>
@@ -15201,6 +16647,1878 @@
                 <w:sz w:val="16"/>
               </w:rPr>
               <w:t>SOC stops at 95% and friction supplies the remainder</w:t>
+            </w:r>
+          </w:p>
+        </w:tc>
+      </w:tr>
+      <w:tr>
+        <w:trPr>
+          <w:cantSplit/>
+        </w:trPr>
+        <w:tc>
+          <w:tcPr>
+            <w:tcW w:type="dxa" w:w="1150"/>
+            <w:tcMar>
+              <w:top w:w="80" w:type="dxa"/>
+              <w:start w:w="120" w:type="dxa"/>
+              <w:bottom w:w="80" w:type="dxa"/>
+              <w:end w:w="120" w:type="dxa"/>
+            </w:tcMar>
+            <w:vAlign w:val="center"/>
+            <w:shd w:fill="FFFFFF"/>
+          </w:tcPr>
+          <w:p>
+            <w:pPr>
+              <w:spacing w:before="0" w:after="40" w:line="252" w:lineRule="auto"/>
+              <w:jc w:val="center"/>
+            </w:pPr>
+            <w:r>
+              <w:rPr>
+                <w:rFonts w:ascii="Calibri" w:hAnsi="Calibri"/>
+                <w:b w:val="0"/>
+                <w:color w:val="111827"/>
+                <w:sz w:val="16"/>
+              </w:rPr>
+              <w:t>EV-T-067</w:t>
+            </w:r>
+          </w:p>
+        </w:tc>
+        <w:tc>
+          <w:tcPr>
+            <w:tcW w:type="dxa" w:w="3700"/>
+            <w:tcMar>
+              <w:top w:w="80" w:type="dxa"/>
+              <w:start w:w="120" w:type="dxa"/>
+              <w:bottom w:w="80" w:type="dxa"/>
+              <w:end w:w="120" w:type="dxa"/>
+            </w:tcMar>
+            <w:vAlign w:val="center"/>
+            <w:shd w:fill="FFFFFF"/>
+          </w:tcPr>
+          <w:p>
+            <w:pPr>
+              <w:spacing w:before="0" w:after="40" w:line="252" w:lineRule="auto"/>
+              <w:jc w:val="left"/>
+            </w:pPr>
+            <w:r>
+              <w:rPr>
+                <w:rFonts w:ascii="Calibri" w:hAnsi="Calibri"/>
+                <w:b w:val="0"/>
+                <w:color w:val="111827"/>
+                <w:sz w:val="16"/>
+              </w:rPr>
+              <w:t>Charging contract bounds</w:t>
+            </w:r>
+          </w:p>
+        </w:tc>
+        <w:tc>
+          <w:tcPr>
+            <w:tcW w:type="dxa" w:w="3100"/>
+            <w:tcMar>
+              <w:top w:w="80" w:type="dxa"/>
+              <w:start w:w="120" w:type="dxa"/>
+              <w:bottom w:w="80" w:type="dxa"/>
+              <w:end w:w="120" w:type="dxa"/>
+            </w:tcMar>
+            <w:vAlign w:val="center"/>
+            <w:shd w:fill="FFFFFF"/>
+          </w:tcPr>
+          <w:p>
+            <w:pPr>
+              <w:spacing w:before="0" w:after="40" w:line="252" w:lineRule="auto"/>
+              <w:jc w:val="left"/>
+            </w:pPr>
+            <w:r>
+              <w:rPr>
+                <w:rFonts w:ascii="Calibri" w:hAnsi="Calibri"/>
+                <w:b w:val="0"/>
+                <w:color w:val="111827"/>
+                <w:sz w:val="16"/>
+              </w:rPr>
+              <w:t>Exceed AC/DC power or omit action fields</w:t>
+            </w:r>
+          </w:p>
+        </w:tc>
+        <w:tc>
+          <w:tcPr>
+            <w:tcW w:type="dxa" w:w="1410"/>
+            <w:tcMar>
+              <w:top w:w="80" w:type="dxa"/>
+              <w:start w:w="120" w:type="dxa"/>
+              <w:bottom w:w="80" w:type="dxa"/>
+              <w:end w:w="120" w:type="dxa"/>
+            </w:tcMar>
+            <w:vAlign w:val="center"/>
+            <w:shd w:fill="FFFFFF"/>
+          </w:tcPr>
+          <w:p>
+            <w:pPr>
+              <w:spacing w:before="0" w:after="40" w:line="252" w:lineRule="auto"/>
+              <w:jc w:val="left"/>
+            </w:pPr>
+            <w:r>
+              <w:rPr>
+                <w:rFonts w:ascii="Calibri" w:hAnsi="Calibri"/>
+                <w:b w:val="0"/>
+                <w:color w:val="111827"/>
+                <w:sz w:val="16"/>
+              </w:rPr>
+              <w:t>Stable validation error</w:t>
+            </w:r>
+          </w:p>
+        </w:tc>
+      </w:tr>
+      <w:tr>
+        <w:trPr>
+          <w:cantSplit/>
+        </w:trPr>
+        <w:tc>
+          <w:tcPr>
+            <w:tcW w:type="dxa" w:w="1150"/>
+            <w:tcMar>
+              <w:top w:w="80" w:type="dxa"/>
+              <w:start w:w="120" w:type="dxa"/>
+              <w:bottom w:w="80" w:type="dxa"/>
+              <w:end w:w="120" w:type="dxa"/>
+            </w:tcMar>
+            <w:vAlign w:val="center"/>
+            <w:shd w:fill="FFFFFF"/>
+          </w:tcPr>
+          <w:p>
+            <w:pPr>
+              <w:spacing w:before="0" w:after="40" w:line="252" w:lineRule="auto"/>
+              <w:jc w:val="center"/>
+            </w:pPr>
+            <w:r>
+              <w:rPr>
+                <w:rFonts w:ascii="Calibri" w:hAnsi="Calibri"/>
+                <w:b w:val="0"/>
+                <w:color w:val="111827"/>
+                <w:sz w:val="16"/>
+              </w:rPr>
+              <w:t>EV-T-068</w:t>
+            </w:r>
+          </w:p>
+        </w:tc>
+        <w:tc>
+          <w:tcPr>
+            <w:tcW w:type="dxa" w:w="3700"/>
+            <w:tcMar>
+              <w:top w:w="80" w:type="dxa"/>
+              <w:start w:w="120" w:type="dxa"/>
+              <w:bottom w:w="80" w:type="dxa"/>
+              <w:end w:w="120" w:type="dxa"/>
+            </w:tcMar>
+            <w:vAlign w:val="center"/>
+            <w:shd w:fill="FFFFFF"/>
+          </w:tcPr>
+          <w:p>
+            <w:pPr>
+              <w:spacing w:before="0" w:after="40" w:line="252" w:lineRule="auto"/>
+              <w:jc w:val="left"/>
+            </w:pPr>
+            <w:r>
+              <w:rPr>
+                <w:rFonts w:ascii="Calibri" w:hAnsi="Calibri"/>
+                <w:b w:val="0"/>
+                <w:color w:val="111827"/>
+                <w:sz w:val="16"/>
+              </w:rPr>
+              <w:t>Charging-system creation</w:t>
+            </w:r>
+          </w:p>
+        </w:tc>
+        <w:tc>
+          <w:tcPr>
+            <w:tcW w:type="dxa" w:w="3100"/>
+            <w:tcMar>
+              <w:top w:w="80" w:type="dxa"/>
+              <w:start w:w="120" w:type="dxa"/>
+              <w:bottom w:w="80" w:type="dxa"/>
+              <w:end w:w="120" w:type="dxa"/>
+            </w:tcMar>
+            <w:vAlign w:val="center"/>
+            <w:shd w:fill="FFFFFF"/>
+          </w:tcPr>
+          <w:p>
+            <w:pPr>
+              <w:spacing w:before="0" w:after="40" w:line="252" w:lineRule="auto"/>
+              <w:jc w:val="left"/>
+            </w:pPr>
+            <w:r>
+              <w:rPr>
+                <w:rFonts w:ascii="Calibri" w:hAnsi="Calibri"/>
+                <w:b w:val="0"/>
+                <w:color w:val="111827"/>
+                <w:sz w:val="16"/>
+              </w:rPr>
+              <w:t>Create one state for a battery-equipped vehicle</w:t>
+            </w:r>
+          </w:p>
+        </w:tc>
+        <w:tc>
+          <w:tcPr>
+            <w:tcW w:type="dxa" w:w="1410"/>
+            <w:tcMar>
+              <w:top w:w="80" w:type="dxa"/>
+              <w:start w:w="120" w:type="dxa"/>
+              <w:bottom w:w="80" w:type="dxa"/>
+              <w:end w:w="120" w:type="dxa"/>
+            </w:tcMar>
+            <w:vAlign w:val="center"/>
+            <w:shd w:fill="FFFFFF"/>
+          </w:tcPr>
+          <w:p>
+            <w:pPr>
+              <w:spacing w:before="0" w:after="40" w:line="252" w:lineRule="auto"/>
+              <w:jc w:val="left"/>
+            </w:pPr>
+            <w:r>
+              <w:rPr>
+                <w:rFonts w:ascii="Calibri" w:hAnsi="Calibri"/>
+                <w:b w:val="0"/>
+                <w:color w:val="111827"/>
+                <w:sz w:val="16"/>
+              </w:rPr>
+              <w:t>Version 1 and idle</w:t>
+            </w:r>
+          </w:p>
+        </w:tc>
+      </w:tr>
+      <w:tr>
+        <w:trPr>
+          <w:cantSplit/>
+        </w:trPr>
+        <w:tc>
+          <w:tcPr>
+            <w:tcW w:type="dxa" w:w="1150"/>
+            <w:tcMar>
+              <w:top w:w="80" w:type="dxa"/>
+              <w:start w:w="120" w:type="dxa"/>
+              <w:bottom w:w="80" w:type="dxa"/>
+              <w:end w:w="120" w:type="dxa"/>
+            </w:tcMar>
+            <w:vAlign w:val="center"/>
+            <w:shd w:fill="FFFFFF"/>
+          </w:tcPr>
+          <w:p>
+            <w:pPr>
+              <w:spacing w:before="0" w:after="40" w:line="252" w:lineRule="auto"/>
+              <w:jc w:val="center"/>
+            </w:pPr>
+            <w:r>
+              <w:rPr>
+                <w:rFonts w:ascii="Calibri" w:hAnsi="Calibri"/>
+                <w:b w:val="0"/>
+                <w:color w:val="111827"/>
+                <w:sz w:val="16"/>
+              </w:rPr>
+              <w:t>EV-T-069</w:t>
+            </w:r>
+          </w:p>
+        </w:tc>
+        <w:tc>
+          <w:tcPr>
+            <w:tcW w:type="dxa" w:w="3700"/>
+            <w:tcMar>
+              <w:top w:w="80" w:type="dxa"/>
+              <w:start w:w="120" w:type="dxa"/>
+              <w:bottom w:w="80" w:type="dxa"/>
+              <w:end w:w="120" w:type="dxa"/>
+            </w:tcMar>
+            <w:vAlign w:val="center"/>
+            <w:shd w:fill="FFFFFF"/>
+          </w:tcPr>
+          <w:p>
+            <w:pPr>
+              <w:spacing w:before="0" w:after="40" w:line="252" w:lineRule="auto"/>
+              <w:jc w:val="left"/>
+            </w:pPr>
+            <w:r>
+              <w:rPr>
+                <w:rFonts w:ascii="Calibri" w:hAnsi="Calibri"/>
+                <w:b w:val="0"/>
+                <w:color w:val="111827"/>
+                <w:sz w:val="16"/>
+              </w:rPr>
+              <w:t>Session start</w:t>
+            </w:r>
+          </w:p>
+        </w:tc>
+        <w:tc>
+          <w:tcPr>
+            <w:tcW w:type="dxa" w:w="3100"/>
+            <w:tcMar>
+              <w:top w:w="80" w:type="dxa"/>
+              <w:start w:w="120" w:type="dxa"/>
+              <w:bottom w:w="80" w:type="dxa"/>
+              <w:end w:w="120" w:type="dxa"/>
+            </w:tcMar>
+            <w:vAlign w:val="center"/>
+            <w:shd w:fill="FFFFFF"/>
+          </w:tcPr>
+          <w:p>
+            <w:pPr>
+              <w:spacing w:before="0" w:after="40" w:line="252" w:lineRule="auto"/>
+              <w:jc w:val="left"/>
+            </w:pPr>
+            <w:r>
+              <w:rPr>
+                <w:rFonts w:ascii="Calibri" w:hAnsi="Calibri"/>
+                <w:b w:val="0"/>
+                <w:color w:val="111827"/>
+                <w:sz w:val="16"/>
+              </w:rPr>
+              <w:t>Start with connector, target, and power</w:t>
+            </w:r>
+          </w:p>
+        </w:tc>
+        <w:tc>
+          <w:tcPr>
+            <w:tcW w:type="dxa" w:w="1410"/>
+            <w:tcMar>
+              <w:top w:w="80" w:type="dxa"/>
+              <w:start w:w="120" w:type="dxa"/>
+              <w:bottom w:w="80" w:type="dxa"/>
+              <w:end w:w="120" w:type="dxa"/>
+            </w:tcMar>
+            <w:vAlign w:val="center"/>
+            <w:shd w:fill="FFFFFF"/>
+          </w:tcPr>
+          <w:p>
+            <w:pPr>
+              <w:spacing w:before="0" w:after="40" w:line="252" w:lineRule="auto"/>
+              <w:jc w:val="left"/>
+            </w:pPr>
+            <w:r>
+              <w:rPr>
+                <w:rFonts w:ascii="Calibri" w:hAnsi="Calibri"/>
+                <w:b w:val="0"/>
+                <w:color w:val="111827"/>
+                <w:sz w:val="16"/>
+              </w:rPr>
+              <w:t>Charging and contactors closed</w:t>
+            </w:r>
+          </w:p>
+        </w:tc>
+      </w:tr>
+      <w:tr>
+        <w:trPr>
+          <w:cantSplit/>
+        </w:trPr>
+        <w:tc>
+          <w:tcPr>
+            <w:tcW w:type="dxa" w:w="1150"/>
+            <w:tcMar>
+              <w:top w:w="80" w:type="dxa"/>
+              <w:start w:w="120" w:type="dxa"/>
+              <w:bottom w:w="80" w:type="dxa"/>
+              <w:end w:w="120" w:type="dxa"/>
+            </w:tcMar>
+            <w:vAlign w:val="center"/>
+            <w:shd w:fill="FFFFFF"/>
+          </w:tcPr>
+          <w:p>
+            <w:pPr>
+              <w:spacing w:before="0" w:after="40" w:line="252" w:lineRule="auto"/>
+              <w:jc w:val="center"/>
+            </w:pPr>
+            <w:r>
+              <w:rPr>
+                <w:rFonts w:ascii="Calibri" w:hAnsi="Calibri"/>
+                <w:b w:val="0"/>
+                <w:color w:val="111827"/>
+                <w:sz w:val="16"/>
+              </w:rPr>
+              <w:t>EV-T-070</w:t>
+            </w:r>
+          </w:p>
+        </w:tc>
+        <w:tc>
+          <w:tcPr>
+            <w:tcW w:type="dxa" w:w="3700"/>
+            <w:tcMar>
+              <w:top w:w="80" w:type="dxa"/>
+              <w:start w:w="120" w:type="dxa"/>
+              <w:bottom w:w="80" w:type="dxa"/>
+              <w:end w:w="120" w:type="dxa"/>
+            </w:tcMar>
+            <w:vAlign w:val="center"/>
+            <w:shd w:fill="FFFFFF"/>
+          </w:tcPr>
+          <w:p>
+            <w:pPr>
+              <w:spacing w:before="0" w:after="40" w:line="252" w:lineRule="auto"/>
+              <w:jc w:val="left"/>
+            </w:pPr>
+            <w:r>
+              <w:rPr>
+                <w:rFonts w:ascii="Calibri" w:hAnsi="Calibri"/>
+                <w:b w:val="0"/>
+                <w:color w:val="111827"/>
+                <w:sz w:val="16"/>
+              </w:rPr>
+              <w:t>AC energy transfer</w:t>
+            </w:r>
+          </w:p>
+        </w:tc>
+        <w:tc>
+          <w:tcPr>
+            <w:tcW w:type="dxa" w:w="3100"/>
+            <w:tcMar>
+              <w:top w:w="80" w:type="dxa"/>
+              <w:start w:w="120" w:type="dxa"/>
+              <w:bottom w:w="80" w:type="dxa"/>
+              <w:end w:w="120" w:type="dxa"/>
+            </w:tcMar>
+            <w:vAlign w:val="center"/>
+            <w:shd w:fill="FFFFFF"/>
+          </w:tcPr>
+          <w:p>
+            <w:pPr>
+              <w:spacing w:before="0" w:after="40" w:line="252" w:lineRule="auto"/>
+              <w:jc w:val="left"/>
+            </w:pPr>
+            <w:r>
+              <w:rPr>
+                <w:rFonts w:ascii="Calibri" w:hAnsi="Calibri"/>
+                <w:b w:val="0"/>
+                <w:color w:val="111827"/>
+                <w:sz w:val="16"/>
+              </w:rPr>
+              <w:t>Charge through AC Type 2</w:t>
+            </w:r>
+          </w:p>
+        </w:tc>
+        <w:tc>
+          <w:tcPr>
+            <w:tcW w:type="dxa" w:w="1410"/>
+            <w:tcMar>
+              <w:top w:w="80" w:type="dxa"/>
+              <w:start w:w="120" w:type="dxa"/>
+              <w:bottom w:w="80" w:type="dxa"/>
+              <w:end w:w="120" w:type="dxa"/>
+            </w:tcMar>
+            <w:vAlign w:val="center"/>
+            <w:shd w:fill="FFFFFF"/>
+          </w:tcPr>
+          <w:p>
+            <w:pPr>
+              <w:spacing w:before="0" w:after="40" w:line="252" w:lineRule="auto"/>
+              <w:jc w:val="left"/>
+            </w:pPr>
+            <w:r>
+              <w:rPr>
+                <w:rFonts w:ascii="Calibri" w:hAnsi="Calibri"/>
+                <w:b w:val="0"/>
+                <w:color w:val="111827"/>
+                <w:sz w:val="16"/>
+              </w:rPr>
+              <w:t>Energy and SOC increase deterministically</w:t>
+            </w:r>
+          </w:p>
+        </w:tc>
+      </w:tr>
+      <w:tr>
+        <w:trPr>
+          <w:cantSplit/>
+        </w:trPr>
+        <w:tc>
+          <w:tcPr>
+            <w:tcW w:type="dxa" w:w="1150"/>
+            <w:tcMar>
+              <w:top w:w="80" w:type="dxa"/>
+              <w:start w:w="120" w:type="dxa"/>
+              <w:bottom w:w="80" w:type="dxa"/>
+              <w:end w:w="120" w:type="dxa"/>
+            </w:tcMar>
+            <w:vAlign w:val="center"/>
+            <w:shd w:fill="FFFFFF"/>
+          </w:tcPr>
+          <w:p>
+            <w:pPr>
+              <w:spacing w:before="0" w:after="40" w:line="252" w:lineRule="auto"/>
+              <w:jc w:val="center"/>
+            </w:pPr>
+            <w:r>
+              <w:rPr>
+                <w:rFonts w:ascii="Calibri" w:hAnsi="Calibri"/>
+                <w:b w:val="0"/>
+                <w:color w:val="111827"/>
+                <w:sz w:val="16"/>
+              </w:rPr>
+              <w:t>EV-T-071</w:t>
+            </w:r>
+          </w:p>
+        </w:tc>
+        <w:tc>
+          <w:tcPr>
+            <w:tcW w:type="dxa" w:w="3700"/>
+            <w:tcMar>
+              <w:top w:w="80" w:type="dxa"/>
+              <w:start w:w="120" w:type="dxa"/>
+              <w:bottom w:w="80" w:type="dxa"/>
+              <w:end w:w="120" w:type="dxa"/>
+            </w:tcMar>
+            <w:vAlign w:val="center"/>
+            <w:shd w:fill="FFFFFF"/>
+          </w:tcPr>
+          <w:p>
+            <w:pPr>
+              <w:spacing w:before="0" w:after="40" w:line="252" w:lineRule="auto"/>
+              <w:jc w:val="left"/>
+            </w:pPr>
+            <w:r>
+              <w:rPr>
+                <w:rFonts w:ascii="Calibri" w:hAnsi="Calibri"/>
+                <w:b w:val="0"/>
+                <w:color w:val="111827"/>
+                <w:sz w:val="16"/>
+              </w:rPr>
+              <w:t>DC power limit</w:t>
+            </w:r>
+          </w:p>
+        </w:tc>
+        <w:tc>
+          <w:tcPr>
+            <w:tcW w:type="dxa" w:w="3100"/>
+            <w:tcMar>
+              <w:top w:w="80" w:type="dxa"/>
+              <w:start w:w="120" w:type="dxa"/>
+              <w:bottom w:w="80" w:type="dxa"/>
+              <w:end w:w="120" w:type="dxa"/>
+            </w:tcMar>
+            <w:vAlign w:val="center"/>
+            <w:shd w:fill="FFFFFF"/>
+          </w:tcPr>
+          <w:p>
+            <w:pPr>
+              <w:spacing w:before="0" w:after="40" w:line="252" w:lineRule="auto"/>
+              <w:jc w:val="left"/>
+            </w:pPr>
+            <w:r>
+              <w:rPr>
+                <w:rFonts w:ascii="Calibri" w:hAnsi="Calibri"/>
+                <w:b w:val="0"/>
+                <w:color w:val="111827"/>
+                <w:sz w:val="16"/>
+              </w:rPr>
+              <w:t>Request above DC or battery capacity</w:t>
+            </w:r>
+          </w:p>
+        </w:tc>
+        <w:tc>
+          <w:tcPr>
+            <w:tcW w:type="dxa" w:w="1410"/>
+            <w:tcMar>
+              <w:top w:w="80" w:type="dxa"/>
+              <w:start w:w="120" w:type="dxa"/>
+              <w:bottom w:w="80" w:type="dxa"/>
+              <w:end w:w="120" w:type="dxa"/>
+            </w:tcMar>
+            <w:vAlign w:val="center"/>
+            <w:shd w:fill="FFFFFF"/>
+          </w:tcPr>
+          <w:p>
+            <w:pPr>
+              <w:spacing w:before="0" w:after="40" w:line="252" w:lineRule="auto"/>
+              <w:jc w:val="left"/>
+            </w:pPr>
+            <w:r>
+              <w:rPr>
+                <w:rFonts w:ascii="Calibri" w:hAnsi="Calibri"/>
+                <w:b w:val="0"/>
+                <w:color w:val="111827"/>
+                <w:sz w:val="16"/>
+              </w:rPr>
+              <w:t>Delivered power is capped</w:t>
+            </w:r>
+          </w:p>
+        </w:tc>
+      </w:tr>
+      <w:tr>
+        <w:trPr>
+          <w:cantSplit/>
+        </w:trPr>
+        <w:tc>
+          <w:tcPr>
+            <w:tcW w:type="dxa" w:w="1150"/>
+            <w:tcMar>
+              <w:top w:w="80" w:type="dxa"/>
+              <w:start w:w="120" w:type="dxa"/>
+              <w:bottom w:w="80" w:type="dxa"/>
+              <w:end w:w="120" w:type="dxa"/>
+            </w:tcMar>
+            <w:vAlign w:val="center"/>
+            <w:shd w:fill="FFFFFF"/>
+          </w:tcPr>
+          <w:p>
+            <w:pPr>
+              <w:spacing w:before="0" w:after="40" w:line="252" w:lineRule="auto"/>
+              <w:jc w:val="center"/>
+            </w:pPr>
+            <w:r>
+              <w:rPr>
+                <w:rFonts w:ascii="Calibri" w:hAnsi="Calibri"/>
+                <w:b w:val="0"/>
+                <w:color w:val="111827"/>
+                <w:sz w:val="16"/>
+              </w:rPr>
+              <w:t>EV-T-072</w:t>
+            </w:r>
+          </w:p>
+        </w:tc>
+        <w:tc>
+          <w:tcPr>
+            <w:tcW w:type="dxa" w:w="3700"/>
+            <w:tcMar>
+              <w:top w:w="80" w:type="dxa"/>
+              <w:start w:w="120" w:type="dxa"/>
+              <w:bottom w:w="80" w:type="dxa"/>
+              <w:end w:w="120" w:type="dxa"/>
+            </w:tcMar>
+            <w:vAlign w:val="center"/>
+            <w:shd w:fill="FFFFFF"/>
+          </w:tcPr>
+          <w:p>
+            <w:pPr>
+              <w:spacing w:before="0" w:after="40" w:line="252" w:lineRule="auto"/>
+              <w:jc w:val="left"/>
+            </w:pPr>
+            <w:r>
+              <w:rPr>
+                <w:rFonts w:ascii="Calibri" w:hAnsi="Calibri"/>
+                <w:b w:val="0"/>
+                <w:color w:val="111827"/>
+                <w:sz w:val="16"/>
+              </w:rPr>
+              <w:t>Charge taper</w:t>
+            </w:r>
+          </w:p>
+        </w:tc>
+        <w:tc>
+          <w:tcPr>
+            <w:tcW w:type="dxa" w:w="3100"/>
+            <w:tcMar>
+              <w:top w:w="80" w:type="dxa"/>
+              <w:start w:w="120" w:type="dxa"/>
+              <w:bottom w:w="80" w:type="dxa"/>
+              <w:end w:w="120" w:type="dxa"/>
+            </w:tcMar>
+            <w:vAlign w:val="center"/>
+            <w:shd w:fill="FFFFFF"/>
+          </w:tcPr>
+          <w:p>
+            <w:pPr>
+              <w:spacing w:before="0" w:after="40" w:line="252" w:lineRule="auto"/>
+              <w:jc w:val="left"/>
+            </w:pPr>
+            <w:r>
+              <w:rPr>
+                <w:rFonts w:ascii="Calibri" w:hAnsi="Calibri"/>
+                <w:b w:val="0"/>
+                <w:color w:val="111827"/>
+                <w:sz w:val="16"/>
+              </w:rPr>
+              <w:t>Compare DC acceptance below and above 80% SOC</w:t>
+            </w:r>
+          </w:p>
+        </w:tc>
+        <w:tc>
+          <w:tcPr>
+            <w:tcW w:type="dxa" w:w="1410"/>
+            <w:tcMar>
+              <w:top w:w="80" w:type="dxa"/>
+              <w:start w:w="120" w:type="dxa"/>
+              <w:bottom w:w="80" w:type="dxa"/>
+              <w:end w:w="120" w:type="dxa"/>
+            </w:tcMar>
+            <w:vAlign w:val="center"/>
+            <w:shd w:fill="FFFFFF"/>
+          </w:tcPr>
+          <w:p>
+            <w:pPr>
+              <w:spacing w:before="0" w:after="40" w:line="252" w:lineRule="auto"/>
+              <w:jc w:val="left"/>
+            </w:pPr>
+            <w:r>
+              <w:rPr>
+                <w:rFonts w:ascii="Calibri" w:hAnsi="Calibri"/>
+                <w:b w:val="0"/>
+                <w:color w:val="111827"/>
+                <w:sz w:val="16"/>
+              </w:rPr>
+              <w:t>Higher SOC has lower acceptance</w:t>
+            </w:r>
+          </w:p>
+        </w:tc>
+      </w:tr>
+      <w:tr>
+        <w:trPr>
+          <w:cantSplit/>
+        </w:trPr>
+        <w:tc>
+          <w:tcPr>
+            <w:tcW w:type="dxa" w:w="1150"/>
+            <w:tcMar>
+              <w:top w:w="80" w:type="dxa"/>
+              <w:start w:w="120" w:type="dxa"/>
+              <w:bottom w:w="80" w:type="dxa"/>
+              <w:end w:w="120" w:type="dxa"/>
+            </w:tcMar>
+            <w:vAlign w:val="center"/>
+            <w:shd w:fill="FFFFFF"/>
+          </w:tcPr>
+          <w:p>
+            <w:pPr>
+              <w:spacing w:before="0" w:after="40" w:line="252" w:lineRule="auto"/>
+              <w:jc w:val="center"/>
+            </w:pPr>
+            <w:r>
+              <w:rPr>
+                <w:rFonts w:ascii="Calibri" w:hAnsi="Calibri"/>
+                <w:b w:val="0"/>
+                <w:color w:val="111827"/>
+                <w:sz w:val="16"/>
+              </w:rPr>
+              <w:t>EV-T-073</w:t>
+            </w:r>
+          </w:p>
+        </w:tc>
+        <w:tc>
+          <w:tcPr>
+            <w:tcW w:type="dxa" w:w="3700"/>
+            <w:tcMar>
+              <w:top w:w="80" w:type="dxa"/>
+              <w:start w:w="120" w:type="dxa"/>
+              <w:bottom w:w="80" w:type="dxa"/>
+              <w:end w:w="120" w:type="dxa"/>
+            </w:tcMar>
+            <w:vAlign w:val="center"/>
+            <w:shd w:fill="FFFFFF"/>
+          </w:tcPr>
+          <w:p>
+            <w:pPr>
+              <w:spacing w:before="0" w:after="40" w:line="252" w:lineRule="auto"/>
+              <w:jc w:val="left"/>
+            </w:pPr>
+            <w:r>
+              <w:rPr>
+                <w:rFonts w:ascii="Calibri" w:hAnsi="Calibri"/>
+                <w:b w:val="0"/>
+                <w:color w:val="111827"/>
+                <w:sz w:val="16"/>
+              </w:rPr>
+              <w:t>Target-SOC ceiling</w:t>
+            </w:r>
+          </w:p>
+        </w:tc>
+        <w:tc>
+          <w:tcPr>
+            <w:tcW w:type="dxa" w:w="3100"/>
+            <w:tcMar>
+              <w:top w:w="80" w:type="dxa"/>
+              <w:start w:w="120" w:type="dxa"/>
+              <w:bottom w:w="80" w:type="dxa"/>
+              <w:end w:w="120" w:type="dxa"/>
+            </w:tcMar>
+            <w:vAlign w:val="center"/>
+            <w:shd w:fill="FFFFFF"/>
+          </w:tcPr>
+          <w:p>
+            <w:pPr>
+              <w:spacing w:before="0" w:after="40" w:line="252" w:lineRule="auto"/>
+              <w:jc w:val="left"/>
+            </w:pPr>
+            <w:r>
+              <w:rPr>
+                <w:rFonts w:ascii="Calibri" w:hAnsi="Calibri"/>
+                <w:b w:val="0"/>
+                <w:color w:val="111827"/>
+                <w:sz w:val="16"/>
+              </w:rPr>
+              <w:t>Use a long step near the target</w:t>
+            </w:r>
+          </w:p>
+        </w:tc>
+        <w:tc>
+          <w:tcPr>
+            <w:tcW w:type="dxa" w:w="1410"/>
+            <w:tcMar>
+              <w:top w:w="80" w:type="dxa"/>
+              <w:start w:w="120" w:type="dxa"/>
+              <w:bottom w:w="80" w:type="dxa"/>
+              <w:end w:w="120" w:type="dxa"/>
+            </w:tcMar>
+            <w:vAlign w:val="center"/>
+            <w:shd w:fill="FFFFFF"/>
+          </w:tcPr>
+          <w:p>
+            <w:pPr>
+              <w:spacing w:before="0" w:after="40" w:line="252" w:lineRule="auto"/>
+              <w:jc w:val="left"/>
+            </w:pPr>
+            <w:r>
+              <w:rPr>
+                <w:rFonts w:ascii="Calibri" w:hAnsi="Calibri"/>
+                <w:b w:val="0"/>
+                <w:color w:val="111827"/>
+                <w:sz w:val="16"/>
+              </w:rPr>
+              <w:t>Exact target, completed, contactors open</w:t>
+            </w:r>
+          </w:p>
+        </w:tc>
+      </w:tr>
+      <w:tr>
+        <w:trPr>
+          <w:cantSplit/>
+        </w:trPr>
+        <w:tc>
+          <w:tcPr>
+            <w:tcW w:type="dxa" w:w="1150"/>
+            <w:tcMar>
+              <w:top w:w="80" w:type="dxa"/>
+              <w:start w:w="120" w:type="dxa"/>
+              <w:bottom w:w="80" w:type="dxa"/>
+              <w:end w:w="120" w:type="dxa"/>
+            </w:tcMar>
+            <w:vAlign w:val="center"/>
+            <w:shd w:fill="FFFFFF"/>
+          </w:tcPr>
+          <w:p>
+            <w:pPr>
+              <w:spacing w:before="0" w:after="40" w:line="252" w:lineRule="auto"/>
+              <w:jc w:val="center"/>
+            </w:pPr>
+            <w:r>
+              <w:rPr>
+                <w:rFonts w:ascii="Calibri" w:hAnsi="Calibri"/>
+                <w:b w:val="0"/>
+                <w:color w:val="111827"/>
+                <w:sz w:val="16"/>
+              </w:rPr>
+              <w:t>EV-T-074</w:t>
+            </w:r>
+          </w:p>
+        </w:tc>
+        <w:tc>
+          <w:tcPr>
+            <w:tcW w:type="dxa" w:w="3700"/>
+            <w:tcMar>
+              <w:top w:w="80" w:type="dxa"/>
+              <w:start w:w="120" w:type="dxa"/>
+              <w:bottom w:w="80" w:type="dxa"/>
+              <w:end w:w="120" w:type="dxa"/>
+            </w:tcMar>
+            <w:vAlign w:val="center"/>
+            <w:shd w:fill="FFFFFF"/>
+          </w:tcPr>
+          <w:p>
+            <w:pPr>
+              <w:spacing w:before="0" w:after="40" w:line="252" w:lineRule="auto"/>
+              <w:jc w:val="left"/>
+            </w:pPr>
+            <w:r>
+              <w:rPr>
+                <w:rFonts w:ascii="Calibri" w:hAnsi="Calibri"/>
+                <w:b w:val="0"/>
+                <w:color w:val="111827"/>
+                <w:sz w:val="16"/>
+              </w:rPr>
+              <w:t>Temperature limit</w:t>
+            </w:r>
+          </w:p>
+        </w:tc>
+        <w:tc>
+          <w:tcPr>
+            <w:tcW w:type="dxa" w:w="3100"/>
+            <w:tcMar>
+              <w:top w:w="80" w:type="dxa"/>
+              <w:start w:w="120" w:type="dxa"/>
+              <w:bottom w:w="80" w:type="dxa"/>
+              <w:end w:w="120" w:type="dxa"/>
+            </w:tcMar>
+            <w:vAlign w:val="center"/>
+            <w:shd w:fill="FFFFFF"/>
+          </w:tcPr>
+          <w:p>
+            <w:pPr>
+              <w:spacing w:before="0" w:after="40" w:line="252" w:lineRule="auto"/>
+              <w:jc w:val="left"/>
+            </w:pPr>
+            <w:r>
+              <w:rPr>
+                <w:rFonts w:ascii="Calibri" w:hAnsi="Calibri"/>
+                <w:b w:val="0"/>
+                <w:color w:val="111827"/>
+                <w:sz w:val="16"/>
+              </w:rPr>
+              <w:t>Charge outside 0-50 C</w:t>
+            </w:r>
+          </w:p>
+        </w:tc>
+        <w:tc>
+          <w:tcPr>
+            <w:tcW w:type="dxa" w:w="1410"/>
+            <w:tcMar>
+              <w:top w:w="80" w:type="dxa"/>
+              <w:start w:w="120" w:type="dxa"/>
+              <w:bottom w:w="80" w:type="dxa"/>
+              <w:end w:w="120" w:type="dxa"/>
+            </w:tcMar>
+            <w:vAlign w:val="center"/>
+            <w:shd w:fill="FFFFFF"/>
+          </w:tcPr>
+          <w:p>
+            <w:pPr>
+              <w:spacing w:before="0" w:after="40" w:line="252" w:lineRule="auto"/>
+              <w:jc w:val="left"/>
+            </w:pPr>
+            <w:r>
+              <w:rPr>
+                <w:rFonts w:ascii="Calibri" w:hAnsi="Calibri"/>
+                <w:b w:val="0"/>
+                <w:color w:val="111827"/>
+                <w:sz w:val="16"/>
+              </w:rPr>
+              <w:t>No transferred energy and stable reason</w:t>
+            </w:r>
+          </w:p>
+        </w:tc>
+      </w:tr>
+      <w:tr>
+        <w:trPr>
+          <w:cantSplit/>
+        </w:trPr>
+        <w:tc>
+          <w:tcPr>
+            <w:tcW w:type="dxa" w:w="1150"/>
+            <w:tcMar>
+              <w:top w:w="80" w:type="dxa"/>
+              <w:start w:w="120" w:type="dxa"/>
+              <w:bottom w:w="80" w:type="dxa"/>
+              <w:end w:w="120" w:type="dxa"/>
+            </w:tcMar>
+            <w:vAlign w:val="center"/>
+            <w:shd w:fill="FFFFFF"/>
+          </w:tcPr>
+          <w:p>
+            <w:pPr>
+              <w:spacing w:before="0" w:after="40" w:line="252" w:lineRule="auto"/>
+              <w:jc w:val="center"/>
+            </w:pPr>
+            <w:r>
+              <w:rPr>
+                <w:rFonts w:ascii="Calibri" w:hAnsi="Calibri"/>
+                <w:b w:val="0"/>
+                <w:color w:val="111827"/>
+                <w:sz w:val="16"/>
+              </w:rPr>
+              <w:t>EV-T-075</w:t>
+            </w:r>
+          </w:p>
+        </w:tc>
+        <w:tc>
+          <w:tcPr>
+            <w:tcW w:type="dxa" w:w="3700"/>
+            <w:tcMar>
+              <w:top w:w="80" w:type="dxa"/>
+              <w:start w:w="120" w:type="dxa"/>
+              <w:bottom w:w="80" w:type="dxa"/>
+              <w:end w:w="120" w:type="dxa"/>
+            </w:tcMar>
+            <w:vAlign w:val="center"/>
+            <w:shd w:fill="FFFFFF"/>
+          </w:tcPr>
+          <w:p>
+            <w:pPr>
+              <w:spacing w:before="0" w:after="40" w:line="252" w:lineRule="auto"/>
+              <w:jc w:val="left"/>
+            </w:pPr>
+            <w:r>
+              <w:rPr>
+                <w:rFonts w:ascii="Calibri" w:hAnsi="Calibri"/>
+                <w:b w:val="0"/>
+                <w:color w:val="111827"/>
+                <w:sz w:val="16"/>
+              </w:rPr>
+              <w:t>Pause and resume</w:t>
+            </w:r>
+          </w:p>
+        </w:tc>
+        <w:tc>
+          <w:tcPr>
+            <w:tcW w:type="dxa" w:w="3100"/>
+            <w:tcMar>
+              <w:top w:w="80" w:type="dxa"/>
+              <w:start w:w="120" w:type="dxa"/>
+              <w:bottom w:w="80" w:type="dxa"/>
+              <w:end w:w="120" w:type="dxa"/>
+            </w:tcMar>
+            <w:vAlign w:val="center"/>
+            <w:shd w:fill="FFFFFF"/>
+          </w:tcPr>
+          <w:p>
+            <w:pPr>
+              <w:spacing w:before="0" w:after="40" w:line="252" w:lineRule="auto"/>
+              <w:jc w:val="left"/>
+            </w:pPr>
+            <w:r>
+              <w:rPr>
+                <w:rFonts w:ascii="Calibri" w:hAnsi="Calibri"/>
+                <w:b w:val="0"/>
+                <w:color w:val="111827"/>
+                <w:sz w:val="16"/>
+              </w:rPr>
+              <w:t>Interrupt and continue a session</w:t>
+            </w:r>
+          </w:p>
+        </w:tc>
+        <w:tc>
+          <w:tcPr>
+            <w:tcW w:type="dxa" w:w="1410"/>
+            <w:tcMar>
+              <w:top w:w="80" w:type="dxa"/>
+              <w:start w:w="120" w:type="dxa"/>
+              <w:bottom w:w="80" w:type="dxa"/>
+              <w:end w:w="120" w:type="dxa"/>
+            </w:tcMar>
+            <w:vAlign w:val="center"/>
+            <w:shd w:fill="FFFFFF"/>
+          </w:tcPr>
+          <w:p>
+            <w:pPr>
+              <w:spacing w:before="0" w:after="40" w:line="252" w:lineRule="auto"/>
+              <w:jc w:val="left"/>
+            </w:pPr>
+            <w:r>
+              <w:rPr>
+                <w:rFonts w:ascii="Calibri" w:hAnsi="Calibri"/>
+                <w:b w:val="0"/>
+                <w:color w:val="111827"/>
+                <w:sz w:val="16"/>
+              </w:rPr>
+              <w:t>Valid state and contactor transitions</w:t>
+            </w:r>
+          </w:p>
+        </w:tc>
+      </w:tr>
+      <w:tr>
+        <w:trPr>
+          <w:cantSplit/>
+        </w:trPr>
+        <w:tc>
+          <w:tcPr>
+            <w:tcW w:type="dxa" w:w="1150"/>
+            <w:tcMar>
+              <w:top w:w="80" w:type="dxa"/>
+              <w:start w:w="120" w:type="dxa"/>
+              <w:bottom w:w="80" w:type="dxa"/>
+              <w:end w:w="120" w:type="dxa"/>
+            </w:tcMar>
+            <w:vAlign w:val="center"/>
+            <w:shd w:fill="FFFFFF"/>
+          </w:tcPr>
+          <w:p>
+            <w:pPr>
+              <w:spacing w:before="0" w:after="40" w:line="252" w:lineRule="auto"/>
+              <w:jc w:val="center"/>
+            </w:pPr>
+            <w:r>
+              <w:rPr>
+                <w:rFonts w:ascii="Calibri" w:hAnsi="Calibri"/>
+                <w:b w:val="0"/>
+                <w:color w:val="111827"/>
+                <w:sz w:val="16"/>
+              </w:rPr>
+              <w:t>EV-T-076</w:t>
+            </w:r>
+          </w:p>
+        </w:tc>
+        <w:tc>
+          <w:tcPr>
+            <w:tcW w:type="dxa" w:w="3700"/>
+            <w:tcMar>
+              <w:top w:w="80" w:type="dxa"/>
+              <w:start w:w="120" w:type="dxa"/>
+              <w:bottom w:w="80" w:type="dxa"/>
+              <w:end w:w="120" w:type="dxa"/>
+            </w:tcMar>
+            <w:vAlign w:val="center"/>
+            <w:shd w:fill="FFFFFF"/>
+          </w:tcPr>
+          <w:p>
+            <w:pPr>
+              <w:spacing w:before="0" w:after="40" w:line="252" w:lineRule="auto"/>
+              <w:jc w:val="left"/>
+            </w:pPr>
+            <w:r>
+              <w:rPr>
+                <w:rFonts w:ascii="Calibri" w:hAnsi="Calibri"/>
+                <w:b w:val="0"/>
+                <w:color w:val="111827"/>
+                <w:sz w:val="16"/>
+              </w:rPr>
+              <w:t>Manual stop</w:t>
+            </w:r>
+          </w:p>
+        </w:tc>
+        <w:tc>
+          <w:tcPr>
+            <w:tcW w:type="dxa" w:w="3100"/>
+            <w:tcMar>
+              <w:top w:w="80" w:type="dxa"/>
+              <w:start w:w="120" w:type="dxa"/>
+              <w:bottom w:w="80" w:type="dxa"/>
+              <w:end w:w="120" w:type="dxa"/>
+            </w:tcMar>
+            <w:vAlign w:val="center"/>
+            <w:shd w:fill="FFFFFF"/>
+          </w:tcPr>
+          <w:p>
+            <w:pPr>
+              <w:spacing w:before="0" w:after="40" w:line="252" w:lineRule="auto"/>
+              <w:jc w:val="left"/>
+            </w:pPr>
+            <w:r>
+              <w:rPr>
+                <w:rFonts w:ascii="Calibri" w:hAnsi="Calibri"/>
+                <w:b w:val="0"/>
+                <w:color w:val="111827"/>
+                <w:sz w:val="16"/>
+              </w:rPr>
+              <w:t>Stop an active or paused session</w:t>
+            </w:r>
+          </w:p>
+        </w:tc>
+        <w:tc>
+          <w:tcPr>
+            <w:tcW w:type="dxa" w:w="1410"/>
+            <w:tcMar>
+              <w:top w:w="80" w:type="dxa"/>
+              <w:start w:w="120" w:type="dxa"/>
+              <w:bottom w:w="80" w:type="dxa"/>
+              <w:end w:w="120" w:type="dxa"/>
+            </w:tcMar>
+            <w:vAlign w:val="center"/>
+            <w:shd w:fill="FFFFFF"/>
+          </w:tcPr>
+          <w:p>
+            <w:pPr>
+              <w:spacing w:before="0" w:after="40" w:line="252" w:lineRule="auto"/>
+              <w:jc w:val="left"/>
+            </w:pPr>
+            <w:r>
+              <w:rPr>
+                <w:rFonts w:ascii="Calibri" w:hAnsi="Calibri"/>
+                <w:b w:val="0"/>
+                <w:color w:val="111827"/>
+                <w:sz w:val="16"/>
+              </w:rPr>
+              <w:t>Completed and isolated</w:t>
+            </w:r>
+          </w:p>
+        </w:tc>
+      </w:tr>
+      <w:tr>
+        <w:trPr>
+          <w:cantSplit/>
+        </w:trPr>
+        <w:tc>
+          <w:tcPr>
+            <w:tcW w:type="dxa" w:w="1150"/>
+            <w:tcMar>
+              <w:top w:w="80" w:type="dxa"/>
+              <w:start w:w="120" w:type="dxa"/>
+              <w:bottom w:w="80" w:type="dxa"/>
+              <w:end w:w="120" w:type="dxa"/>
+            </w:tcMar>
+            <w:vAlign w:val="center"/>
+            <w:shd w:fill="FFFFFF"/>
+          </w:tcPr>
+          <w:p>
+            <w:pPr>
+              <w:spacing w:before="0" w:after="40" w:line="252" w:lineRule="auto"/>
+              <w:jc w:val="center"/>
+            </w:pPr>
+            <w:r>
+              <w:rPr>
+                <w:rFonts w:ascii="Calibri" w:hAnsi="Calibri"/>
+                <w:b w:val="0"/>
+                <w:color w:val="111827"/>
+                <w:sz w:val="16"/>
+              </w:rPr>
+              <w:t>EV-T-077</w:t>
+            </w:r>
+          </w:p>
+        </w:tc>
+        <w:tc>
+          <w:tcPr>
+            <w:tcW w:type="dxa" w:w="3700"/>
+            <w:tcMar>
+              <w:top w:w="80" w:type="dxa"/>
+              <w:start w:w="120" w:type="dxa"/>
+              <w:bottom w:w="80" w:type="dxa"/>
+              <w:end w:w="120" w:type="dxa"/>
+            </w:tcMar>
+            <w:vAlign w:val="center"/>
+            <w:shd w:fill="FFFFFF"/>
+          </w:tcPr>
+          <w:p>
+            <w:pPr>
+              <w:spacing w:before="0" w:after="40" w:line="252" w:lineRule="auto"/>
+              <w:jc w:val="left"/>
+            </w:pPr>
+            <w:r>
+              <w:rPr>
+                <w:rFonts w:ascii="Calibri" w:hAnsi="Calibri"/>
+                <w:b w:val="0"/>
+                <w:color w:val="111827"/>
+                <w:sz w:val="16"/>
+              </w:rPr>
+              <w:t>Fault lifecycle</w:t>
+            </w:r>
+          </w:p>
+        </w:tc>
+        <w:tc>
+          <w:tcPr>
+            <w:tcW w:type="dxa" w:w="3100"/>
+            <w:tcMar>
+              <w:top w:w="80" w:type="dxa"/>
+              <w:start w:w="120" w:type="dxa"/>
+              <w:bottom w:w="80" w:type="dxa"/>
+              <w:end w:w="120" w:type="dxa"/>
+            </w:tcMar>
+            <w:vAlign w:val="center"/>
+            <w:shd w:fill="FFFFFF"/>
+          </w:tcPr>
+          <w:p>
+            <w:pPr>
+              <w:spacing w:before="0" w:after="40" w:line="252" w:lineRule="auto"/>
+              <w:jc w:val="left"/>
+            </w:pPr>
+            <w:r>
+              <w:rPr>
+                <w:rFonts w:ascii="Calibri" w:hAnsi="Calibri"/>
+                <w:b w:val="0"/>
+                <w:color w:val="111827"/>
+                <w:sz w:val="16"/>
+              </w:rPr>
+              <w:t>Inject and clear a charging fault</w:t>
+            </w:r>
+          </w:p>
+        </w:tc>
+        <w:tc>
+          <w:tcPr>
+            <w:tcW w:type="dxa" w:w="1410"/>
+            <w:tcMar>
+              <w:top w:w="80" w:type="dxa"/>
+              <w:start w:w="120" w:type="dxa"/>
+              <w:bottom w:w="80" w:type="dxa"/>
+              <w:end w:w="120" w:type="dxa"/>
+            </w:tcMar>
+            <w:vAlign w:val="center"/>
+            <w:shd w:fill="FFFFFF"/>
+          </w:tcPr>
+          <w:p>
+            <w:pPr>
+              <w:spacing w:before="0" w:after="40" w:line="252" w:lineRule="auto"/>
+              <w:jc w:val="left"/>
+            </w:pPr>
+            <w:r>
+              <w:rPr>
+                <w:rFonts w:ascii="Calibri" w:hAnsi="Calibri"/>
+                <w:b w:val="0"/>
+                <w:color w:val="111827"/>
+                <w:sz w:val="16"/>
+              </w:rPr>
+              <w:t>Fault preserved, isolated, then idle</w:t>
+            </w:r>
+          </w:p>
+        </w:tc>
+      </w:tr>
+      <w:tr>
+        <w:trPr>
+          <w:cantSplit/>
+        </w:trPr>
+        <w:tc>
+          <w:tcPr>
+            <w:tcW w:type="dxa" w:w="1150"/>
+            <w:tcMar>
+              <w:top w:w="80" w:type="dxa"/>
+              <w:start w:w="120" w:type="dxa"/>
+              <w:bottom w:w="80" w:type="dxa"/>
+              <w:end w:w="120" w:type="dxa"/>
+            </w:tcMar>
+            <w:vAlign w:val="center"/>
+            <w:shd w:fill="FFFFFF"/>
+          </w:tcPr>
+          <w:p>
+            <w:pPr>
+              <w:spacing w:before="0" w:after="40" w:line="252" w:lineRule="auto"/>
+              <w:jc w:val="center"/>
+            </w:pPr>
+            <w:r>
+              <w:rPr>
+                <w:rFonts w:ascii="Calibri" w:hAnsi="Calibri"/>
+                <w:b w:val="0"/>
+                <w:color w:val="111827"/>
+                <w:sz w:val="16"/>
+              </w:rPr>
+              <w:t>EV-T-078</w:t>
+            </w:r>
+          </w:p>
+        </w:tc>
+        <w:tc>
+          <w:tcPr>
+            <w:tcW w:type="dxa" w:w="3700"/>
+            <w:tcMar>
+              <w:top w:w="80" w:type="dxa"/>
+              <w:start w:w="120" w:type="dxa"/>
+              <w:bottom w:w="80" w:type="dxa"/>
+              <w:end w:w="120" w:type="dxa"/>
+            </w:tcMar>
+            <w:vAlign w:val="center"/>
+            <w:shd w:fill="FFFFFF"/>
+          </w:tcPr>
+          <w:p>
+            <w:pPr>
+              <w:spacing w:before="0" w:after="40" w:line="252" w:lineRule="auto"/>
+              <w:jc w:val="left"/>
+            </w:pPr>
+            <w:r>
+              <w:rPr>
+                <w:rFonts w:ascii="Calibri" w:hAnsi="Calibri"/>
+                <w:b w:val="0"/>
+                <w:color w:val="111827"/>
+                <w:sz w:val="16"/>
+              </w:rPr>
+              <w:t>Invalid transition</w:t>
+            </w:r>
+          </w:p>
+        </w:tc>
+        <w:tc>
+          <w:tcPr>
+            <w:tcW w:type="dxa" w:w="3100"/>
+            <w:tcMar>
+              <w:top w:w="80" w:type="dxa"/>
+              <w:start w:w="120" w:type="dxa"/>
+              <w:bottom w:w="80" w:type="dxa"/>
+              <w:end w:w="120" w:type="dxa"/>
+            </w:tcMar>
+            <w:vAlign w:val="center"/>
+            <w:shd w:fill="FFFFFF"/>
+          </w:tcPr>
+          <w:p>
+            <w:pPr>
+              <w:spacing w:before="0" w:after="40" w:line="252" w:lineRule="auto"/>
+              <w:jc w:val="left"/>
+            </w:pPr>
+            <w:r>
+              <w:rPr>
+                <w:rFonts w:ascii="Calibri" w:hAnsi="Calibri"/>
+                <w:b w:val="0"/>
+                <w:color w:val="111827"/>
+                <w:sz w:val="16"/>
+              </w:rPr>
+              <w:t>Charge while idle</w:t>
+            </w:r>
+          </w:p>
+        </w:tc>
+        <w:tc>
+          <w:tcPr>
+            <w:tcW w:type="dxa" w:w="1410"/>
+            <w:tcMar>
+              <w:top w:w="80" w:type="dxa"/>
+              <w:start w:w="120" w:type="dxa"/>
+              <w:bottom w:w="80" w:type="dxa"/>
+              <w:end w:w="120" w:type="dxa"/>
+            </w:tcMar>
+            <w:vAlign w:val="center"/>
+            <w:shd w:fill="FFFFFF"/>
+          </w:tcPr>
+          <w:p>
+            <w:pPr>
+              <w:spacing w:before="0" w:after="40" w:line="252" w:lineRule="auto"/>
+              <w:jc w:val="left"/>
+            </w:pPr>
+            <w:r>
+              <w:rPr>
+                <w:rFonts w:ascii="Calibri" w:hAnsi="Calibri"/>
+                <w:b w:val="0"/>
+                <w:color w:val="111827"/>
+                <w:sz w:val="16"/>
+              </w:rPr>
+              <w:t>Stable transition conflict</w:t>
+            </w:r>
+          </w:p>
+        </w:tc>
+      </w:tr>
+      <w:tr>
+        <w:trPr>
+          <w:cantSplit/>
+        </w:trPr>
+        <w:tc>
+          <w:tcPr>
+            <w:tcW w:type="dxa" w:w="1150"/>
+            <w:tcMar>
+              <w:top w:w="80" w:type="dxa"/>
+              <w:start w:w="120" w:type="dxa"/>
+              <w:bottom w:w="80" w:type="dxa"/>
+              <w:end w:w="120" w:type="dxa"/>
+            </w:tcMar>
+            <w:vAlign w:val="center"/>
+            <w:shd w:fill="FFFFFF"/>
+          </w:tcPr>
+          <w:p>
+            <w:pPr>
+              <w:spacing w:before="0" w:after="40" w:line="252" w:lineRule="auto"/>
+              <w:jc w:val="center"/>
+            </w:pPr>
+            <w:r>
+              <w:rPr>
+                <w:rFonts w:ascii="Calibri" w:hAnsi="Calibri"/>
+                <w:b w:val="0"/>
+                <w:color w:val="111827"/>
+                <w:sz w:val="16"/>
+              </w:rPr>
+              <w:t>EV-T-079</w:t>
+            </w:r>
+          </w:p>
+        </w:tc>
+        <w:tc>
+          <w:tcPr>
+            <w:tcW w:type="dxa" w:w="3700"/>
+            <w:tcMar>
+              <w:top w:w="80" w:type="dxa"/>
+              <w:start w:w="120" w:type="dxa"/>
+              <w:bottom w:w="80" w:type="dxa"/>
+              <w:end w:w="120" w:type="dxa"/>
+            </w:tcMar>
+            <w:vAlign w:val="center"/>
+            <w:shd w:fill="FFFFFF"/>
+          </w:tcPr>
+          <w:p>
+            <w:pPr>
+              <w:spacing w:before="0" w:after="40" w:line="252" w:lineRule="auto"/>
+              <w:jc w:val="left"/>
+            </w:pPr>
+            <w:r>
+              <w:rPr>
+                <w:rFonts w:ascii="Calibri" w:hAnsi="Calibri"/>
+                <w:b w:val="0"/>
+                <w:color w:val="111827"/>
+                <w:sz w:val="16"/>
+              </w:rPr>
+              <w:t>Charging exact replay</w:t>
+            </w:r>
+          </w:p>
+        </w:tc>
+        <w:tc>
+          <w:tcPr>
+            <w:tcW w:type="dxa" w:w="3100"/>
+            <w:tcMar>
+              <w:top w:w="80" w:type="dxa"/>
+              <w:start w:w="120" w:type="dxa"/>
+              <w:bottom w:w="80" w:type="dxa"/>
+              <w:end w:w="120" w:type="dxa"/>
+            </w:tcMar>
+            <w:vAlign w:val="center"/>
+            <w:shd w:fill="FFFFFF"/>
+          </w:tcPr>
+          <w:p>
+            <w:pPr>
+              <w:spacing w:before="0" w:after="40" w:line="252" w:lineRule="auto"/>
+              <w:jc w:val="left"/>
+            </w:pPr>
+            <w:r>
+              <w:rPr>
+                <w:rFonts w:ascii="Calibri" w:hAnsi="Calibri"/>
+                <w:b w:val="0"/>
+                <w:color w:val="111827"/>
+                <w:sz w:val="16"/>
+              </w:rPr>
+              <w:t>Retry an identical command</w:t>
+            </w:r>
+          </w:p>
+        </w:tc>
+        <w:tc>
+          <w:tcPr>
+            <w:tcW w:type="dxa" w:w="1410"/>
+            <w:tcMar>
+              <w:top w:w="80" w:type="dxa"/>
+              <w:start w:w="120" w:type="dxa"/>
+              <w:bottom w:w="80" w:type="dxa"/>
+              <w:end w:w="120" w:type="dxa"/>
+            </w:tcMar>
+            <w:vAlign w:val="center"/>
+            <w:shd w:fill="FFFFFF"/>
+          </w:tcPr>
+          <w:p>
+            <w:pPr>
+              <w:spacing w:before="0" w:after="40" w:line="252" w:lineRule="auto"/>
+              <w:jc w:val="left"/>
+            </w:pPr>
+            <w:r>
+              <w:rPr>
+                <w:rFonts w:ascii="Calibri" w:hAnsi="Calibri"/>
+                <w:b w:val="0"/>
+                <w:color w:val="111827"/>
+                <w:sz w:val="16"/>
+              </w:rPr>
+              <w:t>Persisted snapshot, no duplicate energy</w:t>
+            </w:r>
+          </w:p>
+        </w:tc>
+      </w:tr>
+      <w:tr>
+        <w:trPr>
+          <w:cantSplit/>
+        </w:trPr>
+        <w:tc>
+          <w:tcPr>
+            <w:tcW w:type="dxa" w:w="1150"/>
+            <w:tcMar>
+              <w:top w:w="80" w:type="dxa"/>
+              <w:start w:w="120" w:type="dxa"/>
+              <w:bottom w:w="80" w:type="dxa"/>
+              <w:end w:w="120" w:type="dxa"/>
+            </w:tcMar>
+            <w:vAlign w:val="center"/>
+            <w:shd w:fill="FFFFFF"/>
+          </w:tcPr>
+          <w:p>
+            <w:pPr>
+              <w:spacing w:before="0" w:after="40" w:line="252" w:lineRule="auto"/>
+              <w:jc w:val="center"/>
+            </w:pPr>
+            <w:r>
+              <w:rPr>
+                <w:rFonts w:ascii="Calibri" w:hAnsi="Calibri"/>
+                <w:b w:val="0"/>
+                <w:color w:val="111827"/>
+                <w:sz w:val="16"/>
+              </w:rPr>
+              <w:t>EV-T-080</w:t>
+            </w:r>
+          </w:p>
+        </w:tc>
+        <w:tc>
+          <w:tcPr>
+            <w:tcW w:type="dxa" w:w="3700"/>
+            <w:tcMar>
+              <w:top w:w="80" w:type="dxa"/>
+              <w:start w:w="120" w:type="dxa"/>
+              <w:bottom w:w="80" w:type="dxa"/>
+              <w:end w:w="120" w:type="dxa"/>
+            </w:tcMar>
+            <w:vAlign w:val="center"/>
+            <w:shd w:fill="FFFFFF"/>
+          </w:tcPr>
+          <w:p>
+            <w:pPr>
+              <w:spacing w:before="0" w:after="40" w:line="252" w:lineRule="auto"/>
+              <w:jc w:val="left"/>
+            </w:pPr>
+            <w:r>
+              <w:rPr>
+                <w:rFonts w:ascii="Calibri" w:hAnsi="Calibri"/>
+                <w:b w:val="0"/>
+                <w:color w:val="111827"/>
+                <w:sz w:val="16"/>
+              </w:rPr>
+              <w:t>Charging changed reuse</w:t>
+            </w:r>
+          </w:p>
+        </w:tc>
+        <w:tc>
+          <w:tcPr>
+            <w:tcW w:type="dxa" w:w="3100"/>
+            <w:tcMar>
+              <w:top w:w="80" w:type="dxa"/>
+              <w:start w:w="120" w:type="dxa"/>
+              <w:bottom w:w="80" w:type="dxa"/>
+              <w:end w:w="120" w:type="dxa"/>
+            </w:tcMar>
+            <w:vAlign w:val="center"/>
+            <w:shd w:fill="FFFFFF"/>
+          </w:tcPr>
+          <w:p>
+            <w:pPr>
+              <w:spacing w:before="0" w:after="40" w:line="252" w:lineRule="auto"/>
+              <w:jc w:val="left"/>
+            </w:pPr>
+            <w:r>
+              <w:rPr>
+                <w:rFonts w:ascii="Calibri" w:hAnsi="Calibri"/>
+                <w:b w:val="0"/>
+                <w:color w:val="111827"/>
+                <w:sz w:val="16"/>
+              </w:rPr>
+              <w:t>Reuse command ID differently</w:t>
+            </w:r>
+          </w:p>
+        </w:tc>
+        <w:tc>
+          <w:tcPr>
+            <w:tcW w:type="dxa" w:w="1410"/>
+            <w:tcMar>
+              <w:top w:w="80" w:type="dxa"/>
+              <w:start w:w="120" w:type="dxa"/>
+              <w:bottom w:w="80" w:type="dxa"/>
+              <w:end w:w="120" w:type="dxa"/>
+            </w:tcMar>
+            <w:vAlign w:val="center"/>
+            <w:shd w:fill="FFFFFF"/>
+          </w:tcPr>
+          <w:p>
+            <w:pPr>
+              <w:spacing w:before="0" w:after="40" w:line="252" w:lineRule="auto"/>
+              <w:jc w:val="left"/>
+            </w:pPr>
+            <w:r>
+              <w:rPr>
+                <w:rFonts w:ascii="Calibri" w:hAnsi="Calibri"/>
+                <w:b w:val="0"/>
+                <w:color w:val="111827"/>
+                <w:sz w:val="16"/>
+              </w:rPr>
+              <w:t>Stable command conflict</w:t>
+            </w:r>
+          </w:p>
+        </w:tc>
+      </w:tr>
+      <w:tr>
+        <w:trPr>
+          <w:cantSplit/>
+        </w:trPr>
+        <w:tc>
+          <w:tcPr>
+            <w:tcW w:type="dxa" w:w="1150"/>
+            <w:tcMar>
+              <w:top w:w="80" w:type="dxa"/>
+              <w:start w:w="120" w:type="dxa"/>
+              <w:bottom w:w="80" w:type="dxa"/>
+              <w:end w:w="120" w:type="dxa"/>
+            </w:tcMar>
+            <w:vAlign w:val="center"/>
+            <w:shd w:fill="FFFFFF"/>
+          </w:tcPr>
+          <w:p>
+            <w:pPr>
+              <w:spacing w:before="0" w:after="40" w:line="252" w:lineRule="auto"/>
+              <w:jc w:val="center"/>
+            </w:pPr>
+            <w:r>
+              <w:rPr>
+                <w:rFonts w:ascii="Calibri" w:hAnsi="Calibri"/>
+                <w:b w:val="0"/>
+                <w:color w:val="111827"/>
+                <w:sz w:val="16"/>
+              </w:rPr>
+              <w:t>EV-T-081</w:t>
+            </w:r>
+          </w:p>
+        </w:tc>
+        <w:tc>
+          <w:tcPr>
+            <w:tcW w:type="dxa" w:w="3700"/>
+            <w:tcMar>
+              <w:top w:w="80" w:type="dxa"/>
+              <w:start w:w="120" w:type="dxa"/>
+              <w:bottom w:w="80" w:type="dxa"/>
+              <w:end w:w="120" w:type="dxa"/>
+            </w:tcMar>
+            <w:vAlign w:val="center"/>
+            <w:shd w:fill="FFFFFF"/>
+          </w:tcPr>
+          <w:p>
+            <w:pPr>
+              <w:spacing w:before="0" w:after="40" w:line="252" w:lineRule="auto"/>
+              <w:jc w:val="left"/>
+            </w:pPr>
+            <w:r>
+              <w:rPr>
+                <w:rFonts w:ascii="Calibri" w:hAnsi="Calibri"/>
+                <w:b w:val="0"/>
+                <w:color w:val="111827"/>
+                <w:sz w:val="16"/>
+              </w:rPr>
+              <w:t>Dual version conflicts</w:t>
+            </w:r>
+          </w:p>
+        </w:tc>
+        <w:tc>
+          <w:tcPr>
+            <w:tcW w:type="dxa" w:w="3100"/>
+            <w:tcMar>
+              <w:top w:w="80" w:type="dxa"/>
+              <w:start w:w="120" w:type="dxa"/>
+              <w:bottom w:w="80" w:type="dxa"/>
+              <w:end w:w="120" w:type="dxa"/>
+            </w:tcMar>
+            <w:vAlign w:val="center"/>
+            <w:shd w:fill="FFFFFF"/>
+          </w:tcPr>
+          <w:p>
+            <w:pPr>
+              <w:spacing w:before="0" w:after="40" w:line="252" w:lineRule="auto"/>
+              <w:jc w:val="left"/>
+            </w:pPr>
+            <w:r>
+              <w:rPr>
+                <w:rFonts w:ascii="Calibri" w:hAnsi="Calibri"/>
+                <w:b w:val="0"/>
+                <w:color w:val="111827"/>
+                <w:sz w:val="16"/>
+              </w:rPr>
+              <w:t>Submit stale charging or battery version</w:t>
+            </w:r>
+          </w:p>
+        </w:tc>
+        <w:tc>
+          <w:tcPr>
+            <w:tcW w:type="dxa" w:w="1410"/>
+            <w:tcMar>
+              <w:top w:w="80" w:type="dxa"/>
+              <w:start w:w="120" w:type="dxa"/>
+              <w:bottom w:w="80" w:type="dxa"/>
+              <w:end w:w="120" w:type="dxa"/>
+            </w:tcMar>
+            <w:vAlign w:val="center"/>
+            <w:shd w:fill="FFFFFF"/>
+          </w:tcPr>
+          <w:p>
+            <w:pPr>
+              <w:spacing w:before="0" w:after="40" w:line="252" w:lineRule="auto"/>
+              <w:jc w:val="left"/>
+            </w:pPr>
+            <w:r>
+              <w:rPr>
+                <w:rFonts w:ascii="Calibri" w:hAnsi="Calibri"/>
+                <w:b w:val="0"/>
+                <w:color w:val="111827"/>
+                <w:sz w:val="16"/>
+              </w:rPr>
+              <w:t>Distinct current version returned</w:t>
+            </w:r>
+          </w:p>
+        </w:tc>
+      </w:tr>
+      <w:tr>
+        <w:trPr>
+          <w:cantSplit/>
+        </w:trPr>
+        <w:tc>
+          <w:tcPr>
+            <w:tcW w:type="dxa" w:w="1150"/>
+            <w:tcMar>
+              <w:top w:w="80" w:type="dxa"/>
+              <w:start w:w="120" w:type="dxa"/>
+              <w:bottom w:w="80" w:type="dxa"/>
+              <w:end w:w="120" w:type="dxa"/>
+            </w:tcMar>
+            <w:vAlign w:val="center"/>
+            <w:shd w:fill="FFFFFF"/>
+          </w:tcPr>
+          <w:p>
+            <w:pPr>
+              <w:spacing w:before="0" w:after="40" w:line="252" w:lineRule="auto"/>
+              <w:jc w:val="center"/>
+            </w:pPr>
+            <w:r>
+              <w:rPr>
+                <w:rFonts w:ascii="Calibri" w:hAnsi="Calibri"/>
+                <w:b w:val="0"/>
+                <w:color w:val="111827"/>
+                <w:sz w:val="16"/>
+              </w:rPr>
+              <w:t>EV-T-082</w:t>
+            </w:r>
+          </w:p>
+        </w:tc>
+        <w:tc>
+          <w:tcPr>
+            <w:tcW w:type="dxa" w:w="3700"/>
+            <w:tcMar>
+              <w:top w:w="80" w:type="dxa"/>
+              <w:start w:w="120" w:type="dxa"/>
+              <w:bottom w:w="80" w:type="dxa"/>
+              <w:end w:w="120" w:type="dxa"/>
+            </w:tcMar>
+            <w:vAlign w:val="center"/>
+            <w:shd w:fill="FFFFFF"/>
+          </w:tcPr>
+          <w:p>
+            <w:pPr>
+              <w:spacing w:before="0" w:after="40" w:line="252" w:lineRule="auto"/>
+              <w:jc w:val="left"/>
+            </w:pPr>
+            <w:r>
+              <w:rPr>
+                <w:rFonts w:ascii="Calibri" w:hAnsi="Calibri"/>
+                <w:b w:val="0"/>
+                <w:color w:val="111827"/>
+                <w:sz w:val="16"/>
+              </w:rPr>
+              <w:t>Charging OpenAPI and migration</w:t>
+            </w:r>
+          </w:p>
+        </w:tc>
+        <w:tc>
+          <w:tcPr>
+            <w:tcW w:type="dxa" w:w="3100"/>
+            <w:tcMar>
+              <w:top w:w="80" w:type="dxa"/>
+              <w:start w:w="120" w:type="dxa"/>
+              <w:bottom w:w="80" w:type="dxa"/>
+              <w:end w:w="120" w:type="dxa"/>
+            </w:tcMar>
+            <w:vAlign w:val="center"/>
+            <w:shd w:fill="FFFFFF"/>
+          </w:tcPr>
+          <w:p>
+            <w:pPr>
+              <w:spacing w:before="0" w:after="40" w:line="252" w:lineRule="auto"/>
+              <w:jc w:val="left"/>
+            </w:pPr>
+            <w:r>
+              <w:rPr>
+                <w:rFonts w:ascii="Calibri" w:hAnsi="Calibri"/>
+                <w:b w:val="0"/>
+                <w:color w:val="111827"/>
+                <w:sz w:val="16"/>
+              </w:rPr>
+              <w:t>Inspect routes and revision 0040</w:t>
+            </w:r>
+          </w:p>
+        </w:tc>
+        <w:tc>
+          <w:tcPr>
+            <w:tcW w:type="dxa" w:w="1410"/>
+            <w:tcMar>
+              <w:top w:w="80" w:type="dxa"/>
+              <w:start w:w="120" w:type="dxa"/>
+              <w:bottom w:w="80" w:type="dxa"/>
+              <w:end w:w="120" w:type="dxa"/>
+            </w:tcMar>
+            <w:vAlign w:val="center"/>
+            <w:shd w:fill="FFFFFF"/>
+          </w:tcPr>
+          <w:p>
+            <w:pPr>
+              <w:spacing w:before="0" w:after="40" w:line="252" w:lineRule="auto"/>
+              <w:jc w:val="left"/>
+            </w:pPr>
+            <w:r>
+              <w:rPr>
+                <w:rFonts w:ascii="Calibri" w:hAnsi="Calibri"/>
+                <w:b w:val="0"/>
+                <w:color w:val="111827"/>
+                <w:sz w:val="16"/>
+              </w:rPr>
+              <w:t>Bounded schema and reversible tables</w:t>
             </w:r>
           </w:p>
         </w:tc>
@@ -15298,7 +18616,7 @@
                 <w:color w:val="0B2545"/>
                 <w:sz w:val="17"/>
               </w:rPr>
-              <w:t>VI-1 through VI-3 evidence</w:t>
+              <w:t>VI-1 through VI-4 evidence</w:t>
             </w:r>
           </w:p>
         </w:tc>
@@ -15359,7 +18677,7 @@
                 <w:color w:val="111827"/>
                 <w:sz w:val="17"/>
               </w:rPr>
-              <w:t>Battery/BMS, propulsion, regenerative allocation, friction fallback, energy recovery, replay, conflicts</w:t>
+              <w:t>Battery/BMS, propulsion, braking, AC/DC charging, lifecycle, faults, replay, conflicts</w:t>
             </w:r>
           </w:p>
         </w:tc>
@@ -16925,6 +20243,184 @@
           </w:p>
         </w:tc>
       </w:tr>
+      <w:tr>
+        <w:trPr>
+          <w:cantSplit/>
+        </w:trPr>
+        <w:tc>
+          <w:tcPr>
+            <w:tcW w:type="dxa" w:w="1650"/>
+            <w:tcMar>
+              <w:top w:w="80" w:type="dxa"/>
+              <w:start w:w="120" w:type="dxa"/>
+              <w:bottom w:w="80" w:type="dxa"/>
+              <w:end w:w="120" w:type="dxa"/>
+            </w:tcMar>
+            <w:vAlign w:val="center"/>
+            <w:shd w:fill="FFFFFF"/>
+          </w:tcPr>
+          <w:p>
+            <w:pPr>
+              <w:spacing w:before="0" w:after="40" w:line="252" w:lineRule="auto"/>
+              <w:jc w:val="center"/>
+            </w:pPr>
+            <w:r>
+              <w:rPr>
+                <w:rFonts w:ascii="Calibri" w:hAnsi="Calibri"/>
+                <w:b w:val="0"/>
+                <w:color w:val="111827"/>
+                <w:sz w:val="17"/>
+              </w:rPr>
+              <w:t>Analytic charging curve</w:t>
+            </w:r>
+          </w:p>
+        </w:tc>
+        <w:tc>
+          <w:tcPr>
+            <w:tcW w:type="dxa" w:w="4450"/>
+            <w:tcMar>
+              <w:top w:w="80" w:type="dxa"/>
+              <w:start w:w="120" w:type="dxa"/>
+              <w:bottom w:w="80" w:type="dxa"/>
+              <w:end w:w="120" w:type="dxa"/>
+            </w:tcMar>
+            <w:vAlign w:val="center"/>
+            <w:shd w:fill="FFFFFF"/>
+          </w:tcPr>
+          <w:p>
+            <w:pPr>
+              <w:spacing w:before="0" w:after="40" w:line="252" w:lineRule="auto"/>
+              <w:jc w:val="left"/>
+            </w:pPr>
+            <w:r>
+              <w:rPr>
+                <w:rFonts w:ascii="Calibri" w:hAnsi="Calibri"/>
+                <w:b w:val="0"/>
+                <w:color w:val="111827"/>
+                <w:sz w:val="17"/>
+              </w:rPr>
+              <w:t>Cannot reproduce every chemistry or EVSE calibration</w:t>
+            </w:r>
+          </w:p>
+        </w:tc>
+        <w:tc>
+          <w:tcPr>
+            <w:tcW w:type="dxa" w:w="3260"/>
+            <w:tcMar>
+              <w:top w:w="80" w:type="dxa"/>
+              <w:start w:w="120" w:type="dxa"/>
+              <w:bottom w:w="80" w:type="dxa"/>
+              <w:end w:w="120" w:type="dxa"/>
+            </w:tcMar>
+            <w:vAlign w:val="center"/>
+            <w:shd w:fill="FFFFFF"/>
+          </w:tcPr>
+          <w:p>
+            <w:pPr>
+              <w:spacing w:before="0" w:after="40" w:line="252" w:lineRule="auto"/>
+              <w:jc w:val="left"/>
+            </w:pPr>
+            <w:r>
+              <w:rPr>
+                <w:rFonts w:ascii="Calibri" w:hAnsi="Calibri"/>
+                <w:b w:val="0"/>
+                <w:color w:val="111827"/>
+                <w:sz w:val="17"/>
+              </w:rPr>
+              <w:t>Add versioned SOC-temperature-power maps later</w:t>
+            </w:r>
+          </w:p>
+        </w:tc>
+      </w:tr>
+      <w:tr>
+        <w:trPr>
+          <w:cantSplit/>
+        </w:trPr>
+        <w:tc>
+          <w:tcPr>
+            <w:tcW w:type="dxa" w:w="1650"/>
+            <w:tcMar>
+              <w:top w:w="80" w:type="dxa"/>
+              <w:start w:w="120" w:type="dxa"/>
+              <w:bottom w:w="80" w:type="dxa"/>
+              <w:end w:w="120" w:type="dxa"/>
+            </w:tcMar>
+            <w:vAlign w:val="center"/>
+            <w:shd w:fill="FFFFFF"/>
+          </w:tcPr>
+          <w:p>
+            <w:pPr>
+              <w:spacing w:before="0" w:after="40" w:line="252" w:lineRule="auto"/>
+              <w:jc w:val="center"/>
+            </w:pPr>
+            <w:r>
+              <w:rPr>
+                <w:rFonts w:ascii="Calibri" w:hAnsi="Calibri"/>
+                <w:b w:val="0"/>
+                <w:color w:val="111827"/>
+                <w:sz w:val="17"/>
+              </w:rPr>
+              <w:t>No EVSE protocol model</w:t>
+            </w:r>
+          </w:p>
+        </w:tc>
+        <w:tc>
+          <w:tcPr>
+            <w:tcW w:type="dxa" w:w="4450"/>
+            <w:tcMar>
+              <w:top w:w="80" w:type="dxa"/>
+              <w:start w:w="120" w:type="dxa"/>
+              <w:bottom w:w="80" w:type="dxa"/>
+              <w:end w:w="120" w:type="dxa"/>
+            </w:tcMar>
+            <w:vAlign w:val="center"/>
+            <w:shd w:fill="FFFFFF"/>
+          </w:tcPr>
+          <w:p>
+            <w:pPr>
+              <w:spacing w:before="0" w:after="40" w:line="252" w:lineRule="auto"/>
+              <w:jc w:val="left"/>
+            </w:pPr>
+            <w:r>
+              <w:rPr>
+                <w:rFonts w:ascii="Calibri" w:hAnsi="Calibri"/>
+                <w:b w:val="0"/>
+                <w:color w:val="111827"/>
+                <w:sz w:val="17"/>
+              </w:rPr>
+              <w:t>Cannot test ISO 15118 or PLC handshakes yet</w:t>
+            </w:r>
+          </w:p>
+        </w:tc>
+        <w:tc>
+          <w:tcPr>
+            <w:tcW w:type="dxa" w:w="3260"/>
+            <w:tcMar>
+              <w:top w:w="80" w:type="dxa"/>
+              <w:start w:w="120" w:type="dxa"/>
+              <w:bottom w:w="80" w:type="dxa"/>
+              <w:end w:w="120" w:type="dxa"/>
+            </w:tcMar>
+            <w:vAlign w:val="center"/>
+            <w:shd w:fill="FFFFFF"/>
+          </w:tcPr>
+          <w:p>
+            <w:pPr>
+              <w:spacing w:before="0" w:after="40" w:line="252" w:lineRule="auto"/>
+              <w:jc w:val="left"/>
+            </w:pPr>
+            <w:r>
+              <w:rPr>
+                <w:rFonts w:ascii="Calibri" w:hAnsi="Calibri"/>
+                <w:b w:val="0"/>
+                <w:color w:val="111827"/>
+                <w:sz w:val="17"/>
+              </w:rPr>
+              <w:t>Add protocol adapters after core session behavior stabilizes</w:t>
+            </w:r>
+          </w:p>
+        </w:tc>
+      </w:tr>
     </w:tbl>
     <w:p>
       <w:pPr>
@@ -16946,7 +20442,7 @@
         <w:pStyle w:val="ListNumber"/>
         <w:numPr>
           <w:ilvl w:val="0"/>
-          <w:numId w:val="20"/>
+          <w:numId w:val="23"/>
         </w:numPr>
         <w:spacing w:after="120"/>
       </w:pPr>
@@ -16964,7 +20460,7 @@
         <w:pStyle w:val="ListNumber"/>
         <w:numPr>
           <w:ilvl w:val="0"/>
-          <w:numId w:val="20"/>
+          <w:numId w:val="23"/>
         </w:numPr>
         <w:spacing w:after="120"/>
       </w:pPr>
@@ -16982,7 +20478,7 @@
         <w:pStyle w:val="ListNumber"/>
         <w:numPr>
           <w:ilvl w:val="0"/>
-          <w:numId w:val="20"/>
+          <w:numId w:val="23"/>
         </w:numPr>
         <w:spacing w:after="120"/>
       </w:pPr>
@@ -17000,7 +20496,7 @@
         <w:pStyle w:val="ListNumber"/>
         <w:numPr>
           <w:ilvl w:val="0"/>
-          <w:numId w:val="20"/>
+          <w:numId w:val="23"/>
         </w:numPr>
         <w:spacing w:after="120"/>
       </w:pPr>
@@ -17018,7 +20514,7 @@
         <w:pStyle w:val="ListNumber"/>
         <w:numPr>
           <w:ilvl w:val="0"/>
-          <w:numId w:val="20"/>
+          <w:numId w:val="23"/>
         </w:numPr>
         <w:spacing w:after="120"/>
       </w:pPr>
@@ -17036,7 +20532,7 @@
         <w:pStyle w:val="ListNumber"/>
         <w:numPr>
           <w:ilvl w:val="0"/>
-          <w:numId w:val="20"/>
+          <w:numId w:val="23"/>
         </w:numPr>
         <w:spacing w:after="120"/>
       </w:pPr>
@@ -17054,7 +20550,7 @@
         <w:pStyle w:val="ListNumber"/>
         <w:numPr>
           <w:ilvl w:val="0"/>
-          <w:numId w:val="20"/>
+          <w:numId w:val="23"/>
         </w:numPr>
         <w:spacing w:after="120"/>
       </w:pPr>
@@ -17072,7 +20568,7 @@
         <w:pStyle w:val="ListNumber"/>
         <w:numPr>
           <w:ilvl w:val="0"/>
-          <w:numId w:val="20"/>
+          <w:numId w:val="23"/>
         </w:numPr>
         <w:spacing w:after="120"/>
       </w:pPr>
@@ -17090,7 +20586,7 @@
         <w:pStyle w:val="ListNumber"/>
         <w:numPr>
           <w:ilvl w:val="0"/>
-          <w:numId w:val="20"/>
+          <w:numId w:val="23"/>
         </w:numPr>
         <w:spacing w:after="120"/>
       </w:pPr>
@@ -17108,7 +20604,7 @@
         <w:pStyle w:val="ListNumber"/>
         <w:numPr>
           <w:ilvl w:val="0"/>
-          <w:numId w:val="20"/>
+          <w:numId w:val="23"/>
         </w:numPr>
         <w:spacing w:after="120"/>
       </w:pPr>
@@ -17126,7 +20622,7 @@
         <w:pStyle w:val="ListNumber"/>
         <w:numPr>
           <w:ilvl w:val="0"/>
-          <w:numId w:val="20"/>
+          <w:numId w:val="23"/>
         </w:numPr>
         <w:spacing w:after="120"/>
       </w:pPr>
@@ -17144,7 +20640,7 @@
         <w:pStyle w:val="ListNumber"/>
         <w:numPr>
           <w:ilvl w:val="0"/>
-          <w:numId w:val="20"/>
+          <w:numId w:val="23"/>
         </w:numPr>
         <w:spacing w:after="120"/>
       </w:pPr>
@@ -17162,7 +20658,7 @@
         <w:pStyle w:val="ListNumber"/>
         <w:numPr>
           <w:ilvl w:val="0"/>
-          <w:numId w:val="20"/>
+          <w:numId w:val="23"/>
         </w:numPr>
         <w:spacing w:after="120"/>
       </w:pPr>
@@ -17180,7 +20676,7 @@
         <w:pStyle w:val="ListNumber"/>
         <w:numPr>
           <w:ilvl w:val="0"/>
-          <w:numId w:val="20"/>
+          <w:numId w:val="23"/>
         </w:numPr>
         <w:spacing w:after="120"/>
       </w:pPr>
@@ -17198,7 +20694,7 @@
         <w:pStyle w:val="ListNumber"/>
         <w:numPr>
           <w:ilvl w:val="0"/>
-          <w:numId w:val="20"/>
+          <w:numId w:val="23"/>
         </w:numPr>
         <w:spacing w:after="120"/>
       </w:pPr>
@@ -17216,7 +20712,7 @@
         <w:pStyle w:val="ListNumber"/>
         <w:numPr>
           <w:ilvl w:val="0"/>
-          <w:numId w:val="20"/>
+          <w:numId w:val="23"/>
         </w:numPr>
         <w:spacing w:after="120"/>
       </w:pPr>
@@ -17227,6 +20723,96 @@
           <w:sz w:val="22"/>
         </w:rPr>
         <w:t>Repeat a successful braking command and prove that battery SOC does not increase twice.</w:t>
+      </w:r>
+    </w:p>
+    <w:p>
+      <w:pPr>
+        <w:pStyle w:val="ListNumber"/>
+        <w:numPr>
+          <w:ilvl w:val="0"/>
+          <w:numId w:val="23"/>
+        </w:numPr>
+        <w:spacing w:after="120"/>
+      </w:pPr>
+      <w:r>
+        <w:rPr>
+          <w:rFonts w:ascii="Calibri" w:hAnsi="Calibri"/>
+          <w:color w:val="111827"/>
+          <w:sz w:val="22"/>
+        </w:rPr>
+        <w:t>Start an AC Type 2 session and calculate battery energy after a ten-minute step.</w:t>
+      </w:r>
+    </w:p>
+    <w:p>
+      <w:pPr>
+        <w:pStyle w:val="ListNumber"/>
+        <w:numPr>
+          <w:ilvl w:val="0"/>
+          <w:numId w:val="23"/>
+        </w:numPr>
+        <w:spacing w:after="120"/>
+      </w:pPr>
+      <w:r>
+        <w:rPr>
+          <w:rFonts w:ascii="Calibri" w:hAnsi="Calibri"/>
+          <w:color w:val="111827"/>
+          <w:sz w:val="22"/>
+        </w:rPr>
+        <w:t>Compare DC acceptance at 70% and 90% SOC with the same battery temperature.</w:t>
+      </w:r>
+    </w:p>
+    <w:p>
+      <w:pPr>
+        <w:pStyle w:val="ListNumber"/>
+        <w:numPr>
+          <w:ilvl w:val="0"/>
+          <w:numId w:val="23"/>
+        </w:numPr>
+        <w:spacing w:after="120"/>
+      </w:pPr>
+      <w:r>
+        <w:rPr>
+          <w:rFonts w:ascii="Calibri" w:hAnsi="Calibri"/>
+          <w:color w:val="111827"/>
+          <w:sz w:val="22"/>
+        </w:rPr>
+        <w:t>Pause and resume a session and verify the battery contactor transitions.</w:t>
+      </w:r>
+    </w:p>
+    <w:p>
+      <w:pPr>
+        <w:pStyle w:val="ListNumber"/>
+        <w:numPr>
+          <w:ilvl w:val="0"/>
+          <w:numId w:val="23"/>
+        </w:numPr>
+        <w:spacing w:after="120"/>
+      </w:pPr>
+      <w:r>
+        <w:rPr>
+          <w:rFonts w:ascii="Calibri" w:hAnsi="Calibri"/>
+          <w:color w:val="111827"/>
+          <w:sz w:val="22"/>
+        </w:rPr>
+        <w:t>Inject an EVSE communication fault and prove that no charging current remains.</w:t>
+      </w:r>
+    </w:p>
+    <w:p>
+      <w:pPr>
+        <w:pStyle w:val="ListNumber"/>
+        <w:numPr>
+          <w:ilvl w:val="0"/>
+          <w:numId w:val="23"/>
+        </w:numPr>
+        <w:spacing w:after="120"/>
+      </w:pPr>
+      <w:r>
+        <w:rPr>
+          <w:rFonts w:ascii="Calibri" w:hAnsi="Calibri"/>
+          <w:color w:val="111827"/>
+          <w:sz w:val="22"/>
+        </w:rPr>
+        <w:t>Retry a successful charge command and prove that SOC does not increase twice.</w:t>
       </w:r>
     </w:p>
     <w:p>
@@ -17246,7 +20832,7 @@
           <w:color w:val="111827"/>
           <w:sz w:val="22"/>
         </w:rPr>
-        <w:t>VI-4 will add AC and DC charging sessions, connector and charger-power contracts, deterministic charge curves, SOC/temperature limits, session lifecycle, interruptions, and fault handling. It will retain logical time, optimistic versions, idempotency, RBAC, audit, outbox, and bounded evidence.</w:t>
+        <w:t>VI-5 will add active thermal-management loops for the battery, motor, inverter, and cabin. It will model cooling and heating requests, actuator limits, thermal targets, protection interactions, logical-time energy consumption, replay, audit, and outbox evidence.</w:t>
       </w:r>
     </w:p>
     <w:sectPr>
@@ -17278,7 +20864,7 @@
         <w:color w:val="667085"/>
         <w:sz w:val="17"/>
       </w:rPr>
-      <w:t>ATEP Volume VI Workbook  |  Version 0.3.0</w:t>
+      <w:t>ATEP Volume VI Workbook  |  Version 0.4.0</w:t>
     </w:r>
     <w:r>
       <w:rPr>
@@ -17620,6 +21206,24 @@
     </w:lvlOverride>
   </w:num>
   <w:num w:numId="20">
+    <w:abstractNumId w:val="10"/>
+    <w:lvlOverride w:ilvl="0">
+      <w:startOverride w:val="1"/>
+    </w:lvlOverride>
+  </w:num>
+  <w:num w:numId="21">
+    <w:abstractNumId w:val="10"/>
+    <w:lvlOverride w:ilvl="0">
+      <w:startOverride w:val="1"/>
+    </w:lvlOverride>
+  </w:num>
+  <w:num w:numId="22">
+    <w:abstractNumId w:val="10"/>
+    <w:lvlOverride w:ilvl="0">
+      <w:startOverride w:val="1"/>
+    </w:lvlOverride>
+  </w:num>
+  <w:num w:numId="23">
     <w:abstractNumId w:val="9"/>
     <w:lvlOverride w:ilvl="0">
       <w:startOverride w:val="1"/>

</xml_diff>

<commit_message>
feat(electric-vehicle): add thermal management
</commit_message>
<xml_diff>
--- a/docs/ATEP_Volume_VI_Electric_Vehicle_Engineering_Workbook.docx
+++ b/docs/ATEP_Volume_VI_Electric_Vehicle_Engineering_Workbook.docx
@@ -143,7 +143,7 @@
                 <w:color w:val="0B2545"/>
                 <w:sz w:val="19"/>
               </w:rPr>
-              <w:t>0.4.0</w:t>
+              <w:t>0.5.0</w:t>
             </w:r>
           </w:p>
         </w:tc>
@@ -265,7 +265,7 @@
                 <w:color w:val="111827"/>
                 <w:sz w:val="19"/>
               </w:rPr>
-              <w:t>VI-1 through VI-4 implemented, including AC/DC charging sessions</w:t>
+              <w:t>VI-1 through VI-5 implemented, including active thermal management</w:t>
             </w:r>
           </w:p>
         </w:tc>
@@ -873,7 +873,7 @@
                 <w:color w:val="111827"/>
                 <w:sz w:val="17"/>
               </w:rPr>
-              <w:t>0.4.0</w:t>
+              <w:t>0.5.0</w:t>
             </w:r>
           </w:p>
         </w:tc>
@@ -995,7 +995,7 @@
                 <w:color w:val="111827"/>
                 <w:sz w:val="17"/>
               </w:rPr>
-              <w:t>VI-1 through VI-4 implemented, including AC/DC charging sessions</w:t>
+              <w:t>VI-1 through VI-5 implemented, including active thermal management</w:t>
             </w:r>
           </w:p>
         </w:tc>
@@ -1084,7 +1084,7 @@
           <w:color w:val="111827"/>
           <w:sz w:val="22"/>
         </w:rPr>
-        <w:t>Volume VI turns the platform's general digital vehicle into a testable electric-energy system. VI-1 establishes a persistent battery pack and deterministic BMS behavior. VI-2 adds a persistent motor/inverter aggregate, torque delivery, efficiency, power loss, thermal protection, drive-mode limits, and battery-derived propulsion availability. VI-3 adds requested-deceleration control, regenerative energy recovery, battery charge acceptance, and blended friction braking. VI-4 adds AC/DC charging sessions, deterministic charge curves, lifecycle control, and faults.</w:t>
+        <w:t>Volume VI turns the platform's general digital vehicle into a testable electric-energy system. VI-1 establishes a persistent battery pack and deterministic BMS behavior. VI-2 adds a persistent motor/inverter aggregate, torque delivery, efficiency, power loss, thermal protection, drive-mode limits, and battery-derived propulsion availability. VI-3 adds requested-deceleration control, regenerative energy recovery, battery charge acceptance, and blended friction braking. VI-4 adds AC/DC charging sessions, deterministic charge curves, lifecycle control, and faults. VI-5 adds coordinated heating and cooling for the battery, motor, inverter, and cabin.</w:t>
       </w:r>
     </w:p>
     <w:p>
@@ -1548,7 +1548,7 @@
         <w:keepLines/>
       </w:pPr>
       <w:r>
-        <w:t>Deferred</w:t>
+        <w:t>In Scope for VI-5</w:t>
       </w:r>
     </w:p>
     <w:p>
@@ -1566,7 +1566,7 @@
           <w:color w:val="111827"/>
           <w:sz w:val="22"/>
         </w:rPr>
-        <w:t>chemistry-specific equivalent-circuit and open-circuit-voltage curves;</w:t>
+        <w:t>one vehicle-scoped state with independent battery, motor, inverter, and cabin targets;</w:t>
       </w:r>
     </w:p>
     <w:p>
@@ -1584,7 +1584,7 @@
           <w:color w:val="111827"/>
           <w:sz w:val="22"/>
         </w:rPr>
-        <w:t>cell balancing, aging, sensor faults, and module topology;</w:t>
+        <w:t>bounded actuators, ambient exchange, cabin heat load, logical-time integration, and auxiliary demand;</w:t>
       </w:r>
     </w:p>
     <w:p>
@@ -1602,7 +1602,17 @@
           <w:color w:val="111827"/>
           <w:sz w:val="22"/>
         </w:rPr>
-        <w:t>cooling actuators and range estimation;</w:t>
+        <w:t>disabled and faulted operation with triple versioning, exact replay, audit, and outbox evidence.</w:t>
+      </w:r>
+    </w:p>
+    <w:p>
+      <w:pPr>
+        <w:pStyle w:val="Heading2"/>
+        <w:keepNext/>
+        <w:keepLines/>
+      </w:pPr>
+      <w:r>
+        <w:t>Deferred</w:t>
       </w:r>
     </w:p>
     <w:p>
@@ -1610,7 +1620,7 @@
         <w:pStyle w:val="ListBullet"/>
         <w:numPr>
           <w:ilvl w:val="0"/>
-          <w:numId w:val="15"/>
+          <w:numId w:val="16"/>
         </w:numPr>
         <w:spacing w:after="80"/>
       </w:pPr>
@@ -1620,7 +1630,25 @@
           <w:color w:val="111827"/>
           <w:sz w:val="22"/>
         </w:rPr>
-        <w:t>BMS ECU, CAN, UDS, dashboard, and test-framework end-to-end orchestration.</w:t>
+        <w:t>chemistry-specific circuits, cell balancing, aging, sensor faults, and module topology;</w:t>
+      </w:r>
+    </w:p>
+    <w:p>
+      <w:pPr>
+        <w:pStyle w:val="ListBullet"/>
+        <w:numPr>
+          <w:ilvl w:val="0"/>
+          <w:numId w:val="16"/>
+        </w:numPr>
+        <w:spacing w:after="80"/>
+      </w:pPr>
+      <w:r>
+        <w:rPr>
+          <w:rFonts w:ascii="Calibri" w:hAnsi="Calibri"/>
+          <w:color w:val="111827"/>
+          <w:sz w:val="22"/>
+        </w:rPr>
+        <w:t>range estimation, calibrated thermal circuits, and BMS ECU, CAN, UDS, dashboard, and test orchestration.</w:t>
       </w:r>
     </w:p>
     <w:p>
@@ -1720,7 +1748,7 @@
           <w:color w:val="111827"/>
           <w:sz w:val="22"/>
         </w:rPr>
-        <w:t xml:space="preserve">, and </w:t>
+        <w:t xml:space="preserve">, </w:t>
       </w:r>
       <w:r>
         <w:rPr>
@@ -1736,7 +1764,23 @@
           <w:color w:val="111827"/>
           <w:sz w:val="22"/>
         </w:rPr>
-        <w:t xml:space="preserve"> own the battery, propulsion, braking, and charging aggregates. Their simulation step records preserve immutable replay evidence. </w:t>
+        <w:t xml:space="preserve">, and </w:t>
+      </w:r>
+      <w:r>
+        <w:rPr>
+          <w:rFonts w:ascii="Consolas" w:hAnsi="Consolas"/>
+          <w:color w:val="1F4D78"/>
+          <w:sz w:val="19"/>
+        </w:rPr>
+        <w:t>ThermalManagementState</w:t>
+      </w:r>
+      <w:r>
+        <w:rPr>
+          <w:rFonts w:ascii="Calibri" w:hAnsi="Calibri"/>
+          <w:color w:val="111827"/>
+          <w:sz w:val="22"/>
+        </w:rPr>
+        <w:t xml:space="preserve"> own the battery, propulsion, braking, charging, and thermal aggregates. Their simulation step records preserve immutable replay evidence. </w:t>
       </w:r>
       <w:r>
         <w:rPr>
@@ -3482,6 +3526,256 @@
           </w:p>
         </w:tc>
       </w:tr>
+      <w:tr>
+        <w:trPr>
+          <w:cantSplit/>
+        </w:trPr>
+        <w:tc>
+          <w:tcPr>
+            <w:tcW w:type="dxa" w:w="1650"/>
+            <w:tcMar>
+              <w:top w:w="80" w:type="dxa"/>
+              <w:start w:w="120" w:type="dxa"/>
+              <w:bottom w:w="80" w:type="dxa"/>
+              <w:end w:w="120" w:type="dxa"/>
+            </w:tcMar>
+            <w:vAlign w:val="center"/>
+            <w:shd w:fill="FFFFFF"/>
+          </w:tcPr>
+          <w:p>
+            <w:pPr>
+              <w:spacing w:before="0" w:after="40" w:line="252" w:lineRule="auto"/>
+              <w:jc w:val="center"/>
+            </w:pPr>
+            <w:r>
+              <w:rPr>
+                <w:rFonts w:ascii="Calibri" w:hAnsi="Calibri"/>
+                <w:b w:val="0"/>
+                <w:color w:val="111827"/>
+                <w:sz w:val="17"/>
+              </w:rPr>
+              <w:t>ThermalManagementState</w:t>
+            </w:r>
+          </w:p>
+        </w:tc>
+        <w:tc>
+          <w:tcPr>
+            <w:tcW w:type="dxa" w:w="4450"/>
+            <w:tcMar>
+              <w:top w:w="80" w:type="dxa"/>
+              <w:start w:w="120" w:type="dxa"/>
+              <w:bottom w:w="80" w:type="dxa"/>
+              <w:end w:w="120" w:type="dxa"/>
+            </w:tcMar>
+            <w:vAlign w:val="center"/>
+            <w:shd w:fill="FFFFFF"/>
+          </w:tcPr>
+          <w:p>
+            <w:pPr>
+              <w:spacing w:before="0" w:after="40" w:line="252" w:lineRule="auto"/>
+              <w:jc w:val="left"/>
+            </w:pPr>
+            <w:r>
+              <w:rPr>
+                <w:rFonts w:ascii="Calibri" w:hAnsi="Calibri"/>
+                <w:b w:val="0"/>
+                <w:color w:val="111827"/>
+                <w:sz w:val="17"/>
+              </w:rPr>
+              <w:t>Zone targets, cabin state, and actuator demand</w:t>
+            </w:r>
+          </w:p>
+        </w:tc>
+        <w:tc>
+          <w:tcPr>
+            <w:tcW w:type="dxa" w:w="3260"/>
+            <w:tcMar>
+              <w:top w:w="80" w:type="dxa"/>
+              <w:start w:w="120" w:type="dxa"/>
+              <w:bottom w:w="80" w:type="dxa"/>
+              <w:end w:w="120" w:type="dxa"/>
+            </w:tcMar>
+            <w:vAlign w:val="center"/>
+            <w:shd w:fill="FFFFFF"/>
+          </w:tcPr>
+          <w:p>
+            <w:pPr>
+              <w:spacing w:before="0" w:after="40" w:line="252" w:lineRule="auto"/>
+              <w:jc w:val="left"/>
+            </w:pPr>
+            <w:r>
+              <w:rPr>
+                <w:rFonts w:ascii="Calibri" w:hAnsi="Calibri"/>
+                <w:b w:val="0"/>
+                <w:color w:val="111827"/>
+                <w:sz w:val="17"/>
+              </w:rPr>
+              <w:t>one per vehicle; version &gt;= 1</w:t>
+            </w:r>
+          </w:p>
+        </w:tc>
+      </w:tr>
+      <w:tr>
+        <w:trPr>
+          <w:cantSplit/>
+        </w:trPr>
+        <w:tc>
+          <w:tcPr>
+            <w:tcW w:type="dxa" w:w="1650"/>
+            <w:tcMar>
+              <w:top w:w="80" w:type="dxa"/>
+              <w:start w:w="120" w:type="dxa"/>
+              <w:bottom w:w="80" w:type="dxa"/>
+              <w:end w:w="120" w:type="dxa"/>
+            </w:tcMar>
+            <w:vAlign w:val="center"/>
+            <w:shd w:fill="FFFFFF"/>
+          </w:tcPr>
+          <w:p>
+            <w:pPr>
+              <w:spacing w:before="0" w:after="40" w:line="252" w:lineRule="auto"/>
+              <w:jc w:val="center"/>
+            </w:pPr>
+            <w:r>
+              <w:rPr>
+                <w:rFonts w:ascii="Calibri" w:hAnsi="Calibri"/>
+                <w:b w:val="0"/>
+                <w:color w:val="111827"/>
+                <w:sz w:val="17"/>
+              </w:rPr>
+              <w:t>Thermal state</w:t>
+            </w:r>
+          </w:p>
+        </w:tc>
+        <w:tc>
+          <w:tcPr>
+            <w:tcW w:type="dxa" w:w="4450"/>
+            <w:tcMar>
+              <w:top w:w="80" w:type="dxa"/>
+              <w:start w:w="120" w:type="dxa"/>
+              <w:bottom w:w="80" w:type="dxa"/>
+              <w:end w:w="120" w:type="dxa"/>
+            </w:tcMar>
+            <w:vAlign w:val="center"/>
+            <w:shd w:fill="FFFFFF"/>
+          </w:tcPr>
+          <w:p>
+            <w:pPr>
+              <w:spacing w:before="0" w:after="40" w:line="252" w:lineRule="auto"/>
+              <w:jc w:val="left"/>
+            </w:pPr>
+            <w:r>
+              <w:rPr>
+                <w:rFonts w:ascii="Calibri" w:hAnsi="Calibri"/>
+                <w:b w:val="0"/>
+                <w:color w:val="111827"/>
+                <w:sz w:val="17"/>
+              </w:rPr>
+              <w:t>Current controller outcome</w:t>
+            </w:r>
+          </w:p>
+        </w:tc>
+        <w:tc>
+          <w:tcPr>
+            <w:tcW w:type="dxa" w:w="3260"/>
+            <w:tcMar>
+              <w:top w:w="80" w:type="dxa"/>
+              <w:start w:w="120" w:type="dxa"/>
+              <w:bottom w:w="80" w:type="dxa"/>
+              <w:end w:w="120" w:type="dxa"/>
+            </w:tcMar>
+            <w:vAlign w:val="center"/>
+            <w:shd w:fill="FFFFFF"/>
+          </w:tcPr>
+          <w:p>
+            <w:pPr>
+              <w:spacing w:before="0" w:after="40" w:line="252" w:lineRule="auto"/>
+              <w:jc w:val="left"/>
+            </w:pPr>
+            <w:r>
+              <w:rPr>
+                <w:rFonts w:ascii="Calibri" w:hAnsi="Calibri"/>
+                <w:b w:val="0"/>
+                <w:color w:val="111827"/>
+                <w:sz w:val="17"/>
+              </w:rPr>
+              <w:t>standby</w:t>
+            </w:r>
+            <w:r>
+              <w:rPr>
+                <w:rFonts w:ascii="Calibri" w:hAnsi="Calibri"/>
+                <w:b w:val="0"/>
+                <w:color w:val="111827"/>
+                <w:sz w:val="17"/>
+              </w:rPr>
+              <w:t xml:space="preserve">, </w:t>
+            </w:r>
+            <w:r>
+              <w:rPr>
+                <w:rFonts w:ascii="Calibri" w:hAnsi="Calibri"/>
+                <w:b w:val="0"/>
+                <w:color w:val="111827"/>
+                <w:sz w:val="17"/>
+              </w:rPr>
+              <w:t>heating</w:t>
+            </w:r>
+            <w:r>
+              <w:rPr>
+                <w:rFonts w:ascii="Calibri" w:hAnsi="Calibri"/>
+                <w:b w:val="0"/>
+                <w:color w:val="111827"/>
+                <w:sz w:val="17"/>
+              </w:rPr>
+              <w:t xml:space="preserve">, </w:t>
+            </w:r>
+            <w:r>
+              <w:rPr>
+                <w:rFonts w:ascii="Calibri" w:hAnsi="Calibri"/>
+                <w:b w:val="0"/>
+                <w:color w:val="111827"/>
+                <w:sz w:val="17"/>
+              </w:rPr>
+              <w:t>cooling</w:t>
+            </w:r>
+            <w:r>
+              <w:rPr>
+                <w:rFonts w:ascii="Calibri" w:hAnsi="Calibri"/>
+                <w:b w:val="0"/>
+                <w:color w:val="111827"/>
+                <w:sz w:val="17"/>
+              </w:rPr>
+              <w:t xml:space="preserve">, </w:t>
+            </w:r>
+            <w:r>
+              <w:rPr>
+                <w:rFonts w:ascii="Calibri" w:hAnsi="Calibri"/>
+                <w:b w:val="0"/>
+                <w:color w:val="111827"/>
+                <w:sz w:val="17"/>
+              </w:rPr>
+              <w:t>mixed</w:t>
+            </w:r>
+            <w:r>
+              <w:rPr>
+                <w:rFonts w:ascii="Calibri" w:hAnsi="Calibri"/>
+                <w:b w:val="0"/>
+                <w:color w:val="111827"/>
+                <w:sz w:val="17"/>
+              </w:rPr>
+              <w:t xml:space="preserve">, </w:t>
+            </w:r>
+            <w:r>
+              <w:rPr>
+                <w:rFonts w:ascii="Calibri" w:hAnsi="Calibri"/>
+                <w:b w:val="0"/>
+                <w:color w:val="111827"/>
+                <w:sz w:val="17"/>
+              </w:rPr>
+              <w:t>faulted</w:t>
+            </w:r>
+          </w:p>
+        </w:tc>
+      </w:tr>
     </w:tbl>
     <w:p>
       <w:pPr>
@@ -3533,7 +3827,7 @@
         <w:pStyle w:val="ListBullet"/>
         <w:numPr>
           <w:ilvl w:val="0"/>
-          <w:numId w:val="16"/>
+          <w:numId w:val="17"/>
         </w:numPr>
         <w:spacing w:after="80"/>
       </w:pPr>
@@ -3551,7 +3845,7 @@
         <w:pStyle w:val="ListBullet"/>
         <w:numPr>
           <w:ilvl w:val="0"/>
-          <w:numId w:val="16"/>
+          <w:numId w:val="17"/>
         </w:numPr>
         <w:spacing w:after="80"/>
       </w:pPr>
@@ -3569,7 +3863,7 @@
         <w:pStyle w:val="ListBullet"/>
         <w:numPr>
           <w:ilvl w:val="0"/>
-          <w:numId w:val="16"/>
+          <w:numId w:val="17"/>
         </w:numPr>
         <w:spacing w:after="80"/>
       </w:pPr>
@@ -3597,7 +3891,7 @@
         <w:pStyle w:val="ListBullet"/>
         <w:numPr>
           <w:ilvl w:val="0"/>
-          <w:numId w:val="17"/>
+          <w:numId w:val="18"/>
         </w:numPr>
         <w:spacing w:after="80"/>
       </w:pPr>
@@ -3615,7 +3909,7 @@
         <w:pStyle w:val="ListBullet"/>
         <w:numPr>
           <w:ilvl w:val="0"/>
-          <w:numId w:val="17"/>
+          <w:numId w:val="18"/>
         </w:numPr>
         <w:spacing w:after="80"/>
       </w:pPr>
@@ -3643,7 +3937,7 @@
         <w:pStyle w:val="ListBullet"/>
         <w:numPr>
           <w:ilvl w:val="0"/>
-          <w:numId w:val="18"/>
+          <w:numId w:val="19"/>
         </w:numPr>
         <w:spacing w:after="80"/>
       </w:pPr>
@@ -3681,7 +3975,7 @@
         <w:pStyle w:val="ListBullet"/>
         <w:numPr>
           <w:ilvl w:val="0"/>
-          <w:numId w:val="19"/>
+          <w:numId w:val="20"/>
         </w:numPr>
         <w:spacing w:after="80"/>
       </w:pPr>
@@ -3699,7 +3993,7 @@
         <w:pStyle w:val="ListBullet"/>
         <w:numPr>
           <w:ilvl w:val="0"/>
-          <w:numId w:val="19"/>
+          <w:numId w:val="20"/>
         </w:numPr>
         <w:spacing w:after="80"/>
       </w:pPr>
@@ -3717,7 +4011,7 @@
         <w:pStyle w:val="ListBullet"/>
         <w:numPr>
           <w:ilvl w:val="0"/>
-          <w:numId w:val="19"/>
+          <w:numId w:val="20"/>
         </w:numPr>
         <w:spacing w:after="80"/>
       </w:pPr>
@@ -3735,7 +4029,7 @@
         <w:pStyle w:val="ListBullet"/>
         <w:numPr>
           <w:ilvl w:val="0"/>
-          <w:numId w:val="19"/>
+          <w:numId w:val="20"/>
         </w:numPr>
         <w:spacing w:after="80"/>
       </w:pPr>
@@ -3753,7 +4047,7 @@
         <w:pStyle w:val="ListBullet"/>
         <w:numPr>
           <w:ilvl w:val="0"/>
-          <w:numId w:val="19"/>
+          <w:numId w:val="20"/>
         </w:numPr>
         <w:spacing w:after="80"/>
       </w:pPr>
@@ -3771,7 +4065,7 @@
         <w:pStyle w:val="ListBullet"/>
         <w:numPr>
           <w:ilvl w:val="0"/>
-          <w:numId w:val="19"/>
+          <w:numId w:val="20"/>
         </w:numPr>
         <w:spacing w:after="80"/>
       </w:pPr>
@@ -3799,7 +4093,7 @@
         <w:pStyle w:val="ListBullet"/>
         <w:numPr>
           <w:ilvl w:val="0"/>
-          <w:numId w:val="20"/>
+          <w:numId w:val="21"/>
         </w:numPr>
         <w:spacing w:after="80"/>
       </w:pPr>
@@ -3817,7 +4111,7 @@
         <w:pStyle w:val="ListBullet"/>
         <w:numPr>
           <w:ilvl w:val="0"/>
-          <w:numId w:val="20"/>
+          <w:numId w:val="21"/>
         </w:numPr>
         <w:spacing w:after="80"/>
       </w:pPr>
@@ -3835,7 +4129,7 @@
         <w:pStyle w:val="ListBullet"/>
         <w:numPr>
           <w:ilvl w:val="0"/>
-          <w:numId w:val="20"/>
+          <w:numId w:val="21"/>
         </w:numPr>
         <w:spacing w:after="80"/>
       </w:pPr>
@@ -3853,7 +4147,7 @@
         <w:pStyle w:val="ListBullet"/>
         <w:numPr>
           <w:ilvl w:val="0"/>
-          <w:numId w:val="20"/>
+          <w:numId w:val="21"/>
         </w:numPr>
         <w:spacing w:after="80"/>
       </w:pPr>
@@ -3871,7 +4165,7 @@
         <w:pStyle w:val="ListBullet"/>
         <w:numPr>
           <w:ilvl w:val="0"/>
-          <w:numId w:val="20"/>
+          <w:numId w:val="21"/>
         </w:numPr>
         <w:spacing w:after="80"/>
       </w:pPr>
@@ -3919,7 +4213,7 @@
         <w:pStyle w:val="ListBullet"/>
         <w:numPr>
           <w:ilvl w:val="0"/>
-          <w:numId w:val="21"/>
+          <w:numId w:val="22"/>
         </w:numPr>
         <w:spacing w:after="80"/>
       </w:pPr>
@@ -3937,7 +4231,7 @@
         <w:pStyle w:val="ListBullet"/>
         <w:numPr>
           <w:ilvl w:val="0"/>
-          <w:numId w:val="21"/>
+          <w:numId w:val="22"/>
         </w:numPr>
         <w:spacing w:after="80"/>
       </w:pPr>
@@ -3955,7 +4249,7 @@
         <w:pStyle w:val="ListBullet"/>
         <w:numPr>
           <w:ilvl w:val="0"/>
-          <w:numId w:val="21"/>
+          <w:numId w:val="22"/>
         </w:numPr>
         <w:spacing w:after="80"/>
       </w:pPr>
@@ -3973,7 +4267,7 @@
         <w:pStyle w:val="ListBullet"/>
         <w:numPr>
           <w:ilvl w:val="0"/>
-          <w:numId w:val="21"/>
+          <w:numId w:val="22"/>
         </w:numPr>
         <w:spacing w:after="80"/>
       </w:pPr>
@@ -4001,7 +4295,7 @@
         <w:pStyle w:val="ListBullet"/>
         <w:numPr>
           <w:ilvl w:val="0"/>
-          <w:numId w:val="22"/>
+          <w:numId w:val="23"/>
         </w:numPr>
         <w:spacing w:after="80"/>
       </w:pPr>
@@ -4019,7 +4313,7 @@
         <w:pStyle w:val="ListBullet"/>
         <w:numPr>
           <w:ilvl w:val="0"/>
-          <w:numId w:val="22"/>
+          <w:numId w:val="23"/>
         </w:numPr>
         <w:spacing w:after="80"/>
       </w:pPr>
@@ -4030,6 +4324,134 @@
           <w:sz w:val="22"/>
         </w:rPr>
         <w:t>Above 80% SOC, the analytic curve tapers power toward zero at the configured target.</w:t>
+      </w:r>
+    </w:p>
+    <w:p>
+      <w:pPr>
+        <w:pStyle w:val="Heading2"/>
+        <w:keepNext/>
+        <w:keepLines/>
+      </w:pPr>
+      <w:r>
+        <w:t>VI-5 Thermal Control Model</w:t>
+      </w:r>
+    </w:p>
+    <w:p>
+      <w:pPr>
+        <w:pStyle w:val="ListBullet"/>
+        <w:numPr>
+          <w:ilvl w:val="0"/>
+          <w:numId w:val="24"/>
+        </w:numPr>
+        <w:spacing w:after="80"/>
+      </w:pPr>
+      <w:r>
+        <w:rPr>
+          <w:rFonts w:ascii="Calibri" w:hAnsi="Calibri"/>
+          <w:color w:val="111827"/>
+          <w:sz w:val="22"/>
+        </w:rPr>
+        <w:t>Zone request (kW) equals target minus actual temperature multiplied by 0.5 kW/C, capped by capacity.</w:t>
+      </w:r>
+    </w:p>
+    <w:p>
+      <w:pPr>
+        <w:pStyle w:val="ListBullet"/>
+        <w:numPr>
+          <w:ilvl w:val="0"/>
+          <w:numId w:val="24"/>
+        </w:numPr>
+        <w:spacing w:after="80"/>
+      </w:pPr>
+      <w:r>
+        <w:rPr>
+          <w:rFonts w:ascii="Calibri" w:hAnsi="Calibri"/>
+          <w:color w:val="111827"/>
+          <w:sz w:val="22"/>
+        </w:rPr>
+        <w:t>Positive actuator power heats a zone; negative actuator power cools it.</w:t>
+      </w:r>
+    </w:p>
+    <w:p>
+      <w:pPr>
+        <w:pStyle w:val="ListBullet"/>
+        <w:numPr>
+          <w:ilvl w:val="0"/>
+          <w:numId w:val="24"/>
+        </w:numPr>
+        <w:spacing w:after="80"/>
+      </w:pPr>
+      <w:r>
+        <w:rPr>
+          <w:rFonts w:ascii="Calibri" w:hAnsi="Calibri"/>
+          <w:color w:val="111827"/>
+          <w:sz w:val="22"/>
+        </w:rPr>
+        <w:t>Battery, motor, inverter, and cabin temperatures integrate actuator power, ambient exchange,</w:t>
+      </w:r>
+    </w:p>
+    <w:p>
+      <w:r>
+        <w:rPr>
+          <w:rFonts w:ascii="Calibri" w:hAnsi="Calibri"/>
+          <w:color w:val="111827"/>
+          <w:sz w:val="22"/>
+        </w:rPr>
+        <w:t>and logical duration against explicit lumped thermal masses.</w:t>
+      </w:r>
+    </w:p>
+    <w:p>
+      <w:pPr>
+        <w:pStyle w:val="ListBullet"/>
+        <w:numPr>
+          <w:ilvl w:val="0"/>
+          <w:numId w:val="25"/>
+        </w:numPr>
+        <w:spacing w:after="80"/>
+      </w:pPr>
+      <w:r>
+        <w:rPr>
+          <w:rFonts w:ascii="Calibri" w:hAnsi="Calibri"/>
+          <w:color w:val="111827"/>
+          <w:sz w:val="22"/>
+        </w:rPr>
+        <w:t>Motor output uses at most 60% of the powertrain budget. Inverter output uses the remainder.</w:t>
+      </w:r>
+    </w:p>
+    <w:p>
+      <w:pPr>
+        <w:pStyle w:val="ListBullet"/>
+        <w:numPr>
+          <w:ilvl w:val="0"/>
+          <w:numId w:val="25"/>
+        </w:numPr>
+        <w:spacing w:after="80"/>
+      </w:pPr>
+      <w:r>
+        <w:rPr>
+          <w:rFonts w:ascii="Calibri" w:hAnsi="Calibri"/>
+          <w:color w:val="111827"/>
+          <w:sz w:val="22"/>
+        </w:rPr>
+        <w:t>Cabin temperature also integrates a bounded passenger, solar, or equipment heat load.</w:t>
+      </w:r>
+    </w:p>
+    <w:p>
+      <w:pPr>
+        <w:pStyle w:val="ListBullet"/>
+        <w:numPr>
+          <w:ilvl w:val="0"/>
+          <w:numId w:val="25"/>
+        </w:numPr>
+        <w:spacing w:after="80"/>
+      </w:pPr>
+      <w:r>
+        <w:rPr>
+          <w:rFonts w:ascii="Calibri" w:hAnsi="Calibri"/>
+          <w:color w:val="111827"/>
+          <w:sz w:val="22"/>
+        </w:rPr>
+        <w:t>Auxiliary demand is the sum of absolute zone powers. Disabled or faulted control draws zero.</w:t>
       </w:r>
     </w:p>
     <w:p>
@@ -5972,6 +6394,273 @@
           </w:p>
         </w:tc>
       </w:tr>
+      <w:tr>
+        <w:trPr>
+          <w:cantSplit/>
+        </w:trPr>
+        <w:tc>
+          <w:tcPr>
+            <w:tcW w:type="dxa" w:w="3100"/>
+            <w:tcMar>
+              <w:top w:w="80" w:type="dxa"/>
+              <w:start w:w="120" w:type="dxa"/>
+              <w:bottom w:w="80" w:type="dxa"/>
+              <w:end w:w="120" w:type="dxa"/>
+            </w:tcMar>
+            <w:vAlign w:val="center"/>
+            <w:shd w:fill="FFFFFF"/>
+          </w:tcPr>
+          <w:p>
+            <w:pPr>
+              <w:spacing w:before="0" w:after="40" w:line="252" w:lineRule="auto"/>
+              <w:jc w:val="center"/>
+            </w:pPr>
+            <w:r>
+              <w:rPr>
+                <w:rFonts w:ascii="Calibri" w:hAnsi="Calibri"/>
+                <w:b w:val="0"/>
+                <w:color w:val="111827"/>
+                <w:sz w:val="17"/>
+              </w:rPr>
+              <w:t>POST /api/v1/vehicles/{vehicle_id}/electric/thermal</w:t>
+            </w:r>
+          </w:p>
+        </w:tc>
+        <w:tc>
+          <w:tcPr>
+            <w:tcW w:type="dxa" w:w="4000"/>
+            <w:tcMar>
+              <w:top w:w="80" w:type="dxa"/>
+              <w:start w:w="120" w:type="dxa"/>
+              <w:bottom w:w="80" w:type="dxa"/>
+              <w:end w:w="120" w:type="dxa"/>
+            </w:tcMar>
+            <w:vAlign w:val="center"/>
+            <w:shd w:fill="FFFFFF"/>
+          </w:tcPr>
+          <w:p>
+            <w:pPr>
+              <w:spacing w:before="0" w:after="40" w:line="252" w:lineRule="auto"/>
+              <w:jc w:val="left"/>
+            </w:pPr>
+            <w:r>
+              <w:rPr>
+                <w:rFonts w:ascii="Calibri" w:hAnsi="Calibri"/>
+                <w:b w:val="0"/>
+                <w:color w:val="111827"/>
+                <w:sz w:val="17"/>
+              </w:rPr>
+              <w:t>Create thermal targets and actuator capacities</w:t>
+            </w:r>
+          </w:p>
+        </w:tc>
+        <w:tc>
+          <w:tcPr>
+            <w:tcW w:type="dxa" w:w="2260"/>
+            <w:tcMar>
+              <w:top w:w="80" w:type="dxa"/>
+              <w:start w:w="120" w:type="dxa"/>
+              <w:bottom w:w="80" w:type="dxa"/>
+              <w:end w:w="120" w:type="dxa"/>
+            </w:tcMar>
+            <w:vAlign w:val="center"/>
+            <w:shd w:fill="FFFFFF"/>
+          </w:tcPr>
+          <w:p>
+            <w:pPr>
+              <w:spacing w:before="0" w:after="40" w:line="252" w:lineRule="auto"/>
+              <w:jc w:val="left"/>
+            </w:pPr>
+            <w:r>
+              <w:rPr>
+                <w:rFonts w:ascii="Calibri" w:hAnsi="Calibri"/>
+                <w:b w:val="0"/>
+                <w:color w:val="111827"/>
+                <w:sz w:val="17"/>
+              </w:rPr>
+              <w:t>electric_vehicle:manage</w:t>
+            </w:r>
+          </w:p>
+        </w:tc>
+      </w:tr>
+      <w:tr>
+        <w:trPr>
+          <w:cantSplit/>
+        </w:trPr>
+        <w:tc>
+          <w:tcPr>
+            <w:tcW w:type="dxa" w:w="3100"/>
+            <w:tcMar>
+              <w:top w:w="80" w:type="dxa"/>
+              <w:start w:w="120" w:type="dxa"/>
+              <w:bottom w:w="80" w:type="dxa"/>
+              <w:end w:w="120" w:type="dxa"/>
+            </w:tcMar>
+            <w:vAlign w:val="center"/>
+            <w:shd w:fill="FFFFFF"/>
+          </w:tcPr>
+          <w:p>
+            <w:pPr>
+              <w:spacing w:before="0" w:after="40" w:line="252" w:lineRule="auto"/>
+              <w:jc w:val="center"/>
+            </w:pPr>
+            <w:r>
+              <w:rPr>
+                <w:rFonts w:ascii="Calibri" w:hAnsi="Calibri"/>
+                <w:b w:val="0"/>
+                <w:color w:val="111827"/>
+                <w:sz w:val="17"/>
+              </w:rPr>
+              <w:t>GET /api/v1/vehicles/{vehicle_id}/electric/thermal</w:t>
+            </w:r>
+          </w:p>
+        </w:tc>
+        <w:tc>
+          <w:tcPr>
+            <w:tcW w:type="dxa" w:w="4000"/>
+            <w:tcMar>
+              <w:top w:w="80" w:type="dxa"/>
+              <w:start w:w="120" w:type="dxa"/>
+              <w:bottom w:w="80" w:type="dxa"/>
+              <w:end w:w="120" w:type="dxa"/>
+            </w:tcMar>
+            <w:vAlign w:val="center"/>
+            <w:shd w:fill="FFFFFF"/>
+          </w:tcPr>
+          <w:p>
+            <w:pPr>
+              <w:spacing w:before="0" w:after="40" w:line="252" w:lineRule="auto"/>
+              <w:jc w:val="left"/>
+            </w:pPr>
+            <w:r>
+              <w:rPr>
+                <w:rFonts w:ascii="Calibri" w:hAnsi="Calibri"/>
+                <w:b w:val="0"/>
+                <w:color w:val="111827"/>
+                <w:sz w:val="17"/>
+              </w:rPr>
+              <w:t>Read zone temperatures, output, and state</w:t>
+            </w:r>
+          </w:p>
+        </w:tc>
+        <w:tc>
+          <w:tcPr>
+            <w:tcW w:type="dxa" w:w="2260"/>
+            <w:tcMar>
+              <w:top w:w="80" w:type="dxa"/>
+              <w:start w:w="120" w:type="dxa"/>
+              <w:bottom w:w="80" w:type="dxa"/>
+              <w:end w:w="120" w:type="dxa"/>
+            </w:tcMar>
+            <w:vAlign w:val="center"/>
+            <w:shd w:fill="FFFFFF"/>
+          </w:tcPr>
+          <w:p>
+            <w:pPr>
+              <w:spacing w:before="0" w:after="40" w:line="252" w:lineRule="auto"/>
+              <w:jc w:val="left"/>
+            </w:pPr>
+            <w:r>
+              <w:rPr>
+                <w:rFonts w:ascii="Calibri" w:hAnsi="Calibri"/>
+                <w:b w:val="0"/>
+                <w:color w:val="111827"/>
+                <w:sz w:val="17"/>
+              </w:rPr>
+              <w:t>electric_vehicle:read</w:t>
+            </w:r>
+          </w:p>
+        </w:tc>
+      </w:tr>
+      <w:tr>
+        <w:trPr>
+          <w:cantSplit/>
+        </w:trPr>
+        <w:tc>
+          <w:tcPr>
+            <w:tcW w:type="dxa" w:w="3100"/>
+            <w:tcMar>
+              <w:top w:w="80" w:type="dxa"/>
+              <w:start w:w="120" w:type="dxa"/>
+              <w:bottom w:w="80" w:type="dxa"/>
+              <w:end w:w="120" w:type="dxa"/>
+            </w:tcMar>
+            <w:vAlign w:val="center"/>
+            <w:shd w:fill="FFFFFF"/>
+          </w:tcPr>
+          <w:p>
+            <w:pPr>
+              <w:spacing w:before="0" w:after="40" w:line="252" w:lineRule="auto"/>
+              <w:jc w:val="center"/>
+            </w:pPr>
+            <w:r>
+              <w:rPr>
+                <w:rFonts w:ascii="Calibri" w:hAnsi="Calibri"/>
+                <w:b w:val="0"/>
+                <w:color w:val="111827"/>
+                <w:sz w:val="17"/>
+              </w:rPr>
+              <w:t>POST /api/v1/vehicles/{vehicle_id}/electric/thermal/steps</w:t>
+            </w:r>
+          </w:p>
+        </w:tc>
+        <w:tc>
+          <w:tcPr>
+            <w:tcW w:type="dxa" w:w="4000"/>
+            <w:tcMar>
+              <w:top w:w="80" w:type="dxa"/>
+              <w:start w:w="120" w:type="dxa"/>
+              <w:bottom w:w="80" w:type="dxa"/>
+              <w:end w:w="120" w:type="dxa"/>
+            </w:tcMar>
+            <w:vAlign w:val="center"/>
+            <w:shd w:fill="FFFFFF"/>
+          </w:tcPr>
+          <w:p>
+            <w:pPr>
+              <w:spacing w:before="0" w:after="40" w:line="252" w:lineRule="auto"/>
+              <w:jc w:val="left"/>
+            </w:pPr>
+            <w:r>
+              <w:rPr>
+                <w:rFonts w:ascii="Calibri" w:hAnsi="Calibri"/>
+                <w:b w:val="0"/>
+                <w:color w:val="111827"/>
+                <w:sz w:val="17"/>
+              </w:rPr>
+              <w:t>Execute one deterministic thermal-control step</w:t>
+            </w:r>
+          </w:p>
+        </w:tc>
+        <w:tc>
+          <w:tcPr>
+            <w:tcW w:type="dxa" w:w="2260"/>
+            <w:tcMar>
+              <w:top w:w="80" w:type="dxa"/>
+              <w:start w:w="120" w:type="dxa"/>
+              <w:bottom w:w="80" w:type="dxa"/>
+              <w:end w:w="120" w:type="dxa"/>
+            </w:tcMar>
+            <w:vAlign w:val="center"/>
+            <w:shd w:fill="FFFFFF"/>
+          </w:tcPr>
+          <w:p>
+            <w:pPr>
+              <w:spacing w:before="0" w:after="40" w:line="252" w:lineRule="auto"/>
+              <w:jc w:val="left"/>
+            </w:pPr>
+            <w:r>
+              <w:rPr>
+                <w:rFonts w:ascii="Calibri" w:hAnsi="Calibri"/>
+                <w:b w:val="0"/>
+                <w:color w:val="111827"/>
+                <w:sz w:val="17"/>
+              </w:rPr>
+              <w:t>electric_vehicle:manage</w:t>
+            </w:r>
+          </w:p>
+        </w:tc>
+      </w:tr>
     </w:tbl>
     <w:p>
       <w:pPr>
@@ -7288,6 +7977,372 @@
                 <w:sz w:val="17"/>
               </w:rPr>
               <w:t>An action is invalid from the current lifecycle state.</w:t>
+            </w:r>
+          </w:p>
+        </w:tc>
+      </w:tr>
+      <w:tr>
+        <w:trPr>
+          <w:cantSplit/>
+        </w:trPr>
+        <w:tc>
+          <w:tcPr>
+            <w:tcW w:type="dxa" w:w="2700"/>
+            <w:tcMar>
+              <w:top w:w="80" w:type="dxa"/>
+              <w:start w:w="120" w:type="dxa"/>
+              <w:bottom w:w="80" w:type="dxa"/>
+              <w:end w:w="120" w:type="dxa"/>
+            </w:tcMar>
+            <w:vAlign w:val="center"/>
+            <w:shd w:fill="FFFFFF"/>
+          </w:tcPr>
+          <w:p>
+            <w:pPr>
+              <w:spacing w:before="0" w:after="40" w:line="252" w:lineRule="auto"/>
+              <w:jc w:val="left"/>
+            </w:pPr>
+            <w:r>
+              <w:rPr>
+                <w:rFonts w:ascii="Calibri" w:hAnsi="Calibri"/>
+                <w:b w:val="0"/>
+                <w:color w:val="111827"/>
+                <w:sz w:val="17"/>
+              </w:rPr>
+              <w:t>thermal_management_already_exists</w:t>
+            </w:r>
+          </w:p>
+        </w:tc>
+        <w:tc>
+          <w:tcPr>
+            <w:tcW w:type="dxa" w:w="6660"/>
+            <w:tcMar>
+              <w:top w:w="80" w:type="dxa"/>
+              <w:start w:w="120" w:type="dxa"/>
+              <w:bottom w:w="80" w:type="dxa"/>
+              <w:end w:w="120" w:type="dxa"/>
+            </w:tcMar>
+            <w:vAlign w:val="center"/>
+            <w:shd w:fill="FFFFFF"/>
+          </w:tcPr>
+          <w:p>
+            <w:pPr>
+              <w:spacing w:before="0" w:after="40" w:line="252" w:lineRule="auto"/>
+              <w:jc w:val="left"/>
+            </w:pPr>
+            <w:r>
+              <w:rPr>
+                <w:rFonts w:ascii="Calibri" w:hAnsi="Calibri"/>
+                <w:b w:val="0"/>
+                <w:color w:val="111827"/>
+                <w:sz w:val="17"/>
+              </w:rPr>
+              <w:t>The vehicle already owns thermal-management state.</w:t>
+            </w:r>
+          </w:p>
+        </w:tc>
+      </w:tr>
+      <w:tr>
+        <w:trPr>
+          <w:cantSplit/>
+        </w:trPr>
+        <w:tc>
+          <w:tcPr>
+            <w:tcW w:type="dxa" w:w="2700"/>
+            <w:tcMar>
+              <w:top w:w="80" w:type="dxa"/>
+              <w:start w:w="120" w:type="dxa"/>
+              <w:bottom w:w="80" w:type="dxa"/>
+              <w:end w:w="120" w:type="dxa"/>
+            </w:tcMar>
+            <w:vAlign w:val="center"/>
+            <w:shd w:fill="FFFFFF"/>
+          </w:tcPr>
+          <w:p>
+            <w:pPr>
+              <w:spacing w:before="0" w:after="40" w:line="252" w:lineRule="auto"/>
+              <w:jc w:val="left"/>
+            </w:pPr>
+            <w:r>
+              <w:rPr>
+                <w:rFonts w:ascii="Calibri" w:hAnsi="Calibri"/>
+                <w:b w:val="0"/>
+                <w:color w:val="111827"/>
+                <w:sz w:val="17"/>
+              </w:rPr>
+              <w:t>thermal_management_not_found</w:t>
+            </w:r>
+          </w:p>
+        </w:tc>
+        <w:tc>
+          <w:tcPr>
+            <w:tcW w:type="dxa" w:w="6660"/>
+            <w:tcMar>
+              <w:top w:w="80" w:type="dxa"/>
+              <w:start w:w="120" w:type="dxa"/>
+              <w:bottom w:w="80" w:type="dxa"/>
+              <w:end w:w="120" w:type="dxa"/>
+            </w:tcMar>
+            <w:vAlign w:val="center"/>
+            <w:shd w:fill="FFFFFF"/>
+          </w:tcPr>
+          <w:p>
+            <w:pPr>
+              <w:spacing w:before="0" w:after="40" w:line="252" w:lineRule="auto"/>
+              <w:jc w:val="left"/>
+            </w:pPr>
+            <w:r>
+              <w:rPr>
+                <w:rFonts w:ascii="Calibri" w:hAnsi="Calibri"/>
+                <w:b w:val="0"/>
+                <w:color w:val="111827"/>
+                <w:sz w:val="17"/>
+              </w:rPr>
+              <w:t>No thermal-management state exists for the vehicle.</w:t>
+            </w:r>
+          </w:p>
+        </w:tc>
+      </w:tr>
+      <w:tr>
+        <w:trPr>
+          <w:cantSplit/>
+        </w:trPr>
+        <w:tc>
+          <w:tcPr>
+            <w:tcW w:type="dxa" w:w="2700"/>
+            <w:tcMar>
+              <w:top w:w="80" w:type="dxa"/>
+              <w:start w:w="120" w:type="dxa"/>
+              <w:bottom w:w="80" w:type="dxa"/>
+              <w:end w:w="120" w:type="dxa"/>
+            </w:tcMar>
+            <w:vAlign w:val="center"/>
+            <w:shd w:fill="FFFFFF"/>
+          </w:tcPr>
+          <w:p>
+            <w:pPr>
+              <w:spacing w:before="0" w:after="40" w:line="252" w:lineRule="auto"/>
+              <w:jc w:val="left"/>
+            </w:pPr>
+            <w:r>
+              <w:rPr>
+                <w:rFonts w:ascii="Calibri" w:hAnsi="Calibri"/>
+                <w:b w:val="0"/>
+                <w:color w:val="111827"/>
+                <w:sz w:val="17"/>
+              </w:rPr>
+              <w:t>thermal_state_version_conflict</w:t>
+            </w:r>
+          </w:p>
+        </w:tc>
+        <w:tc>
+          <w:tcPr>
+            <w:tcW w:type="dxa" w:w="6660"/>
+            <w:tcMar>
+              <w:top w:w="80" w:type="dxa"/>
+              <w:start w:w="120" w:type="dxa"/>
+              <w:bottom w:w="80" w:type="dxa"/>
+              <w:end w:w="120" w:type="dxa"/>
+            </w:tcMar>
+            <w:vAlign w:val="center"/>
+            <w:shd w:fill="FFFFFF"/>
+          </w:tcPr>
+          <w:p>
+            <w:pPr>
+              <w:spacing w:before="0" w:after="40" w:line="252" w:lineRule="auto"/>
+              <w:jc w:val="left"/>
+            </w:pPr>
+            <w:r>
+              <w:rPr>
+                <w:rFonts w:ascii="Calibri" w:hAnsi="Calibri"/>
+                <w:b w:val="0"/>
+                <w:color w:val="111827"/>
+                <w:sz w:val="17"/>
+              </w:rPr>
+              <w:t>The thermal state version is stale.</w:t>
+            </w:r>
+          </w:p>
+        </w:tc>
+      </w:tr>
+      <w:tr>
+        <w:trPr>
+          <w:cantSplit/>
+        </w:trPr>
+        <w:tc>
+          <w:tcPr>
+            <w:tcW w:type="dxa" w:w="2700"/>
+            <w:tcMar>
+              <w:top w:w="80" w:type="dxa"/>
+              <w:start w:w="120" w:type="dxa"/>
+              <w:bottom w:w="80" w:type="dxa"/>
+              <w:end w:w="120" w:type="dxa"/>
+            </w:tcMar>
+            <w:vAlign w:val="center"/>
+            <w:shd w:fill="FFFFFF"/>
+          </w:tcPr>
+          <w:p>
+            <w:pPr>
+              <w:spacing w:before="0" w:after="40" w:line="252" w:lineRule="auto"/>
+              <w:jc w:val="left"/>
+            </w:pPr>
+            <w:r>
+              <w:rPr>
+                <w:rFonts w:ascii="Calibri" w:hAnsi="Calibri"/>
+                <w:b w:val="0"/>
+                <w:color w:val="111827"/>
+                <w:sz w:val="17"/>
+              </w:rPr>
+              <w:t>thermal_battery_version_conflict</w:t>
+            </w:r>
+          </w:p>
+        </w:tc>
+        <w:tc>
+          <w:tcPr>
+            <w:tcW w:type="dxa" w:w="6660"/>
+            <w:tcMar>
+              <w:top w:w="80" w:type="dxa"/>
+              <w:start w:w="120" w:type="dxa"/>
+              <w:bottom w:w="80" w:type="dxa"/>
+              <w:end w:w="120" w:type="dxa"/>
+            </w:tcMar>
+            <w:vAlign w:val="center"/>
+            <w:shd w:fill="FFFFFF"/>
+          </w:tcPr>
+          <w:p>
+            <w:pPr>
+              <w:spacing w:before="0" w:after="40" w:line="252" w:lineRule="auto"/>
+              <w:jc w:val="left"/>
+            </w:pPr>
+            <w:r>
+              <w:rPr>
+                <w:rFonts w:ascii="Calibri" w:hAnsi="Calibri"/>
+                <w:b w:val="0"/>
+                <w:color w:val="111827"/>
+                <w:sz w:val="17"/>
+              </w:rPr>
+              <w:t>The battery version supplied to thermal control is stale.</w:t>
+            </w:r>
+          </w:p>
+        </w:tc>
+      </w:tr>
+      <w:tr>
+        <w:trPr>
+          <w:cantSplit/>
+        </w:trPr>
+        <w:tc>
+          <w:tcPr>
+            <w:tcW w:type="dxa" w:w="2700"/>
+            <w:tcMar>
+              <w:top w:w="80" w:type="dxa"/>
+              <w:start w:w="120" w:type="dxa"/>
+              <w:bottom w:w="80" w:type="dxa"/>
+              <w:end w:w="120" w:type="dxa"/>
+            </w:tcMar>
+            <w:vAlign w:val="center"/>
+            <w:shd w:fill="FFFFFF"/>
+          </w:tcPr>
+          <w:p>
+            <w:pPr>
+              <w:spacing w:before="0" w:after="40" w:line="252" w:lineRule="auto"/>
+              <w:jc w:val="left"/>
+            </w:pPr>
+            <w:r>
+              <w:rPr>
+                <w:rFonts w:ascii="Calibri" w:hAnsi="Calibri"/>
+                <w:b w:val="0"/>
+                <w:color w:val="111827"/>
+                <w:sz w:val="17"/>
+              </w:rPr>
+              <w:t>thermal_motor_version_conflict</w:t>
+            </w:r>
+          </w:p>
+        </w:tc>
+        <w:tc>
+          <w:tcPr>
+            <w:tcW w:type="dxa" w:w="6660"/>
+            <w:tcMar>
+              <w:top w:w="80" w:type="dxa"/>
+              <w:start w:w="120" w:type="dxa"/>
+              <w:bottom w:w="80" w:type="dxa"/>
+              <w:end w:w="120" w:type="dxa"/>
+            </w:tcMar>
+            <w:vAlign w:val="center"/>
+            <w:shd w:fill="FFFFFF"/>
+          </w:tcPr>
+          <w:p>
+            <w:pPr>
+              <w:spacing w:before="0" w:after="40" w:line="252" w:lineRule="auto"/>
+              <w:jc w:val="left"/>
+            </w:pPr>
+            <w:r>
+              <w:rPr>
+                <w:rFonts w:ascii="Calibri" w:hAnsi="Calibri"/>
+                <w:b w:val="0"/>
+                <w:color w:val="111827"/>
+                <w:sz w:val="17"/>
+              </w:rPr>
+              <w:t>The motor version supplied to thermal control is stale.</w:t>
+            </w:r>
+          </w:p>
+        </w:tc>
+      </w:tr>
+      <w:tr>
+        <w:trPr>
+          <w:cantSplit/>
+        </w:trPr>
+        <w:tc>
+          <w:tcPr>
+            <w:tcW w:type="dxa" w:w="2700"/>
+            <w:tcMar>
+              <w:top w:w="80" w:type="dxa"/>
+              <w:start w:w="120" w:type="dxa"/>
+              <w:bottom w:w="80" w:type="dxa"/>
+              <w:end w:w="120" w:type="dxa"/>
+            </w:tcMar>
+            <w:vAlign w:val="center"/>
+            <w:shd w:fill="FFFFFF"/>
+          </w:tcPr>
+          <w:p>
+            <w:pPr>
+              <w:spacing w:before="0" w:after="40" w:line="252" w:lineRule="auto"/>
+              <w:jc w:val="left"/>
+            </w:pPr>
+            <w:r>
+              <w:rPr>
+                <w:rFonts w:ascii="Calibri" w:hAnsi="Calibri"/>
+                <w:b w:val="0"/>
+                <w:color w:val="111827"/>
+                <w:sz w:val="17"/>
+              </w:rPr>
+              <w:t>thermal_command_conflict</w:t>
+            </w:r>
+          </w:p>
+        </w:tc>
+        <w:tc>
+          <w:tcPr>
+            <w:tcW w:type="dxa" w:w="6660"/>
+            <w:tcMar>
+              <w:top w:w="80" w:type="dxa"/>
+              <w:start w:w="120" w:type="dxa"/>
+              <w:bottom w:w="80" w:type="dxa"/>
+              <w:end w:w="120" w:type="dxa"/>
+            </w:tcMar>
+            <w:vAlign w:val="center"/>
+            <w:shd w:fill="FFFFFF"/>
+          </w:tcPr>
+          <w:p>
+            <w:pPr>
+              <w:spacing w:before="0" w:after="40" w:line="252" w:lineRule="auto"/>
+              <w:jc w:val="left"/>
+            </w:pPr>
+            <w:r>
+              <w:rPr>
+                <w:rFonts w:ascii="Calibri" w:hAnsi="Calibri"/>
+                <w:b w:val="0"/>
+                <w:color w:val="111827"/>
+                <w:sz w:val="17"/>
+              </w:rPr>
+              <w:t>A thermal command ID was reused differently.</w:t>
             </w:r>
           </w:p>
         </w:tc>
@@ -7629,6 +8684,54 @@
           <w:color w:val="111827"/>
           <w:sz w:val="22"/>
         </w:rPr>
+        <w:t xml:space="preserve">. Migration </w:t>
+      </w:r>
+      <w:r>
+        <w:rPr>
+          <w:rFonts w:ascii="Consolas" w:hAnsi="Consolas"/>
+          <w:color w:val="1F4D78"/>
+          <w:sz w:val="19"/>
+        </w:rPr>
+        <w:t>0041_thermal_management</w:t>
+      </w:r>
+      <w:r>
+        <w:rPr>
+          <w:rFonts w:ascii="Calibri" w:hAnsi="Calibri"/>
+          <w:color w:val="111827"/>
+          <w:sz w:val="22"/>
+        </w:rPr>
+        <w:t xml:space="preserve"> creates </w:t>
+      </w:r>
+      <w:r>
+        <w:rPr>
+          <w:rFonts w:ascii="Consolas" w:hAnsi="Consolas"/>
+          <w:color w:val="1F4D78"/>
+          <w:sz w:val="19"/>
+        </w:rPr>
+        <w:t>thermal_management_states</w:t>
+      </w:r>
+      <w:r>
+        <w:rPr>
+          <w:rFonts w:ascii="Calibri" w:hAnsi="Calibri"/>
+          <w:color w:val="111827"/>
+          <w:sz w:val="22"/>
+        </w:rPr>
+        <w:t xml:space="preserve"> and </w:t>
+      </w:r>
+      <w:r>
+        <w:rPr>
+          <w:rFonts w:ascii="Consolas" w:hAnsi="Consolas"/>
+          <w:color w:val="1F4D78"/>
+          <w:sz w:val="19"/>
+        </w:rPr>
+        <w:t>thermal_management_steps</w:t>
+      </w:r>
+      <w:r>
+        <w:rPr>
+          <w:rFonts w:ascii="Calibri" w:hAnsi="Calibri"/>
+          <w:color w:val="111827"/>
+          <w:sz w:val="22"/>
+        </w:rPr>
         <w:t>.</w:t>
       </w:r>
     </w:p>
@@ -8455,6 +9558,184 @@
           </w:p>
         </w:tc>
       </w:tr>
+      <w:tr>
+        <w:trPr>
+          <w:cantSplit/>
+        </w:trPr>
+        <w:tc>
+          <w:tcPr>
+            <w:tcW w:type="dxa" w:w="1650"/>
+            <w:tcMar>
+              <w:top w:w="80" w:type="dxa"/>
+              <w:start w:w="120" w:type="dxa"/>
+              <w:bottom w:w="80" w:type="dxa"/>
+              <w:end w:w="120" w:type="dxa"/>
+            </w:tcMar>
+            <w:vAlign w:val="center"/>
+            <w:shd w:fill="FFFFFF"/>
+          </w:tcPr>
+          <w:p>
+            <w:pPr>
+              <w:spacing w:before="0" w:after="40" w:line="252" w:lineRule="auto"/>
+              <w:jc w:val="center"/>
+            </w:pPr>
+            <w:r>
+              <w:rPr>
+                <w:rFonts w:ascii="Calibri" w:hAnsi="Calibri"/>
+                <w:b w:val="0"/>
+                <w:color w:val="111827"/>
+                <w:sz w:val="17"/>
+              </w:rPr>
+              <w:t>atep.electric_vehicle.thermal_management.created.v1</w:t>
+            </w:r>
+          </w:p>
+        </w:tc>
+        <w:tc>
+          <w:tcPr>
+            <w:tcW w:type="dxa" w:w="4450"/>
+            <w:tcMar>
+              <w:top w:w="80" w:type="dxa"/>
+              <w:start w:w="120" w:type="dxa"/>
+              <w:bottom w:w="80" w:type="dxa"/>
+              <w:end w:w="120" w:type="dxa"/>
+            </w:tcMar>
+            <w:vAlign w:val="center"/>
+            <w:shd w:fill="FFFFFF"/>
+          </w:tcPr>
+          <w:p>
+            <w:pPr>
+              <w:spacing w:before="0" w:after="40" w:line="252" w:lineRule="auto"/>
+              <w:jc w:val="left"/>
+            </w:pPr>
+            <w:r>
+              <w:rPr>
+                <w:rFonts w:ascii="Calibri" w:hAnsi="Calibri"/>
+                <w:b w:val="0"/>
+                <w:color w:val="111827"/>
+                <w:sz w:val="17"/>
+              </w:rPr>
+              <w:t>Announce thermal targets and capacities</w:t>
+            </w:r>
+          </w:p>
+        </w:tc>
+        <w:tc>
+          <w:tcPr>
+            <w:tcW w:type="dxa" w:w="3260"/>
+            <w:tcMar>
+              <w:top w:w="80" w:type="dxa"/>
+              <w:start w:w="120" w:type="dxa"/>
+              <w:bottom w:w="80" w:type="dxa"/>
+              <w:end w:w="120" w:type="dxa"/>
+            </w:tcMar>
+            <w:vAlign w:val="center"/>
+            <w:shd w:fill="FFFFFF"/>
+          </w:tcPr>
+          <w:p>
+            <w:pPr>
+              <w:spacing w:before="0" w:after="40" w:line="252" w:lineRule="auto"/>
+              <w:jc w:val="left"/>
+            </w:pPr>
+            <w:r>
+              <w:rPr>
+                <w:rFonts w:ascii="Calibri" w:hAnsi="Calibri"/>
+                <w:b w:val="0"/>
+                <w:color w:val="111827"/>
+                <w:sz w:val="17"/>
+              </w:rPr>
+              <w:t>Bounded configuration only</w:t>
+            </w:r>
+          </w:p>
+        </w:tc>
+      </w:tr>
+      <w:tr>
+        <w:trPr>
+          <w:cantSplit/>
+        </w:trPr>
+        <w:tc>
+          <w:tcPr>
+            <w:tcW w:type="dxa" w:w="1650"/>
+            <w:tcMar>
+              <w:top w:w="80" w:type="dxa"/>
+              <w:start w:w="120" w:type="dxa"/>
+              <w:bottom w:w="80" w:type="dxa"/>
+              <w:end w:w="120" w:type="dxa"/>
+            </w:tcMar>
+            <w:vAlign w:val="center"/>
+            <w:shd w:fill="FFFFFF"/>
+          </w:tcPr>
+          <w:p>
+            <w:pPr>
+              <w:spacing w:before="0" w:after="40" w:line="252" w:lineRule="auto"/>
+              <w:jc w:val="center"/>
+            </w:pPr>
+            <w:r>
+              <w:rPr>
+                <w:rFonts w:ascii="Calibri" w:hAnsi="Calibri"/>
+                <w:b w:val="0"/>
+                <w:color w:val="111827"/>
+                <w:sz w:val="17"/>
+              </w:rPr>
+              <w:t>atep.electric_vehicle.thermal.step.completed.v1</w:t>
+            </w:r>
+          </w:p>
+        </w:tc>
+        <w:tc>
+          <w:tcPr>
+            <w:tcW w:type="dxa" w:w="4450"/>
+            <w:tcMar>
+              <w:top w:w="80" w:type="dxa"/>
+              <w:start w:w="120" w:type="dxa"/>
+              <w:bottom w:w="80" w:type="dxa"/>
+              <w:end w:w="120" w:type="dxa"/>
+            </w:tcMar>
+            <w:vAlign w:val="center"/>
+            <w:shd w:fill="FFFFFF"/>
+          </w:tcPr>
+          <w:p>
+            <w:pPr>
+              <w:spacing w:before="0" w:after="40" w:line="252" w:lineRule="auto"/>
+              <w:jc w:val="left"/>
+            </w:pPr>
+            <w:r>
+              <w:rPr>
+                <w:rFonts w:ascii="Calibri" w:hAnsi="Calibri"/>
+                <w:b w:val="0"/>
+                <w:color w:val="111827"/>
+                <w:sz w:val="17"/>
+              </w:rPr>
+              <w:t>Announce temperatures and actuator demand</w:t>
+            </w:r>
+          </w:p>
+        </w:tc>
+        <w:tc>
+          <w:tcPr>
+            <w:tcW w:type="dxa" w:w="3260"/>
+            <w:tcMar>
+              <w:top w:w="80" w:type="dxa"/>
+              <w:start w:w="120" w:type="dxa"/>
+              <w:bottom w:w="80" w:type="dxa"/>
+              <w:end w:w="120" w:type="dxa"/>
+            </w:tcMar>
+            <w:vAlign w:val="center"/>
+            <w:shd w:fill="FFFFFF"/>
+          </w:tcPr>
+          <w:p>
+            <w:pPr>
+              <w:spacing w:before="0" w:after="40" w:line="252" w:lineRule="auto"/>
+              <w:jc w:val="left"/>
+            </w:pPr>
+            <w:r>
+              <w:rPr>
+                <w:rFonts w:ascii="Calibri" w:hAnsi="Calibri"/>
+                <w:b w:val="0"/>
+                <w:color w:val="111827"/>
+                <w:sz w:val="17"/>
+              </w:rPr>
+              <w:t>Zone summary and versions; no cells</w:t>
+            </w:r>
+          </w:p>
+        </w:tc>
+      </w:tr>
     </w:tbl>
     <w:p>
       <w:pPr>
@@ -8478,7 +9759,7 @@
           <w:color w:val="111827"/>
           <w:sz w:val="22"/>
         </w:rPr>
-        <w:t xml:space="preserve">VI-1 through VI-4 implement EV-F-001 through EV-F-060 and EV-NF-001 through EV-NF-020. The authoritative traceability table is maintained in </w:t>
+        <w:t xml:space="preserve">VI-1 through VI-5 implement EV-F-001 through EV-F-076 and EV-NF-001 through EV-NF-024. The authoritative traceability table is maintained in </w:t>
       </w:r>
       <w:r>
         <w:rPr>
@@ -8781,6 +10062,66 @@
     </w:p>
     <w:p>
       <w:pPr>
+        <w:pStyle w:val="Heading2"/>
+        <w:keepNext/>
+        <w:keepLines/>
+      </w:pPr>
+      <w:r>
+        <w:t>ADR-EV-013 - Use Bounded Proportional Thermal Control</w:t>
+      </w:r>
+    </w:p>
+    <w:p>
+      <w:r>
+        <w:rPr>
+          <w:rFonts w:ascii="Calibri" w:hAnsi="Calibri"/>
+          <w:color w:val="111827"/>
+          <w:sz w:val="22"/>
+        </w:rPr>
+        <w:t>Decision: derive each zone request from its target error and cap it by declared actuator capacity. Rationale: the controller remains deterministic and explainable without proprietary calibration.</w:t>
+      </w:r>
+    </w:p>
+    <w:p>
+      <w:pPr>
+        <w:pStyle w:val="Heading2"/>
+        <w:keepNext/>
+        <w:keepLines/>
+      </w:pPr>
+      <w:r>
+        <w:t>ADR-EV-014 - Commit Thermal Zones and Component Temperatures Together</w:t>
+      </w:r>
+    </w:p>
+    <w:p>
+      <w:r>
+        <w:rPr>
+          <w:rFonts w:ascii="Calibri" w:hAnsi="Calibri"/>
+          <w:color w:val="111827"/>
+          <w:sz w:val="22"/>
+        </w:rPr>
+        <w:t>Decision: lock battery, motor, and thermal state in a fixed order and validate all three versions. Rationale: thermal evidence cannot describe cooling that is absent from component state.</w:t>
+      </w:r>
+    </w:p>
+    <w:p>
+      <w:pPr>
+        <w:pStyle w:val="Heading2"/>
+        <w:keepNext/>
+        <w:keepLines/>
+      </w:pPr>
+      <w:r>
+        <w:t>ADR-EV-015 - Preserve Passive Exchange When Control Is Inactive</w:t>
+      </w:r>
+    </w:p>
+    <w:p>
+      <w:r>
+        <w:rPr>
+          <w:rFonts w:ascii="Calibri" w:hAnsi="Calibri"/>
+          <w:color w:val="111827"/>
+          <w:sz w:val="22"/>
+        </w:rPr>
+        <w:t>Decision: set actuator output to zero but continue ambient exchange during disabled and faulted operation. Rationale: stopping the controller must not freeze physical temperature state.</w:t>
+      </w:r>
+    </w:p>
+    <w:p>
+      <w:pPr>
         <w:pStyle w:val="Heading1"/>
         <w:keepNext/>
         <w:keepLines/>
@@ -18491,6 +19832,1644 @@
                 <w:sz w:val="16"/>
               </w:rPr>
               <w:t>Inspect routes and revision 0040</w:t>
+            </w:r>
+          </w:p>
+        </w:tc>
+        <w:tc>
+          <w:tcPr>
+            <w:tcW w:type="dxa" w:w="1410"/>
+            <w:tcMar>
+              <w:top w:w="80" w:type="dxa"/>
+              <w:start w:w="120" w:type="dxa"/>
+              <w:bottom w:w="80" w:type="dxa"/>
+              <w:end w:w="120" w:type="dxa"/>
+            </w:tcMar>
+            <w:vAlign w:val="center"/>
+            <w:shd w:fill="FFFFFF"/>
+          </w:tcPr>
+          <w:p>
+            <w:pPr>
+              <w:spacing w:before="0" w:after="40" w:line="252" w:lineRule="auto"/>
+              <w:jc w:val="left"/>
+            </w:pPr>
+            <w:r>
+              <w:rPr>
+                <w:rFonts w:ascii="Calibri" w:hAnsi="Calibri"/>
+                <w:b w:val="0"/>
+                <w:color w:val="111827"/>
+                <w:sz w:val="16"/>
+              </w:rPr>
+              <w:t>Bounded schema and reversible tables</w:t>
+            </w:r>
+          </w:p>
+        </w:tc>
+      </w:tr>
+      <w:tr>
+        <w:trPr>
+          <w:cantSplit/>
+        </w:trPr>
+        <w:tc>
+          <w:tcPr>
+            <w:tcW w:type="dxa" w:w="1150"/>
+            <w:tcMar>
+              <w:top w:w="80" w:type="dxa"/>
+              <w:start w:w="120" w:type="dxa"/>
+              <w:bottom w:w="80" w:type="dxa"/>
+              <w:end w:w="120" w:type="dxa"/>
+            </w:tcMar>
+            <w:vAlign w:val="center"/>
+            <w:shd w:fill="FFFFFF"/>
+          </w:tcPr>
+          <w:p>
+            <w:pPr>
+              <w:spacing w:before="0" w:after="40" w:line="252" w:lineRule="auto"/>
+              <w:jc w:val="center"/>
+            </w:pPr>
+            <w:r>
+              <w:rPr>
+                <w:rFonts w:ascii="Calibri" w:hAnsi="Calibri"/>
+                <w:b w:val="0"/>
+                <w:color w:val="111827"/>
+                <w:sz w:val="16"/>
+              </w:rPr>
+              <w:t>EV-T-083</w:t>
+            </w:r>
+          </w:p>
+        </w:tc>
+        <w:tc>
+          <w:tcPr>
+            <w:tcW w:type="dxa" w:w="3700"/>
+            <w:tcMar>
+              <w:top w:w="80" w:type="dxa"/>
+              <w:start w:w="120" w:type="dxa"/>
+              <w:bottom w:w="80" w:type="dxa"/>
+              <w:end w:w="120" w:type="dxa"/>
+            </w:tcMar>
+            <w:vAlign w:val="center"/>
+            <w:shd w:fill="FFFFFF"/>
+          </w:tcPr>
+          <w:p>
+            <w:pPr>
+              <w:spacing w:before="0" w:after="40" w:line="252" w:lineRule="auto"/>
+              <w:jc w:val="left"/>
+            </w:pPr>
+            <w:r>
+              <w:rPr>
+                <w:rFonts w:ascii="Calibri" w:hAnsi="Calibri"/>
+                <w:b w:val="0"/>
+                <w:color w:val="111827"/>
+                <w:sz w:val="16"/>
+              </w:rPr>
+              <w:t>Thermal contract bounds</w:t>
+            </w:r>
+          </w:p>
+        </w:tc>
+        <w:tc>
+          <w:tcPr>
+            <w:tcW w:type="dxa" w:w="3100"/>
+            <w:tcMar>
+              <w:top w:w="80" w:type="dxa"/>
+              <w:start w:w="120" w:type="dxa"/>
+              <w:bottom w:w="80" w:type="dxa"/>
+              <w:end w:w="120" w:type="dxa"/>
+            </w:tcMar>
+            <w:vAlign w:val="center"/>
+            <w:shd w:fill="FFFFFF"/>
+          </w:tcPr>
+          <w:p>
+            <w:pPr>
+              <w:spacing w:before="0" w:after="40" w:line="252" w:lineRule="auto"/>
+              <w:jc w:val="left"/>
+            </w:pPr>
+            <w:r>
+              <w:rPr>
+                <w:rFonts w:ascii="Calibri" w:hAnsi="Calibri"/>
+                <w:b w:val="0"/>
+                <w:color w:val="111827"/>
+                <w:sz w:val="16"/>
+              </w:rPr>
+              <w:t>Exceed power, target, duration, load, or fault bounds</w:t>
+            </w:r>
+          </w:p>
+        </w:tc>
+        <w:tc>
+          <w:tcPr>
+            <w:tcW w:type="dxa" w:w="1410"/>
+            <w:tcMar>
+              <w:top w:w="80" w:type="dxa"/>
+              <w:start w:w="120" w:type="dxa"/>
+              <w:bottom w:w="80" w:type="dxa"/>
+              <w:end w:w="120" w:type="dxa"/>
+            </w:tcMar>
+            <w:vAlign w:val="center"/>
+            <w:shd w:fill="FFFFFF"/>
+          </w:tcPr>
+          <w:p>
+            <w:pPr>
+              <w:spacing w:before="0" w:after="40" w:line="252" w:lineRule="auto"/>
+              <w:jc w:val="left"/>
+            </w:pPr>
+            <w:r>
+              <w:rPr>
+                <w:rFonts w:ascii="Calibri" w:hAnsi="Calibri"/>
+                <w:b w:val="0"/>
+                <w:color w:val="111827"/>
+                <w:sz w:val="16"/>
+              </w:rPr>
+              <w:t>Stable validation error</w:t>
+            </w:r>
+          </w:p>
+        </w:tc>
+      </w:tr>
+      <w:tr>
+        <w:trPr>
+          <w:cantSplit/>
+        </w:trPr>
+        <w:tc>
+          <w:tcPr>
+            <w:tcW w:type="dxa" w:w="1150"/>
+            <w:tcMar>
+              <w:top w:w="80" w:type="dxa"/>
+              <w:start w:w="120" w:type="dxa"/>
+              <w:bottom w:w="80" w:type="dxa"/>
+              <w:end w:w="120" w:type="dxa"/>
+            </w:tcMar>
+            <w:vAlign w:val="center"/>
+            <w:shd w:fill="FFFFFF"/>
+          </w:tcPr>
+          <w:p>
+            <w:pPr>
+              <w:spacing w:before="0" w:after="40" w:line="252" w:lineRule="auto"/>
+              <w:jc w:val="center"/>
+            </w:pPr>
+            <w:r>
+              <w:rPr>
+                <w:rFonts w:ascii="Calibri" w:hAnsi="Calibri"/>
+                <w:b w:val="0"/>
+                <w:color w:val="111827"/>
+                <w:sz w:val="16"/>
+              </w:rPr>
+              <w:t>EV-T-084</w:t>
+            </w:r>
+          </w:p>
+        </w:tc>
+        <w:tc>
+          <w:tcPr>
+            <w:tcW w:type="dxa" w:w="3700"/>
+            <w:tcMar>
+              <w:top w:w="80" w:type="dxa"/>
+              <w:start w:w="120" w:type="dxa"/>
+              <w:bottom w:w="80" w:type="dxa"/>
+              <w:end w:w="120" w:type="dxa"/>
+            </w:tcMar>
+            <w:vAlign w:val="center"/>
+            <w:shd w:fill="FFFFFF"/>
+          </w:tcPr>
+          <w:p>
+            <w:pPr>
+              <w:spacing w:before="0" w:after="40" w:line="252" w:lineRule="auto"/>
+              <w:jc w:val="left"/>
+            </w:pPr>
+            <w:r>
+              <w:rPr>
+                <w:rFonts w:ascii="Calibri" w:hAnsi="Calibri"/>
+                <w:b w:val="0"/>
+                <w:color w:val="111827"/>
+                <w:sz w:val="16"/>
+              </w:rPr>
+              <w:t>Thermal-system creation</w:t>
+            </w:r>
+          </w:p>
+        </w:tc>
+        <w:tc>
+          <w:tcPr>
+            <w:tcW w:type="dxa" w:w="3100"/>
+            <w:tcMar>
+              <w:top w:w="80" w:type="dxa"/>
+              <w:start w:w="120" w:type="dxa"/>
+              <w:bottom w:w="80" w:type="dxa"/>
+              <w:end w:w="120" w:type="dxa"/>
+            </w:tcMar>
+            <w:vAlign w:val="center"/>
+            <w:shd w:fill="FFFFFF"/>
+          </w:tcPr>
+          <w:p>
+            <w:pPr>
+              <w:spacing w:before="0" w:after="40" w:line="252" w:lineRule="auto"/>
+              <w:jc w:val="left"/>
+            </w:pPr>
+            <w:r>
+              <w:rPr>
+                <w:rFonts w:ascii="Calibri" w:hAnsi="Calibri"/>
+                <w:b w:val="0"/>
+                <w:color w:val="111827"/>
+                <w:sz w:val="16"/>
+              </w:rPr>
+              <w:t>Create state after battery and motor</w:t>
+            </w:r>
+          </w:p>
+        </w:tc>
+        <w:tc>
+          <w:tcPr>
+            <w:tcW w:type="dxa" w:w="1410"/>
+            <w:tcMar>
+              <w:top w:w="80" w:type="dxa"/>
+              <w:start w:w="120" w:type="dxa"/>
+              <w:bottom w:w="80" w:type="dxa"/>
+              <w:end w:w="120" w:type="dxa"/>
+            </w:tcMar>
+            <w:vAlign w:val="center"/>
+            <w:shd w:fill="FFFFFF"/>
+          </w:tcPr>
+          <w:p>
+            <w:pPr>
+              <w:spacing w:before="0" w:after="40" w:line="252" w:lineRule="auto"/>
+              <w:jc w:val="left"/>
+            </w:pPr>
+            <w:r>
+              <w:rPr>
+                <w:rFonts w:ascii="Calibri" w:hAnsi="Calibri"/>
+                <w:b w:val="0"/>
+                <w:color w:val="111827"/>
+                <w:sz w:val="16"/>
+              </w:rPr>
+              <w:t>Version 1 and standby</w:t>
+            </w:r>
+          </w:p>
+        </w:tc>
+      </w:tr>
+      <w:tr>
+        <w:trPr>
+          <w:cantSplit/>
+        </w:trPr>
+        <w:tc>
+          <w:tcPr>
+            <w:tcW w:type="dxa" w:w="1150"/>
+            <w:tcMar>
+              <w:top w:w="80" w:type="dxa"/>
+              <w:start w:w="120" w:type="dxa"/>
+              <w:bottom w:w="80" w:type="dxa"/>
+              <w:end w:w="120" w:type="dxa"/>
+            </w:tcMar>
+            <w:vAlign w:val="center"/>
+            <w:shd w:fill="FFFFFF"/>
+          </w:tcPr>
+          <w:p>
+            <w:pPr>
+              <w:spacing w:before="0" w:after="40" w:line="252" w:lineRule="auto"/>
+              <w:jc w:val="center"/>
+            </w:pPr>
+            <w:r>
+              <w:rPr>
+                <w:rFonts w:ascii="Calibri" w:hAnsi="Calibri"/>
+                <w:b w:val="0"/>
+                <w:color w:val="111827"/>
+                <w:sz w:val="16"/>
+              </w:rPr>
+              <w:t>EV-T-085</w:t>
+            </w:r>
+          </w:p>
+        </w:tc>
+        <w:tc>
+          <w:tcPr>
+            <w:tcW w:type="dxa" w:w="3700"/>
+            <w:tcMar>
+              <w:top w:w="80" w:type="dxa"/>
+              <w:start w:w="120" w:type="dxa"/>
+              <w:bottom w:w="80" w:type="dxa"/>
+              <w:end w:w="120" w:type="dxa"/>
+            </w:tcMar>
+            <w:vAlign w:val="center"/>
+            <w:shd w:fill="FFFFFF"/>
+          </w:tcPr>
+          <w:p>
+            <w:pPr>
+              <w:spacing w:before="0" w:after="40" w:line="252" w:lineRule="auto"/>
+              <w:jc w:val="left"/>
+            </w:pPr>
+            <w:r>
+              <w:rPr>
+                <w:rFonts w:ascii="Calibri" w:hAnsi="Calibri"/>
+                <w:b w:val="0"/>
+                <w:color w:val="111827"/>
+                <w:sz w:val="16"/>
+              </w:rPr>
+              <w:t>Hot battery cooling</w:t>
+            </w:r>
+          </w:p>
+        </w:tc>
+        <w:tc>
+          <w:tcPr>
+            <w:tcW w:type="dxa" w:w="3100"/>
+            <w:tcMar>
+              <w:top w:w="80" w:type="dxa"/>
+              <w:start w:w="120" w:type="dxa"/>
+              <w:bottom w:w="80" w:type="dxa"/>
+              <w:end w:w="120" w:type="dxa"/>
+            </w:tcMar>
+            <w:vAlign w:val="center"/>
+            <w:shd w:fill="FFFFFF"/>
+          </w:tcPr>
+          <w:p>
+            <w:pPr>
+              <w:spacing w:before="0" w:after="40" w:line="252" w:lineRule="auto"/>
+              <w:jc w:val="left"/>
+            </w:pPr>
+            <w:r>
+              <w:rPr>
+                <w:rFonts w:ascii="Calibri" w:hAnsi="Calibri"/>
+                <w:b w:val="0"/>
+                <w:color w:val="111827"/>
+                <w:sz w:val="16"/>
+              </w:rPr>
+              <w:t>Run an enabled step above target</w:t>
+            </w:r>
+          </w:p>
+        </w:tc>
+        <w:tc>
+          <w:tcPr>
+            <w:tcW w:type="dxa" w:w="1410"/>
+            <w:tcMar>
+              <w:top w:w="80" w:type="dxa"/>
+              <w:start w:w="120" w:type="dxa"/>
+              <w:bottom w:w="80" w:type="dxa"/>
+              <w:end w:w="120" w:type="dxa"/>
+            </w:tcMar>
+            <w:vAlign w:val="center"/>
+            <w:shd w:fill="FFFFFF"/>
+          </w:tcPr>
+          <w:p>
+            <w:pPr>
+              <w:spacing w:before="0" w:after="40" w:line="252" w:lineRule="auto"/>
+              <w:jc w:val="left"/>
+            </w:pPr>
+            <w:r>
+              <w:rPr>
+                <w:rFonts w:ascii="Calibri" w:hAnsi="Calibri"/>
+                <w:b w:val="0"/>
+                <w:color w:val="111827"/>
+                <w:sz w:val="16"/>
+              </w:rPr>
+              <w:t>Bounded cooling and lower temperature</w:t>
+            </w:r>
+          </w:p>
+        </w:tc>
+      </w:tr>
+      <w:tr>
+        <w:trPr>
+          <w:cantSplit/>
+        </w:trPr>
+        <w:tc>
+          <w:tcPr>
+            <w:tcW w:type="dxa" w:w="1150"/>
+            <w:tcMar>
+              <w:top w:w="80" w:type="dxa"/>
+              <w:start w:w="120" w:type="dxa"/>
+              <w:bottom w:w="80" w:type="dxa"/>
+              <w:end w:w="120" w:type="dxa"/>
+            </w:tcMar>
+            <w:vAlign w:val="center"/>
+            <w:shd w:fill="FFFFFF"/>
+          </w:tcPr>
+          <w:p>
+            <w:pPr>
+              <w:spacing w:before="0" w:after="40" w:line="252" w:lineRule="auto"/>
+              <w:jc w:val="center"/>
+            </w:pPr>
+            <w:r>
+              <w:rPr>
+                <w:rFonts w:ascii="Calibri" w:hAnsi="Calibri"/>
+                <w:b w:val="0"/>
+                <w:color w:val="111827"/>
+                <w:sz w:val="16"/>
+              </w:rPr>
+              <w:t>EV-T-086</w:t>
+            </w:r>
+          </w:p>
+        </w:tc>
+        <w:tc>
+          <w:tcPr>
+            <w:tcW w:type="dxa" w:w="3700"/>
+            <w:tcMar>
+              <w:top w:w="80" w:type="dxa"/>
+              <w:start w:w="120" w:type="dxa"/>
+              <w:bottom w:w="80" w:type="dxa"/>
+              <w:end w:w="120" w:type="dxa"/>
+            </w:tcMar>
+            <w:vAlign w:val="center"/>
+            <w:shd w:fill="FFFFFF"/>
+          </w:tcPr>
+          <w:p>
+            <w:pPr>
+              <w:spacing w:before="0" w:after="40" w:line="252" w:lineRule="auto"/>
+              <w:jc w:val="left"/>
+            </w:pPr>
+            <w:r>
+              <w:rPr>
+                <w:rFonts w:ascii="Calibri" w:hAnsi="Calibri"/>
+                <w:b w:val="0"/>
+                <w:color w:val="111827"/>
+                <w:sz w:val="16"/>
+              </w:rPr>
+              <w:t>Cold cabin heating</w:t>
+            </w:r>
+          </w:p>
+        </w:tc>
+        <w:tc>
+          <w:tcPr>
+            <w:tcW w:type="dxa" w:w="3100"/>
+            <w:tcMar>
+              <w:top w:w="80" w:type="dxa"/>
+              <w:start w:w="120" w:type="dxa"/>
+              <w:bottom w:w="80" w:type="dxa"/>
+              <w:end w:w="120" w:type="dxa"/>
+            </w:tcMar>
+            <w:vAlign w:val="center"/>
+            <w:shd w:fill="FFFFFF"/>
+          </w:tcPr>
+          <w:p>
+            <w:pPr>
+              <w:spacing w:before="0" w:after="40" w:line="252" w:lineRule="auto"/>
+              <w:jc w:val="left"/>
+            </w:pPr>
+            <w:r>
+              <w:rPr>
+                <w:rFonts w:ascii="Calibri" w:hAnsi="Calibri"/>
+                <w:b w:val="0"/>
+                <w:color w:val="111827"/>
+                <w:sz w:val="16"/>
+              </w:rPr>
+              <w:t>Run an enabled step below target</w:t>
+            </w:r>
+          </w:p>
+        </w:tc>
+        <w:tc>
+          <w:tcPr>
+            <w:tcW w:type="dxa" w:w="1410"/>
+            <w:tcMar>
+              <w:top w:w="80" w:type="dxa"/>
+              <w:start w:w="120" w:type="dxa"/>
+              <w:bottom w:w="80" w:type="dxa"/>
+              <w:end w:w="120" w:type="dxa"/>
+            </w:tcMar>
+            <w:vAlign w:val="center"/>
+            <w:shd w:fill="FFFFFF"/>
+          </w:tcPr>
+          <w:p>
+            <w:pPr>
+              <w:spacing w:before="0" w:after="40" w:line="252" w:lineRule="auto"/>
+              <w:jc w:val="left"/>
+            </w:pPr>
+            <w:r>
+              <w:rPr>
+                <w:rFonts w:ascii="Calibri" w:hAnsi="Calibri"/>
+                <w:b w:val="0"/>
+                <w:color w:val="111827"/>
+                <w:sz w:val="16"/>
+              </w:rPr>
+              <w:t>Bounded heating and higher temperature</w:t>
+            </w:r>
+          </w:p>
+        </w:tc>
+      </w:tr>
+      <w:tr>
+        <w:trPr>
+          <w:cantSplit/>
+        </w:trPr>
+        <w:tc>
+          <w:tcPr>
+            <w:tcW w:type="dxa" w:w="1150"/>
+            <w:tcMar>
+              <w:top w:w="80" w:type="dxa"/>
+              <w:start w:w="120" w:type="dxa"/>
+              <w:bottom w:w="80" w:type="dxa"/>
+              <w:end w:w="120" w:type="dxa"/>
+            </w:tcMar>
+            <w:vAlign w:val="center"/>
+            <w:shd w:fill="FFFFFF"/>
+          </w:tcPr>
+          <w:p>
+            <w:pPr>
+              <w:spacing w:before="0" w:after="40" w:line="252" w:lineRule="auto"/>
+              <w:jc w:val="center"/>
+            </w:pPr>
+            <w:r>
+              <w:rPr>
+                <w:rFonts w:ascii="Calibri" w:hAnsi="Calibri"/>
+                <w:b w:val="0"/>
+                <w:color w:val="111827"/>
+                <w:sz w:val="16"/>
+              </w:rPr>
+              <w:t>EV-T-087</w:t>
+            </w:r>
+          </w:p>
+        </w:tc>
+        <w:tc>
+          <w:tcPr>
+            <w:tcW w:type="dxa" w:w="3700"/>
+            <w:tcMar>
+              <w:top w:w="80" w:type="dxa"/>
+              <w:start w:w="120" w:type="dxa"/>
+              <w:bottom w:w="80" w:type="dxa"/>
+              <w:end w:w="120" w:type="dxa"/>
+            </w:tcMar>
+            <w:vAlign w:val="center"/>
+            <w:shd w:fill="FFFFFF"/>
+          </w:tcPr>
+          <w:p>
+            <w:pPr>
+              <w:spacing w:before="0" w:after="40" w:line="252" w:lineRule="auto"/>
+              <w:jc w:val="left"/>
+            </w:pPr>
+            <w:r>
+              <w:rPr>
+                <w:rFonts w:ascii="Calibri" w:hAnsi="Calibri"/>
+                <w:b w:val="0"/>
+                <w:color w:val="111827"/>
+                <w:sz w:val="16"/>
+              </w:rPr>
+              <w:t>Mixed operation</w:t>
+            </w:r>
+          </w:p>
+        </w:tc>
+        <w:tc>
+          <w:tcPr>
+            <w:tcW w:type="dxa" w:w="3100"/>
+            <w:tcMar>
+              <w:top w:w="80" w:type="dxa"/>
+              <w:start w:w="120" w:type="dxa"/>
+              <w:bottom w:w="80" w:type="dxa"/>
+              <w:end w:w="120" w:type="dxa"/>
+            </w:tcMar>
+            <w:vAlign w:val="center"/>
+            <w:shd w:fill="FFFFFF"/>
+          </w:tcPr>
+          <w:p>
+            <w:pPr>
+              <w:spacing w:before="0" w:after="40" w:line="252" w:lineRule="auto"/>
+              <w:jc w:val="left"/>
+            </w:pPr>
+            <w:r>
+              <w:rPr>
+                <w:rFonts w:ascii="Calibri" w:hAnsi="Calibri"/>
+                <w:b w:val="0"/>
+                <w:color w:val="111827"/>
+                <w:sz w:val="16"/>
+              </w:rPr>
+              <w:t>Cool components while heating the cabin</w:t>
+            </w:r>
+          </w:p>
+        </w:tc>
+        <w:tc>
+          <w:tcPr>
+            <w:tcW w:type="dxa" w:w="1410"/>
+            <w:tcMar>
+              <w:top w:w="80" w:type="dxa"/>
+              <w:start w:w="120" w:type="dxa"/>
+              <w:bottom w:w="80" w:type="dxa"/>
+              <w:end w:w="120" w:type="dxa"/>
+            </w:tcMar>
+            <w:vAlign w:val="center"/>
+            <w:shd w:fill="FFFFFF"/>
+          </w:tcPr>
+          <w:p>
+            <w:pPr>
+              <w:spacing w:before="0" w:after="40" w:line="252" w:lineRule="auto"/>
+              <w:jc w:val="left"/>
+            </w:pPr>
+            <w:r>
+              <w:rPr>
+                <w:rFonts w:ascii="Calibri" w:hAnsi="Calibri"/>
+                <w:b w:val="0"/>
+                <w:color w:val="111827"/>
+                <w:sz w:val="16"/>
+              </w:rPr>
+              <w:t>Mixed state and combined demand</w:t>
+            </w:r>
+          </w:p>
+        </w:tc>
+      </w:tr>
+      <w:tr>
+        <w:trPr>
+          <w:cantSplit/>
+        </w:trPr>
+        <w:tc>
+          <w:tcPr>
+            <w:tcW w:type="dxa" w:w="1150"/>
+            <w:tcMar>
+              <w:top w:w="80" w:type="dxa"/>
+              <w:start w:w="120" w:type="dxa"/>
+              <w:bottom w:w="80" w:type="dxa"/>
+              <w:end w:w="120" w:type="dxa"/>
+            </w:tcMar>
+            <w:vAlign w:val="center"/>
+            <w:shd w:fill="FFFFFF"/>
+          </w:tcPr>
+          <w:p>
+            <w:pPr>
+              <w:spacing w:before="0" w:after="40" w:line="252" w:lineRule="auto"/>
+              <w:jc w:val="center"/>
+            </w:pPr>
+            <w:r>
+              <w:rPr>
+                <w:rFonts w:ascii="Calibri" w:hAnsi="Calibri"/>
+                <w:b w:val="0"/>
+                <w:color w:val="111827"/>
+                <w:sz w:val="16"/>
+              </w:rPr>
+              <w:t>EV-T-088</w:t>
+            </w:r>
+          </w:p>
+        </w:tc>
+        <w:tc>
+          <w:tcPr>
+            <w:tcW w:type="dxa" w:w="3700"/>
+            <w:tcMar>
+              <w:top w:w="80" w:type="dxa"/>
+              <w:start w:w="120" w:type="dxa"/>
+              <w:bottom w:w="80" w:type="dxa"/>
+              <w:end w:w="120" w:type="dxa"/>
+            </w:tcMar>
+            <w:vAlign w:val="center"/>
+            <w:shd w:fill="FFFFFF"/>
+          </w:tcPr>
+          <w:p>
+            <w:pPr>
+              <w:spacing w:before="0" w:after="40" w:line="252" w:lineRule="auto"/>
+              <w:jc w:val="left"/>
+            </w:pPr>
+            <w:r>
+              <w:rPr>
+                <w:rFonts w:ascii="Calibri" w:hAnsi="Calibri"/>
+                <w:b w:val="0"/>
+                <w:color w:val="111827"/>
+                <w:sz w:val="16"/>
+              </w:rPr>
+              <w:t>Powertrain budget</w:t>
+            </w:r>
+          </w:p>
+        </w:tc>
+        <w:tc>
+          <w:tcPr>
+            <w:tcW w:type="dxa" w:w="3100"/>
+            <w:tcMar>
+              <w:top w:w="80" w:type="dxa"/>
+              <w:start w:w="120" w:type="dxa"/>
+              <w:bottom w:w="80" w:type="dxa"/>
+              <w:end w:w="120" w:type="dxa"/>
+            </w:tcMar>
+            <w:vAlign w:val="center"/>
+            <w:shd w:fill="FFFFFF"/>
+          </w:tcPr>
+          <w:p>
+            <w:pPr>
+              <w:spacing w:before="0" w:after="40" w:line="252" w:lineRule="auto"/>
+              <w:jc w:val="left"/>
+            </w:pPr>
+            <w:r>
+              <w:rPr>
+                <w:rFonts w:ascii="Calibri" w:hAnsi="Calibri"/>
+                <w:b w:val="0"/>
+                <w:color w:val="111827"/>
+                <w:sz w:val="16"/>
+              </w:rPr>
+              <w:t>Demand motor and inverter cooling</w:t>
+            </w:r>
+          </w:p>
+        </w:tc>
+        <w:tc>
+          <w:tcPr>
+            <w:tcW w:type="dxa" w:w="1410"/>
+            <w:tcMar>
+              <w:top w:w="80" w:type="dxa"/>
+              <w:start w:w="120" w:type="dxa"/>
+              <w:bottom w:w="80" w:type="dxa"/>
+              <w:end w:w="120" w:type="dxa"/>
+            </w:tcMar>
+            <w:vAlign w:val="center"/>
+            <w:shd w:fill="FFFFFF"/>
+          </w:tcPr>
+          <w:p>
+            <w:pPr>
+              <w:spacing w:before="0" w:after="40" w:line="252" w:lineRule="auto"/>
+              <w:jc w:val="left"/>
+            </w:pPr>
+            <w:r>
+              <w:rPr>
+                <w:rFonts w:ascii="Calibri" w:hAnsi="Calibri"/>
+                <w:b w:val="0"/>
+                <w:color w:val="111827"/>
+                <w:sz w:val="16"/>
+              </w:rPr>
+              <w:t>Combined output stays within capacity</w:t>
+            </w:r>
+          </w:p>
+        </w:tc>
+      </w:tr>
+      <w:tr>
+        <w:trPr>
+          <w:cantSplit/>
+        </w:trPr>
+        <w:tc>
+          <w:tcPr>
+            <w:tcW w:type="dxa" w:w="1150"/>
+            <w:tcMar>
+              <w:top w:w="80" w:type="dxa"/>
+              <w:start w:w="120" w:type="dxa"/>
+              <w:bottom w:w="80" w:type="dxa"/>
+              <w:end w:w="120" w:type="dxa"/>
+            </w:tcMar>
+            <w:vAlign w:val="center"/>
+            <w:shd w:fill="FFFFFF"/>
+          </w:tcPr>
+          <w:p>
+            <w:pPr>
+              <w:spacing w:before="0" w:after="40" w:line="252" w:lineRule="auto"/>
+              <w:jc w:val="center"/>
+            </w:pPr>
+            <w:r>
+              <w:rPr>
+                <w:rFonts w:ascii="Calibri" w:hAnsi="Calibri"/>
+                <w:b w:val="0"/>
+                <w:color w:val="111827"/>
+                <w:sz w:val="16"/>
+              </w:rPr>
+              <w:t>EV-T-089</w:t>
+            </w:r>
+          </w:p>
+        </w:tc>
+        <w:tc>
+          <w:tcPr>
+            <w:tcW w:type="dxa" w:w="3700"/>
+            <w:tcMar>
+              <w:top w:w="80" w:type="dxa"/>
+              <w:start w:w="120" w:type="dxa"/>
+              <w:bottom w:w="80" w:type="dxa"/>
+              <w:end w:w="120" w:type="dxa"/>
+            </w:tcMar>
+            <w:vAlign w:val="center"/>
+            <w:shd w:fill="FFFFFF"/>
+          </w:tcPr>
+          <w:p>
+            <w:pPr>
+              <w:spacing w:before="0" w:after="40" w:line="252" w:lineRule="auto"/>
+              <w:jc w:val="left"/>
+            </w:pPr>
+            <w:r>
+              <w:rPr>
+                <w:rFonts w:ascii="Calibri" w:hAnsi="Calibri"/>
+                <w:b w:val="0"/>
+                <w:color w:val="111827"/>
+                <w:sz w:val="16"/>
+              </w:rPr>
+              <w:t>Passive exchange</w:t>
+            </w:r>
+          </w:p>
+        </w:tc>
+        <w:tc>
+          <w:tcPr>
+            <w:tcW w:type="dxa" w:w="3100"/>
+            <w:tcMar>
+              <w:top w:w="80" w:type="dxa"/>
+              <w:start w:w="120" w:type="dxa"/>
+              <w:bottom w:w="80" w:type="dxa"/>
+              <w:end w:w="120" w:type="dxa"/>
+            </w:tcMar>
+            <w:vAlign w:val="center"/>
+            <w:shd w:fill="FFFFFF"/>
+          </w:tcPr>
+          <w:p>
+            <w:pPr>
+              <w:spacing w:before="0" w:after="40" w:line="252" w:lineRule="auto"/>
+              <w:jc w:val="left"/>
+            </w:pPr>
+            <w:r>
+              <w:rPr>
+                <w:rFonts w:ascii="Calibri" w:hAnsi="Calibri"/>
+                <w:b w:val="0"/>
+                <w:color w:val="111827"/>
+                <w:sz w:val="16"/>
+              </w:rPr>
+              <w:t>Disable control away from ambient</w:t>
+            </w:r>
+          </w:p>
+        </w:tc>
+        <w:tc>
+          <w:tcPr>
+            <w:tcW w:type="dxa" w:w="1410"/>
+            <w:tcMar>
+              <w:top w:w="80" w:type="dxa"/>
+              <w:start w:w="120" w:type="dxa"/>
+              <w:bottom w:w="80" w:type="dxa"/>
+              <w:end w:w="120" w:type="dxa"/>
+            </w:tcMar>
+            <w:vAlign w:val="center"/>
+            <w:shd w:fill="FFFFFF"/>
+          </w:tcPr>
+          <w:p>
+            <w:pPr>
+              <w:spacing w:before="0" w:after="40" w:line="252" w:lineRule="auto"/>
+              <w:jc w:val="left"/>
+            </w:pPr>
+            <w:r>
+              <w:rPr>
+                <w:rFonts w:ascii="Calibri" w:hAnsi="Calibri"/>
+                <w:b w:val="0"/>
+                <w:color w:val="111827"/>
+                <w:sz w:val="16"/>
+              </w:rPr>
+              <w:t>Zero auxiliary power and passive evolution</w:t>
+            </w:r>
+          </w:p>
+        </w:tc>
+      </w:tr>
+      <w:tr>
+        <w:trPr>
+          <w:cantSplit/>
+        </w:trPr>
+        <w:tc>
+          <w:tcPr>
+            <w:tcW w:type="dxa" w:w="1150"/>
+            <w:tcMar>
+              <w:top w:w="80" w:type="dxa"/>
+              <w:start w:w="120" w:type="dxa"/>
+              <w:bottom w:w="80" w:type="dxa"/>
+              <w:end w:w="120" w:type="dxa"/>
+            </w:tcMar>
+            <w:vAlign w:val="center"/>
+            <w:shd w:fill="FFFFFF"/>
+          </w:tcPr>
+          <w:p>
+            <w:pPr>
+              <w:spacing w:before="0" w:after="40" w:line="252" w:lineRule="auto"/>
+              <w:jc w:val="center"/>
+            </w:pPr>
+            <w:r>
+              <w:rPr>
+                <w:rFonts w:ascii="Calibri" w:hAnsi="Calibri"/>
+                <w:b w:val="0"/>
+                <w:color w:val="111827"/>
+                <w:sz w:val="16"/>
+              </w:rPr>
+              <w:t>EV-T-090</w:t>
+            </w:r>
+          </w:p>
+        </w:tc>
+        <w:tc>
+          <w:tcPr>
+            <w:tcW w:type="dxa" w:w="3700"/>
+            <w:tcMar>
+              <w:top w:w="80" w:type="dxa"/>
+              <w:start w:w="120" w:type="dxa"/>
+              <w:bottom w:w="80" w:type="dxa"/>
+              <w:end w:w="120" w:type="dxa"/>
+            </w:tcMar>
+            <w:vAlign w:val="center"/>
+            <w:shd w:fill="FFFFFF"/>
+          </w:tcPr>
+          <w:p>
+            <w:pPr>
+              <w:spacing w:before="0" w:after="40" w:line="252" w:lineRule="auto"/>
+              <w:jc w:val="left"/>
+            </w:pPr>
+            <w:r>
+              <w:rPr>
+                <w:rFonts w:ascii="Calibri" w:hAnsi="Calibri"/>
+                <w:b w:val="0"/>
+                <w:color w:val="111827"/>
+                <w:sz w:val="16"/>
+              </w:rPr>
+              <w:t>Cabin heat load</w:t>
+            </w:r>
+          </w:p>
+        </w:tc>
+        <w:tc>
+          <w:tcPr>
+            <w:tcW w:type="dxa" w:w="3100"/>
+            <w:tcMar>
+              <w:top w:w="80" w:type="dxa"/>
+              <w:start w:w="120" w:type="dxa"/>
+              <w:bottom w:w="80" w:type="dxa"/>
+              <w:end w:w="120" w:type="dxa"/>
+            </w:tcMar>
+            <w:vAlign w:val="center"/>
+            <w:shd w:fill="FFFFFF"/>
+          </w:tcPr>
+          <w:p>
+            <w:pPr>
+              <w:spacing w:before="0" w:after="40" w:line="252" w:lineRule="auto"/>
+              <w:jc w:val="left"/>
+            </w:pPr>
+            <w:r>
+              <w:rPr>
+                <w:rFonts w:ascii="Calibri" w:hAnsi="Calibri"/>
+                <w:b w:val="0"/>
+                <w:color w:val="111827"/>
+                <w:sz w:val="16"/>
+              </w:rPr>
+              <w:t>Compare equal steps with and without load</w:t>
+            </w:r>
+          </w:p>
+        </w:tc>
+        <w:tc>
+          <w:tcPr>
+            <w:tcW w:type="dxa" w:w="1410"/>
+            <w:tcMar>
+              <w:top w:w="80" w:type="dxa"/>
+              <w:start w:w="120" w:type="dxa"/>
+              <w:bottom w:w="80" w:type="dxa"/>
+              <w:end w:w="120" w:type="dxa"/>
+            </w:tcMar>
+            <w:vAlign w:val="center"/>
+            <w:shd w:fill="FFFFFF"/>
+          </w:tcPr>
+          <w:p>
+            <w:pPr>
+              <w:spacing w:before="0" w:after="40" w:line="252" w:lineRule="auto"/>
+              <w:jc w:val="left"/>
+            </w:pPr>
+            <w:r>
+              <w:rPr>
+                <w:rFonts w:ascii="Calibri" w:hAnsi="Calibri"/>
+                <w:b w:val="0"/>
+                <w:color w:val="111827"/>
+                <w:sz w:val="16"/>
+              </w:rPr>
+              <w:t>Loaded cabin retains more heat</w:t>
+            </w:r>
+          </w:p>
+        </w:tc>
+      </w:tr>
+      <w:tr>
+        <w:trPr>
+          <w:cantSplit/>
+        </w:trPr>
+        <w:tc>
+          <w:tcPr>
+            <w:tcW w:type="dxa" w:w="1150"/>
+            <w:tcMar>
+              <w:top w:w="80" w:type="dxa"/>
+              <w:start w:w="120" w:type="dxa"/>
+              <w:bottom w:w="80" w:type="dxa"/>
+              <w:end w:w="120" w:type="dxa"/>
+            </w:tcMar>
+            <w:vAlign w:val="center"/>
+            <w:shd w:fill="FFFFFF"/>
+          </w:tcPr>
+          <w:p>
+            <w:pPr>
+              <w:spacing w:before="0" w:after="40" w:line="252" w:lineRule="auto"/>
+              <w:jc w:val="center"/>
+            </w:pPr>
+            <w:r>
+              <w:rPr>
+                <w:rFonts w:ascii="Calibri" w:hAnsi="Calibri"/>
+                <w:b w:val="0"/>
+                <w:color w:val="111827"/>
+                <w:sz w:val="16"/>
+              </w:rPr>
+              <w:t>EV-T-091</w:t>
+            </w:r>
+          </w:p>
+        </w:tc>
+        <w:tc>
+          <w:tcPr>
+            <w:tcW w:type="dxa" w:w="3700"/>
+            <w:tcMar>
+              <w:top w:w="80" w:type="dxa"/>
+              <w:start w:w="120" w:type="dxa"/>
+              <w:bottom w:w="80" w:type="dxa"/>
+              <w:end w:w="120" w:type="dxa"/>
+            </w:tcMar>
+            <w:vAlign w:val="center"/>
+            <w:shd w:fill="FFFFFF"/>
+          </w:tcPr>
+          <w:p>
+            <w:pPr>
+              <w:spacing w:before="0" w:after="40" w:line="252" w:lineRule="auto"/>
+              <w:jc w:val="left"/>
+            </w:pPr>
+            <w:r>
+              <w:rPr>
+                <w:rFonts w:ascii="Calibri" w:hAnsi="Calibri"/>
+                <w:b w:val="0"/>
+                <w:color w:val="111827"/>
+                <w:sz w:val="16"/>
+              </w:rPr>
+              <w:t>Thermal fault</w:t>
+            </w:r>
+          </w:p>
+        </w:tc>
+        <w:tc>
+          <w:tcPr>
+            <w:tcW w:type="dxa" w:w="3100"/>
+            <w:tcMar>
+              <w:top w:w="80" w:type="dxa"/>
+              <w:start w:w="120" w:type="dxa"/>
+              <w:bottom w:w="80" w:type="dxa"/>
+              <w:end w:w="120" w:type="dxa"/>
+            </w:tcMar>
+            <w:vAlign w:val="center"/>
+            <w:shd w:fill="FFFFFF"/>
+          </w:tcPr>
+          <w:p>
+            <w:pPr>
+              <w:spacing w:before="0" w:after="40" w:line="252" w:lineRule="auto"/>
+              <w:jc w:val="left"/>
+            </w:pPr>
+            <w:r>
+              <w:rPr>
+                <w:rFonts w:ascii="Calibri" w:hAnsi="Calibri"/>
+                <w:b w:val="0"/>
+                <w:color w:val="111827"/>
+                <w:sz w:val="16"/>
+              </w:rPr>
+              <w:t>Inject a pump or sensor fault</w:t>
+            </w:r>
+          </w:p>
+        </w:tc>
+        <w:tc>
+          <w:tcPr>
+            <w:tcW w:type="dxa" w:w="1410"/>
+            <w:tcMar>
+              <w:top w:w="80" w:type="dxa"/>
+              <w:start w:w="120" w:type="dxa"/>
+              <w:bottom w:w="80" w:type="dxa"/>
+              <w:end w:w="120" w:type="dxa"/>
+            </w:tcMar>
+            <w:vAlign w:val="center"/>
+            <w:shd w:fill="FFFFFF"/>
+          </w:tcPr>
+          <w:p>
+            <w:pPr>
+              <w:spacing w:before="0" w:after="40" w:line="252" w:lineRule="auto"/>
+              <w:jc w:val="left"/>
+            </w:pPr>
+            <w:r>
+              <w:rPr>
+                <w:rFonts w:ascii="Calibri" w:hAnsi="Calibri"/>
+                <w:b w:val="0"/>
+                <w:color w:val="111827"/>
+                <w:sz w:val="16"/>
+              </w:rPr>
+              <w:t>Faulted state, stable code, zero output</w:t>
+            </w:r>
+          </w:p>
+        </w:tc>
+      </w:tr>
+      <w:tr>
+        <w:trPr>
+          <w:cantSplit/>
+        </w:trPr>
+        <w:tc>
+          <w:tcPr>
+            <w:tcW w:type="dxa" w:w="1150"/>
+            <w:tcMar>
+              <w:top w:w="80" w:type="dxa"/>
+              <w:start w:w="120" w:type="dxa"/>
+              <w:bottom w:w="80" w:type="dxa"/>
+              <w:end w:w="120" w:type="dxa"/>
+            </w:tcMar>
+            <w:vAlign w:val="center"/>
+            <w:shd w:fill="FFFFFF"/>
+          </w:tcPr>
+          <w:p>
+            <w:pPr>
+              <w:spacing w:before="0" w:after="40" w:line="252" w:lineRule="auto"/>
+              <w:jc w:val="center"/>
+            </w:pPr>
+            <w:r>
+              <w:rPr>
+                <w:rFonts w:ascii="Calibri" w:hAnsi="Calibri"/>
+                <w:b w:val="0"/>
+                <w:color w:val="111827"/>
+                <w:sz w:val="16"/>
+              </w:rPr>
+              <w:t>EV-T-092</w:t>
+            </w:r>
+          </w:p>
+        </w:tc>
+        <w:tc>
+          <w:tcPr>
+            <w:tcW w:type="dxa" w:w="3700"/>
+            <w:tcMar>
+              <w:top w:w="80" w:type="dxa"/>
+              <w:start w:w="120" w:type="dxa"/>
+              <w:bottom w:w="80" w:type="dxa"/>
+              <w:end w:w="120" w:type="dxa"/>
+            </w:tcMar>
+            <w:vAlign w:val="center"/>
+            <w:shd w:fill="FFFFFF"/>
+          </w:tcPr>
+          <w:p>
+            <w:pPr>
+              <w:spacing w:before="0" w:after="40" w:line="252" w:lineRule="auto"/>
+              <w:jc w:val="left"/>
+            </w:pPr>
+            <w:r>
+              <w:rPr>
+                <w:rFonts w:ascii="Calibri" w:hAnsi="Calibri"/>
+                <w:b w:val="0"/>
+                <w:color w:val="111827"/>
+                <w:sz w:val="16"/>
+              </w:rPr>
+              <w:t>Thermal exact replay</w:t>
+            </w:r>
+          </w:p>
+        </w:tc>
+        <w:tc>
+          <w:tcPr>
+            <w:tcW w:type="dxa" w:w="3100"/>
+            <w:tcMar>
+              <w:top w:w="80" w:type="dxa"/>
+              <w:start w:w="120" w:type="dxa"/>
+              <w:bottom w:w="80" w:type="dxa"/>
+              <w:end w:w="120" w:type="dxa"/>
+            </w:tcMar>
+            <w:vAlign w:val="center"/>
+            <w:shd w:fill="FFFFFF"/>
+          </w:tcPr>
+          <w:p>
+            <w:pPr>
+              <w:spacing w:before="0" w:after="40" w:line="252" w:lineRule="auto"/>
+              <w:jc w:val="left"/>
+            </w:pPr>
+            <w:r>
+              <w:rPr>
+                <w:rFonts w:ascii="Calibri" w:hAnsi="Calibri"/>
+                <w:b w:val="0"/>
+                <w:color w:val="111827"/>
+                <w:sz w:val="16"/>
+              </w:rPr>
+              <w:t>Retry an identical command</w:t>
+            </w:r>
+          </w:p>
+        </w:tc>
+        <w:tc>
+          <w:tcPr>
+            <w:tcW w:type="dxa" w:w="1410"/>
+            <w:tcMar>
+              <w:top w:w="80" w:type="dxa"/>
+              <w:start w:w="120" w:type="dxa"/>
+              <w:bottom w:w="80" w:type="dxa"/>
+              <w:end w:w="120" w:type="dxa"/>
+            </w:tcMar>
+            <w:vAlign w:val="center"/>
+            <w:shd w:fill="FFFFFF"/>
+          </w:tcPr>
+          <w:p>
+            <w:pPr>
+              <w:spacing w:before="0" w:after="40" w:line="252" w:lineRule="auto"/>
+              <w:jc w:val="left"/>
+            </w:pPr>
+            <w:r>
+              <w:rPr>
+                <w:rFonts w:ascii="Calibri" w:hAnsi="Calibri"/>
+                <w:b w:val="0"/>
+                <w:color w:val="111827"/>
+                <w:sz w:val="16"/>
+              </w:rPr>
+              <w:t>Persisted snapshot and no repeated integration</w:t>
+            </w:r>
+          </w:p>
+        </w:tc>
+      </w:tr>
+      <w:tr>
+        <w:trPr>
+          <w:cantSplit/>
+        </w:trPr>
+        <w:tc>
+          <w:tcPr>
+            <w:tcW w:type="dxa" w:w="1150"/>
+            <w:tcMar>
+              <w:top w:w="80" w:type="dxa"/>
+              <w:start w:w="120" w:type="dxa"/>
+              <w:bottom w:w="80" w:type="dxa"/>
+              <w:end w:w="120" w:type="dxa"/>
+            </w:tcMar>
+            <w:vAlign w:val="center"/>
+            <w:shd w:fill="FFFFFF"/>
+          </w:tcPr>
+          <w:p>
+            <w:pPr>
+              <w:spacing w:before="0" w:after="40" w:line="252" w:lineRule="auto"/>
+              <w:jc w:val="center"/>
+            </w:pPr>
+            <w:r>
+              <w:rPr>
+                <w:rFonts w:ascii="Calibri" w:hAnsi="Calibri"/>
+                <w:b w:val="0"/>
+                <w:color w:val="111827"/>
+                <w:sz w:val="16"/>
+              </w:rPr>
+              <w:t>EV-T-093</w:t>
+            </w:r>
+          </w:p>
+        </w:tc>
+        <w:tc>
+          <w:tcPr>
+            <w:tcW w:type="dxa" w:w="3700"/>
+            <w:tcMar>
+              <w:top w:w="80" w:type="dxa"/>
+              <w:start w:w="120" w:type="dxa"/>
+              <w:bottom w:w="80" w:type="dxa"/>
+              <w:end w:w="120" w:type="dxa"/>
+            </w:tcMar>
+            <w:vAlign w:val="center"/>
+            <w:shd w:fill="FFFFFF"/>
+          </w:tcPr>
+          <w:p>
+            <w:pPr>
+              <w:spacing w:before="0" w:after="40" w:line="252" w:lineRule="auto"/>
+              <w:jc w:val="left"/>
+            </w:pPr>
+            <w:r>
+              <w:rPr>
+                <w:rFonts w:ascii="Calibri" w:hAnsi="Calibri"/>
+                <w:b w:val="0"/>
+                <w:color w:val="111827"/>
+                <w:sz w:val="16"/>
+              </w:rPr>
+              <w:t>Thermal changed reuse</w:t>
+            </w:r>
+          </w:p>
+        </w:tc>
+        <w:tc>
+          <w:tcPr>
+            <w:tcW w:type="dxa" w:w="3100"/>
+            <w:tcMar>
+              <w:top w:w="80" w:type="dxa"/>
+              <w:start w:w="120" w:type="dxa"/>
+              <w:bottom w:w="80" w:type="dxa"/>
+              <w:end w:w="120" w:type="dxa"/>
+            </w:tcMar>
+            <w:vAlign w:val="center"/>
+            <w:shd w:fill="FFFFFF"/>
+          </w:tcPr>
+          <w:p>
+            <w:pPr>
+              <w:spacing w:before="0" w:after="40" w:line="252" w:lineRule="auto"/>
+              <w:jc w:val="left"/>
+            </w:pPr>
+            <w:r>
+              <w:rPr>
+                <w:rFonts w:ascii="Calibri" w:hAnsi="Calibri"/>
+                <w:b w:val="0"/>
+                <w:color w:val="111827"/>
+                <w:sz w:val="16"/>
+              </w:rPr>
+              <w:t>Reuse the ID with changed input</w:t>
+            </w:r>
+          </w:p>
+        </w:tc>
+        <w:tc>
+          <w:tcPr>
+            <w:tcW w:type="dxa" w:w="1410"/>
+            <w:tcMar>
+              <w:top w:w="80" w:type="dxa"/>
+              <w:start w:w="120" w:type="dxa"/>
+              <w:bottom w:w="80" w:type="dxa"/>
+              <w:end w:w="120" w:type="dxa"/>
+            </w:tcMar>
+            <w:vAlign w:val="center"/>
+            <w:shd w:fill="FFFFFF"/>
+          </w:tcPr>
+          <w:p>
+            <w:pPr>
+              <w:spacing w:before="0" w:after="40" w:line="252" w:lineRule="auto"/>
+              <w:jc w:val="left"/>
+            </w:pPr>
+            <w:r>
+              <w:rPr>
+                <w:rFonts w:ascii="Calibri" w:hAnsi="Calibri"/>
+                <w:b w:val="0"/>
+                <w:color w:val="111827"/>
+                <w:sz w:val="16"/>
+              </w:rPr>
+              <w:t>Stable command conflict</w:t>
+            </w:r>
+          </w:p>
+        </w:tc>
+      </w:tr>
+      <w:tr>
+        <w:trPr>
+          <w:cantSplit/>
+        </w:trPr>
+        <w:tc>
+          <w:tcPr>
+            <w:tcW w:type="dxa" w:w="1150"/>
+            <w:tcMar>
+              <w:top w:w="80" w:type="dxa"/>
+              <w:start w:w="120" w:type="dxa"/>
+              <w:bottom w:w="80" w:type="dxa"/>
+              <w:end w:w="120" w:type="dxa"/>
+            </w:tcMar>
+            <w:vAlign w:val="center"/>
+            <w:shd w:fill="FFFFFF"/>
+          </w:tcPr>
+          <w:p>
+            <w:pPr>
+              <w:spacing w:before="0" w:after="40" w:line="252" w:lineRule="auto"/>
+              <w:jc w:val="center"/>
+            </w:pPr>
+            <w:r>
+              <w:rPr>
+                <w:rFonts w:ascii="Calibri" w:hAnsi="Calibri"/>
+                <w:b w:val="0"/>
+                <w:color w:val="111827"/>
+                <w:sz w:val="16"/>
+              </w:rPr>
+              <w:t>EV-T-094</w:t>
+            </w:r>
+          </w:p>
+        </w:tc>
+        <w:tc>
+          <w:tcPr>
+            <w:tcW w:type="dxa" w:w="3700"/>
+            <w:tcMar>
+              <w:top w:w="80" w:type="dxa"/>
+              <w:start w:w="120" w:type="dxa"/>
+              <w:bottom w:w="80" w:type="dxa"/>
+              <w:end w:w="120" w:type="dxa"/>
+            </w:tcMar>
+            <w:vAlign w:val="center"/>
+            <w:shd w:fill="FFFFFF"/>
+          </w:tcPr>
+          <w:p>
+            <w:pPr>
+              <w:spacing w:before="0" w:after="40" w:line="252" w:lineRule="auto"/>
+              <w:jc w:val="left"/>
+            </w:pPr>
+            <w:r>
+              <w:rPr>
+                <w:rFonts w:ascii="Calibri" w:hAnsi="Calibri"/>
+                <w:b w:val="0"/>
+                <w:color w:val="111827"/>
+                <w:sz w:val="16"/>
+              </w:rPr>
+              <w:t>Triple version conflicts</w:t>
+            </w:r>
+          </w:p>
+        </w:tc>
+        <w:tc>
+          <w:tcPr>
+            <w:tcW w:type="dxa" w:w="3100"/>
+            <w:tcMar>
+              <w:top w:w="80" w:type="dxa"/>
+              <w:start w:w="120" w:type="dxa"/>
+              <w:bottom w:w="80" w:type="dxa"/>
+              <w:end w:w="120" w:type="dxa"/>
+            </w:tcMar>
+            <w:vAlign w:val="center"/>
+            <w:shd w:fill="FFFFFF"/>
+          </w:tcPr>
+          <w:p>
+            <w:pPr>
+              <w:spacing w:before="0" w:after="40" w:line="252" w:lineRule="auto"/>
+              <w:jc w:val="left"/>
+            </w:pPr>
+            <w:r>
+              <w:rPr>
+                <w:rFonts w:ascii="Calibri" w:hAnsi="Calibri"/>
+                <w:b w:val="0"/>
+                <w:color w:val="111827"/>
+                <w:sz w:val="16"/>
+              </w:rPr>
+              <w:t>Submit stale thermal, battery, or motor version</w:t>
+            </w:r>
+          </w:p>
+        </w:tc>
+        <w:tc>
+          <w:tcPr>
+            <w:tcW w:type="dxa" w:w="1410"/>
+            <w:tcMar>
+              <w:top w:w="80" w:type="dxa"/>
+              <w:start w:w="120" w:type="dxa"/>
+              <w:bottom w:w="80" w:type="dxa"/>
+              <w:end w:w="120" w:type="dxa"/>
+            </w:tcMar>
+            <w:vAlign w:val="center"/>
+            <w:shd w:fill="FFFFFF"/>
+          </w:tcPr>
+          <w:p>
+            <w:pPr>
+              <w:spacing w:before="0" w:after="40" w:line="252" w:lineRule="auto"/>
+              <w:jc w:val="left"/>
+            </w:pPr>
+            <w:r>
+              <w:rPr>
+                <w:rFonts w:ascii="Calibri" w:hAnsi="Calibri"/>
+                <w:b w:val="0"/>
+                <w:color w:val="111827"/>
+                <w:sz w:val="16"/>
+              </w:rPr>
+              <w:t>Distinct current version returned</w:t>
+            </w:r>
+          </w:p>
+        </w:tc>
+      </w:tr>
+      <w:tr>
+        <w:trPr>
+          <w:cantSplit/>
+        </w:trPr>
+        <w:tc>
+          <w:tcPr>
+            <w:tcW w:type="dxa" w:w="1150"/>
+            <w:tcMar>
+              <w:top w:w="80" w:type="dxa"/>
+              <w:start w:w="120" w:type="dxa"/>
+              <w:bottom w:w="80" w:type="dxa"/>
+              <w:end w:w="120" w:type="dxa"/>
+            </w:tcMar>
+            <w:vAlign w:val="center"/>
+            <w:shd w:fill="FFFFFF"/>
+          </w:tcPr>
+          <w:p>
+            <w:pPr>
+              <w:spacing w:before="0" w:after="40" w:line="252" w:lineRule="auto"/>
+              <w:jc w:val="center"/>
+            </w:pPr>
+            <w:r>
+              <w:rPr>
+                <w:rFonts w:ascii="Calibri" w:hAnsi="Calibri"/>
+                <w:b w:val="0"/>
+                <w:color w:val="111827"/>
+                <w:sz w:val="16"/>
+              </w:rPr>
+              <w:t>EV-T-095</w:t>
+            </w:r>
+          </w:p>
+        </w:tc>
+        <w:tc>
+          <w:tcPr>
+            <w:tcW w:type="dxa" w:w="3700"/>
+            <w:tcMar>
+              <w:top w:w="80" w:type="dxa"/>
+              <w:start w:w="120" w:type="dxa"/>
+              <w:bottom w:w="80" w:type="dxa"/>
+              <w:end w:w="120" w:type="dxa"/>
+            </w:tcMar>
+            <w:vAlign w:val="center"/>
+            <w:shd w:fill="FFFFFF"/>
+          </w:tcPr>
+          <w:p>
+            <w:pPr>
+              <w:spacing w:before="0" w:after="40" w:line="252" w:lineRule="auto"/>
+              <w:jc w:val="left"/>
+            </w:pPr>
+            <w:r>
+              <w:rPr>
+                <w:rFonts w:ascii="Calibri" w:hAnsi="Calibri"/>
+                <w:b w:val="0"/>
+                <w:color w:val="111827"/>
+                <w:sz w:val="16"/>
+              </w:rPr>
+              <w:t>Thermal atomic evidence</w:t>
+            </w:r>
+          </w:p>
+        </w:tc>
+        <w:tc>
+          <w:tcPr>
+            <w:tcW w:type="dxa" w:w="3100"/>
+            <w:tcMar>
+              <w:top w:w="80" w:type="dxa"/>
+              <w:start w:w="120" w:type="dxa"/>
+              <w:bottom w:w="80" w:type="dxa"/>
+              <w:end w:w="120" w:type="dxa"/>
+            </w:tcMar>
+            <w:vAlign w:val="center"/>
+            <w:shd w:fill="FFFFFF"/>
+          </w:tcPr>
+          <w:p>
+            <w:pPr>
+              <w:spacing w:before="0" w:after="40" w:line="252" w:lineRule="auto"/>
+              <w:jc w:val="left"/>
+            </w:pPr>
+            <w:r>
+              <w:rPr>
+                <w:rFonts w:ascii="Calibri" w:hAnsi="Calibri"/>
+                <w:b w:val="0"/>
+                <w:color w:val="111827"/>
+                <w:sz w:val="16"/>
+              </w:rPr>
+              <w:t>Inspect states, step, audit, and outbox</w:t>
+            </w:r>
+          </w:p>
+        </w:tc>
+        <w:tc>
+          <w:tcPr>
+            <w:tcW w:type="dxa" w:w="1410"/>
+            <w:tcMar>
+              <w:top w:w="80" w:type="dxa"/>
+              <w:start w:w="120" w:type="dxa"/>
+              <w:bottom w:w="80" w:type="dxa"/>
+              <w:end w:w="120" w:type="dxa"/>
+            </w:tcMar>
+            <w:vAlign w:val="center"/>
+            <w:shd w:fill="FFFFFF"/>
+          </w:tcPr>
+          <w:p>
+            <w:pPr>
+              <w:spacing w:before="0" w:after="40" w:line="252" w:lineRule="auto"/>
+              <w:jc w:val="left"/>
+            </w:pPr>
+            <w:r>
+              <w:rPr>
+                <w:rFonts w:ascii="Calibri" w:hAnsi="Calibri"/>
+                <w:b w:val="0"/>
+                <w:color w:val="111827"/>
+                <w:sz w:val="16"/>
+              </w:rPr>
+              <w:t>All commit or all roll back</w:t>
+            </w:r>
+          </w:p>
+        </w:tc>
+      </w:tr>
+      <w:tr>
+        <w:trPr>
+          <w:cantSplit/>
+        </w:trPr>
+        <w:tc>
+          <w:tcPr>
+            <w:tcW w:type="dxa" w:w="1150"/>
+            <w:tcMar>
+              <w:top w:w="80" w:type="dxa"/>
+              <w:start w:w="120" w:type="dxa"/>
+              <w:bottom w:w="80" w:type="dxa"/>
+              <w:end w:w="120" w:type="dxa"/>
+            </w:tcMar>
+            <w:vAlign w:val="center"/>
+            <w:shd w:fill="FFFFFF"/>
+          </w:tcPr>
+          <w:p>
+            <w:pPr>
+              <w:spacing w:before="0" w:after="40" w:line="252" w:lineRule="auto"/>
+              <w:jc w:val="center"/>
+            </w:pPr>
+            <w:r>
+              <w:rPr>
+                <w:rFonts w:ascii="Calibri" w:hAnsi="Calibri"/>
+                <w:b w:val="0"/>
+                <w:color w:val="111827"/>
+                <w:sz w:val="16"/>
+              </w:rPr>
+              <w:t>EV-T-096</w:t>
+            </w:r>
+          </w:p>
+        </w:tc>
+        <w:tc>
+          <w:tcPr>
+            <w:tcW w:type="dxa" w:w="3700"/>
+            <w:tcMar>
+              <w:top w:w="80" w:type="dxa"/>
+              <w:start w:w="120" w:type="dxa"/>
+              <w:bottom w:w="80" w:type="dxa"/>
+              <w:end w:w="120" w:type="dxa"/>
+            </w:tcMar>
+            <w:vAlign w:val="center"/>
+            <w:shd w:fill="FFFFFF"/>
+          </w:tcPr>
+          <w:p>
+            <w:pPr>
+              <w:spacing w:before="0" w:after="40" w:line="252" w:lineRule="auto"/>
+              <w:jc w:val="left"/>
+            </w:pPr>
+            <w:r>
+              <w:rPr>
+                <w:rFonts w:ascii="Calibri" w:hAnsi="Calibri"/>
+                <w:b w:val="0"/>
+                <w:color w:val="111827"/>
+                <w:sz w:val="16"/>
+              </w:rPr>
+              <w:t>Thermal OpenAPI and migration</w:t>
+            </w:r>
+          </w:p>
+        </w:tc>
+        <w:tc>
+          <w:tcPr>
+            <w:tcW w:type="dxa" w:w="3100"/>
+            <w:tcMar>
+              <w:top w:w="80" w:type="dxa"/>
+              <w:start w:w="120" w:type="dxa"/>
+              <w:bottom w:w="80" w:type="dxa"/>
+              <w:end w:w="120" w:type="dxa"/>
+            </w:tcMar>
+            <w:vAlign w:val="center"/>
+            <w:shd w:fill="FFFFFF"/>
+          </w:tcPr>
+          <w:p>
+            <w:pPr>
+              <w:spacing w:before="0" w:after="40" w:line="252" w:lineRule="auto"/>
+              <w:jc w:val="left"/>
+            </w:pPr>
+            <w:r>
+              <w:rPr>
+                <w:rFonts w:ascii="Calibri" w:hAnsi="Calibri"/>
+                <w:b w:val="0"/>
+                <w:color w:val="111827"/>
+                <w:sz w:val="16"/>
+              </w:rPr>
+              <w:t>Inspect routes and revision 0041</w:t>
             </w:r>
           </w:p>
         </w:tc>
@@ -18616,7 +21595,7 @@
                 <w:color w:val="0B2545"/>
                 <w:sz w:val="17"/>
               </w:rPr>
-              <w:t>VI-1 through VI-4 evidence</w:t>
+              <w:t>VI-1 through VI-5 evidence</w:t>
             </w:r>
           </w:p>
         </w:tc>
@@ -18677,7 +21656,7 @@
                 <w:color w:val="111827"/>
                 <w:sz w:val="17"/>
               </w:rPr>
-              <w:t>Battery/BMS, propulsion, braking, AC/DC charging, lifecycle, faults, replay, conflicts</w:t>
+              <w:t>Battery/BMS, propulsion, braking, charging, thermal zones, faults, replay, conflicts</w:t>
             </w:r>
           </w:p>
         </w:tc>
@@ -19915,7 +22894,7 @@
                 <w:color w:val="111827"/>
                 <w:sz w:val="17"/>
               </w:rPr>
-              <w:t>Fixed motor thermal constants</w:t>
+              <w:t>Fixed thermal masses and controller gain</w:t>
             </w:r>
           </w:p>
         </w:tc>
@@ -19971,7 +22950,7 @@
                 <w:color w:val="111827"/>
                 <w:sz w:val="17"/>
               </w:rPr>
-              <w:t>Add calibration profiles in VI-5</w:t>
+              <w:t>Add versioned calibration profiles later</w:t>
             </w:r>
           </w:p>
         </w:tc>
@@ -20442,7 +23421,7 @@
         <w:pStyle w:val="ListNumber"/>
         <w:numPr>
           <w:ilvl w:val="0"/>
-          <w:numId w:val="23"/>
+          <w:numId w:val="26"/>
         </w:numPr>
         <w:spacing w:after="120"/>
       </w:pPr>
@@ -20460,7 +23439,7 @@
         <w:pStyle w:val="ListNumber"/>
         <w:numPr>
           <w:ilvl w:val="0"/>
-          <w:numId w:val="23"/>
+          <w:numId w:val="26"/>
         </w:numPr>
         <w:spacing w:after="120"/>
       </w:pPr>
@@ -20478,7 +23457,7 @@
         <w:pStyle w:val="ListNumber"/>
         <w:numPr>
           <w:ilvl w:val="0"/>
-          <w:numId w:val="23"/>
+          <w:numId w:val="26"/>
         </w:numPr>
         <w:spacing w:after="120"/>
       </w:pPr>
@@ -20496,7 +23475,7 @@
         <w:pStyle w:val="ListNumber"/>
         <w:numPr>
           <w:ilvl w:val="0"/>
-          <w:numId w:val="23"/>
+          <w:numId w:val="26"/>
         </w:numPr>
         <w:spacing w:after="120"/>
       </w:pPr>
@@ -20514,7 +23493,7 @@
         <w:pStyle w:val="ListNumber"/>
         <w:numPr>
           <w:ilvl w:val="0"/>
-          <w:numId w:val="23"/>
+          <w:numId w:val="26"/>
         </w:numPr>
         <w:spacing w:after="120"/>
       </w:pPr>
@@ -20532,7 +23511,7 @@
         <w:pStyle w:val="ListNumber"/>
         <w:numPr>
           <w:ilvl w:val="0"/>
-          <w:numId w:val="23"/>
+          <w:numId w:val="26"/>
         </w:numPr>
         <w:spacing w:after="120"/>
       </w:pPr>
@@ -20550,7 +23529,7 @@
         <w:pStyle w:val="ListNumber"/>
         <w:numPr>
           <w:ilvl w:val="0"/>
-          <w:numId w:val="23"/>
+          <w:numId w:val="26"/>
         </w:numPr>
         <w:spacing w:after="120"/>
       </w:pPr>
@@ -20568,7 +23547,7 @@
         <w:pStyle w:val="ListNumber"/>
         <w:numPr>
           <w:ilvl w:val="0"/>
-          <w:numId w:val="23"/>
+          <w:numId w:val="26"/>
         </w:numPr>
         <w:spacing w:after="120"/>
       </w:pPr>
@@ -20586,7 +23565,7 @@
         <w:pStyle w:val="ListNumber"/>
         <w:numPr>
           <w:ilvl w:val="0"/>
-          <w:numId w:val="23"/>
+          <w:numId w:val="26"/>
         </w:numPr>
         <w:spacing w:after="120"/>
       </w:pPr>
@@ -20604,7 +23583,7 @@
         <w:pStyle w:val="ListNumber"/>
         <w:numPr>
           <w:ilvl w:val="0"/>
-          <w:numId w:val="23"/>
+          <w:numId w:val="26"/>
         </w:numPr>
         <w:spacing w:after="120"/>
       </w:pPr>
@@ -20622,7 +23601,7 @@
         <w:pStyle w:val="ListNumber"/>
         <w:numPr>
           <w:ilvl w:val="0"/>
-          <w:numId w:val="23"/>
+          <w:numId w:val="26"/>
         </w:numPr>
         <w:spacing w:after="120"/>
       </w:pPr>
@@ -20640,7 +23619,7 @@
         <w:pStyle w:val="ListNumber"/>
         <w:numPr>
           <w:ilvl w:val="0"/>
-          <w:numId w:val="23"/>
+          <w:numId w:val="26"/>
         </w:numPr>
         <w:spacing w:after="120"/>
       </w:pPr>
@@ -20658,7 +23637,7 @@
         <w:pStyle w:val="ListNumber"/>
         <w:numPr>
           <w:ilvl w:val="0"/>
-          <w:numId w:val="23"/>
+          <w:numId w:val="26"/>
         </w:numPr>
         <w:spacing w:after="120"/>
       </w:pPr>
@@ -20676,7 +23655,7 @@
         <w:pStyle w:val="ListNumber"/>
         <w:numPr>
           <w:ilvl w:val="0"/>
-          <w:numId w:val="23"/>
+          <w:numId w:val="26"/>
         </w:numPr>
         <w:spacing w:after="120"/>
       </w:pPr>
@@ -20694,7 +23673,7 @@
         <w:pStyle w:val="ListNumber"/>
         <w:numPr>
           <w:ilvl w:val="0"/>
-          <w:numId w:val="23"/>
+          <w:numId w:val="26"/>
         </w:numPr>
         <w:spacing w:after="120"/>
       </w:pPr>
@@ -20712,7 +23691,7 @@
         <w:pStyle w:val="ListNumber"/>
         <w:numPr>
           <w:ilvl w:val="0"/>
-          <w:numId w:val="23"/>
+          <w:numId w:val="26"/>
         </w:numPr>
         <w:spacing w:after="120"/>
       </w:pPr>
@@ -20730,7 +23709,7 @@
         <w:pStyle w:val="ListNumber"/>
         <w:numPr>
           <w:ilvl w:val="0"/>
-          <w:numId w:val="23"/>
+          <w:numId w:val="26"/>
         </w:numPr>
         <w:spacing w:after="120"/>
       </w:pPr>
@@ -20748,7 +23727,7 @@
         <w:pStyle w:val="ListNumber"/>
         <w:numPr>
           <w:ilvl w:val="0"/>
-          <w:numId w:val="23"/>
+          <w:numId w:val="26"/>
         </w:numPr>
         <w:spacing w:after="120"/>
       </w:pPr>
@@ -20766,7 +23745,7 @@
         <w:pStyle w:val="ListNumber"/>
         <w:numPr>
           <w:ilvl w:val="0"/>
-          <w:numId w:val="23"/>
+          <w:numId w:val="26"/>
         </w:numPr>
         <w:spacing w:after="120"/>
       </w:pPr>
@@ -20784,7 +23763,7 @@
         <w:pStyle w:val="ListNumber"/>
         <w:numPr>
           <w:ilvl w:val="0"/>
-          <w:numId w:val="23"/>
+          <w:numId w:val="26"/>
         </w:numPr>
         <w:spacing w:after="120"/>
       </w:pPr>
@@ -20802,7 +23781,7 @@
         <w:pStyle w:val="ListNumber"/>
         <w:numPr>
           <w:ilvl w:val="0"/>
-          <w:numId w:val="23"/>
+          <w:numId w:val="26"/>
         </w:numPr>
         <w:spacing w:after="120"/>
       </w:pPr>
@@ -20813,6 +23792,78 @@
           <w:sz w:val="22"/>
         </w:rPr>
         <w:t>Retry a successful charge command and prove that SOC does not increase twice.</w:t>
+      </w:r>
+    </w:p>
+    <w:p>
+      <w:pPr>
+        <w:pStyle w:val="ListNumber"/>
+        <w:numPr>
+          <w:ilvl w:val="0"/>
+          <w:numId w:val="26"/>
+        </w:numPr>
+        <w:spacing w:after="120"/>
+      </w:pPr>
+      <w:r>
+        <w:rPr>
+          <w:rFonts w:ascii="Calibri" w:hAnsi="Calibri"/>
+          <w:color w:val="111827"/>
+          <w:sz w:val="22"/>
+        </w:rPr>
+        <w:t>Cool a hot battery and motor while heating a cold cabin, then verify the mixed state.</w:t>
+      </w:r>
+    </w:p>
+    <w:p>
+      <w:pPr>
+        <w:pStyle w:val="ListNumber"/>
+        <w:numPr>
+          <w:ilvl w:val="0"/>
+          <w:numId w:val="26"/>
+        </w:numPr>
+        <w:spacing w:after="120"/>
+      </w:pPr>
+      <w:r>
+        <w:rPr>
+          <w:rFonts w:ascii="Calibri" w:hAnsi="Calibri"/>
+          <w:color w:val="111827"/>
+          <w:sz w:val="22"/>
+        </w:rPr>
+        <w:t>Disable thermal management and confirm passive exchange with zero auxiliary power.</w:t>
+      </w:r>
+    </w:p>
+    <w:p>
+      <w:pPr>
+        <w:pStyle w:val="ListNumber"/>
+        <w:numPr>
+          <w:ilvl w:val="0"/>
+          <w:numId w:val="26"/>
+        </w:numPr>
+        <w:spacing w:after="120"/>
+      </w:pPr>
+      <w:r>
+        <w:rPr>
+          <w:rFonts w:ascii="Calibri" w:hAnsi="Calibri"/>
+          <w:color w:val="111827"/>
+          <w:sz w:val="22"/>
+        </w:rPr>
+        <w:t>Inject a coolant-pump fault and verify that every active output becomes zero.</w:t>
+      </w:r>
+    </w:p>
+    <w:p>
+      <w:pPr>
+        <w:pStyle w:val="ListNumber"/>
+        <w:numPr>
+          <w:ilvl w:val="0"/>
+          <w:numId w:val="26"/>
+        </w:numPr>
+        <w:spacing w:after="120"/>
+      </w:pPr>
+      <w:r>
+        <w:rPr>
+          <w:rFonts w:ascii="Calibri" w:hAnsi="Calibri"/>
+          <w:color w:val="111827"/>
+          <w:sz w:val="22"/>
+        </w:rPr>
+        <w:t>Retry a thermal step and prove that component temperatures do not integrate twice.</w:t>
       </w:r>
     </w:p>
     <w:p>
@@ -20832,7 +23883,7 @@
           <w:color w:val="111827"/>
           <w:sz w:val="22"/>
         </w:rPr>
-        <w:t>VI-5 will add active thermal-management loops for the battery, motor, inverter, and cabin. It will model cooling and heating requests, actuator limits, thermal targets, protection interactions, logical-time energy consumption, replay, audit, and outbox evidence.</w:t>
+        <w:t>VI-6 will add deterministic range and energy-consumption estimation across reproducible drive cycles. It will combine traction demand, auxiliary thermal load, charging history, battery state, ambient conditions, and stable route assumptions without paid map or cloud services.</w:t>
       </w:r>
     </w:p>
     <w:sectPr>
@@ -20864,7 +23915,7 @@
         <w:color w:val="667085"/>
         <w:sz w:val="17"/>
       </w:rPr>
-      <w:t>ATEP Volume VI Workbook  |  Version 0.4.0</w:t>
+      <w:t>ATEP Volume VI Workbook  |  Version 0.5.0</w:t>
     </w:r>
     <w:r>
       <w:rPr>
@@ -21224,6 +24275,24 @@
     </w:lvlOverride>
   </w:num>
   <w:num w:numId="23">
+    <w:abstractNumId w:val="10"/>
+    <w:lvlOverride w:ilvl="0">
+      <w:startOverride w:val="1"/>
+    </w:lvlOverride>
+  </w:num>
+  <w:num w:numId="24">
+    <w:abstractNumId w:val="10"/>
+    <w:lvlOverride w:ilvl="0">
+      <w:startOverride w:val="1"/>
+    </w:lvlOverride>
+  </w:num>
+  <w:num w:numId="25">
+    <w:abstractNumId w:val="10"/>
+    <w:lvlOverride w:ilvl="0">
+      <w:startOverride w:val="1"/>
+    </w:lvlOverride>
+  </w:num>
+  <w:num w:numId="26">
     <w:abstractNumId w:val="9"/>
     <w:lvlOverride w:ilvl="0">
       <w:startOverride w:val="1"/>

</xml_diff>

<commit_message>
feat(electric-vehicle): add deterministic range estimation
</commit_message>
<xml_diff>
--- a/docs/ATEP_Volume_VI_Electric_Vehicle_Engineering_Workbook.docx
+++ b/docs/ATEP_Volume_VI_Electric_Vehicle_Engineering_Workbook.docx
@@ -143,7 +143,7 @@
                 <w:color w:val="0B2545"/>
                 <w:sz w:val="19"/>
               </w:rPr>
-              <w:t>0.5.0</w:t>
+              <w:t>0.6.0</w:t>
             </w:r>
           </w:p>
         </w:tc>
@@ -265,7 +265,7 @@
                 <w:color w:val="111827"/>
                 <w:sz w:val="19"/>
               </w:rPr>
-              <w:t>VI-1 through VI-5 implemented, including active thermal management</w:t>
+              <w:t>VI-1 through VI-6 implemented, including deterministic range estimation</w:t>
             </w:r>
           </w:p>
         </w:tc>
@@ -656,6 +656,25 @@
           <w:color w:val="0B2545"/>
           <w:sz w:val="21"/>
         </w:rPr>
+        <w:t>VI-6 Range and Energy Consumption</w:t>
+      </w:r>
+    </w:p>
+    <w:p>
+      <w:pPr>
+        <w:pStyle w:val="ListNumber"/>
+        <w:numPr>
+          <w:ilvl w:val="0"/>
+          <w:numId w:val="10"/>
+        </w:numPr>
+        <w:ind w:left="216" w:firstLine="0"/>
+      </w:pPr>
+      <w:r>
+        <w:rPr>
+          <w:rFonts w:ascii="Calibri" w:hAnsi="Calibri"/>
+          <w:b/>
+          <w:color w:val="0B2545"/>
+          <w:sz w:val="21"/>
+        </w:rPr>
         <w:t>Next Development</w:t>
       </w:r>
     </w:p>
@@ -873,7 +892,7 @@
                 <w:color w:val="111827"/>
                 <w:sz w:val="17"/>
               </w:rPr>
-              <w:t>0.5.0</w:t>
+              <w:t>0.6.0</w:t>
             </w:r>
           </w:p>
         </w:tc>
@@ -995,7 +1014,7 @@
                 <w:color w:val="111827"/>
                 <w:sz w:val="17"/>
               </w:rPr>
-              <w:t>VI-1 through VI-5 implemented, including active thermal management</w:t>
+              <w:t>VI-1 through VI-6 implemented, including deterministic range estimation</w:t>
             </w:r>
           </w:p>
         </w:tc>
@@ -1084,7 +1103,7 @@
           <w:color w:val="111827"/>
           <w:sz w:val="22"/>
         </w:rPr>
-        <w:t>Volume VI turns the platform's general digital vehicle into a testable electric-energy system. VI-1 establishes a persistent battery pack and deterministic BMS behavior. VI-2 adds a persistent motor/inverter aggregate, torque delivery, efficiency, power loss, thermal protection, drive-mode limits, and battery-derived propulsion availability. VI-3 adds requested-deceleration control, regenerative energy recovery, battery charge acceptance, and blended friction braking. VI-4 adds AC/DC charging sessions, deterministic charge curves, lifecycle control, and faults. VI-5 adds coordinated heating and cooling for the battery, motor, inverter, and cabin.</w:t>
+        <w:t>Volume VI turns the platform's general digital vehicle into a testable electric-energy system. VI-1 establishes a persistent battery pack and deterministic BMS behavior. VI-2 adds a persistent motor/inverter aggregate, torque delivery, efficiency, power loss, thermal protection, drive-mode limits, and battery-derived propulsion availability. VI-3 adds requested-deceleration control, regenerative energy recovery, battery charge acceptance, and blended friction braking. VI-4 adds AC/DC charging sessions, deterministic charge curves, lifecycle control, and faults. VI-5 adds coordinated heating and cooling for the battery, motor, inverter, and cabin. VI-6 adds deterministic energy-consumption and remaining-range estimates for bounded drive cycles.</w:t>
       </w:r>
     </w:p>
     <w:p>
@@ -1612,7 +1631,7 @@
         <w:keepLines/>
       </w:pPr>
       <w:r>
-        <w:t>Deferred</w:t>
+        <w:t>In Scope for VI-6</w:t>
       </w:r>
     </w:p>
     <w:p>
@@ -1630,7 +1649,7 @@
           <w:color w:val="111827"/>
           <w:sz w:val="22"/>
         </w:rPr>
-        <w:t>chemistry-specific circuits, cell balancing, aging, sensor faults, and module topology;</w:t>
+        <w:t>one calibrated range estimator per battery- and thermal-equipped vehicle;</w:t>
       </w:r>
     </w:p>
     <w:p>
@@ -1648,7 +1667,89 @@
           <w:color w:val="111827"/>
           <w:sz w:val="22"/>
         </w:rPr>
-        <w:t>range estimation, calibrated thermal circuits, and BMS ECU, CAN, UDS, dashboard, and test orchestration.</w:t>
+        <w:t>bounded drive-cycle segments containing duration, speed, acceleration, and road grade;</w:t>
+      </w:r>
+    </w:p>
+    <w:p>
+      <w:pPr>
+        <w:pStyle w:val="ListBullet"/>
+        <w:numPr>
+          <w:ilvl w:val="0"/>
+          <w:numId w:val="16"/>
+        </w:numPr>
+        <w:spacing w:after="80"/>
+      </w:pPr>
+      <w:r>
+        <w:rPr>
+          <w:rFonts w:ascii="Calibri" w:hAnsi="Calibri"/>
+          <w:color w:val="111827"/>
+          <w:sz w:val="22"/>
+        </w:rPr>
+        <w:t>traction, auxiliary, regenerative, net-energy, consumption, and remaining-range evidence;</w:t>
+      </w:r>
+    </w:p>
+    <w:p>
+      <w:pPr>
+        <w:pStyle w:val="ListBullet"/>
+        <w:numPr>
+          <w:ilvl w:val="0"/>
+          <w:numId w:val="16"/>
+        </w:numPr>
+        <w:spacing w:after="80"/>
+      </w:pPr>
+      <w:r>
+        <w:rPr>
+          <w:rFonts w:ascii="Calibri" w:hAnsi="Calibri"/>
+          <w:color w:val="111827"/>
+          <w:sz w:val="22"/>
+        </w:rPr>
+        <w:t>range, battery, and thermal optimistic versions, exact replay, audit, and outbox evidence.</w:t>
+      </w:r>
+    </w:p>
+    <w:p>
+      <w:pPr>
+        <w:pStyle w:val="Heading2"/>
+        <w:keepNext/>
+        <w:keepLines/>
+      </w:pPr>
+      <w:r>
+        <w:t>Deferred</w:t>
+      </w:r>
+    </w:p>
+    <w:p>
+      <w:pPr>
+        <w:pStyle w:val="ListBullet"/>
+        <w:numPr>
+          <w:ilvl w:val="0"/>
+          <w:numId w:val="17"/>
+        </w:numPr>
+        <w:spacing w:after="80"/>
+      </w:pPr>
+      <w:r>
+        <w:rPr>
+          <w:rFonts w:ascii="Calibri" w:hAnsi="Calibri"/>
+          <w:color w:val="111827"/>
+          <w:sz w:val="22"/>
+        </w:rPr>
+        <w:t>chemistry-specific circuits, cell balancing, aging, sensor faults, and module topology;</w:t>
+      </w:r>
+    </w:p>
+    <w:p>
+      <w:pPr>
+        <w:pStyle w:val="ListBullet"/>
+        <w:numPr>
+          <w:ilvl w:val="0"/>
+          <w:numId w:val="17"/>
+        </w:numPr>
+        <w:spacing w:after="80"/>
+      </w:pPr>
+      <w:r>
+        <w:rPr>
+          <w:rFonts w:ascii="Calibri" w:hAnsi="Calibri"/>
+          <w:color w:val="111827"/>
+          <w:sz w:val="22"/>
+        </w:rPr>
+        <w:t>calibrated thermal circuits and BMS ECU, CAN, UDS, dashboard, and test orchestration.</w:t>
       </w:r>
     </w:p>
     <w:p>
@@ -1764,7 +1865,7 @@
           <w:color w:val="111827"/>
           <w:sz w:val="22"/>
         </w:rPr>
-        <w:t xml:space="preserve">, and </w:t>
+        <w:t xml:space="preserve">, </w:t>
       </w:r>
       <w:r>
         <w:rPr>
@@ -1780,7 +1881,23 @@
           <w:color w:val="111827"/>
           <w:sz w:val="22"/>
         </w:rPr>
-        <w:t xml:space="preserve"> own the battery, propulsion, braking, charging, and thermal aggregates. Their simulation step records preserve immutable replay evidence. </w:t>
+        <w:t xml:space="preserve">, and </w:t>
+      </w:r>
+      <w:r>
+        <w:rPr>
+          <w:rFonts w:ascii="Consolas" w:hAnsi="Consolas"/>
+          <w:color w:val="1F4D78"/>
+          <w:sz w:val="19"/>
+        </w:rPr>
+        <w:t>RangeEstimatorState</w:t>
+      </w:r>
+      <w:r>
+        <w:rPr>
+          <w:rFonts w:ascii="Calibri" w:hAnsi="Calibri"/>
+          <w:color w:val="111827"/>
+          <w:sz w:val="22"/>
+        </w:rPr>
+        <w:t xml:space="preserve"> own the battery, propulsion, braking, charging, thermal, and range aggregates. Their simulation step records preserve immutable replay evidence. </w:t>
       </w:r>
       <w:r>
         <w:rPr>
@@ -3776,6 +3893,184 @@
           </w:p>
         </w:tc>
       </w:tr>
+      <w:tr>
+        <w:trPr>
+          <w:cantSplit/>
+        </w:trPr>
+        <w:tc>
+          <w:tcPr>
+            <w:tcW w:type="dxa" w:w="1650"/>
+            <w:tcMar>
+              <w:top w:w="80" w:type="dxa"/>
+              <w:start w:w="120" w:type="dxa"/>
+              <w:bottom w:w="80" w:type="dxa"/>
+              <w:end w:w="120" w:type="dxa"/>
+            </w:tcMar>
+            <w:vAlign w:val="center"/>
+            <w:shd w:fill="FFFFFF"/>
+          </w:tcPr>
+          <w:p>
+            <w:pPr>
+              <w:spacing w:before="0" w:after="40" w:line="252" w:lineRule="auto"/>
+              <w:jc w:val="center"/>
+            </w:pPr>
+            <w:r>
+              <w:rPr>
+                <w:rFonts w:ascii="Calibri" w:hAnsi="Calibri"/>
+                <w:b w:val="0"/>
+                <w:color w:val="111827"/>
+                <w:sz w:val="17"/>
+              </w:rPr>
+              <w:t>RangeEstimatorState</w:t>
+            </w:r>
+          </w:p>
+        </w:tc>
+        <w:tc>
+          <w:tcPr>
+            <w:tcW w:type="dxa" w:w="4450"/>
+            <w:tcMar>
+              <w:top w:w="80" w:type="dxa"/>
+              <w:start w:w="120" w:type="dxa"/>
+              <w:bottom w:w="80" w:type="dxa"/>
+              <w:end w:w="120" w:type="dxa"/>
+            </w:tcMar>
+            <w:vAlign w:val="center"/>
+            <w:shd w:fill="FFFFFF"/>
+          </w:tcPr>
+          <w:p>
+            <w:pPr>
+              <w:spacing w:before="0" w:after="40" w:line="252" w:lineRule="auto"/>
+              <w:jc w:val="left"/>
+            </w:pPr>
+            <w:r>
+              <w:rPr>
+                <w:rFonts w:ascii="Calibri" w:hAnsi="Calibri"/>
+                <w:b w:val="0"/>
+                <w:color w:val="111827"/>
+                <w:sz w:val="17"/>
+              </w:rPr>
+              <w:t>Drive-cycle energy and remaining range</w:t>
+            </w:r>
+          </w:p>
+        </w:tc>
+        <w:tc>
+          <w:tcPr>
+            <w:tcW w:type="dxa" w:w="3260"/>
+            <w:tcMar>
+              <w:top w:w="80" w:type="dxa"/>
+              <w:start w:w="120" w:type="dxa"/>
+              <w:bottom w:w="80" w:type="dxa"/>
+              <w:end w:w="120" w:type="dxa"/>
+            </w:tcMar>
+            <w:vAlign w:val="center"/>
+            <w:shd w:fill="FFFFFF"/>
+          </w:tcPr>
+          <w:p>
+            <w:pPr>
+              <w:spacing w:before="0" w:after="40" w:line="252" w:lineRule="auto"/>
+              <w:jc w:val="left"/>
+            </w:pPr>
+            <w:r>
+              <w:rPr>
+                <w:rFonts w:ascii="Calibri" w:hAnsi="Calibri"/>
+                <w:b w:val="0"/>
+                <w:color w:val="111827"/>
+                <w:sz w:val="17"/>
+              </w:rPr>
+              <w:t>one per vehicle; version &gt;= 1</w:t>
+            </w:r>
+          </w:p>
+        </w:tc>
+      </w:tr>
+      <w:tr>
+        <w:trPr>
+          <w:cantSplit/>
+        </w:trPr>
+        <w:tc>
+          <w:tcPr>
+            <w:tcW w:type="dxa" w:w="1650"/>
+            <w:tcMar>
+              <w:top w:w="80" w:type="dxa"/>
+              <w:start w:w="120" w:type="dxa"/>
+              <w:bottom w:w="80" w:type="dxa"/>
+              <w:end w:w="120" w:type="dxa"/>
+            </w:tcMar>
+            <w:vAlign w:val="center"/>
+            <w:shd w:fill="FFFFFF"/>
+          </w:tcPr>
+          <w:p>
+            <w:pPr>
+              <w:spacing w:before="0" w:after="40" w:line="252" w:lineRule="auto"/>
+              <w:jc w:val="center"/>
+            </w:pPr>
+            <w:r>
+              <w:rPr>
+                <w:rFonts w:ascii="Calibri" w:hAnsi="Calibri"/>
+                <w:b w:val="0"/>
+                <w:color w:val="111827"/>
+                <w:sz w:val="17"/>
+              </w:rPr>
+              <w:t>DriveCycleSegment</w:t>
+            </w:r>
+          </w:p>
+        </w:tc>
+        <w:tc>
+          <w:tcPr>
+            <w:tcW w:type="dxa" w:w="4450"/>
+            <w:tcMar>
+              <w:top w:w="80" w:type="dxa"/>
+              <w:start w:w="120" w:type="dxa"/>
+              <w:bottom w:w="80" w:type="dxa"/>
+              <w:end w:w="120" w:type="dxa"/>
+            </w:tcMar>
+            <w:vAlign w:val="center"/>
+            <w:shd w:fill="FFFFFF"/>
+          </w:tcPr>
+          <w:p>
+            <w:pPr>
+              <w:spacing w:before="0" w:after="40" w:line="252" w:lineRule="auto"/>
+              <w:jc w:val="left"/>
+            </w:pPr>
+            <w:r>
+              <w:rPr>
+                <w:rFonts w:ascii="Calibri" w:hAnsi="Calibri"/>
+                <w:b w:val="0"/>
+                <w:color w:val="111827"/>
+                <w:sz w:val="17"/>
+              </w:rPr>
+              <w:t>Reproducible route assumption</w:t>
+            </w:r>
+          </w:p>
+        </w:tc>
+        <w:tc>
+          <w:tcPr>
+            <w:tcW w:type="dxa" w:w="3260"/>
+            <w:tcMar>
+              <w:top w:w="80" w:type="dxa"/>
+              <w:start w:w="120" w:type="dxa"/>
+              <w:bottom w:w="80" w:type="dxa"/>
+              <w:end w:w="120" w:type="dxa"/>
+            </w:tcMar>
+            <w:vAlign w:val="center"/>
+            <w:shd w:fill="FFFFFF"/>
+          </w:tcPr>
+          <w:p>
+            <w:pPr>
+              <w:spacing w:before="0" w:after="40" w:line="252" w:lineRule="auto"/>
+              <w:jc w:val="left"/>
+            </w:pPr>
+            <w:r>
+              <w:rPr>
+                <w:rFonts w:ascii="Calibri" w:hAnsi="Calibri"/>
+                <w:b w:val="0"/>
+                <w:color w:val="111827"/>
+                <w:sz w:val="17"/>
+              </w:rPr>
+              <w:t>1-3,600 s; 0-250 km/h; bounded acceleration and grade</w:t>
+            </w:r>
+          </w:p>
+        </w:tc>
+      </w:tr>
     </w:tbl>
     <w:p>
       <w:pPr>
@@ -3827,7 +4122,7 @@
         <w:pStyle w:val="ListBullet"/>
         <w:numPr>
           <w:ilvl w:val="0"/>
-          <w:numId w:val="17"/>
+          <w:numId w:val="18"/>
         </w:numPr>
         <w:spacing w:after="80"/>
       </w:pPr>
@@ -3845,7 +4140,7 @@
         <w:pStyle w:val="ListBullet"/>
         <w:numPr>
           <w:ilvl w:val="0"/>
-          <w:numId w:val="17"/>
+          <w:numId w:val="18"/>
         </w:numPr>
         <w:spacing w:after="80"/>
       </w:pPr>
@@ -3863,7 +4158,7 @@
         <w:pStyle w:val="ListBullet"/>
         <w:numPr>
           <w:ilvl w:val="0"/>
-          <w:numId w:val="17"/>
+          <w:numId w:val="18"/>
         </w:numPr>
         <w:spacing w:after="80"/>
       </w:pPr>
@@ -3891,7 +4186,7 @@
         <w:pStyle w:val="ListBullet"/>
         <w:numPr>
           <w:ilvl w:val="0"/>
-          <w:numId w:val="18"/>
+          <w:numId w:val="19"/>
         </w:numPr>
         <w:spacing w:after="80"/>
       </w:pPr>
@@ -3909,7 +4204,7 @@
         <w:pStyle w:val="ListBullet"/>
         <w:numPr>
           <w:ilvl w:val="0"/>
-          <w:numId w:val="18"/>
+          <w:numId w:val="19"/>
         </w:numPr>
         <w:spacing w:after="80"/>
       </w:pPr>
@@ -3937,7 +4232,7 @@
         <w:pStyle w:val="ListBullet"/>
         <w:numPr>
           <w:ilvl w:val="0"/>
-          <w:numId w:val="19"/>
+          <w:numId w:val="20"/>
         </w:numPr>
         <w:spacing w:after="80"/>
       </w:pPr>
@@ -3975,7 +4270,7 @@
         <w:pStyle w:val="ListBullet"/>
         <w:numPr>
           <w:ilvl w:val="0"/>
-          <w:numId w:val="20"/>
+          <w:numId w:val="21"/>
         </w:numPr>
         <w:spacing w:after="80"/>
       </w:pPr>
@@ -3993,7 +4288,7 @@
         <w:pStyle w:val="ListBullet"/>
         <w:numPr>
           <w:ilvl w:val="0"/>
-          <w:numId w:val="20"/>
+          <w:numId w:val="21"/>
         </w:numPr>
         <w:spacing w:after="80"/>
       </w:pPr>
@@ -4011,7 +4306,7 @@
         <w:pStyle w:val="ListBullet"/>
         <w:numPr>
           <w:ilvl w:val="0"/>
-          <w:numId w:val="20"/>
+          <w:numId w:val="21"/>
         </w:numPr>
         <w:spacing w:after="80"/>
       </w:pPr>
@@ -4029,7 +4324,7 @@
         <w:pStyle w:val="ListBullet"/>
         <w:numPr>
           <w:ilvl w:val="0"/>
-          <w:numId w:val="20"/>
+          <w:numId w:val="21"/>
         </w:numPr>
         <w:spacing w:after="80"/>
       </w:pPr>
@@ -4047,7 +4342,7 @@
         <w:pStyle w:val="ListBullet"/>
         <w:numPr>
           <w:ilvl w:val="0"/>
-          <w:numId w:val="20"/>
+          <w:numId w:val="21"/>
         </w:numPr>
         <w:spacing w:after="80"/>
       </w:pPr>
@@ -4065,7 +4360,7 @@
         <w:pStyle w:val="ListBullet"/>
         <w:numPr>
           <w:ilvl w:val="0"/>
-          <w:numId w:val="20"/>
+          <w:numId w:val="21"/>
         </w:numPr>
         <w:spacing w:after="80"/>
       </w:pPr>
@@ -4093,7 +4388,7 @@
         <w:pStyle w:val="ListBullet"/>
         <w:numPr>
           <w:ilvl w:val="0"/>
-          <w:numId w:val="21"/>
+          <w:numId w:val="22"/>
         </w:numPr>
         <w:spacing w:after="80"/>
       </w:pPr>
@@ -4111,7 +4406,7 @@
         <w:pStyle w:val="ListBullet"/>
         <w:numPr>
           <w:ilvl w:val="0"/>
-          <w:numId w:val="21"/>
+          <w:numId w:val="22"/>
         </w:numPr>
         <w:spacing w:after="80"/>
       </w:pPr>
@@ -4129,7 +4424,7 @@
         <w:pStyle w:val="ListBullet"/>
         <w:numPr>
           <w:ilvl w:val="0"/>
-          <w:numId w:val="21"/>
+          <w:numId w:val="22"/>
         </w:numPr>
         <w:spacing w:after="80"/>
       </w:pPr>
@@ -4147,7 +4442,7 @@
         <w:pStyle w:val="ListBullet"/>
         <w:numPr>
           <w:ilvl w:val="0"/>
-          <w:numId w:val="21"/>
+          <w:numId w:val="22"/>
         </w:numPr>
         <w:spacing w:after="80"/>
       </w:pPr>
@@ -4165,7 +4460,7 @@
         <w:pStyle w:val="ListBullet"/>
         <w:numPr>
           <w:ilvl w:val="0"/>
-          <w:numId w:val="21"/>
+          <w:numId w:val="22"/>
         </w:numPr>
         <w:spacing w:after="80"/>
       </w:pPr>
@@ -4213,7 +4508,7 @@
         <w:pStyle w:val="ListBullet"/>
         <w:numPr>
           <w:ilvl w:val="0"/>
-          <w:numId w:val="22"/>
+          <w:numId w:val="23"/>
         </w:numPr>
         <w:spacing w:after="80"/>
       </w:pPr>
@@ -4231,7 +4526,7 @@
         <w:pStyle w:val="ListBullet"/>
         <w:numPr>
           <w:ilvl w:val="0"/>
-          <w:numId w:val="22"/>
+          <w:numId w:val="23"/>
         </w:numPr>
         <w:spacing w:after="80"/>
       </w:pPr>
@@ -4249,7 +4544,7 @@
         <w:pStyle w:val="ListBullet"/>
         <w:numPr>
           <w:ilvl w:val="0"/>
-          <w:numId w:val="22"/>
+          <w:numId w:val="23"/>
         </w:numPr>
         <w:spacing w:after="80"/>
       </w:pPr>
@@ -4267,7 +4562,7 @@
         <w:pStyle w:val="ListBullet"/>
         <w:numPr>
           <w:ilvl w:val="0"/>
-          <w:numId w:val="22"/>
+          <w:numId w:val="23"/>
         </w:numPr>
         <w:spacing w:after="80"/>
       </w:pPr>
@@ -4295,7 +4590,7 @@
         <w:pStyle w:val="ListBullet"/>
         <w:numPr>
           <w:ilvl w:val="0"/>
-          <w:numId w:val="23"/>
+          <w:numId w:val="24"/>
         </w:numPr>
         <w:spacing w:after="80"/>
       </w:pPr>
@@ -4313,7 +4608,7 @@
         <w:pStyle w:val="ListBullet"/>
         <w:numPr>
           <w:ilvl w:val="0"/>
-          <w:numId w:val="23"/>
+          <w:numId w:val="24"/>
         </w:numPr>
         <w:spacing w:after="80"/>
       </w:pPr>
@@ -4341,7 +4636,7 @@
         <w:pStyle w:val="ListBullet"/>
         <w:numPr>
           <w:ilvl w:val="0"/>
-          <w:numId w:val="24"/>
+          <w:numId w:val="25"/>
         </w:numPr>
         <w:spacing w:after="80"/>
       </w:pPr>
@@ -4359,7 +4654,7 @@
         <w:pStyle w:val="ListBullet"/>
         <w:numPr>
           <w:ilvl w:val="0"/>
-          <w:numId w:val="24"/>
+          <w:numId w:val="25"/>
         </w:numPr>
         <w:spacing w:after="80"/>
       </w:pPr>
@@ -4377,7 +4672,7 @@
         <w:pStyle w:val="ListBullet"/>
         <w:numPr>
           <w:ilvl w:val="0"/>
-          <w:numId w:val="24"/>
+          <w:numId w:val="25"/>
         </w:numPr>
         <w:spacing w:after="80"/>
       </w:pPr>
@@ -4405,7 +4700,7 @@
         <w:pStyle w:val="ListBullet"/>
         <w:numPr>
           <w:ilvl w:val="0"/>
-          <w:numId w:val="25"/>
+          <w:numId w:val="26"/>
         </w:numPr>
         <w:spacing w:after="80"/>
       </w:pPr>
@@ -4423,7 +4718,7 @@
         <w:pStyle w:val="ListBullet"/>
         <w:numPr>
           <w:ilvl w:val="0"/>
-          <w:numId w:val="25"/>
+          <w:numId w:val="26"/>
         </w:numPr>
         <w:spacing w:after="80"/>
       </w:pPr>
@@ -4441,7 +4736,7 @@
         <w:pStyle w:val="ListBullet"/>
         <w:numPr>
           <w:ilvl w:val="0"/>
-          <w:numId w:val="25"/>
+          <w:numId w:val="26"/>
         </w:numPr>
         <w:spacing w:after="80"/>
       </w:pPr>
@@ -4452,6 +4747,170 @@
           <w:sz w:val="22"/>
         </w:rPr>
         <w:t>Auxiliary demand is the sum of absolute zone powers. Disabled or faulted control draws zero.</w:t>
+      </w:r>
+    </w:p>
+    <w:p>
+      <w:pPr>
+        <w:pStyle w:val="Heading2"/>
+        <w:keepNext/>
+        <w:keepLines/>
+      </w:pPr>
+      <w:r>
+        <w:t>VI-6 Range Model</w:t>
+      </w:r>
+    </w:p>
+    <w:p>
+      <w:pPr>
+        <w:pStyle w:val="ListBullet"/>
+        <w:numPr>
+          <w:ilvl w:val="0"/>
+          <w:numId w:val="27"/>
+        </w:numPr>
+        <w:spacing w:after="80"/>
+      </w:pPr>
+      <w:r>
+        <w:rPr>
+          <w:rFonts w:ascii="Calibri" w:hAnsi="Calibri"/>
+          <w:color w:val="111827"/>
+          <w:sz w:val="22"/>
+        </w:rPr>
+        <w:t>Segment force combines rolling resistance, aerodynamic drag, road grade, and acceleration.</w:t>
+      </w:r>
+    </w:p>
+    <w:p>
+      <w:pPr>
+        <w:pStyle w:val="ListBullet"/>
+        <w:numPr>
+          <w:ilvl w:val="0"/>
+          <w:numId w:val="27"/>
+        </w:numPr>
+        <w:spacing w:after="80"/>
+      </w:pPr>
+      <w:r>
+        <w:rPr>
+          <w:rFonts w:ascii="Calibri" w:hAnsi="Calibri"/>
+          <w:color w:val="111827"/>
+          <w:sz w:val="22"/>
+        </w:rPr>
+        <w:t>Positive mechanical work is divided by drivetrain efficiency to obtain traction energy.</w:t>
+      </w:r>
+    </w:p>
+    <w:p>
+      <w:pPr>
+        <w:pStyle w:val="ListBullet"/>
+        <w:numPr>
+          <w:ilvl w:val="0"/>
+          <w:numId w:val="27"/>
+        </w:numPr>
+        <w:spacing w:after="80"/>
+      </w:pPr>
+      <w:r>
+        <w:rPr>
+          <w:rFonts w:ascii="Calibri" w:hAnsi="Calibri"/>
+          <w:color w:val="111827"/>
+          <w:sz w:val="22"/>
+        </w:rPr>
+        <w:t>Negative mechanical work is multiplied by regenerative efficiency to obtain recovered energy.</w:t>
+      </w:r>
+    </w:p>
+    <w:p>
+      <w:pPr>
+        <w:pStyle w:val="ListBullet"/>
+        <w:numPr>
+          <w:ilvl w:val="0"/>
+          <w:numId w:val="27"/>
+        </w:numPr>
+        <w:spacing w:after="80"/>
+      </w:pPr>
+      <w:r>
+        <w:rPr>
+          <w:rFonts w:ascii="Calibri" w:hAnsi="Calibri"/>
+          <w:color w:val="111827"/>
+          <w:sz w:val="22"/>
+        </w:rPr>
+        <w:t>Auxiliary energy integrates baseline demand plus the current thermal-system demand.</w:t>
+      </w:r>
+    </w:p>
+    <w:p>
+      <w:pPr>
+        <w:pStyle w:val="ListBullet"/>
+        <w:numPr>
+          <w:ilvl w:val="0"/>
+          <w:numId w:val="27"/>
+        </w:numPr>
+        <w:spacing w:after="80"/>
+      </w:pPr>
+      <w:r>
+        <w:rPr>
+          <w:rFonts w:ascii="Calibri" w:hAnsi="Calibri"/>
+          <w:color w:val="111827"/>
+          <w:sz w:val="22"/>
+        </w:rPr>
+        <w:t>Net energy equals traction plus auxiliary energy minus recovered energy, with a zero floor.</w:t>
+      </w:r>
+    </w:p>
+    <w:p>
+      <w:pPr>
+        <w:pStyle w:val="ListBullet"/>
+        <w:numPr>
+          <w:ilvl w:val="0"/>
+          <w:numId w:val="27"/>
+        </w:numPr>
+        <w:spacing w:after="80"/>
+      </w:pPr>
+      <w:r>
+        <w:rPr>
+          <w:rFonts w:ascii="Calibri" w:hAnsi="Calibri"/>
+          <w:color w:val="111827"/>
+          <w:sz w:val="22"/>
+        </w:rPr>
+        <w:t>Consumption is net energy per distance, expressed in kWh/100 km.</w:t>
+      </w:r>
+    </w:p>
+    <w:p>
+      <w:pPr>
+        <w:pStyle w:val="ListBullet"/>
+        <w:numPr>
+          <w:ilvl w:val="0"/>
+          <w:numId w:val="27"/>
+        </w:numPr>
+        <w:spacing w:after="80"/>
+      </w:pPr>
+      <w:r>
+        <w:rPr>
+          <w:rFonts w:ascii="Calibri" w:hAnsi="Calibri"/>
+          <w:color w:val="111827"/>
+          <w:sz w:val="22"/>
+        </w:rPr>
+        <w:t>Available energy uses nominal pack energy, SOH, SOC, and the configured reserve SOC.</w:t>
+      </w:r>
+    </w:p>
+    <w:p>
+      <w:pPr>
+        <w:pStyle w:val="ListBullet"/>
+        <w:numPr>
+          <w:ilvl w:val="0"/>
+          <w:numId w:val="27"/>
+        </w:numPr>
+        <w:spacing w:after="80"/>
+      </w:pPr>
+      <w:r>
+        <w:rPr>
+          <w:rFonts w:ascii="Calibri" w:hAnsi="Calibri"/>
+          <w:color w:val="111827"/>
+          <w:sz w:val="22"/>
+        </w:rPr>
+        <w:t>Estimated range equals available energy divided by consumption. Stationary cycles return an</w:t>
+      </w:r>
+    </w:p>
+    <w:p>
+      <w:r>
+        <w:rPr>
+          <w:rFonts w:ascii="Calibri" w:hAnsi="Calibri"/>
+          <w:color w:val="111827"/>
+          <w:sz w:val="22"/>
+        </w:rPr>
+        <w:t>explicit limited result.</w:t>
       </w:r>
     </w:p>
     <w:p>
@@ -6661,6 +7120,273 @@
           </w:p>
         </w:tc>
       </w:tr>
+      <w:tr>
+        <w:trPr>
+          <w:cantSplit/>
+        </w:trPr>
+        <w:tc>
+          <w:tcPr>
+            <w:tcW w:type="dxa" w:w="3100"/>
+            <w:tcMar>
+              <w:top w:w="80" w:type="dxa"/>
+              <w:start w:w="120" w:type="dxa"/>
+              <w:bottom w:w="80" w:type="dxa"/>
+              <w:end w:w="120" w:type="dxa"/>
+            </w:tcMar>
+            <w:vAlign w:val="center"/>
+            <w:shd w:fill="FFFFFF"/>
+          </w:tcPr>
+          <w:p>
+            <w:pPr>
+              <w:spacing w:before="0" w:after="40" w:line="252" w:lineRule="auto"/>
+              <w:jc w:val="center"/>
+            </w:pPr>
+            <w:r>
+              <w:rPr>
+                <w:rFonts w:ascii="Calibri" w:hAnsi="Calibri"/>
+                <w:b w:val="0"/>
+                <w:color w:val="111827"/>
+                <w:sz w:val="17"/>
+              </w:rPr>
+              <w:t>POST /api/v1/vehicles/{vehicle_id}/electric/range</w:t>
+            </w:r>
+          </w:p>
+        </w:tc>
+        <w:tc>
+          <w:tcPr>
+            <w:tcW w:type="dxa" w:w="4000"/>
+            <w:tcMar>
+              <w:top w:w="80" w:type="dxa"/>
+              <w:start w:w="120" w:type="dxa"/>
+              <w:bottom w:w="80" w:type="dxa"/>
+              <w:end w:w="120" w:type="dxa"/>
+            </w:tcMar>
+            <w:vAlign w:val="center"/>
+            <w:shd w:fill="FFFFFF"/>
+          </w:tcPr>
+          <w:p>
+            <w:pPr>
+              <w:spacing w:before="0" w:after="40" w:line="252" w:lineRule="auto"/>
+              <w:jc w:val="left"/>
+            </w:pPr>
+            <w:r>
+              <w:rPr>
+                <w:rFonts w:ascii="Calibri" w:hAnsi="Calibri"/>
+                <w:b w:val="0"/>
+                <w:color w:val="111827"/>
+                <w:sz w:val="17"/>
+              </w:rPr>
+              <w:t>Create range calibration</w:t>
+            </w:r>
+          </w:p>
+        </w:tc>
+        <w:tc>
+          <w:tcPr>
+            <w:tcW w:type="dxa" w:w="2260"/>
+            <w:tcMar>
+              <w:top w:w="80" w:type="dxa"/>
+              <w:start w:w="120" w:type="dxa"/>
+              <w:bottom w:w="80" w:type="dxa"/>
+              <w:end w:w="120" w:type="dxa"/>
+            </w:tcMar>
+            <w:vAlign w:val="center"/>
+            <w:shd w:fill="FFFFFF"/>
+          </w:tcPr>
+          <w:p>
+            <w:pPr>
+              <w:spacing w:before="0" w:after="40" w:line="252" w:lineRule="auto"/>
+              <w:jc w:val="left"/>
+            </w:pPr>
+            <w:r>
+              <w:rPr>
+                <w:rFonts w:ascii="Calibri" w:hAnsi="Calibri"/>
+                <w:b w:val="0"/>
+                <w:color w:val="111827"/>
+                <w:sz w:val="17"/>
+              </w:rPr>
+              <w:t>electric_vehicle:manage</w:t>
+            </w:r>
+          </w:p>
+        </w:tc>
+      </w:tr>
+      <w:tr>
+        <w:trPr>
+          <w:cantSplit/>
+        </w:trPr>
+        <w:tc>
+          <w:tcPr>
+            <w:tcW w:type="dxa" w:w="3100"/>
+            <w:tcMar>
+              <w:top w:w="80" w:type="dxa"/>
+              <w:start w:w="120" w:type="dxa"/>
+              <w:bottom w:w="80" w:type="dxa"/>
+              <w:end w:w="120" w:type="dxa"/>
+            </w:tcMar>
+            <w:vAlign w:val="center"/>
+            <w:shd w:fill="FFFFFF"/>
+          </w:tcPr>
+          <w:p>
+            <w:pPr>
+              <w:spacing w:before="0" w:after="40" w:line="252" w:lineRule="auto"/>
+              <w:jc w:val="center"/>
+            </w:pPr>
+            <w:r>
+              <w:rPr>
+                <w:rFonts w:ascii="Calibri" w:hAnsi="Calibri"/>
+                <w:b w:val="0"/>
+                <w:color w:val="111827"/>
+                <w:sz w:val="17"/>
+              </w:rPr>
+              <w:t>GET /api/v1/vehicles/{vehicle_id}/electric/range</w:t>
+            </w:r>
+          </w:p>
+        </w:tc>
+        <w:tc>
+          <w:tcPr>
+            <w:tcW w:type="dxa" w:w="4000"/>
+            <w:tcMar>
+              <w:top w:w="80" w:type="dxa"/>
+              <w:start w:w="120" w:type="dxa"/>
+              <w:bottom w:w="80" w:type="dxa"/>
+              <w:end w:w="120" w:type="dxa"/>
+            </w:tcMar>
+            <w:vAlign w:val="center"/>
+            <w:shd w:fill="FFFFFF"/>
+          </w:tcPr>
+          <w:p>
+            <w:pPr>
+              <w:spacing w:before="0" w:after="40" w:line="252" w:lineRule="auto"/>
+              <w:jc w:val="left"/>
+            </w:pPr>
+            <w:r>
+              <w:rPr>
+                <w:rFonts w:ascii="Calibri" w:hAnsi="Calibri"/>
+                <w:b w:val="0"/>
+                <w:color w:val="111827"/>
+                <w:sz w:val="17"/>
+              </w:rPr>
+              <w:t>Read the latest estimate</w:t>
+            </w:r>
+          </w:p>
+        </w:tc>
+        <w:tc>
+          <w:tcPr>
+            <w:tcW w:type="dxa" w:w="2260"/>
+            <w:tcMar>
+              <w:top w:w="80" w:type="dxa"/>
+              <w:start w:w="120" w:type="dxa"/>
+              <w:bottom w:w="80" w:type="dxa"/>
+              <w:end w:w="120" w:type="dxa"/>
+            </w:tcMar>
+            <w:vAlign w:val="center"/>
+            <w:shd w:fill="FFFFFF"/>
+          </w:tcPr>
+          <w:p>
+            <w:pPr>
+              <w:spacing w:before="0" w:after="40" w:line="252" w:lineRule="auto"/>
+              <w:jc w:val="left"/>
+            </w:pPr>
+            <w:r>
+              <w:rPr>
+                <w:rFonts w:ascii="Calibri" w:hAnsi="Calibri"/>
+                <w:b w:val="0"/>
+                <w:color w:val="111827"/>
+                <w:sz w:val="17"/>
+              </w:rPr>
+              <w:t>electric_vehicle:read</w:t>
+            </w:r>
+          </w:p>
+        </w:tc>
+      </w:tr>
+      <w:tr>
+        <w:trPr>
+          <w:cantSplit/>
+        </w:trPr>
+        <w:tc>
+          <w:tcPr>
+            <w:tcW w:type="dxa" w:w="3100"/>
+            <w:tcMar>
+              <w:top w:w="80" w:type="dxa"/>
+              <w:start w:w="120" w:type="dxa"/>
+              <w:bottom w:w="80" w:type="dxa"/>
+              <w:end w:w="120" w:type="dxa"/>
+            </w:tcMar>
+            <w:vAlign w:val="center"/>
+            <w:shd w:fill="FFFFFF"/>
+          </w:tcPr>
+          <w:p>
+            <w:pPr>
+              <w:spacing w:before="0" w:after="40" w:line="252" w:lineRule="auto"/>
+              <w:jc w:val="center"/>
+            </w:pPr>
+            <w:r>
+              <w:rPr>
+                <w:rFonts w:ascii="Calibri" w:hAnsi="Calibri"/>
+                <w:b w:val="0"/>
+                <w:color w:val="111827"/>
+                <w:sz w:val="17"/>
+              </w:rPr>
+              <w:t>POST /api/v1/vehicles/{vehicle_id}/electric/range/cycles</w:t>
+            </w:r>
+          </w:p>
+        </w:tc>
+        <w:tc>
+          <w:tcPr>
+            <w:tcW w:type="dxa" w:w="4000"/>
+            <w:tcMar>
+              <w:top w:w="80" w:type="dxa"/>
+              <w:start w:w="120" w:type="dxa"/>
+              <w:bottom w:w="80" w:type="dxa"/>
+              <w:end w:w="120" w:type="dxa"/>
+            </w:tcMar>
+            <w:vAlign w:val="center"/>
+            <w:shd w:fill="FFFFFF"/>
+          </w:tcPr>
+          <w:p>
+            <w:pPr>
+              <w:spacing w:before="0" w:after="40" w:line="252" w:lineRule="auto"/>
+              <w:jc w:val="left"/>
+            </w:pPr>
+            <w:r>
+              <w:rPr>
+                <w:rFonts w:ascii="Calibri" w:hAnsi="Calibri"/>
+                <w:b w:val="0"/>
+                <w:color w:val="111827"/>
+                <w:sz w:val="17"/>
+              </w:rPr>
+              <w:t>Evaluate one reproducible drive cycle</w:t>
+            </w:r>
+          </w:p>
+        </w:tc>
+        <w:tc>
+          <w:tcPr>
+            <w:tcW w:type="dxa" w:w="2260"/>
+            <w:tcMar>
+              <w:top w:w="80" w:type="dxa"/>
+              <w:start w:w="120" w:type="dxa"/>
+              <w:bottom w:w="80" w:type="dxa"/>
+              <w:end w:w="120" w:type="dxa"/>
+            </w:tcMar>
+            <w:vAlign w:val="center"/>
+            <w:shd w:fill="FFFFFF"/>
+          </w:tcPr>
+          <w:p>
+            <w:pPr>
+              <w:spacing w:before="0" w:after="40" w:line="252" w:lineRule="auto"/>
+              <w:jc w:val="left"/>
+            </w:pPr>
+            <w:r>
+              <w:rPr>
+                <w:rFonts w:ascii="Calibri" w:hAnsi="Calibri"/>
+                <w:b w:val="0"/>
+                <w:color w:val="111827"/>
+                <w:sz w:val="17"/>
+              </w:rPr>
+              <w:t>electric_vehicle:manage</w:t>
+            </w:r>
+          </w:p>
+        </w:tc>
+      </w:tr>
     </w:tbl>
     <w:p>
       <w:pPr>
@@ -8343,6 +9069,372 @@
                 <w:sz w:val="17"/>
               </w:rPr>
               <w:t>A thermal command ID was reused differently.</w:t>
+            </w:r>
+          </w:p>
+        </w:tc>
+      </w:tr>
+      <w:tr>
+        <w:trPr>
+          <w:cantSplit/>
+        </w:trPr>
+        <w:tc>
+          <w:tcPr>
+            <w:tcW w:type="dxa" w:w="2700"/>
+            <w:tcMar>
+              <w:top w:w="80" w:type="dxa"/>
+              <w:start w:w="120" w:type="dxa"/>
+              <w:bottom w:w="80" w:type="dxa"/>
+              <w:end w:w="120" w:type="dxa"/>
+            </w:tcMar>
+            <w:vAlign w:val="center"/>
+            <w:shd w:fill="FFFFFF"/>
+          </w:tcPr>
+          <w:p>
+            <w:pPr>
+              <w:spacing w:before="0" w:after="40" w:line="252" w:lineRule="auto"/>
+              <w:jc w:val="left"/>
+            </w:pPr>
+            <w:r>
+              <w:rPr>
+                <w:rFonts w:ascii="Calibri" w:hAnsi="Calibri"/>
+                <w:b w:val="0"/>
+                <w:color w:val="111827"/>
+                <w:sz w:val="17"/>
+              </w:rPr>
+              <w:t>range_estimator_already_exists</w:t>
+            </w:r>
+          </w:p>
+        </w:tc>
+        <w:tc>
+          <w:tcPr>
+            <w:tcW w:type="dxa" w:w="6660"/>
+            <w:tcMar>
+              <w:top w:w="80" w:type="dxa"/>
+              <w:start w:w="120" w:type="dxa"/>
+              <w:bottom w:w="80" w:type="dxa"/>
+              <w:end w:w="120" w:type="dxa"/>
+            </w:tcMar>
+            <w:vAlign w:val="center"/>
+            <w:shd w:fill="FFFFFF"/>
+          </w:tcPr>
+          <w:p>
+            <w:pPr>
+              <w:spacing w:before="0" w:after="40" w:line="252" w:lineRule="auto"/>
+              <w:jc w:val="left"/>
+            </w:pPr>
+            <w:r>
+              <w:rPr>
+                <w:rFonts w:ascii="Calibri" w:hAnsi="Calibri"/>
+                <w:b w:val="0"/>
+                <w:color w:val="111827"/>
+                <w:sz w:val="17"/>
+              </w:rPr>
+              <w:t>The vehicle already owns range-estimator state.</w:t>
+            </w:r>
+          </w:p>
+        </w:tc>
+      </w:tr>
+      <w:tr>
+        <w:trPr>
+          <w:cantSplit/>
+        </w:trPr>
+        <w:tc>
+          <w:tcPr>
+            <w:tcW w:type="dxa" w:w="2700"/>
+            <w:tcMar>
+              <w:top w:w="80" w:type="dxa"/>
+              <w:start w:w="120" w:type="dxa"/>
+              <w:bottom w:w="80" w:type="dxa"/>
+              <w:end w:w="120" w:type="dxa"/>
+            </w:tcMar>
+            <w:vAlign w:val="center"/>
+            <w:shd w:fill="FFFFFF"/>
+          </w:tcPr>
+          <w:p>
+            <w:pPr>
+              <w:spacing w:before="0" w:after="40" w:line="252" w:lineRule="auto"/>
+              <w:jc w:val="left"/>
+            </w:pPr>
+            <w:r>
+              <w:rPr>
+                <w:rFonts w:ascii="Calibri" w:hAnsi="Calibri"/>
+                <w:b w:val="0"/>
+                <w:color w:val="111827"/>
+                <w:sz w:val="17"/>
+              </w:rPr>
+              <w:t>range_estimator_not_found</w:t>
+            </w:r>
+          </w:p>
+        </w:tc>
+        <w:tc>
+          <w:tcPr>
+            <w:tcW w:type="dxa" w:w="6660"/>
+            <w:tcMar>
+              <w:top w:w="80" w:type="dxa"/>
+              <w:start w:w="120" w:type="dxa"/>
+              <w:bottom w:w="80" w:type="dxa"/>
+              <w:end w:w="120" w:type="dxa"/>
+            </w:tcMar>
+            <w:vAlign w:val="center"/>
+            <w:shd w:fill="FFFFFF"/>
+          </w:tcPr>
+          <w:p>
+            <w:pPr>
+              <w:spacing w:before="0" w:after="40" w:line="252" w:lineRule="auto"/>
+              <w:jc w:val="left"/>
+            </w:pPr>
+            <w:r>
+              <w:rPr>
+                <w:rFonts w:ascii="Calibri" w:hAnsi="Calibri"/>
+                <w:b w:val="0"/>
+                <w:color w:val="111827"/>
+                <w:sz w:val="17"/>
+              </w:rPr>
+              <w:t>No range estimator exists for the vehicle.</w:t>
+            </w:r>
+          </w:p>
+        </w:tc>
+      </w:tr>
+      <w:tr>
+        <w:trPr>
+          <w:cantSplit/>
+        </w:trPr>
+        <w:tc>
+          <w:tcPr>
+            <w:tcW w:type="dxa" w:w="2700"/>
+            <w:tcMar>
+              <w:top w:w="80" w:type="dxa"/>
+              <w:start w:w="120" w:type="dxa"/>
+              <w:bottom w:w="80" w:type="dxa"/>
+              <w:end w:w="120" w:type="dxa"/>
+            </w:tcMar>
+            <w:vAlign w:val="center"/>
+            <w:shd w:fill="FFFFFF"/>
+          </w:tcPr>
+          <w:p>
+            <w:pPr>
+              <w:spacing w:before="0" w:after="40" w:line="252" w:lineRule="auto"/>
+              <w:jc w:val="left"/>
+            </w:pPr>
+            <w:r>
+              <w:rPr>
+                <w:rFonts w:ascii="Calibri" w:hAnsi="Calibri"/>
+                <w:b w:val="0"/>
+                <w:color w:val="111827"/>
+                <w:sz w:val="17"/>
+              </w:rPr>
+              <w:t>range_state_version_conflict</w:t>
+            </w:r>
+          </w:p>
+        </w:tc>
+        <w:tc>
+          <w:tcPr>
+            <w:tcW w:type="dxa" w:w="6660"/>
+            <w:tcMar>
+              <w:top w:w="80" w:type="dxa"/>
+              <w:start w:w="120" w:type="dxa"/>
+              <w:bottom w:w="80" w:type="dxa"/>
+              <w:end w:w="120" w:type="dxa"/>
+            </w:tcMar>
+            <w:vAlign w:val="center"/>
+            <w:shd w:fill="FFFFFF"/>
+          </w:tcPr>
+          <w:p>
+            <w:pPr>
+              <w:spacing w:before="0" w:after="40" w:line="252" w:lineRule="auto"/>
+              <w:jc w:val="left"/>
+            </w:pPr>
+            <w:r>
+              <w:rPr>
+                <w:rFonts w:ascii="Calibri" w:hAnsi="Calibri"/>
+                <w:b w:val="0"/>
+                <w:color w:val="111827"/>
+                <w:sz w:val="17"/>
+              </w:rPr>
+              <w:t>The range estimator version is stale.</w:t>
+            </w:r>
+          </w:p>
+        </w:tc>
+      </w:tr>
+      <w:tr>
+        <w:trPr>
+          <w:cantSplit/>
+        </w:trPr>
+        <w:tc>
+          <w:tcPr>
+            <w:tcW w:type="dxa" w:w="2700"/>
+            <w:tcMar>
+              <w:top w:w="80" w:type="dxa"/>
+              <w:start w:w="120" w:type="dxa"/>
+              <w:bottom w:w="80" w:type="dxa"/>
+              <w:end w:w="120" w:type="dxa"/>
+            </w:tcMar>
+            <w:vAlign w:val="center"/>
+            <w:shd w:fill="FFFFFF"/>
+          </w:tcPr>
+          <w:p>
+            <w:pPr>
+              <w:spacing w:before="0" w:after="40" w:line="252" w:lineRule="auto"/>
+              <w:jc w:val="left"/>
+            </w:pPr>
+            <w:r>
+              <w:rPr>
+                <w:rFonts w:ascii="Calibri" w:hAnsi="Calibri"/>
+                <w:b w:val="0"/>
+                <w:color w:val="111827"/>
+                <w:sz w:val="17"/>
+              </w:rPr>
+              <w:t>range_battery_version_conflict</w:t>
+            </w:r>
+          </w:p>
+        </w:tc>
+        <w:tc>
+          <w:tcPr>
+            <w:tcW w:type="dxa" w:w="6660"/>
+            <w:tcMar>
+              <w:top w:w="80" w:type="dxa"/>
+              <w:start w:w="120" w:type="dxa"/>
+              <w:bottom w:w="80" w:type="dxa"/>
+              <w:end w:w="120" w:type="dxa"/>
+            </w:tcMar>
+            <w:vAlign w:val="center"/>
+            <w:shd w:fill="FFFFFF"/>
+          </w:tcPr>
+          <w:p>
+            <w:pPr>
+              <w:spacing w:before="0" w:after="40" w:line="252" w:lineRule="auto"/>
+              <w:jc w:val="left"/>
+            </w:pPr>
+            <w:r>
+              <w:rPr>
+                <w:rFonts w:ascii="Calibri" w:hAnsi="Calibri"/>
+                <w:b w:val="0"/>
+                <w:color w:val="111827"/>
+                <w:sz w:val="17"/>
+              </w:rPr>
+              <w:t>The battery version supplied to the estimate is stale.</w:t>
+            </w:r>
+          </w:p>
+        </w:tc>
+      </w:tr>
+      <w:tr>
+        <w:trPr>
+          <w:cantSplit/>
+        </w:trPr>
+        <w:tc>
+          <w:tcPr>
+            <w:tcW w:type="dxa" w:w="2700"/>
+            <w:tcMar>
+              <w:top w:w="80" w:type="dxa"/>
+              <w:start w:w="120" w:type="dxa"/>
+              <w:bottom w:w="80" w:type="dxa"/>
+              <w:end w:w="120" w:type="dxa"/>
+            </w:tcMar>
+            <w:vAlign w:val="center"/>
+            <w:shd w:fill="FFFFFF"/>
+          </w:tcPr>
+          <w:p>
+            <w:pPr>
+              <w:spacing w:before="0" w:after="40" w:line="252" w:lineRule="auto"/>
+              <w:jc w:val="left"/>
+            </w:pPr>
+            <w:r>
+              <w:rPr>
+                <w:rFonts w:ascii="Calibri" w:hAnsi="Calibri"/>
+                <w:b w:val="0"/>
+                <w:color w:val="111827"/>
+                <w:sz w:val="17"/>
+              </w:rPr>
+              <w:t>range_thermal_version_conflict</w:t>
+            </w:r>
+          </w:p>
+        </w:tc>
+        <w:tc>
+          <w:tcPr>
+            <w:tcW w:type="dxa" w:w="6660"/>
+            <w:tcMar>
+              <w:top w:w="80" w:type="dxa"/>
+              <w:start w:w="120" w:type="dxa"/>
+              <w:bottom w:w="80" w:type="dxa"/>
+              <w:end w:w="120" w:type="dxa"/>
+            </w:tcMar>
+            <w:vAlign w:val="center"/>
+            <w:shd w:fill="FFFFFF"/>
+          </w:tcPr>
+          <w:p>
+            <w:pPr>
+              <w:spacing w:before="0" w:after="40" w:line="252" w:lineRule="auto"/>
+              <w:jc w:val="left"/>
+            </w:pPr>
+            <w:r>
+              <w:rPr>
+                <w:rFonts w:ascii="Calibri" w:hAnsi="Calibri"/>
+                <w:b w:val="0"/>
+                <w:color w:val="111827"/>
+                <w:sz w:val="17"/>
+              </w:rPr>
+              <w:t>The thermal version supplied to the estimate is stale.</w:t>
+            </w:r>
+          </w:p>
+        </w:tc>
+      </w:tr>
+      <w:tr>
+        <w:trPr>
+          <w:cantSplit/>
+        </w:trPr>
+        <w:tc>
+          <w:tcPr>
+            <w:tcW w:type="dxa" w:w="2700"/>
+            <w:tcMar>
+              <w:top w:w="80" w:type="dxa"/>
+              <w:start w:w="120" w:type="dxa"/>
+              <w:bottom w:w="80" w:type="dxa"/>
+              <w:end w:w="120" w:type="dxa"/>
+            </w:tcMar>
+            <w:vAlign w:val="center"/>
+            <w:shd w:fill="FFFFFF"/>
+          </w:tcPr>
+          <w:p>
+            <w:pPr>
+              <w:spacing w:before="0" w:after="40" w:line="252" w:lineRule="auto"/>
+              <w:jc w:val="left"/>
+            </w:pPr>
+            <w:r>
+              <w:rPr>
+                <w:rFonts w:ascii="Calibri" w:hAnsi="Calibri"/>
+                <w:b w:val="0"/>
+                <w:color w:val="111827"/>
+                <w:sz w:val="17"/>
+              </w:rPr>
+              <w:t>range_estimation_command_conflict</w:t>
+            </w:r>
+          </w:p>
+        </w:tc>
+        <w:tc>
+          <w:tcPr>
+            <w:tcW w:type="dxa" w:w="6660"/>
+            <w:tcMar>
+              <w:top w:w="80" w:type="dxa"/>
+              <w:start w:w="120" w:type="dxa"/>
+              <w:bottom w:w="80" w:type="dxa"/>
+              <w:end w:w="120" w:type="dxa"/>
+            </w:tcMar>
+            <w:vAlign w:val="center"/>
+            <w:shd w:fill="FFFFFF"/>
+          </w:tcPr>
+          <w:p>
+            <w:pPr>
+              <w:spacing w:before="0" w:after="40" w:line="252" w:lineRule="auto"/>
+              <w:jc w:val="left"/>
+            </w:pPr>
+            <w:r>
+              <w:rPr>
+                <w:rFonts w:ascii="Calibri" w:hAnsi="Calibri"/>
+                <w:b w:val="0"/>
+                <w:color w:val="111827"/>
+                <w:sz w:val="17"/>
+              </w:rPr>
+              <w:t>A range command ID was reused differently.</w:t>
             </w:r>
           </w:p>
         </w:tc>
@@ -8732,6 +9824,54 @@
           <w:color w:val="111827"/>
           <w:sz w:val="22"/>
         </w:rPr>
+        <w:t xml:space="preserve">. Migration </w:t>
+      </w:r>
+      <w:r>
+        <w:rPr>
+          <w:rFonts w:ascii="Consolas" w:hAnsi="Consolas"/>
+          <w:color w:val="1F4D78"/>
+          <w:sz w:val="19"/>
+        </w:rPr>
+        <w:t>0042_range_estimation</w:t>
+      </w:r>
+      <w:r>
+        <w:rPr>
+          <w:rFonts w:ascii="Calibri" w:hAnsi="Calibri"/>
+          <w:color w:val="111827"/>
+          <w:sz w:val="22"/>
+        </w:rPr>
+        <w:t xml:space="preserve"> creates </w:t>
+      </w:r>
+      <w:r>
+        <w:rPr>
+          <w:rFonts w:ascii="Consolas" w:hAnsi="Consolas"/>
+          <w:color w:val="1F4D78"/>
+          <w:sz w:val="19"/>
+        </w:rPr>
+        <w:t>range_estimator_states</w:t>
+      </w:r>
+      <w:r>
+        <w:rPr>
+          <w:rFonts w:ascii="Calibri" w:hAnsi="Calibri"/>
+          <w:color w:val="111827"/>
+          <w:sz w:val="22"/>
+        </w:rPr>
+        <w:t xml:space="preserve"> and </w:t>
+      </w:r>
+      <w:r>
+        <w:rPr>
+          <w:rFonts w:ascii="Consolas" w:hAnsi="Consolas"/>
+          <w:color w:val="1F4D78"/>
+          <w:sz w:val="19"/>
+        </w:rPr>
+        <w:t>range_estimation_steps</w:t>
+      </w:r>
+      <w:r>
+        <w:rPr>
+          <w:rFonts w:ascii="Calibri" w:hAnsi="Calibri"/>
+          <w:color w:val="111827"/>
+          <w:sz w:val="22"/>
+        </w:rPr>
         <w:t>.</w:t>
       </w:r>
     </w:p>
@@ -9736,6 +10876,184 @@
           </w:p>
         </w:tc>
       </w:tr>
+      <w:tr>
+        <w:trPr>
+          <w:cantSplit/>
+        </w:trPr>
+        <w:tc>
+          <w:tcPr>
+            <w:tcW w:type="dxa" w:w="1650"/>
+            <w:tcMar>
+              <w:top w:w="80" w:type="dxa"/>
+              <w:start w:w="120" w:type="dxa"/>
+              <w:bottom w:w="80" w:type="dxa"/>
+              <w:end w:w="120" w:type="dxa"/>
+            </w:tcMar>
+            <w:vAlign w:val="center"/>
+            <w:shd w:fill="FFFFFF"/>
+          </w:tcPr>
+          <w:p>
+            <w:pPr>
+              <w:spacing w:before="0" w:after="40" w:line="252" w:lineRule="auto"/>
+              <w:jc w:val="center"/>
+            </w:pPr>
+            <w:r>
+              <w:rPr>
+                <w:rFonts w:ascii="Calibri" w:hAnsi="Calibri"/>
+                <w:b w:val="0"/>
+                <w:color w:val="111827"/>
+                <w:sz w:val="17"/>
+              </w:rPr>
+              <w:t>atep.electric_vehicle.range_estimator.created.v1</w:t>
+            </w:r>
+          </w:p>
+        </w:tc>
+        <w:tc>
+          <w:tcPr>
+            <w:tcW w:type="dxa" w:w="4450"/>
+            <w:tcMar>
+              <w:top w:w="80" w:type="dxa"/>
+              <w:start w:w="120" w:type="dxa"/>
+              <w:bottom w:w="80" w:type="dxa"/>
+              <w:end w:w="120" w:type="dxa"/>
+            </w:tcMar>
+            <w:vAlign w:val="center"/>
+            <w:shd w:fill="FFFFFF"/>
+          </w:tcPr>
+          <w:p>
+            <w:pPr>
+              <w:spacing w:before="0" w:after="40" w:line="252" w:lineRule="auto"/>
+              <w:jc w:val="left"/>
+            </w:pPr>
+            <w:r>
+              <w:rPr>
+                <w:rFonts w:ascii="Calibri" w:hAnsi="Calibri"/>
+                <w:b w:val="0"/>
+                <w:color w:val="111827"/>
+                <w:sz w:val="17"/>
+              </w:rPr>
+              <w:t>Announce calibrated range estimation</w:t>
+            </w:r>
+          </w:p>
+        </w:tc>
+        <w:tc>
+          <w:tcPr>
+            <w:tcW w:type="dxa" w:w="3260"/>
+            <w:tcMar>
+              <w:top w:w="80" w:type="dxa"/>
+              <w:start w:w="120" w:type="dxa"/>
+              <w:bottom w:w="80" w:type="dxa"/>
+              <w:end w:w="120" w:type="dxa"/>
+            </w:tcMar>
+            <w:vAlign w:val="center"/>
+            <w:shd w:fill="FFFFFF"/>
+          </w:tcPr>
+          <w:p>
+            <w:pPr>
+              <w:spacing w:before="0" w:after="40" w:line="252" w:lineRule="auto"/>
+              <w:jc w:val="left"/>
+            </w:pPr>
+            <w:r>
+              <w:rPr>
+                <w:rFonts w:ascii="Calibri" w:hAnsi="Calibri"/>
+                <w:b w:val="0"/>
+                <w:color w:val="111827"/>
+                <w:sz w:val="17"/>
+              </w:rPr>
+              <w:t>Bounded calibration only</w:t>
+            </w:r>
+          </w:p>
+        </w:tc>
+      </w:tr>
+      <w:tr>
+        <w:trPr>
+          <w:cantSplit/>
+        </w:trPr>
+        <w:tc>
+          <w:tcPr>
+            <w:tcW w:type="dxa" w:w="1650"/>
+            <w:tcMar>
+              <w:top w:w="80" w:type="dxa"/>
+              <w:start w:w="120" w:type="dxa"/>
+              <w:bottom w:w="80" w:type="dxa"/>
+              <w:end w:w="120" w:type="dxa"/>
+            </w:tcMar>
+            <w:vAlign w:val="center"/>
+            <w:shd w:fill="FFFFFF"/>
+          </w:tcPr>
+          <w:p>
+            <w:pPr>
+              <w:spacing w:before="0" w:after="40" w:line="252" w:lineRule="auto"/>
+              <w:jc w:val="center"/>
+            </w:pPr>
+            <w:r>
+              <w:rPr>
+                <w:rFonts w:ascii="Calibri" w:hAnsi="Calibri"/>
+                <w:b w:val="0"/>
+                <w:color w:val="111827"/>
+                <w:sz w:val="17"/>
+              </w:rPr>
+              <w:t>atep.electric_vehicle.range.cycle.completed.v1</w:t>
+            </w:r>
+          </w:p>
+        </w:tc>
+        <w:tc>
+          <w:tcPr>
+            <w:tcW w:type="dxa" w:w="4450"/>
+            <w:tcMar>
+              <w:top w:w="80" w:type="dxa"/>
+              <w:start w:w="120" w:type="dxa"/>
+              <w:bottom w:w="80" w:type="dxa"/>
+              <w:end w:w="120" w:type="dxa"/>
+            </w:tcMar>
+            <w:vAlign w:val="center"/>
+            <w:shd w:fill="FFFFFF"/>
+          </w:tcPr>
+          <w:p>
+            <w:pPr>
+              <w:spacing w:before="0" w:after="40" w:line="252" w:lineRule="auto"/>
+              <w:jc w:val="left"/>
+            </w:pPr>
+            <w:r>
+              <w:rPr>
+                <w:rFonts w:ascii="Calibri" w:hAnsi="Calibri"/>
+                <w:b w:val="0"/>
+                <w:color w:val="111827"/>
+                <w:sz w:val="17"/>
+              </w:rPr>
+              <w:t>Announce drive-cycle outcome</w:t>
+            </w:r>
+          </w:p>
+        </w:tc>
+        <w:tc>
+          <w:tcPr>
+            <w:tcW w:type="dxa" w:w="3260"/>
+            <w:tcMar>
+              <w:top w:w="80" w:type="dxa"/>
+              <w:start w:w="120" w:type="dxa"/>
+              <w:bottom w:w="80" w:type="dxa"/>
+              <w:end w:w="120" w:type="dxa"/>
+            </w:tcMar>
+            <w:vAlign w:val="center"/>
+            <w:shd w:fill="FFFFFF"/>
+          </w:tcPr>
+          <w:p>
+            <w:pPr>
+              <w:spacing w:before="0" w:after="40" w:line="252" w:lineRule="auto"/>
+              <w:jc w:val="left"/>
+            </w:pPr>
+            <w:r>
+              <w:rPr>
+                <w:rFonts w:ascii="Calibri" w:hAnsi="Calibri"/>
+                <w:b w:val="0"/>
+                <w:color w:val="111827"/>
+                <w:sz w:val="17"/>
+              </w:rPr>
+              <w:t>Consumption, range, cycle ID, and version</w:t>
+            </w:r>
+          </w:p>
+        </w:tc>
+      </w:tr>
     </w:tbl>
     <w:p>
       <w:pPr>
@@ -9759,7 +11077,7 @@
           <w:color w:val="111827"/>
           <w:sz w:val="22"/>
         </w:rPr>
-        <w:t xml:space="preserve">VI-1 through VI-5 implement EV-F-001 through EV-F-076 and EV-NF-001 through EV-NF-024. The authoritative traceability table is maintained in </w:t>
+        <w:t xml:space="preserve">VI-1 through VI-6 implement EV-F-001 through EV-F-089 and EV-NF-001 through EV-NF-029. The authoritative traceability table is maintained in </w:t>
       </w:r>
       <w:r>
         <w:rPr>
@@ -10122,6 +11440,46 @@
     </w:p>
     <w:p>
       <w:pPr>
+        <w:pStyle w:val="Heading2"/>
+        <w:keepNext/>
+        <w:keepLines/>
+      </w:pPr>
+      <w:r>
+        <w:t>ADR-EV-016 - Use Reproducible Drive-Cycle Segments</w:t>
+      </w:r>
+    </w:p>
+    <w:p>
+      <w:r>
+        <w:rPr>
+          <w:rFonts w:ascii="Calibri" w:hAnsi="Calibri"/>
+          <w:color w:val="111827"/>
+          <w:sz w:val="22"/>
+        </w:rPr>
+        <w:t>Decision: represent a route as bounded duration, speed, acceleration, and grade segments rather than querying a map provider. Rationale: the same input remains deterministic, local, free, and usable in regression tests.</w:t>
+      </w:r>
+    </w:p>
+    <w:p>
+      <w:pPr>
+        <w:pStyle w:val="Heading2"/>
+        <w:keepNext/>
+        <w:keepLines/>
+      </w:pPr>
+      <w:r>
+        <w:t>ADR-EV-017 - Estimate Without Mutating Battery Energy</w:t>
+      </w:r>
+    </w:p>
+    <w:p>
+      <w:r>
+        <w:rPr>
+          <w:rFonts w:ascii="Calibri" w:hAnsi="Calibri"/>
+          <w:color w:val="111827"/>
+          <w:sz w:val="22"/>
+        </w:rPr>
+        <w:t>Decision: VI-6 reads versioned battery and thermal state but treats a drive cycle as an analytical estimate. Rationale: repeated scenario execution must not silently debit SOC before VI-7 defines a cross-domain trip transaction.</w:t>
+      </w:r>
+    </w:p>
+    <w:p>
+      <w:pPr>
         <w:pStyle w:val="Heading1"/>
         <w:keepNext/>
         <w:keepLines/>
@@ -21470,6 +22828,1644 @@
                 <w:sz w:val="16"/>
               </w:rPr>
               <w:t>Inspect routes and revision 0041</w:t>
+            </w:r>
+          </w:p>
+        </w:tc>
+        <w:tc>
+          <w:tcPr>
+            <w:tcW w:type="dxa" w:w="1410"/>
+            <w:tcMar>
+              <w:top w:w="80" w:type="dxa"/>
+              <w:start w:w="120" w:type="dxa"/>
+              <w:bottom w:w="80" w:type="dxa"/>
+              <w:end w:w="120" w:type="dxa"/>
+            </w:tcMar>
+            <w:vAlign w:val="center"/>
+            <w:shd w:fill="FFFFFF"/>
+          </w:tcPr>
+          <w:p>
+            <w:pPr>
+              <w:spacing w:before="0" w:after="40" w:line="252" w:lineRule="auto"/>
+              <w:jc w:val="left"/>
+            </w:pPr>
+            <w:r>
+              <w:rPr>
+                <w:rFonts w:ascii="Calibri" w:hAnsi="Calibri"/>
+                <w:b w:val="0"/>
+                <w:color w:val="111827"/>
+                <w:sz w:val="16"/>
+              </w:rPr>
+              <w:t>Bounded schema and reversible tables</w:t>
+            </w:r>
+          </w:p>
+        </w:tc>
+      </w:tr>
+      <w:tr>
+        <w:trPr>
+          <w:cantSplit/>
+        </w:trPr>
+        <w:tc>
+          <w:tcPr>
+            <w:tcW w:type="dxa" w:w="1150"/>
+            <w:tcMar>
+              <w:top w:w="80" w:type="dxa"/>
+              <w:start w:w="120" w:type="dxa"/>
+              <w:bottom w:w="80" w:type="dxa"/>
+              <w:end w:w="120" w:type="dxa"/>
+            </w:tcMar>
+            <w:vAlign w:val="center"/>
+            <w:shd w:fill="FFFFFF"/>
+          </w:tcPr>
+          <w:p>
+            <w:pPr>
+              <w:spacing w:before="0" w:after="40" w:line="252" w:lineRule="auto"/>
+              <w:jc w:val="center"/>
+            </w:pPr>
+            <w:r>
+              <w:rPr>
+                <w:rFonts w:ascii="Calibri" w:hAnsi="Calibri"/>
+                <w:b w:val="0"/>
+                <w:color w:val="111827"/>
+                <w:sz w:val="16"/>
+              </w:rPr>
+              <w:t>EV-T-097</w:t>
+            </w:r>
+          </w:p>
+        </w:tc>
+        <w:tc>
+          <w:tcPr>
+            <w:tcW w:type="dxa" w:w="3700"/>
+            <w:tcMar>
+              <w:top w:w="80" w:type="dxa"/>
+              <w:start w:w="120" w:type="dxa"/>
+              <w:bottom w:w="80" w:type="dxa"/>
+              <w:end w:w="120" w:type="dxa"/>
+            </w:tcMar>
+            <w:vAlign w:val="center"/>
+            <w:shd w:fill="FFFFFF"/>
+          </w:tcPr>
+          <w:p>
+            <w:pPr>
+              <w:spacing w:before="0" w:after="40" w:line="252" w:lineRule="auto"/>
+              <w:jc w:val="left"/>
+            </w:pPr>
+            <w:r>
+              <w:rPr>
+                <w:rFonts w:ascii="Calibri" w:hAnsi="Calibri"/>
+                <w:b w:val="0"/>
+                <w:color w:val="111827"/>
+                <w:sz w:val="16"/>
+              </w:rPr>
+              <w:t>Range contract bounds</w:t>
+            </w:r>
+          </w:p>
+        </w:tc>
+        <w:tc>
+          <w:tcPr>
+            <w:tcW w:type="dxa" w:w="3100"/>
+            <w:tcMar>
+              <w:top w:w="80" w:type="dxa"/>
+              <w:start w:w="120" w:type="dxa"/>
+              <w:bottom w:w="80" w:type="dxa"/>
+              <w:end w:w="120" w:type="dxa"/>
+            </w:tcMar>
+            <w:vAlign w:val="center"/>
+            <w:shd w:fill="FFFFFF"/>
+          </w:tcPr>
+          <w:p>
+            <w:pPr>
+              <w:spacing w:before="0" w:after="40" w:line="252" w:lineRule="auto"/>
+              <w:jc w:val="left"/>
+            </w:pPr>
+            <w:r>
+              <w:rPr>
+                <w:rFonts w:ascii="Calibri" w:hAnsi="Calibri"/>
+                <w:b w:val="0"/>
+                <w:color w:val="111827"/>
+                <w:sz w:val="16"/>
+              </w:rPr>
+              <w:t>Exceed calibration, segment, or collection limits</w:t>
+            </w:r>
+          </w:p>
+        </w:tc>
+        <w:tc>
+          <w:tcPr>
+            <w:tcW w:type="dxa" w:w="1410"/>
+            <w:tcMar>
+              <w:top w:w="80" w:type="dxa"/>
+              <w:start w:w="120" w:type="dxa"/>
+              <w:bottom w:w="80" w:type="dxa"/>
+              <w:end w:w="120" w:type="dxa"/>
+            </w:tcMar>
+            <w:vAlign w:val="center"/>
+            <w:shd w:fill="FFFFFF"/>
+          </w:tcPr>
+          <w:p>
+            <w:pPr>
+              <w:spacing w:before="0" w:after="40" w:line="252" w:lineRule="auto"/>
+              <w:jc w:val="left"/>
+            </w:pPr>
+            <w:r>
+              <w:rPr>
+                <w:rFonts w:ascii="Calibri" w:hAnsi="Calibri"/>
+                <w:b w:val="0"/>
+                <w:color w:val="111827"/>
+                <w:sz w:val="16"/>
+              </w:rPr>
+              <w:t>Stable validation error</w:t>
+            </w:r>
+          </w:p>
+        </w:tc>
+      </w:tr>
+      <w:tr>
+        <w:trPr>
+          <w:cantSplit/>
+        </w:trPr>
+        <w:tc>
+          <w:tcPr>
+            <w:tcW w:type="dxa" w:w="1150"/>
+            <w:tcMar>
+              <w:top w:w="80" w:type="dxa"/>
+              <w:start w:w="120" w:type="dxa"/>
+              <w:bottom w:w="80" w:type="dxa"/>
+              <w:end w:w="120" w:type="dxa"/>
+            </w:tcMar>
+            <w:vAlign w:val="center"/>
+            <w:shd w:fill="FFFFFF"/>
+          </w:tcPr>
+          <w:p>
+            <w:pPr>
+              <w:spacing w:before="0" w:after="40" w:line="252" w:lineRule="auto"/>
+              <w:jc w:val="center"/>
+            </w:pPr>
+            <w:r>
+              <w:rPr>
+                <w:rFonts w:ascii="Calibri" w:hAnsi="Calibri"/>
+                <w:b w:val="0"/>
+                <w:color w:val="111827"/>
+                <w:sz w:val="16"/>
+              </w:rPr>
+              <w:t>EV-T-098</w:t>
+            </w:r>
+          </w:p>
+        </w:tc>
+        <w:tc>
+          <w:tcPr>
+            <w:tcW w:type="dxa" w:w="3700"/>
+            <w:tcMar>
+              <w:top w:w="80" w:type="dxa"/>
+              <w:start w:w="120" w:type="dxa"/>
+              <w:bottom w:w="80" w:type="dxa"/>
+              <w:end w:w="120" w:type="dxa"/>
+            </w:tcMar>
+            <w:vAlign w:val="center"/>
+            <w:shd w:fill="FFFFFF"/>
+          </w:tcPr>
+          <w:p>
+            <w:pPr>
+              <w:spacing w:before="0" w:after="40" w:line="252" w:lineRule="auto"/>
+              <w:jc w:val="left"/>
+            </w:pPr>
+            <w:r>
+              <w:rPr>
+                <w:rFonts w:ascii="Calibri" w:hAnsi="Calibri"/>
+                <w:b w:val="0"/>
+                <w:color w:val="111827"/>
+                <w:sz w:val="16"/>
+              </w:rPr>
+              <w:t>Range-estimator creation</w:t>
+            </w:r>
+          </w:p>
+        </w:tc>
+        <w:tc>
+          <w:tcPr>
+            <w:tcW w:type="dxa" w:w="3100"/>
+            <w:tcMar>
+              <w:top w:w="80" w:type="dxa"/>
+              <w:start w:w="120" w:type="dxa"/>
+              <w:bottom w:w="80" w:type="dxa"/>
+              <w:end w:w="120" w:type="dxa"/>
+            </w:tcMar>
+            <w:vAlign w:val="center"/>
+            <w:shd w:fill="FFFFFF"/>
+          </w:tcPr>
+          <w:p>
+            <w:pPr>
+              <w:spacing w:before="0" w:after="40" w:line="252" w:lineRule="auto"/>
+              <w:jc w:val="left"/>
+            </w:pPr>
+            <w:r>
+              <w:rPr>
+                <w:rFonts w:ascii="Calibri" w:hAnsi="Calibri"/>
+                <w:b w:val="0"/>
+                <w:color w:val="111827"/>
+                <w:sz w:val="16"/>
+              </w:rPr>
+              <w:t>Create one estimator after battery and thermal setup</w:t>
+            </w:r>
+          </w:p>
+        </w:tc>
+        <w:tc>
+          <w:tcPr>
+            <w:tcW w:type="dxa" w:w="1410"/>
+            <w:tcMar>
+              <w:top w:w="80" w:type="dxa"/>
+              <w:start w:w="120" w:type="dxa"/>
+              <w:bottom w:w="80" w:type="dxa"/>
+              <w:end w:w="120" w:type="dxa"/>
+            </w:tcMar>
+            <w:vAlign w:val="center"/>
+            <w:shd w:fill="FFFFFF"/>
+          </w:tcPr>
+          <w:p>
+            <w:pPr>
+              <w:spacing w:before="0" w:after="40" w:line="252" w:lineRule="auto"/>
+              <w:jc w:val="left"/>
+            </w:pPr>
+            <w:r>
+              <w:rPr>
+                <w:rFonts w:ascii="Calibri" w:hAnsi="Calibri"/>
+                <w:b w:val="0"/>
+                <w:color w:val="111827"/>
+                <w:sz w:val="16"/>
+              </w:rPr>
+              <w:t>Version 1 and ready</w:t>
+            </w:r>
+          </w:p>
+        </w:tc>
+      </w:tr>
+      <w:tr>
+        <w:trPr>
+          <w:cantSplit/>
+        </w:trPr>
+        <w:tc>
+          <w:tcPr>
+            <w:tcW w:type="dxa" w:w="1150"/>
+            <w:tcMar>
+              <w:top w:w="80" w:type="dxa"/>
+              <w:start w:w="120" w:type="dxa"/>
+              <w:bottom w:w="80" w:type="dxa"/>
+              <w:end w:w="120" w:type="dxa"/>
+            </w:tcMar>
+            <w:vAlign w:val="center"/>
+            <w:shd w:fill="FFFFFF"/>
+          </w:tcPr>
+          <w:p>
+            <w:pPr>
+              <w:spacing w:before="0" w:after="40" w:line="252" w:lineRule="auto"/>
+              <w:jc w:val="center"/>
+            </w:pPr>
+            <w:r>
+              <w:rPr>
+                <w:rFonts w:ascii="Calibri" w:hAnsi="Calibri"/>
+                <w:b w:val="0"/>
+                <w:color w:val="111827"/>
+                <w:sz w:val="16"/>
+              </w:rPr>
+              <w:t>EV-T-099</w:t>
+            </w:r>
+          </w:p>
+        </w:tc>
+        <w:tc>
+          <w:tcPr>
+            <w:tcW w:type="dxa" w:w="3700"/>
+            <w:tcMar>
+              <w:top w:w="80" w:type="dxa"/>
+              <w:start w:w="120" w:type="dxa"/>
+              <w:bottom w:w="80" w:type="dxa"/>
+              <w:end w:w="120" w:type="dxa"/>
+            </w:tcMar>
+            <w:vAlign w:val="center"/>
+            <w:shd w:fill="FFFFFF"/>
+          </w:tcPr>
+          <w:p>
+            <w:pPr>
+              <w:spacing w:before="0" w:after="40" w:line="252" w:lineRule="auto"/>
+              <w:jc w:val="left"/>
+            </w:pPr>
+            <w:r>
+              <w:rPr>
+                <w:rFonts w:ascii="Calibri" w:hAnsi="Calibri"/>
+                <w:b w:val="0"/>
+                <w:color w:val="111827"/>
+                <w:sz w:val="16"/>
+              </w:rPr>
+              <w:t>Constant-speed cycle</w:t>
+            </w:r>
+          </w:p>
+        </w:tc>
+        <w:tc>
+          <w:tcPr>
+            <w:tcW w:type="dxa" w:w="3100"/>
+            <w:tcMar>
+              <w:top w:w="80" w:type="dxa"/>
+              <w:start w:w="120" w:type="dxa"/>
+              <w:bottom w:w="80" w:type="dxa"/>
+              <w:end w:w="120" w:type="dxa"/>
+            </w:tcMar>
+            <w:vAlign w:val="center"/>
+            <w:shd w:fill="FFFFFF"/>
+          </w:tcPr>
+          <w:p>
+            <w:pPr>
+              <w:spacing w:before="0" w:after="40" w:line="252" w:lineRule="auto"/>
+              <w:jc w:val="left"/>
+            </w:pPr>
+            <w:r>
+              <w:rPr>
+                <w:rFonts w:ascii="Calibri" w:hAnsi="Calibri"/>
+                <w:b w:val="0"/>
+                <w:color w:val="111827"/>
+                <w:sz w:val="16"/>
+              </w:rPr>
+              <w:t>Execute a reproducible level-road profile</w:t>
+            </w:r>
+          </w:p>
+        </w:tc>
+        <w:tc>
+          <w:tcPr>
+            <w:tcW w:type="dxa" w:w="1410"/>
+            <w:tcMar>
+              <w:top w:w="80" w:type="dxa"/>
+              <w:start w:w="120" w:type="dxa"/>
+              <w:bottom w:w="80" w:type="dxa"/>
+              <w:end w:w="120" w:type="dxa"/>
+            </w:tcMar>
+            <w:vAlign w:val="center"/>
+            <w:shd w:fill="FFFFFF"/>
+          </w:tcPr>
+          <w:p>
+            <w:pPr>
+              <w:spacing w:before="0" w:after="40" w:line="252" w:lineRule="auto"/>
+              <w:jc w:val="left"/>
+            </w:pPr>
+            <w:r>
+              <w:rPr>
+                <w:rFonts w:ascii="Calibri" w:hAnsi="Calibri"/>
+                <w:b w:val="0"/>
+                <w:color w:val="111827"/>
+                <w:sz w:val="16"/>
+              </w:rPr>
+              <w:t>Deterministic distance and energy</w:t>
+            </w:r>
+          </w:p>
+        </w:tc>
+      </w:tr>
+      <w:tr>
+        <w:trPr>
+          <w:cantSplit/>
+        </w:trPr>
+        <w:tc>
+          <w:tcPr>
+            <w:tcW w:type="dxa" w:w="1150"/>
+            <w:tcMar>
+              <w:top w:w="80" w:type="dxa"/>
+              <w:start w:w="120" w:type="dxa"/>
+              <w:bottom w:w="80" w:type="dxa"/>
+              <w:end w:w="120" w:type="dxa"/>
+            </w:tcMar>
+            <w:vAlign w:val="center"/>
+            <w:shd w:fill="FFFFFF"/>
+          </w:tcPr>
+          <w:p>
+            <w:pPr>
+              <w:spacing w:before="0" w:after="40" w:line="252" w:lineRule="auto"/>
+              <w:jc w:val="center"/>
+            </w:pPr>
+            <w:r>
+              <w:rPr>
+                <w:rFonts w:ascii="Calibri" w:hAnsi="Calibri"/>
+                <w:b w:val="0"/>
+                <w:color w:val="111827"/>
+                <w:sz w:val="16"/>
+              </w:rPr>
+              <w:t>EV-T-100</w:t>
+            </w:r>
+          </w:p>
+        </w:tc>
+        <w:tc>
+          <w:tcPr>
+            <w:tcW w:type="dxa" w:w="3700"/>
+            <w:tcMar>
+              <w:top w:w="80" w:type="dxa"/>
+              <w:start w:w="120" w:type="dxa"/>
+              <w:bottom w:w="80" w:type="dxa"/>
+              <w:end w:w="120" w:type="dxa"/>
+            </w:tcMar>
+            <w:vAlign w:val="center"/>
+            <w:shd w:fill="FFFFFF"/>
+          </w:tcPr>
+          <w:p>
+            <w:pPr>
+              <w:spacing w:before="0" w:after="40" w:line="252" w:lineRule="auto"/>
+              <w:jc w:val="left"/>
+            </w:pPr>
+            <w:r>
+              <w:rPr>
+                <w:rFonts w:ascii="Calibri" w:hAnsi="Calibri"/>
+                <w:b w:val="0"/>
+                <w:color w:val="111827"/>
+                <w:sz w:val="16"/>
+              </w:rPr>
+              <w:t>Aerodynamic sensitivity</w:t>
+            </w:r>
+          </w:p>
+        </w:tc>
+        <w:tc>
+          <w:tcPr>
+            <w:tcW w:type="dxa" w:w="3100"/>
+            <w:tcMar>
+              <w:top w:w="80" w:type="dxa"/>
+              <w:start w:w="120" w:type="dxa"/>
+              <w:bottom w:w="80" w:type="dxa"/>
+              <w:end w:w="120" w:type="dxa"/>
+            </w:tcMar>
+            <w:vAlign w:val="center"/>
+            <w:shd w:fill="FFFFFF"/>
+          </w:tcPr>
+          <w:p>
+            <w:pPr>
+              <w:spacing w:before="0" w:after="40" w:line="252" w:lineRule="auto"/>
+              <w:jc w:val="left"/>
+            </w:pPr>
+            <w:r>
+              <w:rPr>
+                <w:rFonts w:ascii="Calibri" w:hAnsi="Calibri"/>
+                <w:b w:val="0"/>
+                <w:color w:val="111827"/>
+                <w:sz w:val="16"/>
+              </w:rPr>
+              <w:t>Compare equal cycles at different speeds</w:t>
+            </w:r>
+          </w:p>
+        </w:tc>
+        <w:tc>
+          <w:tcPr>
+            <w:tcW w:type="dxa" w:w="1410"/>
+            <w:tcMar>
+              <w:top w:w="80" w:type="dxa"/>
+              <w:start w:w="120" w:type="dxa"/>
+              <w:bottom w:w="80" w:type="dxa"/>
+              <w:end w:w="120" w:type="dxa"/>
+            </w:tcMar>
+            <w:vAlign w:val="center"/>
+            <w:shd w:fill="FFFFFF"/>
+          </w:tcPr>
+          <w:p>
+            <w:pPr>
+              <w:spacing w:before="0" w:after="40" w:line="252" w:lineRule="auto"/>
+              <w:jc w:val="left"/>
+            </w:pPr>
+            <w:r>
+              <w:rPr>
+                <w:rFonts w:ascii="Calibri" w:hAnsi="Calibri"/>
+                <w:b w:val="0"/>
+                <w:color w:val="111827"/>
+                <w:sz w:val="16"/>
+              </w:rPr>
+              <w:t>Higher speed raises consumption</w:t>
+            </w:r>
+          </w:p>
+        </w:tc>
+      </w:tr>
+      <w:tr>
+        <w:trPr>
+          <w:cantSplit/>
+        </w:trPr>
+        <w:tc>
+          <w:tcPr>
+            <w:tcW w:type="dxa" w:w="1150"/>
+            <w:tcMar>
+              <w:top w:w="80" w:type="dxa"/>
+              <w:start w:w="120" w:type="dxa"/>
+              <w:bottom w:w="80" w:type="dxa"/>
+              <w:end w:w="120" w:type="dxa"/>
+            </w:tcMar>
+            <w:vAlign w:val="center"/>
+            <w:shd w:fill="FFFFFF"/>
+          </w:tcPr>
+          <w:p>
+            <w:pPr>
+              <w:spacing w:before="0" w:after="40" w:line="252" w:lineRule="auto"/>
+              <w:jc w:val="center"/>
+            </w:pPr>
+            <w:r>
+              <w:rPr>
+                <w:rFonts w:ascii="Calibri" w:hAnsi="Calibri"/>
+                <w:b w:val="0"/>
+                <w:color w:val="111827"/>
+                <w:sz w:val="16"/>
+              </w:rPr>
+              <w:t>EV-T-101</w:t>
+            </w:r>
+          </w:p>
+        </w:tc>
+        <w:tc>
+          <w:tcPr>
+            <w:tcW w:type="dxa" w:w="3700"/>
+            <w:tcMar>
+              <w:top w:w="80" w:type="dxa"/>
+              <w:start w:w="120" w:type="dxa"/>
+              <w:bottom w:w="80" w:type="dxa"/>
+              <w:end w:w="120" w:type="dxa"/>
+            </w:tcMar>
+            <w:vAlign w:val="center"/>
+            <w:shd w:fill="FFFFFF"/>
+          </w:tcPr>
+          <w:p>
+            <w:pPr>
+              <w:spacing w:before="0" w:after="40" w:line="252" w:lineRule="auto"/>
+              <w:jc w:val="left"/>
+            </w:pPr>
+            <w:r>
+              <w:rPr>
+                <w:rFonts w:ascii="Calibri" w:hAnsi="Calibri"/>
+                <w:b w:val="0"/>
+                <w:color w:val="111827"/>
+                <w:sz w:val="16"/>
+              </w:rPr>
+              <w:t>Auxiliary sensitivity</w:t>
+            </w:r>
+          </w:p>
+        </w:tc>
+        <w:tc>
+          <w:tcPr>
+            <w:tcW w:type="dxa" w:w="3100"/>
+            <w:tcMar>
+              <w:top w:w="80" w:type="dxa"/>
+              <w:start w:w="120" w:type="dxa"/>
+              <w:bottom w:w="80" w:type="dxa"/>
+              <w:end w:w="120" w:type="dxa"/>
+            </w:tcMar>
+            <w:vAlign w:val="center"/>
+            <w:shd w:fill="FFFFFF"/>
+          </w:tcPr>
+          <w:p>
+            <w:pPr>
+              <w:spacing w:before="0" w:after="40" w:line="252" w:lineRule="auto"/>
+              <w:jc w:val="left"/>
+            </w:pPr>
+            <w:r>
+              <w:rPr>
+                <w:rFonts w:ascii="Calibri" w:hAnsi="Calibri"/>
+                <w:b w:val="0"/>
+                <w:color w:val="111827"/>
+                <w:sz w:val="16"/>
+              </w:rPr>
+              <w:t>Compare equal cycles with different thermal demand</w:t>
+            </w:r>
+          </w:p>
+        </w:tc>
+        <w:tc>
+          <w:tcPr>
+            <w:tcW w:type="dxa" w:w="1410"/>
+            <w:tcMar>
+              <w:top w:w="80" w:type="dxa"/>
+              <w:start w:w="120" w:type="dxa"/>
+              <w:bottom w:w="80" w:type="dxa"/>
+              <w:end w:w="120" w:type="dxa"/>
+            </w:tcMar>
+            <w:vAlign w:val="center"/>
+            <w:shd w:fill="FFFFFF"/>
+          </w:tcPr>
+          <w:p>
+            <w:pPr>
+              <w:spacing w:before="0" w:after="40" w:line="252" w:lineRule="auto"/>
+              <w:jc w:val="left"/>
+            </w:pPr>
+            <w:r>
+              <w:rPr>
+                <w:rFonts w:ascii="Calibri" w:hAnsi="Calibri"/>
+                <w:b w:val="0"/>
+                <w:color w:val="111827"/>
+                <w:sz w:val="16"/>
+              </w:rPr>
+              <w:t>Higher load reduces range</w:t>
+            </w:r>
+          </w:p>
+        </w:tc>
+      </w:tr>
+      <w:tr>
+        <w:trPr>
+          <w:cantSplit/>
+        </w:trPr>
+        <w:tc>
+          <w:tcPr>
+            <w:tcW w:type="dxa" w:w="1150"/>
+            <w:tcMar>
+              <w:top w:w="80" w:type="dxa"/>
+              <w:start w:w="120" w:type="dxa"/>
+              <w:bottom w:w="80" w:type="dxa"/>
+              <w:end w:w="120" w:type="dxa"/>
+            </w:tcMar>
+            <w:vAlign w:val="center"/>
+            <w:shd w:fill="FFFFFF"/>
+          </w:tcPr>
+          <w:p>
+            <w:pPr>
+              <w:spacing w:before="0" w:after="40" w:line="252" w:lineRule="auto"/>
+              <w:jc w:val="center"/>
+            </w:pPr>
+            <w:r>
+              <w:rPr>
+                <w:rFonts w:ascii="Calibri" w:hAnsi="Calibri"/>
+                <w:b w:val="0"/>
+                <w:color w:val="111827"/>
+                <w:sz w:val="16"/>
+              </w:rPr>
+              <w:t>EV-T-102</w:t>
+            </w:r>
+          </w:p>
+        </w:tc>
+        <w:tc>
+          <w:tcPr>
+            <w:tcW w:type="dxa" w:w="3700"/>
+            <w:tcMar>
+              <w:top w:w="80" w:type="dxa"/>
+              <w:start w:w="120" w:type="dxa"/>
+              <w:bottom w:w="80" w:type="dxa"/>
+              <w:end w:w="120" w:type="dxa"/>
+            </w:tcMar>
+            <w:vAlign w:val="center"/>
+            <w:shd w:fill="FFFFFF"/>
+          </w:tcPr>
+          <w:p>
+            <w:pPr>
+              <w:spacing w:before="0" w:after="40" w:line="252" w:lineRule="auto"/>
+              <w:jc w:val="left"/>
+            </w:pPr>
+            <w:r>
+              <w:rPr>
+                <w:rFonts w:ascii="Calibri" w:hAnsi="Calibri"/>
+                <w:b w:val="0"/>
+                <w:color w:val="111827"/>
+                <w:sz w:val="16"/>
+              </w:rPr>
+              <w:t>Road-grade sensitivity</w:t>
+            </w:r>
+          </w:p>
+        </w:tc>
+        <w:tc>
+          <w:tcPr>
+            <w:tcW w:type="dxa" w:w="3100"/>
+            <w:tcMar>
+              <w:top w:w="80" w:type="dxa"/>
+              <w:start w:w="120" w:type="dxa"/>
+              <w:bottom w:w="80" w:type="dxa"/>
+              <w:end w:w="120" w:type="dxa"/>
+            </w:tcMar>
+            <w:vAlign w:val="center"/>
+            <w:shd w:fill="FFFFFF"/>
+          </w:tcPr>
+          <w:p>
+            <w:pPr>
+              <w:spacing w:before="0" w:after="40" w:line="252" w:lineRule="auto"/>
+              <w:jc w:val="left"/>
+            </w:pPr>
+            <w:r>
+              <w:rPr>
+                <w:rFonts w:ascii="Calibri" w:hAnsi="Calibri"/>
+                <w:b w:val="0"/>
+                <w:color w:val="111827"/>
+                <w:sz w:val="16"/>
+              </w:rPr>
+              <w:t>Compare level and uphill segments</w:t>
+            </w:r>
+          </w:p>
+        </w:tc>
+        <w:tc>
+          <w:tcPr>
+            <w:tcW w:type="dxa" w:w="1410"/>
+            <w:tcMar>
+              <w:top w:w="80" w:type="dxa"/>
+              <w:start w:w="120" w:type="dxa"/>
+              <w:bottom w:w="80" w:type="dxa"/>
+              <w:end w:w="120" w:type="dxa"/>
+            </w:tcMar>
+            <w:vAlign w:val="center"/>
+            <w:shd w:fill="FFFFFF"/>
+          </w:tcPr>
+          <w:p>
+            <w:pPr>
+              <w:spacing w:before="0" w:after="40" w:line="252" w:lineRule="auto"/>
+              <w:jc w:val="left"/>
+            </w:pPr>
+            <w:r>
+              <w:rPr>
+                <w:rFonts w:ascii="Calibri" w:hAnsi="Calibri"/>
+                <w:b w:val="0"/>
+                <w:color w:val="111827"/>
+                <w:sz w:val="16"/>
+              </w:rPr>
+              <w:t>Uphill demand raises traction energy</w:t>
+            </w:r>
+          </w:p>
+        </w:tc>
+      </w:tr>
+      <w:tr>
+        <w:trPr>
+          <w:cantSplit/>
+        </w:trPr>
+        <w:tc>
+          <w:tcPr>
+            <w:tcW w:type="dxa" w:w="1150"/>
+            <w:tcMar>
+              <w:top w:w="80" w:type="dxa"/>
+              <w:start w:w="120" w:type="dxa"/>
+              <w:bottom w:w="80" w:type="dxa"/>
+              <w:end w:w="120" w:type="dxa"/>
+            </w:tcMar>
+            <w:vAlign w:val="center"/>
+            <w:shd w:fill="FFFFFF"/>
+          </w:tcPr>
+          <w:p>
+            <w:pPr>
+              <w:spacing w:before="0" w:after="40" w:line="252" w:lineRule="auto"/>
+              <w:jc w:val="center"/>
+            </w:pPr>
+            <w:r>
+              <w:rPr>
+                <w:rFonts w:ascii="Calibri" w:hAnsi="Calibri"/>
+                <w:b w:val="0"/>
+                <w:color w:val="111827"/>
+                <w:sz w:val="16"/>
+              </w:rPr>
+              <w:t>EV-T-103</w:t>
+            </w:r>
+          </w:p>
+        </w:tc>
+        <w:tc>
+          <w:tcPr>
+            <w:tcW w:type="dxa" w:w="3700"/>
+            <w:tcMar>
+              <w:top w:w="80" w:type="dxa"/>
+              <w:start w:w="120" w:type="dxa"/>
+              <w:bottom w:w="80" w:type="dxa"/>
+              <w:end w:w="120" w:type="dxa"/>
+            </w:tcMar>
+            <w:vAlign w:val="center"/>
+            <w:shd w:fill="FFFFFF"/>
+          </w:tcPr>
+          <w:p>
+            <w:pPr>
+              <w:spacing w:before="0" w:after="40" w:line="252" w:lineRule="auto"/>
+              <w:jc w:val="left"/>
+            </w:pPr>
+            <w:r>
+              <w:rPr>
+                <w:rFonts w:ascii="Calibri" w:hAnsi="Calibri"/>
+                <w:b w:val="0"/>
+                <w:color w:val="111827"/>
+                <w:sz w:val="16"/>
+              </w:rPr>
+              <w:t>Regenerative recovery</w:t>
+            </w:r>
+          </w:p>
+        </w:tc>
+        <w:tc>
+          <w:tcPr>
+            <w:tcW w:type="dxa" w:w="3100"/>
+            <w:tcMar>
+              <w:top w:w="80" w:type="dxa"/>
+              <w:start w:w="120" w:type="dxa"/>
+              <w:bottom w:w="80" w:type="dxa"/>
+              <w:end w:w="120" w:type="dxa"/>
+            </w:tcMar>
+            <w:vAlign w:val="center"/>
+            <w:shd w:fill="FFFFFF"/>
+          </w:tcPr>
+          <w:p>
+            <w:pPr>
+              <w:spacing w:before="0" w:after="40" w:line="252" w:lineRule="auto"/>
+              <w:jc w:val="left"/>
+            </w:pPr>
+            <w:r>
+              <w:rPr>
+                <w:rFonts w:ascii="Calibri" w:hAnsi="Calibri"/>
+                <w:b w:val="0"/>
+                <w:color w:val="111827"/>
+                <w:sz w:val="16"/>
+              </w:rPr>
+              <w:t>Include a negative-acceleration segment</w:t>
+            </w:r>
+          </w:p>
+        </w:tc>
+        <w:tc>
+          <w:tcPr>
+            <w:tcW w:type="dxa" w:w="1410"/>
+            <w:tcMar>
+              <w:top w:w="80" w:type="dxa"/>
+              <w:start w:w="120" w:type="dxa"/>
+              <w:bottom w:w="80" w:type="dxa"/>
+              <w:end w:w="120" w:type="dxa"/>
+            </w:tcMar>
+            <w:vAlign w:val="center"/>
+            <w:shd w:fill="FFFFFF"/>
+          </w:tcPr>
+          <w:p>
+            <w:pPr>
+              <w:spacing w:before="0" w:after="40" w:line="252" w:lineRule="auto"/>
+              <w:jc w:val="left"/>
+            </w:pPr>
+            <w:r>
+              <w:rPr>
+                <w:rFonts w:ascii="Calibri" w:hAnsi="Calibri"/>
+                <w:b w:val="0"/>
+                <w:color w:val="111827"/>
+                <w:sz w:val="16"/>
+              </w:rPr>
+              <w:t>Recovered energy is positive and bounded</w:t>
+            </w:r>
+          </w:p>
+        </w:tc>
+      </w:tr>
+      <w:tr>
+        <w:trPr>
+          <w:cantSplit/>
+        </w:trPr>
+        <w:tc>
+          <w:tcPr>
+            <w:tcW w:type="dxa" w:w="1150"/>
+            <w:tcMar>
+              <w:top w:w="80" w:type="dxa"/>
+              <w:start w:w="120" w:type="dxa"/>
+              <w:bottom w:w="80" w:type="dxa"/>
+              <w:end w:w="120" w:type="dxa"/>
+            </w:tcMar>
+            <w:vAlign w:val="center"/>
+            <w:shd w:fill="FFFFFF"/>
+          </w:tcPr>
+          <w:p>
+            <w:pPr>
+              <w:spacing w:before="0" w:after="40" w:line="252" w:lineRule="auto"/>
+              <w:jc w:val="center"/>
+            </w:pPr>
+            <w:r>
+              <w:rPr>
+                <w:rFonts w:ascii="Calibri" w:hAnsi="Calibri"/>
+                <w:b w:val="0"/>
+                <w:color w:val="111827"/>
+                <w:sz w:val="16"/>
+              </w:rPr>
+              <w:t>EV-T-104</w:t>
+            </w:r>
+          </w:p>
+        </w:tc>
+        <w:tc>
+          <w:tcPr>
+            <w:tcW w:type="dxa" w:w="3700"/>
+            <w:tcMar>
+              <w:top w:w="80" w:type="dxa"/>
+              <w:start w:w="120" w:type="dxa"/>
+              <w:bottom w:w="80" w:type="dxa"/>
+              <w:end w:w="120" w:type="dxa"/>
+            </w:tcMar>
+            <w:vAlign w:val="center"/>
+            <w:shd w:fill="FFFFFF"/>
+          </w:tcPr>
+          <w:p>
+            <w:pPr>
+              <w:spacing w:before="0" w:after="40" w:line="252" w:lineRule="auto"/>
+              <w:jc w:val="left"/>
+            </w:pPr>
+            <w:r>
+              <w:rPr>
+                <w:rFonts w:ascii="Calibri" w:hAnsi="Calibri"/>
+                <w:b w:val="0"/>
+                <w:color w:val="111827"/>
+                <w:sz w:val="16"/>
+              </w:rPr>
+              <w:t>Battery reserve</w:t>
+            </w:r>
+          </w:p>
+        </w:tc>
+        <w:tc>
+          <w:tcPr>
+            <w:tcW w:type="dxa" w:w="3100"/>
+            <w:tcMar>
+              <w:top w:w="80" w:type="dxa"/>
+              <w:start w:w="120" w:type="dxa"/>
+              <w:bottom w:w="80" w:type="dxa"/>
+              <w:end w:w="120" w:type="dxa"/>
+            </w:tcMar>
+            <w:vAlign w:val="center"/>
+            <w:shd w:fill="FFFFFF"/>
+          </w:tcPr>
+          <w:p>
+            <w:pPr>
+              <w:spacing w:before="0" w:after="40" w:line="252" w:lineRule="auto"/>
+              <w:jc w:val="left"/>
+            </w:pPr>
+            <w:r>
+              <w:rPr>
+                <w:rFonts w:ascii="Calibri" w:hAnsi="Calibri"/>
+                <w:b w:val="0"/>
+                <w:color w:val="111827"/>
+                <w:sz w:val="16"/>
+              </w:rPr>
+              <w:t>Estimate at or below configured reserve SOC</w:t>
+            </w:r>
+          </w:p>
+        </w:tc>
+        <w:tc>
+          <w:tcPr>
+            <w:tcW w:type="dxa" w:w="1410"/>
+            <w:tcMar>
+              <w:top w:w="80" w:type="dxa"/>
+              <w:start w:w="120" w:type="dxa"/>
+              <w:bottom w:w="80" w:type="dxa"/>
+              <w:end w:w="120" w:type="dxa"/>
+            </w:tcMar>
+            <w:vAlign w:val="center"/>
+            <w:shd w:fill="FFFFFF"/>
+          </w:tcPr>
+          <w:p>
+            <w:pPr>
+              <w:spacing w:before="0" w:after="40" w:line="252" w:lineRule="auto"/>
+              <w:jc w:val="left"/>
+            </w:pPr>
+            <w:r>
+              <w:rPr>
+                <w:rFonts w:ascii="Calibri" w:hAnsi="Calibri"/>
+                <w:b w:val="0"/>
+                <w:color w:val="111827"/>
+                <w:sz w:val="16"/>
+              </w:rPr>
+              <w:t>Limited state and zero available energy</w:t>
+            </w:r>
+          </w:p>
+        </w:tc>
+      </w:tr>
+      <w:tr>
+        <w:trPr>
+          <w:cantSplit/>
+        </w:trPr>
+        <w:tc>
+          <w:tcPr>
+            <w:tcW w:type="dxa" w:w="1150"/>
+            <w:tcMar>
+              <w:top w:w="80" w:type="dxa"/>
+              <w:start w:w="120" w:type="dxa"/>
+              <w:bottom w:w="80" w:type="dxa"/>
+              <w:end w:w="120" w:type="dxa"/>
+            </w:tcMar>
+            <w:vAlign w:val="center"/>
+            <w:shd w:fill="FFFFFF"/>
+          </w:tcPr>
+          <w:p>
+            <w:pPr>
+              <w:spacing w:before="0" w:after="40" w:line="252" w:lineRule="auto"/>
+              <w:jc w:val="center"/>
+            </w:pPr>
+            <w:r>
+              <w:rPr>
+                <w:rFonts w:ascii="Calibri" w:hAnsi="Calibri"/>
+                <w:b w:val="0"/>
+                <w:color w:val="111827"/>
+                <w:sz w:val="16"/>
+              </w:rPr>
+              <w:t>EV-T-105</w:t>
+            </w:r>
+          </w:p>
+        </w:tc>
+        <w:tc>
+          <w:tcPr>
+            <w:tcW w:type="dxa" w:w="3700"/>
+            <w:tcMar>
+              <w:top w:w="80" w:type="dxa"/>
+              <w:start w:w="120" w:type="dxa"/>
+              <w:bottom w:w="80" w:type="dxa"/>
+              <w:end w:w="120" w:type="dxa"/>
+            </w:tcMar>
+            <w:vAlign w:val="center"/>
+            <w:shd w:fill="FFFFFF"/>
+          </w:tcPr>
+          <w:p>
+            <w:pPr>
+              <w:spacing w:before="0" w:after="40" w:line="252" w:lineRule="auto"/>
+              <w:jc w:val="left"/>
+            </w:pPr>
+            <w:r>
+              <w:rPr>
+                <w:rFonts w:ascii="Calibri" w:hAnsi="Calibri"/>
+                <w:b w:val="0"/>
+                <w:color w:val="111827"/>
+                <w:sz w:val="16"/>
+              </w:rPr>
+              <w:t>Insufficient distance</w:t>
+            </w:r>
+          </w:p>
+        </w:tc>
+        <w:tc>
+          <w:tcPr>
+            <w:tcW w:type="dxa" w:w="3100"/>
+            <w:tcMar>
+              <w:top w:w="80" w:type="dxa"/>
+              <w:start w:w="120" w:type="dxa"/>
+              <w:bottom w:w="80" w:type="dxa"/>
+              <w:end w:w="120" w:type="dxa"/>
+            </w:tcMar>
+            <w:vAlign w:val="center"/>
+            <w:shd w:fill="FFFFFF"/>
+          </w:tcPr>
+          <w:p>
+            <w:pPr>
+              <w:spacing w:before="0" w:after="40" w:line="252" w:lineRule="auto"/>
+              <w:jc w:val="left"/>
+            </w:pPr>
+            <w:r>
+              <w:rPr>
+                <w:rFonts w:ascii="Calibri" w:hAnsi="Calibri"/>
+                <w:b w:val="0"/>
+                <w:color w:val="111827"/>
+                <w:sz w:val="16"/>
+              </w:rPr>
+              <w:t>Execute a stationary cycle</w:t>
+            </w:r>
+          </w:p>
+        </w:tc>
+        <w:tc>
+          <w:tcPr>
+            <w:tcW w:type="dxa" w:w="1410"/>
+            <w:tcMar>
+              <w:top w:w="80" w:type="dxa"/>
+              <w:start w:w="120" w:type="dxa"/>
+              <w:bottom w:w="80" w:type="dxa"/>
+              <w:end w:w="120" w:type="dxa"/>
+            </w:tcMar>
+            <w:vAlign w:val="center"/>
+            <w:shd w:fill="FFFFFF"/>
+          </w:tcPr>
+          <w:p>
+            <w:pPr>
+              <w:spacing w:before="0" w:after="40" w:line="252" w:lineRule="auto"/>
+              <w:jc w:val="left"/>
+            </w:pPr>
+            <w:r>
+              <w:rPr>
+                <w:rFonts w:ascii="Calibri" w:hAnsi="Calibri"/>
+                <w:b w:val="0"/>
+                <w:color w:val="111827"/>
+                <w:sz w:val="16"/>
+              </w:rPr>
+              <w:t>Stable limited reason and no division by zero</w:t>
+            </w:r>
+          </w:p>
+        </w:tc>
+      </w:tr>
+      <w:tr>
+        <w:trPr>
+          <w:cantSplit/>
+        </w:trPr>
+        <w:tc>
+          <w:tcPr>
+            <w:tcW w:type="dxa" w:w="1150"/>
+            <w:tcMar>
+              <w:top w:w="80" w:type="dxa"/>
+              <w:start w:w="120" w:type="dxa"/>
+              <w:bottom w:w="80" w:type="dxa"/>
+              <w:end w:w="120" w:type="dxa"/>
+            </w:tcMar>
+            <w:vAlign w:val="center"/>
+            <w:shd w:fill="FFFFFF"/>
+          </w:tcPr>
+          <w:p>
+            <w:pPr>
+              <w:spacing w:before="0" w:after="40" w:line="252" w:lineRule="auto"/>
+              <w:jc w:val="center"/>
+            </w:pPr>
+            <w:r>
+              <w:rPr>
+                <w:rFonts w:ascii="Calibri" w:hAnsi="Calibri"/>
+                <w:b w:val="0"/>
+                <w:color w:val="111827"/>
+                <w:sz w:val="16"/>
+              </w:rPr>
+              <w:t>EV-T-106</w:t>
+            </w:r>
+          </w:p>
+        </w:tc>
+        <w:tc>
+          <w:tcPr>
+            <w:tcW w:type="dxa" w:w="3700"/>
+            <w:tcMar>
+              <w:top w:w="80" w:type="dxa"/>
+              <w:start w:w="120" w:type="dxa"/>
+              <w:bottom w:w="80" w:type="dxa"/>
+              <w:end w:w="120" w:type="dxa"/>
+            </w:tcMar>
+            <w:vAlign w:val="center"/>
+            <w:shd w:fill="FFFFFF"/>
+          </w:tcPr>
+          <w:p>
+            <w:pPr>
+              <w:spacing w:before="0" w:after="40" w:line="252" w:lineRule="auto"/>
+              <w:jc w:val="left"/>
+            </w:pPr>
+            <w:r>
+              <w:rPr>
+                <w:rFonts w:ascii="Calibri" w:hAnsi="Calibri"/>
+                <w:b w:val="0"/>
+                <w:color w:val="111827"/>
+                <w:sz w:val="16"/>
+              </w:rPr>
+              <w:t>Range exact replay</w:t>
+            </w:r>
+          </w:p>
+        </w:tc>
+        <w:tc>
+          <w:tcPr>
+            <w:tcW w:type="dxa" w:w="3100"/>
+            <w:tcMar>
+              <w:top w:w="80" w:type="dxa"/>
+              <w:start w:w="120" w:type="dxa"/>
+              <w:bottom w:w="80" w:type="dxa"/>
+              <w:end w:w="120" w:type="dxa"/>
+            </w:tcMar>
+            <w:vAlign w:val="center"/>
+            <w:shd w:fill="FFFFFF"/>
+          </w:tcPr>
+          <w:p>
+            <w:pPr>
+              <w:spacing w:before="0" w:after="40" w:line="252" w:lineRule="auto"/>
+              <w:jc w:val="left"/>
+            </w:pPr>
+            <w:r>
+              <w:rPr>
+                <w:rFonts w:ascii="Calibri" w:hAnsi="Calibri"/>
+                <w:b w:val="0"/>
+                <w:color w:val="111827"/>
+                <w:sz w:val="16"/>
+              </w:rPr>
+              <w:t>Retry an identical cycle command</w:t>
+            </w:r>
+          </w:p>
+        </w:tc>
+        <w:tc>
+          <w:tcPr>
+            <w:tcW w:type="dxa" w:w="1410"/>
+            <w:tcMar>
+              <w:top w:w="80" w:type="dxa"/>
+              <w:start w:w="120" w:type="dxa"/>
+              <w:bottom w:w="80" w:type="dxa"/>
+              <w:end w:w="120" w:type="dxa"/>
+            </w:tcMar>
+            <w:vAlign w:val="center"/>
+            <w:shd w:fill="FFFFFF"/>
+          </w:tcPr>
+          <w:p>
+            <w:pPr>
+              <w:spacing w:before="0" w:after="40" w:line="252" w:lineRule="auto"/>
+              <w:jc w:val="left"/>
+            </w:pPr>
+            <w:r>
+              <w:rPr>
+                <w:rFonts w:ascii="Calibri" w:hAnsi="Calibri"/>
+                <w:b w:val="0"/>
+                <w:color w:val="111827"/>
+                <w:sz w:val="16"/>
+              </w:rPr>
+              <w:t>Persisted snapshot and duplicate true</w:t>
+            </w:r>
+          </w:p>
+        </w:tc>
+      </w:tr>
+      <w:tr>
+        <w:trPr>
+          <w:cantSplit/>
+        </w:trPr>
+        <w:tc>
+          <w:tcPr>
+            <w:tcW w:type="dxa" w:w="1150"/>
+            <w:tcMar>
+              <w:top w:w="80" w:type="dxa"/>
+              <w:start w:w="120" w:type="dxa"/>
+              <w:bottom w:w="80" w:type="dxa"/>
+              <w:end w:w="120" w:type="dxa"/>
+            </w:tcMar>
+            <w:vAlign w:val="center"/>
+            <w:shd w:fill="FFFFFF"/>
+          </w:tcPr>
+          <w:p>
+            <w:pPr>
+              <w:spacing w:before="0" w:after="40" w:line="252" w:lineRule="auto"/>
+              <w:jc w:val="center"/>
+            </w:pPr>
+            <w:r>
+              <w:rPr>
+                <w:rFonts w:ascii="Calibri" w:hAnsi="Calibri"/>
+                <w:b w:val="0"/>
+                <w:color w:val="111827"/>
+                <w:sz w:val="16"/>
+              </w:rPr>
+              <w:t>EV-T-107</w:t>
+            </w:r>
+          </w:p>
+        </w:tc>
+        <w:tc>
+          <w:tcPr>
+            <w:tcW w:type="dxa" w:w="3700"/>
+            <w:tcMar>
+              <w:top w:w="80" w:type="dxa"/>
+              <w:start w:w="120" w:type="dxa"/>
+              <w:bottom w:w="80" w:type="dxa"/>
+              <w:end w:w="120" w:type="dxa"/>
+            </w:tcMar>
+            <w:vAlign w:val="center"/>
+            <w:shd w:fill="FFFFFF"/>
+          </w:tcPr>
+          <w:p>
+            <w:pPr>
+              <w:spacing w:before="0" w:after="40" w:line="252" w:lineRule="auto"/>
+              <w:jc w:val="left"/>
+            </w:pPr>
+            <w:r>
+              <w:rPr>
+                <w:rFonts w:ascii="Calibri" w:hAnsi="Calibri"/>
+                <w:b w:val="0"/>
+                <w:color w:val="111827"/>
+                <w:sz w:val="16"/>
+              </w:rPr>
+              <w:t>Range changed reuse</w:t>
+            </w:r>
+          </w:p>
+        </w:tc>
+        <w:tc>
+          <w:tcPr>
+            <w:tcW w:type="dxa" w:w="3100"/>
+            <w:tcMar>
+              <w:top w:w="80" w:type="dxa"/>
+              <w:start w:w="120" w:type="dxa"/>
+              <w:bottom w:w="80" w:type="dxa"/>
+              <w:end w:w="120" w:type="dxa"/>
+            </w:tcMar>
+            <w:vAlign w:val="center"/>
+            <w:shd w:fill="FFFFFF"/>
+          </w:tcPr>
+          <w:p>
+            <w:pPr>
+              <w:spacing w:before="0" w:after="40" w:line="252" w:lineRule="auto"/>
+              <w:jc w:val="left"/>
+            </w:pPr>
+            <w:r>
+              <w:rPr>
+                <w:rFonts w:ascii="Calibri" w:hAnsi="Calibri"/>
+                <w:b w:val="0"/>
+                <w:color w:val="111827"/>
+                <w:sz w:val="16"/>
+              </w:rPr>
+              <w:t>Reuse command ID with different input</w:t>
+            </w:r>
+          </w:p>
+        </w:tc>
+        <w:tc>
+          <w:tcPr>
+            <w:tcW w:type="dxa" w:w="1410"/>
+            <w:tcMar>
+              <w:top w:w="80" w:type="dxa"/>
+              <w:start w:w="120" w:type="dxa"/>
+              <w:bottom w:w="80" w:type="dxa"/>
+              <w:end w:w="120" w:type="dxa"/>
+            </w:tcMar>
+            <w:vAlign w:val="center"/>
+            <w:shd w:fill="FFFFFF"/>
+          </w:tcPr>
+          <w:p>
+            <w:pPr>
+              <w:spacing w:before="0" w:after="40" w:line="252" w:lineRule="auto"/>
+              <w:jc w:val="left"/>
+            </w:pPr>
+            <w:r>
+              <w:rPr>
+                <w:rFonts w:ascii="Calibri" w:hAnsi="Calibri"/>
+                <w:b w:val="0"/>
+                <w:color w:val="111827"/>
+                <w:sz w:val="16"/>
+              </w:rPr>
+              <w:t>Stable command conflict</w:t>
+            </w:r>
+          </w:p>
+        </w:tc>
+      </w:tr>
+      <w:tr>
+        <w:trPr>
+          <w:cantSplit/>
+        </w:trPr>
+        <w:tc>
+          <w:tcPr>
+            <w:tcW w:type="dxa" w:w="1150"/>
+            <w:tcMar>
+              <w:top w:w="80" w:type="dxa"/>
+              <w:start w:w="120" w:type="dxa"/>
+              <w:bottom w:w="80" w:type="dxa"/>
+              <w:end w:w="120" w:type="dxa"/>
+            </w:tcMar>
+            <w:vAlign w:val="center"/>
+            <w:shd w:fill="FFFFFF"/>
+          </w:tcPr>
+          <w:p>
+            <w:pPr>
+              <w:spacing w:before="0" w:after="40" w:line="252" w:lineRule="auto"/>
+              <w:jc w:val="center"/>
+            </w:pPr>
+            <w:r>
+              <w:rPr>
+                <w:rFonts w:ascii="Calibri" w:hAnsi="Calibri"/>
+                <w:b w:val="0"/>
+                <w:color w:val="111827"/>
+                <w:sz w:val="16"/>
+              </w:rPr>
+              <w:t>EV-T-108</w:t>
+            </w:r>
+          </w:p>
+        </w:tc>
+        <w:tc>
+          <w:tcPr>
+            <w:tcW w:type="dxa" w:w="3700"/>
+            <w:tcMar>
+              <w:top w:w="80" w:type="dxa"/>
+              <w:start w:w="120" w:type="dxa"/>
+              <w:bottom w:w="80" w:type="dxa"/>
+              <w:end w:w="120" w:type="dxa"/>
+            </w:tcMar>
+            <w:vAlign w:val="center"/>
+            <w:shd w:fill="FFFFFF"/>
+          </w:tcPr>
+          <w:p>
+            <w:pPr>
+              <w:spacing w:before="0" w:after="40" w:line="252" w:lineRule="auto"/>
+              <w:jc w:val="left"/>
+            </w:pPr>
+            <w:r>
+              <w:rPr>
+                <w:rFonts w:ascii="Calibri" w:hAnsi="Calibri"/>
+                <w:b w:val="0"/>
+                <w:color w:val="111827"/>
+                <w:sz w:val="16"/>
+              </w:rPr>
+              <w:t>Triple version conflicts</w:t>
+            </w:r>
+          </w:p>
+        </w:tc>
+        <w:tc>
+          <w:tcPr>
+            <w:tcW w:type="dxa" w:w="3100"/>
+            <w:tcMar>
+              <w:top w:w="80" w:type="dxa"/>
+              <w:start w:w="120" w:type="dxa"/>
+              <w:bottom w:w="80" w:type="dxa"/>
+              <w:end w:w="120" w:type="dxa"/>
+            </w:tcMar>
+            <w:vAlign w:val="center"/>
+            <w:shd w:fill="FFFFFF"/>
+          </w:tcPr>
+          <w:p>
+            <w:pPr>
+              <w:spacing w:before="0" w:after="40" w:line="252" w:lineRule="auto"/>
+              <w:jc w:val="left"/>
+            </w:pPr>
+            <w:r>
+              <w:rPr>
+                <w:rFonts w:ascii="Calibri" w:hAnsi="Calibri"/>
+                <w:b w:val="0"/>
+                <w:color w:val="111827"/>
+                <w:sz w:val="16"/>
+              </w:rPr>
+              <w:t>Submit stale range, battery, or thermal version</w:t>
+            </w:r>
+          </w:p>
+        </w:tc>
+        <w:tc>
+          <w:tcPr>
+            <w:tcW w:type="dxa" w:w="1410"/>
+            <w:tcMar>
+              <w:top w:w="80" w:type="dxa"/>
+              <w:start w:w="120" w:type="dxa"/>
+              <w:bottom w:w="80" w:type="dxa"/>
+              <w:end w:w="120" w:type="dxa"/>
+            </w:tcMar>
+            <w:vAlign w:val="center"/>
+            <w:shd w:fill="FFFFFF"/>
+          </w:tcPr>
+          <w:p>
+            <w:pPr>
+              <w:spacing w:before="0" w:after="40" w:line="252" w:lineRule="auto"/>
+              <w:jc w:val="left"/>
+            </w:pPr>
+            <w:r>
+              <w:rPr>
+                <w:rFonts w:ascii="Calibri" w:hAnsi="Calibri"/>
+                <w:b w:val="0"/>
+                <w:color w:val="111827"/>
+                <w:sz w:val="16"/>
+              </w:rPr>
+              <w:t>Distinct current version returned</w:t>
+            </w:r>
+          </w:p>
+        </w:tc>
+      </w:tr>
+      <w:tr>
+        <w:trPr>
+          <w:cantSplit/>
+        </w:trPr>
+        <w:tc>
+          <w:tcPr>
+            <w:tcW w:type="dxa" w:w="1150"/>
+            <w:tcMar>
+              <w:top w:w="80" w:type="dxa"/>
+              <w:start w:w="120" w:type="dxa"/>
+              <w:bottom w:w="80" w:type="dxa"/>
+              <w:end w:w="120" w:type="dxa"/>
+            </w:tcMar>
+            <w:vAlign w:val="center"/>
+            <w:shd w:fill="FFFFFF"/>
+          </w:tcPr>
+          <w:p>
+            <w:pPr>
+              <w:spacing w:before="0" w:after="40" w:line="252" w:lineRule="auto"/>
+              <w:jc w:val="center"/>
+            </w:pPr>
+            <w:r>
+              <w:rPr>
+                <w:rFonts w:ascii="Calibri" w:hAnsi="Calibri"/>
+                <w:b w:val="0"/>
+                <w:color w:val="111827"/>
+                <w:sz w:val="16"/>
+              </w:rPr>
+              <w:t>EV-T-109</w:t>
+            </w:r>
+          </w:p>
+        </w:tc>
+        <w:tc>
+          <w:tcPr>
+            <w:tcW w:type="dxa" w:w="3700"/>
+            <w:tcMar>
+              <w:top w:w="80" w:type="dxa"/>
+              <w:start w:w="120" w:type="dxa"/>
+              <w:bottom w:w="80" w:type="dxa"/>
+              <w:end w:w="120" w:type="dxa"/>
+            </w:tcMar>
+            <w:vAlign w:val="center"/>
+            <w:shd w:fill="FFFFFF"/>
+          </w:tcPr>
+          <w:p>
+            <w:pPr>
+              <w:spacing w:before="0" w:after="40" w:line="252" w:lineRule="auto"/>
+              <w:jc w:val="left"/>
+            </w:pPr>
+            <w:r>
+              <w:rPr>
+                <w:rFonts w:ascii="Calibri" w:hAnsi="Calibri"/>
+                <w:b w:val="0"/>
+                <w:color w:val="111827"/>
+                <w:sz w:val="16"/>
+              </w:rPr>
+              <w:t>Range atomic evidence</w:t>
+            </w:r>
+          </w:p>
+        </w:tc>
+        <w:tc>
+          <w:tcPr>
+            <w:tcW w:type="dxa" w:w="3100"/>
+            <w:tcMar>
+              <w:top w:w="80" w:type="dxa"/>
+              <w:start w:w="120" w:type="dxa"/>
+              <w:bottom w:w="80" w:type="dxa"/>
+              <w:end w:w="120" w:type="dxa"/>
+            </w:tcMar>
+            <w:vAlign w:val="center"/>
+            <w:shd w:fill="FFFFFF"/>
+          </w:tcPr>
+          <w:p>
+            <w:pPr>
+              <w:spacing w:before="0" w:after="40" w:line="252" w:lineRule="auto"/>
+              <w:jc w:val="left"/>
+            </w:pPr>
+            <w:r>
+              <w:rPr>
+                <w:rFonts w:ascii="Calibri" w:hAnsi="Calibri"/>
+                <w:b w:val="0"/>
+                <w:color w:val="111827"/>
+                <w:sz w:val="16"/>
+              </w:rPr>
+              <w:t>Inspect estimator, step, audit, and outbox</w:t>
+            </w:r>
+          </w:p>
+        </w:tc>
+        <w:tc>
+          <w:tcPr>
+            <w:tcW w:type="dxa" w:w="1410"/>
+            <w:tcMar>
+              <w:top w:w="80" w:type="dxa"/>
+              <w:start w:w="120" w:type="dxa"/>
+              <w:bottom w:w="80" w:type="dxa"/>
+              <w:end w:w="120" w:type="dxa"/>
+            </w:tcMar>
+            <w:vAlign w:val="center"/>
+            <w:shd w:fill="FFFFFF"/>
+          </w:tcPr>
+          <w:p>
+            <w:pPr>
+              <w:spacing w:before="0" w:after="40" w:line="252" w:lineRule="auto"/>
+              <w:jc w:val="left"/>
+            </w:pPr>
+            <w:r>
+              <w:rPr>
+                <w:rFonts w:ascii="Calibri" w:hAnsi="Calibri"/>
+                <w:b w:val="0"/>
+                <w:color w:val="111827"/>
+                <w:sz w:val="16"/>
+              </w:rPr>
+              <w:t>All commit or all roll back</w:t>
+            </w:r>
+          </w:p>
+        </w:tc>
+      </w:tr>
+      <w:tr>
+        <w:trPr>
+          <w:cantSplit/>
+        </w:trPr>
+        <w:tc>
+          <w:tcPr>
+            <w:tcW w:type="dxa" w:w="1150"/>
+            <w:tcMar>
+              <w:top w:w="80" w:type="dxa"/>
+              <w:start w:w="120" w:type="dxa"/>
+              <w:bottom w:w="80" w:type="dxa"/>
+              <w:end w:w="120" w:type="dxa"/>
+            </w:tcMar>
+            <w:vAlign w:val="center"/>
+            <w:shd w:fill="FFFFFF"/>
+          </w:tcPr>
+          <w:p>
+            <w:pPr>
+              <w:spacing w:before="0" w:after="40" w:line="252" w:lineRule="auto"/>
+              <w:jc w:val="center"/>
+            </w:pPr>
+            <w:r>
+              <w:rPr>
+                <w:rFonts w:ascii="Calibri" w:hAnsi="Calibri"/>
+                <w:b w:val="0"/>
+                <w:color w:val="111827"/>
+                <w:sz w:val="16"/>
+              </w:rPr>
+              <w:t>EV-T-110</w:t>
+            </w:r>
+          </w:p>
+        </w:tc>
+        <w:tc>
+          <w:tcPr>
+            <w:tcW w:type="dxa" w:w="3700"/>
+            <w:tcMar>
+              <w:top w:w="80" w:type="dxa"/>
+              <w:start w:w="120" w:type="dxa"/>
+              <w:bottom w:w="80" w:type="dxa"/>
+              <w:end w:w="120" w:type="dxa"/>
+            </w:tcMar>
+            <w:vAlign w:val="center"/>
+            <w:shd w:fill="FFFFFF"/>
+          </w:tcPr>
+          <w:p>
+            <w:pPr>
+              <w:spacing w:before="0" w:after="40" w:line="252" w:lineRule="auto"/>
+              <w:jc w:val="left"/>
+            </w:pPr>
+            <w:r>
+              <w:rPr>
+                <w:rFonts w:ascii="Calibri" w:hAnsi="Calibri"/>
+                <w:b w:val="0"/>
+                <w:color w:val="111827"/>
+                <w:sz w:val="16"/>
+              </w:rPr>
+              <w:t>Range OpenAPI and migration</w:t>
+            </w:r>
+          </w:p>
+        </w:tc>
+        <w:tc>
+          <w:tcPr>
+            <w:tcW w:type="dxa" w:w="3100"/>
+            <w:tcMar>
+              <w:top w:w="80" w:type="dxa"/>
+              <w:start w:w="120" w:type="dxa"/>
+              <w:bottom w:w="80" w:type="dxa"/>
+              <w:end w:w="120" w:type="dxa"/>
+            </w:tcMar>
+            <w:vAlign w:val="center"/>
+            <w:shd w:fill="FFFFFF"/>
+          </w:tcPr>
+          <w:p>
+            <w:pPr>
+              <w:spacing w:before="0" w:after="40" w:line="252" w:lineRule="auto"/>
+              <w:jc w:val="left"/>
+            </w:pPr>
+            <w:r>
+              <w:rPr>
+                <w:rFonts w:ascii="Calibri" w:hAnsi="Calibri"/>
+                <w:b w:val="0"/>
+                <w:color w:val="111827"/>
+                <w:sz w:val="16"/>
+              </w:rPr>
+              <w:t>Inspect routes and revision 0042</w:t>
             </w:r>
           </w:p>
         </w:tc>
@@ -21595,7 +24591,7 @@
                 <w:color w:val="0B2545"/>
                 <w:sz w:val="17"/>
               </w:rPr>
-              <w:t>VI-1 through VI-5 evidence</w:t>
+              <w:t>VI-1 through VI-6 evidence</w:t>
             </w:r>
           </w:p>
         </w:tc>
@@ -21656,7 +24652,7 @@
                 <w:color w:val="111827"/>
                 <w:sz w:val="17"/>
               </w:rPr>
-              <w:t>Battery/BMS, propulsion, braking, charging, thermal zones, faults, replay, conflicts</w:t>
+              <w:t>Battery/BMS, propulsion, braking, charging, thermal zones, drive-cycle range, faults, replay, conflicts</w:t>
             </w:r>
           </w:p>
         </w:tc>
@@ -22861,7 +25857,7 @@
                 <w:color w:val="111827"/>
                 <w:sz w:val="17"/>
               </w:rPr>
-              <w:t>Couple energy flow in VI-6/VI-7 scenarios</w:t>
+              <w:t>Couple energy flow in VI-7 scenarios</w:t>
             </w:r>
           </w:p>
         </w:tc>
@@ -23396,6 +26392,273 @@
                 <w:sz w:val="17"/>
               </w:rPr>
               <w:t>Add protocol adapters after core session behavior stabilizes</w:t>
+            </w:r>
+          </w:p>
+        </w:tc>
+      </w:tr>
+      <w:tr>
+        <w:trPr>
+          <w:cantSplit/>
+        </w:trPr>
+        <w:tc>
+          <w:tcPr>
+            <w:tcW w:type="dxa" w:w="1650"/>
+            <w:tcMar>
+              <w:top w:w="80" w:type="dxa"/>
+              <w:start w:w="120" w:type="dxa"/>
+              <w:bottom w:w="80" w:type="dxa"/>
+              <w:end w:w="120" w:type="dxa"/>
+            </w:tcMar>
+            <w:vAlign w:val="center"/>
+            <w:shd w:fill="FFFFFF"/>
+          </w:tcPr>
+          <w:p>
+            <w:pPr>
+              <w:spacing w:before="0" w:after="40" w:line="252" w:lineRule="auto"/>
+              <w:jc w:val="center"/>
+            </w:pPr>
+            <w:r>
+              <w:rPr>
+                <w:rFonts w:ascii="Calibri" w:hAnsi="Calibri"/>
+                <w:b w:val="0"/>
+                <w:color w:val="111827"/>
+                <w:sz w:val="17"/>
+              </w:rPr>
+              <w:t>Quasi-static drive-cycle segments</w:t>
+            </w:r>
+          </w:p>
+        </w:tc>
+        <w:tc>
+          <w:tcPr>
+            <w:tcW w:type="dxa" w:w="4450"/>
+            <w:tcMar>
+              <w:top w:w="80" w:type="dxa"/>
+              <w:start w:w="120" w:type="dxa"/>
+              <w:bottom w:w="80" w:type="dxa"/>
+              <w:end w:w="120" w:type="dxa"/>
+            </w:tcMar>
+            <w:vAlign w:val="center"/>
+            <w:shd w:fill="FFFFFF"/>
+          </w:tcPr>
+          <w:p>
+            <w:pPr>
+              <w:spacing w:before="0" w:after="40" w:line="252" w:lineRule="auto"/>
+              <w:jc w:val="left"/>
+            </w:pPr>
+            <w:r>
+              <w:rPr>
+                <w:rFonts w:ascii="Calibri" w:hAnsi="Calibri"/>
+                <w:b w:val="0"/>
+                <w:color w:val="111827"/>
+                <w:sz w:val="17"/>
+              </w:rPr>
+              <w:t>Transient chassis dynamics are simplified</w:t>
+            </w:r>
+          </w:p>
+        </w:tc>
+        <w:tc>
+          <w:tcPr>
+            <w:tcW w:type="dxa" w:w="3260"/>
+            <w:tcMar>
+              <w:top w:w="80" w:type="dxa"/>
+              <w:start w:w="120" w:type="dxa"/>
+              <w:bottom w:w="80" w:type="dxa"/>
+              <w:end w:w="120" w:type="dxa"/>
+            </w:tcMar>
+            <w:vAlign w:val="center"/>
+            <w:shd w:fill="FFFFFF"/>
+          </w:tcPr>
+          <w:p>
+            <w:pPr>
+              <w:spacing w:before="0" w:after="40" w:line="252" w:lineRule="auto"/>
+              <w:jc w:val="left"/>
+            </w:pPr>
+            <w:r>
+              <w:rPr>
+                <w:rFonts w:ascii="Calibri" w:hAnsi="Calibri"/>
+                <w:b w:val="0"/>
+                <w:color w:val="111827"/>
+                <w:sz w:val="17"/>
+              </w:rPr>
+              <w:t>Couple range estimation to Volume II dynamics in VI-7</w:t>
+            </w:r>
+          </w:p>
+        </w:tc>
+      </w:tr>
+      <w:tr>
+        <w:trPr>
+          <w:cantSplit/>
+        </w:trPr>
+        <w:tc>
+          <w:tcPr>
+            <w:tcW w:type="dxa" w:w="1650"/>
+            <w:tcMar>
+              <w:top w:w="80" w:type="dxa"/>
+              <w:start w:w="120" w:type="dxa"/>
+              <w:bottom w:w="80" w:type="dxa"/>
+              <w:end w:w="120" w:type="dxa"/>
+            </w:tcMar>
+            <w:vAlign w:val="center"/>
+            <w:shd w:fill="FFFFFF"/>
+          </w:tcPr>
+          <w:p>
+            <w:pPr>
+              <w:spacing w:before="0" w:after="40" w:line="252" w:lineRule="auto"/>
+              <w:jc w:val="center"/>
+            </w:pPr>
+            <w:r>
+              <w:rPr>
+                <w:rFonts w:ascii="Calibri" w:hAnsi="Calibri"/>
+                <w:b w:val="0"/>
+                <w:color w:val="111827"/>
+                <w:sz w:val="17"/>
+              </w:rPr>
+              <w:t>Fixed air density and calibration</w:t>
+            </w:r>
+          </w:p>
+        </w:tc>
+        <w:tc>
+          <w:tcPr>
+            <w:tcW w:type="dxa" w:w="4450"/>
+            <w:tcMar>
+              <w:top w:w="80" w:type="dxa"/>
+              <w:start w:w="120" w:type="dxa"/>
+              <w:bottom w:w="80" w:type="dxa"/>
+              <w:end w:w="120" w:type="dxa"/>
+            </w:tcMar>
+            <w:vAlign w:val="center"/>
+            <w:shd w:fill="FFFFFF"/>
+          </w:tcPr>
+          <w:p>
+            <w:pPr>
+              <w:spacing w:before="0" w:after="40" w:line="252" w:lineRule="auto"/>
+              <w:jc w:val="left"/>
+            </w:pPr>
+            <w:r>
+              <w:rPr>
+                <w:rFonts w:ascii="Calibri" w:hAnsi="Calibri"/>
+                <w:b w:val="0"/>
+                <w:color w:val="111827"/>
+                <w:sz w:val="17"/>
+              </w:rPr>
+              <w:t>Weather and vehicle variants are approximate</w:t>
+            </w:r>
+          </w:p>
+        </w:tc>
+        <w:tc>
+          <w:tcPr>
+            <w:tcW w:type="dxa" w:w="3260"/>
+            <w:tcMar>
+              <w:top w:w="80" w:type="dxa"/>
+              <w:start w:w="120" w:type="dxa"/>
+              <w:bottom w:w="80" w:type="dxa"/>
+              <w:end w:w="120" w:type="dxa"/>
+            </w:tcMar>
+            <w:vAlign w:val="center"/>
+            <w:shd w:fill="FFFFFF"/>
+          </w:tcPr>
+          <w:p>
+            <w:pPr>
+              <w:spacing w:before="0" w:after="40" w:line="252" w:lineRule="auto"/>
+              <w:jc w:val="left"/>
+            </w:pPr>
+            <w:r>
+              <w:rPr>
+                <w:rFonts w:ascii="Calibri" w:hAnsi="Calibri"/>
+                <w:b w:val="0"/>
+                <w:color w:val="111827"/>
+                <w:sz w:val="17"/>
+              </w:rPr>
+              <w:t>Add versioned environment and vehicle calibration profiles</w:t>
+            </w:r>
+          </w:p>
+        </w:tc>
+      </w:tr>
+      <w:tr>
+        <w:trPr>
+          <w:cantSplit/>
+        </w:trPr>
+        <w:tc>
+          <w:tcPr>
+            <w:tcW w:type="dxa" w:w="1650"/>
+            <w:tcMar>
+              <w:top w:w="80" w:type="dxa"/>
+              <w:start w:w="120" w:type="dxa"/>
+              <w:bottom w:w="80" w:type="dxa"/>
+              <w:end w:w="120" w:type="dxa"/>
+            </w:tcMar>
+            <w:vAlign w:val="center"/>
+            <w:shd w:fill="FFFFFF"/>
+          </w:tcPr>
+          <w:p>
+            <w:pPr>
+              <w:spacing w:before="0" w:after="40" w:line="252" w:lineRule="auto"/>
+              <w:jc w:val="center"/>
+            </w:pPr>
+            <w:r>
+              <w:rPr>
+                <w:rFonts w:ascii="Calibri" w:hAnsi="Calibri"/>
+                <w:b w:val="0"/>
+                <w:color w:val="111827"/>
+                <w:sz w:val="17"/>
+              </w:rPr>
+              <w:t>Range cycle does not debit battery SOC</w:t>
+            </w:r>
+          </w:p>
+        </w:tc>
+        <w:tc>
+          <w:tcPr>
+            <w:tcW w:type="dxa" w:w="4450"/>
+            <w:tcMar>
+              <w:top w:w="80" w:type="dxa"/>
+              <w:start w:w="120" w:type="dxa"/>
+              <w:bottom w:w="80" w:type="dxa"/>
+              <w:end w:w="120" w:type="dxa"/>
+            </w:tcMar>
+            <w:vAlign w:val="center"/>
+            <w:shd w:fill="FFFFFF"/>
+          </w:tcPr>
+          <w:p>
+            <w:pPr>
+              <w:spacing w:before="0" w:after="40" w:line="252" w:lineRule="auto"/>
+              <w:jc w:val="left"/>
+            </w:pPr>
+            <w:r>
+              <w:rPr>
+                <w:rFonts w:ascii="Calibri" w:hAnsi="Calibri"/>
+                <w:b w:val="0"/>
+                <w:color w:val="111827"/>
+                <w:sz w:val="17"/>
+              </w:rPr>
+              <w:t>Repeated estimates are analytical rather than stateful trips</w:t>
+            </w:r>
+          </w:p>
+        </w:tc>
+        <w:tc>
+          <w:tcPr>
+            <w:tcW w:type="dxa" w:w="3260"/>
+            <w:tcMar>
+              <w:top w:w="80" w:type="dxa"/>
+              <w:start w:w="120" w:type="dxa"/>
+              <w:bottom w:w="80" w:type="dxa"/>
+              <w:end w:w="120" w:type="dxa"/>
+            </w:tcMar>
+            <w:vAlign w:val="center"/>
+            <w:shd w:fill="FFFFFF"/>
+          </w:tcPr>
+          <w:p>
+            <w:pPr>
+              <w:spacing w:before="0" w:after="40" w:line="252" w:lineRule="auto"/>
+              <w:jc w:val="left"/>
+            </w:pPr>
+            <w:r>
+              <w:rPr>
+                <w:rFonts w:ascii="Calibri" w:hAnsi="Calibri"/>
+                <w:b w:val="0"/>
+                <w:color w:val="111827"/>
+                <w:sz w:val="17"/>
+              </w:rPr>
+              <w:t>Apply energy through cross-domain scenarios in VI-7</w:t>
             </w:r>
           </w:p>
         </w:tc>
@@ -23421,7 +26684,7 @@
         <w:pStyle w:val="ListNumber"/>
         <w:numPr>
           <w:ilvl w:val="0"/>
-          <w:numId w:val="26"/>
+          <w:numId w:val="28"/>
         </w:numPr>
         <w:spacing w:after="120"/>
       </w:pPr>
@@ -23439,7 +26702,7 @@
         <w:pStyle w:val="ListNumber"/>
         <w:numPr>
           <w:ilvl w:val="0"/>
-          <w:numId w:val="26"/>
+          <w:numId w:val="28"/>
         </w:numPr>
         <w:spacing w:after="120"/>
       </w:pPr>
@@ -23457,7 +26720,7 @@
         <w:pStyle w:val="ListNumber"/>
         <w:numPr>
           <w:ilvl w:val="0"/>
-          <w:numId w:val="26"/>
+          <w:numId w:val="28"/>
         </w:numPr>
         <w:spacing w:after="120"/>
       </w:pPr>
@@ -23475,7 +26738,7 @@
         <w:pStyle w:val="ListNumber"/>
         <w:numPr>
           <w:ilvl w:val="0"/>
-          <w:numId w:val="26"/>
+          <w:numId w:val="28"/>
         </w:numPr>
         <w:spacing w:after="120"/>
       </w:pPr>
@@ -23493,7 +26756,7 @@
         <w:pStyle w:val="ListNumber"/>
         <w:numPr>
           <w:ilvl w:val="0"/>
-          <w:numId w:val="26"/>
+          <w:numId w:val="28"/>
         </w:numPr>
         <w:spacing w:after="120"/>
       </w:pPr>
@@ -23511,7 +26774,7 @@
         <w:pStyle w:val="ListNumber"/>
         <w:numPr>
           <w:ilvl w:val="0"/>
-          <w:numId w:val="26"/>
+          <w:numId w:val="28"/>
         </w:numPr>
         <w:spacing w:after="120"/>
       </w:pPr>
@@ -23529,7 +26792,7 @@
         <w:pStyle w:val="ListNumber"/>
         <w:numPr>
           <w:ilvl w:val="0"/>
-          <w:numId w:val="26"/>
+          <w:numId w:val="28"/>
         </w:numPr>
         <w:spacing w:after="120"/>
       </w:pPr>
@@ -23547,7 +26810,7 @@
         <w:pStyle w:val="ListNumber"/>
         <w:numPr>
           <w:ilvl w:val="0"/>
-          <w:numId w:val="26"/>
+          <w:numId w:val="28"/>
         </w:numPr>
         <w:spacing w:after="120"/>
       </w:pPr>
@@ -23565,7 +26828,7 @@
         <w:pStyle w:val="ListNumber"/>
         <w:numPr>
           <w:ilvl w:val="0"/>
-          <w:numId w:val="26"/>
+          <w:numId w:val="28"/>
         </w:numPr>
         <w:spacing w:after="120"/>
       </w:pPr>
@@ -23583,7 +26846,7 @@
         <w:pStyle w:val="ListNumber"/>
         <w:numPr>
           <w:ilvl w:val="0"/>
-          <w:numId w:val="26"/>
+          <w:numId w:val="28"/>
         </w:numPr>
         <w:spacing w:after="120"/>
       </w:pPr>
@@ -23601,7 +26864,7 @@
         <w:pStyle w:val="ListNumber"/>
         <w:numPr>
           <w:ilvl w:val="0"/>
-          <w:numId w:val="26"/>
+          <w:numId w:val="28"/>
         </w:numPr>
         <w:spacing w:after="120"/>
       </w:pPr>
@@ -23619,7 +26882,7 @@
         <w:pStyle w:val="ListNumber"/>
         <w:numPr>
           <w:ilvl w:val="0"/>
-          <w:numId w:val="26"/>
+          <w:numId w:val="28"/>
         </w:numPr>
         <w:spacing w:after="120"/>
       </w:pPr>
@@ -23637,7 +26900,7 @@
         <w:pStyle w:val="ListNumber"/>
         <w:numPr>
           <w:ilvl w:val="0"/>
-          <w:numId w:val="26"/>
+          <w:numId w:val="28"/>
         </w:numPr>
         <w:spacing w:after="120"/>
       </w:pPr>
@@ -23655,7 +26918,7 @@
         <w:pStyle w:val="ListNumber"/>
         <w:numPr>
           <w:ilvl w:val="0"/>
-          <w:numId w:val="26"/>
+          <w:numId w:val="28"/>
         </w:numPr>
         <w:spacing w:after="120"/>
       </w:pPr>
@@ -23673,7 +26936,7 @@
         <w:pStyle w:val="ListNumber"/>
         <w:numPr>
           <w:ilvl w:val="0"/>
-          <w:numId w:val="26"/>
+          <w:numId w:val="28"/>
         </w:numPr>
         <w:spacing w:after="120"/>
       </w:pPr>
@@ -23691,7 +26954,7 @@
         <w:pStyle w:val="ListNumber"/>
         <w:numPr>
           <w:ilvl w:val="0"/>
-          <w:numId w:val="26"/>
+          <w:numId w:val="28"/>
         </w:numPr>
         <w:spacing w:after="120"/>
       </w:pPr>
@@ -23709,7 +26972,7 @@
         <w:pStyle w:val="ListNumber"/>
         <w:numPr>
           <w:ilvl w:val="0"/>
-          <w:numId w:val="26"/>
+          <w:numId w:val="28"/>
         </w:numPr>
         <w:spacing w:after="120"/>
       </w:pPr>
@@ -23727,7 +26990,7 @@
         <w:pStyle w:val="ListNumber"/>
         <w:numPr>
           <w:ilvl w:val="0"/>
-          <w:numId w:val="26"/>
+          <w:numId w:val="28"/>
         </w:numPr>
         <w:spacing w:after="120"/>
       </w:pPr>
@@ -23745,7 +27008,7 @@
         <w:pStyle w:val="ListNumber"/>
         <w:numPr>
           <w:ilvl w:val="0"/>
-          <w:numId w:val="26"/>
+          <w:numId w:val="28"/>
         </w:numPr>
         <w:spacing w:after="120"/>
       </w:pPr>
@@ -23763,7 +27026,7 @@
         <w:pStyle w:val="ListNumber"/>
         <w:numPr>
           <w:ilvl w:val="0"/>
-          <w:numId w:val="26"/>
+          <w:numId w:val="28"/>
         </w:numPr>
         <w:spacing w:after="120"/>
       </w:pPr>
@@ -23781,7 +27044,7 @@
         <w:pStyle w:val="ListNumber"/>
         <w:numPr>
           <w:ilvl w:val="0"/>
-          <w:numId w:val="26"/>
+          <w:numId w:val="28"/>
         </w:numPr>
         <w:spacing w:after="120"/>
       </w:pPr>
@@ -23799,7 +27062,7 @@
         <w:pStyle w:val="ListNumber"/>
         <w:numPr>
           <w:ilvl w:val="0"/>
-          <w:numId w:val="26"/>
+          <w:numId w:val="28"/>
         </w:numPr>
         <w:spacing w:after="120"/>
       </w:pPr>
@@ -23817,7 +27080,7 @@
         <w:pStyle w:val="ListNumber"/>
         <w:numPr>
           <w:ilvl w:val="0"/>
-          <w:numId w:val="26"/>
+          <w:numId w:val="28"/>
         </w:numPr>
         <w:spacing w:after="120"/>
       </w:pPr>
@@ -23835,7 +27098,7 @@
         <w:pStyle w:val="ListNumber"/>
         <w:numPr>
           <w:ilvl w:val="0"/>
-          <w:numId w:val="26"/>
+          <w:numId w:val="28"/>
         </w:numPr>
         <w:spacing w:after="120"/>
       </w:pPr>
@@ -23853,7 +27116,7 @@
         <w:pStyle w:val="ListNumber"/>
         <w:numPr>
           <w:ilvl w:val="0"/>
-          <w:numId w:val="26"/>
+          <w:numId w:val="28"/>
         </w:numPr>
         <w:spacing w:after="120"/>
       </w:pPr>
@@ -23868,12 +27131,102 @@
     </w:p>
     <w:p>
       <w:pPr>
+        <w:pStyle w:val="ListNumber"/>
+        <w:numPr>
+          <w:ilvl w:val="0"/>
+          <w:numId w:val="28"/>
+        </w:numPr>
+        <w:spacing w:after="120"/>
+      </w:pPr>
+      <w:r>
+        <w:rPr>
+          <w:rFonts w:ascii="Calibri" w:hAnsi="Calibri"/>
+          <w:color w:val="111827"/>
+          <w:sz w:val="22"/>
+        </w:rPr>
+        <w:t>Run equal urban and highway cycles and explain the aerodynamic consumption difference.</w:t>
+      </w:r>
+    </w:p>
+    <w:p>
+      <w:pPr>
+        <w:pStyle w:val="ListNumber"/>
+        <w:numPr>
+          <w:ilvl w:val="0"/>
+          <w:numId w:val="28"/>
+        </w:numPr>
+        <w:spacing w:after="120"/>
+      </w:pPr>
+      <w:r>
+        <w:rPr>
+          <w:rFonts w:ascii="Calibri" w:hAnsi="Calibri"/>
+          <w:color w:val="111827"/>
+          <w:sz w:val="22"/>
+        </w:rPr>
+        <w:t>Increase thermal auxiliary demand and verify that estimated range decreases.</w:t>
+      </w:r>
+    </w:p>
+    <w:p>
+      <w:pPr>
+        <w:pStyle w:val="ListNumber"/>
+        <w:numPr>
+          <w:ilvl w:val="0"/>
+          <w:numId w:val="28"/>
+        </w:numPr>
+        <w:spacing w:after="120"/>
+      </w:pPr>
+      <w:r>
+        <w:rPr>
+          <w:rFonts w:ascii="Calibri" w:hAnsi="Calibri"/>
+          <w:color w:val="111827"/>
+          <w:sz w:val="22"/>
+        </w:rPr>
+        <w:t>Add a downhill deceleration segment and inspect recovered energy.</w:t>
+      </w:r>
+    </w:p>
+    <w:p>
+      <w:pPr>
+        <w:pStyle w:val="ListNumber"/>
+        <w:numPr>
+          <w:ilvl w:val="0"/>
+          <w:numId w:val="28"/>
+        </w:numPr>
+        <w:spacing w:after="120"/>
+      </w:pPr>
+      <w:r>
+        <w:rPr>
+          <w:rFonts w:ascii="Calibri" w:hAnsi="Calibri"/>
+          <w:color w:val="111827"/>
+          <w:sz w:val="22"/>
+        </w:rPr>
+        <w:t>Move battery SOC to the reserve boundary and verify the stable limited result.</w:t>
+      </w:r>
+    </w:p>
+    <w:p>
+      <w:pPr>
+        <w:pStyle w:val="ListNumber"/>
+        <w:numPr>
+          <w:ilvl w:val="0"/>
+          <w:numId w:val="28"/>
+        </w:numPr>
+        <w:spacing w:after="120"/>
+      </w:pPr>
+      <w:r>
+        <w:rPr>
+          <w:rFonts w:ascii="Calibri" w:hAnsi="Calibri"/>
+          <w:color w:val="111827"/>
+          <w:sz w:val="22"/>
+        </w:rPr>
+        <w:t>Retry a range command and prove that the persisted cycle is not integrated twice.</w:t>
+      </w:r>
+    </w:p>
+    <w:p>
+      <w:pPr>
         <w:pStyle w:val="Heading1"/>
         <w:keepNext/>
         <w:keepLines/>
       </w:pPr>
       <w:r>
-        <w:t>14. Next Development</w:t>
+        <w:t>14. VI-6 Range and Energy Consumption</w:t>
       </w:r>
     </w:p>
     <w:p>
@@ -23883,7 +27236,105 @@
           <w:color w:val="111827"/>
           <w:sz w:val="22"/>
         </w:rPr>
-        <w:t>VI-6 will add deterministic range and energy-consumption estimation across reproducible drive cycles. It will combine traction demand, auxiliary thermal load, charging history, battery state, ambient conditions, and stable route assumptions without paid map or cloud services.</w:t>
+        <w:t>VI-6 implements a vehicle-scoped range estimator with bounded physical calibration and reproducible drive-cycle segments. Each segment supplies duration, speed, longitudinal acceleration, and road grade. The service calculates rolling, aerodynamic, grade, and acceleration forces; converts positive mechanical work through drivetrain efficiency; captures bounded regenerative recovery; and adds baseline plus active thermal auxiliary energy.</w:t>
+      </w:r>
+    </w:p>
+    <w:p>
+      <w:r>
+        <w:rPr>
+          <w:rFonts w:ascii="Calibri" w:hAnsi="Calibri"/>
+          <w:color w:val="111827"/>
+          <w:sz w:val="22"/>
+        </w:rPr>
+        <w:t>Available energy is derived from nominal pack energy, SOH, current SOC, and a configurable reserve. The response reports distance, duration, traction energy, auxiliary energy, recovered energy, net energy, consumption per 100 km, and remaining range. Stationary cycles and depleted reserve produce explicit limited results instead of unstable division or misleading estimates.</w:t>
+      </w:r>
+    </w:p>
+    <w:p>
+      <w:r>
+        <w:rPr>
+          <w:rFonts w:ascii="Calibri" w:hAnsi="Calibri"/>
+          <w:color w:val="111827"/>
+          <w:sz w:val="22"/>
+        </w:rPr>
+        <w:t xml:space="preserve">The public contract consists of </w:t>
+      </w:r>
+      <w:r>
+        <w:rPr>
+          <w:rFonts w:ascii="Consolas" w:hAnsi="Consolas"/>
+          <w:color w:val="1F4D78"/>
+          <w:sz w:val="19"/>
+        </w:rPr>
+        <w:t>POST /range</w:t>
+      </w:r>
+      <w:r>
+        <w:rPr>
+          <w:rFonts w:ascii="Calibri" w:hAnsi="Calibri"/>
+          <w:color w:val="111827"/>
+          <w:sz w:val="22"/>
+        </w:rPr>
+        <w:t xml:space="preserve">, </w:t>
+      </w:r>
+      <w:r>
+        <w:rPr>
+          <w:rFonts w:ascii="Consolas" w:hAnsi="Consolas"/>
+          <w:color w:val="1F4D78"/>
+          <w:sz w:val="19"/>
+        </w:rPr>
+        <w:t>GET /range</w:t>
+      </w:r>
+      <w:r>
+        <w:rPr>
+          <w:rFonts w:ascii="Calibri" w:hAnsi="Calibri"/>
+          <w:color w:val="111827"/>
+          <w:sz w:val="22"/>
+        </w:rPr>
+        <w:t xml:space="preserve">, and </w:t>
+      </w:r>
+      <w:r>
+        <w:rPr>
+          <w:rFonts w:ascii="Consolas" w:hAnsi="Consolas"/>
+          <w:color w:val="1F4D78"/>
+          <w:sz w:val="19"/>
+        </w:rPr>
+        <w:t>POST /range/cycles</w:t>
+      </w:r>
+      <w:r>
+        <w:rPr>
+          <w:rFonts w:ascii="Calibri" w:hAnsi="Calibri"/>
+          <w:color w:val="111827"/>
+          <w:sz w:val="22"/>
+        </w:rPr>
+        <w:t xml:space="preserve"> under the vehicle electric API. Mutations require electric-vehicle management permission. Every accepted operation records audit and transactional-outbox evidence. Cycle commands use exact replay, changed-reuse rejection, and version checks against the estimator, battery, and thermal aggregate.</w:t>
+      </w:r>
+    </w:p>
+    <w:p>
+      <w:r>
+        <w:rPr>
+          <w:rFonts w:ascii="Calibri" w:hAnsi="Calibri"/>
+          <w:color w:val="111827"/>
+          <w:sz w:val="22"/>
+        </w:rPr>
+        <w:t>The model is local and free to run. It requires no commercial map, routing, weather, LLM, or cloud API. Charging history influences the result through the authoritative battery SOC and SOH rather than a second derived energy ledger.</w:t>
+      </w:r>
+    </w:p>
+    <w:p>
+      <w:pPr>
+        <w:pStyle w:val="Heading1"/>
+        <w:keepNext/>
+        <w:keepLines/>
+      </w:pPr>
+      <w:r>
+        <w:t>15. Next Development</w:t>
+      </w:r>
+    </w:p>
+    <w:p>
+      <w:r>
+        <w:rPr>
+          <w:rFonts w:ascii="Calibri" w:hAnsi="Calibri"/>
+          <w:color w:val="111827"/>
+          <w:sz w:val="22"/>
+        </w:rPr>
+        <w:t>VI-7 will add cross-domain EV scenarios that coordinate battery, powertrain, regenerative braking, charging, thermal management, and range through BMS ECU, CAN, UDS, automated tests, and correlated evidence.</w:t>
       </w:r>
     </w:p>
     <w:sectPr>
@@ -23915,7 +27366,7 @@
         <w:color w:val="667085"/>
         <w:sz w:val="17"/>
       </w:rPr>
-      <w:t>ATEP Volume VI Workbook  |  Version 0.5.0</w:t>
+      <w:t>ATEP Volume VI Workbook  |  Version 0.6.0</w:t>
     </w:r>
     <w:r>
       <w:rPr>
@@ -24293,6 +27744,18 @@
     </w:lvlOverride>
   </w:num>
   <w:num w:numId="26">
+    <w:abstractNumId w:val="10"/>
+    <w:lvlOverride w:ilvl="0">
+      <w:startOverride w:val="1"/>
+    </w:lvlOverride>
+  </w:num>
+  <w:num w:numId="27">
+    <w:abstractNumId w:val="10"/>
+    <w:lvlOverride w:ilvl="0">
+      <w:startOverride w:val="1"/>
+    </w:lvlOverride>
+  </w:num>
+  <w:num w:numId="28">
     <w:abstractNumId w:val="9"/>
     <w:lvlOverride w:ilvl="0">
       <w:startOverride w:val="1"/>

</xml_diff>

<commit_message>
feat(electric-vehicle): add cross-domain safety scenarios
</commit_message>
<xml_diff>
--- a/docs/ATEP_Volume_VI_Electric_Vehicle_Engineering_Workbook.docx
+++ b/docs/ATEP_Volume_VI_Electric_Vehicle_Engineering_Workbook.docx
@@ -143,7 +143,7 @@
                 <w:color w:val="0B2545"/>
                 <w:sz w:val="19"/>
               </w:rPr>
-              <w:t>0.6.0</w:t>
+              <w:t>0.7.0</w:t>
             </w:r>
           </w:p>
         </w:tc>
@@ -265,7 +265,7 @@
                 <w:color w:val="111827"/>
                 <w:sz w:val="19"/>
               </w:rPr>
-              <w:t>VI-1 through VI-6 implemented, including deterministic range estimation</w:t>
+              <w:t>Volume VI complete through VI-7, including cross-domain EV safety scenarios</w:t>
             </w:r>
           </w:p>
         </w:tc>
@@ -675,6 +675,25 @@
           <w:color w:val="0B2545"/>
           <w:sz w:val="21"/>
         </w:rPr>
+        <w:t>VI-7 Cross-Domain EV Safety Scenario</w:t>
+      </w:r>
+    </w:p>
+    <w:p>
+      <w:pPr>
+        <w:pStyle w:val="ListNumber"/>
+        <w:numPr>
+          <w:ilvl w:val="0"/>
+          <w:numId w:val="10"/>
+        </w:numPr>
+        <w:ind w:left="216" w:firstLine="0"/>
+      </w:pPr>
+      <w:r>
+        <w:rPr>
+          <w:rFonts w:ascii="Calibri" w:hAnsi="Calibri"/>
+          <w:b/>
+          <w:color w:val="0B2545"/>
+          <w:sz w:val="21"/>
+        </w:rPr>
         <w:t>Next Development</w:t>
       </w:r>
     </w:p>
@@ -892,7 +911,7 @@
                 <w:color w:val="111827"/>
                 <w:sz w:val="17"/>
               </w:rPr>
-              <w:t>0.6.0</w:t>
+              <w:t>0.7.0</w:t>
             </w:r>
           </w:p>
         </w:tc>
@@ -1014,7 +1033,7 @@
                 <w:color w:val="111827"/>
                 <w:sz w:val="17"/>
               </w:rPr>
-              <w:t>VI-1 through VI-6 implemented, including deterministic range estimation</w:t>
+              <w:t>Volume VI complete through VI-7, including cross-domain EV safety scenarios</w:t>
             </w:r>
           </w:p>
         </w:tc>
@@ -1103,7 +1122,7 @@
           <w:color w:val="111827"/>
           <w:sz w:val="22"/>
         </w:rPr>
-        <w:t>Volume VI turns the platform's general digital vehicle into a testable electric-energy system. VI-1 establishes a persistent battery pack and deterministic BMS behavior. VI-2 adds a persistent motor/inverter aggregate, torque delivery, efficiency, power loss, thermal protection, drive-mode limits, and battery-derived propulsion availability. VI-3 adds requested-deceleration control, regenerative energy recovery, battery charge acceptance, and blended friction braking. VI-4 adds AC/DC charging sessions, deterministic charge curves, lifecycle control, and faults. VI-5 adds coordinated heating and cooling for the battery, motor, inverter, and cabin. VI-6 adds deterministic energy-consumption and remaining-range estimates for bounded drive cycles.</w:t>
+        <w:t>Volume VI turns the platform's general digital vehicle into a testable electric-energy system. VI-1 establishes a persistent battery pack and deterministic BMS behavior. VI-2 adds a persistent motor/inverter aggregate, torque delivery, efficiency, power loss, thermal protection, drive-mode limits, and battery-derived propulsion availability. VI-3 adds requested-deceleration control, regenerative energy recovery, battery charge acceptance, and blended friction braking. VI-4 adds AC/DC charging sessions, deterministic charge curves, lifecycle control, and faults. VI-5 adds coordinated heating and cooling for the battery, motor, inverter, and cabin. VI-6 adds deterministic energy-consumption and remaining-range estimates for bounded drive cycles. VI-7 adds an atomic battery-overtemperature scenario with BMS ECU, CAN, UDS, state assertions, and correlated evidence across every Volume VI aggregate.</w:t>
       </w:r>
     </w:p>
     <w:p>
@@ -1713,7 +1732,7 @@
         <w:keepLines/>
       </w:pPr>
       <w:r>
-        <w:t>Deferred</w:t>
+        <w:t>In Scope for VI-7</w:t>
       </w:r>
     </w:p>
     <w:p>
@@ -1731,7 +1750,7 @@
           <w:color w:val="111827"/>
           <w:sz w:val="22"/>
         </w:rPr>
-        <w:t>chemistry-specific circuits, cell balancing, aging, sensor faults, and module topology;</w:t>
+        <w:t>one persisted battery-overtemperature safety scenario;</w:t>
       </w:r>
     </w:p>
     <w:p>
@@ -1749,7 +1768,125 @@
           <w:color w:val="111827"/>
           <w:sz w:val="22"/>
         </w:rPr>
-        <w:t>calibrated thermal circuits and BMS ECU, CAN, UDS, dashboard, and test orchestration.</w:t>
+        <w:t>coordinated battery, motor, braking, charging, thermal, and range reactions;</w:t>
+      </w:r>
+    </w:p>
+    <w:p>
+      <w:pPr>
+        <w:pStyle w:val="ListBullet"/>
+        <w:numPr>
+          <w:ilvl w:val="0"/>
+          <w:numId w:val="17"/>
+        </w:numPr>
+        <w:spacing w:after="80"/>
+      </w:pPr>
+      <w:r>
+        <w:rPr>
+          <w:rFonts w:ascii="Calibri" w:hAnsi="Calibri"/>
+          <w:color w:val="111827"/>
+          <w:sz w:val="22"/>
+        </w:rPr>
+        <w:t>battery ECU signal and confirmed fault state;</w:t>
+      </w:r>
+    </w:p>
+    <w:p>
+      <w:pPr>
+        <w:pStyle w:val="ListBullet"/>
+        <w:numPr>
+          <w:ilvl w:val="0"/>
+          <w:numId w:val="17"/>
+        </w:numPr>
+        <w:spacing w:after="80"/>
+      </w:pPr>
+      <w:r>
+        <w:rPr>
+          <w:rFonts w:ascii="Calibri" w:hAnsi="Calibri"/>
+          <w:color w:val="111827"/>
+          <w:sz w:val="22"/>
+        </w:rPr>
+        <w:t>contracted CAN transmission and UDS-readable DTC evidence;</w:t>
+      </w:r>
+    </w:p>
+    <w:p>
+      <w:pPr>
+        <w:pStyle w:val="ListBullet"/>
+        <w:numPr>
+          <w:ilvl w:val="0"/>
+          <w:numId w:val="17"/>
+        </w:numPr>
+        <w:spacing w:after="80"/>
+      </w:pPr>
+      <w:r>
+        <w:rPr>
+          <w:rFonts w:ascii="Calibri" w:hAnsi="Calibri"/>
+          <w:color w:val="111827"/>
+          <w:sz w:val="22"/>
+        </w:rPr>
+        <w:t>eight-resource optimistic concurrency, exact replay, stable conflicts, audit, and outbox;</w:t>
+      </w:r>
+    </w:p>
+    <w:p>
+      <w:pPr>
+        <w:pStyle w:val="ListBullet"/>
+        <w:numPr>
+          <w:ilvl w:val="0"/>
+          <w:numId w:val="17"/>
+        </w:numPr>
+        <w:spacing w:after="80"/>
+      </w:pPr>
+      <w:r>
+        <w:rPr>
+          <w:rFonts w:ascii="Calibri" w:hAnsi="Calibri"/>
+          <w:color w:val="111827"/>
+          <w:sz w:val="22"/>
+        </w:rPr>
+        <w:t>bounded scenario listing and retrieval APIs.</w:t>
+      </w:r>
+    </w:p>
+    <w:p>
+      <w:pPr>
+        <w:pStyle w:val="Heading2"/>
+        <w:keepNext/>
+        <w:keepLines/>
+      </w:pPr>
+      <w:r>
+        <w:t>Deferred</w:t>
+      </w:r>
+    </w:p>
+    <w:p>
+      <w:pPr>
+        <w:pStyle w:val="ListBullet"/>
+        <w:numPr>
+          <w:ilvl w:val="0"/>
+          <w:numId w:val="18"/>
+        </w:numPr>
+        <w:spacing w:after="80"/>
+      </w:pPr>
+      <w:r>
+        <w:rPr>
+          <w:rFonts w:ascii="Calibri" w:hAnsi="Calibri"/>
+          <w:color w:val="111827"/>
+          <w:sz w:val="22"/>
+        </w:rPr>
+        <w:t>chemistry-specific circuits, cell balancing, aging, sensor faults, and module topology;</w:t>
+      </w:r>
+    </w:p>
+    <w:p>
+      <w:pPr>
+        <w:pStyle w:val="ListBullet"/>
+        <w:numPr>
+          <w:ilvl w:val="0"/>
+          <w:numId w:val="18"/>
+        </w:numPr>
+        <w:spacing w:after="80"/>
+      </w:pPr>
+      <w:r>
+        <w:rPr>
+          <w:rFonts w:ascii="Calibri" w:hAnsi="Calibri"/>
+          <w:color w:val="111827"/>
+          <w:sz w:val="22"/>
+        </w:rPr>
+        <w:t>calibrated thermal circuits, stateful drive trips, dashboard integration, and test scheduling.</w:t>
       </w:r>
     </w:p>
     <w:p>
@@ -1905,6 +2042,22 @@
           <w:color w:val="1F4D78"/>
           <w:sz w:val="19"/>
         </w:rPr>
+        <w:t>ElectricVehicleScenarioExecution</w:t>
+      </w:r>
+      <w:r>
+        <w:rPr>
+          <w:rFonts w:ascii="Calibri" w:hAnsi="Calibri"/>
+          <w:color w:val="111827"/>
+          <w:sz w:val="22"/>
+        </w:rPr>
+        <w:t xml:space="preserve"> correlates the six EV aggregates with the BMS ECU, CAN transmission, UDS DTC, assertions, and versions. </w:t>
+      </w:r>
+      <w:r>
+        <w:rPr>
+          <w:rFonts w:ascii="Consolas" w:hAnsi="Consolas"/>
+          <w:color w:val="1F4D78"/>
+          <w:sz w:val="19"/>
+        </w:rPr>
         <w:t>AuditRecord</w:t>
       </w:r>
       <w:r>
@@ -1929,7 +2082,7 @@
           <w:color w:val="111827"/>
           <w:sz w:val="22"/>
         </w:rPr>
-        <w:t xml:space="preserve"> commit in the same database transaction as each accepted mutation.</w:t>
+        <w:t xml:space="preserve"> commit in the same transaction as each accepted mutation.</w:t>
       </w:r>
     </w:p>
     <w:p>
@@ -4071,6 +4224,184 @@
           </w:p>
         </w:tc>
       </w:tr>
+      <w:tr>
+        <w:trPr>
+          <w:cantSplit/>
+        </w:trPr>
+        <w:tc>
+          <w:tcPr>
+            <w:tcW w:type="dxa" w:w="1650"/>
+            <w:tcMar>
+              <w:top w:w="80" w:type="dxa"/>
+              <w:start w:w="120" w:type="dxa"/>
+              <w:bottom w:w="80" w:type="dxa"/>
+              <w:end w:w="120" w:type="dxa"/>
+            </w:tcMar>
+            <w:vAlign w:val="center"/>
+            <w:shd w:fill="FFFFFF"/>
+          </w:tcPr>
+          <w:p>
+            <w:pPr>
+              <w:spacing w:before="0" w:after="40" w:line="252" w:lineRule="auto"/>
+              <w:jc w:val="center"/>
+            </w:pPr>
+            <w:r>
+              <w:rPr>
+                <w:rFonts w:ascii="Calibri" w:hAnsi="Calibri"/>
+                <w:b w:val="0"/>
+                <w:color w:val="111827"/>
+                <w:sz w:val="17"/>
+              </w:rPr>
+              <w:t>ElectricVehicleScenarioExecution</w:t>
+            </w:r>
+          </w:p>
+        </w:tc>
+        <w:tc>
+          <w:tcPr>
+            <w:tcW w:type="dxa" w:w="4450"/>
+            <w:tcMar>
+              <w:top w:w="80" w:type="dxa"/>
+              <w:start w:w="120" w:type="dxa"/>
+              <w:bottom w:w="80" w:type="dxa"/>
+              <w:end w:w="120" w:type="dxa"/>
+            </w:tcMar>
+            <w:vAlign w:val="center"/>
+            <w:shd w:fill="FFFFFF"/>
+          </w:tcPr>
+          <w:p>
+            <w:pPr>
+              <w:spacing w:before="0" w:after="40" w:line="252" w:lineRule="auto"/>
+              <w:jc w:val="left"/>
+            </w:pPr>
+            <w:r>
+              <w:rPr>
+                <w:rFonts w:ascii="Calibri" w:hAnsi="Calibri"/>
+                <w:b w:val="0"/>
+                <w:color w:val="111827"/>
+                <w:sz w:val="17"/>
+              </w:rPr>
+              <w:t>Immutable cross-domain evidence and replay identity</w:t>
+            </w:r>
+          </w:p>
+        </w:tc>
+        <w:tc>
+          <w:tcPr>
+            <w:tcW w:type="dxa" w:w="3260"/>
+            <w:tcMar>
+              <w:top w:w="80" w:type="dxa"/>
+              <w:start w:w="120" w:type="dxa"/>
+              <w:bottom w:w="80" w:type="dxa"/>
+              <w:end w:w="120" w:type="dxa"/>
+            </w:tcMar>
+            <w:vAlign w:val="center"/>
+            <w:shd w:fill="FFFFFF"/>
+          </w:tcPr>
+          <w:p>
+            <w:pPr>
+              <w:spacing w:before="0" w:after="40" w:line="252" w:lineRule="auto"/>
+              <w:jc w:val="left"/>
+            </w:pPr>
+            <w:r>
+              <w:rPr>
+                <w:rFonts w:ascii="Calibri" w:hAnsi="Calibri"/>
+                <w:b w:val="0"/>
+                <w:color w:val="111827"/>
+                <w:sz w:val="17"/>
+              </w:rPr>
+              <w:t>one row per vehicle and execution ID</w:t>
+            </w:r>
+          </w:p>
+        </w:tc>
+      </w:tr>
+      <w:tr>
+        <w:trPr>
+          <w:cantSplit/>
+        </w:trPr>
+        <w:tc>
+          <w:tcPr>
+            <w:tcW w:type="dxa" w:w="1650"/>
+            <w:tcMar>
+              <w:top w:w="80" w:type="dxa"/>
+              <w:start w:w="120" w:type="dxa"/>
+              <w:bottom w:w="80" w:type="dxa"/>
+              <w:end w:w="120" w:type="dxa"/>
+            </w:tcMar>
+            <w:vAlign w:val="center"/>
+            <w:shd w:fill="FFFFFF"/>
+          </w:tcPr>
+          <w:p>
+            <w:pPr>
+              <w:spacing w:before="0" w:after="40" w:line="252" w:lineRule="auto"/>
+              <w:jc w:val="center"/>
+            </w:pPr>
+            <w:r>
+              <w:rPr>
+                <w:rFonts w:ascii="Calibri" w:hAnsi="Calibri"/>
+                <w:b w:val="0"/>
+                <w:color w:val="111827"/>
+                <w:sz w:val="17"/>
+              </w:rPr>
+              <w:t>Scenario assertion</w:t>
+            </w:r>
+          </w:p>
+        </w:tc>
+        <w:tc>
+          <w:tcPr>
+            <w:tcW w:type="dxa" w:w="4450"/>
+            <w:tcMar>
+              <w:top w:w="80" w:type="dxa"/>
+              <w:start w:w="120" w:type="dxa"/>
+              <w:bottom w:w="80" w:type="dxa"/>
+              <w:end w:w="120" w:type="dxa"/>
+            </w:tcMar>
+            <w:vAlign w:val="center"/>
+            <w:shd w:fill="FFFFFF"/>
+          </w:tcPr>
+          <w:p>
+            <w:pPr>
+              <w:spacing w:before="0" w:after="40" w:line="252" w:lineRule="auto"/>
+              <w:jc w:val="left"/>
+            </w:pPr>
+            <w:r>
+              <w:rPr>
+                <w:rFonts w:ascii="Calibri" w:hAnsi="Calibri"/>
+                <w:b w:val="0"/>
+                <w:color w:val="111827"/>
+                <w:sz w:val="17"/>
+              </w:rPr>
+              <w:t>Machine-readable safety expectation</w:t>
+            </w:r>
+          </w:p>
+        </w:tc>
+        <w:tc>
+          <w:tcPr>
+            <w:tcW w:type="dxa" w:w="3260"/>
+            <w:tcMar>
+              <w:top w:w="80" w:type="dxa"/>
+              <w:start w:w="120" w:type="dxa"/>
+              <w:bottom w:w="80" w:type="dxa"/>
+              <w:end w:w="120" w:type="dxa"/>
+            </w:tcMar>
+            <w:vAlign w:val="center"/>
+            <w:shd w:fill="FFFFFF"/>
+          </w:tcPr>
+          <w:p>
+            <w:pPr>
+              <w:spacing w:before="0" w:after="40" w:line="252" w:lineRule="auto"/>
+              <w:jc w:val="left"/>
+            </w:pPr>
+            <w:r>
+              <w:rPr>
+                <w:rFonts w:ascii="Calibri" w:hAnsi="Calibri"/>
+                <w:b w:val="0"/>
+                <w:color w:val="111827"/>
+                <w:sz w:val="17"/>
+              </w:rPr>
+              <w:t>observed value, expected value, pass or fail</w:t>
+            </w:r>
+          </w:p>
+        </w:tc>
+      </w:tr>
     </w:tbl>
     <w:p>
       <w:pPr>
@@ -4122,7 +4453,7 @@
         <w:pStyle w:val="ListBullet"/>
         <w:numPr>
           <w:ilvl w:val="0"/>
-          <w:numId w:val="18"/>
+          <w:numId w:val="19"/>
         </w:numPr>
         <w:spacing w:after="80"/>
       </w:pPr>
@@ -4140,7 +4471,7 @@
         <w:pStyle w:val="ListBullet"/>
         <w:numPr>
           <w:ilvl w:val="0"/>
-          <w:numId w:val="18"/>
+          <w:numId w:val="19"/>
         </w:numPr>
         <w:spacing w:after="80"/>
       </w:pPr>
@@ -4158,7 +4489,7 @@
         <w:pStyle w:val="ListBullet"/>
         <w:numPr>
           <w:ilvl w:val="0"/>
-          <w:numId w:val="18"/>
+          <w:numId w:val="19"/>
         </w:numPr>
         <w:spacing w:after="80"/>
       </w:pPr>
@@ -4186,7 +4517,7 @@
         <w:pStyle w:val="ListBullet"/>
         <w:numPr>
           <w:ilvl w:val="0"/>
-          <w:numId w:val="19"/>
+          <w:numId w:val="20"/>
         </w:numPr>
         <w:spacing w:after="80"/>
       </w:pPr>
@@ -4204,7 +4535,7 @@
         <w:pStyle w:val="ListBullet"/>
         <w:numPr>
           <w:ilvl w:val="0"/>
-          <w:numId w:val="19"/>
+          <w:numId w:val="20"/>
         </w:numPr>
         <w:spacing w:after="80"/>
       </w:pPr>
@@ -4232,7 +4563,7 @@
         <w:pStyle w:val="ListBullet"/>
         <w:numPr>
           <w:ilvl w:val="0"/>
-          <w:numId w:val="20"/>
+          <w:numId w:val="21"/>
         </w:numPr>
         <w:spacing w:after="80"/>
       </w:pPr>
@@ -4270,7 +4601,7 @@
         <w:pStyle w:val="ListBullet"/>
         <w:numPr>
           <w:ilvl w:val="0"/>
-          <w:numId w:val="21"/>
+          <w:numId w:val="22"/>
         </w:numPr>
         <w:spacing w:after="80"/>
       </w:pPr>
@@ -4288,7 +4619,7 @@
         <w:pStyle w:val="ListBullet"/>
         <w:numPr>
           <w:ilvl w:val="0"/>
-          <w:numId w:val="21"/>
+          <w:numId w:val="22"/>
         </w:numPr>
         <w:spacing w:after="80"/>
       </w:pPr>
@@ -4306,7 +4637,7 @@
         <w:pStyle w:val="ListBullet"/>
         <w:numPr>
           <w:ilvl w:val="0"/>
-          <w:numId w:val="21"/>
+          <w:numId w:val="22"/>
         </w:numPr>
         <w:spacing w:after="80"/>
       </w:pPr>
@@ -4324,7 +4655,7 @@
         <w:pStyle w:val="ListBullet"/>
         <w:numPr>
           <w:ilvl w:val="0"/>
-          <w:numId w:val="21"/>
+          <w:numId w:val="22"/>
         </w:numPr>
         <w:spacing w:after="80"/>
       </w:pPr>
@@ -4342,7 +4673,7 @@
         <w:pStyle w:val="ListBullet"/>
         <w:numPr>
           <w:ilvl w:val="0"/>
-          <w:numId w:val="21"/>
+          <w:numId w:val="22"/>
         </w:numPr>
         <w:spacing w:after="80"/>
       </w:pPr>
@@ -4360,7 +4691,7 @@
         <w:pStyle w:val="ListBullet"/>
         <w:numPr>
           <w:ilvl w:val="0"/>
-          <w:numId w:val="21"/>
+          <w:numId w:val="22"/>
         </w:numPr>
         <w:spacing w:after="80"/>
       </w:pPr>
@@ -4388,7 +4719,7 @@
         <w:pStyle w:val="ListBullet"/>
         <w:numPr>
           <w:ilvl w:val="0"/>
-          <w:numId w:val="22"/>
+          <w:numId w:val="23"/>
         </w:numPr>
         <w:spacing w:after="80"/>
       </w:pPr>
@@ -4406,7 +4737,7 @@
         <w:pStyle w:val="ListBullet"/>
         <w:numPr>
           <w:ilvl w:val="0"/>
-          <w:numId w:val="22"/>
+          <w:numId w:val="23"/>
         </w:numPr>
         <w:spacing w:after="80"/>
       </w:pPr>
@@ -4424,7 +4755,7 @@
         <w:pStyle w:val="ListBullet"/>
         <w:numPr>
           <w:ilvl w:val="0"/>
-          <w:numId w:val="22"/>
+          <w:numId w:val="23"/>
         </w:numPr>
         <w:spacing w:after="80"/>
       </w:pPr>
@@ -4442,7 +4773,7 @@
         <w:pStyle w:val="ListBullet"/>
         <w:numPr>
           <w:ilvl w:val="0"/>
-          <w:numId w:val="22"/>
+          <w:numId w:val="23"/>
         </w:numPr>
         <w:spacing w:after="80"/>
       </w:pPr>
@@ -4460,7 +4791,7 @@
         <w:pStyle w:val="ListBullet"/>
         <w:numPr>
           <w:ilvl w:val="0"/>
-          <w:numId w:val="22"/>
+          <w:numId w:val="23"/>
         </w:numPr>
         <w:spacing w:after="80"/>
       </w:pPr>
@@ -4508,7 +4839,7 @@
         <w:pStyle w:val="ListBullet"/>
         <w:numPr>
           <w:ilvl w:val="0"/>
-          <w:numId w:val="23"/>
+          <w:numId w:val="24"/>
         </w:numPr>
         <w:spacing w:after="80"/>
       </w:pPr>
@@ -4526,7 +4857,7 @@
         <w:pStyle w:val="ListBullet"/>
         <w:numPr>
           <w:ilvl w:val="0"/>
-          <w:numId w:val="23"/>
+          <w:numId w:val="24"/>
         </w:numPr>
         <w:spacing w:after="80"/>
       </w:pPr>
@@ -4544,7 +4875,7 @@
         <w:pStyle w:val="ListBullet"/>
         <w:numPr>
           <w:ilvl w:val="0"/>
-          <w:numId w:val="23"/>
+          <w:numId w:val="24"/>
         </w:numPr>
         <w:spacing w:after="80"/>
       </w:pPr>
@@ -4562,7 +4893,7 @@
         <w:pStyle w:val="ListBullet"/>
         <w:numPr>
           <w:ilvl w:val="0"/>
-          <w:numId w:val="23"/>
+          <w:numId w:val="24"/>
         </w:numPr>
         <w:spacing w:after="80"/>
       </w:pPr>
@@ -4590,7 +4921,7 @@
         <w:pStyle w:val="ListBullet"/>
         <w:numPr>
           <w:ilvl w:val="0"/>
-          <w:numId w:val="24"/>
+          <w:numId w:val="25"/>
         </w:numPr>
         <w:spacing w:after="80"/>
       </w:pPr>
@@ -4608,7 +4939,7 @@
         <w:pStyle w:val="ListBullet"/>
         <w:numPr>
           <w:ilvl w:val="0"/>
-          <w:numId w:val="24"/>
+          <w:numId w:val="25"/>
         </w:numPr>
         <w:spacing w:after="80"/>
       </w:pPr>
@@ -4636,7 +4967,7 @@
         <w:pStyle w:val="ListBullet"/>
         <w:numPr>
           <w:ilvl w:val="0"/>
-          <w:numId w:val="25"/>
+          <w:numId w:val="26"/>
         </w:numPr>
         <w:spacing w:after="80"/>
       </w:pPr>
@@ -4654,7 +4985,7 @@
         <w:pStyle w:val="ListBullet"/>
         <w:numPr>
           <w:ilvl w:val="0"/>
-          <w:numId w:val="25"/>
+          <w:numId w:val="26"/>
         </w:numPr>
         <w:spacing w:after="80"/>
       </w:pPr>
@@ -4672,7 +5003,7 @@
         <w:pStyle w:val="ListBullet"/>
         <w:numPr>
           <w:ilvl w:val="0"/>
-          <w:numId w:val="25"/>
+          <w:numId w:val="26"/>
         </w:numPr>
         <w:spacing w:after="80"/>
       </w:pPr>
@@ -4700,7 +5031,7 @@
         <w:pStyle w:val="ListBullet"/>
         <w:numPr>
           <w:ilvl w:val="0"/>
-          <w:numId w:val="26"/>
+          <w:numId w:val="27"/>
         </w:numPr>
         <w:spacing w:after="80"/>
       </w:pPr>
@@ -4718,7 +5049,7 @@
         <w:pStyle w:val="ListBullet"/>
         <w:numPr>
           <w:ilvl w:val="0"/>
-          <w:numId w:val="26"/>
+          <w:numId w:val="27"/>
         </w:numPr>
         <w:spacing w:after="80"/>
       </w:pPr>
@@ -4736,7 +5067,7 @@
         <w:pStyle w:val="ListBullet"/>
         <w:numPr>
           <w:ilvl w:val="0"/>
-          <w:numId w:val="26"/>
+          <w:numId w:val="27"/>
         </w:numPr>
         <w:spacing w:after="80"/>
       </w:pPr>
@@ -4764,7 +5095,7 @@
         <w:pStyle w:val="ListBullet"/>
         <w:numPr>
           <w:ilvl w:val="0"/>
-          <w:numId w:val="27"/>
+          <w:numId w:val="28"/>
         </w:numPr>
         <w:spacing w:after="80"/>
       </w:pPr>
@@ -4782,7 +5113,7 @@
         <w:pStyle w:val="ListBullet"/>
         <w:numPr>
           <w:ilvl w:val="0"/>
-          <w:numId w:val="27"/>
+          <w:numId w:val="28"/>
         </w:numPr>
         <w:spacing w:after="80"/>
       </w:pPr>
@@ -4800,7 +5131,7 @@
         <w:pStyle w:val="ListBullet"/>
         <w:numPr>
           <w:ilvl w:val="0"/>
-          <w:numId w:val="27"/>
+          <w:numId w:val="28"/>
         </w:numPr>
         <w:spacing w:after="80"/>
       </w:pPr>
@@ -4818,7 +5149,7 @@
         <w:pStyle w:val="ListBullet"/>
         <w:numPr>
           <w:ilvl w:val="0"/>
-          <w:numId w:val="27"/>
+          <w:numId w:val="28"/>
         </w:numPr>
         <w:spacing w:after="80"/>
       </w:pPr>
@@ -4836,7 +5167,7 @@
         <w:pStyle w:val="ListBullet"/>
         <w:numPr>
           <w:ilvl w:val="0"/>
-          <w:numId w:val="27"/>
+          <w:numId w:val="28"/>
         </w:numPr>
         <w:spacing w:after="80"/>
       </w:pPr>
@@ -4854,7 +5185,7 @@
         <w:pStyle w:val="ListBullet"/>
         <w:numPr>
           <w:ilvl w:val="0"/>
-          <w:numId w:val="27"/>
+          <w:numId w:val="28"/>
         </w:numPr>
         <w:spacing w:after="80"/>
       </w:pPr>
@@ -4872,7 +5203,7 @@
         <w:pStyle w:val="ListBullet"/>
         <w:numPr>
           <w:ilvl w:val="0"/>
-          <w:numId w:val="27"/>
+          <w:numId w:val="28"/>
         </w:numPr>
         <w:spacing w:after="80"/>
       </w:pPr>
@@ -4890,7 +5221,7 @@
         <w:pStyle w:val="ListBullet"/>
         <w:numPr>
           <w:ilvl w:val="0"/>
-          <w:numId w:val="27"/>
+          <w:numId w:val="28"/>
         </w:numPr>
         <w:spacing w:after="80"/>
       </w:pPr>
@@ -7387,6 +7718,273 @@
           </w:p>
         </w:tc>
       </w:tr>
+      <w:tr>
+        <w:trPr>
+          <w:cantSplit/>
+        </w:trPr>
+        <w:tc>
+          <w:tcPr>
+            <w:tcW w:type="dxa" w:w="3100"/>
+            <w:tcMar>
+              <w:top w:w="80" w:type="dxa"/>
+              <w:start w:w="120" w:type="dxa"/>
+              <w:bottom w:w="80" w:type="dxa"/>
+              <w:end w:w="120" w:type="dxa"/>
+            </w:tcMar>
+            <w:vAlign w:val="center"/>
+            <w:shd w:fill="FFFFFF"/>
+          </w:tcPr>
+          <w:p>
+            <w:pPr>
+              <w:spacing w:before="0" w:after="40" w:line="252" w:lineRule="auto"/>
+              <w:jc w:val="center"/>
+            </w:pPr>
+            <w:r>
+              <w:rPr>
+                <w:rFonts w:ascii="Calibri" w:hAnsi="Calibri"/>
+                <w:b w:val="0"/>
+                <w:color w:val="111827"/>
+                <w:sz w:val="17"/>
+              </w:rPr>
+              <w:t>POST /api/v1/vehicles/{vehicle_id}/electric/scenarios</w:t>
+            </w:r>
+          </w:p>
+        </w:tc>
+        <w:tc>
+          <w:tcPr>
+            <w:tcW w:type="dxa" w:w="4000"/>
+            <w:tcMar>
+              <w:top w:w="80" w:type="dxa"/>
+              <w:start w:w="120" w:type="dxa"/>
+              <w:bottom w:w="80" w:type="dxa"/>
+              <w:end w:w="120" w:type="dxa"/>
+            </w:tcMar>
+            <w:vAlign w:val="center"/>
+            <w:shd w:fill="FFFFFF"/>
+          </w:tcPr>
+          <w:p>
+            <w:pPr>
+              <w:spacing w:before="0" w:after="40" w:line="252" w:lineRule="auto"/>
+              <w:jc w:val="left"/>
+            </w:pPr>
+            <w:r>
+              <w:rPr>
+                <w:rFonts w:ascii="Calibri" w:hAnsi="Calibri"/>
+                <w:b w:val="0"/>
+                <w:color w:val="111827"/>
+                <w:sz w:val="17"/>
+              </w:rPr>
+              <w:t>Execute an atomic cross-domain safety scenario</w:t>
+            </w:r>
+          </w:p>
+        </w:tc>
+        <w:tc>
+          <w:tcPr>
+            <w:tcW w:type="dxa" w:w="2260"/>
+            <w:tcMar>
+              <w:top w:w="80" w:type="dxa"/>
+              <w:start w:w="120" w:type="dxa"/>
+              <w:bottom w:w="80" w:type="dxa"/>
+              <w:end w:w="120" w:type="dxa"/>
+            </w:tcMar>
+            <w:vAlign w:val="center"/>
+            <w:shd w:fill="FFFFFF"/>
+          </w:tcPr>
+          <w:p>
+            <w:pPr>
+              <w:spacing w:before="0" w:after="40" w:line="252" w:lineRule="auto"/>
+              <w:jc w:val="left"/>
+            </w:pPr>
+            <w:r>
+              <w:rPr>
+                <w:rFonts w:ascii="Calibri" w:hAnsi="Calibri"/>
+                <w:b w:val="0"/>
+                <w:color w:val="111827"/>
+                <w:sz w:val="17"/>
+              </w:rPr>
+              <w:t>electric_vehicle:manage</w:t>
+            </w:r>
+          </w:p>
+        </w:tc>
+      </w:tr>
+      <w:tr>
+        <w:trPr>
+          <w:cantSplit/>
+        </w:trPr>
+        <w:tc>
+          <w:tcPr>
+            <w:tcW w:type="dxa" w:w="3100"/>
+            <w:tcMar>
+              <w:top w:w="80" w:type="dxa"/>
+              <w:start w:w="120" w:type="dxa"/>
+              <w:bottom w:w="80" w:type="dxa"/>
+              <w:end w:w="120" w:type="dxa"/>
+            </w:tcMar>
+            <w:vAlign w:val="center"/>
+            <w:shd w:fill="FFFFFF"/>
+          </w:tcPr>
+          <w:p>
+            <w:pPr>
+              <w:spacing w:before="0" w:after="40" w:line="252" w:lineRule="auto"/>
+              <w:jc w:val="center"/>
+            </w:pPr>
+            <w:r>
+              <w:rPr>
+                <w:rFonts w:ascii="Calibri" w:hAnsi="Calibri"/>
+                <w:b w:val="0"/>
+                <w:color w:val="111827"/>
+                <w:sz w:val="17"/>
+              </w:rPr>
+              <w:t>GET /api/v1/vehicles/{vehicle_id}/electric/scenarios</w:t>
+            </w:r>
+          </w:p>
+        </w:tc>
+        <w:tc>
+          <w:tcPr>
+            <w:tcW w:type="dxa" w:w="4000"/>
+            <w:tcMar>
+              <w:top w:w="80" w:type="dxa"/>
+              <w:start w:w="120" w:type="dxa"/>
+              <w:bottom w:w="80" w:type="dxa"/>
+              <w:end w:w="120" w:type="dxa"/>
+            </w:tcMar>
+            <w:vAlign w:val="center"/>
+            <w:shd w:fill="FFFFFF"/>
+          </w:tcPr>
+          <w:p>
+            <w:pPr>
+              <w:spacing w:before="0" w:after="40" w:line="252" w:lineRule="auto"/>
+              <w:jc w:val="left"/>
+            </w:pPr>
+            <w:r>
+              <w:rPr>
+                <w:rFonts w:ascii="Calibri" w:hAnsi="Calibri"/>
+                <w:b w:val="0"/>
+                <w:color w:val="111827"/>
+                <w:sz w:val="17"/>
+              </w:rPr>
+              <w:t>List persisted scenario evidence</w:t>
+            </w:r>
+          </w:p>
+        </w:tc>
+        <w:tc>
+          <w:tcPr>
+            <w:tcW w:type="dxa" w:w="2260"/>
+            <w:tcMar>
+              <w:top w:w="80" w:type="dxa"/>
+              <w:start w:w="120" w:type="dxa"/>
+              <w:bottom w:w="80" w:type="dxa"/>
+              <w:end w:w="120" w:type="dxa"/>
+            </w:tcMar>
+            <w:vAlign w:val="center"/>
+            <w:shd w:fill="FFFFFF"/>
+          </w:tcPr>
+          <w:p>
+            <w:pPr>
+              <w:spacing w:before="0" w:after="40" w:line="252" w:lineRule="auto"/>
+              <w:jc w:val="left"/>
+            </w:pPr>
+            <w:r>
+              <w:rPr>
+                <w:rFonts w:ascii="Calibri" w:hAnsi="Calibri"/>
+                <w:b w:val="0"/>
+                <w:color w:val="111827"/>
+                <w:sz w:val="17"/>
+              </w:rPr>
+              <w:t>electric_vehicle:read</w:t>
+            </w:r>
+          </w:p>
+        </w:tc>
+      </w:tr>
+      <w:tr>
+        <w:trPr>
+          <w:cantSplit/>
+        </w:trPr>
+        <w:tc>
+          <w:tcPr>
+            <w:tcW w:type="dxa" w:w="3100"/>
+            <w:tcMar>
+              <w:top w:w="80" w:type="dxa"/>
+              <w:start w:w="120" w:type="dxa"/>
+              <w:bottom w:w="80" w:type="dxa"/>
+              <w:end w:w="120" w:type="dxa"/>
+            </w:tcMar>
+            <w:vAlign w:val="center"/>
+            <w:shd w:fill="FFFFFF"/>
+          </w:tcPr>
+          <w:p>
+            <w:pPr>
+              <w:spacing w:before="0" w:after="40" w:line="252" w:lineRule="auto"/>
+              <w:jc w:val="center"/>
+            </w:pPr>
+            <w:r>
+              <w:rPr>
+                <w:rFonts w:ascii="Calibri" w:hAnsi="Calibri"/>
+                <w:b w:val="0"/>
+                <w:color w:val="111827"/>
+                <w:sz w:val="17"/>
+              </w:rPr>
+              <w:t>GET /api/v1/vehicles/{vehicle_id}/electric/scenarios/{execution_id}</w:t>
+            </w:r>
+          </w:p>
+        </w:tc>
+        <w:tc>
+          <w:tcPr>
+            <w:tcW w:type="dxa" w:w="4000"/>
+            <w:tcMar>
+              <w:top w:w="80" w:type="dxa"/>
+              <w:start w:w="120" w:type="dxa"/>
+              <w:bottom w:w="80" w:type="dxa"/>
+              <w:end w:w="120" w:type="dxa"/>
+            </w:tcMar>
+            <w:vAlign w:val="center"/>
+            <w:shd w:fill="FFFFFF"/>
+          </w:tcPr>
+          <w:p>
+            <w:pPr>
+              <w:spacing w:before="0" w:after="40" w:line="252" w:lineRule="auto"/>
+              <w:jc w:val="left"/>
+            </w:pPr>
+            <w:r>
+              <w:rPr>
+                <w:rFonts w:ascii="Calibri" w:hAnsi="Calibri"/>
+                <w:b w:val="0"/>
+                <w:color w:val="111827"/>
+                <w:sz w:val="17"/>
+              </w:rPr>
+              <w:t>Read one immutable scenario result</w:t>
+            </w:r>
+          </w:p>
+        </w:tc>
+        <w:tc>
+          <w:tcPr>
+            <w:tcW w:type="dxa" w:w="2260"/>
+            <w:tcMar>
+              <w:top w:w="80" w:type="dxa"/>
+              <w:start w:w="120" w:type="dxa"/>
+              <w:bottom w:w="80" w:type="dxa"/>
+              <w:end w:w="120" w:type="dxa"/>
+            </w:tcMar>
+            <w:vAlign w:val="center"/>
+            <w:shd w:fill="FFFFFF"/>
+          </w:tcPr>
+          <w:p>
+            <w:pPr>
+              <w:spacing w:before="0" w:after="40" w:line="252" w:lineRule="auto"/>
+              <w:jc w:val="left"/>
+            </w:pPr>
+            <w:r>
+              <w:rPr>
+                <w:rFonts w:ascii="Calibri" w:hAnsi="Calibri"/>
+                <w:b w:val="0"/>
+                <w:color w:val="111827"/>
+                <w:sz w:val="17"/>
+              </w:rPr>
+              <w:t>electric_vehicle:read</w:t>
+            </w:r>
+          </w:p>
+        </w:tc>
+      </w:tr>
     </w:tbl>
     <w:p>
       <w:pPr>
@@ -9435,6 +10033,250 @@
                 <w:sz w:val="17"/>
               </w:rPr>
               <w:t>A range command ID was reused differently.</w:t>
+            </w:r>
+          </w:p>
+        </w:tc>
+      </w:tr>
+      <w:tr>
+        <w:trPr>
+          <w:cantSplit/>
+        </w:trPr>
+        <w:tc>
+          <w:tcPr>
+            <w:tcW w:type="dxa" w:w="2700"/>
+            <w:tcMar>
+              <w:top w:w="80" w:type="dxa"/>
+              <w:start w:w="120" w:type="dxa"/>
+              <w:bottom w:w="80" w:type="dxa"/>
+              <w:end w:w="120" w:type="dxa"/>
+            </w:tcMar>
+            <w:vAlign w:val="center"/>
+            <w:shd w:fill="FFFFFF"/>
+          </w:tcPr>
+          <w:p>
+            <w:pPr>
+              <w:spacing w:before="0" w:after="40" w:line="252" w:lineRule="auto"/>
+              <w:jc w:val="left"/>
+            </w:pPr>
+            <w:r>
+              <w:rPr>
+                <w:rFonts w:ascii="Calibri" w:hAnsi="Calibri"/>
+                <w:b w:val="0"/>
+                <w:color w:val="111827"/>
+                <w:sz w:val="17"/>
+              </w:rPr>
+              <w:t>electric_vehicle_scenario_conflict</w:t>
+            </w:r>
+          </w:p>
+        </w:tc>
+        <w:tc>
+          <w:tcPr>
+            <w:tcW w:type="dxa" w:w="6660"/>
+            <w:tcMar>
+              <w:top w:w="80" w:type="dxa"/>
+              <w:start w:w="120" w:type="dxa"/>
+              <w:bottom w:w="80" w:type="dxa"/>
+              <w:end w:w="120" w:type="dxa"/>
+            </w:tcMar>
+            <w:vAlign w:val="center"/>
+            <w:shd w:fill="FFFFFF"/>
+          </w:tcPr>
+          <w:p>
+            <w:pPr>
+              <w:spacing w:before="0" w:after="40" w:line="252" w:lineRule="auto"/>
+              <w:jc w:val="left"/>
+            </w:pPr>
+            <w:r>
+              <w:rPr>
+                <w:rFonts w:ascii="Calibri" w:hAnsi="Calibri"/>
+                <w:b w:val="0"/>
+                <w:color w:val="111827"/>
+                <w:sz w:val="17"/>
+              </w:rPr>
+              <w:t>A scenario execution ID was reused differently.</w:t>
+            </w:r>
+          </w:p>
+        </w:tc>
+      </w:tr>
+      <w:tr>
+        <w:trPr>
+          <w:cantSplit/>
+        </w:trPr>
+        <w:tc>
+          <w:tcPr>
+            <w:tcW w:type="dxa" w:w="2700"/>
+            <w:tcMar>
+              <w:top w:w="80" w:type="dxa"/>
+              <w:start w:w="120" w:type="dxa"/>
+              <w:bottom w:w="80" w:type="dxa"/>
+              <w:end w:w="120" w:type="dxa"/>
+            </w:tcMar>
+            <w:vAlign w:val="center"/>
+            <w:shd w:fill="FFFFFF"/>
+          </w:tcPr>
+          <w:p>
+            <w:pPr>
+              <w:spacing w:before="0" w:after="40" w:line="252" w:lineRule="auto"/>
+              <w:jc w:val="left"/>
+            </w:pPr>
+            <w:r>
+              <w:rPr>
+                <w:rFonts w:ascii="Calibri" w:hAnsi="Calibri"/>
+                <w:b w:val="0"/>
+                <w:color w:val="111827"/>
+                <w:sz w:val="17"/>
+              </w:rPr>
+              <w:t>electric_vehicle_scenario_version_conflict</w:t>
+            </w:r>
+          </w:p>
+        </w:tc>
+        <w:tc>
+          <w:tcPr>
+            <w:tcW w:type="dxa" w:w="6660"/>
+            <w:tcMar>
+              <w:top w:w="80" w:type="dxa"/>
+              <w:start w:w="120" w:type="dxa"/>
+              <w:bottom w:w="80" w:type="dxa"/>
+              <w:end w:w="120" w:type="dxa"/>
+            </w:tcMar>
+            <w:vAlign w:val="center"/>
+            <w:shd w:fill="FFFFFF"/>
+          </w:tcPr>
+          <w:p>
+            <w:pPr>
+              <w:spacing w:before="0" w:after="40" w:line="252" w:lineRule="auto"/>
+              <w:jc w:val="left"/>
+            </w:pPr>
+            <w:r>
+              <w:rPr>
+                <w:rFonts w:ascii="Calibri" w:hAnsi="Calibri"/>
+                <w:b w:val="0"/>
+                <w:color w:val="111827"/>
+                <w:sz w:val="17"/>
+              </w:rPr>
+              <w:t>One expected resource version is stale.</w:t>
+            </w:r>
+          </w:p>
+        </w:tc>
+      </w:tr>
+      <w:tr>
+        <w:trPr>
+          <w:cantSplit/>
+        </w:trPr>
+        <w:tc>
+          <w:tcPr>
+            <w:tcW w:type="dxa" w:w="2700"/>
+            <w:tcMar>
+              <w:top w:w="80" w:type="dxa"/>
+              <w:start w:w="120" w:type="dxa"/>
+              <w:bottom w:w="80" w:type="dxa"/>
+              <w:end w:w="120" w:type="dxa"/>
+            </w:tcMar>
+            <w:vAlign w:val="center"/>
+            <w:shd w:fill="FFFFFF"/>
+          </w:tcPr>
+          <w:p>
+            <w:pPr>
+              <w:spacing w:before="0" w:after="40" w:line="252" w:lineRule="auto"/>
+              <w:jc w:val="left"/>
+            </w:pPr>
+            <w:r>
+              <w:rPr>
+                <w:rFonts w:ascii="Calibri" w:hAnsi="Calibri"/>
+                <w:b w:val="0"/>
+                <w:color w:val="111827"/>
+                <w:sz w:val="17"/>
+              </w:rPr>
+              <w:t>electric_vehicle_scenario_contract_error</w:t>
+            </w:r>
+          </w:p>
+        </w:tc>
+        <w:tc>
+          <w:tcPr>
+            <w:tcW w:type="dxa" w:w="6660"/>
+            <w:tcMar>
+              <w:top w:w="80" w:type="dxa"/>
+              <w:start w:w="120" w:type="dxa"/>
+              <w:bottom w:w="80" w:type="dxa"/>
+              <w:end w:w="120" w:type="dxa"/>
+            </w:tcMar>
+            <w:vAlign w:val="center"/>
+            <w:shd w:fill="FFFFFF"/>
+          </w:tcPr>
+          <w:p>
+            <w:pPr>
+              <w:spacing w:before="0" w:after="40" w:line="252" w:lineRule="auto"/>
+              <w:jc w:val="left"/>
+            </w:pPr>
+            <w:r>
+              <w:rPr>
+                <w:rFonts w:ascii="Calibri" w:hAnsi="Calibri"/>
+                <w:b w:val="0"/>
+                <w:color w:val="111827"/>
+                <w:sz w:val="17"/>
+              </w:rPr>
+              <w:t>The BMS ECU or CAN contract is incompatible.</w:t>
+            </w:r>
+          </w:p>
+        </w:tc>
+      </w:tr>
+      <w:tr>
+        <w:trPr>
+          <w:cantSplit/>
+        </w:trPr>
+        <w:tc>
+          <w:tcPr>
+            <w:tcW w:type="dxa" w:w="2700"/>
+            <w:tcMar>
+              <w:top w:w="80" w:type="dxa"/>
+              <w:start w:w="120" w:type="dxa"/>
+              <w:bottom w:w="80" w:type="dxa"/>
+              <w:end w:w="120" w:type="dxa"/>
+            </w:tcMar>
+            <w:vAlign w:val="center"/>
+            <w:shd w:fill="FFFFFF"/>
+          </w:tcPr>
+          <w:p>
+            <w:pPr>
+              <w:spacing w:before="0" w:after="40" w:line="252" w:lineRule="auto"/>
+              <w:jc w:val="left"/>
+            </w:pPr>
+            <w:r>
+              <w:rPr>
+                <w:rFonts w:ascii="Calibri" w:hAnsi="Calibri"/>
+                <w:b w:val="0"/>
+                <w:color w:val="111827"/>
+                <w:sz w:val="17"/>
+              </w:rPr>
+              <w:t>electric_vehicle_scenario_not_found</w:t>
+            </w:r>
+          </w:p>
+        </w:tc>
+        <w:tc>
+          <w:tcPr>
+            <w:tcW w:type="dxa" w:w="6660"/>
+            <w:tcMar>
+              <w:top w:w="80" w:type="dxa"/>
+              <w:start w:w="120" w:type="dxa"/>
+              <w:bottom w:w="80" w:type="dxa"/>
+              <w:end w:w="120" w:type="dxa"/>
+            </w:tcMar>
+            <w:vAlign w:val="center"/>
+            <w:shd w:fill="FFFFFF"/>
+          </w:tcPr>
+          <w:p>
+            <w:pPr>
+              <w:spacing w:before="0" w:after="40" w:line="252" w:lineRule="auto"/>
+              <w:jc w:val="left"/>
+            </w:pPr>
+            <w:r>
+              <w:rPr>
+                <w:rFonts w:ascii="Calibri" w:hAnsi="Calibri"/>
+                <w:b w:val="0"/>
+                <w:color w:val="111827"/>
+                <w:sz w:val="17"/>
+              </w:rPr>
+              <w:t>No matching scenario evidence exists.</w:t>
             </w:r>
           </w:p>
         </w:tc>
@@ -9872,7 +10714,23 @@
           <w:color w:val="111827"/>
           <w:sz w:val="22"/>
         </w:rPr>
-        <w:t>.</w:t>
+        <w:t xml:space="preserve">. Migration </w:t>
+      </w:r>
+      <w:r>
+        <w:rPr>
+          <w:rFonts w:ascii="Consolas" w:hAnsi="Consolas"/>
+          <w:color w:val="1F4D78"/>
+          <w:sz w:val="19"/>
+        </w:rPr>
+        <w:t>0043_electric_vehicle_scenarios</w:t>
+      </w:r>
+      <w:r>
+        <w:rPr>
+          <w:rFonts w:ascii="Calibri" w:hAnsi="Calibri"/>
+          <w:color w:val="111827"/>
+          <w:sz w:val="22"/>
+        </w:rPr>
+        <w:t xml:space="preserve"> creates the persisted cross-domain scenario evidence table.</w:t>
       </w:r>
     </w:p>
     <w:tbl>
@@ -11054,6 +11912,95 @@
           </w:p>
         </w:tc>
       </w:tr>
+      <w:tr>
+        <w:trPr>
+          <w:cantSplit/>
+        </w:trPr>
+        <w:tc>
+          <w:tcPr>
+            <w:tcW w:type="dxa" w:w="1650"/>
+            <w:tcMar>
+              <w:top w:w="80" w:type="dxa"/>
+              <w:start w:w="120" w:type="dxa"/>
+              <w:bottom w:w="80" w:type="dxa"/>
+              <w:end w:w="120" w:type="dxa"/>
+            </w:tcMar>
+            <w:vAlign w:val="center"/>
+            <w:shd w:fill="FFFFFF"/>
+          </w:tcPr>
+          <w:p>
+            <w:pPr>
+              <w:spacing w:before="0" w:after="40" w:line="252" w:lineRule="auto"/>
+              <w:jc w:val="center"/>
+            </w:pPr>
+            <w:r>
+              <w:rPr>
+                <w:rFonts w:ascii="Calibri" w:hAnsi="Calibri"/>
+                <w:b w:val="0"/>
+                <w:color w:val="111827"/>
+                <w:sz w:val="17"/>
+              </w:rPr>
+              <w:t>atep.electric_vehicle.scenario.completed.v1</w:t>
+            </w:r>
+          </w:p>
+        </w:tc>
+        <w:tc>
+          <w:tcPr>
+            <w:tcW w:type="dxa" w:w="4450"/>
+            <w:tcMar>
+              <w:top w:w="80" w:type="dxa"/>
+              <w:start w:w="120" w:type="dxa"/>
+              <w:bottom w:w="80" w:type="dxa"/>
+              <w:end w:w="120" w:type="dxa"/>
+            </w:tcMar>
+            <w:vAlign w:val="center"/>
+            <w:shd w:fill="FFFFFF"/>
+          </w:tcPr>
+          <w:p>
+            <w:pPr>
+              <w:spacing w:before="0" w:after="40" w:line="252" w:lineRule="auto"/>
+              <w:jc w:val="left"/>
+            </w:pPr>
+            <w:r>
+              <w:rPr>
+                <w:rFonts w:ascii="Calibri" w:hAnsi="Calibri"/>
+                <w:b w:val="0"/>
+                <w:color w:val="111827"/>
+                <w:sz w:val="17"/>
+              </w:rPr>
+              <w:t>Announce a completed cross-domain safety scenario</w:t>
+            </w:r>
+          </w:p>
+        </w:tc>
+        <w:tc>
+          <w:tcPr>
+            <w:tcW w:type="dxa" w:w="3260"/>
+            <w:tcMar>
+              <w:top w:w="80" w:type="dxa"/>
+              <w:start w:w="120" w:type="dxa"/>
+              <w:bottom w:w="80" w:type="dxa"/>
+              <w:end w:w="120" w:type="dxa"/>
+            </w:tcMar>
+            <w:vAlign w:val="center"/>
+            <w:shd w:fill="FFFFFF"/>
+          </w:tcPr>
+          <w:p>
+            <w:pPr>
+              <w:spacing w:before="0" w:after="40" w:line="252" w:lineRule="auto"/>
+              <w:jc w:val="left"/>
+            </w:pPr>
+            <w:r>
+              <w:rPr>
+                <w:rFonts w:ascii="Calibri" w:hAnsi="Calibri"/>
+                <w:b w:val="0"/>
+                <w:color w:val="111827"/>
+                <w:sz w:val="17"/>
+              </w:rPr>
+              <w:t>IDs, status, contract, and DTC only</w:t>
+            </w:r>
+          </w:p>
+        </w:tc>
+      </w:tr>
     </w:tbl>
     <w:p>
       <w:pPr>
@@ -11077,7 +12024,7 @@
           <w:color w:val="111827"/>
           <w:sz w:val="22"/>
         </w:rPr>
-        <w:t xml:space="preserve">VI-1 through VI-6 implement EV-F-001 through EV-F-089 and EV-NF-001 through EV-NF-029. The authoritative traceability table is maintained in </w:t>
+        <w:t xml:space="preserve">VI-1 through VI-7 implement EV-F-001 through EV-F-101 and EV-NF-001 through EV-NF-035. The authoritative traceability table is maintained in </w:t>
       </w:r>
       <w:r>
         <w:rPr>
@@ -11480,6 +12427,66 @@
     </w:p>
     <w:p>
       <w:pPr>
+        <w:pStyle w:val="Heading2"/>
+        <w:keepNext/>
+        <w:keepLines/>
+      </w:pPr>
+      <w:r>
+        <w:t>ADR-EV-018 - Use One Transaction for Cross-Domain Safety Evidence</w:t>
+      </w:r>
+    </w:p>
+    <w:p>
+      <w:r>
+        <w:rPr>
+          <w:rFonts w:ascii="Calibri" w:hAnsi="Calibri"/>
+          <w:color w:val="111827"/>
+          <w:sz w:val="22"/>
+        </w:rPr>
+        <w:t>Decision: lock the six EV aggregates, battery ECU, and CAN network before applying the scenario. Validate every expected version before the first mutation. Rationale: a safety result is valid only when all domain and protocol observations describe the same logical event.</w:t>
+      </w:r>
+    </w:p>
+    <w:p>
+      <w:pPr>
+        <w:pStyle w:val="Heading2"/>
+        <w:keepNext/>
+        <w:keepLines/>
+      </w:pPr>
+      <w:r>
+        <w:t>ADR-EV-019 - Require a BMS-Owned CAN Contract</w:t>
+      </w:r>
+    </w:p>
+    <w:p>
+      <w:r>
+        <w:rPr>
+          <w:rFonts w:ascii="Calibri" w:hAnsi="Calibri"/>
+          <w:color w:val="111827"/>
+          <w:sz w:val="22"/>
+        </w:rPr>
+        <w:t>Decision: the selected CAN frame contract must name the selected battery ECU as producer and must provide at least three payload bytes. Rationale: this prevents a scenario from attributing BMS evidence to an unrelated ECU or an incompatible frame.</w:t>
+      </w:r>
+    </w:p>
+    <w:p>
+      <w:pPr>
+        <w:pStyle w:val="Heading2"/>
+        <w:keepNext/>
+        <w:keepLines/>
+      </w:pPr>
+      <w:r>
+        <w:t>ADR-EV-020 - Persist Assertions with Observations</w:t>
+      </w:r>
+    </w:p>
+    <w:p>
+      <w:r>
+        <w:rPr>
+          <w:rFonts w:ascii="Calibri" w:hAnsi="Calibri"/>
+          <w:color w:val="111827"/>
+          <w:sz w:val="22"/>
+        </w:rPr>
+        <w:t>Decision: store each assertion name, observed value, expected value, and result in the scenario snapshot. Rationale: test automation and the future dashboard can explain a result without reconstructing mutable state.</w:t>
+      </w:r>
+    </w:p>
+    <w:p>
+      <w:pPr>
         <w:pStyle w:val="Heading1"/>
         <w:keepNext/>
         <w:keepLines/>
@@ -24494,6 +25501,1419 @@
                 <w:sz w:val="16"/>
               </w:rPr>
               <w:t>Bounded schema and reversible tables</w:t>
+            </w:r>
+          </w:p>
+        </w:tc>
+      </w:tr>
+      <w:tr>
+        <w:trPr>
+          <w:cantSplit/>
+        </w:trPr>
+        <w:tc>
+          <w:tcPr>
+            <w:tcW w:type="dxa" w:w="1150"/>
+            <w:tcMar>
+              <w:top w:w="80" w:type="dxa"/>
+              <w:start w:w="120" w:type="dxa"/>
+              <w:bottom w:w="80" w:type="dxa"/>
+              <w:end w:w="120" w:type="dxa"/>
+            </w:tcMar>
+            <w:vAlign w:val="center"/>
+            <w:shd w:fill="FFFFFF"/>
+          </w:tcPr>
+          <w:p>
+            <w:pPr>
+              <w:spacing w:before="0" w:after="40" w:line="252" w:lineRule="auto"/>
+              <w:jc w:val="center"/>
+            </w:pPr>
+            <w:r>
+              <w:rPr>
+                <w:rFonts w:ascii="Calibri" w:hAnsi="Calibri"/>
+                <w:b w:val="0"/>
+                <w:color w:val="111827"/>
+                <w:sz w:val="16"/>
+              </w:rPr>
+              <w:t>EV-T-111</w:t>
+            </w:r>
+          </w:p>
+        </w:tc>
+        <w:tc>
+          <w:tcPr>
+            <w:tcW w:type="dxa" w:w="3700"/>
+            <w:tcMar>
+              <w:top w:w="80" w:type="dxa"/>
+              <w:start w:w="120" w:type="dxa"/>
+              <w:bottom w:w="80" w:type="dxa"/>
+              <w:end w:w="120" w:type="dxa"/>
+            </w:tcMar>
+            <w:vAlign w:val="center"/>
+            <w:shd w:fill="FFFFFF"/>
+          </w:tcPr>
+          <w:p>
+            <w:pPr>
+              <w:spacing w:before="0" w:after="40" w:line="252" w:lineRule="auto"/>
+              <w:jc w:val="left"/>
+            </w:pPr>
+            <w:r>
+              <w:rPr>
+                <w:rFonts w:ascii="Calibri" w:hAnsi="Calibri"/>
+                <w:b w:val="0"/>
+                <w:color w:val="111827"/>
+                <w:sz w:val="16"/>
+              </w:rPr>
+              <w:t>Scenario contract bounds</w:t>
+            </w:r>
+          </w:p>
+        </w:tc>
+        <w:tc>
+          <w:tcPr>
+            <w:tcW w:type="dxa" w:w="3100"/>
+            <w:tcMar>
+              <w:top w:w="80" w:type="dxa"/>
+              <w:start w:w="120" w:type="dxa"/>
+              <w:bottom w:w="80" w:type="dxa"/>
+              <w:end w:w="120" w:type="dxa"/>
+            </w:tcMar>
+            <w:vAlign w:val="center"/>
+            <w:shd w:fill="FFFFFF"/>
+          </w:tcPr>
+          <w:p>
+            <w:pPr>
+              <w:spacing w:before="0" w:after="40" w:line="252" w:lineRule="auto"/>
+              <w:jc w:val="left"/>
+            </w:pPr>
+            <w:r>
+              <w:rPr>
+                <w:rFonts w:ascii="Calibri" w:hAnsi="Calibri"/>
+                <w:b w:val="0"/>
+                <w:color w:val="111827"/>
+                <w:sz w:val="16"/>
+              </w:rPr>
+              <w:t>Submit unsafe temperature, duration, or identifier</w:t>
+            </w:r>
+          </w:p>
+        </w:tc>
+        <w:tc>
+          <w:tcPr>
+            <w:tcW w:type="dxa" w:w="1410"/>
+            <w:tcMar>
+              <w:top w:w="80" w:type="dxa"/>
+              <w:start w:w="120" w:type="dxa"/>
+              <w:bottom w:w="80" w:type="dxa"/>
+              <w:end w:w="120" w:type="dxa"/>
+            </w:tcMar>
+            <w:vAlign w:val="center"/>
+            <w:shd w:fill="FFFFFF"/>
+          </w:tcPr>
+          <w:p>
+            <w:pPr>
+              <w:spacing w:before="0" w:after="40" w:line="252" w:lineRule="auto"/>
+              <w:jc w:val="left"/>
+            </w:pPr>
+            <w:r>
+              <w:rPr>
+                <w:rFonts w:ascii="Calibri" w:hAnsi="Calibri"/>
+                <w:b w:val="0"/>
+                <w:color w:val="111827"/>
+                <w:sz w:val="16"/>
+              </w:rPr>
+              <w:t>Stable validation error</w:t>
+            </w:r>
+          </w:p>
+        </w:tc>
+      </w:tr>
+      <w:tr>
+        <w:trPr>
+          <w:cantSplit/>
+        </w:trPr>
+        <w:tc>
+          <w:tcPr>
+            <w:tcW w:type="dxa" w:w="1150"/>
+            <w:tcMar>
+              <w:top w:w="80" w:type="dxa"/>
+              <w:start w:w="120" w:type="dxa"/>
+              <w:bottom w:w="80" w:type="dxa"/>
+              <w:end w:w="120" w:type="dxa"/>
+            </w:tcMar>
+            <w:vAlign w:val="center"/>
+            <w:shd w:fill="FFFFFF"/>
+          </w:tcPr>
+          <w:p>
+            <w:pPr>
+              <w:spacing w:before="0" w:after="40" w:line="252" w:lineRule="auto"/>
+              <w:jc w:val="center"/>
+            </w:pPr>
+            <w:r>
+              <w:rPr>
+                <w:rFonts w:ascii="Calibri" w:hAnsi="Calibri"/>
+                <w:b w:val="0"/>
+                <w:color w:val="111827"/>
+                <w:sz w:val="16"/>
+              </w:rPr>
+              <w:t>EV-T-112</w:t>
+            </w:r>
+          </w:p>
+        </w:tc>
+        <w:tc>
+          <w:tcPr>
+            <w:tcW w:type="dxa" w:w="3700"/>
+            <w:tcMar>
+              <w:top w:w="80" w:type="dxa"/>
+              <w:start w:w="120" w:type="dxa"/>
+              <w:bottom w:w="80" w:type="dxa"/>
+              <w:end w:w="120" w:type="dxa"/>
+            </w:tcMar>
+            <w:vAlign w:val="center"/>
+            <w:shd w:fill="FFFFFF"/>
+          </w:tcPr>
+          <w:p>
+            <w:pPr>
+              <w:spacing w:before="0" w:after="40" w:line="252" w:lineRule="auto"/>
+              <w:jc w:val="left"/>
+            </w:pPr>
+            <w:r>
+              <w:rPr>
+                <w:rFonts w:ascii="Calibri" w:hAnsi="Calibri"/>
+                <w:b w:val="0"/>
+                <w:color w:val="111827"/>
+                <w:sz w:val="16"/>
+              </w:rPr>
+              <w:t>Cross-domain protection</w:t>
+            </w:r>
+          </w:p>
+        </w:tc>
+        <w:tc>
+          <w:tcPr>
+            <w:tcW w:type="dxa" w:w="3100"/>
+            <w:tcMar>
+              <w:top w:w="80" w:type="dxa"/>
+              <w:start w:w="120" w:type="dxa"/>
+              <w:bottom w:w="80" w:type="dxa"/>
+              <w:end w:w="120" w:type="dxa"/>
+            </w:tcMar>
+            <w:vAlign w:val="center"/>
+            <w:shd w:fill="FFFFFF"/>
+          </w:tcPr>
+          <w:p>
+            <w:pPr>
+              <w:spacing w:before="0" w:after="40" w:line="252" w:lineRule="auto"/>
+              <w:jc w:val="left"/>
+            </w:pPr>
+            <w:r>
+              <w:rPr>
+                <w:rFonts w:ascii="Calibri" w:hAnsi="Calibri"/>
+                <w:b w:val="0"/>
+                <w:color w:val="111827"/>
+                <w:sz w:val="16"/>
+              </w:rPr>
+              <w:t>Execute battery overtemperature</w:t>
+            </w:r>
+          </w:p>
+        </w:tc>
+        <w:tc>
+          <w:tcPr>
+            <w:tcW w:type="dxa" w:w="1410"/>
+            <w:tcMar>
+              <w:top w:w="80" w:type="dxa"/>
+              <w:start w:w="120" w:type="dxa"/>
+              <w:bottom w:w="80" w:type="dxa"/>
+              <w:end w:w="120" w:type="dxa"/>
+            </w:tcMar>
+            <w:vAlign w:val="center"/>
+            <w:shd w:fill="FFFFFF"/>
+          </w:tcPr>
+          <w:p>
+            <w:pPr>
+              <w:spacing w:before="0" w:after="40" w:line="252" w:lineRule="auto"/>
+              <w:jc w:val="left"/>
+            </w:pPr>
+            <w:r>
+              <w:rPr>
+                <w:rFonts w:ascii="Calibri" w:hAnsi="Calibri"/>
+                <w:b w:val="0"/>
+                <w:color w:val="111827"/>
+                <w:sz w:val="16"/>
+              </w:rPr>
+              <w:t>Six EV aggregates enter their defined safety reactions</w:t>
+            </w:r>
+          </w:p>
+        </w:tc>
+      </w:tr>
+      <w:tr>
+        <w:trPr>
+          <w:cantSplit/>
+        </w:trPr>
+        <w:tc>
+          <w:tcPr>
+            <w:tcW w:type="dxa" w:w="1150"/>
+            <w:tcMar>
+              <w:top w:w="80" w:type="dxa"/>
+              <w:start w:w="120" w:type="dxa"/>
+              <w:bottom w:w="80" w:type="dxa"/>
+              <w:end w:w="120" w:type="dxa"/>
+            </w:tcMar>
+            <w:vAlign w:val="center"/>
+            <w:shd w:fill="FFFFFF"/>
+          </w:tcPr>
+          <w:p>
+            <w:pPr>
+              <w:spacing w:before="0" w:after="40" w:line="252" w:lineRule="auto"/>
+              <w:jc w:val="center"/>
+            </w:pPr>
+            <w:r>
+              <w:rPr>
+                <w:rFonts w:ascii="Calibri" w:hAnsi="Calibri"/>
+                <w:b w:val="0"/>
+                <w:color w:val="111827"/>
+                <w:sz w:val="16"/>
+              </w:rPr>
+              <w:t>EV-T-113</w:t>
+            </w:r>
+          </w:p>
+        </w:tc>
+        <w:tc>
+          <w:tcPr>
+            <w:tcW w:type="dxa" w:w="3700"/>
+            <w:tcMar>
+              <w:top w:w="80" w:type="dxa"/>
+              <w:start w:w="120" w:type="dxa"/>
+              <w:bottom w:w="80" w:type="dxa"/>
+              <w:end w:w="120" w:type="dxa"/>
+            </w:tcMar>
+            <w:vAlign w:val="center"/>
+            <w:shd w:fill="FFFFFF"/>
+          </w:tcPr>
+          <w:p>
+            <w:pPr>
+              <w:spacing w:before="0" w:after="40" w:line="252" w:lineRule="auto"/>
+              <w:jc w:val="left"/>
+            </w:pPr>
+            <w:r>
+              <w:rPr>
+                <w:rFonts w:ascii="Calibri" w:hAnsi="Calibri"/>
+                <w:b w:val="0"/>
+                <w:color w:val="111827"/>
+                <w:sz w:val="16"/>
+              </w:rPr>
+              <w:t>BMS ECU evidence</w:t>
+            </w:r>
+          </w:p>
+        </w:tc>
+        <w:tc>
+          <w:tcPr>
+            <w:tcW w:type="dxa" w:w="3100"/>
+            <w:tcMar>
+              <w:top w:w="80" w:type="dxa"/>
+              <w:start w:w="120" w:type="dxa"/>
+              <w:bottom w:w="80" w:type="dxa"/>
+              <w:end w:w="120" w:type="dxa"/>
+            </w:tcMar>
+            <w:vAlign w:val="center"/>
+            <w:shd w:fill="FFFFFF"/>
+          </w:tcPr>
+          <w:p>
+            <w:pPr>
+              <w:spacing w:before="0" w:after="40" w:line="252" w:lineRule="auto"/>
+              <w:jc w:val="left"/>
+            </w:pPr>
+            <w:r>
+              <w:rPr>
+                <w:rFonts w:ascii="Calibri" w:hAnsi="Calibri"/>
+                <w:b w:val="0"/>
+                <w:color w:val="111827"/>
+                <w:sz w:val="16"/>
+              </w:rPr>
+              <w:t>Inspect ECU after the scenario</w:t>
+            </w:r>
+          </w:p>
+        </w:tc>
+        <w:tc>
+          <w:tcPr>
+            <w:tcW w:type="dxa" w:w="1410"/>
+            <w:tcMar>
+              <w:top w:w="80" w:type="dxa"/>
+              <w:start w:w="120" w:type="dxa"/>
+              <w:bottom w:w="80" w:type="dxa"/>
+              <w:end w:w="120" w:type="dxa"/>
+            </w:tcMar>
+            <w:vAlign w:val="center"/>
+            <w:shd w:fill="FFFFFF"/>
+          </w:tcPr>
+          <w:p>
+            <w:pPr>
+              <w:spacing w:before="0" w:after="40" w:line="252" w:lineRule="auto"/>
+              <w:jc w:val="left"/>
+            </w:pPr>
+            <w:r>
+              <w:rPr>
+                <w:rFonts w:ascii="Calibri" w:hAnsi="Calibri"/>
+                <w:b w:val="0"/>
+                <w:color w:val="111827"/>
+                <w:sz w:val="16"/>
+              </w:rPr>
+              <w:t>Temperature signal and confirmed latched fault</w:t>
+            </w:r>
+          </w:p>
+        </w:tc>
+      </w:tr>
+      <w:tr>
+        <w:trPr>
+          <w:cantSplit/>
+        </w:trPr>
+        <w:tc>
+          <w:tcPr>
+            <w:tcW w:type="dxa" w:w="1150"/>
+            <w:tcMar>
+              <w:top w:w="80" w:type="dxa"/>
+              <w:start w:w="120" w:type="dxa"/>
+              <w:bottom w:w="80" w:type="dxa"/>
+              <w:end w:w="120" w:type="dxa"/>
+            </w:tcMar>
+            <w:vAlign w:val="center"/>
+            <w:shd w:fill="FFFFFF"/>
+          </w:tcPr>
+          <w:p>
+            <w:pPr>
+              <w:spacing w:before="0" w:after="40" w:line="252" w:lineRule="auto"/>
+              <w:jc w:val="center"/>
+            </w:pPr>
+            <w:r>
+              <w:rPr>
+                <w:rFonts w:ascii="Calibri" w:hAnsi="Calibri"/>
+                <w:b w:val="0"/>
+                <w:color w:val="111827"/>
+                <w:sz w:val="16"/>
+              </w:rPr>
+              <w:t>EV-T-114</w:t>
+            </w:r>
+          </w:p>
+        </w:tc>
+        <w:tc>
+          <w:tcPr>
+            <w:tcW w:type="dxa" w:w="3700"/>
+            <w:tcMar>
+              <w:top w:w="80" w:type="dxa"/>
+              <w:start w:w="120" w:type="dxa"/>
+              <w:bottom w:w="80" w:type="dxa"/>
+              <w:end w:w="120" w:type="dxa"/>
+            </w:tcMar>
+            <w:vAlign w:val="center"/>
+            <w:shd w:fill="FFFFFF"/>
+          </w:tcPr>
+          <w:p>
+            <w:pPr>
+              <w:spacing w:before="0" w:after="40" w:line="252" w:lineRule="auto"/>
+              <w:jc w:val="left"/>
+            </w:pPr>
+            <w:r>
+              <w:rPr>
+                <w:rFonts w:ascii="Calibri" w:hAnsi="Calibri"/>
+                <w:b w:val="0"/>
+                <w:color w:val="111827"/>
+                <w:sz w:val="16"/>
+              </w:rPr>
+              <w:t>CAN evidence</w:t>
+            </w:r>
+          </w:p>
+        </w:tc>
+        <w:tc>
+          <w:tcPr>
+            <w:tcW w:type="dxa" w:w="3100"/>
+            <w:tcMar>
+              <w:top w:w="80" w:type="dxa"/>
+              <w:start w:w="120" w:type="dxa"/>
+              <w:bottom w:w="80" w:type="dxa"/>
+              <w:end w:w="120" w:type="dxa"/>
+            </w:tcMar>
+            <w:vAlign w:val="center"/>
+            <w:shd w:fill="FFFFFF"/>
+          </w:tcPr>
+          <w:p>
+            <w:pPr>
+              <w:spacing w:before="0" w:after="40" w:line="252" w:lineRule="auto"/>
+              <w:jc w:val="left"/>
+            </w:pPr>
+            <w:r>
+              <w:rPr>
+                <w:rFonts w:ascii="Calibri" w:hAnsi="Calibri"/>
+                <w:b w:val="0"/>
+                <w:color w:val="111827"/>
+                <w:sz w:val="16"/>
+              </w:rPr>
+              <w:t>Inspect the transmitted BMS frame</w:t>
+            </w:r>
+          </w:p>
+        </w:tc>
+        <w:tc>
+          <w:tcPr>
+            <w:tcW w:type="dxa" w:w="1410"/>
+            <w:tcMar>
+              <w:top w:w="80" w:type="dxa"/>
+              <w:start w:w="120" w:type="dxa"/>
+              <w:bottom w:w="80" w:type="dxa"/>
+              <w:end w:w="120" w:type="dxa"/>
+            </w:tcMar>
+            <w:vAlign w:val="center"/>
+            <w:shd w:fill="FFFFFF"/>
+          </w:tcPr>
+          <w:p>
+            <w:pPr>
+              <w:spacing w:before="0" w:after="40" w:line="252" w:lineRule="auto"/>
+              <w:jc w:val="left"/>
+            </w:pPr>
+            <w:r>
+              <w:rPr>
+                <w:rFonts w:ascii="Calibri" w:hAnsi="Calibri"/>
+                <w:b w:val="0"/>
+                <w:color w:val="111827"/>
+                <w:sz w:val="16"/>
+              </w:rPr>
+              <w:t>Contract, sequence, encoded temperature, and protection flag</w:t>
+            </w:r>
+          </w:p>
+        </w:tc>
+      </w:tr>
+      <w:tr>
+        <w:trPr>
+          <w:cantSplit/>
+        </w:trPr>
+        <w:tc>
+          <w:tcPr>
+            <w:tcW w:type="dxa" w:w="1150"/>
+            <w:tcMar>
+              <w:top w:w="80" w:type="dxa"/>
+              <w:start w:w="120" w:type="dxa"/>
+              <w:bottom w:w="80" w:type="dxa"/>
+              <w:end w:w="120" w:type="dxa"/>
+            </w:tcMar>
+            <w:vAlign w:val="center"/>
+            <w:shd w:fill="FFFFFF"/>
+          </w:tcPr>
+          <w:p>
+            <w:pPr>
+              <w:spacing w:before="0" w:after="40" w:line="252" w:lineRule="auto"/>
+              <w:jc w:val="center"/>
+            </w:pPr>
+            <w:r>
+              <w:rPr>
+                <w:rFonts w:ascii="Calibri" w:hAnsi="Calibri"/>
+                <w:b w:val="0"/>
+                <w:color w:val="111827"/>
+                <w:sz w:val="16"/>
+              </w:rPr>
+              <w:t>EV-T-115</w:t>
+            </w:r>
+          </w:p>
+        </w:tc>
+        <w:tc>
+          <w:tcPr>
+            <w:tcW w:type="dxa" w:w="3700"/>
+            <w:tcMar>
+              <w:top w:w="80" w:type="dxa"/>
+              <w:start w:w="120" w:type="dxa"/>
+              <w:bottom w:w="80" w:type="dxa"/>
+              <w:end w:w="120" w:type="dxa"/>
+            </w:tcMar>
+            <w:vAlign w:val="center"/>
+            <w:shd w:fill="FFFFFF"/>
+          </w:tcPr>
+          <w:p>
+            <w:pPr>
+              <w:spacing w:before="0" w:after="40" w:line="252" w:lineRule="auto"/>
+              <w:jc w:val="left"/>
+            </w:pPr>
+            <w:r>
+              <w:rPr>
+                <w:rFonts w:ascii="Calibri" w:hAnsi="Calibri"/>
+                <w:b w:val="0"/>
+                <w:color w:val="111827"/>
+                <w:sz w:val="16"/>
+              </w:rPr>
+              <w:t>UDS DTC evidence</w:t>
+            </w:r>
+          </w:p>
+        </w:tc>
+        <w:tc>
+          <w:tcPr>
+            <w:tcW w:type="dxa" w:w="3100"/>
+            <w:tcMar>
+              <w:top w:w="80" w:type="dxa"/>
+              <w:start w:w="120" w:type="dxa"/>
+              <w:bottom w:w="80" w:type="dxa"/>
+              <w:end w:w="120" w:type="dxa"/>
+            </w:tcMar>
+            <w:vAlign w:val="center"/>
+            <w:shd w:fill="FFFFFF"/>
+          </w:tcPr>
+          <w:p>
+            <w:pPr>
+              <w:spacing w:before="0" w:after="40" w:line="252" w:lineRule="auto"/>
+              <w:jc w:val="left"/>
+            </w:pPr>
+            <w:r>
+              <w:rPr>
+                <w:rFonts w:ascii="Calibri" w:hAnsi="Calibri"/>
+                <w:b w:val="0"/>
+                <w:color w:val="111827"/>
+                <w:sz w:val="16"/>
+              </w:rPr>
+              <w:t xml:space="preserve">Read DTC </w:t>
+            </w:r>
+            <w:r>
+              <w:rPr>
+                <w:rFonts w:ascii="Calibri" w:hAnsi="Calibri"/>
+                <w:b w:val="0"/>
+                <w:color w:val="111827"/>
+                <w:sz w:val="16"/>
+              </w:rPr>
+              <w:t>0A7E00</w:t>
+            </w:r>
+          </w:p>
+        </w:tc>
+        <w:tc>
+          <w:tcPr>
+            <w:tcW w:type="dxa" w:w="1410"/>
+            <w:tcMar>
+              <w:top w:w="80" w:type="dxa"/>
+              <w:start w:w="120" w:type="dxa"/>
+              <w:bottom w:w="80" w:type="dxa"/>
+              <w:end w:w="120" w:type="dxa"/>
+            </w:tcMar>
+            <w:vAlign w:val="center"/>
+            <w:shd w:fill="FFFFFF"/>
+          </w:tcPr>
+          <w:p>
+            <w:pPr>
+              <w:spacing w:before="0" w:after="40" w:line="252" w:lineRule="auto"/>
+              <w:jc w:val="left"/>
+            </w:pPr>
+            <w:r>
+              <w:rPr>
+                <w:rFonts w:ascii="Calibri" w:hAnsi="Calibri"/>
+                <w:b w:val="0"/>
+                <w:color w:val="111827"/>
+                <w:sz w:val="16"/>
+              </w:rPr>
+              <w:t>Critical status and freeze-frame values</w:t>
+            </w:r>
+          </w:p>
+        </w:tc>
+      </w:tr>
+      <w:tr>
+        <w:trPr>
+          <w:cantSplit/>
+        </w:trPr>
+        <w:tc>
+          <w:tcPr>
+            <w:tcW w:type="dxa" w:w="1150"/>
+            <w:tcMar>
+              <w:top w:w="80" w:type="dxa"/>
+              <w:start w:w="120" w:type="dxa"/>
+              <w:bottom w:w="80" w:type="dxa"/>
+              <w:end w:w="120" w:type="dxa"/>
+            </w:tcMar>
+            <w:vAlign w:val="center"/>
+            <w:shd w:fill="FFFFFF"/>
+          </w:tcPr>
+          <w:p>
+            <w:pPr>
+              <w:spacing w:before="0" w:after="40" w:line="252" w:lineRule="auto"/>
+              <w:jc w:val="center"/>
+            </w:pPr>
+            <w:r>
+              <w:rPr>
+                <w:rFonts w:ascii="Calibri" w:hAnsi="Calibri"/>
+                <w:b w:val="0"/>
+                <w:color w:val="111827"/>
+                <w:sz w:val="16"/>
+              </w:rPr>
+              <w:t>EV-T-116</w:t>
+            </w:r>
+          </w:p>
+        </w:tc>
+        <w:tc>
+          <w:tcPr>
+            <w:tcW w:type="dxa" w:w="3700"/>
+            <w:tcMar>
+              <w:top w:w="80" w:type="dxa"/>
+              <w:start w:w="120" w:type="dxa"/>
+              <w:bottom w:w="80" w:type="dxa"/>
+              <w:end w:w="120" w:type="dxa"/>
+            </w:tcMar>
+            <w:vAlign w:val="center"/>
+            <w:shd w:fill="FFFFFF"/>
+          </w:tcPr>
+          <w:p>
+            <w:pPr>
+              <w:spacing w:before="0" w:after="40" w:line="252" w:lineRule="auto"/>
+              <w:jc w:val="left"/>
+            </w:pPr>
+            <w:r>
+              <w:rPr>
+                <w:rFonts w:ascii="Calibri" w:hAnsi="Calibri"/>
+                <w:b w:val="0"/>
+                <w:color w:val="111827"/>
+                <w:sz w:val="16"/>
+              </w:rPr>
+              <w:t>Eight-resource version conflict</w:t>
+            </w:r>
+          </w:p>
+        </w:tc>
+        <w:tc>
+          <w:tcPr>
+            <w:tcW w:type="dxa" w:w="3100"/>
+            <w:tcMar>
+              <w:top w:w="80" w:type="dxa"/>
+              <w:start w:w="120" w:type="dxa"/>
+              <w:bottom w:w="80" w:type="dxa"/>
+              <w:end w:w="120" w:type="dxa"/>
+            </w:tcMar>
+            <w:vAlign w:val="center"/>
+            <w:shd w:fill="FFFFFF"/>
+          </w:tcPr>
+          <w:p>
+            <w:pPr>
+              <w:spacing w:before="0" w:after="40" w:line="252" w:lineRule="auto"/>
+              <w:jc w:val="left"/>
+            </w:pPr>
+            <w:r>
+              <w:rPr>
+                <w:rFonts w:ascii="Calibri" w:hAnsi="Calibri"/>
+                <w:b w:val="0"/>
+                <w:color w:val="111827"/>
+                <w:sz w:val="16"/>
+              </w:rPr>
+              <w:t>Submit one stale expected version</w:t>
+            </w:r>
+          </w:p>
+        </w:tc>
+        <w:tc>
+          <w:tcPr>
+            <w:tcW w:type="dxa" w:w="1410"/>
+            <w:tcMar>
+              <w:top w:w="80" w:type="dxa"/>
+              <w:start w:w="120" w:type="dxa"/>
+              <w:bottom w:w="80" w:type="dxa"/>
+              <w:end w:w="120" w:type="dxa"/>
+            </w:tcMar>
+            <w:vAlign w:val="center"/>
+            <w:shd w:fill="FFFFFF"/>
+          </w:tcPr>
+          <w:p>
+            <w:pPr>
+              <w:spacing w:before="0" w:after="40" w:line="252" w:lineRule="auto"/>
+              <w:jc w:val="left"/>
+            </w:pPr>
+            <w:r>
+              <w:rPr>
+                <w:rFonts w:ascii="Calibri" w:hAnsi="Calibri"/>
+                <w:b w:val="0"/>
+                <w:color w:val="111827"/>
+                <w:sz w:val="16"/>
+              </w:rPr>
+              <w:t>No resource is mutated and current version is returned</w:t>
+            </w:r>
+          </w:p>
+        </w:tc>
+      </w:tr>
+      <w:tr>
+        <w:trPr>
+          <w:cantSplit/>
+        </w:trPr>
+        <w:tc>
+          <w:tcPr>
+            <w:tcW w:type="dxa" w:w="1150"/>
+            <w:tcMar>
+              <w:top w:w="80" w:type="dxa"/>
+              <w:start w:w="120" w:type="dxa"/>
+              <w:bottom w:w="80" w:type="dxa"/>
+              <w:end w:w="120" w:type="dxa"/>
+            </w:tcMar>
+            <w:vAlign w:val="center"/>
+            <w:shd w:fill="FFFFFF"/>
+          </w:tcPr>
+          <w:p>
+            <w:pPr>
+              <w:spacing w:before="0" w:after="40" w:line="252" w:lineRule="auto"/>
+              <w:jc w:val="center"/>
+            </w:pPr>
+            <w:r>
+              <w:rPr>
+                <w:rFonts w:ascii="Calibri" w:hAnsi="Calibri"/>
+                <w:b w:val="0"/>
+                <w:color w:val="111827"/>
+                <w:sz w:val="16"/>
+              </w:rPr>
+              <w:t>EV-T-117</w:t>
+            </w:r>
+          </w:p>
+        </w:tc>
+        <w:tc>
+          <w:tcPr>
+            <w:tcW w:type="dxa" w:w="3700"/>
+            <w:tcMar>
+              <w:top w:w="80" w:type="dxa"/>
+              <w:start w:w="120" w:type="dxa"/>
+              <w:bottom w:w="80" w:type="dxa"/>
+              <w:end w:w="120" w:type="dxa"/>
+            </w:tcMar>
+            <w:vAlign w:val="center"/>
+            <w:shd w:fill="FFFFFF"/>
+          </w:tcPr>
+          <w:p>
+            <w:pPr>
+              <w:spacing w:before="0" w:after="40" w:line="252" w:lineRule="auto"/>
+              <w:jc w:val="left"/>
+            </w:pPr>
+            <w:r>
+              <w:rPr>
+                <w:rFonts w:ascii="Calibri" w:hAnsi="Calibri"/>
+                <w:b w:val="0"/>
+                <w:color w:val="111827"/>
+                <w:sz w:val="16"/>
+              </w:rPr>
+              <w:t>Exact scenario replay</w:t>
+            </w:r>
+          </w:p>
+        </w:tc>
+        <w:tc>
+          <w:tcPr>
+            <w:tcW w:type="dxa" w:w="3100"/>
+            <w:tcMar>
+              <w:top w:w="80" w:type="dxa"/>
+              <w:start w:w="120" w:type="dxa"/>
+              <w:bottom w:w="80" w:type="dxa"/>
+              <w:end w:w="120" w:type="dxa"/>
+            </w:tcMar>
+            <w:vAlign w:val="center"/>
+            <w:shd w:fill="FFFFFF"/>
+          </w:tcPr>
+          <w:p>
+            <w:pPr>
+              <w:spacing w:before="0" w:after="40" w:line="252" w:lineRule="auto"/>
+              <w:jc w:val="left"/>
+            </w:pPr>
+            <w:r>
+              <w:rPr>
+                <w:rFonts w:ascii="Calibri" w:hAnsi="Calibri"/>
+                <w:b w:val="0"/>
+                <w:color w:val="111827"/>
+                <w:sz w:val="16"/>
+              </w:rPr>
+              <w:t>Retry the identical execution</w:t>
+            </w:r>
+          </w:p>
+        </w:tc>
+        <w:tc>
+          <w:tcPr>
+            <w:tcW w:type="dxa" w:w="1410"/>
+            <w:tcMar>
+              <w:top w:w="80" w:type="dxa"/>
+              <w:start w:w="120" w:type="dxa"/>
+              <w:bottom w:w="80" w:type="dxa"/>
+              <w:end w:w="120" w:type="dxa"/>
+            </w:tcMar>
+            <w:vAlign w:val="center"/>
+            <w:shd w:fill="FFFFFF"/>
+          </w:tcPr>
+          <w:p>
+            <w:pPr>
+              <w:spacing w:before="0" w:after="40" w:line="252" w:lineRule="auto"/>
+              <w:jc w:val="left"/>
+            </w:pPr>
+            <w:r>
+              <w:rPr>
+                <w:rFonts w:ascii="Calibri" w:hAnsi="Calibri"/>
+                <w:b w:val="0"/>
+                <w:color w:val="111827"/>
+                <w:sz w:val="16"/>
+              </w:rPr>
+              <w:t>Persisted evidence and no second state transition</w:t>
+            </w:r>
+          </w:p>
+        </w:tc>
+      </w:tr>
+      <w:tr>
+        <w:trPr>
+          <w:cantSplit/>
+        </w:trPr>
+        <w:tc>
+          <w:tcPr>
+            <w:tcW w:type="dxa" w:w="1150"/>
+            <w:tcMar>
+              <w:top w:w="80" w:type="dxa"/>
+              <w:start w:w="120" w:type="dxa"/>
+              <w:bottom w:w="80" w:type="dxa"/>
+              <w:end w:w="120" w:type="dxa"/>
+            </w:tcMar>
+            <w:vAlign w:val="center"/>
+            <w:shd w:fill="FFFFFF"/>
+          </w:tcPr>
+          <w:p>
+            <w:pPr>
+              <w:spacing w:before="0" w:after="40" w:line="252" w:lineRule="auto"/>
+              <w:jc w:val="center"/>
+            </w:pPr>
+            <w:r>
+              <w:rPr>
+                <w:rFonts w:ascii="Calibri" w:hAnsi="Calibri"/>
+                <w:b w:val="0"/>
+                <w:color w:val="111827"/>
+                <w:sz w:val="16"/>
+              </w:rPr>
+              <w:t>EV-T-118</w:t>
+            </w:r>
+          </w:p>
+        </w:tc>
+        <w:tc>
+          <w:tcPr>
+            <w:tcW w:type="dxa" w:w="3700"/>
+            <w:tcMar>
+              <w:top w:w="80" w:type="dxa"/>
+              <w:start w:w="120" w:type="dxa"/>
+              <w:bottom w:w="80" w:type="dxa"/>
+              <w:end w:w="120" w:type="dxa"/>
+            </w:tcMar>
+            <w:vAlign w:val="center"/>
+            <w:shd w:fill="FFFFFF"/>
+          </w:tcPr>
+          <w:p>
+            <w:pPr>
+              <w:spacing w:before="0" w:after="40" w:line="252" w:lineRule="auto"/>
+              <w:jc w:val="left"/>
+            </w:pPr>
+            <w:r>
+              <w:rPr>
+                <w:rFonts w:ascii="Calibri" w:hAnsi="Calibri"/>
+                <w:b w:val="0"/>
+                <w:color w:val="111827"/>
+                <w:sz w:val="16"/>
+              </w:rPr>
+              <w:t>Changed scenario reuse</w:t>
+            </w:r>
+          </w:p>
+        </w:tc>
+        <w:tc>
+          <w:tcPr>
+            <w:tcW w:type="dxa" w:w="3100"/>
+            <w:tcMar>
+              <w:top w:w="80" w:type="dxa"/>
+              <w:start w:w="120" w:type="dxa"/>
+              <w:bottom w:w="80" w:type="dxa"/>
+              <w:end w:w="120" w:type="dxa"/>
+            </w:tcMar>
+            <w:vAlign w:val="center"/>
+            <w:shd w:fill="FFFFFF"/>
+          </w:tcPr>
+          <w:p>
+            <w:pPr>
+              <w:spacing w:before="0" w:after="40" w:line="252" w:lineRule="auto"/>
+              <w:jc w:val="left"/>
+            </w:pPr>
+            <w:r>
+              <w:rPr>
+                <w:rFonts w:ascii="Calibri" w:hAnsi="Calibri"/>
+                <w:b w:val="0"/>
+                <w:color w:val="111827"/>
+                <w:sz w:val="16"/>
+              </w:rPr>
+              <w:t>Reuse execution ID with changed input</w:t>
+            </w:r>
+          </w:p>
+        </w:tc>
+        <w:tc>
+          <w:tcPr>
+            <w:tcW w:type="dxa" w:w="1410"/>
+            <w:tcMar>
+              <w:top w:w="80" w:type="dxa"/>
+              <w:start w:w="120" w:type="dxa"/>
+              <w:bottom w:w="80" w:type="dxa"/>
+              <w:end w:w="120" w:type="dxa"/>
+            </w:tcMar>
+            <w:vAlign w:val="center"/>
+            <w:shd w:fill="FFFFFF"/>
+          </w:tcPr>
+          <w:p>
+            <w:pPr>
+              <w:spacing w:before="0" w:after="40" w:line="252" w:lineRule="auto"/>
+              <w:jc w:val="left"/>
+            </w:pPr>
+            <w:r>
+              <w:rPr>
+                <w:rFonts w:ascii="Calibri" w:hAnsi="Calibri"/>
+                <w:b w:val="0"/>
+                <w:color w:val="111827"/>
+                <w:sz w:val="16"/>
+              </w:rPr>
+              <w:t>Stable scenario conflict</w:t>
+            </w:r>
+          </w:p>
+        </w:tc>
+      </w:tr>
+      <w:tr>
+        <w:trPr>
+          <w:cantSplit/>
+        </w:trPr>
+        <w:tc>
+          <w:tcPr>
+            <w:tcW w:type="dxa" w:w="1150"/>
+            <w:tcMar>
+              <w:top w:w="80" w:type="dxa"/>
+              <w:start w:w="120" w:type="dxa"/>
+              <w:bottom w:w="80" w:type="dxa"/>
+              <w:end w:w="120" w:type="dxa"/>
+            </w:tcMar>
+            <w:vAlign w:val="center"/>
+            <w:shd w:fill="FFFFFF"/>
+          </w:tcPr>
+          <w:p>
+            <w:pPr>
+              <w:spacing w:before="0" w:after="40" w:line="252" w:lineRule="auto"/>
+              <w:jc w:val="center"/>
+            </w:pPr>
+            <w:r>
+              <w:rPr>
+                <w:rFonts w:ascii="Calibri" w:hAnsi="Calibri"/>
+                <w:b w:val="0"/>
+                <w:color w:val="111827"/>
+                <w:sz w:val="16"/>
+              </w:rPr>
+              <w:t>EV-T-119</w:t>
+            </w:r>
+          </w:p>
+        </w:tc>
+        <w:tc>
+          <w:tcPr>
+            <w:tcW w:type="dxa" w:w="3700"/>
+            <w:tcMar>
+              <w:top w:w="80" w:type="dxa"/>
+              <w:start w:w="120" w:type="dxa"/>
+              <w:bottom w:w="80" w:type="dxa"/>
+              <w:end w:w="120" w:type="dxa"/>
+            </w:tcMar>
+            <w:vAlign w:val="center"/>
+            <w:shd w:fill="FFFFFF"/>
+          </w:tcPr>
+          <w:p>
+            <w:pPr>
+              <w:spacing w:before="0" w:after="40" w:line="252" w:lineRule="auto"/>
+              <w:jc w:val="left"/>
+            </w:pPr>
+            <w:r>
+              <w:rPr>
+                <w:rFonts w:ascii="Calibri" w:hAnsi="Calibri"/>
+                <w:b w:val="0"/>
+                <w:color w:val="111827"/>
+                <w:sz w:val="16"/>
+              </w:rPr>
+              <w:t>CAN ownership contract</w:t>
+            </w:r>
+          </w:p>
+        </w:tc>
+        <w:tc>
+          <w:tcPr>
+            <w:tcW w:type="dxa" w:w="3100"/>
+            <w:tcMar>
+              <w:top w:w="80" w:type="dxa"/>
+              <w:start w:w="120" w:type="dxa"/>
+              <w:bottom w:w="80" w:type="dxa"/>
+              <w:end w:w="120" w:type="dxa"/>
+            </w:tcMar>
+            <w:vAlign w:val="center"/>
+            <w:shd w:fill="FFFFFF"/>
+          </w:tcPr>
+          <w:p>
+            <w:pPr>
+              <w:spacing w:before="0" w:after="40" w:line="252" w:lineRule="auto"/>
+              <w:jc w:val="left"/>
+            </w:pPr>
+            <w:r>
+              <w:rPr>
+                <w:rFonts w:ascii="Calibri" w:hAnsi="Calibri"/>
+                <w:b w:val="0"/>
+                <w:color w:val="111827"/>
+                <w:sz w:val="16"/>
+              </w:rPr>
+              <w:t>Select a frame produced by another ECU</w:t>
+            </w:r>
+          </w:p>
+        </w:tc>
+        <w:tc>
+          <w:tcPr>
+            <w:tcW w:type="dxa" w:w="1410"/>
+            <w:tcMar>
+              <w:top w:w="80" w:type="dxa"/>
+              <w:start w:w="120" w:type="dxa"/>
+              <w:bottom w:w="80" w:type="dxa"/>
+              <w:end w:w="120" w:type="dxa"/>
+            </w:tcMar>
+            <w:vAlign w:val="center"/>
+            <w:shd w:fill="FFFFFF"/>
+          </w:tcPr>
+          <w:p>
+            <w:pPr>
+              <w:spacing w:before="0" w:after="40" w:line="252" w:lineRule="auto"/>
+              <w:jc w:val="left"/>
+            </w:pPr>
+            <w:r>
+              <w:rPr>
+                <w:rFonts w:ascii="Calibri" w:hAnsi="Calibri"/>
+                <w:b w:val="0"/>
+                <w:color w:val="111827"/>
+                <w:sz w:val="16"/>
+              </w:rPr>
+              <w:t>Stable contract error</w:t>
+            </w:r>
+          </w:p>
+        </w:tc>
+      </w:tr>
+      <w:tr>
+        <w:trPr>
+          <w:cantSplit/>
+        </w:trPr>
+        <w:tc>
+          <w:tcPr>
+            <w:tcW w:type="dxa" w:w="1150"/>
+            <w:tcMar>
+              <w:top w:w="80" w:type="dxa"/>
+              <w:start w:w="120" w:type="dxa"/>
+              <w:bottom w:w="80" w:type="dxa"/>
+              <w:end w:w="120" w:type="dxa"/>
+            </w:tcMar>
+            <w:vAlign w:val="center"/>
+            <w:shd w:fill="FFFFFF"/>
+          </w:tcPr>
+          <w:p>
+            <w:pPr>
+              <w:spacing w:before="0" w:after="40" w:line="252" w:lineRule="auto"/>
+              <w:jc w:val="center"/>
+            </w:pPr>
+            <w:r>
+              <w:rPr>
+                <w:rFonts w:ascii="Calibri" w:hAnsi="Calibri"/>
+                <w:b w:val="0"/>
+                <w:color w:val="111827"/>
+                <w:sz w:val="16"/>
+              </w:rPr>
+              <w:t>EV-T-120</w:t>
+            </w:r>
+          </w:p>
+        </w:tc>
+        <w:tc>
+          <w:tcPr>
+            <w:tcW w:type="dxa" w:w="3700"/>
+            <w:tcMar>
+              <w:top w:w="80" w:type="dxa"/>
+              <w:start w:w="120" w:type="dxa"/>
+              <w:bottom w:w="80" w:type="dxa"/>
+              <w:end w:w="120" w:type="dxa"/>
+            </w:tcMar>
+            <w:vAlign w:val="center"/>
+            <w:shd w:fill="FFFFFF"/>
+          </w:tcPr>
+          <w:p>
+            <w:pPr>
+              <w:spacing w:before="0" w:after="40" w:line="252" w:lineRule="auto"/>
+              <w:jc w:val="left"/>
+            </w:pPr>
+            <w:r>
+              <w:rPr>
+                <w:rFonts w:ascii="Calibri" w:hAnsi="Calibri"/>
+                <w:b w:val="0"/>
+                <w:color w:val="111827"/>
+                <w:sz w:val="16"/>
+              </w:rPr>
+              <w:t>Atomic correlated evidence</w:t>
+            </w:r>
+          </w:p>
+        </w:tc>
+        <w:tc>
+          <w:tcPr>
+            <w:tcW w:type="dxa" w:w="3100"/>
+            <w:tcMar>
+              <w:top w:w="80" w:type="dxa"/>
+              <w:start w:w="120" w:type="dxa"/>
+              <w:bottom w:w="80" w:type="dxa"/>
+              <w:end w:w="120" w:type="dxa"/>
+            </w:tcMar>
+            <w:vAlign w:val="center"/>
+            <w:shd w:fill="FFFFFF"/>
+          </w:tcPr>
+          <w:p>
+            <w:pPr>
+              <w:spacing w:before="0" w:after="40" w:line="252" w:lineRule="auto"/>
+              <w:jc w:val="left"/>
+            </w:pPr>
+            <w:r>
+              <w:rPr>
+                <w:rFonts w:ascii="Calibri" w:hAnsi="Calibri"/>
+                <w:b w:val="0"/>
+                <w:color w:val="111827"/>
+                <w:sz w:val="16"/>
+              </w:rPr>
+              <w:t>Inspect scenario, state, frame, DTC, audit, and outbox</w:t>
+            </w:r>
+          </w:p>
+        </w:tc>
+        <w:tc>
+          <w:tcPr>
+            <w:tcW w:type="dxa" w:w="1410"/>
+            <w:tcMar>
+              <w:top w:w="80" w:type="dxa"/>
+              <w:start w:w="120" w:type="dxa"/>
+              <w:bottom w:w="80" w:type="dxa"/>
+              <w:end w:w="120" w:type="dxa"/>
+            </w:tcMar>
+            <w:vAlign w:val="center"/>
+            <w:shd w:fill="FFFFFF"/>
+          </w:tcPr>
+          <w:p>
+            <w:pPr>
+              <w:spacing w:before="0" w:after="40" w:line="252" w:lineRule="auto"/>
+              <w:jc w:val="left"/>
+            </w:pPr>
+            <w:r>
+              <w:rPr>
+                <w:rFonts w:ascii="Calibri" w:hAnsi="Calibri"/>
+                <w:b w:val="0"/>
+                <w:color w:val="111827"/>
+                <w:sz w:val="16"/>
+              </w:rPr>
+              <w:t>All records commit or all roll back</w:t>
+            </w:r>
+          </w:p>
+        </w:tc>
+      </w:tr>
+      <w:tr>
+        <w:trPr>
+          <w:cantSplit/>
+        </w:trPr>
+        <w:tc>
+          <w:tcPr>
+            <w:tcW w:type="dxa" w:w="1150"/>
+            <w:tcMar>
+              <w:top w:w="80" w:type="dxa"/>
+              <w:start w:w="120" w:type="dxa"/>
+              <w:bottom w:w="80" w:type="dxa"/>
+              <w:end w:w="120" w:type="dxa"/>
+            </w:tcMar>
+            <w:vAlign w:val="center"/>
+            <w:shd w:fill="FFFFFF"/>
+          </w:tcPr>
+          <w:p>
+            <w:pPr>
+              <w:spacing w:before="0" w:after="40" w:line="252" w:lineRule="auto"/>
+              <w:jc w:val="center"/>
+            </w:pPr>
+            <w:r>
+              <w:rPr>
+                <w:rFonts w:ascii="Calibri" w:hAnsi="Calibri"/>
+                <w:b w:val="0"/>
+                <w:color w:val="111827"/>
+                <w:sz w:val="16"/>
+              </w:rPr>
+              <w:t>EV-T-121</w:t>
+            </w:r>
+          </w:p>
+        </w:tc>
+        <w:tc>
+          <w:tcPr>
+            <w:tcW w:type="dxa" w:w="3700"/>
+            <w:tcMar>
+              <w:top w:w="80" w:type="dxa"/>
+              <w:start w:w="120" w:type="dxa"/>
+              <w:bottom w:w="80" w:type="dxa"/>
+              <w:end w:w="120" w:type="dxa"/>
+            </w:tcMar>
+            <w:vAlign w:val="center"/>
+            <w:shd w:fill="FFFFFF"/>
+          </w:tcPr>
+          <w:p>
+            <w:pPr>
+              <w:spacing w:before="0" w:after="40" w:line="252" w:lineRule="auto"/>
+              <w:jc w:val="left"/>
+            </w:pPr>
+            <w:r>
+              <w:rPr>
+                <w:rFonts w:ascii="Calibri" w:hAnsi="Calibri"/>
+                <w:b w:val="0"/>
+                <w:color w:val="111827"/>
+                <w:sz w:val="16"/>
+              </w:rPr>
+              <w:t>Scenario RBAC</w:t>
+            </w:r>
+          </w:p>
+        </w:tc>
+        <w:tc>
+          <w:tcPr>
+            <w:tcW w:type="dxa" w:w="3100"/>
+            <w:tcMar>
+              <w:top w:w="80" w:type="dxa"/>
+              <w:start w:w="120" w:type="dxa"/>
+              <w:bottom w:w="80" w:type="dxa"/>
+              <w:end w:w="120" w:type="dxa"/>
+            </w:tcMar>
+            <w:vAlign w:val="center"/>
+            <w:shd w:fill="FFFFFF"/>
+          </w:tcPr>
+          <w:p>
+            <w:pPr>
+              <w:spacing w:before="0" w:after="40" w:line="252" w:lineRule="auto"/>
+              <w:jc w:val="left"/>
+            </w:pPr>
+            <w:r>
+              <w:rPr>
+                <w:rFonts w:ascii="Calibri" w:hAnsi="Calibri"/>
+                <w:b w:val="0"/>
+                <w:color w:val="111827"/>
+                <w:sz w:val="16"/>
+              </w:rPr>
+              <w:t>Exercise read and mutation without permission</w:t>
+            </w:r>
+          </w:p>
+        </w:tc>
+        <w:tc>
+          <w:tcPr>
+            <w:tcW w:type="dxa" w:w="1410"/>
+            <w:tcMar>
+              <w:top w:w="80" w:type="dxa"/>
+              <w:start w:w="120" w:type="dxa"/>
+              <w:bottom w:w="80" w:type="dxa"/>
+              <w:end w:w="120" w:type="dxa"/>
+            </w:tcMar>
+            <w:vAlign w:val="center"/>
+            <w:shd w:fill="FFFFFF"/>
+          </w:tcPr>
+          <w:p>
+            <w:pPr>
+              <w:spacing w:before="0" w:after="40" w:line="252" w:lineRule="auto"/>
+              <w:jc w:val="left"/>
+            </w:pPr>
+            <w:r>
+              <w:rPr>
+                <w:rFonts w:ascii="Calibri" w:hAnsi="Calibri"/>
+                <w:b w:val="0"/>
+                <w:color w:val="111827"/>
+                <w:sz w:val="16"/>
+              </w:rPr>
+              <w:t>HTTP 403</w:t>
+            </w:r>
+          </w:p>
+        </w:tc>
+      </w:tr>
+      <w:tr>
+        <w:trPr>
+          <w:cantSplit/>
+        </w:trPr>
+        <w:tc>
+          <w:tcPr>
+            <w:tcW w:type="dxa" w:w="1150"/>
+            <w:tcMar>
+              <w:top w:w="80" w:type="dxa"/>
+              <w:start w:w="120" w:type="dxa"/>
+              <w:bottom w:w="80" w:type="dxa"/>
+              <w:end w:w="120" w:type="dxa"/>
+            </w:tcMar>
+            <w:vAlign w:val="center"/>
+            <w:shd w:fill="FFFFFF"/>
+          </w:tcPr>
+          <w:p>
+            <w:pPr>
+              <w:spacing w:before="0" w:after="40" w:line="252" w:lineRule="auto"/>
+              <w:jc w:val="center"/>
+            </w:pPr>
+            <w:r>
+              <w:rPr>
+                <w:rFonts w:ascii="Calibri" w:hAnsi="Calibri"/>
+                <w:b w:val="0"/>
+                <w:color w:val="111827"/>
+                <w:sz w:val="16"/>
+              </w:rPr>
+              <w:t>EV-T-122</w:t>
+            </w:r>
+          </w:p>
+        </w:tc>
+        <w:tc>
+          <w:tcPr>
+            <w:tcW w:type="dxa" w:w="3700"/>
+            <w:tcMar>
+              <w:top w:w="80" w:type="dxa"/>
+              <w:start w:w="120" w:type="dxa"/>
+              <w:bottom w:w="80" w:type="dxa"/>
+              <w:end w:w="120" w:type="dxa"/>
+            </w:tcMar>
+            <w:vAlign w:val="center"/>
+            <w:shd w:fill="FFFFFF"/>
+          </w:tcPr>
+          <w:p>
+            <w:pPr>
+              <w:spacing w:before="0" w:after="40" w:line="252" w:lineRule="auto"/>
+              <w:jc w:val="left"/>
+            </w:pPr>
+            <w:r>
+              <w:rPr>
+                <w:rFonts w:ascii="Calibri" w:hAnsi="Calibri"/>
+                <w:b w:val="0"/>
+                <w:color w:val="111827"/>
+                <w:sz w:val="16"/>
+              </w:rPr>
+              <w:t>Scenario pagination and migration</w:t>
+            </w:r>
+          </w:p>
+        </w:tc>
+        <w:tc>
+          <w:tcPr>
+            <w:tcW w:type="dxa" w:w="3100"/>
+            <w:tcMar>
+              <w:top w:w="80" w:type="dxa"/>
+              <w:start w:w="120" w:type="dxa"/>
+              <w:bottom w:w="80" w:type="dxa"/>
+              <w:end w:w="120" w:type="dxa"/>
+            </w:tcMar>
+            <w:vAlign w:val="center"/>
+            <w:shd w:fill="FFFFFF"/>
+          </w:tcPr>
+          <w:p>
+            <w:pPr>
+              <w:spacing w:before="0" w:after="40" w:line="252" w:lineRule="auto"/>
+              <w:jc w:val="left"/>
+            </w:pPr>
+            <w:r>
+              <w:rPr>
+                <w:rFonts w:ascii="Calibri" w:hAnsi="Calibri"/>
+                <w:b w:val="0"/>
+                <w:color w:val="111827"/>
+                <w:sz w:val="16"/>
+              </w:rPr>
+              <w:t>Inspect OpenAPI and revision 0043</w:t>
+            </w:r>
+          </w:p>
+        </w:tc>
+        <w:tc>
+          <w:tcPr>
+            <w:tcW w:type="dxa" w:w="1410"/>
+            <w:tcMar>
+              <w:top w:w="80" w:type="dxa"/>
+              <w:start w:w="120" w:type="dxa"/>
+              <w:bottom w:w="80" w:type="dxa"/>
+              <w:end w:w="120" w:type="dxa"/>
+            </w:tcMar>
+            <w:vAlign w:val="center"/>
+            <w:shd w:fill="FFFFFF"/>
+          </w:tcPr>
+          <w:p>
+            <w:pPr>
+              <w:spacing w:before="0" w:after="40" w:line="252" w:lineRule="auto"/>
+              <w:jc w:val="left"/>
+            </w:pPr>
+            <w:r>
+              <w:rPr>
+                <w:rFonts w:ascii="Calibri" w:hAnsi="Calibri"/>
+                <w:b w:val="0"/>
+                <w:color w:val="111827"/>
+                <w:sz w:val="16"/>
+              </w:rPr>
+              <w:t>Safe limits and reversible evidence table</w:t>
             </w:r>
           </w:p>
         </w:tc>
@@ -24591,7 +27011,7 @@
                 <w:color w:val="0B2545"/>
                 <w:sz w:val="17"/>
               </w:rPr>
-              <w:t>VI-1 through VI-6 evidence</w:t>
+              <w:t>VI-1 through VI-7 evidence</w:t>
             </w:r>
           </w:p>
         </w:tc>
@@ -24652,7 +27072,7 @@
                 <w:color w:val="111827"/>
                 <w:sz w:val="17"/>
               </w:rPr>
-              <w:t>Battery/BMS, propulsion, braking, charging, thermal zones, drive-cycle range, faults, replay, conflicts</w:t>
+              <w:t>Battery/BMS, propulsion, braking, charging, thermal, range, cross-domain protection, CAN, UDS, replay, conflicts</w:t>
             </w:r>
           </w:p>
         </w:tc>
@@ -25679,7 +28099,7 @@
                 <w:color w:val="111827"/>
                 <w:sz w:val="17"/>
               </w:rPr>
-              <w:t>Add an explicit projection/synchronization contract in VI-7</w:t>
+              <w:t>Add an explicit projection/synchronization contract when stateful trip scenarios are introduced</w:t>
             </w:r>
           </w:p>
         </w:tc>
@@ -25857,7 +28277,7 @@
                 <w:color w:val="111827"/>
                 <w:sz w:val="17"/>
               </w:rPr>
-              <w:t>Couple energy flow in VI-7 scenarios</w:t>
+              <w:t>Add a stateful drive-trip scenario after the safety baseline</w:t>
             </w:r>
           </w:p>
         </w:tc>
@@ -26035,7 +28455,7 @@
                 <w:color w:val="111827"/>
                 <w:sz w:val="17"/>
               </w:rPr>
-              <w:t>Couple braking to Volume II dynamics in VI-7</w:t>
+              <w:t>Couple braking to Volume II dynamics in a stateful trip scenario</w:t>
             </w:r>
           </w:p>
         </w:tc>
@@ -26480,7 +28900,7 @@
                 <w:color w:val="111827"/>
                 <w:sz w:val="17"/>
               </w:rPr>
-              <w:t>Couple range estimation to Volume II dynamics in VI-7</w:t>
+              <w:t>Couple range estimation to Volume II dynamics in a future trip scenario</w:t>
             </w:r>
           </w:p>
         </w:tc>
@@ -26658,7 +29078,185 @@
                 <w:color w:val="111827"/>
                 <w:sz w:val="17"/>
               </w:rPr>
-              <w:t>Apply energy through cross-domain scenarios in VI-7</w:t>
+              <w:t>Add a separate stateful drive execution contract</w:t>
+            </w:r>
+          </w:p>
+        </w:tc>
+      </w:tr>
+      <w:tr>
+        <w:trPr>
+          <w:cantSplit/>
+        </w:trPr>
+        <w:tc>
+          <w:tcPr>
+            <w:tcW w:type="dxa" w:w="1650"/>
+            <w:tcMar>
+              <w:top w:w="80" w:type="dxa"/>
+              <w:start w:w="120" w:type="dxa"/>
+              <w:bottom w:w="80" w:type="dxa"/>
+              <w:end w:w="120" w:type="dxa"/>
+            </w:tcMar>
+            <w:vAlign w:val="center"/>
+            <w:shd w:fill="FFFFFF"/>
+          </w:tcPr>
+          <w:p>
+            <w:pPr>
+              <w:spacing w:before="0" w:after="40" w:line="252" w:lineRule="auto"/>
+              <w:jc w:val="center"/>
+            </w:pPr>
+            <w:r>
+              <w:rPr>
+                <w:rFonts w:ascii="Calibri" w:hAnsi="Calibri"/>
+                <w:b w:val="0"/>
+                <w:color w:val="111827"/>
+                <w:sz w:val="17"/>
+              </w:rPr>
+              <w:t>First scenario covers one hazard</w:t>
+            </w:r>
+          </w:p>
+        </w:tc>
+        <w:tc>
+          <w:tcPr>
+            <w:tcW w:type="dxa" w:w="4450"/>
+            <w:tcMar>
+              <w:top w:w="80" w:type="dxa"/>
+              <w:start w:w="120" w:type="dxa"/>
+              <w:bottom w:w="80" w:type="dxa"/>
+              <w:end w:w="120" w:type="dxa"/>
+            </w:tcMar>
+            <w:vAlign w:val="center"/>
+            <w:shd w:fill="FFFFFF"/>
+          </w:tcPr>
+          <w:p>
+            <w:pPr>
+              <w:spacing w:before="0" w:after="40" w:line="252" w:lineRule="auto"/>
+              <w:jc w:val="left"/>
+            </w:pPr>
+            <w:r>
+              <w:rPr>
+                <w:rFonts w:ascii="Calibri" w:hAnsi="Calibri"/>
+                <w:b w:val="0"/>
+                <w:color w:val="111827"/>
+                <w:sz w:val="17"/>
+              </w:rPr>
+              <w:t>Drive and charging hazards are not yet orchestrated</w:t>
+            </w:r>
+          </w:p>
+        </w:tc>
+        <w:tc>
+          <w:tcPr>
+            <w:tcW w:type="dxa" w:w="3260"/>
+            <w:tcMar>
+              <w:top w:w="80" w:type="dxa"/>
+              <w:start w:w="120" w:type="dxa"/>
+              <w:bottom w:w="80" w:type="dxa"/>
+              <w:end w:w="120" w:type="dxa"/>
+            </w:tcMar>
+            <w:vAlign w:val="center"/>
+            <w:shd w:fill="FFFFFF"/>
+          </w:tcPr>
+          <w:p>
+            <w:pPr>
+              <w:spacing w:before="0" w:after="40" w:line="252" w:lineRule="auto"/>
+              <w:jc w:val="left"/>
+            </w:pPr>
+            <w:r>
+              <w:rPr>
+                <w:rFonts w:ascii="Calibri" w:hAnsi="Calibri"/>
+                <w:b w:val="0"/>
+                <w:color w:val="111827"/>
+                <w:sz w:val="17"/>
+              </w:rPr>
+              <w:t>Extend the template catalogue without weakening replay guarantees</w:t>
+            </w:r>
+          </w:p>
+        </w:tc>
+      </w:tr>
+      <w:tr>
+        <w:trPr>
+          <w:cantSplit/>
+        </w:trPr>
+        <w:tc>
+          <w:tcPr>
+            <w:tcW w:type="dxa" w:w="1650"/>
+            <w:tcMar>
+              <w:top w:w="80" w:type="dxa"/>
+              <w:start w:w="120" w:type="dxa"/>
+              <w:bottom w:w="80" w:type="dxa"/>
+              <w:end w:w="120" w:type="dxa"/>
+            </w:tcMar>
+            <w:vAlign w:val="center"/>
+            <w:shd w:fill="FFFFFF"/>
+          </w:tcPr>
+          <w:p>
+            <w:pPr>
+              <w:spacing w:before="0" w:after="40" w:line="252" w:lineRule="auto"/>
+              <w:jc w:val="center"/>
+            </w:pPr>
+            <w:r>
+              <w:rPr>
+                <w:rFonts w:ascii="Calibri" w:hAnsi="Calibri"/>
+                <w:b w:val="0"/>
+                <w:color w:val="111827"/>
+                <w:sz w:val="17"/>
+              </w:rPr>
+              <w:t>Simplified DTC code mapping</w:t>
+            </w:r>
+          </w:p>
+        </w:tc>
+        <w:tc>
+          <w:tcPr>
+            <w:tcW w:type="dxa" w:w="4450"/>
+            <w:tcMar>
+              <w:top w:w="80" w:type="dxa"/>
+              <w:start w:w="120" w:type="dxa"/>
+              <w:bottom w:w="80" w:type="dxa"/>
+              <w:end w:w="120" w:type="dxa"/>
+            </w:tcMar>
+            <w:vAlign w:val="center"/>
+            <w:shd w:fill="FFFFFF"/>
+          </w:tcPr>
+          <w:p>
+            <w:pPr>
+              <w:spacing w:before="0" w:after="40" w:line="252" w:lineRule="auto"/>
+              <w:jc w:val="left"/>
+            </w:pPr>
+            <w:r>
+              <w:rPr>
+                <w:rFonts w:ascii="Calibri" w:hAnsi="Calibri"/>
+                <w:b w:val="0"/>
+                <w:color w:val="111827"/>
+                <w:sz w:val="17"/>
+              </w:rPr>
+              <w:t>Not an OEM-specific diagnostic definition</w:t>
+            </w:r>
+          </w:p>
+        </w:tc>
+        <w:tc>
+          <w:tcPr>
+            <w:tcW w:type="dxa" w:w="3260"/>
+            <w:tcMar>
+              <w:top w:w="80" w:type="dxa"/>
+              <w:start w:w="120" w:type="dxa"/>
+              <w:bottom w:w="80" w:type="dxa"/>
+              <w:end w:w="120" w:type="dxa"/>
+            </w:tcMar>
+            <w:vAlign w:val="center"/>
+            <w:shd w:fill="FFFFFF"/>
+          </w:tcPr>
+          <w:p>
+            <w:pPr>
+              <w:spacing w:before="0" w:after="40" w:line="252" w:lineRule="auto"/>
+              <w:jc w:val="left"/>
+            </w:pPr>
+            <w:r>
+              <w:rPr>
+                <w:rFonts w:ascii="Calibri" w:hAnsi="Calibri"/>
+                <w:b w:val="0"/>
+                <w:color w:val="111827"/>
+                <w:sz w:val="17"/>
+              </w:rPr>
+              <w:t>Introduce versioned diagnostic catalogues and fault mappings</w:t>
             </w:r>
           </w:p>
         </w:tc>
@@ -26684,7 +29282,7 @@
         <w:pStyle w:val="ListNumber"/>
         <w:numPr>
           <w:ilvl w:val="0"/>
-          <w:numId w:val="28"/>
+          <w:numId w:val="29"/>
         </w:numPr>
         <w:spacing w:after="120"/>
       </w:pPr>
@@ -26702,7 +29300,7 @@
         <w:pStyle w:val="ListNumber"/>
         <w:numPr>
           <w:ilvl w:val="0"/>
-          <w:numId w:val="28"/>
+          <w:numId w:val="29"/>
         </w:numPr>
         <w:spacing w:after="120"/>
       </w:pPr>
@@ -26720,7 +29318,7 @@
         <w:pStyle w:val="ListNumber"/>
         <w:numPr>
           <w:ilvl w:val="0"/>
-          <w:numId w:val="28"/>
+          <w:numId w:val="29"/>
         </w:numPr>
         <w:spacing w:after="120"/>
       </w:pPr>
@@ -26738,7 +29336,7 @@
         <w:pStyle w:val="ListNumber"/>
         <w:numPr>
           <w:ilvl w:val="0"/>
-          <w:numId w:val="28"/>
+          <w:numId w:val="29"/>
         </w:numPr>
         <w:spacing w:after="120"/>
       </w:pPr>
@@ -26756,7 +29354,7 @@
         <w:pStyle w:val="ListNumber"/>
         <w:numPr>
           <w:ilvl w:val="0"/>
-          <w:numId w:val="28"/>
+          <w:numId w:val="29"/>
         </w:numPr>
         <w:spacing w:after="120"/>
       </w:pPr>
@@ -26774,7 +29372,7 @@
         <w:pStyle w:val="ListNumber"/>
         <w:numPr>
           <w:ilvl w:val="0"/>
-          <w:numId w:val="28"/>
+          <w:numId w:val="29"/>
         </w:numPr>
         <w:spacing w:after="120"/>
       </w:pPr>
@@ -26792,7 +29390,7 @@
         <w:pStyle w:val="ListNumber"/>
         <w:numPr>
           <w:ilvl w:val="0"/>
-          <w:numId w:val="28"/>
+          <w:numId w:val="29"/>
         </w:numPr>
         <w:spacing w:after="120"/>
       </w:pPr>
@@ -26810,7 +29408,7 @@
         <w:pStyle w:val="ListNumber"/>
         <w:numPr>
           <w:ilvl w:val="0"/>
-          <w:numId w:val="28"/>
+          <w:numId w:val="29"/>
         </w:numPr>
         <w:spacing w:after="120"/>
       </w:pPr>
@@ -26828,7 +29426,7 @@
         <w:pStyle w:val="ListNumber"/>
         <w:numPr>
           <w:ilvl w:val="0"/>
-          <w:numId w:val="28"/>
+          <w:numId w:val="29"/>
         </w:numPr>
         <w:spacing w:after="120"/>
       </w:pPr>
@@ -26846,7 +29444,7 @@
         <w:pStyle w:val="ListNumber"/>
         <w:numPr>
           <w:ilvl w:val="0"/>
-          <w:numId w:val="28"/>
+          <w:numId w:val="29"/>
         </w:numPr>
         <w:spacing w:after="120"/>
       </w:pPr>
@@ -26864,7 +29462,7 @@
         <w:pStyle w:val="ListNumber"/>
         <w:numPr>
           <w:ilvl w:val="0"/>
-          <w:numId w:val="28"/>
+          <w:numId w:val="29"/>
         </w:numPr>
         <w:spacing w:after="120"/>
       </w:pPr>
@@ -26882,7 +29480,7 @@
         <w:pStyle w:val="ListNumber"/>
         <w:numPr>
           <w:ilvl w:val="0"/>
-          <w:numId w:val="28"/>
+          <w:numId w:val="29"/>
         </w:numPr>
         <w:spacing w:after="120"/>
       </w:pPr>
@@ -26900,7 +29498,7 @@
         <w:pStyle w:val="ListNumber"/>
         <w:numPr>
           <w:ilvl w:val="0"/>
-          <w:numId w:val="28"/>
+          <w:numId w:val="29"/>
         </w:numPr>
         <w:spacing w:after="120"/>
       </w:pPr>
@@ -26918,7 +29516,7 @@
         <w:pStyle w:val="ListNumber"/>
         <w:numPr>
           <w:ilvl w:val="0"/>
-          <w:numId w:val="28"/>
+          <w:numId w:val="29"/>
         </w:numPr>
         <w:spacing w:after="120"/>
       </w:pPr>
@@ -26936,7 +29534,7 @@
         <w:pStyle w:val="ListNumber"/>
         <w:numPr>
           <w:ilvl w:val="0"/>
-          <w:numId w:val="28"/>
+          <w:numId w:val="29"/>
         </w:numPr>
         <w:spacing w:after="120"/>
       </w:pPr>
@@ -26954,7 +29552,7 @@
         <w:pStyle w:val="ListNumber"/>
         <w:numPr>
           <w:ilvl w:val="0"/>
-          <w:numId w:val="28"/>
+          <w:numId w:val="29"/>
         </w:numPr>
         <w:spacing w:after="120"/>
       </w:pPr>
@@ -26972,7 +29570,7 @@
         <w:pStyle w:val="ListNumber"/>
         <w:numPr>
           <w:ilvl w:val="0"/>
-          <w:numId w:val="28"/>
+          <w:numId w:val="29"/>
         </w:numPr>
         <w:spacing w:after="120"/>
       </w:pPr>
@@ -26990,7 +29588,7 @@
         <w:pStyle w:val="ListNumber"/>
         <w:numPr>
           <w:ilvl w:val="0"/>
-          <w:numId w:val="28"/>
+          <w:numId w:val="29"/>
         </w:numPr>
         <w:spacing w:after="120"/>
       </w:pPr>
@@ -27008,7 +29606,7 @@
         <w:pStyle w:val="ListNumber"/>
         <w:numPr>
           <w:ilvl w:val="0"/>
-          <w:numId w:val="28"/>
+          <w:numId w:val="29"/>
         </w:numPr>
         <w:spacing w:after="120"/>
       </w:pPr>
@@ -27026,7 +29624,7 @@
         <w:pStyle w:val="ListNumber"/>
         <w:numPr>
           <w:ilvl w:val="0"/>
-          <w:numId w:val="28"/>
+          <w:numId w:val="29"/>
         </w:numPr>
         <w:spacing w:after="120"/>
       </w:pPr>
@@ -27044,7 +29642,7 @@
         <w:pStyle w:val="ListNumber"/>
         <w:numPr>
           <w:ilvl w:val="0"/>
-          <w:numId w:val="28"/>
+          <w:numId w:val="29"/>
         </w:numPr>
         <w:spacing w:after="120"/>
       </w:pPr>
@@ -27062,7 +29660,7 @@
         <w:pStyle w:val="ListNumber"/>
         <w:numPr>
           <w:ilvl w:val="0"/>
-          <w:numId w:val="28"/>
+          <w:numId w:val="29"/>
         </w:numPr>
         <w:spacing w:after="120"/>
       </w:pPr>
@@ -27080,7 +29678,7 @@
         <w:pStyle w:val="ListNumber"/>
         <w:numPr>
           <w:ilvl w:val="0"/>
-          <w:numId w:val="28"/>
+          <w:numId w:val="29"/>
         </w:numPr>
         <w:spacing w:after="120"/>
       </w:pPr>
@@ -27098,7 +29696,7 @@
         <w:pStyle w:val="ListNumber"/>
         <w:numPr>
           <w:ilvl w:val="0"/>
-          <w:numId w:val="28"/>
+          <w:numId w:val="29"/>
         </w:numPr>
         <w:spacing w:after="120"/>
       </w:pPr>
@@ -27116,7 +29714,7 @@
         <w:pStyle w:val="ListNumber"/>
         <w:numPr>
           <w:ilvl w:val="0"/>
-          <w:numId w:val="28"/>
+          <w:numId w:val="29"/>
         </w:numPr>
         <w:spacing w:after="120"/>
       </w:pPr>
@@ -27134,7 +29732,7 @@
         <w:pStyle w:val="ListNumber"/>
         <w:numPr>
           <w:ilvl w:val="0"/>
-          <w:numId w:val="28"/>
+          <w:numId w:val="29"/>
         </w:numPr>
         <w:spacing w:after="120"/>
       </w:pPr>
@@ -27152,7 +29750,7 @@
         <w:pStyle w:val="ListNumber"/>
         <w:numPr>
           <w:ilvl w:val="0"/>
-          <w:numId w:val="28"/>
+          <w:numId w:val="29"/>
         </w:numPr>
         <w:spacing w:after="120"/>
       </w:pPr>
@@ -27170,7 +29768,7 @@
         <w:pStyle w:val="ListNumber"/>
         <w:numPr>
           <w:ilvl w:val="0"/>
-          <w:numId w:val="28"/>
+          <w:numId w:val="29"/>
         </w:numPr>
         <w:spacing w:after="120"/>
       </w:pPr>
@@ -27188,7 +29786,7 @@
         <w:pStyle w:val="ListNumber"/>
         <w:numPr>
           <w:ilvl w:val="0"/>
-          <w:numId w:val="28"/>
+          <w:numId w:val="29"/>
         </w:numPr>
         <w:spacing w:after="120"/>
       </w:pPr>
@@ -27206,7 +29804,7 @@
         <w:pStyle w:val="ListNumber"/>
         <w:numPr>
           <w:ilvl w:val="0"/>
-          <w:numId w:val="28"/>
+          <w:numId w:val="29"/>
         </w:numPr>
         <w:spacing w:after="120"/>
       </w:pPr>
@@ -27217,6 +29815,112 @@
           <w:sz w:val="22"/>
         </w:rPr>
         <w:t>Retry a range command and prove that the persisted cycle is not integrated twice.</w:t>
+      </w:r>
+    </w:p>
+    <w:p>
+      <w:pPr>
+        <w:pStyle w:val="ListNumber"/>
+        <w:numPr>
+          <w:ilvl w:val="0"/>
+          <w:numId w:val="29"/>
+        </w:numPr>
+        <w:spacing w:after="120"/>
+      </w:pPr>
+      <w:r>
+        <w:rPr>
+          <w:rFonts w:ascii="Calibri" w:hAnsi="Calibri"/>
+          <w:color w:val="111827"/>
+          <w:sz w:val="22"/>
+        </w:rPr>
+        <w:t>Configure a battery ECU and a BMS-owned CAN frame contract, then execute the overtemperature scenario.</w:t>
+      </w:r>
+    </w:p>
+    <w:p>
+      <w:pPr>
+        <w:pStyle w:val="ListNumber"/>
+        <w:numPr>
+          <w:ilvl w:val="0"/>
+          <w:numId w:val="29"/>
+        </w:numPr>
+        <w:spacing w:after="120"/>
+      </w:pPr>
+      <w:r>
+        <w:rPr>
+          <w:rFonts w:ascii="Calibri" w:hAnsi="Calibri"/>
+          <w:color w:val="111827"/>
+          <w:sz w:val="22"/>
+        </w:rPr>
+        <w:t>Decode the first two CAN payload bytes and verify the temperature in tenths of a degree Celsius.</w:t>
+      </w:r>
+    </w:p>
+    <w:p>
+      <w:pPr>
+        <w:pStyle w:val="ListNumber"/>
+        <w:numPr>
+          <w:ilvl w:val="0"/>
+          <w:numId w:val="29"/>
+        </w:numPr>
+        <w:spacing w:after="120"/>
+      </w:pPr>
+      <w:r>
+        <w:rPr>
+          <w:rFonts w:ascii="Calibri" w:hAnsi="Calibri"/>
+          <w:color w:val="111827"/>
+          <w:sz w:val="22"/>
+        </w:rPr>
+        <w:t xml:space="preserve">Read DTC </w:t>
+      </w:r>
+      <w:r>
+        <w:rPr>
+          <w:rFonts w:ascii="Consolas" w:hAnsi="Consolas"/>
+          <w:color w:val="1F4D78"/>
+          <w:sz w:val="19"/>
+        </w:rPr>
+        <w:t>0A7E00</w:t>
+      </w:r>
+      <w:r>
+        <w:rPr>
+          <w:rFonts w:ascii="Calibri" w:hAnsi="Calibri"/>
+          <w:color w:val="111827"/>
+          <w:sz w:val="22"/>
+        </w:rPr>
+        <w:t xml:space="preserve"> and compare its freeze frame with the scenario state evidence.</w:t>
+      </w:r>
+    </w:p>
+    <w:p>
+      <w:pPr>
+        <w:pStyle w:val="ListNumber"/>
+        <w:numPr>
+          <w:ilvl w:val="0"/>
+          <w:numId w:val="29"/>
+        </w:numPr>
+        <w:spacing w:after="120"/>
+      </w:pPr>
+      <w:r>
+        <w:rPr>
+          <w:rFonts w:ascii="Calibri" w:hAnsi="Calibri"/>
+          <w:color w:val="111827"/>
+          <w:sz w:val="22"/>
+        </w:rPr>
+        <w:t>Retry the execution and prove that no aggregate version advances twice.</w:t>
+      </w:r>
+    </w:p>
+    <w:p>
+      <w:pPr>
+        <w:pStyle w:val="ListNumber"/>
+        <w:numPr>
+          <w:ilvl w:val="0"/>
+          <w:numId w:val="29"/>
+        </w:numPr>
+        <w:spacing w:after="120"/>
+      </w:pPr>
+      <w:r>
+        <w:rPr>
+          <w:rFonts w:ascii="Calibri" w:hAnsi="Calibri"/>
+          <w:color w:val="111827"/>
+          <w:sz w:val="22"/>
+        </w:rPr>
+        <w:t>Change one expected version and prove that no domain or protocol record is mutated.</w:t>
       </w:r>
     </w:p>
     <w:p>
@@ -27324,7 +30028,7 @@
         <w:keepLines/>
       </w:pPr>
       <w:r>
-        <w:t>15. Next Development</w:t>
+        <w:t>15. VI-7 Cross-Domain EV Safety Scenario</w:t>
       </w:r>
     </w:p>
     <w:p>
@@ -27334,7 +30038,121 @@
           <w:color w:val="111827"/>
           <w:sz w:val="22"/>
         </w:rPr>
-        <w:t>VI-7 will add cross-domain EV scenarios that coordinate battery, powertrain, regenerative braking, charging, thermal management, and range through BMS ECU, CAN, UDS, automated tests, and correlated evidence.</w:t>
+        <w:t xml:space="preserve">VI-7 implements the battery-overtemperature flow described in the project vision. A single API operation applies the thermal stimulus and records the safety response across battery, propulsion, regenerative braking, charging, thermal management, and range. It also updates the selected BMS ECU, transmits a BMS-owned CAN frame, and stores UDS DTC </w:t>
+      </w:r>
+      <w:r>
+        <w:rPr>
+          <w:rFonts w:ascii="Consolas" w:hAnsi="Consolas"/>
+          <w:color w:val="1F4D78"/>
+          <w:sz w:val="19"/>
+        </w:rPr>
+        <w:t>0A7E00</w:t>
+      </w:r>
+      <w:r>
+        <w:rPr>
+          <w:rFonts w:ascii="Calibri" w:hAnsi="Calibri"/>
+          <w:color w:val="111827"/>
+          <w:sz w:val="22"/>
+        </w:rPr>
+        <w:t xml:space="preserve"> with freeze-frame data.</w:t>
+      </w:r>
+    </w:p>
+    <w:p>
+      <w:r>
+        <w:rPr>
+          <w:rFonts w:ascii="Calibri" w:hAnsi="Calibri"/>
+          <w:color w:val="111827"/>
+          <w:sz w:val="22"/>
+        </w:rPr>
+        <w:t>The transaction validates eight expected versions before the first mutation. Its result contains before and after versions, domain observations, CAN and UDS evidence, and explicit assertions. An exact retry returns the immutable result without advancing logical time or versions. Changed reuse and incompatible CAN ownership produce stable error codes.</w:t>
+      </w:r>
+    </w:p>
+    <w:p>
+      <w:r>
+        <w:rPr>
+          <w:rFonts w:ascii="Calibri" w:hAnsi="Calibri"/>
+          <w:color w:val="111827"/>
+          <w:sz w:val="22"/>
+        </w:rPr>
+        <w:t xml:space="preserve">The public contract consists of </w:t>
+      </w:r>
+      <w:r>
+        <w:rPr>
+          <w:rFonts w:ascii="Consolas" w:hAnsi="Consolas"/>
+          <w:color w:val="1F4D78"/>
+          <w:sz w:val="19"/>
+        </w:rPr>
+        <w:t>POST /scenarios</w:t>
+      </w:r>
+      <w:r>
+        <w:rPr>
+          <w:rFonts w:ascii="Calibri" w:hAnsi="Calibri"/>
+          <w:color w:val="111827"/>
+          <w:sz w:val="22"/>
+        </w:rPr>
+        <w:t xml:space="preserve">, </w:t>
+      </w:r>
+      <w:r>
+        <w:rPr>
+          <w:rFonts w:ascii="Consolas" w:hAnsi="Consolas"/>
+          <w:color w:val="1F4D78"/>
+          <w:sz w:val="19"/>
+        </w:rPr>
+        <w:t>GET /scenarios</w:t>
+      </w:r>
+      <w:r>
+        <w:rPr>
+          <w:rFonts w:ascii="Calibri" w:hAnsi="Calibri"/>
+          <w:color w:val="111827"/>
+          <w:sz w:val="22"/>
+        </w:rPr>
+        <w:t xml:space="preserve">, and </w:t>
+      </w:r>
+      <w:r>
+        <w:rPr>
+          <w:rFonts w:ascii="Consolas" w:hAnsi="Consolas"/>
+          <w:color w:val="1F4D78"/>
+          <w:sz w:val="19"/>
+        </w:rPr>
+        <w:t>GET /scenarios/{execution_id}</w:t>
+      </w:r>
+      <w:r>
+        <w:rPr>
+          <w:rFonts w:ascii="Calibri" w:hAnsi="Calibri"/>
+          <w:color w:val="111827"/>
+          <w:sz w:val="22"/>
+        </w:rPr>
+        <w:t xml:space="preserve"> under the vehicle electric API. List pagination is bounded at 100 items per request. Read and mutation operations use the existing Volume VI permissions.</w:t>
+      </w:r>
+    </w:p>
+    <w:p>
+      <w:r>
+        <w:rPr>
+          <w:rFonts w:ascii="Calibri" w:hAnsi="Calibri"/>
+          <w:color w:val="111827"/>
+          <w:sz w:val="22"/>
+        </w:rPr>
+        <w:t>The scenario runs entirely on the local ATEP stack. It requires no paid API, cloud account, LLM, or GPU.</w:t>
+      </w:r>
+    </w:p>
+    <w:p>
+      <w:pPr>
+        <w:pStyle w:val="Heading1"/>
+        <w:keepNext/>
+        <w:keepLines/>
+      </w:pPr>
+      <w:r>
+        <w:t>16. Next Development</w:t>
+      </w:r>
+    </w:p>
+    <w:p>
+      <w:r>
+        <w:rPr>
+          <w:rFonts w:ascii="Calibri" w:hAnsi="Calibri"/>
+          <w:color w:val="111827"/>
+          <w:sz w:val="22"/>
+        </w:rPr>
+        <w:t>Volume VI is complete. VII-1 should establish the ADAS world model: coordinate frames, road and lane geometry, actors, sensor-independent ground truth, deterministic logical time, bounded API contracts, and the first automated world-state tests.</w:t>
       </w:r>
     </w:p>
     <w:sectPr>
@@ -27366,7 +30184,7 @@
         <w:color w:val="667085"/>
         <w:sz w:val="17"/>
       </w:rPr>
-      <w:t>ATEP Volume VI Workbook  |  Version 0.6.0</w:t>
+      <w:t>ATEP Volume VI Workbook  |  Version 0.7.0</w:t>
     </w:r>
     <w:r>
       <w:rPr>
@@ -27756,6 +30574,12 @@
     </w:lvlOverride>
   </w:num>
   <w:num w:numId="28">
+    <w:abstractNumId w:val="10"/>
+    <w:lvlOverride w:ilvl="0">
+      <w:startOverride w:val="1"/>
+    </w:lvlOverride>
+  </w:num>
+  <w:num w:numId="29">
     <w:abstractNumId w:val="9"/>
     <w:lvlOverride w:ilvl="0">
       <w:startOverride w:val="1"/>

</xml_diff>

<commit_message>
feat(electric-vehicle): add cross-domain safety scenarios (#82)
</commit_message>
<xml_diff>
--- a/docs/ATEP_Volume_VI_Electric_Vehicle_Engineering_Workbook.docx
+++ b/docs/ATEP_Volume_VI_Electric_Vehicle_Engineering_Workbook.docx
@@ -143,7 +143,7 @@
                 <w:color w:val="0B2545"/>
                 <w:sz w:val="19"/>
               </w:rPr>
-              <w:t>0.6.0</w:t>
+              <w:t>0.7.0</w:t>
             </w:r>
           </w:p>
         </w:tc>
@@ -265,7 +265,7 @@
                 <w:color w:val="111827"/>
                 <w:sz w:val="19"/>
               </w:rPr>
-              <w:t>VI-1 through VI-6 implemented, including deterministic range estimation</w:t>
+              <w:t>Volume VI complete through VI-7, including cross-domain EV safety scenarios</w:t>
             </w:r>
           </w:p>
         </w:tc>
@@ -675,6 +675,25 @@
           <w:color w:val="0B2545"/>
           <w:sz w:val="21"/>
         </w:rPr>
+        <w:t>VI-7 Cross-Domain EV Safety Scenario</w:t>
+      </w:r>
+    </w:p>
+    <w:p>
+      <w:pPr>
+        <w:pStyle w:val="ListNumber"/>
+        <w:numPr>
+          <w:ilvl w:val="0"/>
+          <w:numId w:val="10"/>
+        </w:numPr>
+        <w:ind w:left="216" w:firstLine="0"/>
+      </w:pPr>
+      <w:r>
+        <w:rPr>
+          <w:rFonts w:ascii="Calibri" w:hAnsi="Calibri"/>
+          <w:b/>
+          <w:color w:val="0B2545"/>
+          <w:sz w:val="21"/>
+        </w:rPr>
         <w:t>Next Development</w:t>
       </w:r>
     </w:p>
@@ -892,7 +911,7 @@
                 <w:color w:val="111827"/>
                 <w:sz w:val="17"/>
               </w:rPr>
-              <w:t>0.6.0</w:t>
+              <w:t>0.7.0</w:t>
             </w:r>
           </w:p>
         </w:tc>
@@ -1014,7 +1033,7 @@
                 <w:color w:val="111827"/>
                 <w:sz w:val="17"/>
               </w:rPr>
-              <w:t>VI-1 through VI-6 implemented, including deterministic range estimation</w:t>
+              <w:t>Volume VI complete through VI-7, including cross-domain EV safety scenarios</w:t>
             </w:r>
           </w:p>
         </w:tc>
@@ -1103,7 +1122,7 @@
           <w:color w:val="111827"/>
           <w:sz w:val="22"/>
         </w:rPr>
-        <w:t>Volume VI turns the platform's general digital vehicle into a testable electric-energy system. VI-1 establishes a persistent battery pack and deterministic BMS behavior. VI-2 adds a persistent motor/inverter aggregate, torque delivery, efficiency, power loss, thermal protection, drive-mode limits, and battery-derived propulsion availability. VI-3 adds requested-deceleration control, regenerative energy recovery, battery charge acceptance, and blended friction braking. VI-4 adds AC/DC charging sessions, deterministic charge curves, lifecycle control, and faults. VI-5 adds coordinated heating and cooling for the battery, motor, inverter, and cabin. VI-6 adds deterministic energy-consumption and remaining-range estimates for bounded drive cycles.</w:t>
+        <w:t>Volume VI turns the platform's general digital vehicle into a testable electric-energy system. VI-1 establishes a persistent battery pack and deterministic BMS behavior. VI-2 adds a persistent motor/inverter aggregate, torque delivery, efficiency, power loss, thermal protection, drive-mode limits, and battery-derived propulsion availability. VI-3 adds requested-deceleration control, regenerative energy recovery, battery charge acceptance, and blended friction braking. VI-4 adds AC/DC charging sessions, deterministic charge curves, lifecycle control, and faults. VI-5 adds coordinated heating and cooling for the battery, motor, inverter, and cabin. VI-6 adds deterministic energy-consumption and remaining-range estimates for bounded drive cycles. VI-7 adds an atomic battery-overtemperature scenario with BMS ECU, CAN, UDS, state assertions, and correlated evidence across every Volume VI aggregate.</w:t>
       </w:r>
     </w:p>
     <w:p>
@@ -1713,7 +1732,7 @@
         <w:keepLines/>
       </w:pPr>
       <w:r>
-        <w:t>Deferred</w:t>
+        <w:t>In Scope for VI-7</w:t>
       </w:r>
     </w:p>
     <w:p>
@@ -1731,7 +1750,7 @@
           <w:color w:val="111827"/>
           <w:sz w:val="22"/>
         </w:rPr>
-        <w:t>chemistry-specific circuits, cell balancing, aging, sensor faults, and module topology;</w:t>
+        <w:t>one persisted battery-overtemperature safety scenario;</w:t>
       </w:r>
     </w:p>
     <w:p>
@@ -1749,7 +1768,125 @@
           <w:color w:val="111827"/>
           <w:sz w:val="22"/>
         </w:rPr>
-        <w:t>calibrated thermal circuits and BMS ECU, CAN, UDS, dashboard, and test orchestration.</w:t>
+        <w:t>coordinated battery, motor, braking, charging, thermal, and range reactions;</w:t>
+      </w:r>
+    </w:p>
+    <w:p>
+      <w:pPr>
+        <w:pStyle w:val="ListBullet"/>
+        <w:numPr>
+          <w:ilvl w:val="0"/>
+          <w:numId w:val="17"/>
+        </w:numPr>
+        <w:spacing w:after="80"/>
+      </w:pPr>
+      <w:r>
+        <w:rPr>
+          <w:rFonts w:ascii="Calibri" w:hAnsi="Calibri"/>
+          <w:color w:val="111827"/>
+          <w:sz w:val="22"/>
+        </w:rPr>
+        <w:t>battery ECU signal and confirmed fault state;</w:t>
+      </w:r>
+    </w:p>
+    <w:p>
+      <w:pPr>
+        <w:pStyle w:val="ListBullet"/>
+        <w:numPr>
+          <w:ilvl w:val="0"/>
+          <w:numId w:val="17"/>
+        </w:numPr>
+        <w:spacing w:after="80"/>
+      </w:pPr>
+      <w:r>
+        <w:rPr>
+          <w:rFonts w:ascii="Calibri" w:hAnsi="Calibri"/>
+          <w:color w:val="111827"/>
+          <w:sz w:val="22"/>
+        </w:rPr>
+        <w:t>contracted CAN transmission and UDS-readable DTC evidence;</w:t>
+      </w:r>
+    </w:p>
+    <w:p>
+      <w:pPr>
+        <w:pStyle w:val="ListBullet"/>
+        <w:numPr>
+          <w:ilvl w:val="0"/>
+          <w:numId w:val="17"/>
+        </w:numPr>
+        <w:spacing w:after="80"/>
+      </w:pPr>
+      <w:r>
+        <w:rPr>
+          <w:rFonts w:ascii="Calibri" w:hAnsi="Calibri"/>
+          <w:color w:val="111827"/>
+          <w:sz w:val="22"/>
+        </w:rPr>
+        <w:t>eight-resource optimistic concurrency, exact replay, stable conflicts, audit, and outbox;</w:t>
+      </w:r>
+    </w:p>
+    <w:p>
+      <w:pPr>
+        <w:pStyle w:val="ListBullet"/>
+        <w:numPr>
+          <w:ilvl w:val="0"/>
+          <w:numId w:val="17"/>
+        </w:numPr>
+        <w:spacing w:after="80"/>
+      </w:pPr>
+      <w:r>
+        <w:rPr>
+          <w:rFonts w:ascii="Calibri" w:hAnsi="Calibri"/>
+          <w:color w:val="111827"/>
+          <w:sz w:val="22"/>
+        </w:rPr>
+        <w:t>bounded scenario listing and retrieval APIs.</w:t>
+      </w:r>
+    </w:p>
+    <w:p>
+      <w:pPr>
+        <w:pStyle w:val="Heading2"/>
+        <w:keepNext/>
+        <w:keepLines/>
+      </w:pPr>
+      <w:r>
+        <w:t>Deferred</w:t>
+      </w:r>
+    </w:p>
+    <w:p>
+      <w:pPr>
+        <w:pStyle w:val="ListBullet"/>
+        <w:numPr>
+          <w:ilvl w:val="0"/>
+          <w:numId w:val="18"/>
+        </w:numPr>
+        <w:spacing w:after="80"/>
+      </w:pPr>
+      <w:r>
+        <w:rPr>
+          <w:rFonts w:ascii="Calibri" w:hAnsi="Calibri"/>
+          <w:color w:val="111827"/>
+          <w:sz w:val="22"/>
+        </w:rPr>
+        <w:t>chemistry-specific circuits, cell balancing, aging, sensor faults, and module topology;</w:t>
+      </w:r>
+    </w:p>
+    <w:p>
+      <w:pPr>
+        <w:pStyle w:val="ListBullet"/>
+        <w:numPr>
+          <w:ilvl w:val="0"/>
+          <w:numId w:val="18"/>
+        </w:numPr>
+        <w:spacing w:after="80"/>
+      </w:pPr>
+      <w:r>
+        <w:rPr>
+          <w:rFonts w:ascii="Calibri" w:hAnsi="Calibri"/>
+          <w:color w:val="111827"/>
+          <w:sz w:val="22"/>
+        </w:rPr>
+        <w:t>calibrated thermal circuits, stateful drive trips, dashboard integration, and test scheduling.</w:t>
       </w:r>
     </w:p>
     <w:p>
@@ -1905,6 +2042,22 @@
           <w:color w:val="1F4D78"/>
           <w:sz w:val="19"/>
         </w:rPr>
+        <w:t>ElectricVehicleScenarioExecution</w:t>
+      </w:r>
+      <w:r>
+        <w:rPr>
+          <w:rFonts w:ascii="Calibri" w:hAnsi="Calibri"/>
+          <w:color w:val="111827"/>
+          <w:sz w:val="22"/>
+        </w:rPr>
+        <w:t xml:space="preserve"> correlates the six EV aggregates with the BMS ECU, CAN transmission, UDS DTC, assertions, and versions. </w:t>
+      </w:r>
+      <w:r>
+        <w:rPr>
+          <w:rFonts w:ascii="Consolas" w:hAnsi="Consolas"/>
+          <w:color w:val="1F4D78"/>
+          <w:sz w:val="19"/>
+        </w:rPr>
         <w:t>AuditRecord</w:t>
       </w:r>
       <w:r>
@@ -1929,7 +2082,7 @@
           <w:color w:val="111827"/>
           <w:sz w:val="22"/>
         </w:rPr>
-        <w:t xml:space="preserve"> commit in the same database transaction as each accepted mutation.</w:t>
+        <w:t xml:space="preserve"> commit in the same transaction as each accepted mutation.</w:t>
       </w:r>
     </w:p>
     <w:p>
@@ -4071,6 +4224,184 @@
           </w:p>
         </w:tc>
       </w:tr>
+      <w:tr>
+        <w:trPr>
+          <w:cantSplit/>
+        </w:trPr>
+        <w:tc>
+          <w:tcPr>
+            <w:tcW w:type="dxa" w:w="1650"/>
+            <w:tcMar>
+              <w:top w:w="80" w:type="dxa"/>
+              <w:start w:w="120" w:type="dxa"/>
+              <w:bottom w:w="80" w:type="dxa"/>
+              <w:end w:w="120" w:type="dxa"/>
+            </w:tcMar>
+            <w:vAlign w:val="center"/>
+            <w:shd w:fill="FFFFFF"/>
+          </w:tcPr>
+          <w:p>
+            <w:pPr>
+              <w:spacing w:before="0" w:after="40" w:line="252" w:lineRule="auto"/>
+              <w:jc w:val="center"/>
+            </w:pPr>
+            <w:r>
+              <w:rPr>
+                <w:rFonts w:ascii="Calibri" w:hAnsi="Calibri"/>
+                <w:b w:val="0"/>
+                <w:color w:val="111827"/>
+                <w:sz w:val="17"/>
+              </w:rPr>
+              <w:t>ElectricVehicleScenarioExecution</w:t>
+            </w:r>
+          </w:p>
+        </w:tc>
+        <w:tc>
+          <w:tcPr>
+            <w:tcW w:type="dxa" w:w="4450"/>
+            <w:tcMar>
+              <w:top w:w="80" w:type="dxa"/>
+              <w:start w:w="120" w:type="dxa"/>
+              <w:bottom w:w="80" w:type="dxa"/>
+              <w:end w:w="120" w:type="dxa"/>
+            </w:tcMar>
+            <w:vAlign w:val="center"/>
+            <w:shd w:fill="FFFFFF"/>
+          </w:tcPr>
+          <w:p>
+            <w:pPr>
+              <w:spacing w:before="0" w:after="40" w:line="252" w:lineRule="auto"/>
+              <w:jc w:val="left"/>
+            </w:pPr>
+            <w:r>
+              <w:rPr>
+                <w:rFonts w:ascii="Calibri" w:hAnsi="Calibri"/>
+                <w:b w:val="0"/>
+                <w:color w:val="111827"/>
+                <w:sz w:val="17"/>
+              </w:rPr>
+              <w:t>Immutable cross-domain evidence and replay identity</w:t>
+            </w:r>
+          </w:p>
+        </w:tc>
+        <w:tc>
+          <w:tcPr>
+            <w:tcW w:type="dxa" w:w="3260"/>
+            <w:tcMar>
+              <w:top w:w="80" w:type="dxa"/>
+              <w:start w:w="120" w:type="dxa"/>
+              <w:bottom w:w="80" w:type="dxa"/>
+              <w:end w:w="120" w:type="dxa"/>
+            </w:tcMar>
+            <w:vAlign w:val="center"/>
+            <w:shd w:fill="FFFFFF"/>
+          </w:tcPr>
+          <w:p>
+            <w:pPr>
+              <w:spacing w:before="0" w:after="40" w:line="252" w:lineRule="auto"/>
+              <w:jc w:val="left"/>
+            </w:pPr>
+            <w:r>
+              <w:rPr>
+                <w:rFonts w:ascii="Calibri" w:hAnsi="Calibri"/>
+                <w:b w:val="0"/>
+                <w:color w:val="111827"/>
+                <w:sz w:val="17"/>
+              </w:rPr>
+              <w:t>one row per vehicle and execution ID</w:t>
+            </w:r>
+          </w:p>
+        </w:tc>
+      </w:tr>
+      <w:tr>
+        <w:trPr>
+          <w:cantSplit/>
+        </w:trPr>
+        <w:tc>
+          <w:tcPr>
+            <w:tcW w:type="dxa" w:w="1650"/>
+            <w:tcMar>
+              <w:top w:w="80" w:type="dxa"/>
+              <w:start w:w="120" w:type="dxa"/>
+              <w:bottom w:w="80" w:type="dxa"/>
+              <w:end w:w="120" w:type="dxa"/>
+            </w:tcMar>
+            <w:vAlign w:val="center"/>
+            <w:shd w:fill="FFFFFF"/>
+          </w:tcPr>
+          <w:p>
+            <w:pPr>
+              <w:spacing w:before="0" w:after="40" w:line="252" w:lineRule="auto"/>
+              <w:jc w:val="center"/>
+            </w:pPr>
+            <w:r>
+              <w:rPr>
+                <w:rFonts w:ascii="Calibri" w:hAnsi="Calibri"/>
+                <w:b w:val="0"/>
+                <w:color w:val="111827"/>
+                <w:sz w:val="17"/>
+              </w:rPr>
+              <w:t>Scenario assertion</w:t>
+            </w:r>
+          </w:p>
+        </w:tc>
+        <w:tc>
+          <w:tcPr>
+            <w:tcW w:type="dxa" w:w="4450"/>
+            <w:tcMar>
+              <w:top w:w="80" w:type="dxa"/>
+              <w:start w:w="120" w:type="dxa"/>
+              <w:bottom w:w="80" w:type="dxa"/>
+              <w:end w:w="120" w:type="dxa"/>
+            </w:tcMar>
+            <w:vAlign w:val="center"/>
+            <w:shd w:fill="FFFFFF"/>
+          </w:tcPr>
+          <w:p>
+            <w:pPr>
+              <w:spacing w:before="0" w:after="40" w:line="252" w:lineRule="auto"/>
+              <w:jc w:val="left"/>
+            </w:pPr>
+            <w:r>
+              <w:rPr>
+                <w:rFonts w:ascii="Calibri" w:hAnsi="Calibri"/>
+                <w:b w:val="0"/>
+                <w:color w:val="111827"/>
+                <w:sz w:val="17"/>
+              </w:rPr>
+              <w:t>Machine-readable safety expectation</w:t>
+            </w:r>
+          </w:p>
+        </w:tc>
+        <w:tc>
+          <w:tcPr>
+            <w:tcW w:type="dxa" w:w="3260"/>
+            <w:tcMar>
+              <w:top w:w="80" w:type="dxa"/>
+              <w:start w:w="120" w:type="dxa"/>
+              <w:bottom w:w="80" w:type="dxa"/>
+              <w:end w:w="120" w:type="dxa"/>
+            </w:tcMar>
+            <w:vAlign w:val="center"/>
+            <w:shd w:fill="FFFFFF"/>
+          </w:tcPr>
+          <w:p>
+            <w:pPr>
+              <w:spacing w:before="0" w:after="40" w:line="252" w:lineRule="auto"/>
+              <w:jc w:val="left"/>
+            </w:pPr>
+            <w:r>
+              <w:rPr>
+                <w:rFonts w:ascii="Calibri" w:hAnsi="Calibri"/>
+                <w:b w:val="0"/>
+                <w:color w:val="111827"/>
+                <w:sz w:val="17"/>
+              </w:rPr>
+              <w:t>observed value, expected value, pass or fail</w:t>
+            </w:r>
+          </w:p>
+        </w:tc>
+      </w:tr>
     </w:tbl>
     <w:p>
       <w:pPr>
@@ -4122,7 +4453,7 @@
         <w:pStyle w:val="ListBullet"/>
         <w:numPr>
           <w:ilvl w:val="0"/>
-          <w:numId w:val="18"/>
+          <w:numId w:val="19"/>
         </w:numPr>
         <w:spacing w:after="80"/>
       </w:pPr>
@@ -4140,7 +4471,7 @@
         <w:pStyle w:val="ListBullet"/>
         <w:numPr>
           <w:ilvl w:val="0"/>
-          <w:numId w:val="18"/>
+          <w:numId w:val="19"/>
         </w:numPr>
         <w:spacing w:after="80"/>
       </w:pPr>
@@ -4158,7 +4489,7 @@
         <w:pStyle w:val="ListBullet"/>
         <w:numPr>
           <w:ilvl w:val="0"/>
-          <w:numId w:val="18"/>
+          <w:numId w:val="19"/>
         </w:numPr>
         <w:spacing w:after="80"/>
       </w:pPr>
@@ -4186,7 +4517,7 @@
         <w:pStyle w:val="ListBullet"/>
         <w:numPr>
           <w:ilvl w:val="0"/>
-          <w:numId w:val="19"/>
+          <w:numId w:val="20"/>
         </w:numPr>
         <w:spacing w:after="80"/>
       </w:pPr>
@@ -4204,7 +4535,7 @@
         <w:pStyle w:val="ListBullet"/>
         <w:numPr>
           <w:ilvl w:val="0"/>
-          <w:numId w:val="19"/>
+          <w:numId w:val="20"/>
         </w:numPr>
         <w:spacing w:after="80"/>
       </w:pPr>
@@ -4232,7 +4563,7 @@
         <w:pStyle w:val="ListBullet"/>
         <w:numPr>
           <w:ilvl w:val="0"/>
-          <w:numId w:val="20"/>
+          <w:numId w:val="21"/>
         </w:numPr>
         <w:spacing w:after="80"/>
       </w:pPr>
@@ -4270,7 +4601,7 @@
         <w:pStyle w:val="ListBullet"/>
         <w:numPr>
           <w:ilvl w:val="0"/>
-          <w:numId w:val="21"/>
+          <w:numId w:val="22"/>
         </w:numPr>
         <w:spacing w:after="80"/>
       </w:pPr>
@@ -4288,7 +4619,7 @@
         <w:pStyle w:val="ListBullet"/>
         <w:numPr>
           <w:ilvl w:val="0"/>
-          <w:numId w:val="21"/>
+          <w:numId w:val="22"/>
         </w:numPr>
         <w:spacing w:after="80"/>
       </w:pPr>
@@ -4306,7 +4637,7 @@
         <w:pStyle w:val="ListBullet"/>
         <w:numPr>
           <w:ilvl w:val="0"/>
-          <w:numId w:val="21"/>
+          <w:numId w:val="22"/>
         </w:numPr>
         <w:spacing w:after="80"/>
       </w:pPr>
@@ -4324,7 +4655,7 @@
         <w:pStyle w:val="ListBullet"/>
         <w:numPr>
           <w:ilvl w:val="0"/>
-          <w:numId w:val="21"/>
+          <w:numId w:val="22"/>
         </w:numPr>
         <w:spacing w:after="80"/>
       </w:pPr>
@@ -4342,7 +4673,7 @@
         <w:pStyle w:val="ListBullet"/>
         <w:numPr>
           <w:ilvl w:val="0"/>
-          <w:numId w:val="21"/>
+          <w:numId w:val="22"/>
         </w:numPr>
         <w:spacing w:after="80"/>
       </w:pPr>
@@ -4360,7 +4691,7 @@
         <w:pStyle w:val="ListBullet"/>
         <w:numPr>
           <w:ilvl w:val="0"/>
-          <w:numId w:val="21"/>
+          <w:numId w:val="22"/>
         </w:numPr>
         <w:spacing w:after="80"/>
       </w:pPr>
@@ -4388,7 +4719,7 @@
         <w:pStyle w:val="ListBullet"/>
         <w:numPr>
           <w:ilvl w:val="0"/>
-          <w:numId w:val="22"/>
+          <w:numId w:val="23"/>
         </w:numPr>
         <w:spacing w:after="80"/>
       </w:pPr>
@@ -4406,7 +4737,7 @@
         <w:pStyle w:val="ListBullet"/>
         <w:numPr>
           <w:ilvl w:val="0"/>
-          <w:numId w:val="22"/>
+          <w:numId w:val="23"/>
         </w:numPr>
         <w:spacing w:after="80"/>
       </w:pPr>
@@ -4424,7 +4755,7 @@
         <w:pStyle w:val="ListBullet"/>
         <w:numPr>
           <w:ilvl w:val="0"/>
-          <w:numId w:val="22"/>
+          <w:numId w:val="23"/>
         </w:numPr>
         <w:spacing w:after="80"/>
       </w:pPr>
@@ -4442,7 +4773,7 @@
         <w:pStyle w:val="ListBullet"/>
         <w:numPr>
           <w:ilvl w:val="0"/>
-          <w:numId w:val="22"/>
+          <w:numId w:val="23"/>
         </w:numPr>
         <w:spacing w:after="80"/>
       </w:pPr>
@@ -4460,7 +4791,7 @@
         <w:pStyle w:val="ListBullet"/>
         <w:numPr>
           <w:ilvl w:val="0"/>
-          <w:numId w:val="22"/>
+          <w:numId w:val="23"/>
         </w:numPr>
         <w:spacing w:after="80"/>
       </w:pPr>
@@ -4508,7 +4839,7 @@
         <w:pStyle w:val="ListBullet"/>
         <w:numPr>
           <w:ilvl w:val="0"/>
-          <w:numId w:val="23"/>
+          <w:numId w:val="24"/>
         </w:numPr>
         <w:spacing w:after="80"/>
       </w:pPr>
@@ -4526,7 +4857,7 @@
         <w:pStyle w:val="ListBullet"/>
         <w:numPr>
           <w:ilvl w:val="0"/>
-          <w:numId w:val="23"/>
+          <w:numId w:val="24"/>
         </w:numPr>
         <w:spacing w:after="80"/>
       </w:pPr>
@@ -4544,7 +4875,7 @@
         <w:pStyle w:val="ListBullet"/>
         <w:numPr>
           <w:ilvl w:val="0"/>
-          <w:numId w:val="23"/>
+          <w:numId w:val="24"/>
         </w:numPr>
         <w:spacing w:after="80"/>
       </w:pPr>
@@ -4562,7 +4893,7 @@
         <w:pStyle w:val="ListBullet"/>
         <w:numPr>
           <w:ilvl w:val="0"/>
-          <w:numId w:val="23"/>
+          <w:numId w:val="24"/>
         </w:numPr>
         <w:spacing w:after="80"/>
       </w:pPr>
@@ -4590,7 +4921,7 @@
         <w:pStyle w:val="ListBullet"/>
         <w:numPr>
           <w:ilvl w:val="0"/>
-          <w:numId w:val="24"/>
+          <w:numId w:val="25"/>
         </w:numPr>
         <w:spacing w:after="80"/>
       </w:pPr>
@@ -4608,7 +4939,7 @@
         <w:pStyle w:val="ListBullet"/>
         <w:numPr>
           <w:ilvl w:val="0"/>
-          <w:numId w:val="24"/>
+          <w:numId w:val="25"/>
         </w:numPr>
         <w:spacing w:after="80"/>
       </w:pPr>
@@ -4636,7 +4967,7 @@
         <w:pStyle w:val="ListBullet"/>
         <w:numPr>
           <w:ilvl w:val="0"/>
-          <w:numId w:val="25"/>
+          <w:numId w:val="26"/>
         </w:numPr>
         <w:spacing w:after="80"/>
       </w:pPr>
@@ -4654,7 +4985,7 @@
         <w:pStyle w:val="ListBullet"/>
         <w:numPr>
           <w:ilvl w:val="0"/>
-          <w:numId w:val="25"/>
+          <w:numId w:val="26"/>
         </w:numPr>
         <w:spacing w:after="80"/>
       </w:pPr>
@@ -4672,7 +5003,7 @@
         <w:pStyle w:val="ListBullet"/>
         <w:numPr>
           <w:ilvl w:val="0"/>
-          <w:numId w:val="25"/>
+          <w:numId w:val="26"/>
         </w:numPr>
         <w:spacing w:after="80"/>
       </w:pPr>
@@ -4700,7 +5031,7 @@
         <w:pStyle w:val="ListBullet"/>
         <w:numPr>
           <w:ilvl w:val="0"/>
-          <w:numId w:val="26"/>
+          <w:numId w:val="27"/>
         </w:numPr>
         <w:spacing w:after="80"/>
       </w:pPr>
@@ -4718,7 +5049,7 @@
         <w:pStyle w:val="ListBullet"/>
         <w:numPr>
           <w:ilvl w:val="0"/>
-          <w:numId w:val="26"/>
+          <w:numId w:val="27"/>
         </w:numPr>
         <w:spacing w:after="80"/>
       </w:pPr>
@@ -4736,7 +5067,7 @@
         <w:pStyle w:val="ListBullet"/>
         <w:numPr>
           <w:ilvl w:val="0"/>
-          <w:numId w:val="26"/>
+          <w:numId w:val="27"/>
         </w:numPr>
         <w:spacing w:after="80"/>
       </w:pPr>
@@ -4764,7 +5095,7 @@
         <w:pStyle w:val="ListBullet"/>
         <w:numPr>
           <w:ilvl w:val="0"/>
-          <w:numId w:val="27"/>
+          <w:numId w:val="28"/>
         </w:numPr>
         <w:spacing w:after="80"/>
       </w:pPr>
@@ -4782,7 +5113,7 @@
         <w:pStyle w:val="ListBullet"/>
         <w:numPr>
           <w:ilvl w:val="0"/>
-          <w:numId w:val="27"/>
+          <w:numId w:val="28"/>
         </w:numPr>
         <w:spacing w:after="80"/>
       </w:pPr>
@@ -4800,7 +5131,7 @@
         <w:pStyle w:val="ListBullet"/>
         <w:numPr>
           <w:ilvl w:val="0"/>
-          <w:numId w:val="27"/>
+          <w:numId w:val="28"/>
         </w:numPr>
         <w:spacing w:after="80"/>
       </w:pPr>
@@ -4818,7 +5149,7 @@
         <w:pStyle w:val="ListBullet"/>
         <w:numPr>
           <w:ilvl w:val="0"/>
-          <w:numId w:val="27"/>
+          <w:numId w:val="28"/>
         </w:numPr>
         <w:spacing w:after="80"/>
       </w:pPr>
@@ -4836,7 +5167,7 @@
         <w:pStyle w:val="ListBullet"/>
         <w:numPr>
           <w:ilvl w:val="0"/>
-          <w:numId w:val="27"/>
+          <w:numId w:val="28"/>
         </w:numPr>
         <w:spacing w:after="80"/>
       </w:pPr>
@@ -4854,7 +5185,7 @@
         <w:pStyle w:val="ListBullet"/>
         <w:numPr>
           <w:ilvl w:val="0"/>
-          <w:numId w:val="27"/>
+          <w:numId w:val="28"/>
         </w:numPr>
         <w:spacing w:after="80"/>
       </w:pPr>
@@ -4872,7 +5203,7 @@
         <w:pStyle w:val="ListBullet"/>
         <w:numPr>
           <w:ilvl w:val="0"/>
-          <w:numId w:val="27"/>
+          <w:numId w:val="28"/>
         </w:numPr>
         <w:spacing w:after="80"/>
       </w:pPr>
@@ -4890,7 +5221,7 @@
         <w:pStyle w:val="ListBullet"/>
         <w:numPr>
           <w:ilvl w:val="0"/>
-          <w:numId w:val="27"/>
+          <w:numId w:val="28"/>
         </w:numPr>
         <w:spacing w:after="80"/>
       </w:pPr>
@@ -7387,6 +7718,273 @@
           </w:p>
         </w:tc>
       </w:tr>
+      <w:tr>
+        <w:trPr>
+          <w:cantSplit/>
+        </w:trPr>
+        <w:tc>
+          <w:tcPr>
+            <w:tcW w:type="dxa" w:w="3100"/>
+            <w:tcMar>
+              <w:top w:w="80" w:type="dxa"/>
+              <w:start w:w="120" w:type="dxa"/>
+              <w:bottom w:w="80" w:type="dxa"/>
+              <w:end w:w="120" w:type="dxa"/>
+            </w:tcMar>
+            <w:vAlign w:val="center"/>
+            <w:shd w:fill="FFFFFF"/>
+          </w:tcPr>
+          <w:p>
+            <w:pPr>
+              <w:spacing w:before="0" w:after="40" w:line="252" w:lineRule="auto"/>
+              <w:jc w:val="center"/>
+            </w:pPr>
+            <w:r>
+              <w:rPr>
+                <w:rFonts w:ascii="Calibri" w:hAnsi="Calibri"/>
+                <w:b w:val="0"/>
+                <w:color w:val="111827"/>
+                <w:sz w:val="17"/>
+              </w:rPr>
+              <w:t>POST /api/v1/vehicles/{vehicle_id}/electric/scenarios</w:t>
+            </w:r>
+          </w:p>
+        </w:tc>
+        <w:tc>
+          <w:tcPr>
+            <w:tcW w:type="dxa" w:w="4000"/>
+            <w:tcMar>
+              <w:top w:w="80" w:type="dxa"/>
+              <w:start w:w="120" w:type="dxa"/>
+              <w:bottom w:w="80" w:type="dxa"/>
+              <w:end w:w="120" w:type="dxa"/>
+            </w:tcMar>
+            <w:vAlign w:val="center"/>
+            <w:shd w:fill="FFFFFF"/>
+          </w:tcPr>
+          <w:p>
+            <w:pPr>
+              <w:spacing w:before="0" w:after="40" w:line="252" w:lineRule="auto"/>
+              <w:jc w:val="left"/>
+            </w:pPr>
+            <w:r>
+              <w:rPr>
+                <w:rFonts w:ascii="Calibri" w:hAnsi="Calibri"/>
+                <w:b w:val="0"/>
+                <w:color w:val="111827"/>
+                <w:sz w:val="17"/>
+              </w:rPr>
+              <w:t>Execute an atomic cross-domain safety scenario</w:t>
+            </w:r>
+          </w:p>
+        </w:tc>
+        <w:tc>
+          <w:tcPr>
+            <w:tcW w:type="dxa" w:w="2260"/>
+            <w:tcMar>
+              <w:top w:w="80" w:type="dxa"/>
+              <w:start w:w="120" w:type="dxa"/>
+              <w:bottom w:w="80" w:type="dxa"/>
+              <w:end w:w="120" w:type="dxa"/>
+            </w:tcMar>
+            <w:vAlign w:val="center"/>
+            <w:shd w:fill="FFFFFF"/>
+          </w:tcPr>
+          <w:p>
+            <w:pPr>
+              <w:spacing w:before="0" w:after="40" w:line="252" w:lineRule="auto"/>
+              <w:jc w:val="left"/>
+            </w:pPr>
+            <w:r>
+              <w:rPr>
+                <w:rFonts w:ascii="Calibri" w:hAnsi="Calibri"/>
+                <w:b w:val="0"/>
+                <w:color w:val="111827"/>
+                <w:sz w:val="17"/>
+              </w:rPr>
+              <w:t>electric_vehicle:manage</w:t>
+            </w:r>
+          </w:p>
+        </w:tc>
+      </w:tr>
+      <w:tr>
+        <w:trPr>
+          <w:cantSplit/>
+        </w:trPr>
+        <w:tc>
+          <w:tcPr>
+            <w:tcW w:type="dxa" w:w="3100"/>
+            <w:tcMar>
+              <w:top w:w="80" w:type="dxa"/>
+              <w:start w:w="120" w:type="dxa"/>
+              <w:bottom w:w="80" w:type="dxa"/>
+              <w:end w:w="120" w:type="dxa"/>
+            </w:tcMar>
+            <w:vAlign w:val="center"/>
+            <w:shd w:fill="FFFFFF"/>
+          </w:tcPr>
+          <w:p>
+            <w:pPr>
+              <w:spacing w:before="0" w:after="40" w:line="252" w:lineRule="auto"/>
+              <w:jc w:val="center"/>
+            </w:pPr>
+            <w:r>
+              <w:rPr>
+                <w:rFonts w:ascii="Calibri" w:hAnsi="Calibri"/>
+                <w:b w:val="0"/>
+                <w:color w:val="111827"/>
+                <w:sz w:val="17"/>
+              </w:rPr>
+              <w:t>GET /api/v1/vehicles/{vehicle_id}/electric/scenarios</w:t>
+            </w:r>
+          </w:p>
+        </w:tc>
+        <w:tc>
+          <w:tcPr>
+            <w:tcW w:type="dxa" w:w="4000"/>
+            <w:tcMar>
+              <w:top w:w="80" w:type="dxa"/>
+              <w:start w:w="120" w:type="dxa"/>
+              <w:bottom w:w="80" w:type="dxa"/>
+              <w:end w:w="120" w:type="dxa"/>
+            </w:tcMar>
+            <w:vAlign w:val="center"/>
+            <w:shd w:fill="FFFFFF"/>
+          </w:tcPr>
+          <w:p>
+            <w:pPr>
+              <w:spacing w:before="0" w:after="40" w:line="252" w:lineRule="auto"/>
+              <w:jc w:val="left"/>
+            </w:pPr>
+            <w:r>
+              <w:rPr>
+                <w:rFonts w:ascii="Calibri" w:hAnsi="Calibri"/>
+                <w:b w:val="0"/>
+                <w:color w:val="111827"/>
+                <w:sz w:val="17"/>
+              </w:rPr>
+              <w:t>List persisted scenario evidence</w:t>
+            </w:r>
+          </w:p>
+        </w:tc>
+        <w:tc>
+          <w:tcPr>
+            <w:tcW w:type="dxa" w:w="2260"/>
+            <w:tcMar>
+              <w:top w:w="80" w:type="dxa"/>
+              <w:start w:w="120" w:type="dxa"/>
+              <w:bottom w:w="80" w:type="dxa"/>
+              <w:end w:w="120" w:type="dxa"/>
+            </w:tcMar>
+            <w:vAlign w:val="center"/>
+            <w:shd w:fill="FFFFFF"/>
+          </w:tcPr>
+          <w:p>
+            <w:pPr>
+              <w:spacing w:before="0" w:after="40" w:line="252" w:lineRule="auto"/>
+              <w:jc w:val="left"/>
+            </w:pPr>
+            <w:r>
+              <w:rPr>
+                <w:rFonts w:ascii="Calibri" w:hAnsi="Calibri"/>
+                <w:b w:val="0"/>
+                <w:color w:val="111827"/>
+                <w:sz w:val="17"/>
+              </w:rPr>
+              <w:t>electric_vehicle:read</w:t>
+            </w:r>
+          </w:p>
+        </w:tc>
+      </w:tr>
+      <w:tr>
+        <w:trPr>
+          <w:cantSplit/>
+        </w:trPr>
+        <w:tc>
+          <w:tcPr>
+            <w:tcW w:type="dxa" w:w="3100"/>
+            <w:tcMar>
+              <w:top w:w="80" w:type="dxa"/>
+              <w:start w:w="120" w:type="dxa"/>
+              <w:bottom w:w="80" w:type="dxa"/>
+              <w:end w:w="120" w:type="dxa"/>
+            </w:tcMar>
+            <w:vAlign w:val="center"/>
+            <w:shd w:fill="FFFFFF"/>
+          </w:tcPr>
+          <w:p>
+            <w:pPr>
+              <w:spacing w:before="0" w:after="40" w:line="252" w:lineRule="auto"/>
+              <w:jc w:val="center"/>
+            </w:pPr>
+            <w:r>
+              <w:rPr>
+                <w:rFonts w:ascii="Calibri" w:hAnsi="Calibri"/>
+                <w:b w:val="0"/>
+                <w:color w:val="111827"/>
+                <w:sz w:val="17"/>
+              </w:rPr>
+              <w:t>GET /api/v1/vehicles/{vehicle_id}/electric/scenarios/{execution_id}</w:t>
+            </w:r>
+          </w:p>
+        </w:tc>
+        <w:tc>
+          <w:tcPr>
+            <w:tcW w:type="dxa" w:w="4000"/>
+            <w:tcMar>
+              <w:top w:w="80" w:type="dxa"/>
+              <w:start w:w="120" w:type="dxa"/>
+              <w:bottom w:w="80" w:type="dxa"/>
+              <w:end w:w="120" w:type="dxa"/>
+            </w:tcMar>
+            <w:vAlign w:val="center"/>
+            <w:shd w:fill="FFFFFF"/>
+          </w:tcPr>
+          <w:p>
+            <w:pPr>
+              <w:spacing w:before="0" w:after="40" w:line="252" w:lineRule="auto"/>
+              <w:jc w:val="left"/>
+            </w:pPr>
+            <w:r>
+              <w:rPr>
+                <w:rFonts w:ascii="Calibri" w:hAnsi="Calibri"/>
+                <w:b w:val="0"/>
+                <w:color w:val="111827"/>
+                <w:sz w:val="17"/>
+              </w:rPr>
+              <w:t>Read one immutable scenario result</w:t>
+            </w:r>
+          </w:p>
+        </w:tc>
+        <w:tc>
+          <w:tcPr>
+            <w:tcW w:type="dxa" w:w="2260"/>
+            <w:tcMar>
+              <w:top w:w="80" w:type="dxa"/>
+              <w:start w:w="120" w:type="dxa"/>
+              <w:bottom w:w="80" w:type="dxa"/>
+              <w:end w:w="120" w:type="dxa"/>
+            </w:tcMar>
+            <w:vAlign w:val="center"/>
+            <w:shd w:fill="FFFFFF"/>
+          </w:tcPr>
+          <w:p>
+            <w:pPr>
+              <w:spacing w:before="0" w:after="40" w:line="252" w:lineRule="auto"/>
+              <w:jc w:val="left"/>
+            </w:pPr>
+            <w:r>
+              <w:rPr>
+                <w:rFonts w:ascii="Calibri" w:hAnsi="Calibri"/>
+                <w:b w:val="0"/>
+                <w:color w:val="111827"/>
+                <w:sz w:val="17"/>
+              </w:rPr>
+              <w:t>electric_vehicle:read</w:t>
+            </w:r>
+          </w:p>
+        </w:tc>
+      </w:tr>
     </w:tbl>
     <w:p>
       <w:pPr>
@@ -9435,6 +10033,250 @@
                 <w:sz w:val="17"/>
               </w:rPr>
               <w:t>A range command ID was reused differently.</w:t>
+            </w:r>
+          </w:p>
+        </w:tc>
+      </w:tr>
+      <w:tr>
+        <w:trPr>
+          <w:cantSplit/>
+        </w:trPr>
+        <w:tc>
+          <w:tcPr>
+            <w:tcW w:type="dxa" w:w="2700"/>
+            <w:tcMar>
+              <w:top w:w="80" w:type="dxa"/>
+              <w:start w:w="120" w:type="dxa"/>
+              <w:bottom w:w="80" w:type="dxa"/>
+              <w:end w:w="120" w:type="dxa"/>
+            </w:tcMar>
+            <w:vAlign w:val="center"/>
+            <w:shd w:fill="FFFFFF"/>
+          </w:tcPr>
+          <w:p>
+            <w:pPr>
+              <w:spacing w:before="0" w:after="40" w:line="252" w:lineRule="auto"/>
+              <w:jc w:val="left"/>
+            </w:pPr>
+            <w:r>
+              <w:rPr>
+                <w:rFonts w:ascii="Calibri" w:hAnsi="Calibri"/>
+                <w:b w:val="0"/>
+                <w:color w:val="111827"/>
+                <w:sz w:val="17"/>
+              </w:rPr>
+              <w:t>electric_vehicle_scenario_conflict</w:t>
+            </w:r>
+          </w:p>
+        </w:tc>
+        <w:tc>
+          <w:tcPr>
+            <w:tcW w:type="dxa" w:w="6660"/>
+            <w:tcMar>
+              <w:top w:w="80" w:type="dxa"/>
+              <w:start w:w="120" w:type="dxa"/>
+              <w:bottom w:w="80" w:type="dxa"/>
+              <w:end w:w="120" w:type="dxa"/>
+            </w:tcMar>
+            <w:vAlign w:val="center"/>
+            <w:shd w:fill="FFFFFF"/>
+          </w:tcPr>
+          <w:p>
+            <w:pPr>
+              <w:spacing w:before="0" w:after="40" w:line="252" w:lineRule="auto"/>
+              <w:jc w:val="left"/>
+            </w:pPr>
+            <w:r>
+              <w:rPr>
+                <w:rFonts w:ascii="Calibri" w:hAnsi="Calibri"/>
+                <w:b w:val="0"/>
+                <w:color w:val="111827"/>
+                <w:sz w:val="17"/>
+              </w:rPr>
+              <w:t>A scenario execution ID was reused differently.</w:t>
+            </w:r>
+          </w:p>
+        </w:tc>
+      </w:tr>
+      <w:tr>
+        <w:trPr>
+          <w:cantSplit/>
+        </w:trPr>
+        <w:tc>
+          <w:tcPr>
+            <w:tcW w:type="dxa" w:w="2700"/>
+            <w:tcMar>
+              <w:top w:w="80" w:type="dxa"/>
+              <w:start w:w="120" w:type="dxa"/>
+              <w:bottom w:w="80" w:type="dxa"/>
+              <w:end w:w="120" w:type="dxa"/>
+            </w:tcMar>
+            <w:vAlign w:val="center"/>
+            <w:shd w:fill="FFFFFF"/>
+          </w:tcPr>
+          <w:p>
+            <w:pPr>
+              <w:spacing w:before="0" w:after="40" w:line="252" w:lineRule="auto"/>
+              <w:jc w:val="left"/>
+            </w:pPr>
+            <w:r>
+              <w:rPr>
+                <w:rFonts w:ascii="Calibri" w:hAnsi="Calibri"/>
+                <w:b w:val="0"/>
+                <w:color w:val="111827"/>
+                <w:sz w:val="17"/>
+              </w:rPr>
+              <w:t>electric_vehicle_scenario_version_conflict</w:t>
+            </w:r>
+          </w:p>
+        </w:tc>
+        <w:tc>
+          <w:tcPr>
+            <w:tcW w:type="dxa" w:w="6660"/>
+            <w:tcMar>
+              <w:top w:w="80" w:type="dxa"/>
+              <w:start w:w="120" w:type="dxa"/>
+              <w:bottom w:w="80" w:type="dxa"/>
+              <w:end w:w="120" w:type="dxa"/>
+            </w:tcMar>
+            <w:vAlign w:val="center"/>
+            <w:shd w:fill="FFFFFF"/>
+          </w:tcPr>
+          <w:p>
+            <w:pPr>
+              <w:spacing w:before="0" w:after="40" w:line="252" w:lineRule="auto"/>
+              <w:jc w:val="left"/>
+            </w:pPr>
+            <w:r>
+              <w:rPr>
+                <w:rFonts w:ascii="Calibri" w:hAnsi="Calibri"/>
+                <w:b w:val="0"/>
+                <w:color w:val="111827"/>
+                <w:sz w:val="17"/>
+              </w:rPr>
+              <w:t>One expected resource version is stale.</w:t>
+            </w:r>
+          </w:p>
+        </w:tc>
+      </w:tr>
+      <w:tr>
+        <w:trPr>
+          <w:cantSplit/>
+        </w:trPr>
+        <w:tc>
+          <w:tcPr>
+            <w:tcW w:type="dxa" w:w="2700"/>
+            <w:tcMar>
+              <w:top w:w="80" w:type="dxa"/>
+              <w:start w:w="120" w:type="dxa"/>
+              <w:bottom w:w="80" w:type="dxa"/>
+              <w:end w:w="120" w:type="dxa"/>
+            </w:tcMar>
+            <w:vAlign w:val="center"/>
+            <w:shd w:fill="FFFFFF"/>
+          </w:tcPr>
+          <w:p>
+            <w:pPr>
+              <w:spacing w:before="0" w:after="40" w:line="252" w:lineRule="auto"/>
+              <w:jc w:val="left"/>
+            </w:pPr>
+            <w:r>
+              <w:rPr>
+                <w:rFonts w:ascii="Calibri" w:hAnsi="Calibri"/>
+                <w:b w:val="0"/>
+                <w:color w:val="111827"/>
+                <w:sz w:val="17"/>
+              </w:rPr>
+              <w:t>electric_vehicle_scenario_contract_error</w:t>
+            </w:r>
+          </w:p>
+        </w:tc>
+        <w:tc>
+          <w:tcPr>
+            <w:tcW w:type="dxa" w:w="6660"/>
+            <w:tcMar>
+              <w:top w:w="80" w:type="dxa"/>
+              <w:start w:w="120" w:type="dxa"/>
+              <w:bottom w:w="80" w:type="dxa"/>
+              <w:end w:w="120" w:type="dxa"/>
+            </w:tcMar>
+            <w:vAlign w:val="center"/>
+            <w:shd w:fill="FFFFFF"/>
+          </w:tcPr>
+          <w:p>
+            <w:pPr>
+              <w:spacing w:before="0" w:after="40" w:line="252" w:lineRule="auto"/>
+              <w:jc w:val="left"/>
+            </w:pPr>
+            <w:r>
+              <w:rPr>
+                <w:rFonts w:ascii="Calibri" w:hAnsi="Calibri"/>
+                <w:b w:val="0"/>
+                <w:color w:val="111827"/>
+                <w:sz w:val="17"/>
+              </w:rPr>
+              <w:t>The BMS ECU or CAN contract is incompatible.</w:t>
+            </w:r>
+          </w:p>
+        </w:tc>
+      </w:tr>
+      <w:tr>
+        <w:trPr>
+          <w:cantSplit/>
+        </w:trPr>
+        <w:tc>
+          <w:tcPr>
+            <w:tcW w:type="dxa" w:w="2700"/>
+            <w:tcMar>
+              <w:top w:w="80" w:type="dxa"/>
+              <w:start w:w="120" w:type="dxa"/>
+              <w:bottom w:w="80" w:type="dxa"/>
+              <w:end w:w="120" w:type="dxa"/>
+            </w:tcMar>
+            <w:vAlign w:val="center"/>
+            <w:shd w:fill="FFFFFF"/>
+          </w:tcPr>
+          <w:p>
+            <w:pPr>
+              <w:spacing w:before="0" w:after="40" w:line="252" w:lineRule="auto"/>
+              <w:jc w:val="left"/>
+            </w:pPr>
+            <w:r>
+              <w:rPr>
+                <w:rFonts w:ascii="Calibri" w:hAnsi="Calibri"/>
+                <w:b w:val="0"/>
+                <w:color w:val="111827"/>
+                <w:sz w:val="17"/>
+              </w:rPr>
+              <w:t>electric_vehicle_scenario_not_found</w:t>
+            </w:r>
+          </w:p>
+        </w:tc>
+        <w:tc>
+          <w:tcPr>
+            <w:tcW w:type="dxa" w:w="6660"/>
+            <w:tcMar>
+              <w:top w:w="80" w:type="dxa"/>
+              <w:start w:w="120" w:type="dxa"/>
+              <w:bottom w:w="80" w:type="dxa"/>
+              <w:end w:w="120" w:type="dxa"/>
+            </w:tcMar>
+            <w:vAlign w:val="center"/>
+            <w:shd w:fill="FFFFFF"/>
+          </w:tcPr>
+          <w:p>
+            <w:pPr>
+              <w:spacing w:before="0" w:after="40" w:line="252" w:lineRule="auto"/>
+              <w:jc w:val="left"/>
+            </w:pPr>
+            <w:r>
+              <w:rPr>
+                <w:rFonts w:ascii="Calibri" w:hAnsi="Calibri"/>
+                <w:b w:val="0"/>
+                <w:color w:val="111827"/>
+                <w:sz w:val="17"/>
+              </w:rPr>
+              <w:t>No matching scenario evidence exists.</w:t>
             </w:r>
           </w:p>
         </w:tc>
@@ -9872,7 +10714,23 @@
           <w:color w:val="111827"/>
           <w:sz w:val="22"/>
         </w:rPr>
-        <w:t>.</w:t>
+        <w:t xml:space="preserve">. Migration </w:t>
+      </w:r>
+      <w:r>
+        <w:rPr>
+          <w:rFonts w:ascii="Consolas" w:hAnsi="Consolas"/>
+          <w:color w:val="1F4D78"/>
+          <w:sz w:val="19"/>
+        </w:rPr>
+        <w:t>0043_electric_vehicle_scenarios</w:t>
+      </w:r>
+      <w:r>
+        <w:rPr>
+          <w:rFonts w:ascii="Calibri" w:hAnsi="Calibri"/>
+          <w:color w:val="111827"/>
+          <w:sz w:val="22"/>
+        </w:rPr>
+        <w:t xml:space="preserve"> creates the persisted cross-domain scenario evidence table.</w:t>
       </w:r>
     </w:p>
     <w:tbl>
@@ -11054,6 +11912,95 @@
           </w:p>
         </w:tc>
       </w:tr>
+      <w:tr>
+        <w:trPr>
+          <w:cantSplit/>
+        </w:trPr>
+        <w:tc>
+          <w:tcPr>
+            <w:tcW w:type="dxa" w:w="1650"/>
+            <w:tcMar>
+              <w:top w:w="80" w:type="dxa"/>
+              <w:start w:w="120" w:type="dxa"/>
+              <w:bottom w:w="80" w:type="dxa"/>
+              <w:end w:w="120" w:type="dxa"/>
+            </w:tcMar>
+            <w:vAlign w:val="center"/>
+            <w:shd w:fill="FFFFFF"/>
+          </w:tcPr>
+          <w:p>
+            <w:pPr>
+              <w:spacing w:before="0" w:after="40" w:line="252" w:lineRule="auto"/>
+              <w:jc w:val="center"/>
+            </w:pPr>
+            <w:r>
+              <w:rPr>
+                <w:rFonts w:ascii="Calibri" w:hAnsi="Calibri"/>
+                <w:b w:val="0"/>
+                <w:color w:val="111827"/>
+                <w:sz w:val="17"/>
+              </w:rPr>
+              <w:t>atep.electric_vehicle.scenario.completed.v1</w:t>
+            </w:r>
+          </w:p>
+        </w:tc>
+        <w:tc>
+          <w:tcPr>
+            <w:tcW w:type="dxa" w:w="4450"/>
+            <w:tcMar>
+              <w:top w:w="80" w:type="dxa"/>
+              <w:start w:w="120" w:type="dxa"/>
+              <w:bottom w:w="80" w:type="dxa"/>
+              <w:end w:w="120" w:type="dxa"/>
+            </w:tcMar>
+            <w:vAlign w:val="center"/>
+            <w:shd w:fill="FFFFFF"/>
+          </w:tcPr>
+          <w:p>
+            <w:pPr>
+              <w:spacing w:before="0" w:after="40" w:line="252" w:lineRule="auto"/>
+              <w:jc w:val="left"/>
+            </w:pPr>
+            <w:r>
+              <w:rPr>
+                <w:rFonts w:ascii="Calibri" w:hAnsi="Calibri"/>
+                <w:b w:val="0"/>
+                <w:color w:val="111827"/>
+                <w:sz w:val="17"/>
+              </w:rPr>
+              <w:t>Announce a completed cross-domain safety scenario</w:t>
+            </w:r>
+          </w:p>
+        </w:tc>
+        <w:tc>
+          <w:tcPr>
+            <w:tcW w:type="dxa" w:w="3260"/>
+            <w:tcMar>
+              <w:top w:w="80" w:type="dxa"/>
+              <w:start w:w="120" w:type="dxa"/>
+              <w:bottom w:w="80" w:type="dxa"/>
+              <w:end w:w="120" w:type="dxa"/>
+            </w:tcMar>
+            <w:vAlign w:val="center"/>
+            <w:shd w:fill="FFFFFF"/>
+          </w:tcPr>
+          <w:p>
+            <w:pPr>
+              <w:spacing w:before="0" w:after="40" w:line="252" w:lineRule="auto"/>
+              <w:jc w:val="left"/>
+            </w:pPr>
+            <w:r>
+              <w:rPr>
+                <w:rFonts w:ascii="Calibri" w:hAnsi="Calibri"/>
+                <w:b w:val="0"/>
+                <w:color w:val="111827"/>
+                <w:sz w:val="17"/>
+              </w:rPr>
+              <w:t>IDs, status, contract, and DTC only</w:t>
+            </w:r>
+          </w:p>
+        </w:tc>
+      </w:tr>
     </w:tbl>
     <w:p>
       <w:pPr>
@@ -11077,7 +12024,7 @@
           <w:color w:val="111827"/>
           <w:sz w:val="22"/>
         </w:rPr>
-        <w:t xml:space="preserve">VI-1 through VI-6 implement EV-F-001 through EV-F-089 and EV-NF-001 through EV-NF-029. The authoritative traceability table is maintained in </w:t>
+        <w:t xml:space="preserve">VI-1 through VI-7 implement EV-F-001 through EV-F-101 and EV-NF-001 through EV-NF-035. The authoritative traceability table is maintained in </w:t>
       </w:r>
       <w:r>
         <w:rPr>
@@ -11480,6 +12427,66 @@
     </w:p>
     <w:p>
       <w:pPr>
+        <w:pStyle w:val="Heading2"/>
+        <w:keepNext/>
+        <w:keepLines/>
+      </w:pPr>
+      <w:r>
+        <w:t>ADR-EV-018 - Use One Transaction for Cross-Domain Safety Evidence</w:t>
+      </w:r>
+    </w:p>
+    <w:p>
+      <w:r>
+        <w:rPr>
+          <w:rFonts w:ascii="Calibri" w:hAnsi="Calibri"/>
+          <w:color w:val="111827"/>
+          <w:sz w:val="22"/>
+        </w:rPr>
+        <w:t>Decision: lock the six EV aggregates, battery ECU, and CAN network before applying the scenario. Validate every expected version before the first mutation. Rationale: a safety result is valid only when all domain and protocol observations describe the same logical event.</w:t>
+      </w:r>
+    </w:p>
+    <w:p>
+      <w:pPr>
+        <w:pStyle w:val="Heading2"/>
+        <w:keepNext/>
+        <w:keepLines/>
+      </w:pPr>
+      <w:r>
+        <w:t>ADR-EV-019 - Require a BMS-Owned CAN Contract</w:t>
+      </w:r>
+    </w:p>
+    <w:p>
+      <w:r>
+        <w:rPr>
+          <w:rFonts w:ascii="Calibri" w:hAnsi="Calibri"/>
+          <w:color w:val="111827"/>
+          <w:sz w:val="22"/>
+        </w:rPr>
+        <w:t>Decision: the selected CAN frame contract must name the selected battery ECU as producer and must provide at least three payload bytes. Rationale: this prevents a scenario from attributing BMS evidence to an unrelated ECU or an incompatible frame.</w:t>
+      </w:r>
+    </w:p>
+    <w:p>
+      <w:pPr>
+        <w:pStyle w:val="Heading2"/>
+        <w:keepNext/>
+        <w:keepLines/>
+      </w:pPr>
+      <w:r>
+        <w:t>ADR-EV-020 - Persist Assertions with Observations</w:t>
+      </w:r>
+    </w:p>
+    <w:p>
+      <w:r>
+        <w:rPr>
+          <w:rFonts w:ascii="Calibri" w:hAnsi="Calibri"/>
+          <w:color w:val="111827"/>
+          <w:sz w:val="22"/>
+        </w:rPr>
+        <w:t>Decision: store each assertion name, observed value, expected value, and result in the scenario snapshot. Rationale: test automation and the future dashboard can explain a result without reconstructing mutable state.</w:t>
+      </w:r>
+    </w:p>
+    <w:p>
+      <w:pPr>
         <w:pStyle w:val="Heading1"/>
         <w:keepNext/>
         <w:keepLines/>
@@ -24494,6 +25501,1419 @@
                 <w:sz w:val="16"/>
               </w:rPr>
               <w:t>Bounded schema and reversible tables</w:t>
+            </w:r>
+          </w:p>
+        </w:tc>
+      </w:tr>
+      <w:tr>
+        <w:trPr>
+          <w:cantSplit/>
+        </w:trPr>
+        <w:tc>
+          <w:tcPr>
+            <w:tcW w:type="dxa" w:w="1150"/>
+            <w:tcMar>
+              <w:top w:w="80" w:type="dxa"/>
+              <w:start w:w="120" w:type="dxa"/>
+              <w:bottom w:w="80" w:type="dxa"/>
+              <w:end w:w="120" w:type="dxa"/>
+            </w:tcMar>
+            <w:vAlign w:val="center"/>
+            <w:shd w:fill="FFFFFF"/>
+          </w:tcPr>
+          <w:p>
+            <w:pPr>
+              <w:spacing w:before="0" w:after="40" w:line="252" w:lineRule="auto"/>
+              <w:jc w:val="center"/>
+            </w:pPr>
+            <w:r>
+              <w:rPr>
+                <w:rFonts w:ascii="Calibri" w:hAnsi="Calibri"/>
+                <w:b w:val="0"/>
+                <w:color w:val="111827"/>
+                <w:sz w:val="16"/>
+              </w:rPr>
+              <w:t>EV-T-111</w:t>
+            </w:r>
+          </w:p>
+        </w:tc>
+        <w:tc>
+          <w:tcPr>
+            <w:tcW w:type="dxa" w:w="3700"/>
+            <w:tcMar>
+              <w:top w:w="80" w:type="dxa"/>
+              <w:start w:w="120" w:type="dxa"/>
+              <w:bottom w:w="80" w:type="dxa"/>
+              <w:end w:w="120" w:type="dxa"/>
+            </w:tcMar>
+            <w:vAlign w:val="center"/>
+            <w:shd w:fill="FFFFFF"/>
+          </w:tcPr>
+          <w:p>
+            <w:pPr>
+              <w:spacing w:before="0" w:after="40" w:line="252" w:lineRule="auto"/>
+              <w:jc w:val="left"/>
+            </w:pPr>
+            <w:r>
+              <w:rPr>
+                <w:rFonts w:ascii="Calibri" w:hAnsi="Calibri"/>
+                <w:b w:val="0"/>
+                <w:color w:val="111827"/>
+                <w:sz w:val="16"/>
+              </w:rPr>
+              <w:t>Scenario contract bounds</w:t>
+            </w:r>
+          </w:p>
+        </w:tc>
+        <w:tc>
+          <w:tcPr>
+            <w:tcW w:type="dxa" w:w="3100"/>
+            <w:tcMar>
+              <w:top w:w="80" w:type="dxa"/>
+              <w:start w:w="120" w:type="dxa"/>
+              <w:bottom w:w="80" w:type="dxa"/>
+              <w:end w:w="120" w:type="dxa"/>
+            </w:tcMar>
+            <w:vAlign w:val="center"/>
+            <w:shd w:fill="FFFFFF"/>
+          </w:tcPr>
+          <w:p>
+            <w:pPr>
+              <w:spacing w:before="0" w:after="40" w:line="252" w:lineRule="auto"/>
+              <w:jc w:val="left"/>
+            </w:pPr>
+            <w:r>
+              <w:rPr>
+                <w:rFonts w:ascii="Calibri" w:hAnsi="Calibri"/>
+                <w:b w:val="0"/>
+                <w:color w:val="111827"/>
+                <w:sz w:val="16"/>
+              </w:rPr>
+              <w:t>Submit unsafe temperature, duration, or identifier</w:t>
+            </w:r>
+          </w:p>
+        </w:tc>
+        <w:tc>
+          <w:tcPr>
+            <w:tcW w:type="dxa" w:w="1410"/>
+            <w:tcMar>
+              <w:top w:w="80" w:type="dxa"/>
+              <w:start w:w="120" w:type="dxa"/>
+              <w:bottom w:w="80" w:type="dxa"/>
+              <w:end w:w="120" w:type="dxa"/>
+            </w:tcMar>
+            <w:vAlign w:val="center"/>
+            <w:shd w:fill="FFFFFF"/>
+          </w:tcPr>
+          <w:p>
+            <w:pPr>
+              <w:spacing w:before="0" w:after="40" w:line="252" w:lineRule="auto"/>
+              <w:jc w:val="left"/>
+            </w:pPr>
+            <w:r>
+              <w:rPr>
+                <w:rFonts w:ascii="Calibri" w:hAnsi="Calibri"/>
+                <w:b w:val="0"/>
+                <w:color w:val="111827"/>
+                <w:sz w:val="16"/>
+              </w:rPr>
+              <w:t>Stable validation error</w:t>
+            </w:r>
+          </w:p>
+        </w:tc>
+      </w:tr>
+      <w:tr>
+        <w:trPr>
+          <w:cantSplit/>
+        </w:trPr>
+        <w:tc>
+          <w:tcPr>
+            <w:tcW w:type="dxa" w:w="1150"/>
+            <w:tcMar>
+              <w:top w:w="80" w:type="dxa"/>
+              <w:start w:w="120" w:type="dxa"/>
+              <w:bottom w:w="80" w:type="dxa"/>
+              <w:end w:w="120" w:type="dxa"/>
+            </w:tcMar>
+            <w:vAlign w:val="center"/>
+            <w:shd w:fill="FFFFFF"/>
+          </w:tcPr>
+          <w:p>
+            <w:pPr>
+              <w:spacing w:before="0" w:after="40" w:line="252" w:lineRule="auto"/>
+              <w:jc w:val="center"/>
+            </w:pPr>
+            <w:r>
+              <w:rPr>
+                <w:rFonts w:ascii="Calibri" w:hAnsi="Calibri"/>
+                <w:b w:val="0"/>
+                <w:color w:val="111827"/>
+                <w:sz w:val="16"/>
+              </w:rPr>
+              <w:t>EV-T-112</w:t>
+            </w:r>
+          </w:p>
+        </w:tc>
+        <w:tc>
+          <w:tcPr>
+            <w:tcW w:type="dxa" w:w="3700"/>
+            <w:tcMar>
+              <w:top w:w="80" w:type="dxa"/>
+              <w:start w:w="120" w:type="dxa"/>
+              <w:bottom w:w="80" w:type="dxa"/>
+              <w:end w:w="120" w:type="dxa"/>
+            </w:tcMar>
+            <w:vAlign w:val="center"/>
+            <w:shd w:fill="FFFFFF"/>
+          </w:tcPr>
+          <w:p>
+            <w:pPr>
+              <w:spacing w:before="0" w:after="40" w:line="252" w:lineRule="auto"/>
+              <w:jc w:val="left"/>
+            </w:pPr>
+            <w:r>
+              <w:rPr>
+                <w:rFonts w:ascii="Calibri" w:hAnsi="Calibri"/>
+                <w:b w:val="0"/>
+                <w:color w:val="111827"/>
+                <w:sz w:val="16"/>
+              </w:rPr>
+              <w:t>Cross-domain protection</w:t>
+            </w:r>
+          </w:p>
+        </w:tc>
+        <w:tc>
+          <w:tcPr>
+            <w:tcW w:type="dxa" w:w="3100"/>
+            <w:tcMar>
+              <w:top w:w="80" w:type="dxa"/>
+              <w:start w:w="120" w:type="dxa"/>
+              <w:bottom w:w="80" w:type="dxa"/>
+              <w:end w:w="120" w:type="dxa"/>
+            </w:tcMar>
+            <w:vAlign w:val="center"/>
+            <w:shd w:fill="FFFFFF"/>
+          </w:tcPr>
+          <w:p>
+            <w:pPr>
+              <w:spacing w:before="0" w:after="40" w:line="252" w:lineRule="auto"/>
+              <w:jc w:val="left"/>
+            </w:pPr>
+            <w:r>
+              <w:rPr>
+                <w:rFonts w:ascii="Calibri" w:hAnsi="Calibri"/>
+                <w:b w:val="0"/>
+                <w:color w:val="111827"/>
+                <w:sz w:val="16"/>
+              </w:rPr>
+              <w:t>Execute battery overtemperature</w:t>
+            </w:r>
+          </w:p>
+        </w:tc>
+        <w:tc>
+          <w:tcPr>
+            <w:tcW w:type="dxa" w:w="1410"/>
+            <w:tcMar>
+              <w:top w:w="80" w:type="dxa"/>
+              <w:start w:w="120" w:type="dxa"/>
+              <w:bottom w:w="80" w:type="dxa"/>
+              <w:end w:w="120" w:type="dxa"/>
+            </w:tcMar>
+            <w:vAlign w:val="center"/>
+            <w:shd w:fill="FFFFFF"/>
+          </w:tcPr>
+          <w:p>
+            <w:pPr>
+              <w:spacing w:before="0" w:after="40" w:line="252" w:lineRule="auto"/>
+              <w:jc w:val="left"/>
+            </w:pPr>
+            <w:r>
+              <w:rPr>
+                <w:rFonts w:ascii="Calibri" w:hAnsi="Calibri"/>
+                <w:b w:val="0"/>
+                <w:color w:val="111827"/>
+                <w:sz w:val="16"/>
+              </w:rPr>
+              <w:t>Six EV aggregates enter their defined safety reactions</w:t>
+            </w:r>
+          </w:p>
+        </w:tc>
+      </w:tr>
+      <w:tr>
+        <w:trPr>
+          <w:cantSplit/>
+        </w:trPr>
+        <w:tc>
+          <w:tcPr>
+            <w:tcW w:type="dxa" w:w="1150"/>
+            <w:tcMar>
+              <w:top w:w="80" w:type="dxa"/>
+              <w:start w:w="120" w:type="dxa"/>
+              <w:bottom w:w="80" w:type="dxa"/>
+              <w:end w:w="120" w:type="dxa"/>
+            </w:tcMar>
+            <w:vAlign w:val="center"/>
+            <w:shd w:fill="FFFFFF"/>
+          </w:tcPr>
+          <w:p>
+            <w:pPr>
+              <w:spacing w:before="0" w:after="40" w:line="252" w:lineRule="auto"/>
+              <w:jc w:val="center"/>
+            </w:pPr>
+            <w:r>
+              <w:rPr>
+                <w:rFonts w:ascii="Calibri" w:hAnsi="Calibri"/>
+                <w:b w:val="0"/>
+                <w:color w:val="111827"/>
+                <w:sz w:val="16"/>
+              </w:rPr>
+              <w:t>EV-T-113</w:t>
+            </w:r>
+          </w:p>
+        </w:tc>
+        <w:tc>
+          <w:tcPr>
+            <w:tcW w:type="dxa" w:w="3700"/>
+            <w:tcMar>
+              <w:top w:w="80" w:type="dxa"/>
+              <w:start w:w="120" w:type="dxa"/>
+              <w:bottom w:w="80" w:type="dxa"/>
+              <w:end w:w="120" w:type="dxa"/>
+            </w:tcMar>
+            <w:vAlign w:val="center"/>
+            <w:shd w:fill="FFFFFF"/>
+          </w:tcPr>
+          <w:p>
+            <w:pPr>
+              <w:spacing w:before="0" w:after="40" w:line="252" w:lineRule="auto"/>
+              <w:jc w:val="left"/>
+            </w:pPr>
+            <w:r>
+              <w:rPr>
+                <w:rFonts w:ascii="Calibri" w:hAnsi="Calibri"/>
+                <w:b w:val="0"/>
+                <w:color w:val="111827"/>
+                <w:sz w:val="16"/>
+              </w:rPr>
+              <w:t>BMS ECU evidence</w:t>
+            </w:r>
+          </w:p>
+        </w:tc>
+        <w:tc>
+          <w:tcPr>
+            <w:tcW w:type="dxa" w:w="3100"/>
+            <w:tcMar>
+              <w:top w:w="80" w:type="dxa"/>
+              <w:start w:w="120" w:type="dxa"/>
+              <w:bottom w:w="80" w:type="dxa"/>
+              <w:end w:w="120" w:type="dxa"/>
+            </w:tcMar>
+            <w:vAlign w:val="center"/>
+            <w:shd w:fill="FFFFFF"/>
+          </w:tcPr>
+          <w:p>
+            <w:pPr>
+              <w:spacing w:before="0" w:after="40" w:line="252" w:lineRule="auto"/>
+              <w:jc w:val="left"/>
+            </w:pPr>
+            <w:r>
+              <w:rPr>
+                <w:rFonts w:ascii="Calibri" w:hAnsi="Calibri"/>
+                <w:b w:val="0"/>
+                <w:color w:val="111827"/>
+                <w:sz w:val="16"/>
+              </w:rPr>
+              <w:t>Inspect ECU after the scenario</w:t>
+            </w:r>
+          </w:p>
+        </w:tc>
+        <w:tc>
+          <w:tcPr>
+            <w:tcW w:type="dxa" w:w="1410"/>
+            <w:tcMar>
+              <w:top w:w="80" w:type="dxa"/>
+              <w:start w:w="120" w:type="dxa"/>
+              <w:bottom w:w="80" w:type="dxa"/>
+              <w:end w:w="120" w:type="dxa"/>
+            </w:tcMar>
+            <w:vAlign w:val="center"/>
+            <w:shd w:fill="FFFFFF"/>
+          </w:tcPr>
+          <w:p>
+            <w:pPr>
+              <w:spacing w:before="0" w:after="40" w:line="252" w:lineRule="auto"/>
+              <w:jc w:val="left"/>
+            </w:pPr>
+            <w:r>
+              <w:rPr>
+                <w:rFonts w:ascii="Calibri" w:hAnsi="Calibri"/>
+                <w:b w:val="0"/>
+                <w:color w:val="111827"/>
+                <w:sz w:val="16"/>
+              </w:rPr>
+              <w:t>Temperature signal and confirmed latched fault</w:t>
+            </w:r>
+          </w:p>
+        </w:tc>
+      </w:tr>
+      <w:tr>
+        <w:trPr>
+          <w:cantSplit/>
+        </w:trPr>
+        <w:tc>
+          <w:tcPr>
+            <w:tcW w:type="dxa" w:w="1150"/>
+            <w:tcMar>
+              <w:top w:w="80" w:type="dxa"/>
+              <w:start w:w="120" w:type="dxa"/>
+              <w:bottom w:w="80" w:type="dxa"/>
+              <w:end w:w="120" w:type="dxa"/>
+            </w:tcMar>
+            <w:vAlign w:val="center"/>
+            <w:shd w:fill="FFFFFF"/>
+          </w:tcPr>
+          <w:p>
+            <w:pPr>
+              <w:spacing w:before="0" w:after="40" w:line="252" w:lineRule="auto"/>
+              <w:jc w:val="center"/>
+            </w:pPr>
+            <w:r>
+              <w:rPr>
+                <w:rFonts w:ascii="Calibri" w:hAnsi="Calibri"/>
+                <w:b w:val="0"/>
+                <w:color w:val="111827"/>
+                <w:sz w:val="16"/>
+              </w:rPr>
+              <w:t>EV-T-114</w:t>
+            </w:r>
+          </w:p>
+        </w:tc>
+        <w:tc>
+          <w:tcPr>
+            <w:tcW w:type="dxa" w:w="3700"/>
+            <w:tcMar>
+              <w:top w:w="80" w:type="dxa"/>
+              <w:start w:w="120" w:type="dxa"/>
+              <w:bottom w:w="80" w:type="dxa"/>
+              <w:end w:w="120" w:type="dxa"/>
+            </w:tcMar>
+            <w:vAlign w:val="center"/>
+            <w:shd w:fill="FFFFFF"/>
+          </w:tcPr>
+          <w:p>
+            <w:pPr>
+              <w:spacing w:before="0" w:after="40" w:line="252" w:lineRule="auto"/>
+              <w:jc w:val="left"/>
+            </w:pPr>
+            <w:r>
+              <w:rPr>
+                <w:rFonts w:ascii="Calibri" w:hAnsi="Calibri"/>
+                <w:b w:val="0"/>
+                <w:color w:val="111827"/>
+                <w:sz w:val="16"/>
+              </w:rPr>
+              <w:t>CAN evidence</w:t>
+            </w:r>
+          </w:p>
+        </w:tc>
+        <w:tc>
+          <w:tcPr>
+            <w:tcW w:type="dxa" w:w="3100"/>
+            <w:tcMar>
+              <w:top w:w="80" w:type="dxa"/>
+              <w:start w:w="120" w:type="dxa"/>
+              <w:bottom w:w="80" w:type="dxa"/>
+              <w:end w:w="120" w:type="dxa"/>
+            </w:tcMar>
+            <w:vAlign w:val="center"/>
+            <w:shd w:fill="FFFFFF"/>
+          </w:tcPr>
+          <w:p>
+            <w:pPr>
+              <w:spacing w:before="0" w:after="40" w:line="252" w:lineRule="auto"/>
+              <w:jc w:val="left"/>
+            </w:pPr>
+            <w:r>
+              <w:rPr>
+                <w:rFonts w:ascii="Calibri" w:hAnsi="Calibri"/>
+                <w:b w:val="0"/>
+                <w:color w:val="111827"/>
+                <w:sz w:val="16"/>
+              </w:rPr>
+              <w:t>Inspect the transmitted BMS frame</w:t>
+            </w:r>
+          </w:p>
+        </w:tc>
+        <w:tc>
+          <w:tcPr>
+            <w:tcW w:type="dxa" w:w="1410"/>
+            <w:tcMar>
+              <w:top w:w="80" w:type="dxa"/>
+              <w:start w:w="120" w:type="dxa"/>
+              <w:bottom w:w="80" w:type="dxa"/>
+              <w:end w:w="120" w:type="dxa"/>
+            </w:tcMar>
+            <w:vAlign w:val="center"/>
+            <w:shd w:fill="FFFFFF"/>
+          </w:tcPr>
+          <w:p>
+            <w:pPr>
+              <w:spacing w:before="0" w:after="40" w:line="252" w:lineRule="auto"/>
+              <w:jc w:val="left"/>
+            </w:pPr>
+            <w:r>
+              <w:rPr>
+                <w:rFonts w:ascii="Calibri" w:hAnsi="Calibri"/>
+                <w:b w:val="0"/>
+                <w:color w:val="111827"/>
+                <w:sz w:val="16"/>
+              </w:rPr>
+              <w:t>Contract, sequence, encoded temperature, and protection flag</w:t>
+            </w:r>
+          </w:p>
+        </w:tc>
+      </w:tr>
+      <w:tr>
+        <w:trPr>
+          <w:cantSplit/>
+        </w:trPr>
+        <w:tc>
+          <w:tcPr>
+            <w:tcW w:type="dxa" w:w="1150"/>
+            <w:tcMar>
+              <w:top w:w="80" w:type="dxa"/>
+              <w:start w:w="120" w:type="dxa"/>
+              <w:bottom w:w="80" w:type="dxa"/>
+              <w:end w:w="120" w:type="dxa"/>
+            </w:tcMar>
+            <w:vAlign w:val="center"/>
+            <w:shd w:fill="FFFFFF"/>
+          </w:tcPr>
+          <w:p>
+            <w:pPr>
+              <w:spacing w:before="0" w:after="40" w:line="252" w:lineRule="auto"/>
+              <w:jc w:val="center"/>
+            </w:pPr>
+            <w:r>
+              <w:rPr>
+                <w:rFonts w:ascii="Calibri" w:hAnsi="Calibri"/>
+                <w:b w:val="0"/>
+                <w:color w:val="111827"/>
+                <w:sz w:val="16"/>
+              </w:rPr>
+              <w:t>EV-T-115</w:t>
+            </w:r>
+          </w:p>
+        </w:tc>
+        <w:tc>
+          <w:tcPr>
+            <w:tcW w:type="dxa" w:w="3700"/>
+            <w:tcMar>
+              <w:top w:w="80" w:type="dxa"/>
+              <w:start w:w="120" w:type="dxa"/>
+              <w:bottom w:w="80" w:type="dxa"/>
+              <w:end w:w="120" w:type="dxa"/>
+            </w:tcMar>
+            <w:vAlign w:val="center"/>
+            <w:shd w:fill="FFFFFF"/>
+          </w:tcPr>
+          <w:p>
+            <w:pPr>
+              <w:spacing w:before="0" w:after="40" w:line="252" w:lineRule="auto"/>
+              <w:jc w:val="left"/>
+            </w:pPr>
+            <w:r>
+              <w:rPr>
+                <w:rFonts w:ascii="Calibri" w:hAnsi="Calibri"/>
+                <w:b w:val="0"/>
+                <w:color w:val="111827"/>
+                <w:sz w:val="16"/>
+              </w:rPr>
+              <w:t>UDS DTC evidence</w:t>
+            </w:r>
+          </w:p>
+        </w:tc>
+        <w:tc>
+          <w:tcPr>
+            <w:tcW w:type="dxa" w:w="3100"/>
+            <w:tcMar>
+              <w:top w:w="80" w:type="dxa"/>
+              <w:start w:w="120" w:type="dxa"/>
+              <w:bottom w:w="80" w:type="dxa"/>
+              <w:end w:w="120" w:type="dxa"/>
+            </w:tcMar>
+            <w:vAlign w:val="center"/>
+            <w:shd w:fill="FFFFFF"/>
+          </w:tcPr>
+          <w:p>
+            <w:pPr>
+              <w:spacing w:before="0" w:after="40" w:line="252" w:lineRule="auto"/>
+              <w:jc w:val="left"/>
+            </w:pPr>
+            <w:r>
+              <w:rPr>
+                <w:rFonts w:ascii="Calibri" w:hAnsi="Calibri"/>
+                <w:b w:val="0"/>
+                <w:color w:val="111827"/>
+                <w:sz w:val="16"/>
+              </w:rPr>
+              <w:t xml:space="preserve">Read DTC </w:t>
+            </w:r>
+            <w:r>
+              <w:rPr>
+                <w:rFonts w:ascii="Calibri" w:hAnsi="Calibri"/>
+                <w:b w:val="0"/>
+                <w:color w:val="111827"/>
+                <w:sz w:val="16"/>
+              </w:rPr>
+              <w:t>0A7E00</w:t>
+            </w:r>
+          </w:p>
+        </w:tc>
+        <w:tc>
+          <w:tcPr>
+            <w:tcW w:type="dxa" w:w="1410"/>
+            <w:tcMar>
+              <w:top w:w="80" w:type="dxa"/>
+              <w:start w:w="120" w:type="dxa"/>
+              <w:bottom w:w="80" w:type="dxa"/>
+              <w:end w:w="120" w:type="dxa"/>
+            </w:tcMar>
+            <w:vAlign w:val="center"/>
+            <w:shd w:fill="FFFFFF"/>
+          </w:tcPr>
+          <w:p>
+            <w:pPr>
+              <w:spacing w:before="0" w:after="40" w:line="252" w:lineRule="auto"/>
+              <w:jc w:val="left"/>
+            </w:pPr>
+            <w:r>
+              <w:rPr>
+                <w:rFonts w:ascii="Calibri" w:hAnsi="Calibri"/>
+                <w:b w:val="0"/>
+                <w:color w:val="111827"/>
+                <w:sz w:val="16"/>
+              </w:rPr>
+              <w:t>Critical status and freeze-frame values</w:t>
+            </w:r>
+          </w:p>
+        </w:tc>
+      </w:tr>
+      <w:tr>
+        <w:trPr>
+          <w:cantSplit/>
+        </w:trPr>
+        <w:tc>
+          <w:tcPr>
+            <w:tcW w:type="dxa" w:w="1150"/>
+            <w:tcMar>
+              <w:top w:w="80" w:type="dxa"/>
+              <w:start w:w="120" w:type="dxa"/>
+              <w:bottom w:w="80" w:type="dxa"/>
+              <w:end w:w="120" w:type="dxa"/>
+            </w:tcMar>
+            <w:vAlign w:val="center"/>
+            <w:shd w:fill="FFFFFF"/>
+          </w:tcPr>
+          <w:p>
+            <w:pPr>
+              <w:spacing w:before="0" w:after="40" w:line="252" w:lineRule="auto"/>
+              <w:jc w:val="center"/>
+            </w:pPr>
+            <w:r>
+              <w:rPr>
+                <w:rFonts w:ascii="Calibri" w:hAnsi="Calibri"/>
+                <w:b w:val="0"/>
+                <w:color w:val="111827"/>
+                <w:sz w:val="16"/>
+              </w:rPr>
+              <w:t>EV-T-116</w:t>
+            </w:r>
+          </w:p>
+        </w:tc>
+        <w:tc>
+          <w:tcPr>
+            <w:tcW w:type="dxa" w:w="3700"/>
+            <w:tcMar>
+              <w:top w:w="80" w:type="dxa"/>
+              <w:start w:w="120" w:type="dxa"/>
+              <w:bottom w:w="80" w:type="dxa"/>
+              <w:end w:w="120" w:type="dxa"/>
+            </w:tcMar>
+            <w:vAlign w:val="center"/>
+            <w:shd w:fill="FFFFFF"/>
+          </w:tcPr>
+          <w:p>
+            <w:pPr>
+              <w:spacing w:before="0" w:after="40" w:line="252" w:lineRule="auto"/>
+              <w:jc w:val="left"/>
+            </w:pPr>
+            <w:r>
+              <w:rPr>
+                <w:rFonts w:ascii="Calibri" w:hAnsi="Calibri"/>
+                <w:b w:val="0"/>
+                <w:color w:val="111827"/>
+                <w:sz w:val="16"/>
+              </w:rPr>
+              <w:t>Eight-resource version conflict</w:t>
+            </w:r>
+          </w:p>
+        </w:tc>
+        <w:tc>
+          <w:tcPr>
+            <w:tcW w:type="dxa" w:w="3100"/>
+            <w:tcMar>
+              <w:top w:w="80" w:type="dxa"/>
+              <w:start w:w="120" w:type="dxa"/>
+              <w:bottom w:w="80" w:type="dxa"/>
+              <w:end w:w="120" w:type="dxa"/>
+            </w:tcMar>
+            <w:vAlign w:val="center"/>
+            <w:shd w:fill="FFFFFF"/>
+          </w:tcPr>
+          <w:p>
+            <w:pPr>
+              <w:spacing w:before="0" w:after="40" w:line="252" w:lineRule="auto"/>
+              <w:jc w:val="left"/>
+            </w:pPr>
+            <w:r>
+              <w:rPr>
+                <w:rFonts w:ascii="Calibri" w:hAnsi="Calibri"/>
+                <w:b w:val="0"/>
+                <w:color w:val="111827"/>
+                <w:sz w:val="16"/>
+              </w:rPr>
+              <w:t>Submit one stale expected version</w:t>
+            </w:r>
+          </w:p>
+        </w:tc>
+        <w:tc>
+          <w:tcPr>
+            <w:tcW w:type="dxa" w:w="1410"/>
+            <w:tcMar>
+              <w:top w:w="80" w:type="dxa"/>
+              <w:start w:w="120" w:type="dxa"/>
+              <w:bottom w:w="80" w:type="dxa"/>
+              <w:end w:w="120" w:type="dxa"/>
+            </w:tcMar>
+            <w:vAlign w:val="center"/>
+            <w:shd w:fill="FFFFFF"/>
+          </w:tcPr>
+          <w:p>
+            <w:pPr>
+              <w:spacing w:before="0" w:after="40" w:line="252" w:lineRule="auto"/>
+              <w:jc w:val="left"/>
+            </w:pPr>
+            <w:r>
+              <w:rPr>
+                <w:rFonts w:ascii="Calibri" w:hAnsi="Calibri"/>
+                <w:b w:val="0"/>
+                <w:color w:val="111827"/>
+                <w:sz w:val="16"/>
+              </w:rPr>
+              <w:t>No resource is mutated and current version is returned</w:t>
+            </w:r>
+          </w:p>
+        </w:tc>
+      </w:tr>
+      <w:tr>
+        <w:trPr>
+          <w:cantSplit/>
+        </w:trPr>
+        <w:tc>
+          <w:tcPr>
+            <w:tcW w:type="dxa" w:w="1150"/>
+            <w:tcMar>
+              <w:top w:w="80" w:type="dxa"/>
+              <w:start w:w="120" w:type="dxa"/>
+              <w:bottom w:w="80" w:type="dxa"/>
+              <w:end w:w="120" w:type="dxa"/>
+            </w:tcMar>
+            <w:vAlign w:val="center"/>
+            <w:shd w:fill="FFFFFF"/>
+          </w:tcPr>
+          <w:p>
+            <w:pPr>
+              <w:spacing w:before="0" w:after="40" w:line="252" w:lineRule="auto"/>
+              <w:jc w:val="center"/>
+            </w:pPr>
+            <w:r>
+              <w:rPr>
+                <w:rFonts w:ascii="Calibri" w:hAnsi="Calibri"/>
+                <w:b w:val="0"/>
+                <w:color w:val="111827"/>
+                <w:sz w:val="16"/>
+              </w:rPr>
+              <w:t>EV-T-117</w:t>
+            </w:r>
+          </w:p>
+        </w:tc>
+        <w:tc>
+          <w:tcPr>
+            <w:tcW w:type="dxa" w:w="3700"/>
+            <w:tcMar>
+              <w:top w:w="80" w:type="dxa"/>
+              <w:start w:w="120" w:type="dxa"/>
+              <w:bottom w:w="80" w:type="dxa"/>
+              <w:end w:w="120" w:type="dxa"/>
+            </w:tcMar>
+            <w:vAlign w:val="center"/>
+            <w:shd w:fill="FFFFFF"/>
+          </w:tcPr>
+          <w:p>
+            <w:pPr>
+              <w:spacing w:before="0" w:after="40" w:line="252" w:lineRule="auto"/>
+              <w:jc w:val="left"/>
+            </w:pPr>
+            <w:r>
+              <w:rPr>
+                <w:rFonts w:ascii="Calibri" w:hAnsi="Calibri"/>
+                <w:b w:val="0"/>
+                <w:color w:val="111827"/>
+                <w:sz w:val="16"/>
+              </w:rPr>
+              <w:t>Exact scenario replay</w:t>
+            </w:r>
+          </w:p>
+        </w:tc>
+        <w:tc>
+          <w:tcPr>
+            <w:tcW w:type="dxa" w:w="3100"/>
+            <w:tcMar>
+              <w:top w:w="80" w:type="dxa"/>
+              <w:start w:w="120" w:type="dxa"/>
+              <w:bottom w:w="80" w:type="dxa"/>
+              <w:end w:w="120" w:type="dxa"/>
+            </w:tcMar>
+            <w:vAlign w:val="center"/>
+            <w:shd w:fill="FFFFFF"/>
+          </w:tcPr>
+          <w:p>
+            <w:pPr>
+              <w:spacing w:before="0" w:after="40" w:line="252" w:lineRule="auto"/>
+              <w:jc w:val="left"/>
+            </w:pPr>
+            <w:r>
+              <w:rPr>
+                <w:rFonts w:ascii="Calibri" w:hAnsi="Calibri"/>
+                <w:b w:val="0"/>
+                <w:color w:val="111827"/>
+                <w:sz w:val="16"/>
+              </w:rPr>
+              <w:t>Retry the identical execution</w:t>
+            </w:r>
+          </w:p>
+        </w:tc>
+        <w:tc>
+          <w:tcPr>
+            <w:tcW w:type="dxa" w:w="1410"/>
+            <w:tcMar>
+              <w:top w:w="80" w:type="dxa"/>
+              <w:start w:w="120" w:type="dxa"/>
+              <w:bottom w:w="80" w:type="dxa"/>
+              <w:end w:w="120" w:type="dxa"/>
+            </w:tcMar>
+            <w:vAlign w:val="center"/>
+            <w:shd w:fill="FFFFFF"/>
+          </w:tcPr>
+          <w:p>
+            <w:pPr>
+              <w:spacing w:before="0" w:after="40" w:line="252" w:lineRule="auto"/>
+              <w:jc w:val="left"/>
+            </w:pPr>
+            <w:r>
+              <w:rPr>
+                <w:rFonts w:ascii="Calibri" w:hAnsi="Calibri"/>
+                <w:b w:val="0"/>
+                <w:color w:val="111827"/>
+                <w:sz w:val="16"/>
+              </w:rPr>
+              <w:t>Persisted evidence and no second state transition</w:t>
+            </w:r>
+          </w:p>
+        </w:tc>
+      </w:tr>
+      <w:tr>
+        <w:trPr>
+          <w:cantSplit/>
+        </w:trPr>
+        <w:tc>
+          <w:tcPr>
+            <w:tcW w:type="dxa" w:w="1150"/>
+            <w:tcMar>
+              <w:top w:w="80" w:type="dxa"/>
+              <w:start w:w="120" w:type="dxa"/>
+              <w:bottom w:w="80" w:type="dxa"/>
+              <w:end w:w="120" w:type="dxa"/>
+            </w:tcMar>
+            <w:vAlign w:val="center"/>
+            <w:shd w:fill="FFFFFF"/>
+          </w:tcPr>
+          <w:p>
+            <w:pPr>
+              <w:spacing w:before="0" w:after="40" w:line="252" w:lineRule="auto"/>
+              <w:jc w:val="center"/>
+            </w:pPr>
+            <w:r>
+              <w:rPr>
+                <w:rFonts w:ascii="Calibri" w:hAnsi="Calibri"/>
+                <w:b w:val="0"/>
+                <w:color w:val="111827"/>
+                <w:sz w:val="16"/>
+              </w:rPr>
+              <w:t>EV-T-118</w:t>
+            </w:r>
+          </w:p>
+        </w:tc>
+        <w:tc>
+          <w:tcPr>
+            <w:tcW w:type="dxa" w:w="3700"/>
+            <w:tcMar>
+              <w:top w:w="80" w:type="dxa"/>
+              <w:start w:w="120" w:type="dxa"/>
+              <w:bottom w:w="80" w:type="dxa"/>
+              <w:end w:w="120" w:type="dxa"/>
+            </w:tcMar>
+            <w:vAlign w:val="center"/>
+            <w:shd w:fill="FFFFFF"/>
+          </w:tcPr>
+          <w:p>
+            <w:pPr>
+              <w:spacing w:before="0" w:after="40" w:line="252" w:lineRule="auto"/>
+              <w:jc w:val="left"/>
+            </w:pPr>
+            <w:r>
+              <w:rPr>
+                <w:rFonts w:ascii="Calibri" w:hAnsi="Calibri"/>
+                <w:b w:val="0"/>
+                <w:color w:val="111827"/>
+                <w:sz w:val="16"/>
+              </w:rPr>
+              <w:t>Changed scenario reuse</w:t>
+            </w:r>
+          </w:p>
+        </w:tc>
+        <w:tc>
+          <w:tcPr>
+            <w:tcW w:type="dxa" w:w="3100"/>
+            <w:tcMar>
+              <w:top w:w="80" w:type="dxa"/>
+              <w:start w:w="120" w:type="dxa"/>
+              <w:bottom w:w="80" w:type="dxa"/>
+              <w:end w:w="120" w:type="dxa"/>
+            </w:tcMar>
+            <w:vAlign w:val="center"/>
+            <w:shd w:fill="FFFFFF"/>
+          </w:tcPr>
+          <w:p>
+            <w:pPr>
+              <w:spacing w:before="0" w:after="40" w:line="252" w:lineRule="auto"/>
+              <w:jc w:val="left"/>
+            </w:pPr>
+            <w:r>
+              <w:rPr>
+                <w:rFonts w:ascii="Calibri" w:hAnsi="Calibri"/>
+                <w:b w:val="0"/>
+                <w:color w:val="111827"/>
+                <w:sz w:val="16"/>
+              </w:rPr>
+              <w:t>Reuse execution ID with changed input</w:t>
+            </w:r>
+          </w:p>
+        </w:tc>
+        <w:tc>
+          <w:tcPr>
+            <w:tcW w:type="dxa" w:w="1410"/>
+            <w:tcMar>
+              <w:top w:w="80" w:type="dxa"/>
+              <w:start w:w="120" w:type="dxa"/>
+              <w:bottom w:w="80" w:type="dxa"/>
+              <w:end w:w="120" w:type="dxa"/>
+            </w:tcMar>
+            <w:vAlign w:val="center"/>
+            <w:shd w:fill="FFFFFF"/>
+          </w:tcPr>
+          <w:p>
+            <w:pPr>
+              <w:spacing w:before="0" w:after="40" w:line="252" w:lineRule="auto"/>
+              <w:jc w:val="left"/>
+            </w:pPr>
+            <w:r>
+              <w:rPr>
+                <w:rFonts w:ascii="Calibri" w:hAnsi="Calibri"/>
+                <w:b w:val="0"/>
+                <w:color w:val="111827"/>
+                <w:sz w:val="16"/>
+              </w:rPr>
+              <w:t>Stable scenario conflict</w:t>
+            </w:r>
+          </w:p>
+        </w:tc>
+      </w:tr>
+      <w:tr>
+        <w:trPr>
+          <w:cantSplit/>
+        </w:trPr>
+        <w:tc>
+          <w:tcPr>
+            <w:tcW w:type="dxa" w:w="1150"/>
+            <w:tcMar>
+              <w:top w:w="80" w:type="dxa"/>
+              <w:start w:w="120" w:type="dxa"/>
+              <w:bottom w:w="80" w:type="dxa"/>
+              <w:end w:w="120" w:type="dxa"/>
+            </w:tcMar>
+            <w:vAlign w:val="center"/>
+            <w:shd w:fill="FFFFFF"/>
+          </w:tcPr>
+          <w:p>
+            <w:pPr>
+              <w:spacing w:before="0" w:after="40" w:line="252" w:lineRule="auto"/>
+              <w:jc w:val="center"/>
+            </w:pPr>
+            <w:r>
+              <w:rPr>
+                <w:rFonts w:ascii="Calibri" w:hAnsi="Calibri"/>
+                <w:b w:val="0"/>
+                <w:color w:val="111827"/>
+                <w:sz w:val="16"/>
+              </w:rPr>
+              <w:t>EV-T-119</w:t>
+            </w:r>
+          </w:p>
+        </w:tc>
+        <w:tc>
+          <w:tcPr>
+            <w:tcW w:type="dxa" w:w="3700"/>
+            <w:tcMar>
+              <w:top w:w="80" w:type="dxa"/>
+              <w:start w:w="120" w:type="dxa"/>
+              <w:bottom w:w="80" w:type="dxa"/>
+              <w:end w:w="120" w:type="dxa"/>
+            </w:tcMar>
+            <w:vAlign w:val="center"/>
+            <w:shd w:fill="FFFFFF"/>
+          </w:tcPr>
+          <w:p>
+            <w:pPr>
+              <w:spacing w:before="0" w:after="40" w:line="252" w:lineRule="auto"/>
+              <w:jc w:val="left"/>
+            </w:pPr>
+            <w:r>
+              <w:rPr>
+                <w:rFonts w:ascii="Calibri" w:hAnsi="Calibri"/>
+                <w:b w:val="0"/>
+                <w:color w:val="111827"/>
+                <w:sz w:val="16"/>
+              </w:rPr>
+              <w:t>CAN ownership contract</w:t>
+            </w:r>
+          </w:p>
+        </w:tc>
+        <w:tc>
+          <w:tcPr>
+            <w:tcW w:type="dxa" w:w="3100"/>
+            <w:tcMar>
+              <w:top w:w="80" w:type="dxa"/>
+              <w:start w:w="120" w:type="dxa"/>
+              <w:bottom w:w="80" w:type="dxa"/>
+              <w:end w:w="120" w:type="dxa"/>
+            </w:tcMar>
+            <w:vAlign w:val="center"/>
+            <w:shd w:fill="FFFFFF"/>
+          </w:tcPr>
+          <w:p>
+            <w:pPr>
+              <w:spacing w:before="0" w:after="40" w:line="252" w:lineRule="auto"/>
+              <w:jc w:val="left"/>
+            </w:pPr>
+            <w:r>
+              <w:rPr>
+                <w:rFonts w:ascii="Calibri" w:hAnsi="Calibri"/>
+                <w:b w:val="0"/>
+                <w:color w:val="111827"/>
+                <w:sz w:val="16"/>
+              </w:rPr>
+              <w:t>Select a frame produced by another ECU</w:t>
+            </w:r>
+          </w:p>
+        </w:tc>
+        <w:tc>
+          <w:tcPr>
+            <w:tcW w:type="dxa" w:w="1410"/>
+            <w:tcMar>
+              <w:top w:w="80" w:type="dxa"/>
+              <w:start w:w="120" w:type="dxa"/>
+              <w:bottom w:w="80" w:type="dxa"/>
+              <w:end w:w="120" w:type="dxa"/>
+            </w:tcMar>
+            <w:vAlign w:val="center"/>
+            <w:shd w:fill="FFFFFF"/>
+          </w:tcPr>
+          <w:p>
+            <w:pPr>
+              <w:spacing w:before="0" w:after="40" w:line="252" w:lineRule="auto"/>
+              <w:jc w:val="left"/>
+            </w:pPr>
+            <w:r>
+              <w:rPr>
+                <w:rFonts w:ascii="Calibri" w:hAnsi="Calibri"/>
+                <w:b w:val="0"/>
+                <w:color w:val="111827"/>
+                <w:sz w:val="16"/>
+              </w:rPr>
+              <w:t>Stable contract error</w:t>
+            </w:r>
+          </w:p>
+        </w:tc>
+      </w:tr>
+      <w:tr>
+        <w:trPr>
+          <w:cantSplit/>
+        </w:trPr>
+        <w:tc>
+          <w:tcPr>
+            <w:tcW w:type="dxa" w:w="1150"/>
+            <w:tcMar>
+              <w:top w:w="80" w:type="dxa"/>
+              <w:start w:w="120" w:type="dxa"/>
+              <w:bottom w:w="80" w:type="dxa"/>
+              <w:end w:w="120" w:type="dxa"/>
+            </w:tcMar>
+            <w:vAlign w:val="center"/>
+            <w:shd w:fill="FFFFFF"/>
+          </w:tcPr>
+          <w:p>
+            <w:pPr>
+              <w:spacing w:before="0" w:after="40" w:line="252" w:lineRule="auto"/>
+              <w:jc w:val="center"/>
+            </w:pPr>
+            <w:r>
+              <w:rPr>
+                <w:rFonts w:ascii="Calibri" w:hAnsi="Calibri"/>
+                <w:b w:val="0"/>
+                <w:color w:val="111827"/>
+                <w:sz w:val="16"/>
+              </w:rPr>
+              <w:t>EV-T-120</w:t>
+            </w:r>
+          </w:p>
+        </w:tc>
+        <w:tc>
+          <w:tcPr>
+            <w:tcW w:type="dxa" w:w="3700"/>
+            <w:tcMar>
+              <w:top w:w="80" w:type="dxa"/>
+              <w:start w:w="120" w:type="dxa"/>
+              <w:bottom w:w="80" w:type="dxa"/>
+              <w:end w:w="120" w:type="dxa"/>
+            </w:tcMar>
+            <w:vAlign w:val="center"/>
+            <w:shd w:fill="FFFFFF"/>
+          </w:tcPr>
+          <w:p>
+            <w:pPr>
+              <w:spacing w:before="0" w:after="40" w:line="252" w:lineRule="auto"/>
+              <w:jc w:val="left"/>
+            </w:pPr>
+            <w:r>
+              <w:rPr>
+                <w:rFonts w:ascii="Calibri" w:hAnsi="Calibri"/>
+                <w:b w:val="0"/>
+                <w:color w:val="111827"/>
+                <w:sz w:val="16"/>
+              </w:rPr>
+              <w:t>Atomic correlated evidence</w:t>
+            </w:r>
+          </w:p>
+        </w:tc>
+        <w:tc>
+          <w:tcPr>
+            <w:tcW w:type="dxa" w:w="3100"/>
+            <w:tcMar>
+              <w:top w:w="80" w:type="dxa"/>
+              <w:start w:w="120" w:type="dxa"/>
+              <w:bottom w:w="80" w:type="dxa"/>
+              <w:end w:w="120" w:type="dxa"/>
+            </w:tcMar>
+            <w:vAlign w:val="center"/>
+            <w:shd w:fill="FFFFFF"/>
+          </w:tcPr>
+          <w:p>
+            <w:pPr>
+              <w:spacing w:before="0" w:after="40" w:line="252" w:lineRule="auto"/>
+              <w:jc w:val="left"/>
+            </w:pPr>
+            <w:r>
+              <w:rPr>
+                <w:rFonts w:ascii="Calibri" w:hAnsi="Calibri"/>
+                <w:b w:val="0"/>
+                <w:color w:val="111827"/>
+                <w:sz w:val="16"/>
+              </w:rPr>
+              <w:t>Inspect scenario, state, frame, DTC, audit, and outbox</w:t>
+            </w:r>
+          </w:p>
+        </w:tc>
+        <w:tc>
+          <w:tcPr>
+            <w:tcW w:type="dxa" w:w="1410"/>
+            <w:tcMar>
+              <w:top w:w="80" w:type="dxa"/>
+              <w:start w:w="120" w:type="dxa"/>
+              <w:bottom w:w="80" w:type="dxa"/>
+              <w:end w:w="120" w:type="dxa"/>
+            </w:tcMar>
+            <w:vAlign w:val="center"/>
+            <w:shd w:fill="FFFFFF"/>
+          </w:tcPr>
+          <w:p>
+            <w:pPr>
+              <w:spacing w:before="0" w:after="40" w:line="252" w:lineRule="auto"/>
+              <w:jc w:val="left"/>
+            </w:pPr>
+            <w:r>
+              <w:rPr>
+                <w:rFonts w:ascii="Calibri" w:hAnsi="Calibri"/>
+                <w:b w:val="0"/>
+                <w:color w:val="111827"/>
+                <w:sz w:val="16"/>
+              </w:rPr>
+              <w:t>All records commit or all roll back</w:t>
+            </w:r>
+          </w:p>
+        </w:tc>
+      </w:tr>
+      <w:tr>
+        <w:trPr>
+          <w:cantSplit/>
+        </w:trPr>
+        <w:tc>
+          <w:tcPr>
+            <w:tcW w:type="dxa" w:w="1150"/>
+            <w:tcMar>
+              <w:top w:w="80" w:type="dxa"/>
+              <w:start w:w="120" w:type="dxa"/>
+              <w:bottom w:w="80" w:type="dxa"/>
+              <w:end w:w="120" w:type="dxa"/>
+            </w:tcMar>
+            <w:vAlign w:val="center"/>
+            <w:shd w:fill="FFFFFF"/>
+          </w:tcPr>
+          <w:p>
+            <w:pPr>
+              <w:spacing w:before="0" w:after="40" w:line="252" w:lineRule="auto"/>
+              <w:jc w:val="center"/>
+            </w:pPr>
+            <w:r>
+              <w:rPr>
+                <w:rFonts w:ascii="Calibri" w:hAnsi="Calibri"/>
+                <w:b w:val="0"/>
+                <w:color w:val="111827"/>
+                <w:sz w:val="16"/>
+              </w:rPr>
+              <w:t>EV-T-121</w:t>
+            </w:r>
+          </w:p>
+        </w:tc>
+        <w:tc>
+          <w:tcPr>
+            <w:tcW w:type="dxa" w:w="3700"/>
+            <w:tcMar>
+              <w:top w:w="80" w:type="dxa"/>
+              <w:start w:w="120" w:type="dxa"/>
+              <w:bottom w:w="80" w:type="dxa"/>
+              <w:end w:w="120" w:type="dxa"/>
+            </w:tcMar>
+            <w:vAlign w:val="center"/>
+            <w:shd w:fill="FFFFFF"/>
+          </w:tcPr>
+          <w:p>
+            <w:pPr>
+              <w:spacing w:before="0" w:after="40" w:line="252" w:lineRule="auto"/>
+              <w:jc w:val="left"/>
+            </w:pPr>
+            <w:r>
+              <w:rPr>
+                <w:rFonts w:ascii="Calibri" w:hAnsi="Calibri"/>
+                <w:b w:val="0"/>
+                <w:color w:val="111827"/>
+                <w:sz w:val="16"/>
+              </w:rPr>
+              <w:t>Scenario RBAC</w:t>
+            </w:r>
+          </w:p>
+        </w:tc>
+        <w:tc>
+          <w:tcPr>
+            <w:tcW w:type="dxa" w:w="3100"/>
+            <w:tcMar>
+              <w:top w:w="80" w:type="dxa"/>
+              <w:start w:w="120" w:type="dxa"/>
+              <w:bottom w:w="80" w:type="dxa"/>
+              <w:end w:w="120" w:type="dxa"/>
+            </w:tcMar>
+            <w:vAlign w:val="center"/>
+            <w:shd w:fill="FFFFFF"/>
+          </w:tcPr>
+          <w:p>
+            <w:pPr>
+              <w:spacing w:before="0" w:after="40" w:line="252" w:lineRule="auto"/>
+              <w:jc w:val="left"/>
+            </w:pPr>
+            <w:r>
+              <w:rPr>
+                <w:rFonts w:ascii="Calibri" w:hAnsi="Calibri"/>
+                <w:b w:val="0"/>
+                <w:color w:val="111827"/>
+                <w:sz w:val="16"/>
+              </w:rPr>
+              <w:t>Exercise read and mutation without permission</w:t>
+            </w:r>
+          </w:p>
+        </w:tc>
+        <w:tc>
+          <w:tcPr>
+            <w:tcW w:type="dxa" w:w="1410"/>
+            <w:tcMar>
+              <w:top w:w="80" w:type="dxa"/>
+              <w:start w:w="120" w:type="dxa"/>
+              <w:bottom w:w="80" w:type="dxa"/>
+              <w:end w:w="120" w:type="dxa"/>
+            </w:tcMar>
+            <w:vAlign w:val="center"/>
+            <w:shd w:fill="FFFFFF"/>
+          </w:tcPr>
+          <w:p>
+            <w:pPr>
+              <w:spacing w:before="0" w:after="40" w:line="252" w:lineRule="auto"/>
+              <w:jc w:val="left"/>
+            </w:pPr>
+            <w:r>
+              <w:rPr>
+                <w:rFonts w:ascii="Calibri" w:hAnsi="Calibri"/>
+                <w:b w:val="0"/>
+                <w:color w:val="111827"/>
+                <w:sz w:val="16"/>
+              </w:rPr>
+              <w:t>HTTP 403</w:t>
+            </w:r>
+          </w:p>
+        </w:tc>
+      </w:tr>
+      <w:tr>
+        <w:trPr>
+          <w:cantSplit/>
+        </w:trPr>
+        <w:tc>
+          <w:tcPr>
+            <w:tcW w:type="dxa" w:w="1150"/>
+            <w:tcMar>
+              <w:top w:w="80" w:type="dxa"/>
+              <w:start w:w="120" w:type="dxa"/>
+              <w:bottom w:w="80" w:type="dxa"/>
+              <w:end w:w="120" w:type="dxa"/>
+            </w:tcMar>
+            <w:vAlign w:val="center"/>
+            <w:shd w:fill="FFFFFF"/>
+          </w:tcPr>
+          <w:p>
+            <w:pPr>
+              <w:spacing w:before="0" w:after="40" w:line="252" w:lineRule="auto"/>
+              <w:jc w:val="center"/>
+            </w:pPr>
+            <w:r>
+              <w:rPr>
+                <w:rFonts w:ascii="Calibri" w:hAnsi="Calibri"/>
+                <w:b w:val="0"/>
+                <w:color w:val="111827"/>
+                <w:sz w:val="16"/>
+              </w:rPr>
+              <w:t>EV-T-122</w:t>
+            </w:r>
+          </w:p>
+        </w:tc>
+        <w:tc>
+          <w:tcPr>
+            <w:tcW w:type="dxa" w:w="3700"/>
+            <w:tcMar>
+              <w:top w:w="80" w:type="dxa"/>
+              <w:start w:w="120" w:type="dxa"/>
+              <w:bottom w:w="80" w:type="dxa"/>
+              <w:end w:w="120" w:type="dxa"/>
+            </w:tcMar>
+            <w:vAlign w:val="center"/>
+            <w:shd w:fill="FFFFFF"/>
+          </w:tcPr>
+          <w:p>
+            <w:pPr>
+              <w:spacing w:before="0" w:after="40" w:line="252" w:lineRule="auto"/>
+              <w:jc w:val="left"/>
+            </w:pPr>
+            <w:r>
+              <w:rPr>
+                <w:rFonts w:ascii="Calibri" w:hAnsi="Calibri"/>
+                <w:b w:val="0"/>
+                <w:color w:val="111827"/>
+                <w:sz w:val="16"/>
+              </w:rPr>
+              <w:t>Scenario pagination and migration</w:t>
+            </w:r>
+          </w:p>
+        </w:tc>
+        <w:tc>
+          <w:tcPr>
+            <w:tcW w:type="dxa" w:w="3100"/>
+            <w:tcMar>
+              <w:top w:w="80" w:type="dxa"/>
+              <w:start w:w="120" w:type="dxa"/>
+              <w:bottom w:w="80" w:type="dxa"/>
+              <w:end w:w="120" w:type="dxa"/>
+            </w:tcMar>
+            <w:vAlign w:val="center"/>
+            <w:shd w:fill="FFFFFF"/>
+          </w:tcPr>
+          <w:p>
+            <w:pPr>
+              <w:spacing w:before="0" w:after="40" w:line="252" w:lineRule="auto"/>
+              <w:jc w:val="left"/>
+            </w:pPr>
+            <w:r>
+              <w:rPr>
+                <w:rFonts w:ascii="Calibri" w:hAnsi="Calibri"/>
+                <w:b w:val="0"/>
+                <w:color w:val="111827"/>
+                <w:sz w:val="16"/>
+              </w:rPr>
+              <w:t>Inspect OpenAPI and revision 0043</w:t>
+            </w:r>
+          </w:p>
+        </w:tc>
+        <w:tc>
+          <w:tcPr>
+            <w:tcW w:type="dxa" w:w="1410"/>
+            <w:tcMar>
+              <w:top w:w="80" w:type="dxa"/>
+              <w:start w:w="120" w:type="dxa"/>
+              <w:bottom w:w="80" w:type="dxa"/>
+              <w:end w:w="120" w:type="dxa"/>
+            </w:tcMar>
+            <w:vAlign w:val="center"/>
+            <w:shd w:fill="FFFFFF"/>
+          </w:tcPr>
+          <w:p>
+            <w:pPr>
+              <w:spacing w:before="0" w:after="40" w:line="252" w:lineRule="auto"/>
+              <w:jc w:val="left"/>
+            </w:pPr>
+            <w:r>
+              <w:rPr>
+                <w:rFonts w:ascii="Calibri" w:hAnsi="Calibri"/>
+                <w:b w:val="0"/>
+                <w:color w:val="111827"/>
+                <w:sz w:val="16"/>
+              </w:rPr>
+              <w:t>Safe limits and reversible evidence table</w:t>
             </w:r>
           </w:p>
         </w:tc>
@@ -24591,7 +27011,7 @@
                 <w:color w:val="0B2545"/>
                 <w:sz w:val="17"/>
               </w:rPr>
-              <w:t>VI-1 through VI-6 evidence</w:t>
+              <w:t>VI-1 through VI-7 evidence</w:t>
             </w:r>
           </w:p>
         </w:tc>
@@ -24652,7 +27072,7 @@
                 <w:color w:val="111827"/>
                 <w:sz w:val="17"/>
               </w:rPr>
-              <w:t>Battery/BMS, propulsion, braking, charging, thermal zones, drive-cycle range, faults, replay, conflicts</w:t>
+              <w:t>Battery/BMS, propulsion, braking, charging, thermal, range, cross-domain protection, CAN, UDS, replay, conflicts</w:t>
             </w:r>
           </w:p>
         </w:tc>
@@ -25679,7 +28099,7 @@
                 <w:color w:val="111827"/>
                 <w:sz w:val="17"/>
               </w:rPr>
-              <w:t>Add an explicit projection/synchronization contract in VI-7</w:t>
+              <w:t>Add an explicit projection/synchronization contract when stateful trip scenarios are introduced</w:t>
             </w:r>
           </w:p>
         </w:tc>
@@ -25857,7 +28277,7 @@
                 <w:color w:val="111827"/>
                 <w:sz w:val="17"/>
               </w:rPr>
-              <w:t>Couple energy flow in VI-7 scenarios</w:t>
+              <w:t>Add a stateful drive-trip scenario after the safety baseline</w:t>
             </w:r>
           </w:p>
         </w:tc>
@@ -26035,7 +28455,7 @@
                 <w:color w:val="111827"/>
                 <w:sz w:val="17"/>
               </w:rPr>
-              <w:t>Couple braking to Volume II dynamics in VI-7</w:t>
+              <w:t>Couple braking to Volume II dynamics in a stateful trip scenario</w:t>
             </w:r>
           </w:p>
         </w:tc>
@@ -26480,7 +28900,7 @@
                 <w:color w:val="111827"/>
                 <w:sz w:val="17"/>
               </w:rPr>
-              <w:t>Couple range estimation to Volume II dynamics in VI-7</w:t>
+              <w:t>Couple range estimation to Volume II dynamics in a future trip scenario</w:t>
             </w:r>
           </w:p>
         </w:tc>
@@ -26658,7 +29078,185 @@
                 <w:color w:val="111827"/>
                 <w:sz w:val="17"/>
               </w:rPr>
-              <w:t>Apply energy through cross-domain scenarios in VI-7</w:t>
+              <w:t>Add a separate stateful drive execution contract</w:t>
+            </w:r>
+          </w:p>
+        </w:tc>
+      </w:tr>
+      <w:tr>
+        <w:trPr>
+          <w:cantSplit/>
+        </w:trPr>
+        <w:tc>
+          <w:tcPr>
+            <w:tcW w:type="dxa" w:w="1650"/>
+            <w:tcMar>
+              <w:top w:w="80" w:type="dxa"/>
+              <w:start w:w="120" w:type="dxa"/>
+              <w:bottom w:w="80" w:type="dxa"/>
+              <w:end w:w="120" w:type="dxa"/>
+            </w:tcMar>
+            <w:vAlign w:val="center"/>
+            <w:shd w:fill="FFFFFF"/>
+          </w:tcPr>
+          <w:p>
+            <w:pPr>
+              <w:spacing w:before="0" w:after="40" w:line="252" w:lineRule="auto"/>
+              <w:jc w:val="center"/>
+            </w:pPr>
+            <w:r>
+              <w:rPr>
+                <w:rFonts w:ascii="Calibri" w:hAnsi="Calibri"/>
+                <w:b w:val="0"/>
+                <w:color w:val="111827"/>
+                <w:sz w:val="17"/>
+              </w:rPr>
+              <w:t>First scenario covers one hazard</w:t>
+            </w:r>
+          </w:p>
+        </w:tc>
+        <w:tc>
+          <w:tcPr>
+            <w:tcW w:type="dxa" w:w="4450"/>
+            <w:tcMar>
+              <w:top w:w="80" w:type="dxa"/>
+              <w:start w:w="120" w:type="dxa"/>
+              <w:bottom w:w="80" w:type="dxa"/>
+              <w:end w:w="120" w:type="dxa"/>
+            </w:tcMar>
+            <w:vAlign w:val="center"/>
+            <w:shd w:fill="FFFFFF"/>
+          </w:tcPr>
+          <w:p>
+            <w:pPr>
+              <w:spacing w:before="0" w:after="40" w:line="252" w:lineRule="auto"/>
+              <w:jc w:val="left"/>
+            </w:pPr>
+            <w:r>
+              <w:rPr>
+                <w:rFonts w:ascii="Calibri" w:hAnsi="Calibri"/>
+                <w:b w:val="0"/>
+                <w:color w:val="111827"/>
+                <w:sz w:val="17"/>
+              </w:rPr>
+              <w:t>Drive and charging hazards are not yet orchestrated</w:t>
+            </w:r>
+          </w:p>
+        </w:tc>
+        <w:tc>
+          <w:tcPr>
+            <w:tcW w:type="dxa" w:w="3260"/>
+            <w:tcMar>
+              <w:top w:w="80" w:type="dxa"/>
+              <w:start w:w="120" w:type="dxa"/>
+              <w:bottom w:w="80" w:type="dxa"/>
+              <w:end w:w="120" w:type="dxa"/>
+            </w:tcMar>
+            <w:vAlign w:val="center"/>
+            <w:shd w:fill="FFFFFF"/>
+          </w:tcPr>
+          <w:p>
+            <w:pPr>
+              <w:spacing w:before="0" w:after="40" w:line="252" w:lineRule="auto"/>
+              <w:jc w:val="left"/>
+            </w:pPr>
+            <w:r>
+              <w:rPr>
+                <w:rFonts w:ascii="Calibri" w:hAnsi="Calibri"/>
+                <w:b w:val="0"/>
+                <w:color w:val="111827"/>
+                <w:sz w:val="17"/>
+              </w:rPr>
+              <w:t>Extend the template catalogue without weakening replay guarantees</w:t>
+            </w:r>
+          </w:p>
+        </w:tc>
+      </w:tr>
+      <w:tr>
+        <w:trPr>
+          <w:cantSplit/>
+        </w:trPr>
+        <w:tc>
+          <w:tcPr>
+            <w:tcW w:type="dxa" w:w="1650"/>
+            <w:tcMar>
+              <w:top w:w="80" w:type="dxa"/>
+              <w:start w:w="120" w:type="dxa"/>
+              <w:bottom w:w="80" w:type="dxa"/>
+              <w:end w:w="120" w:type="dxa"/>
+            </w:tcMar>
+            <w:vAlign w:val="center"/>
+            <w:shd w:fill="FFFFFF"/>
+          </w:tcPr>
+          <w:p>
+            <w:pPr>
+              <w:spacing w:before="0" w:after="40" w:line="252" w:lineRule="auto"/>
+              <w:jc w:val="center"/>
+            </w:pPr>
+            <w:r>
+              <w:rPr>
+                <w:rFonts w:ascii="Calibri" w:hAnsi="Calibri"/>
+                <w:b w:val="0"/>
+                <w:color w:val="111827"/>
+                <w:sz w:val="17"/>
+              </w:rPr>
+              <w:t>Simplified DTC code mapping</w:t>
+            </w:r>
+          </w:p>
+        </w:tc>
+        <w:tc>
+          <w:tcPr>
+            <w:tcW w:type="dxa" w:w="4450"/>
+            <w:tcMar>
+              <w:top w:w="80" w:type="dxa"/>
+              <w:start w:w="120" w:type="dxa"/>
+              <w:bottom w:w="80" w:type="dxa"/>
+              <w:end w:w="120" w:type="dxa"/>
+            </w:tcMar>
+            <w:vAlign w:val="center"/>
+            <w:shd w:fill="FFFFFF"/>
+          </w:tcPr>
+          <w:p>
+            <w:pPr>
+              <w:spacing w:before="0" w:after="40" w:line="252" w:lineRule="auto"/>
+              <w:jc w:val="left"/>
+            </w:pPr>
+            <w:r>
+              <w:rPr>
+                <w:rFonts w:ascii="Calibri" w:hAnsi="Calibri"/>
+                <w:b w:val="0"/>
+                <w:color w:val="111827"/>
+                <w:sz w:val="17"/>
+              </w:rPr>
+              <w:t>Not an OEM-specific diagnostic definition</w:t>
+            </w:r>
+          </w:p>
+        </w:tc>
+        <w:tc>
+          <w:tcPr>
+            <w:tcW w:type="dxa" w:w="3260"/>
+            <w:tcMar>
+              <w:top w:w="80" w:type="dxa"/>
+              <w:start w:w="120" w:type="dxa"/>
+              <w:bottom w:w="80" w:type="dxa"/>
+              <w:end w:w="120" w:type="dxa"/>
+            </w:tcMar>
+            <w:vAlign w:val="center"/>
+            <w:shd w:fill="FFFFFF"/>
+          </w:tcPr>
+          <w:p>
+            <w:pPr>
+              <w:spacing w:before="0" w:after="40" w:line="252" w:lineRule="auto"/>
+              <w:jc w:val="left"/>
+            </w:pPr>
+            <w:r>
+              <w:rPr>
+                <w:rFonts w:ascii="Calibri" w:hAnsi="Calibri"/>
+                <w:b w:val="0"/>
+                <w:color w:val="111827"/>
+                <w:sz w:val="17"/>
+              </w:rPr>
+              <w:t>Introduce versioned diagnostic catalogues and fault mappings</w:t>
             </w:r>
           </w:p>
         </w:tc>
@@ -26684,7 +29282,7 @@
         <w:pStyle w:val="ListNumber"/>
         <w:numPr>
           <w:ilvl w:val="0"/>
-          <w:numId w:val="28"/>
+          <w:numId w:val="29"/>
         </w:numPr>
         <w:spacing w:after="120"/>
       </w:pPr>
@@ -26702,7 +29300,7 @@
         <w:pStyle w:val="ListNumber"/>
         <w:numPr>
           <w:ilvl w:val="0"/>
-          <w:numId w:val="28"/>
+          <w:numId w:val="29"/>
         </w:numPr>
         <w:spacing w:after="120"/>
       </w:pPr>
@@ -26720,7 +29318,7 @@
         <w:pStyle w:val="ListNumber"/>
         <w:numPr>
           <w:ilvl w:val="0"/>
-          <w:numId w:val="28"/>
+          <w:numId w:val="29"/>
         </w:numPr>
         <w:spacing w:after="120"/>
       </w:pPr>
@@ -26738,7 +29336,7 @@
         <w:pStyle w:val="ListNumber"/>
         <w:numPr>
           <w:ilvl w:val="0"/>
-          <w:numId w:val="28"/>
+          <w:numId w:val="29"/>
         </w:numPr>
         <w:spacing w:after="120"/>
       </w:pPr>
@@ -26756,7 +29354,7 @@
         <w:pStyle w:val="ListNumber"/>
         <w:numPr>
           <w:ilvl w:val="0"/>
-          <w:numId w:val="28"/>
+          <w:numId w:val="29"/>
         </w:numPr>
         <w:spacing w:after="120"/>
       </w:pPr>
@@ -26774,7 +29372,7 @@
         <w:pStyle w:val="ListNumber"/>
         <w:numPr>
           <w:ilvl w:val="0"/>
-          <w:numId w:val="28"/>
+          <w:numId w:val="29"/>
         </w:numPr>
         <w:spacing w:after="120"/>
       </w:pPr>
@@ -26792,7 +29390,7 @@
         <w:pStyle w:val="ListNumber"/>
         <w:numPr>
           <w:ilvl w:val="0"/>
-          <w:numId w:val="28"/>
+          <w:numId w:val="29"/>
         </w:numPr>
         <w:spacing w:after="120"/>
       </w:pPr>
@@ -26810,7 +29408,7 @@
         <w:pStyle w:val="ListNumber"/>
         <w:numPr>
           <w:ilvl w:val="0"/>
-          <w:numId w:val="28"/>
+          <w:numId w:val="29"/>
         </w:numPr>
         <w:spacing w:after="120"/>
       </w:pPr>
@@ -26828,7 +29426,7 @@
         <w:pStyle w:val="ListNumber"/>
         <w:numPr>
           <w:ilvl w:val="0"/>
-          <w:numId w:val="28"/>
+          <w:numId w:val="29"/>
         </w:numPr>
         <w:spacing w:after="120"/>
       </w:pPr>
@@ -26846,7 +29444,7 @@
         <w:pStyle w:val="ListNumber"/>
         <w:numPr>
           <w:ilvl w:val="0"/>
-          <w:numId w:val="28"/>
+          <w:numId w:val="29"/>
         </w:numPr>
         <w:spacing w:after="120"/>
       </w:pPr>
@@ -26864,7 +29462,7 @@
         <w:pStyle w:val="ListNumber"/>
         <w:numPr>
           <w:ilvl w:val="0"/>
-          <w:numId w:val="28"/>
+          <w:numId w:val="29"/>
         </w:numPr>
         <w:spacing w:after="120"/>
       </w:pPr>
@@ -26882,7 +29480,7 @@
         <w:pStyle w:val="ListNumber"/>
         <w:numPr>
           <w:ilvl w:val="0"/>
-          <w:numId w:val="28"/>
+          <w:numId w:val="29"/>
         </w:numPr>
         <w:spacing w:after="120"/>
       </w:pPr>
@@ -26900,7 +29498,7 @@
         <w:pStyle w:val="ListNumber"/>
         <w:numPr>
           <w:ilvl w:val="0"/>
-          <w:numId w:val="28"/>
+          <w:numId w:val="29"/>
         </w:numPr>
         <w:spacing w:after="120"/>
       </w:pPr>
@@ -26918,7 +29516,7 @@
         <w:pStyle w:val="ListNumber"/>
         <w:numPr>
           <w:ilvl w:val="0"/>
-          <w:numId w:val="28"/>
+          <w:numId w:val="29"/>
         </w:numPr>
         <w:spacing w:after="120"/>
       </w:pPr>
@@ -26936,7 +29534,7 @@
         <w:pStyle w:val="ListNumber"/>
         <w:numPr>
           <w:ilvl w:val="0"/>
-          <w:numId w:val="28"/>
+          <w:numId w:val="29"/>
         </w:numPr>
         <w:spacing w:after="120"/>
       </w:pPr>
@@ -26954,7 +29552,7 @@
         <w:pStyle w:val="ListNumber"/>
         <w:numPr>
           <w:ilvl w:val="0"/>
-          <w:numId w:val="28"/>
+          <w:numId w:val="29"/>
         </w:numPr>
         <w:spacing w:after="120"/>
       </w:pPr>
@@ -26972,7 +29570,7 @@
         <w:pStyle w:val="ListNumber"/>
         <w:numPr>
           <w:ilvl w:val="0"/>
-          <w:numId w:val="28"/>
+          <w:numId w:val="29"/>
         </w:numPr>
         <w:spacing w:after="120"/>
       </w:pPr>
@@ -26990,7 +29588,7 @@
         <w:pStyle w:val="ListNumber"/>
         <w:numPr>
           <w:ilvl w:val="0"/>
-          <w:numId w:val="28"/>
+          <w:numId w:val="29"/>
         </w:numPr>
         <w:spacing w:after="120"/>
       </w:pPr>
@@ -27008,7 +29606,7 @@
         <w:pStyle w:val="ListNumber"/>
         <w:numPr>
           <w:ilvl w:val="0"/>
-          <w:numId w:val="28"/>
+          <w:numId w:val="29"/>
         </w:numPr>
         <w:spacing w:after="120"/>
       </w:pPr>
@@ -27026,7 +29624,7 @@
         <w:pStyle w:val="ListNumber"/>
         <w:numPr>
           <w:ilvl w:val="0"/>
-          <w:numId w:val="28"/>
+          <w:numId w:val="29"/>
         </w:numPr>
         <w:spacing w:after="120"/>
       </w:pPr>
@@ -27044,7 +29642,7 @@
         <w:pStyle w:val="ListNumber"/>
         <w:numPr>
           <w:ilvl w:val="0"/>
-          <w:numId w:val="28"/>
+          <w:numId w:val="29"/>
         </w:numPr>
         <w:spacing w:after="120"/>
       </w:pPr>
@@ -27062,7 +29660,7 @@
         <w:pStyle w:val="ListNumber"/>
         <w:numPr>
           <w:ilvl w:val="0"/>
-          <w:numId w:val="28"/>
+          <w:numId w:val="29"/>
         </w:numPr>
         <w:spacing w:after="120"/>
       </w:pPr>
@@ -27080,7 +29678,7 @@
         <w:pStyle w:val="ListNumber"/>
         <w:numPr>
           <w:ilvl w:val="0"/>
-          <w:numId w:val="28"/>
+          <w:numId w:val="29"/>
         </w:numPr>
         <w:spacing w:after="120"/>
       </w:pPr>
@@ -27098,7 +29696,7 @@
         <w:pStyle w:val="ListNumber"/>
         <w:numPr>
           <w:ilvl w:val="0"/>
-          <w:numId w:val="28"/>
+          <w:numId w:val="29"/>
         </w:numPr>
         <w:spacing w:after="120"/>
       </w:pPr>
@@ -27116,7 +29714,7 @@
         <w:pStyle w:val="ListNumber"/>
         <w:numPr>
           <w:ilvl w:val="0"/>
-          <w:numId w:val="28"/>
+          <w:numId w:val="29"/>
         </w:numPr>
         <w:spacing w:after="120"/>
       </w:pPr>
@@ -27134,7 +29732,7 @@
         <w:pStyle w:val="ListNumber"/>
         <w:numPr>
           <w:ilvl w:val="0"/>
-          <w:numId w:val="28"/>
+          <w:numId w:val="29"/>
         </w:numPr>
         <w:spacing w:after="120"/>
       </w:pPr>
@@ -27152,7 +29750,7 @@
         <w:pStyle w:val="ListNumber"/>
         <w:numPr>
           <w:ilvl w:val="0"/>
-          <w:numId w:val="28"/>
+          <w:numId w:val="29"/>
         </w:numPr>
         <w:spacing w:after="120"/>
       </w:pPr>
@@ -27170,7 +29768,7 @@
         <w:pStyle w:val="ListNumber"/>
         <w:numPr>
           <w:ilvl w:val="0"/>
-          <w:numId w:val="28"/>
+          <w:numId w:val="29"/>
         </w:numPr>
         <w:spacing w:after="120"/>
       </w:pPr>
@@ -27188,7 +29786,7 @@
         <w:pStyle w:val="ListNumber"/>
         <w:numPr>
           <w:ilvl w:val="0"/>
-          <w:numId w:val="28"/>
+          <w:numId w:val="29"/>
         </w:numPr>
         <w:spacing w:after="120"/>
       </w:pPr>
@@ -27206,7 +29804,7 @@
         <w:pStyle w:val="ListNumber"/>
         <w:numPr>
           <w:ilvl w:val="0"/>
-          <w:numId w:val="28"/>
+          <w:numId w:val="29"/>
         </w:numPr>
         <w:spacing w:after="120"/>
       </w:pPr>
@@ -27217,6 +29815,112 @@
           <w:sz w:val="22"/>
         </w:rPr>
         <w:t>Retry a range command and prove that the persisted cycle is not integrated twice.</w:t>
+      </w:r>
+    </w:p>
+    <w:p>
+      <w:pPr>
+        <w:pStyle w:val="ListNumber"/>
+        <w:numPr>
+          <w:ilvl w:val="0"/>
+          <w:numId w:val="29"/>
+        </w:numPr>
+        <w:spacing w:after="120"/>
+      </w:pPr>
+      <w:r>
+        <w:rPr>
+          <w:rFonts w:ascii="Calibri" w:hAnsi="Calibri"/>
+          <w:color w:val="111827"/>
+          <w:sz w:val="22"/>
+        </w:rPr>
+        <w:t>Configure a battery ECU and a BMS-owned CAN frame contract, then execute the overtemperature scenario.</w:t>
+      </w:r>
+    </w:p>
+    <w:p>
+      <w:pPr>
+        <w:pStyle w:val="ListNumber"/>
+        <w:numPr>
+          <w:ilvl w:val="0"/>
+          <w:numId w:val="29"/>
+        </w:numPr>
+        <w:spacing w:after="120"/>
+      </w:pPr>
+      <w:r>
+        <w:rPr>
+          <w:rFonts w:ascii="Calibri" w:hAnsi="Calibri"/>
+          <w:color w:val="111827"/>
+          <w:sz w:val="22"/>
+        </w:rPr>
+        <w:t>Decode the first two CAN payload bytes and verify the temperature in tenths of a degree Celsius.</w:t>
+      </w:r>
+    </w:p>
+    <w:p>
+      <w:pPr>
+        <w:pStyle w:val="ListNumber"/>
+        <w:numPr>
+          <w:ilvl w:val="0"/>
+          <w:numId w:val="29"/>
+        </w:numPr>
+        <w:spacing w:after="120"/>
+      </w:pPr>
+      <w:r>
+        <w:rPr>
+          <w:rFonts w:ascii="Calibri" w:hAnsi="Calibri"/>
+          <w:color w:val="111827"/>
+          <w:sz w:val="22"/>
+        </w:rPr>
+        <w:t xml:space="preserve">Read DTC </w:t>
+      </w:r>
+      <w:r>
+        <w:rPr>
+          <w:rFonts w:ascii="Consolas" w:hAnsi="Consolas"/>
+          <w:color w:val="1F4D78"/>
+          <w:sz w:val="19"/>
+        </w:rPr>
+        <w:t>0A7E00</w:t>
+      </w:r>
+      <w:r>
+        <w:rPr>
+          <w:rFonts w:ascii="Calibri" w:hAnsi="Calibri"/>
+          <w:color w:val="111827"/>
+          <w:sz w:val="22"/>
+        </w:rPr>
+        <w:t xml:space="preserve"> and compare its freeze frame with the scenario state evidence.</w:t>
+      </w:r>
+    </w:p>
+    <w:p>
+      <w:pPr>
+        <w:pStyle w:val="ListNumber"/>
+        <w:numPr>
+          <w:ilvl w:val="0"/>
+          <w:numId w:val="29"/>
+        </w:numPr>
+        <w:spacing w:after="120"/>
+      </w:pPr>
+      <w:r>
+        <w:rPr>
+          <w:rFonts w:ascii="Calibri" w:hAnsi="Calibri"/>
+          <w:color w:val="111827"/>
+          <w:sz w:val="22"/>
+        </w:rPr>
+        <w:t>Retry the execution and prove that no aggregate version advances twice.</w:t>
+      </w:r>
+    </w:p>
+    <w:p>
+      <w:pPr>
+        <w:pStyle w:val="ListNumber"/>
+        <w:numPr>
+          <w:ilvl w:val="0"/>
+          <w:numId w:val="29"/>
+        </w:numPr>
+        <w:spacing w:after="120"/>
+      </w:pPr>
+      <w:r>
+        <w:rPr>
+          <w:rFonts w:ascii="Calibri" w:hAnsi="Calibri"/>
+          <w:color w:val="111827"/>
+          <w:sz w:val="22"/>
+        </w:rPr>
+        <w:t>Change one expected version and prove that no domain or protocol record is mutated.</w:t>
       </w:r>
     </w:p>
     <w:p>
@@ -27324,7 +30028,7 @@
         <w:keepLines/>
       </w:pPr>
       <w:r>
-        <w:t>15. Next Development</w:t>
+        <w:t>15. VI-7 Cross-Domain EV Safety Scenario</w:t>
       </w:r>
     </w:p>
     <w:p>
@@ -27334,7 +30038,121 @@
           <w:color w:val="111827"/>
           <w:sz w:val="22"/>
         </w:rPr>
-        <w:t>VI-7 will add cross-domain EV scenarios that coordinate battery, powertrain, regenerative braking, charging, thermal management, and range through BMS ECU, CAN, UDS, automated tests, and correlated evidence.</w:t>
+        <w:t xml:space="preserve">VI-7 implements the battery-overtemperature flow described in the project vision. A single API operation applies the thermal stimulus and records the safety response across battery, propulsion, regenerative braking, charging, thermal management, and range. It also updates the selected BMS ECU, transmits a BMS-owned CAN frame, and stores UDS DTC </w:t>
+      </w:r>
+      <w:r>
+        <w:rPr>
+          <w:rFonts w:ascii="Consolas" w:hAnsi="Consolas"/>
+          <w:color w:val="1F4D78"/>
+          <w:sz w:val="19"/>
+        </w:rPr>
+        <w:t>0A7E00</w:t>
+      </w:r>
+      <w:r>
+        <w:rPr>
+          <w:rFonts w:ascii="Calibri" w:hAnsi="Calibri"/>
+          <w:color w:val="111827"/>
+          <w:sz w:val="22"/>
+        </w:rPr>
+        <w:t xml:space="preserve"> with freeze-frame data.</w:t>
+      </w:r>
+    </w:p>
+    <w:p>
+      <w:r>
+        <w:rPr>
+          <w:rFonts w:ascii="Calibri" w:hAnsi="Calibri"/>
+          <w:color w:val="111827"/>
+          <w:sz w:val="22"/>
+        </w:rPr>
+        <w:t>The transaction validates eight expected versions before the first mutation. Its result contains before and after versions, domain observations, CAN and UDS evidence, and explicit assertions. An exact retry returns the immutable result without advancing logical time or versions. Changed reuse and incompatible CAN ownership produce stable error codes.</w:t>
+      </w:r>
+    </w:p>
+    <w:p>
+      <w:r>
+        <w:rPr>
+          <w:rFonts w:ascii="Calibri" w:hAnsi="Calibri"/>
+          <w:color w:val="111827"/>
+          <w:sz w:val="22"/>
+        </w:rPr>
+        <w:t xml:space="preserve">The public contract consists of </w:t>
+      </w:r>
+      <w:r>
+        <w:rPr>
+          <w:rFonts w:ascii="Consolas" w:hAnsi="Consolas"/>
+          <w:color w:val="1F4D78"/>
+          <w:sz w:val="19"/>
+        </w:rPr>
+        <w:t>POST /scenarios</w:t>
+      </w:r>
+      <w:r>
+        <w:rPr>
+          <w:rFonts w:ascii="Calibri" w:hAnsi="Calibri"/>
+          <w:color w:val="111827"/>
+          <w:sz w:val="22"/>
+        </w:rPr>
+        <w:t xml:space="preserve">, </w:t>
+      </w:r>
+      <w:r>
+        <w:rPr>
+          <w:rFonts w:ascii="Consolas" w:hAnsi="Consolas"/>
+          <w:color w:val="1F4D78"/>
+          <w:sz w:val="19"/>
+        </w:rPr>
+        <w:t>GET /scenarios</w:t>
+      </w:r>
+      <w:r>
+        <w:rPr>
+          <w:rFonts w:ascii="Calibri" w:hAnsi="Calibri"/>
+          <w:color w:val="111827"/>
+          <w:sz w:val="22"/>
+        </w:rPr>
+        <w:t xml:space="preserve">, and </w:t>
+      </w:r>
+      <w:r>
+        <w:rPr>
+          <w:rFonts w:ascii="Consolas" w:hAnsi="Consolas"/>
+          <w:color w:val="1F4D78"/>
+          <w:sz w:val="19"/>
+        </w:rPr>
+        <w:t>GET /scenarios/{execution_id}</w:t>
+      </w:r>
+      <w:r>
+        <w:rPr>
+          <w:rFonts w:ascii="Calibri" w:hAnsi="Calibri"/>
+          <w:color w:val="111827"/>
+          <w:sz w:val="22"/>
+        </w:rPr>
+        <w:t xml:space="preserve"> under the vehicle electric API. List pagination is bounded at 100 items per request. Read and mutation operations use the existing Volume VI permissions.</w:t>
+      </w:r>
+    </w:p>
+    <w:p>
+      <w:r>
+        <w:rPr>
+          <w:rFonts w:ascii="Calibri" w:hAnsi="Calibri"/>
+          <w:color w:val="111827"/>
+          <w:sz w:val="22"/>
+        </w:rPr>
+        <w:t>The scenario runs entirely on the local ATEP stack. It requires no paid API, cloud account, LLM, or GPU.</w:t>
+      </w:r>
+    </w:p>
+    <w:p>
+      <w:pPr>
+        <w:pStyle w:val="Heading1"/>
+        <w:keepNext/>
+        <w:keepLines/>
+      </w:pPr>
+      <w:r>
+        <w:t>16. Next Development</w:t>
+      </w:r>
+    </w:p>
+    <w:p>
+      <w:r>
+        <w:rPr>
+          <w:rFonts w:ascii="Calibri" w:hAnsi="Calibri"/>
+          <w:color w:val="111827"/>
+          <w:sz w:val="22"/>
+        </w:rPr>
+        <w:t>Volume VI is complete. VII-1 should establish the ADAS world model: coordinate frames, road and lane geometry, actors, sensor-independent ground truth, deterministic logical time, bounded API contracts, and the first automated world-state tests.</w:t>
       </w:r>
     </w:p>
     <w:sectPr>
@@ -27366,7 +30184,7 @@
         <w:color w:val="667085"/>
         <w:sz w:val="17"/>
       </w:rPr>
-      <w:t>ATEP Volume VI Workbook  |  Version 0.6.0</w:t>
+      <w:t>ATEP Volume VI Workbook  |  Version 0.7.0</w:t>
     </w:r>
     <w:r>
       <w:rPr>
@@ -27756,6 +30574,12 @@
     </w:lvlOverride>
   </w:num>
   <w:num w:numId="28">
+    <w:abstractNumId w:val="10"/>
+    <w:lvlOverride w:ilvl="0">
+      <w:startOverride w:val="1"/>
+    </w:lvlOverride>
+  </w:num>
+  <w:num w:numId="29">
     <w:abstractNumId w:val="9"/>
     <w:lvlOverride w:ilvl="0">
       <w:startOverride w:val="1"/>

</xml_diff>